<commit_message>
Add front matter layout and title page framework
</commit_message>
<xml_diff>
--- a/manuscript/volume-1/sacrae-preces-volume-1.docx
+++ b/manuscript/volume-1/sacrae-preces-volume-1.docx
@@ -95,6 +95,8 @@
         <w:rPr>
           <w:rStyle w:val="SPPrayerResponseCS"/>
           <w:i w:val="0"/>
+          <w:sz w:val="48"/>
+          <w:szCs w:val="18"/>
         </w:rPr>
       </w:pPr>
       <w:proofErr w:type="spellStart"/>
@@ -102,6 +104,8 @@
         <w:rPr>
           <w:rStyle w:val="SPPrayerResponseCS"/>
           <w:i w:val="0"/>
+          <w:sz w:val="48"/>
+          <w:szCs w:val="18"/>
         </w:rPr>
         <w:t>Sacrea</w:t>
       </w:r>
@@ -110,6 +114,8 @@
         <w:rPr>
           <w:rStyle w:val="SPPrayerResponseCS"/>
           <w:i w:val="0"/>
+          <w:sz w:val="48"/>
+          <w:szCs w:val="18"/>
         </w:rPr>
         <w:t xml:space="preserve"> preces</w:t>
       </w:r>
@@ -117,6 +123,7 @@
     <w:p>
       <w:pPr>
         <w:pStyle w:val="SPCoverSubtitle"/>
+        <w:spacing w:after="240"/>
       </w:pPr>
       <w:r>
         <w:t xml:space="preserve">Volume </w:t>
@@ -128,6 +135,7 @@
     <w:p>
       <w:pPr>
         <w:pStyle w:val="SPCoverSubtitle"/>
+        <w:spacing w:after="120"/>
       </w:pPr>
       <w:r>
         <w:rPr>
@@ -142,102 +150,37 @@
         <w:pStyle w:val="SPCoverSubtitle"/>
         <w:rPr>
           <w:rStyle w:val="SPCatechismrefCS"/>
+          <w:smallCaps w:val="0"/>
         </w:rPr>
       </w:pPr>
       <w:r>
         <w:rPr>
           <w:rStyle w:val="SPCatechismrefCS"/>
+          <w:smallCaps w:val="0"/>
         </w:rPr>
-        <w:t>English and Latin</w:t>
+        <w:t xml:space="preserve">English </w:t>
+      </w:r>
+      <w:r>
+        <w:rPr>
+          <w:rStyle w:val="SPCatechismrefCS"/>
+          <w:smallCaps w:val="0"/>
+        </w:rPr>
+        <w:t>&amp;</w:t>
+      </w:r>
+      <w:r>
+        <w:rPr>
+          <w:rStyle w:val="SPCatechismrefCS"/>
+          <w:smallCaps w:val="0"/>
+        </w:rPr>
+        <w:t xml:space="preserve"> Latin</w:t>
       </w:r>
     </w:p>
     <w:p>
       <w:pPr>
-        <w:pStyle w:val="SPCoverSubtitle"/>
-        <w:rPr>
-          <w:rStyle w:val="SPCatechismrefCS"/>
-        </w:rPr>
-      </w:pPr>
-    </w:p>
-    <w:p>
-      <w:pPr>
-        <w:pStyle w:val="SPCoverSubtitle"/>
-        <w:rPr>
-          <w:rStyle w:val="SPCatechismrefCS"/>
-        </w:rPr>
-      </w:pPr>
-    </w:p>
-    <w:p>
-      <w:pPr>
-        <w:pStyle w:val="SPCoverSubtitle"/>
-        <w:rPr>
-          <w:rStyle w:val="SPCatechismrefCS"/>
-        </w:rPr>
-      </w:pPr>
-    </w:p>
-    <w:p>
-      <w:pPr>
-        <w:pStyle w:val="SPCoverSubtitle"/>
-        <w:rPr>
-          <w:rStyle w:val="SPCatechismrefCS"/>
-        </w:rPr>
-      </w:pPr>
-    </w:p>
-    <w:p>
-      <w:pPr>
-        <w:pStyle w:val="SPCoverSubtitle"/>
-        <w:rPr>
-          <w:rStyle w:val="SPCatechismrefCS"/>
-        </w:rPr>
-      </w:pPr>
-    </w:p>
-    <w:p>
-      <w:pPr>
-        <w:pStyle w:val="SPCoverSubtitle"/>
-        <w:rPr>
-          <w:rStyle w:val="SPCatechismrefCS"/>
-        </w:rPr>
-      </w:pPr>
-    </w:p>
-    <w:p>
-      <w:pPr>
-        <w:pStyle w:val="SPCoverSubtitle"/>
-        <w:rPr>
-          <w:rStyle w:val="SPCatechismrefCS"/>
-        </w:rPr>
-      </w:pPr>
-    </w:p>
-    <w:p>
-      <w:pPr>
-        <w:pStyle w:val="SPCoverSubtitle"/>
-        <w:rPr>
-          <w:rStyle w:val="SPCatechismrefCS"/>
-        </w:rPr>
-      </w:pPr>
-    </w:p>
-    <w:p>
-      <w:pPr>
-        <w:pStyle w:val="SPCoverSubtitle"/>
-        <w:rPr>
-          <w:rStyle w:val="SPCatechismrefCS"/>
-        </w:rPr>
-      </w:pPr>
-    </w:p>
-    <w:p>
-      <w:pPr>
-        <w:pStyle w:val="SPCoverSubtitle"/>
-        <w:rPr>
-          <w:rStyle w:val="SPCatechismrefCS"/>
-          <w:sz w:val="22"/>
-          <w:szCs w:val="20"/>
-        </w:rPr>
+        <w:pStyle w:val="SPAuthor"/>
+        <w:spacing w:before="1800"/>
       </w:pPr>
       <w:r>
-        <w:rPr>
-          <w:rStyle w:val="SPCatechismrefCS"/>
-          <w:sz w:val="22"/>
-          <w:szCs w:val="20"/>
-        </w:rPr>
         <w:t>Lance Martincich</w:t>
       </w:r>
     </w:p>
@@ -1429,7 +1372,11 @@
     <w:basedOn w:val="Normal"/>
     <w:next w:val="SPCoverSubtitle"/>
     <w:qFormat/>
-    <w:rsid w:val="00225384"/>
+    <w:rsid w:val="00F63DD8"/>
+    <w:pPr>
+      <w:keepNext/>
+      <w:spacing w:after="480"/>
+    </w:pPr>
     <w:rPr>
       <w:rFonts w:ascii="Cinzel Decorative" w:hAnsi="Cinzel Decorative"/>
       <w:color w:val="6A1E1E"/>
@@ -1440,9 +1387,9 @@
     <w:name w:val="SP Cover Subtitle"/>
     <w:basedOn w:val="Normal"/>
     <w:qFormat/>
-    <w:rsid w:val="005F422E"/>
-    <w:pPr>
-      <w:spacing w:before="240" w:line="276" w:lineRule="auto"/>
+    <w:rsid w:val="007B7F48"/>
+    <w:pPr>
+      <w:spacing w:after="480" w:line="240" w:lineRule="auto"/>
       <w:ind w:left="0"/>
       <w:jc w:val="center"/>
     </w:pPr>
@@ -1561,6 +1508,28 @@
       <w:i/>
       <w:caps w:val="0"/>
       <w:smallCaps w:val="0"/>
+    </w:rPr>
+  </w:style>
+  <w:style w:type="paragraph" w:customStyle="1" w:styleId="SPAuthor">
+    <w:name w:val="SP Author"/>
+    <w:basedOn w:val="Normal"/>
+    <w:link w:val="SPAuthorChar"/>
+    <w:qFormat/>
+    <w:rsid w:val="007B7F48"/>
+    <w:pPr>
+      <w:spacing w:before="2040" w:after="0" w:line="240" w:lineRule="auto"/>
+      <w:ind w:left="0"/>
+      <w:jc w:val="center"/>
+    </w:pPr>
+  </w:style>
+  <w:style w:type="character" w:customStyle="1" w:styleId="SPAuthorChar">
+    <w:name w:val="SP Author Char"/>
+    <w:basedOn w:val="DefaultParagraphFont"/>
+    <w:link w:val="SPAuthor"/>
+    <w:rsid w:val="007B7F48"/>
+    <w:rPr>
+      <w:rFonts w:ascii="Garamond" w:hAnsi="Garamond"/>
+      <w:sz w:val="24"/>
     </w:rPr>
   </w:style>
 </w:styles>

</xml_diff>

<commit_message>
Sign of the Cross added
</commit_message>
<xml_diff>
--- a/manuscript/volume-1/sacrae-preces-volume-1.docx
+++ b/manuscript/volume-1/sacrae-preces-volume-1.docx
@@ -1148,7 +1148,7 @@
       </w:pPr>
       <w:r>
         <w:pict w14:anchorId="249FE732">
-          <v:rect id="_x0000_i1349" style="width:0;height:1.5pt" o:hralign="center" o:hrstd="t" o:hr="t" fillcolor="#a0a0a0" stroked="f"/>
+          <v:rect id="_x0000_i1379" style="width:0;height:1.5pt" o:hralign="center" o:hrstd="t" o:hr="t" fillcolor="#a0a0a0" stroked="f"/>
         </w:pict>
       </w:r>
     </w:p>
@@ -1217,7 +1217,7 @@
       </w:pPr>
       <w:r>
         <w:pict w14:anchorId="25751FDD">
-          <v:rect id="_x0000_i1350" style="width:0;height:1.5pt" o:hralign="center" o:hrstd="t" o:hr="t" fillcolor="#a0a0a0" stroked="f"/>
+          <v:rect id="_x0000_i1380" style="width:0;height:1.5pt" o:hralign="center" o:hrstd="t" o:hr="t" fillcolor="#a0a0a0" stroked="f"/>
         </w:pict>
       </w:r>
     </w:p>
@@ -1283,7 +1283,7 @@
       </w:pPr>
       <w:r>
         <w:pict w14:anchorId="19542BB1">
-          <v:rect id="_x0000_i1351" style="width:0;height:1.5pt" o:hralign="center" o:hrstd="t" o:hr="t" fillcolor="#a0a0a0" stroked="f"/>
+          <v:rect id="_x0000_i1381" style="width:0;height:1.5pt" o:hralign="center" o:hrstd="t" o:hr="t" fillcolor="#a0a0a0" stroked="f"/>
         </w:pict>
       </w:r>
     </w:p>
@@ -1350,7 +1350,7 @@
       </w:pPr>
       <w:r>
         <w:pict w14:anchorId="4D1CE6F0">
-          <v:rect id="_x0000_i1352" style="width:0;height:1.5pt" o:hralign="center" o:hrstd="t" o:hr="t" fillcolor="#a0a0a0" stroked="f"/>
+          <v:rect id="_x0000_i1382" style="width:0;height:1.5pt" o:hralign="center" o:hrstd="t" o:hr="t" fillcolor="#a0a0a0" stroked="f"/>
         </w:pict>
       </w:r>
     </w:p>
@@ -1378,21 +1378,320 @@
     <w:p>
       <w:pPr>
         <w:pStyle w:val="SPBodyText"/>
-        <w:jc w:val="center"/>
-      </w:pPr>
+      </w:pPr>
+      <w:r>
+        <w:t>S</w:t>
+      </w:r>
+      <w:r>
+        <w:t>uggestions.</w:t>
+      </w:r>
+    </w:p>
+    <w:p>
+      <w:pPr>
+        <w:pStyle w:val="SPBodyText"/>
+      </w:pPr>
+    </w:p>
+    <w:p>
+      <w:pPr>
+        <w:pStyle w:val="SPBodyText"/>
+      </w:pPr>
+      <w:r>
+        <w:t>A morning prayer may help begin the day with gratitude and intention. A prayer during the day may provide a moment of stillness amid work and responsibilities. An evening prayer may help us give thanks for the day that has passed and place tomorrow into God's hands.</w:t>
+      </w:r>
+    </w:p>
+    <w:p>
+      <w:pPr>
+        <w:pStyle w:val="SPBodyText"/>
+      </w:pPr>
+      <w:r>
+        <w:t>These suggestions are not rules.</w:t>
+      </w:r>
+    </w:p>
+    <w:p>
+      <w:pPr>
+        <w:pStyle w:val="SPBodyText"/>
+      </w:pPr>
+      <w:r>
+        <w:t>Life is rarely predictable, and prayer should not become another source of pressure.</w:t>
+      </w:r>
+    </w:p>
+    <w:p>
+      <w:pPr>
+        <w:pStyle w:val="SPBodyText"/>
+      </w:pPr>
+      <w:r>
+        <w:t>If the suggested time does not suit you, choose another.</w:t>
+      </w:r>
+    </w:p>
+    <w:p>
+      <w:pPr>
+        <w:pStyle w:val="SPBodyText"/>
+      </w:pPr>
+      <w:r>
+        <w:t>If you have only a few minutes, use those minutes.</w:t>
+      </w:r>
+    </w:p>
+    <w:p>
+      <w:pPr>
+        <w:pStyle w:val="SPBodyText"/>
+      </w:pPr>
+      <w:r>
+        <w:t>If you miss a day, simply begin again.</w:t>
+      </w:r>
+    </w:p>
+    <w:p>
+      <w:pPr>
+        <w:pStyle w:val="SPBodyText"/>
+      </w:pPr>
+      <w:r>
+        <w:t>There is no failure in returning to prayer.</w:t>
+      </w:r>
+    </w:p>
+    <w:p>
+      <w:pPr>
+        <w:pStyle w:val="SPBodyText"/>
+      </w:pPr>
+      <w:r>
+        <w:pict w14:anchorId="68D46385">
+          <v:rect id="_x0000_i1383" style="width:0;height:1.5pt" o:hralign="center" o:hrstd="t" o:hr="t" fillcolor="#a0a0a0" stroked="f"/>
+        </w:pict>
+      </w:r>
+    </w:p>
+    <w:p>
+      <w:pPr>
+        <w:pStyle w:val="SPSubheading"/>
+      </w:pPr>
+      <w:r>
+        <w:lastRenderedPageBreak/>
+        <w:t>A Simple Way to Begin</w:t>
+      </w:r>
+    </w:p>
+    <w:p>
+      <w:pPr>
+        <w:pStyle w:val="SPBodyText"/>
+      </w:pPr>
+      <w:r>
+        <w:t>A useful pattern is simply:</w:t>
+      </w:r>
+    </w:p>
+    <w:p>
+      <w:pPr>
+        <w:pStyle w:val="SPBodyText"/>
+      </w:pPr>
+    </w:p>
+    <w:p>
+      <w:pPr>
+        <w:pStyle w:val="SPBodyText"/>
+      </w:pPr>
+      <w:r>
+        <w:t>Read.</w:t>
+      </w:r>
+      <w:r>
+        <w:br/>
+        <w:t>Reflect.</w:t>
+      </w:r>
+      <w:r>
+        <w:br/>
+        <w:t>Pray.</w:t>
+      </w:r>
+      <w:r>
+        <w:br/>
+        <w:t>Return.</w:t>
+      </w:r>
+    </w:p>
+    <w:p>
+      <w:pPr>
+        <w:pStyle w:val="SPBodyText"/>
+      </w:pPr>
+    </w:p>
+    <w:p>
+      <w:pPr>
+        <w:pStyle w:val="SPBodyText"/>
+      </w:pPr>
+      <w:r>
+        <w:t>Read the prayer slowly.</w:t>
+      </w:r>
+    </w:p>
+    <w:p>
+      <w:pPr>
+        <w:pStyle w:val="SPBodyText"/>
+      </w:pPr>
+      <w:r>
+        <w:t>Consider what its words are asking of you.</w:t>
+      </w:r>
+    </w:p>
+    <w:p>
+      <w:pPr>
+        <w:pStyle w:val="SPBodyText"/>
+      </w:pPr>
+      <w:r>
+        <w:t>Reflect on the Scripture and the meaning behind the prayer.</w:t>
+      </w:r>
+    </w:p>
+    <w:p>
+      <w:pPr>
+        <w:pStyle w:val="SPBodyText"/>
+      </w:pPr>
+      <w:r>
+        <w:t>Then pray it.</w:t>
+      </w:r>
+    </w:p>
+    <w:p>
+      <w:pPr>
+        <w:pStyle w:val="SPBodyText"/>
+      </w:pPr>
+      <w:r>
+        <w:t>Do not worry about finding the perfect words or creating the perfect environment. Prayer can happen in a quiet church, at a kitchen table, beside a child's bed, during a morning commute, or in the silence of a room before sleep.</w:t>
+      </w:r>
+    </w:p>
+    <w:p>
+      <w:pPr>
+        <w:pStyle w:val="SPBodyText"/>
+      </w:pPr>
+      <w:r>
+        <w:t>What matters is turning towards God.</w:t>
+      </w:r>
+    </w:p>
+    <w:p>
+      <w:pPr>
+        <w:pStyle w:val="SPBodyText"/>
+      </w:pPr>
+      <w:r>
+        <w:t>Over time, a prayer that once required deliberate attention may become part of the natural rhythm of the day.</w:t>
+      </w:r>
+    </w:p>
+    <w:p>
+      <w:pPr>
+        <w:pStyle w:val="SPBodyText"/>
+      </w:pPr>
+      <w:r>
+        <w:t>That is one of the gifts of traditional prayer.</w:t>
+      </w:r>
+    </w:p>
+    <w:p>
+      <w:pPr>
+        <w:pStyle w:val="SPBodyText"/>
+      </w:pPr>
+      <w:r>
+        <w:t>It gives us words when our own words are difficult to find.</w:t>
+      </w:r>
+    </w:p>
+    <w:p>
+      <w:pPr>
+        <w:pStyle w:val="SPBodyText"/>
+      </w:pPr>
+      <w:r>
+        <w:pict w14:anchorId="36FAD975">
+          <v:rect id="_x0000_i1384" style="width:0;height:1.5pt" o:hralign="center" o:hrstd="t" o:hr="t" fillcolor="#a0a0a0" stroked="f"/>
+        </w:pict>
+      </w:r>
+    </w:p>
+    <w:p>
+      <w:pPr>
+        <w:pStyle w:val="SPBodyText"/>
+      </w:pPr>
+      <w:r>
+        <w:rPr>
+          <w:i/>
+          <w:iCs/>
+        </w:rPr>
+        <w:lastRenderedPageBreak/>
+        <w:t>Sacrae Preces</w:t>
+      </w:r>
+      <w:r>
+        <w:t xml:space="preserve"> is therefore not meant to </w:t>
+      </w:r>
+      <w:proofErr w:type="gramStart"/>
+      <w:r>
+        <w:t>be something that is</w:t>
+      </w:r>
+      <w:proofErr w:type="gramEnd"/>
+      <w:r>
+        <w:t xml:space="preserve"> simply read once and placed back on a shelf.</w:t>
+      </w:r>
+    </w:p>
+    <w:p>
+      <w:pPr>
+        <w:pStyle w:val="SPBodyText"/>
+      </w:pPr>
+    </w:p>
+    <w:p>
+      <w:pPr>
+        <w:pStyle w:val="SPBodyText"/>
+      </w:pPr>
+      <w:r>
+        <w:t>Return to it.</w:t>
+      </w:r>
+    </w:p>
+    <w:p>
+      <w:pPr>
+        <w:pStyle w:val="SPBodyText"/>
+      </w:pPr>
+      <w:r>
+        <w:t>Pray the same prayer repeatedly.</w:t>
+      </w:r>
+    </w:p>
+    <w:p>
+      <w:pPr>
+        <w:pStyle w:val="SPBodyText"/>
+      </w:pPr>
+      <w:r>
+        <w:t>Learn a word of Latin.</w:t>
+      </w:r>
+    </w:p>
+    <w:p>
+      <w:pPr>
+        <w:pStyle w:val="SPBodyText"/>
+      </w:pPr>
+      <w:r>
+        <w:t>Read a passage of Scripture.</w:t>
+      </w:r>
+    </w:p>
+    <w:p>
+      <w:pPr>
+        <w:pStyle w:val="SPBodyText"/>
+      </w:pPr>
+      <w:r>
+        <w:t>Sit with a reflection.</w:t>
+      </w:r>
+    </w:p>
+    <w:p>
+      <w:pPr>
+        <w:pStyle w:val="SPBodyText"/>
+      </w:pPr>
+      <w:r>
+        <w:t>Teach a prayer to someone else.</w:t>
+      </w:r>
+    </w:p>
+    <w:p>
+      <w:pPr>
+        <w:pStyle w:val="SPBodyText"/>
+      </w:pPr>
+      <w:r>
+        <w:t>And then come back tomorrow.</w:t>
+      </w:r>
+    </w:p>
+    <w:p>
+      <w:pPr>
+        <w:pStyle w:val="SPBodyText"/>
+      </w:pPr>
+      <w:r>
+        <w:t>The goal is not to finish the book.</w:t>
+      </w:r>
+    </w:p>
+    <w:p>
+      <w:pPr>
+        <w:pStyle w:val="SPBodyText"/>
+      </w:pPr>
+      <w:r>
+        <w:t xml:space="preserve">The goal is to </w:t>
+      </w:r>
       <w:r>
         <w:rPr>
           <w:b/>
           <w:bCs/>
         </w:rPr>
-        <w:t>S</w:t>
-      </w:r>
-      <w:r>
-        <w:rPr>
-          <w:b/>
-          <w:bCs/>
-        </w:rPr>
-        <w:t>uggestions</w:t>
+        <w:t>pray</w:t>
       </w:r>
       <w:r>
         <w:t>.</w:t>
@@ -1408,331 +1707,87 @@
         <w:pStyle w:val="SPBodyText"/>
       </w:pPr>
       <w:r>
-        <w:t>A morning prayer may help begin the day with gratitude and intention. A prayer during the day may provide a moment of stillness amid work and responsibilities. An evening prayer may help us give thanks for the day that has passed and place tomorrow into God's hands.</w:t>
-      </w:r>
-    </w:p>
-    <w:p>
-      <w:pPr>
-        <w:pStyle w:val="SPBodyText"/>
-      </w:pPr>
-      <w:r>
-        <w:t>These suggestions are not rules.</w:t>
-      </w:r>
-    </w:p>
-    <w:p>
-      <w:pPr>
-        <w:pStyle w:val="SPBodyText"/>
-      </w:pPr>
-      <w:r>
-        <w:t>Life is rarely predictable, and prayer should not become another source of pressure.</w:t>
-      </w:r>
-    </w:p>
-    <w:p>
-      <w:pPr>
-        <w:pStyle w:val="SPBodyText"/>
-      </w:pPr>
-      <w:r>
-        <w:t>If the suggested time does not suit you, choose another.</w:t>
-      </w:r>
-    </w:p>
-    <w:p>
-      <w:pPr>
-        <w:pStyle w:val="SPBodyText"/>
-      </w:pPr>
-      <w:r>
-        <w:t>If you have only a few minutes, use those minutes.</w:t>
-      </w:r>
-    </w:p>
-    <w:p>
-      <w:pPr>
-        <w:pStyle w:val="SPBodyText"/>
-      </w:pPr>
-      <w:r>
-        <w:t>If you miss a day, simply begin again.</w:t>
-      </w:r>
-    </w:p>
-    <w:p>
-      <w:pPr>
-        <w:pStyle w:val="SPBodyText"/>
-      </w:pPr>
-      <w:r>
-        <w:t>There is no failure in returning to prayer.</w:t>
-      </w:r>
-    </w:p>
-    <w:p>
-      <w:pPr>
-        <w:pStyle w:val="SPBodyText"/>
-      </w:pPr>
-      <w:r>
-        <w:pict w14:anchorId="68D46385">
-          <v:rect id="_x0000_i1353" style="width:0;height:1.5pt" o:hralign="center" o:hrstd="t" o:hr="t" fillcolor="#a0a0a0" stroked="f"/>
-        </w:pict>
-      </w:r>
-    </w:p>
-    <w:p>
-      <w:pPr>
-        <w:pStyle w:val="SPSubheading"/>
-      </w:pPr>
-      <w:r>
+        <w:t>The Sign of the Cross stands at the beginning of this collection not simply as a prayer, but as the gesture by which Christians traditionally begin and conclude their prayer. It reminds us that prayer is offered in the name of the Father, and of the Son, and of the Holy Spirit.</w:t>
+      </w:r>
+    </w:p>
+    <w:p>
+      <w:pPr>
+        <w:pStyle w:val="SPBodyText"/>
+      </w:pPr>
+    </w:p>
+    <w:p>
+      <w:pPr>
+        <w:jc w:val="center"/>
+        <w:rPr>
+          <w:rFonts w:ascii="Segoe UI Symbol" w:hAnsi="Segoe UI Symbol" w:cs="Segoe UI Symbol"/>
+        </w:rPr>
+        <w:sectPr>
+          <w:type w:val="evenPage"/>
+          <w:pgSz w:w="7920" w:h="12240" w:code="6"/>
+          <w:pgMar w:top="1080" w:right="864" w:bottom="1080" w:left="1152" w:header="576" w:footer="576" w:gutter="0"/>
+          <w:cols w:space="720"/>
+          <w:titlePg/>
+          <w:docGrid w:linePitch="360"/>
+        </w:sectPr>
+      </w:pPr>
+      <w:r>
+        <w:rPr>
+          <w:rFonts w:ascii="Segoe UI Symbol" w:hAnsi="Segoe UI Symbol" w:cs="Segoe UI Symbol"/>
+        </w:rPr>
+        <w:t>✠</w:t>
+      </w:r>
+    </w:p>
+    <w:p>
+      <w:pPr>
+        <w:pStyle w:val="SPBodyText"/>
+        <w:jc w:val="center"/>
+        <w:rPr>
+          <w:rFonts w:ascii="Segoe UI Symbol" w:hAnsi="Segoe UI Symbol" w:cs="Segoe UI Symbol"/>
+        </w:rPr>
+      </w:pPr>
+      <w:r>
+        <w:rPr>
+          <w:rFonts w:ascii="Segoe UI Symbol" w:hAnsi="Segoe UI Symbol" w:cs="Segoe UI Symbol"/>
+        </w:rPr>
         <w:lastRenderedPageBreak/>
-        <w:t>A Simple Way to Begin</w:t>
-      </w:r>
-    </w:p>
-    <w:p>
-      <w:pPr>
-        <w:pStyle w:val="SPBodyText"/>
-      </w:pPr>
-      <w:r>
-        <w:t>A useful pattern is simply:</w:t>
-      </w:r>
-    </w:p>
-    <w:p>
-      <w:pPr>
-        <w:pStyle w:val="SPBodyText"/>
-      </w:pPr>
-    </w:p>
-    <w:p>
-      <w:pPr>
-        <w:pStyle w:val="SPBodyText"/>
-        <w:ind w:left="1440" w:firstLine="0"/>
-        <w:rPr>
-          <w:i/>
-          <w:iCs/>
-        </w:rPr>
-      </w:pPr>
-      <w:r>
-        <w:rPr>
-          <w:i/>
-          <w:iCs/>
-        </w:rPr>
-        <w:t>Read.</w:t>
-      </w:r>
-      <w:r>
-        <w:rPr>
-          <w:i/>
-          <w:iCs/>
-        </w:rPr>
-        <w:br/>
-        <w:t>Reflect.</w:t>
-      </w:r>
-      <w:r>
-        <w:rPr>
-          <w:i/>
-          <w:iCs/>
-        </w:rPr>
-        <w:br/>
-        <w:t>Pray.</w:t>
-      </w:r>
-      <w:r>
-        <w:rPr>
-          <w:i/>
-          <w:iCs/>
-        </w:rPr>
-        <w:br/>
-        <w:t>Return.</w:t>
-      </w:r>
-    </w:p>
-    <w:p>
-      <w:pPr>
-        <w:pStyle w:val="SPBodyText"/>
-      </w:pPr>
-    </w:p>
-    <w:p>
-      <w:pPr>
-        <w:pStyle w:val="SPBodyText"/>
-      </w:pPr>
-      <w:r>
-        <w:t>Read the prayer slowly.</w:t>
-      </w:r>
-    </w:p>
-    <w:p>
-      <w:pPr>
-        <w:pStyle w:val="SPBodyText"/>
-      </w:pPr>
-      <w:r>
-        <w:t>Consider what its words are asking of you.</w:t>
-      </w:r>
-    </w:p>
-    <w:p>
-      <w:pPr>
-        <w:pStyle w:val="SPBodyText"/>
-      </w:pPr>
-      <w:r>
-        <w:t>Reflect on the Scripture and the meaning behind the prayer.</w:t>
-      </w:r>
-    </w:p>
-    <w:p>
-      <w:pPr>
-        <w:pStyle w:val="SPBodyText"/>
-      </w:pPr>
-      <w:r>
-        <w:t>Then pray it.</w:t>
-      </w:r>
-    </w:p>
-    <w:p>
-      <w:pPr>
-        <w:pStyle w:val="SPBodyText"/>
-      </w:pPr>
-      <w:r>
-        <w:t>Do not worry about finding the perfect words or creating the perfect environment. Prayer can happen in a quiet church, at a kitchen table, beside a child's bed, during a morning commute, or in the silence of a room before sleep.</w:t>
-      </w:r>
-    </w:p>
-    <w:p>
-      <w:pPr>
-        <w:pStyle w:val="SPBodyText"/>
-      </w:pPr>
-      <w:r>
-        <w:t>What matters is turning towards God.</w:t>
-      </w:r>
-    </w:p>
-    <w:p>
-      <w:pPr>
-        <w:pStyle w:val="SPBodyText"/>
-      </w:pPr>
-      <w:r>
-        <w:t>Over time, a prayer that once required deliberate attention may become part of the natural rhythm of the day.</w:t>
-      </w:r>
-    </w:p>
-    <w:p>
-      <w:pPr>
-        <w:pStyle w:val="SPBodyText"/>
-      </w:pPr>
-      <w:r>
-        <w:t>That is one of the gifts of traditional prayer.</w:t>
-      </w:r>
-    </w:p>
-    <w:p>
-      <w:pPr>
-        <w:pStyle w:val="SPBodyText"/>
-      </w:pPr>
-      <w:r>
-        <w:t>It gives us words when our own words are difficult to find.</w:t>
-      </w:r>
-    </w:p>
-    <w:p>
-      <w:pPr>
-        <w:pStyle w:val="SPBodyText"/>
-      </w:pPr>
-      <w:r>
-        <w:pict w14:anchorId="36FAD975">
-          <v:rect id="_x0000_i1354" style="width:0;height:1.5pt" o:hralign="center" o:hrstd="t" o:hr="t" fillcolor="#a0a0a0" stroked="f"/>
-        </w:pict>
-      </w:r>
-    </w:p>
-    <w:p>
-      <w:pPr>
-        <w:pStyle w:val="SPBodyText"/>
-      </w:pPr>
-      <w:r>
-        <w:rPr>
-          <w:i/>
-          <w:iCs/>
-        </w:rPr>
-        <w:lastRenderedPageBreak/>
-        <w:t>Sacrae Preces</w:t>
-      </w:r>
-      <w:r>
-        <w:t xml:space="preserve"> is therefore not meant to </w:t>
-      </w:r>
-      <w:proofErr w:type="gramStart"/>
-      <w:r>
-        <w:t>be something that is</w:t>
-      </w:r>
-      <w:proofErr w:type="gramEnd"/>
-      <w:r>
-        <w:t xml:space="preserve"> simply read once and placed back on a shelf.</w:t>
-      </w:r>
-    </w:p>
-    <w:p>
-      <w:pPr>
-        <w:pStyle w:val="SPBodyText"/>
-      </w:pPr>
-    </w:p>
-    <w:p>
-      <w:pPr>
-        <w:pStyle w:val="SPBodyText"/>
-      </w:pPr>
-      <w:r>
-        <w:t>Return to it.</w:t>
-      </w:r>
-    </w:p>
-    <w:p>
-      <w:pPr>
-        <w:pStyle w:val="SPBodyText"/>
-      </w:pPr>
-      <w:r>
-        <w:t>Pray the same prayer repeatedly.</w:t>
-      </w:r>
-    </w:p>
-    <w:p>
-      <w:pPr>
-        <w:pStyle w:val="SPBodyText"/>
-      </w:pPr>
-      <w:r>
-        <w:t>Learn a word of Latin.</w:t>
-      </w:r>
-    </w:p>
-    <w:p>
-      <w:pPr>
-        <w:pStyle w:val="SPBodyText"/>
-      </w:pPr>
-      <w:r>
-        <w:t>Read a passage of Scripture.</w:t>
-      </w:r>
-    </w:p>
-    <w:p>
-      <w:pPr>
-        <w:pStyle w:val="SPBodyText"/>
-      </w:pPr>
-      <w:r>
-        <w:t>Sit with a reflection.</w:t>
-      </w:r>
-    </w:p>
-    <w:p>
-      <w:pPr>
-        <w:pStyle w:val="SPBodyText"/>
-      </w:pPr>
-      <w:r>
-        <w:t>Teach a prayer to someone else.</w:t>
-      </w:r>
-    </w:p>
-    <w:p>
-      <w:pPr>
-        <w:pStyle w:val="SPBodyText"/>
-      </w:pPr>
-      <w:r>
-        <w:t>And then come back tomorrow.</w:t>
-      </w:r>
-    </w:p>
-    <w:p>
-      <w:pPr>
-        <w:pStyle w:val="SPBodyText"/>
-      </w:pPr>
-      <w:r>
-        <w:t>The goal is not to finish the book.</w:t>
-      </w:r>
-    </w:p>
-    <w:p>
-      <w:pPr>
-        <w:pStyle w:val="SPBodyText"/>
-      </w:pPr>
-      <w:r>
-        <w:t xml:space="preserve">The goal is to </w:t>
-      </w:r>
-      <w:r>
-        <w:rPr>
-          <w:b/>
-          <w:bCs/>
-        </w:rPr>
-        <w:t>pray</w:t>
-      </w:r>
-      <w:r>
-        <w:t>.</w:t>
-      </w:r>
-    </w:p>
-    <w:p>
-      <w:pPr>
-        <w:pStyle w:val="SPBodyText"/>
+        <w:t>✠</w:t>
+      </w:r>
+    </w:p>
+    <w:p>
+      <w:pPr>
+        <w:pStyle w:val="SPBodyText"/>
+        <w:jc w:val="center"/>
+        <w:rPr>
+          <w:rFonts w:ascii="Segoe UI Symbol" w:hAnsi="Segoe UI Symbol" w:cs="Segoe UI Symbol"/>
+        </w:rPr>
+      </w:pPr>
+    </w:p>
+    <w:p>
+      <w:pPr>
+        <w:pStyle w:val="SPPrayerTitle"/>
+      </w:pPr>
+      <w:r>
+        <w:t>Sign of the cross</w:t>
+      </w:r>
+    </w:p>
+    <w:p>
+      <w:pPr>
+        <w:pStyle w:val="SPPrayerIntro"/>
+      </w:pPr>
+      <w:r>
+        <w:t>The Sign of the Cross is one of the simplest and most familiar gestures of Christian prayer. With it, we begin and conclude many of our prayers, invoking the Father, the Son, and the Holy Spirit.</w:t>
+      </w:r>
+    </w:p>
+    <w:p>
+      <w:pPr>
+        <w:pStyle w:val="SPPrayerIntro"/>
+      </w:pPr>
+      <w:r>
+        <w:t>It is both a profession of faith and an invitation to prayer. In making the Sign of the Cross, we place ourselves consciously in the presence of God and remember the mystery at the heart of our faith.</w:t>
+      </w:r>
+    </w:p>
+    <w:p>
+      <w:pPr>
         <w:jc w:val="center"/>
         <w:sectPr>
           <w:type w:val="oddPage"/>
@@ -1743,31 +1798,196 @@
           <w:docGrid w:linePitch="360"/>
         </w:sectPr>
       </w:pPr>
-      <w:r>
-        <w:rPr>
-          <w:rFonts w:ascii="Segoe UI Symbol" w:hAnsi="Segoe UI Symbol" w:cs="Segoe UI Symbol"/>
-        </w:rPr>
-        <w:t>✠</w:t>
-      </w:r>
-    </w:p>
-    <w:p>
-      <w:pPr>
-        <w:pStyle w:val="SPSubheading"/>
-        <w:jc w:val="center"/>
-      </w:pPr>
-    </w:p>
-    <w:p>
-      <w:pPr>
-        <w:pStyle w:val="SPBodyText"/>
-      </w:pPr>
-    </w:p>
-    <w:p>
-      <w:pPr>
-        <w:pStyle w:val="SPSectionSubTitle"/>
+    </w:p>
+    <w:p>
+      <w:pPr>
+        <w:pStyle w:val="SPLanguage"/>
+      </w:pPr>
+      <w:r>
+        <w:lastRenderedPageBreak/>
+        <w:t xml:space="preserve">ENGLISH </w:t>
+      </w:r>
+    </w:p>
+    <w:p>
+      <w:pPr>
+        <w:pStyle w:val="SPPrayerEnglish"/>
+      </w:pPr>
+      <w:r>
+        <w:t xml:space="preserve">In the name of the Father, </w:t>
+      </w:r>
+    </w:p>
+    <w:p>
+      <w:pPr>
+        <w:pStyle w:val="SPPrayerEnglish"/>
+      </w:pPr>
+      <w:r>
+        <w:t xml:space="preserve">and of the Son, and of the </w:t>
+      </w:r>
+    </w:p>
+    <w:p>
+      <w:pPr>
+        <w:pStyle w:val="SPPrayerEnglish"/>
+      </w:pPr>
+      <w:r>
+        <w:t xml:space="preserve">Holy Spirit. </w:t>
+      </w:r>
+    </w:p>
+    <w:p>
+      <w:pPr>
+        <w:pStyle w:val="SPPrayerEnglish"/>
+        <w:sectPr>
+          <w:type w:val="evenPage"/>
+          <w:pgSz w:w="7920" w:h="12240" w:code="6"/>
+          <w:pgMar w:top="1080" w:right="864" w:bottom="1080" w:left="1152" w:header="576" w:footer="576" w:gutter="0"/>
+          <w:cols w:space="720"/>
+          <w:titlePg/>
+          <w:docGrid w:linePitch="360"/>
+        </w:sectPr>
+      </w:pPr>
+      <w:r>
+        <w:t>Amen.</w:t>
+      </w:r>
+    </w:p>
+    <w:p>
+      <w:pPr>
+        <w:pStyle w:val="SPLanguage"/>
+      </w:pPr>
+      <w:r>
+        <w:lastRenderedPageBreak/>
+        <w:t>LATIN</w:t>
+      </w:r>
+    </w:p>
+    <w:p>
+      <w:pPr>
+        <w:pStyle w:val="SPPrayerLatin"/>
+      </w:pPr>
+      <w:r>
+        <w:t xml:space="preserve"> In </w:t>
+      </w:r>
+      <w:proofErr w:type="spellStart"/>
+      <w:r>
+        <w:t>nomine</w:t>
+      </w:r>
+      <w:proofErr w:type="spellEnd"/>
+      <w:r>
+        <w:t xml:space="preserve"> Patris, </w:t>
+      </w:r>
+    </w:p>
+    <w:p>
+      <w:pPr>
+        <w:pStyle w:val="SPPrayerLatin"/>
+      </w:pPr>
+      <w:r>
+        <w:t xml:space="preserve">et Filii, et Spiritus Sancti. </w:t>
+      </w:r>
+    </w:p>
+    <w:p>
+      <w:pPr>
+        <w:pStyle w:val="SPPrayerLatin"/>
+      </w:pPr>
+      <w:r>
+        <w:t>Amen.</w:t>
+      </w:r>
+    </w:p>
+    <w:p>
+      <w:pPr>
+        <w:pStyle w:val="SPPronunciationLabel"/>
+        <w:rPr>
+          <w:rFonts w:ascii="Times New Roman" w:hAnsi="Times New Roman"/>
+          <w:sz w:val="24"/>
+        </w:rPr>
+      </w:pPr>
+      <w:r>
+        <w:rPr>
+          <w:rStyle w:val="Strong"/>
+        </w:rPr>
+        <w:t>P</w:t>
+      </w:r>
+      <w:r>
+        <w:rPr>
+          <w:rStyle w:val="Strong"/>
+        </w:rPr>
+        <w:t>RONUNCIATION</w:t>
+      </w:r>
+    </w:p>
+    <w:p>
+      <w:pPr>
+        <w:pStyle w:val="SPPronunciation"/>
+      </w:pPr>
+      <w:r>
+        <w:rPr>
+          <w:rStyle w:val="Emphasis"/>
+        </w:rPr>
+        <w:t>in NOH-mee-</w:t>
+      </w:r>
+      <w:proofErr w:type="spellStart"/>
+      <w:r>
+        <w:rPr>
+          <w:rStyle w:val="Emphasis"/>
+        </w:rPr>
+        <w:t>neh</w:t>
+      </w:r>
+      <w:proofErr w:type="spellEnd"/>
+      <w:r>
+        <w:rPr>
+          <w:rStyle w:val="Emphasis"/>
+        </w:rPr>
+        <w:t xml:space="preserve"> PAH-tris,</w:t>
+      </w:r>
+      <w:r>
+        <w:br/>
+      </w:r>
+      <w:r>
+        <w:rPr>
+          <w:rStyle w:val="Emphasis"/>
+        </w:rPr>
+        <w:t>et FEE-lee-ee, et SPEE-</w:t>
+      </w:r>
+      <w:proofErr w:type="spellStart"/>
+      <w:r>
+        <w:rPr>
+          <w:rStyle w:val="Emphasis"/>
+        </w:rPr>
+        <w:t>ree</w:t>
+      </w:r>
+      <w:proofErr w:type="spellEnd"/>
+      <w:r>
+        <w:rPr>
+          <w:rStyle w:val="Emphasis"/>
+        </w:rPr>
+        <w:t>-</w:t>
+      </w:r>
+      <w:proofErr w:type="spellStart"/>
+      <w:r>
+        <w:rPr>
+          <w:rStyle w:val="Emphasis"/>
+        </w:rPr>
+        <w:t>toos</w:t>
+      </w:r>
+      <w:proofErr w:type="spellEnd"/>
+      <w:r>
+        <w:rPr>
+          <w:rStyle w:val="Emphasis"/>
+        </w:rPr>
+        <w:t xml:space="preserve"> SAHNK-tee.</w:t>
+      </w:r>
+      <w:r>
+        <w:br/>
+      </w:r>
+      <w:r>
+        <w:rPr>
+          <w:rStyle w:val="Emphasis"/>
+        </w:rPr>
+        <w:t>AH-men.</w:t>
+      </w:r>
+    </w:p>
+    <w:p>
+      <w:pPr>
+        <w:pStyle w:val="SPPronunciationLabel"/>
       </w:pPr>
     </w:p>
     <w:sectPr>
-      <w:type w:val="evenPage"/>
+      <w:type w:val="oddPage"/>
       <w:pgSz w:w="7920" w:h="12240" w:code="6"/>
       <w:pgMar w:top="1080" w:right="864" w:bottom="1080" w:left="1152" w:header="576" w:footer="576" w:gutter="0"/>
       <w:cols w:space="720"/>
@@ -2777,7 +2997,7 @@
     <w:basedOn w:val="Normal"/>
     <w:autoRedefine/>
     <w:qFormat/>
-    <w:rsid w:val="007F56B3"/>
+    <w:rsid w:val="00A8637F"/>
     <w:pPr>
       <w:keepLines/>
       <w:spacing w:after="80" w:line="288" w:lineRule="auto"/>
@@ -2792,21 +3012,21 @@
     <w:name w:val="SP Prayer English"/>
     <w:basedOn w:val="SPBodyText"/>
     <w:qFormat/>
-    <w:rsid w:val="006D0882"/>
-    <w:pPr>
-      <w:spacing w:before="240" w:after="240"/>
-      <w:ind w:firstLine="0"/>
+    <w:rsid w:val="00066ABD"/>
+    <w:pPr>
+      <w:spacing w:after="120" w:line="360" w:lineRule="auto"/>
+      <w:ind w:left="0" w:firstLine="0"/>
       <w:jc w:val="center"/>
     </w:pPr>
     <w:rPr>
-      <w:sz w:val="26"/>
+      <w:sz w:val="28"/>
     </w:rPr>
   </w:style>
   <w:style w:type="paragraph" w:customStyle="1" w:styleId="SPPrayerLatin">
     <w:name w:val="SP Prayer Latin"/>
     <w:basedOn w:val="SPPrayerEnglish"/>
     <w:qFormat/>
-    <w:rsid w:val="0074024C"/>
+    <w:rsid w:val="00066ABD"/>
     <w:rPr>
       <w:i/>
     </w:rPr>
@@ -3202,6 +3422,135 @@
     <w:rPr>
       <w:rFonts w:cs="Segoe UI Symbol"/>
       <w:b/>
+    </w:rPr>
+  </w:style>
+  <w:style w:type="paragraph" w:customStyle="1" w:styleId="SPPrayerTitle">
+    <w:name w:val="SP Prayer Title"/>
+    <w:basedOn w:val="Normal"/>
+    <w:qFormat/>
+    <w:rsid w:val="00251346"/>
+    <w:pPr>
+      <w:keepNext/>
+      <w:keepLines/>
+      <w:spacing w:after="480" w:line="240" w:lineRule="auto"/>
+      <w:ind w:left="0"/>
+      <w:jc w:val="center"/>
+      <w:outlineLvl w:val="0"/>
+    </w:pPr>
+    <w:rPr>
+      <w:rFonts w:ascii="Cinzel" w:hAnsi="Cinzel" w:cs="Segoe UI Symbol"/>
+      <w:sz w:val="40"/>
+    </w:rPr>
+  </w:style>
+  <w:style w:type="paragraph" w:customStyle="1" w:styleId="SPPrayerIntro">
+    <w:name w:val="SP Prayer Intro"/>
+    <w:basedOn w:val="SPBodyText"/>
+    <w:qFormat/>
+    <w:rsid w:val="00251346"/>
+    <w:pPr>
+      <w:keepNext/>
+      <w:keepLines w:val="0"/>
+      <w:spacing w:after="120"/>
+      <w:ind w:left="0"/>
+      <w:jc w:val="both"/>
+    </w:pPr>
+    <w:rPr>
+      <w:sz w:val="23"/>
+    </w:rPr>
+  </w:style>
+  <w:style w:type="paragraph" w:customStyle="1" w:styleId="SPLanguage">
+    <w:name w:val="SP Language"/>
+    <w:basedOn w:val="SPPrayerEnglish"/>
+    <w:qFormat/>
+    <w:rsid w:val="00066ABD"/>
+    <w:pPr>
+      <w:spacing w:before="240"/>
+    </w:pPr>
+  </w:style>
+  <w:style w:type="paragraph" w:customStyle="1" w:styleId="SPPronunciation">
+    <w:name w:val="SP Pronunciation"/>
+    <w:basedOn w:val="SPBodyText"/>
+    <w:qFormat/>
+    <w:rsid w:val="00B74AAA"/>
+    <w:pPr>
+      <w:keepNext/>
+      <w:spacing w:before="240" w:after="120" w:line="264" w:lineRule="auto"/>
+      <w:ind w:left="0" w:firstLine="0"/>
+      <w:jc w:val="center"/>
+    </w:pPr>
+    <w:rPr>
+      <w:i/>
+      <w:sz w:val="23"/>
+    </w:rPr>
+  </w:style>
+  <w:style w:type="paragraph" w:customStyle="1" w:styleId="SPPronunciationLabel">
+    <w:name w:val="SP Pronunciation Label"/>
+    <w:basedOn w:val="SPPronunciation"/>
+    <w:qFormat/>
+    <w:rsid w:val="00B74AAA"/>
+    <w:pPr>
+      <w:spacing w:before="360"/>
+    </w:pPr>
+    <w:rPr>
+      <w:rFonts w:ascii="Cinzel" w:hAnsi="Cinzel"/>
+      <w:i w:val="0"/>
+    </w:rPr>
+  </w:style>
+  <w:style w:type="paragraph" w:customStyle="1" w:styleId="pdq2pgselectionanchorcontainer">
+    <w:name w:val="pdq2pg_selectionanchorcontainer"/>
+    <w:basedOn w:val="Normal"/>
+    <w:rsid w:val="00B74AAA"/>
+    <w:pPr>
+      <w:spacing w:before="100" w:beforeAutospacing="1" w:after="100" w:afterAutospacing="1" w:line="240" w:lineRule="auto"/>
+      <w:ind w:left="0"/>
+      <w:jc w:val="left"/>
+    </w:pPr>
+    <w:rPr>
+      <w:rFonts w:ascii="Times New Roman" w:eastAsia="Times New Roman" w:hAnsi="Times New Roman" w:cs="Times New Roman"/>
+      <w:szCs w:val="24"/>
+      <w:lang w:eastAsia="en-ZA"/>
+      <w14:ligatures w14:val="none"/>
+    </w:rPr>
+  </w:style>
+  <w:style w:type="character" w:styleId="Strong">
+    <w:name w:val="Strong"/>
+    <w:basedOn w:val="DefaultParagraphFont"/>
+    <w:uiPriority w:val="22"/>
+    <w:qFormat/>
+    <w:rsid w:val="00B74AAA"/>
+    <w:rPr>
+      <w:b/>
+      <w:bCs/>
+    </w:rPr>
+  </w:style>
+  <w:style w:type="paragraph" w:styleId="NormalWeb">
+    <w:name w:val="Normal (Web)"/>
+    <w:basedOn w:val="Normal"/>
+    <w:uiPriority w:val="99"/>
+    <w:semiHidden/>
+    <w:unhideWhenUsed/>
+    <w:rsid w:val="00B74AAA"/>
+    <w:pPr>
+      <w:spacing w:before="100" w:beforeAutospacing="1" w:after="100" w:afterAutospacing="1" w:line="240" w:lineRule="auto"/>
+      <w:ind w:left="0"/>
+      <w:jc w:val="left"/>
+    </w:pPr>
+    <w:rPr>
+      <w:rFonts w:ascii="Times New Roman" w:eastAsia="Times New Roman" w:hAnsi="Times New Roman" w:cs="Times New Roman"/>
+      <w:szCs w:val="24"/>
+      <w:lang w:eastAsia="en-ZA"/>
+      <w14:ligatures w14:val="none"/>
+    </w:rPr>
+  </w:style>
+  <w:style w:type="character" w:styleId="Emphasis">
+    <w:name w:val="Emphasis"/>
+    <w:basedOn w:val="DefaultParagraphFont"/>
+    <w:uiPriority w:val="20"/>
+    <w:qFormat/>
+    <w:rsid w:val="00B74AAA"/>
+    <w:rPr>
+      <w:i/>
+      <w:iCs/>
     </w:rPr>
   </w:style>
 </w:styles>

</xml_diff>

<commit_message>
Establish prayer chapter template with Sign of the Cross
</commit_message>
<xml_diff>
--- a/manuscript/volume-1/sacrae-preces-volume-1.docx
+++ b/manuscript/volume-1/sacrae-preces-volume-1.docx
@@ -1701,6 +1701,11 @@
       <w:pPr>
         <w:pStyle w:val="SPBodyText"/>
       </w:pPr>
+      <w:proofErr w:type="spellStart"/>
+      <w:r>
+        <w:t>tt</w:t>
+      </w:r>
+      <w:proofErr w:type="spellEnd"/>
     </w:p>
     <w:p>
       <w:pPr>
@@ -1913,11 +1918,22 @@
     <w:p>
       <w:pPr>
         <w:pStyle w:val="SPPronunciation"/>
-      </w:pPr>
-      <w:r>
         <w:rPr>
           <w:rStyle w:val="Emphasis"/>
         </w:rPr>
+        <w:sectPr>
+          <w:type w:val="oddPage"/>
+          <w:pgSz w:w="7920" w:h="12240" w:code="6"/>
+          <w:pgMar w:top="1080" w:right="864" w:bottom="1080" w:left="1152" w:header="576" w:footer="576" w:gutter="0"/>
+          <w:cols w:space="720"/>
+          <w:titlePg/>
+          <w:docGrid w:linePitch="360"/>
+        </w:sectPr>
+      </w:pPr>
+      <w:r>
+        <w:rPr>
+          <w:rStyle w:val="Emphasis"/>
+        </w:rPr>
         <w:t>in NOH-mee-</w:t>
       </w:r>
       <w:proofErr w:type="spellStart"/>
@@ -1979,6 +1995,76 @@
           <w:rStyle w:val="Emphasis"/>
         </w:rPr>
         <w:t>AH-men.</w:t>
+      </w:r>
+    </w:p>
+    <w:p>
+      <w:pPr>
+        <w:pStyle w:val="SPSectionTitle"/>
+      </w:pPr>
+      <w:r>
+        <w:lastRenderedPageBreak/>
+        <w:t>Scripture</w:t>
+      </w:r>
+    </w:p>
+    <w:p>
+      <w:pPr>
+        <w:pStyle w:val="SPScriptureReference"/>
+      </w:pPr>
+      <w:r>
+        <w:t>Matthew 28:19</w:t>
+      </w:r>
+    </w:p>
+    <w:p>
+      <w:pPr>
+        <w:pStyle w:val="SPScripture"/>
+      </w:pPr>
+      <w:r>
+        <w:t>“Go therefore and make disciples of all nations, baptising them in the name of the Father and of the Son and of the Holy Spirit.”</w:t>
+      </w:r>
+    </w:p>
+    <w:p>
+      <w:pPr>
+        <w:pStyle w:val="SPScriptureReference"/>
+      </w:pPr>
+      <w:r>
+        <w:t>Galatians 6:14</w:t>
+      </w:r>
+    </w:p>
+    <w:p>
+      <w:pPr>
+        <w:pStyle w:val="SPScripture"/>
+      </w:pPr>
+      <w:r>
+        <w:t>“May I never boast of anything except the cross of our Lord Jesus Christ.”</w:t>
+      </w:r>
+    </w:p>
+    <w:p>
+      <w:pPr>
+        <w:pStyle w:val="SPScripture"/>
+      </w:pPr>
+    </w:p>
+    <w:p>
+      <w:pPr>
+        <w:pStyle w:val="SPPronunciationLabel"/>
+        <w:rPr>
+          <w:rFonts w:ascii="Garamond" w:hAnsi="Garamond"/>
+          <w:sz w:val="24"/>
+        </w:rPr>
+        <w:sectPr>
+          <w:type w:val="evenPage"/>
+          <w:pgSz w:w="7920" w:h="12240" w:code="6"/>
+          <w:pgMar w:top="1080" w:right="864" w:bottom="1080" w:left="1152" w:header="576" w:footer="576" w:gutter="0"/>
+          <w:cols w:space="720"/>
+          <w:titlePg/>
+          <w:docGrid w:linePitch="360"/>
+        </w:sectPr>
+      </w:pPr>
+      <w:r>
+        <w:rPr>
+          <w:rFonts w:ascii="Garamond" w:hAnsi="Garamond"/>
+          <w:sz w:val="24"/>
+        </w:rPr>
+        <w:t>The Sign of the Cross brings together two mysteries at the heart of Christian faith: the Holy Trinity and the Cross of Christ. With this simple gesture, we place ourselves in the presence of God, remembering the Father, the Son, and the Holy Spirit, and the love revealed to us through the Cross.</w:t>
       </w:r>
     </w:p>
     <w:p>
@@ -3035,10 +3121,11 @@
     <w:name w:val="SP Scripture"/>
     <w:basedOn w:val="SPBodyText"/>
     <w:qFormat/>
-    <w:rsid w:val="00225384"/>
-    <w:pPr>
-      <w:spacing w:before="120"/>
+    <w:rsid w:val="00090FFF"/>
+    <w:pPr>
+      <w:spacing w:before="120" w:after="120"/>
       <w:ind w:right="360" w:firstLine="0"/>
+      <w:jc w:val="both"/>
     </w:pPr>
     <w:rPr>
       <w:i/>
@@ -3551,6 +3638,20 @@
     <w:rPr>
       <w:i/>
       <w:iCs/>
+    </w:rPr>
+  </w:style>
+  <w:style w:type="paragraph" w:customStyle="1" w:styleId="SPScriptureReference">
+    <w:name w:val="SP Scripture Reference"/>
+    <w:basedOn w:val="SPScripture"/>
+    <w:qFormat/>
+    <w:rsid w:val="00090FFF"/>
+    <w:pPr>
+      <w:spacing w:before="240" w:line="240" w:lineRule="auto"/>
+      <w:ind w:left="0" w:right="0"/>
+    </w:pPr>
+    <w:rPr>
+      <w:b/>
+      <w:i w:val="0"/>
     </w:rPr>
   </w:style>
 </w:styles>

</xml_diff>

<commit_message>
Our Father Chapter completed
</commit_message>
<xml_diff>
--- a/manuscript/volume-1/sacrae-preces-volume-1.docx
+++ b/manuscript/volume-1/sacrae-preces-volume-1.docx
@@ -2106,6 +2106,919 @@
       <w:r>
         <w:t>Then begin your prayer.</w:t>
       </w:r>
+    </w:p>
+    <w:p>
+      <w:pPr>
+        <w:pStyle w:val="SPBodyText"/>
+        <w:jc w:val="center"/>
+        <w:rPr>
+          <w:rFonts w:ascii="Segoe UI Symbol" w:hAnsi="Segoe UI Symbol" w:cs="Segoe UI Symbol"/>
+        </w:rPr>
+      </w:pPr>
+      <w:r>
+        <w:rPr>
+          <w:rFonts w:ascii="Segoe UI Symbol" w:hAnsi="Segoe UI Symbol" w:cs="Segoe UI Symbol"/>
+        </w:rPr>
+        <w:lastRenderedPageBreak/>
+        <w:t>✠</w:t>
+      </w:r>
+    </w:p>
+    <w:p>
+      <w:pPr>
+        <w:pStyle w:val="SPBodyText"/>
+        <w:jc w:val="center"/>
+        <w:rPr>
+          <w:rFonts w:ascii="Segoe UI Symbol" w:hAnsi="Segoe UI Symbol" w:cs="Segoe UI Symbol"/>
+        </w:rPr>
+      </w:pPr>
+    </w:p>
+    <w:p>
+      <w:pPr>
+        <w:pStyle w:val="SPPrayerTitle"/>
+      </w:pPr>
+      <w:r>
+        <w:t>The Our Father</w:t>
+      </w:r>
+    </w:p>
+    <w:p>
+      <w:pPr>
+        <w:pStyle w:val="SPBodyText"/>
+      </w:pPr>
+      <w:r>
+        <w:t>The Our Father is the prayer Christ gave to His disciples when they asked Him how they should pray. It is at once simple enough for a child to learn and deep enough to accompany a lifetime of prayer.</w:t>
+      </w:r>
+    </w:p>
+    <w:p>
+      <w:pPr>
+        <w:pStyle w:val="SPBodyText"/>
+      </w:pPr>
+      <w:r>
+        <w:t>In these words, we turn towards God as Father, ask for His Kingdom to come, place our daily needs in His hands, seek forgiveness, and ask for strength to remain faithful.</w:t>
+      </w:r>
+    </w:p>
+    <w:p>
+      <w:pPr>
+        <w:pStyle w:val="SPBodyText"/>
+      </w:pPr>
+      <w:r>
+        <w:t>The prayer is not only something we say. It is also a way of learning how to pray.</w:t>
+      </w:r>
+    </w:p>
+    <w:p>
+      <w:pPr>
+        <w:pStyle w:val="SPBodyText"/>
+      </w:pPr>
+    </w:p>
+    <w:p>
+      <w:pPr>
+        <w:pStyle w:val="SPPrayerEnglish"/>
+      </w:pPr>
+      <w:r>
+        <w:t>Pray these words slowly</w:t>
+      </w:r>
+      <w:r>
+        <w:t>.</w:t>
+      </w:r>
+      <w:r>
+        <w:tab/>
+      </w:r>
+    </w:p>
+    <w:p>
+      <w:pPr>
+        <w:sectPr>
+          <w:type w:val="oddPage"/>
+          <w:pgSz w:w="7920" w:h="12240" w:code="6"/>
+          <w:pgMar w:top="1080" w:right="864" w:bottom="1080" w:left="1152" w:header="576" w:footer="576" w:gutter="0"/>
+          <w:cols w:space="720"/>
+          <w:titlePg/>
+          <w:docGrid w:linePitch="360"/>
+        </w:sectPr>
+      </w:pPr>
+    </w:p>
+    <w:p>
+      <w:pPr>
+        <w:pStyle w:val="SPLanguage"/>
+      </w:pPr>
+      <w:r>
+        <w:lastRenderedPageBreak/>
+        <w:t xml:space="preserve">ENGLISH </w:t>
+      </w:r>
+    </w:p>
+    <w:p>
+      <w:pPr>
+        <w:pStyle w:val="SPPrayerEnglish"/>
+      </w:pPr>
+      <w:r>
+        <w:t>Our Father, who art in Heaven,</w:t>
+      </w:r>
+    </w:p>
+    <w:p>
+      <w:pPr>
+        <w:pStyle w:val="SPPrayerEnglish"/>
+      </w:pPr>
+      <w:r>
+        <w:t>Hallowed be thy Name.</w:t>
+      </w:r>
+    </w:p>
+    <w:p>
+      <w:pPr>
+        <w:pStyle w:val="SPPrayerEnglish"/>
+      </w:pPr>
+      <w:r>
+        <w:t>Thy Kingdom Come.</w:t>
+      </w:r>
+    </w:p>
+    <w:p>
+      <w:pPr>
+        <w:pStyle w:val="SPPrayerEnglish"/>
+      </w:pPr>
+      <w:r>
+        <w:t>Thy will be done, on earth as it is in Heaven.</w:t>
+      </w:r>
+    </w:p>
+    <w:p>
+      <w:pPr>
+        <w:pStyle w:val="SPPrayerEnglish"/>
+      </w:pPr>
+      <w:r>
+        <w:t>Give us this day our daily bread,</w:t>
+      </w:r>
+    </w:p>
+    <w:p>
+      <w:pPr>
+        <w:pStyle w:val="SPPrayerEnglish"/>
+      </w:pPr>
+      <w:r>
+        <w:t>And forgive us our trespasses,</w:t>
+      </w:r>
+    </w:p>
+    <w:p>
+      <w:pPr>
+        <w:pStyle w:val="SPPrayerEnglish"/>
+      </w:pPr>
+      <w:r>
+        <w:t>As we forgive those who trespass against us.</w:t>
+      </w:r>
+    </w:p>
+    <w:p>
+      <w:pPr>
+        <w:pStyle w:val="SPPrayerEnglish"/>
+      </w:pPr>
+      <w:r>
+        <w:t>And lead us not into temptation</w:t>
+      </w:r>
+    </w:p>
+    <w:p>
+      <w:pPr>
+        <w:pStyle w:val="SPPrayerEnglish"/>
+      </w:pPr>
+      <w:r>
+        <w:t>But deliver us from evil</w:t>
+      </w:r>
+      <w:r>
+        <w:t xml:space="preserve">. </w:t>
+      </w:r>
+    </w:p>
+    <w:p>
+      <w:pPr>
+        <w:pStyle w:val="SPPrayerEnglish"/>
+        <w:sectPr>
+          <w:type w:val="evenPage"/>
+          <w:pgSz w:w="7920" w:h="12240" w:code="6"/>
+          <w:pgMar w:top="1080" w:right="864" w:bottom="1080" w:left="1152" w:header="576" w:footer="576" w:gutter="0"/>
+          <w:cols w:space="720"/>
+          <w:titlePg/>
+          <w:docGrid w:linePitch="360"/>
+        </w:sectPr>
+      </w:pPr>
+      <w:r>
+        <w:t>Amen.</w:t>
+      </w:r>
+    </w:p>
+    <w:p>
+      <w:pPr>
+        <w:pStyle w:val="SPLanguage"/>
+      </w:pPr>
+      <w:r>
+        <w:lastRenderedPageBreak/>
+        <w:t>LATIN</w:t>
+      </w:r>
+    </w:p>
+    <w:p>
+      <w:pPr>
+        <w:pStyle w:val="SPPrayerLatin"/>
+      </w:pPr>
+      <w:r>
+        <w:t xml:space="preserve">Pater </w:t>
+      </w:r>
+      <w:proofErr w:type="spellStart"/>
+      <w:r>
+        <w:t>noster</w:t>
+      </w:r>
+      <w:proofErr w:type="spellEnd"/>
+      <w:r>
+        <w:t xml:space="preserve">, qui es in </w:t>
+      </w:r>
+      <w:proofErr w:type="spellStart"/>
+      <w:r>
+        <w:t>caelis</w:t>
+      </w:r>
+      <w:proofErr w:type="spellEnd"/>
+      <w:r>
+        <w:t>,</w:t>
+      </w:r>
+    </w:p>
+    <w:p>
+      <w:pPr>
+        <w:pStyle w:val="SPPrayerLatin"/>
+      </w:pPr>
+      <w:proofErr w:type="spellStart"/>
+      <w:r>
+        <w:t>Sanctificetur</w:t>
+      </w:r>
+      <w:proofErr w:type="spellEnd"/>
+      <w:r>
+        <w:t xml:space="preserve"> nomen </w:t>
+      </w:r>
+      <w:proofErr w:type="spellStart"/>
+      <w:r>
+        <w:t>tuum</w:t>
+      </w:r>
+      <w:proofErr w:type="spellEnd"/>
+      <w:r>
+        <w:t>.</w:t>
+      </w:r>
+    </w:p>
+    <w:p>
+      <w:pPr>
+        <w:pStyle w:val="SPPrayerLatin"/>
+      </w:pPr>
+      <w:proofErr w:type="spellStart"/>
+      <w:r>
+        <w:t>Adveniat</w:t>
+      </w:r>
+      <w:proofErr w:type="spellEnd"/>
+      <w:r>
+        <w:t xml:space="preserve"> regnum </w:t>
+      </w:r>
+      <w:proofErr w:type="spellStart"/>
+      <w:r>
+        <w:t>tuum</w:t>
+      </w:r>
+      <w:proofErr w:type="spellEnd"/>
+      <w:r>
+        <w:t>.</w:t>
+      </w:r>
+      <w:r>
+        <w:t xml:space="preserve"> </w:t>
+      </w:r>
+    </w:p>
+    <w:p>
+      <w:pPr>
+        <w:pStyle w:val="SPPrayerLatin"/>
+      </w:pPr>
+      <w:r>
+        <w:t xml:space="preserve">Fiat </w:t>
+      </w:r>
+      <w:proofErr w:type="spellStart"/>
+      <w:r>
+        <w:t>voluntas</w:t>
+      </w:r>
+      <w:proofErr w:type="spellEnd"/>
+      <w:r>
+        <w:t xml:space="preserve"> </w:t>
+      </w:r>
+      <w:proofErr w:type="spellStart"/>
+      <w:r>
+        <w:t>tua</w:t>
+      </w:r>
+      <w:proofErr w:type="spellEnd"/>
+      <w:r>
+        <w:t xml:space="preserve">, sicut in </w:t>
+      </w:r>
+      <w:proofErr w:type="spellStart"/>
+      <w:r>
+        <w:t>caelo</w:t>
+      </w:r>
+      <w:proofErr w:type="spellEnd"/>
+      <w:r>
+        <w:t xml:space="preserve"> et in terra.</w:t>
+      </w:r>
+    </w:p>
+    <w:p>
+      <w:pPr>
+        <w:pStyle w:val="SPPrayerLatin"/>
+      </w:pPr>
+      <w:r>
+        <w:t xml:space="preserve">Panem nostrum </w:t>
+      </w:r>
+      <w:proofErr w:type="spellStart"/>
+      <w:r>
+        <w:t>quotidianum</w:t>
+      </w:r>
+      <w:proofErr w:type="spellEnd"/>
+      <w:r>
+        <w:t xml:space="preserve"> do nobis </w:t>
+      </w:r>
+      <w:proofErr w:type="spellStart"/>
+      <w:r>
+        <w:t>hodie</w:t>
+      </w:r>
+      <w:proofErr w:type="spellEnd"/>
+      <w:r>
+        <w:t>,</w:t>
+      </w:r>
+    </w:p>
+    <w:p>
+      <w:pPr>
+        <w:pStyle w:val="SPPrayerLatin"/>
+      </w:pPr>
+      <w:r>
+        <w:t xml:space="preserve">Et </w:t>
+      </w:r>
+      <w:proofErr w:type="spellStart"/>
+      <w:r>
+        <w:t>dimitte</w:t>
+      </w:r>
+      <w:proofErr w:type="spellEnd"/>
+      <w:r>
+        <w:t xml:space="preserve"> nobis </w:t>
+      </w:r>
+      <w:proofErr w:type="spellStart"/>
+      <w:r>
+        <w:t>debita</w:t>
+      </w:r>
+      <w:proofErr w:type="spellEnd"/>
+      <w:r>
+        <w:t xml:space="preserve"> nostra,</w:t>
+      </w:r>
+    </w:p>
+    <w:p>
+      <w:pPr>
+        <w:pStyle w:val="SPPrayerLatin"/>
+      </w:pPr>
+      <w:r>
+        <w:t xml:space="preserve">Sicut et </w:t>
+      </w:r>
+      <w:proofErr w:type="spellStart"/>
+      <w:r>
+        <w:t>nos</w:t>
+      </w:r>
+      <w:proofErr w:type="spellEnd"/>
+      <w:r>
+        <w:t xml:space="preserve"> </w:t>
+      </w:r>
+      <w:proofErr w:type="spellStart"/>
+      <w:r>
+        <w:t>dimittimus</w:t>
+      </w:r>
+      <w:proofErr w:type="spellEnd"/>
+      <w:r>
+        <w:t xml:space="preserve"> </w:t>
+      </w:r>
+      <w:proofErr w:type="spellStart"/>
+      <w:r>
+        <w:t>debitoribus</w:t>
+      </w:r>
+      <w:proofErr w:type="spellEnd"/>
+      <w:r>
+        <w:t xml:space="preserve"> </w:t>
+      </w:r>
+      <w:proofErr w:type="spellStart"/>
+      <w:r>
+        <w:t>nostris</w:t>
+      </w:r>
+      <w:proofErr w:type="spellEnd"/>
+      <w:r>
+        <w:t>.</w:t>
+      </w:r>
+    </w:p>
+    <w:p>
+      <w:pPr>
+        <w:pStyle w:val="SPPrayerLatin"/>
+      </w:pPr>
+      <w:r>
+        <w:t xml:space="preserve">Et ne </w:t>
+      </w:r>
+      <w:proofErr w:type="spellStart"/>
+      <w:r>
+        <w:t>nos</w:t>
+      </w:r>
+      <w:proofErr w:type="spellEnd"/>
+      <w:r>
+        <w:t xml:space="preserve"> </w:t>
+      </w:r>
+      <w:proofErr w:type="spellStart"/>
+      <w:r>
+        <w:t>inducasin</w:t>
+      </w:r>
+      <w:proofErr w:type="spellEnd"/>
+      <w:r>
+        <w:t xml:space="preserve"> </w:t>
+      </w:r>
+      <w:proofErr w:type="spellStart"/>
+      <w:r>
+        <w:t>tentationem</w:t>
+      </w:r>
+      <w:proofErr w:type="spellEnd"/>
+    </w:p>
+    <w:p>
+      <w:pPr>
+        <w:pStyle w:val="SPPrayerLatin"/>
+      </w:pPr>
+      <w:r>
+        <w:t xml:space="preserve">Sed libera </w:t>
+      </w:r>
+      <w:proofErr w:type="spellStart"/>
+      <w:r>
+        <w:t>nos</w:t>
+      </w:r>
+      <w:proofErr w:type="spellEnd"/>
+      <w:r>
+        <w:t xml:space="preserve"> a </w:t>
+      </w:r>
+      <w:proofErr w:type="spellStart"/>
+      <w:r>
+        <w:t>malo</w:t>
+      </w:r>
+      <w:proofErr w:type="spellEnd"/>
+    </w:p>
+    <w:p>
+      <w:pPr>
+        <w:pStyle w:val="SPPrayerLatin"/>
+      </w:pPr>
+      <w:r>
+        <w:t>Amen.</w:t>
+      </w:r>
+    </w:p>
+    <w:p>
+      <w:pPr>
+        <w:pStyle w:val="SPPronunciation"/>
+        <w:rPr>
+          <w:rStyle w:val="Emphasis"/>
+        </w:rPr>
+        <w:sectPr>
+          <w:type w:val="oddPage"/>
+          <w:pgSz w:w="7920" w:h="12240" w:code="6"/>
+          <w:pgMar w:top="1080" w:right="864" w:bottom="1080" w:left="1152" w:header="576" w:footer="576" w:gutter="0"/>
+          <w:cols w:space="720"/>
+          <w:titlePg/>
+          <w:docGrid w:linePitch="360"/>
+        </w:sectPr>
+      </w:pPr>
+    </w:p>
+    <w:p>
+      <w:pPr>
+        <w:pStyle w:val="SPSectionTitle"/>
+      </w:pPr>
+      <w:r>
+        <w:lastRenderedPageBreak/>
+        <w:t>Scripture</w:t>
+      </w:r>
+    </w:p>
+    <w:p>
+      <w:pPr>
+        <w:pStyle w:val="SPScriptureReference"/>
+      </w:pPr>
+      <w:r>
+        <w:t xml:space="preserve">Matthew </w:t>
+      </w:r>
+      <w:r>
+        <w:t>6:9-13</w:t>
+      </w:r>
+    </w:p>
+    <w:p>
+      <w:pPr>
+        <w:pStyle w:val="SPScripture"/>
+      </w:pPr>
+      <w:r>
+        <w:t>“</w:t>
+      </w:r>
+      <w:r>
+        <w:t>Pray then like this:</w:t>
+      </w:r>
+    </w:p>
+    <w:p>
+      <w:pPr>
+        <w:pStyle w:val="SPScripture"/>
+      </w:pPr>
+      <w:r>
+        <w:t xml:space="preserve">Our Father who art in heaven, Hallowed be thy name. Thy kingdom </w:t>
+      </w:r>
+      <w:proofErr w:type="gramStart"/>
+      <w:r>
+        <w:t>come</w:t>
+      </w:r>
+      <w:proofErr w:type="gramEnd"/>
+      <w:r>
+        <w:t>.</w:t>
+      </w:r>
+      <w:r>
+        <w:t xml:space="preserve"> Thy will be done, </w:t>
+      </w:r>
+      <w:r>
+        <w:t>o</w:t>
+      </w:r>
+      <w:r>
+        <w:t>n earth as it is in heaven. Give us this day our daily bread</w:t>
+      </w:r>
+      <w:r>
+        <w:t xml:space="preserve">; </w:t>
+      </w:r>
+      <w:r>
+        <w:t>a</w:t>
+      </w:r>
+      <w:r>
+        <w:t xml:space="preserve">nd forgive us our </w:t>
+      </w:r>
+      <w:r>
+        <w:t>trespasses</w:t>
+      </w:r>
+      <w:r>
+        <w:t xml:space="preserve">, </w:t>
+      </w:r>
+      <w:r>
+        <w:t>a</w:t>
+      </w:r>
+      <w:r>
+        <w:t xml:space="preserve">s we </w:t>
+      </w:r>
+      <w:r>
+        <w:t>forgive those who trespass against us</w:t>
+      </w:r>
+      <w:r>
+        <w:t>;</w:t>
+      </w:r>
+      <w:r>
+        <w:t xml:space="preserve"> </w:t>
+      </w:r>
+      <w:r>
+        <w:t xml:space="preserve">And lead us not into </w:t>
+      </w:r>
+      <w:proofErr w:type="gramStart"/>
+      <w:r>
+        <w:t xml:space="preserve">temptation, </w:t>
+      </w:r>
+      <w:r>
+        <w:t>b</w:t>
+      </w:r>
+      <w:r>
+        <w:t>ut</w:t>
+      </w:r>
+      <w:proofErr w:type="gramEnd"/>
+      <w:r>
+        <w:t xml:space="preserve"> deliver us from evil.</w:t>
+      </w:r>
+      <w:r>
+        <w:t>”</w:t>
+      </w:r>
+    </w:p>
+    <w:p>
+      <w:pPr>
+        <w:pStyle w:val="SPScriptureReference"/>
+      </w:pPr>
+      <w:r>
+        <w:t>Luke 11:2-4</w:t>
+      </w:r>
+    </w:p>
+    <w:p>
+      <w:pPr>
+        <w:pStyle w:val="SPScripture"/>
+      </w:pPr>
+      <w:r>
+        <w:t xml:space="preserve">And He said to them “When you pray, say: </w:t>
+      </w:r>
+      <w:r>
+        <w:t xml:space="preserve">Father, hallowed be </w:t>
+      </w:r>
+      <w:r>
+        <w:t>your</w:t>
+      </w:r>
+      <w:r>
+        <w:t xml:space="preserve"> name. </w:t>
+      </w:r>
+      <w:r>
+        <w:t>Your</w:t>
+      </w:r>
+      <w:r>
+        <w:t xml:space="preserve"> kingdom </w:t>
+      </w:r>
+      <w:proofErr w:type="gramStart"/>
+      <w:r>
+        <w:t>come</w:t>
+      </w:r>
+      <w:proofErr w:type="gramEnd"/>
+      <w:r>
+        <w:t xml:space="preserve">. Give us each day our daily bread; and forgive us our sins, for we ourselves forgive </w:t>
+      </w:r>
+      <w:proofErr w:type="spellStart"/>
+      <w:proofErr w:type="gramStart"/>
+      <w:r>
+        <w:t>every one</w:t>
+      </w:r>
+      <w:proofErr w:type="spellEnd"/>
+      <w:proofErr w:type="gramEnd"/>
+      <w:r>
+        <w:t xml:space="preserve"> who is indebted to us; and lead us not into temptation.</w:t>
+      </w:r>
+      <w:r>
+        <w:t>”</w:t>
+      </w:r>
+    </w:p>
+    <w:p>
+      <w:pPr>
+        <w:pStyle w:val="SPScripture"/>
+      </w:pPr>
+    </w:p>
+    <w:p>
+      <w:pPr>
+        <w:pStyle w:val="SPBodyText"/>
+      </w:pPr>
+      <w:r>
+        <w:rPr>
+          <w:bCs/>
+        </w:rPr>
+        <w:t>The Our Father is given to us directly from the teaching of Christ.</w:t>
+      </w:r>
+      <w:r>
+        <w:t xml:space="preserve"> In Matthew, Jesus gives the prayer as part of His teaching on how His disciples should pray. In Luke, the disciples ask Him to teach them, and He answers with these words.</w:t>
+      </w:r>
+    </w:p>
+    <w:p>
+      <w:pPr>
+        <w:pStyle w:val="SPBodyText"/>
+        <w:sectPr>
+          <w:type w:val="evenPage"/>
+          <w:pgSz w:w="7920" w:h="12240" w:code="6"/>
+          <w:pgMar w:top="1080" w:right="864" w:bottom="1080" w:left="1152" w:header="576" w:footer="576" w:gutter="0"/>
+          <w:cols w:space="720"/>
+          <w:titlePg/>
+          <w:docGrid w:linePitch="360"/>
+        </w:sectPr>
+      </w:pPr>
+      <w:r>
+        <w:t xml:space="preserve">The two accounts remind us that prayer is both gift and invitation: Christ teaches us how to turn towards the Father, </w:t>
+      </w:r>
+      <w:r>
+        <w:t>bringing before Him the needs of each day and asking for the grace to forgive as we ourselves seek forgiveness.</w:t>
+      </w:r>
+      <w:r>
+        <w:t xml:space="preserve"> </w:t>
+      </w:r>
+    </w:p>
+    <w:p>
+      <w:pPr>
+        <w:pStyle w:val="SPSectionTitle"/>
+      </w:pPr>
+      <w:r>
+        <w:lastRenderedPageBreak/>
+        <w:t>Reflection</w:t>
+      </w:r>
+    </w:p>
+    <w:p>
+      <w:pPr>
+        <w:pStyle w:val="SPBodyText"/>
+        <w:rPr>
+          <w:b/>
+          <w:bCs/>
+        </w:rPr>
+      </w:pPr>
+      <w:r>
+        <w:t xml:space="preserve"> </w:t>
+      </w:r>
+      <w:r>
+        <w:rPr>
+          <w:b/>
+          <w:bCs/>
+        </w:rPr>
+        <w:t>The Father We Share</w:t>
+      </w:r>
+    </w:p>
+    <w:p>
+      <w:pPr>
+        <w:pStyle w:val="SPBodyText"/>
+      </w:pPr>
+      <w:r>
+        <w:t xml:space="preserve">The first word is not </w:t>
+      </w:r>
+      <w:proofErr w:type="gramStart"/>
+      <w:r>
+        <w:rPr>
+          <w:i/>
+          <w:iCs/>
+        </w:rPr>
+        <w:t>my</w:t>
+      </w:r>
+      <w:proofErr w:type="gramEnd"/>
+      <w:r>
+        <w:t xml:space="preserve">. It is </w:t>
+      </w:r>
+      <w:proofErr w:type="spellStart"/>
+      <w:proofErr w:type="gramStart"/>
+      <w:r>
+        <w:rPr>
+          <w:i/>
+          <w:iCs/>
+        </w:rPr>
+        <w:t>our</w:t>
+      </w:r>
+      <w:proofErr w:type="spellEnd"/>
+      <w:proofErr w:type="gramEnd"/>
+      <w:r>
+        <w:t>.</w:t>
+      </w:r>
+    </w:p>
+    <w:p>
+      <w:pPr>
+        <w:pStyle w:val="SPBodyText"/>
+      </w:pPr>
+      <w:r>
+        <w:t>When we pray the words taught to us by Christ, we do not stand before God alone. We come as His children, and we come alongside one another. The Father we address is not the possession of one person, one family, one nation, or one station in life. He is our Father.</w:t>
+      </w:r>
+    </w:p>
+    <w:p>
+      <w:pPr>
+        <w:pStyle w:val="SPBodyText"/>
+      </w:pPr>
+      <w:r>
+        <w:t>That changes the way we pray.</w:t>
+      </w:r>
+    </w:p>
+    <w:p>
+      <w:pPr>
+        <w:pStyle w:val="SPBodyText"/>
+      </w:pPr>
+      <w:r>
+        <w:t xml:space="preserve">We ask for </w:t>
+      </w:r>
+      <w:r>
+        <w:rPr>
+          <w:b/>
+          <w:bCs/>
+        </w:rPr>
+        <w:t>our</w:t>
+      </w:r>
+      <w:r>
+        <w:t xml:space="preserve"> daily bread. We acknowledge that everything we have is received, and that none of us lives entirely for ourselves. The needs of another are not separate from our own. We are invited to remember those who hunger, those who struggle, and those who have less than we do.</w:t>
+      </w:r>
+    </w:p>
+    <w:p>
+      <w:pPr>
+        <w:pStyle w:val="SPBodyText"/>
+      </w:pPr>
+      <w:r>
+        <w:t>We ask for forgiveness, knowing that we ourselves are sinners in need of mercy. The prayer leaves no room for pride. Before we consider the faults of another, we are reminded of our own need for God's grace.</w:t>
+      </w:r>
+    </w:p>
+    <w:p>
+      <w:pPr>
+        <w:pStyle w:val="SPBodyText"/>
+      </w:pPr>
+      <w:r>
+        <w:t>And then comes the difficult part:</w:t>
+      </w:r>
+    </w:p>
+    <w:p>
+      <w:pPr>
+        <w:pStyle w:val="SPBodyText"/>
+      </w:pPr>
+      <w:r>
+        <w:rPr>
+          <w:i/>
+          <w:iCs/>
+        </w:rPr>
+        <w:t>As we forgive those who trespass against us.</w:t>
+      </w:r>
+    </w:p>
+    <w:p>
+      <w:pPr>
+        <w:pStyle w:val="SPBodyText"/>
+      </w:pPr>
+      <w:r>
+        <w:lastRenderedPageBreak/>
+        <w:t xml:space="preserve">We ask God to show us mercy while promising to extend that mercy to others. We cannot pray for forgiveness while deliberately </w:t>
+      </w:r>
+      <w:r>
+        <w:t>refusing to extend it to another</w:t>
+      </w:r>
+      <w:r>
+        <w:t>. Forgiveness does not make wrong things right, nor does it deny the hurt that has been caused. It releases our desire to become the judge and places the matter once more into the hands of God.</w:t>
+      </w:r>
+    </w:p>
+    <w:p>
+      <w:pPr>
+        <w:pStyle w:val="SPBodyText"/>
+      </w:pPr>
+      <w:r>
+        <w:t xml:space="preserve">Even </w:t>
+      </w:r>
+      <w:r>
+        <w:rPr>
+          <w:i/>
+          <w:iCs/>
+        </w:rPr>
+        <w:t>Hallowed be thy Name</w:t>
+      </w:r>
+      <w:r>
+        <w:t xml:space="preserve"> is not simply a statement about God. It is an invitation to live in such a way that His name is honoured through us.</w:t>
+      </w:r>
+    </w:p>
+    <w:p>
+      <w:pPr>
+        <w:pStyle w:val="SPBodyText"/>
+      </w:pPr>
+      <w:r>
+        <w:t>We are many, but we pray as one.</w:t>
+      </w:r>
+    </w:p>
+    <w:p>
+      <w:pPr>
+        <w:pStyle w:val="SPBodyText"/>
+      </w:pPr>
+      <w:r>
+        <w:t>We bring our needs, our failures, our hopes, and our gratitude before the same Father. Whatever our circumstances or our place in the world, we stand equally in need of His grace.</w:t>
+      </w:r>
+    </w:p>
+    <w:p>
+      <w:pPr>
+        <w:pStyle w:val="SPBodyText"/>
+      </w:pPr>
+      <w:r>
+        <w:t>So,</w:t>
+      </w:r>
+      <w:r>
+        <w:t xml:space="preserve"> pray the word slowly.</w:t>
+      </w:r>
+    </w:p>
+    <w:p>
+      <w:pPr>
+        <w:pStyle w:val="SPBodyText"/>
+      </w:pPr>
+      <w:r>
+        <w:rPr>
+          <w:b/>
+          <w:bCs/>
+        </w:rPr>
+        <w:t>Our.</w:t>
+      </w:r>
+    </w:p>
+    <w:p>
+      <w:pPr>
+        <w:pStyle w:val="SPBodyText"/>
+      </w:pPr>
+      <w:r>
+        <w:t>Let it remind you that you are not alone.</w:t>
+      </w:r>
+    </w:p>
+    <w:p>
+      <w:pPr>
+        <w:pStyle w:val="SPBodyText"/>
+      </w:pPr>
+      <w:r>
+        <w:t>And when you ask for bread, remember another who is hungry.</w:t>
+      </w:r>
+      <w:r>
+        <w:br/>
+        <w:t>When you ask for forgiveness, remember your own need for mercy.</w:t>
+      </w:r>
+      <w:r>
+        <w:br/>
+        <w:t>When you ask for God's Kingdom, remember that it is not yours alone.</w:t>
+      </w:r>
+    </w:p>
+    <w:p>
+      <w:pPr>
+        <w:pStyle w:val="SPBodyText"/>
+      </w:pPr>
+    </w:p>
+    <w:p>
+      <w:pPr>
+        <w:pStyle w:val="SPBodyText"/>
+      </w:pPr>
+      <w:r>
+        <w:t>Then forgive.</w:t>
+      </w:r>
+    </w:p>
+    <w:p>
+      <w:pPr>
+        <w:pStyle w:val="SPBodyText"/>
+      </w:pPr>
+      <w:r>
+        <w:t>And let the name of the Father be hallowed in the way you live.</w:t>
+      </w:r>
+    </w:p>
+    <w:p>
+      <w:pPr>
+        <w:pStyle w:val="SPBodyText"/>
+        <w:sectPr>
+          <w:type w:val="oddPage"/>
+          <w:pgSz w:w="7920" w:h="12240" w:code="6"/>
+          <w:pgMar w:top="1080" w:right="864" w:bottom="1080" w:left="1152" w:header="576" w:footer="576" w:gutter="0"/>
+          <w:cols w:space="720"/>
+          <w:titlePg/>
+          <w:docGrid w:linePitch="360"/>
+        </w:sectPr>
+      </w:pPr>
     </w:p>
     <w:p>
       <w:pPr>
@@ -3699,6 +4612,29 @@
       <w:i w:val="0"/>
     </w:rPr>
   </w:style>
+  <w:style w:type="character" w:styleId="Hyperlink">
+    <w:name w:val="Hyperlink"/>
+    <w:basedOn w:val="DefaultParagraphFont"/>
+    <w:uiPriority w:val="99"/>
+    <w:unhideWhenUsed/>
+    <w:rsid w:val="002D4A74"/>
+    <w:rPr>
+      <w:color w:val="467886" w:themeColor="hyperlink"/>
+      <w:u w:val="single"/>
+    </w:rPr>
+  </w:style>
+  <w:style w:type="character" w:styleId="UnresolvedMention">
+    <w:name w:val="Unresolved Mention"/>
+    <w:basedOn w:val="DefaultParagraphFont"/>
+    <w:uiPriority w:val="99"/>
+    <w:semiHidden/>
+    <w:unhideWhenUsed/>
+    <w:rsid w:val="002D4A74"/>
+    <w:rPr>
+      <w:color w:val="605E5C"/>
+      <w:shd w:val="clear" w:color="auto" w:fill="E1DFDD"/>
+    </w:rPr>
+  </w:style>
 </w:styles>
 </file>
 

</xml_diff>

<commit_message>
Hail Mary Chapter Complete
</commit_message>
<xml_diff>
--- a/manuscript/volume-1/sacrae-preces-volume-1.docx
+++ b/manuscript/volume-1/sacrae-preces-volume-1.docx
@@ -431,15 +431,7 @@
         <w:pStyle w:val="SPBodyText"/>
       </w:pPr>
       <w:r>
-        <w:t xml:space="preserve">We can spend our days surrounded by noise, responsibilities, conversations, messages, and countless things competing for our attention. </w:t>
-      </w:r>
-      <w:proofErr w:type="gramStart"/>
-      <w:r>
-        <w:t>In the midst of</w:t>
-      </w:r>
-      <w:proofErr w:type="gramEnd"/>
-      <w:r>
-        <w:t xml:space="preserve"> all of this, prayer calls us to stop. To become still. To turn our hearts towards God.</w:t>
+        <w:t>We can spend our days surrounded by noise, responsibilities, conversations, messages, and countless things competing for our attention. In the midst of all of this, prayer calls us to stop. To become still. To turn our hearts towards God.</w:t>
       </w:r>
     </w:p>
     <w:p>
@@ -523,15 +515,7 @@
         <w:t>"Sacred Prayers."</w:t>
       </w:r>
       <w:r>
-        <w:t xml:space="preserve"> The name reflects something simple: these prayers are part of a rich inheritance that has been handed down through the life of the Church. They belong not merely to one generation, one country, or one language. They have crossed centuries and borders, carried by ordinary people who have sought God </w:t>
-      </w:r>
-      <w:proofErr w:type="gramStart"/>
-      <w:r>
-        <w:t>in the midst of</w:t>
-      </w:r>
-      <w:proofErr w:type="gramEnd"/>
-      <w:r>
-        <w:t xml:space="preserve"> ordinary lives.</w:t>
+        <w:t xml:space="preserve"> The name reflects something simple: these prayers are part of a rich inheritance that has been handed down through the life of the Church. They belong not merely to one generation, one country, or one language. They have crossed centuries and borders, carried by ordinary people who have sought God in the midst of ordinary lives.</w:t>
       </w:r>
     </w:p>
     <w:p>
@@ -606,15 +590,7 @@
         <w:pStyle w:val="SPBodyText"/>
       </w:pPr>
       <w:r>
-        <w:t xml:space="preserve">For this reason, each prayer is accompanied by material intended for reflection and study. We look at its place in Scripture, consider why Christians have prayed it, explore the meaning of its petitions, and examine some of the Latin words that give the prayer its </w:t>
-      </w:r>
-      <w:proofErr w:type="gramStart"/>
-      <w:r>
-        <w:t>particular character</w:t>
-      </w:r>
-      <w:proofErr w:type="gramEnd"/>
-      <w:r>
-        <w:t>.</w:t>
+        <w:t>For this reason, each prayer is accompanied by material intended for reflection and study. We look at its place in Scripture, consider why Christians have prayed it, explore the meaning of its petitions, and examine some of the Latin words that give the prayer its particular character.</w:t>
       </w:r>
     </w:p>
     <w:p>
@@ -762,15 +738,7 @@
       </w:pPr>
       <w:r>
         <w:lastRenderedPageBreak/>
-        <w:t xml:space="preserve">And someone who learns to pray may eventually discover that prayer is not something we merely do at </w:t>
-      </w:r>
-      <w:proofErr w:type="gramStart"/>
-      <w:r>
-        <w:t>particular times</w:t>
-      </w:r>
-      <w:proofErr w:type="gramEnd"/>
-      <w:r>
-        <w:t>.</w:t>
+        <w:t>And someone who learns to pray may eventually discover that prayer is not something we merely do at particular times.</w:t>
       </w:r>
     </w:p>
     <w:p>
@@ -1008,15 +976,7 @@
         <w:pStyle w:val="SPBodyText"/>
       </w:pPr>
       <w:r>
-        <w:t xml:space="preserve">It is not necessary to read this book from beginning to end. There is no </w:t>
-      </w:r>
-      <w:proofErr w:type="gramStart"/>
-      <w:r>
-        <w:t>particular order</w:t>
-      </w:r>
-      <w:proofErr w:type="gramEnd"/>
-      <w:r>
-        <w:t xml:space="preserve"> in which the prayers must be approached, and there is no expectation that every page must be studied before the prayers can be prayed.</w:t>
+        <w:t>It is not necessary to read this book from beginning to end. There is no particular order in which the prayers must be approached, and there is no expectation that every page must be studied before the prayers can be prayed.</w:t>
       </w:r>
     </w:p>
     <w:p>
@@ -1042,15 +1002,7 @@
         <w:pStyle w:val="SPBodyText"/>
       </w:pPr>
       <w:r>
-        <w:t xml:space="preserve">Perhaps there is a prayer you already know well. Perhaps there is one you have heard many times but never really considered. Perhaps you are looking for a prayer for a particular moment of the </w:t>
-      </w:r>
-      <w:proofErr w:type="gramStart"/>
-      <w:r>
-        <w:t>day, or</w:t>
-      </w:r>
-      <w:proofErr w:type="gramEnd"/>
-      <w:r>
-        <w:t xml:space="preserve"> simply looking for a few quiet minutes in which to turn your attention towards God.</w:t>
+        <w:t>Perhaps there is a prayer you already know well. Perhaps there is one you have heard many times but never really considered. Perhaps you are looking for a prayer for a particular moment of the day, or simply looking for a few quiet minutes in which to turn your attention towards God.</w:t>
       </w:r>
     </w:p>
     <w:p>
@@ -1095,15 +1047,7 @@
         <w:pStyle w:val="SPBodyText"/>
       </w:pPr>
       <w:r>
-        <w:t xml:space="preserve">There is no requirement to learn Latin </w:t>
-      </w:r>
-      <w:proofErr w:type="gramStart"/>
-      <w:r>
-        <w:t>in order to</w:t>
-      </w:r>
-      <w:proofErr w:type="gramEnd"/>
-      <w:r>
-        <w:t xml:space="preserve"> use this book.</w:t>
+        <w:t>There is no requirement to learn Latin in order to use this book.</w:t>
       </w:r>
     </w:p>
     <w:p>
@@ -1587,15 +1531,7 @@
         <w:t>Sacrae Preces</w:t>
       </w:r>
       <w:r>
-        <w:t xml:space="preserve"> is therefore not meant to </w:t>
-      </w:r>
-      <w:proofErr w:type="gramStart"/>
-      <w:r>
-        <w:t>be something that is</w:t>
-      </w:r>
-      <w:proofErr w:type="gramEnd"/>
-      <w:r>
-        <w:t xml:space="preserve"> simply read once and placed back on a shelf.</w:t>
+        <w:t xml:space="preserve"> is therefore not meant to be something that is simply read once and placed back on a shelf.</w:t>
       </w:r>
     </w:p>
     <w:p>
@@ -2603,13 +2539,8 @@
         <w:pStyle w:val="SPScripture"/>
       </w:pPr>
       <w:r>
-        <w:t xml:space="preserve">Our Father who art in heaven, Hallowed be thy name. Thy kingdom </w:t>
-      </w:r>
-      <w:proofErr w:type="gramStart"/>
-      <w:r>
-        <w:t>come</w:t>
-      </w:r>
-      <w:proofErr w:type="gramEnd"/>
+        <w:t>Our Father who art in heaven, Hallowed be thy name. Thy kingdom come</w:t>
+      </w:r>
       <w:r>
         <w:t>.</w:t>
       </w:r>
@@ -2653,21 +2584,13 @@
         <w:t xml:space="preserve"> </w:t>
       </w:r>
       <w:r>
-        <w:t xml:space="preserve">And lead us not into </w:t>
-      </w:r>
-      <w:proofErr w:type="gramStart"/>
-      <w:r>
-        <w:t xml:space="preserve">temptation, </w:t>
+        <w:t xml:space="preserve">And lead us not into temptation, </w:t>
       </w:r>
       <w:r>
         <w:t>b</w:t>
       </w:r>
       <w:r>
-        <w:t>ut</w:t>
-      </w:r>
-      <w:proofErr w:type="gramEnd"/>
-      <w:r>
-        <w:t xml:space="preserve"> deliver us from evil.</w:t>
+        <w:t>ut deliver us from evil.</w:t>
       </w:r>
       <w:r>
         <w:t>”</w:t>
@@ -2701,23 +2624,13 @@
         <w:t>Your</w:t>
       </w:r>
       <w:r>
-        <w:t xml:space="preserve"> kingdom </w:t>
-      </w:r>
-      <w:proofErr w:type="gramStart"/>
-      <w:r>
-        <w:t>come</w:t>
-      </w:r>
-      <w:proofErr w:type="gramEnd"/>
-      <w:r>
-        <w:t xml:space="preserve">. Give us each day our daily bread; and forgive us our sins, for we ourselves forgive </w:t>
+        <w:t xml:space="preserve"> kingdom come. Give us each day our daily bread; and forgive us our sins, for we ourselves forgive </w:t>
       </w:r>
       <w:proofErr w:type="spellStart"/>
-      <w:proofErr w:type="gramStart"/>
       <w:r>
         <w:t>every one</w:t>
       </w:r>
       <w:proofErr w:type="spellEnd"/>
-      <w:proofErr w:type="gramEnd"/>
       <w:r>
         <w:t xml:space="preserve"> who is indebted to us; and lead us not into temptation.</w:t>
       </w:r>
@@ -2801,7 +2714,6 @@
       <w:r>
         <w:t xml:space="preserve">The first word is not </w:t>
       </w:r>
-      <w:proofErr w:type="gramStart"/>
       <w:r>
         <w:rPr>
           <w:i/>
@@ -2809,12 +2721,10 @@
         </w:rPr>
         <w:t>my</w:t>
       </w:r>
-      <w:proofErr w:type="gramEnd"/>
       <w:r>
         <w:t xml:space="preserve">. It is </w:t>
       </w:r>
       <w:proofErr w:type="spellStart"/>
-      <w:proofErr w:type="gramStart"/>
       <w:r>
         <w:rPr>
           <w:i/>
@@ -2823,7 +2733,6 @@
         <w:t>our</w:t>
       </w:r>
       <w:proofErr w:type="spellEnd"/>
-      <w:proofErr w:type="gramEnd"/>
       <w:r>
         <w:t>.</w:t>
       </w:r>
@@ -3023,12 +2932,1015 @@
     <w:p>
       <w:pPr>
         <w:pStyle w:val="SPBodyText"/>
-      </w:pPr>
-    </w:p>
-    <w:p>
-      <w:pPr>
-        <w:pStyle w:val="SPBodyText"/>
-      </w:pPr>
+        <w:jc w:val="center"/>
+        <w:rPr>
+          <w:rFonts w:ascii="Segoe UI Symbol" w:hAnsi="Segoe UI Symbol" w:cs="Segoe UI Symbol"/>
+        </w:rPr>
+      </w:pPr>
+      <w:r>
+        <w:rPr>
+          <w:rFonts w:ascii="Segoe UI Symbol" w:hAnsi="Segoe UI Symbol" w:cs="Segoe UI Symbol"/>
+        </w:rPr>
+        <w:lastRenderedPageBreak/>
+        <w:t>✠</w:t>
+      </w:r>
+    </w:p>
+    <w:p>
+      <w:pPr>
+        <w:pStyle w:val="SPBodyText"/>
+        <w:jc w:val="center"/>
+        <w:rPr>
+          <w:rFonts w:ascii="Segoe UI Symbol" w:hAnsi="Segoe UI Symbol" w:cs="Segoe UI Symbol"/>
+        </w:rPr>
+      </w:pPr>
+    </w:p>
+    <w:p>
+      <w:pPr>
+        <w:pStyle w:val="SPPrayerTitle"/>
+      </w:pPr>
+      <w:r>
+        <w:t xml:space="preserve">The </w:t>
+      </w:r>
+      <w:r>
+        <w:t xml:space="preserve">Hail </w:t>
+      </w:r>
+      <w:proofErr w:type="spellStart"/>
+      <w:r>
+        <w:t>mary</w:t>
+      </w:r>
+      <w:proofErr w:type="spellEnd"/>
+    </w:p>
+    <w:p>
+      <w:pPr>
+        <w:pStyle w:val="SPBodyText"/>
+      </w:pPr>
+      <w:r>
+        <w:t>The Hail Mary begins with the words of Scripture. The greeting of the angel and the blessing of Elizabeth lead us into the mystery of the Incarnation, where the Word of God takes flesh in the womb of Mary.</w:t>
+      </w:r>
+    </w:p>
+    <w:p>
+      <w:pPr>
+        <w:pStyle w:val="SPBodyText"/>
+      </w:pPr>
+      <w:r>
+        <w:t>The prayer then becomes our petition. We ask Mary, Mother of God, to pray for us — now, in the midst of our lives, and at the hour of our death.</w:t>
+      </w:r>
+    </w:p>
+    <w:p>
+      <w:pPr>
+        <w:pStyle w:val="SPBodyText"/>
+      </w:pPr>
+      <w:r>
+        <w:t>In praying these words, we join our voices to the Church, receiving the words of Scripture and placing ourselves under the care of God.</w:t>
+      </w:r>
+    </w:p>
+    <w:p>
+      <w:pPr>
+        <w:pStyle w:val="SPBodyText"/>
+      </w:pPr>
+    </w:p>
+    <w:p>
+      <w:pPr>
+        <w:pStyle w:val="SPPrayerEnglish"/>
+      </w:pPr>
+      <w:r>
+        <w:t>Pray these words slowly</w:t>
+      </w:r>
+      <w:r>
+        <w:t>.</w:t>
+      </w:r>
+      <w:r>
+        <w:t xml:space="preserve"> </w:t>
+      </w:r>
+    </w:p>
+    <w:p>
+      <w:pPr>
+        <w:sectPr>
+          <w:type w:val="oddPage"/>
+          <w:pgSz w:w="7920" w:h="12240" w:code="6"/>
+          <w:pgMar w:top="1080" w:right="864" w:bottom="1080" w:left="1152" w:header="576" w:footer="576" w:gutter="0"/>
+          <w:cols w:space="720"/>
+          <w:titlePg/>
+          <w:docGrid w:linePitch="360"/>
+        </w:sectPr>
+      </w:pPr>
+    </w:p>
+    <w:p>
+      <w:pPr>
+        <w:pStyle w:val="SPLanguage"/>
+      </w:pPr>
+      <w:r>
+        <w:lastRenderedPageBreak/>
+        <w:t xml:space="preserve">ENGLISH </w:t>
+      </w:r>
+    </w:p>
+    <w:p>
+      <w:pPr>
+        <w:pStyle w:val="SPPrayerEnglish"/>
+      </w:pPr>
+    </w:p>
+    <w:p>
+      <w:pPr>
+        <w:pStyle w:val="SPPrayerEnglish"/>
+      </w:pPr>
+      <w:r>
+        <w:t>Hail</w:t>
+      </w:r>
+      <w:r>
+        <w:t xml:space="preserve">, </w:t>
+      </w:r>
+      <w:r>
+        <w:t>Mary</w:t>
+      </w:r>
+      <w:r>
+        <w:t>,</w:t>
+      </w:r>
+      <w:r>
+        <w:t xml:space="preserve"> full of </w:t>
+      </w:r>
+      <w:r>
+        <w:t>g</w:t>
+      </w:r>
+      <w:r>
+        <w:t>race</w:t>
+      </w:r>
+      <w:r>
+        <w:t>,</w:t>
+      </w:r>
+    </w:p>
+    <w:p>
+      <w:pPr>
+        <w:pStyle w:val="SPPrayerEnglish"/>
+      </w:pPr>
+      <w:r>
+        <w:t>The Lord is with thee.</w:t>
+      </w:r>
+    </w:p>
+    <w:p>
+      <w:pPr>
+        <w:pStyle w:val="SPPrayerEnglish"/>
+      </w:pPr>
+      <w:r>
+        <w:t>Blessed art though amongst women,</w:t>
+      </w:r>
+    </w:p>
+    <w:p>
+      <w:pPr>
+        <w:pStyle w:val="SPPrayerEnglish"/>
+      </w:pPr>
+      <w:r>
+        <w:t>And blessed is the fruit of thy womb, Jesus.</w:t>
+      </w:r>
+    </w:p>
+    <w:p>
+      <w:pPr>
+        <w:pStyle w:val="SPPrayerEnglish"/>
+      </w:pPr>
+      <w:r>
+        <w:t>Holy Mary, Mother of God</w:t>
+      </w:r>
+      <w:r>
+        <w:t>,</w:t>
+      </w:r>
+    </w:p>
+    <w:p>
+      <w:pPr>
+        <w:pStyle w:val="SPPrayerEnglish"/>
+      </w:pPr>
+      <w:r>
+        <w:t>Pray for us sinners</w:t>
+      </w:r>
+      <w:r>
+        <w:t>,</w:t>
+      </w:r>
+    </w:p>
+    <w:p>
+      <w:pPr>
+        <w:pStyle w:val="SPPrayerEnglish"/>
+      </w:pPr>
+      <w:r>
+        <w:t>Now and at the hour of our death</w:t>
+      </w:r>
+      <w:r>
+        <w:t>.</w:t>
+      </w:r>
+    </w:p>
+    <w:p>
+      <w:pPr>
+        <w:pStyle w:val="SPPrayerEnglish"/>
+      </w:pPr>
+      <w:r>
+        <w:t>Amen</w:t>
+      </w:r>
+    </w:p>
+    <w:p>
+      <w:pPr>
+        <w:pStyle w:val="SPPrayerEnglish"/>
+        <w:sectPr>
+          <w:type w:val="evenPage"/>
+          <w:pgSz w:w="7920" w:h="12240" w:code="6"/>
+          <w:pgMar w:top="1080" w:right="864" w:bottom="1080" w:left="1152" w:header="576" w:footer="576" w:gutter="0"/>
+          <w:cols w:space="720"/>
+          <w:titlePg/>
+          <w:docGrid w:linePitch="360"/>
+        </w:sectPr>
+      </w:pPr>
+      <w:r>
+        <w:t xml:space="preserve"> </w:t>
+      </w:r>
+    </w:p>
+    <w:p>
+      <w:pPr>
+        <w:pStyle w:val="SPLanguage"/>
+      </w:pPr>
+      <w:r>
+        <w:lastRenderedPageBreak/>
+        <w:t>LATIN</w:t>
+      </w:r>
+    </w:p>
+    <w:p>
+      <w:pPr>
+        <w:pStyle w:val="SPPrayerLatin"/>
+      </w:pPr>
+    </w:p>
+    <w:p>
+      <w:pPr>
+        <w:pStyle w:val="SPPrayerLatin"/>
+      </w:pPr>
+      <w:r>
+        <w:t xml:space="preserve">Ave Maria, </w:t>
+      </w:r>
+      <w:r>
+        <w:t>g</w:t>
+      </w:r>
+      <w:r>
+        <w:t xml:space="preserve">ratia </w:t>
+      </w:r>
+      <w:r>
+        <w:t>p</w:t>
+      </w:r>
+      <w:r>
+        <w:t>lena</w:t>
+      </w:r>
+      <w:r>
+        <w:t>,</w:t>
+      </w:r>
+    </w:p>
+    <w:p>
+      <w:pPr>
+        <w:pStyle w:val="SPPrayerLatin"/>
+      </w:pPr>
+      <w:r>
+        <w:t>Dominus tecum</w:t>
+      </w:r>
+      <w:r>
+        <w:t>.</w:t>
+      </w:r>
+    </w:p>
+    <w:p>
+      <w:pPr>
+        <w:pStyle w:val="SPPrayerLatin"/>
+      </w:pPr>
+      <w:r>
+        <w:t>B</w:t>
+      </w:r>
+      <w:r>
+        <w:t>enedict</w:t>
+      </w:r>
+      <w:r>
+        <w:t>a</w:t>
+      </w:r>
+      <w:r>
+        <w:t xml:space="preserve"> </w:t>
+      </w:r>
+      <w:proofErr w:type="spellStart"/>
+      <w:r>
+        <w:t>tu</w:t>
+      </w:r>
+      <w:proofErr w:type="spellEnd"/>
+      <w:r>
+        <w:t xml:space="preserve"> in </w:t>
+      </w:r>
+      <w:proofErr w:type="spellStart"/>
+      <w:r>
+        <w:t>muliéribus</w:t>
+      </w:r>
+      <w:proofErr w:type="spellEnd"/>
+      <w:r>
+        <w:t>,</w:t>
+      </w:r>
+    </w:p>
+    <w:p>
+      <w:pPr>
+        <w:pStyle w:val="SPPrayerLatin"/>
+      </w:pPr>
+      <w:r>
+        <w:t xml:space="preserve">Et </w:t>
+      </w:r>
+      <w:proofErr w:type="spellStart"/>
+      <w:r>
+        <w:t>b</w:t>
+      </w:r>
+      <w:r>
+        <w:t>enedictus</w:t>
+      </w:r>
+      <w:proofErr w:type="spellEnd"/>
+      <w:r>
+        <w:t xml:space="preserve"> fructus </w:t>
+      </w:r>
+      <w:proofErr w:type="spellStart"/>
+      <w:r>
+        <w:t>ventris</w:t>
+      </w:r>
+      <w:proofErr w:type="spellEnd"/>
+      <w:r>
+        <w:t xml:space="preserve"> tu</w:t>
+      </w:r>
+      <w:r>
+        <w:t>i,</w:t>
+      </w:r>
+      <w:r>
+        <w:t xml:space="preserve"> Iesus.</w:t>
+      </w:r>
+    </w:p>
+    <w:p>
+      <w:pPr>
+        <w:pStyle w:val="SPPrayerLatin"/>
+      </w:pPr>
+      <w:r>
+        <w:t xml:space="preserve">Sancta Maria, Mater </w:t>
+      </w:r>
+      <w:r>
+        <w:t>D</w:t>
+      </w:r>
+      <w:r>
+        <w:t>ei</w:t>
+      </w:r>
+      <w:r>
+        <w:t>,</w:t>
+      </w:r>
+    </w:p>
+    <w:p>
+      <w:pPr>
+        <w:pStyle w:val="SPPrayerLatin"/>
+      </w:pPr>
+      <w:r>
+        <w:t xml:space="preserve">Ora pro nobis </w:t>
+      </w:r>
+      <w:proofErr w:type="spellStart"/>
+      <w:r>
+        <w:t>pec</w:t>
+      </w:r>
+      <w:r>
+        <w:t>c</w:t>
+      </w:r>
+      <w:r>
+        <w:t>atoribus</w:t>
+      </w:r>
+      <w:proofErr w:type="spellEnd"/>
+      <w:r>
+        <w:t>,</w:t>
+      </w:r>
+    </w:p>
+    <w:p>
+      <w:pPr>
+        <w:pStyle w:val="SPPrayerLatin"/>
+      </w:pPr>
+      <w:r>
+        <w:t xml:space="preserve">Nunc et </w:t>
+      </w:r>
+      <w:r>
+        <w:t>i</w:t>
+      </w:r>
+      <w:r>
+        <w:t xml:space="preserve">n </w:t>
+      </w:r>
+      <w:r>
+        <w:t>h</w:t>
+      </w:r>
+      <w:r>
+        <w:t xml:space="preserve">ora mortis </w:t>
+      </w:r>
+      <w:proofErr w:type="spellStart"/>
+      <w:r>
+        <w:t>nostr</w:t>
+      </w:r>
+      <w:r>
+        <w:t>a</w:t>
+      </w:r>
+      <w:r>
+        <w:t>e</w:t>
+      </w:r>
+      <w:proofErr w:type="spellEnd"/>
+      <w:r>
+        <w:t>.</w:t>
+      </w:r>
+    </w:p>
+    <w:p>
+      <w:pPr>
+        <w:pStyle w:val="SPPrayerLatin"/>
+      </w:pPr>
+      <w:r>
+        <w:t>Amen</w:t>
+      </w:r>
+      <w:r>
+        <w:t xml:space="preserve"> </w:t>
+      </w:r>
+    </w:p>
+    <w:p>
+      <w:pPr>
+        <w:pStyle w:val="SPPronunciation"/>
+        <w:rPr>
+          <w:rStyle w:val="Emphasis"/>
+        </w:rPr>
+        <w:sectPr>
+          <w:type w:val="oddPage"/>
+          <w:pgSz w:w="7920" w:h="12240" w:code="6"/>
+          <w:pgMar w:top="1080" w:right="864" w:bottom="1080" w:left="1152" w:header="576" w:footer="576" w:gutter="0"/>
+          <w:cols w:space="720"/>
+          <w:titlePg/>
+          <w:docGrid w:linePitch="360"/>
+        </w:sectPr>
+      </w:pPr>
+    </w:p>
+    <w:p>
+      <w:pPr>
+        <w:pStyle w:val="SPSectionTitle"/>
+      </w:pPr>
+      <w:r>
+        <w:lastRenderedPageBreak/>
+        <w:t>Scripture</w:t>
+      </w:r>
+    </w:p>
+    <w:p>
+      <w:pPr>
+        <w:pStyle w:val="SPScriptureReference"/>
+      </w:pPr>
+      <w:r>
+        <w:t xml:space="preserve"> </w:t>
+      </w:r>
+      <w:r>
+        <w:t>Luke 1:28</w:t>
+      </w:r>
+    </w:p>
+    <w:p>
+      <w:pPr>
+        <w:pStyle w:val="SPScripture"/>
+      </w:pPr>
+      <w:r>
+        <w:t>"And he came to her and said, 'Hail, full of grace, the Lord is with you!'"</w:t>
+      </w:r>
+    </w:p>
+    <w:p>
+      <w:pPr>
+        <w:pStyle w:val="SPScriptureReference"/>
+      </w:pPr>
+      <w:r>
+        <w:t>Luke 1:</w:t>
+      </w:r>
+      <w:r>
+        <w:t>42</w:t>
+      </w:r>
+    </w:p>
+    <w:p>
+      <w:pPr>
+        <w:pStyle w:val="SPScripture"/>
+      </w:pPr>
+      <w:r>
+        <w:t>"And she exclaimed with a loud cry, 'Blessed are you among women, and blessed is the fruit of your womb!'"</w:t>
+      </w:r>
+    </w:p>
+    <w:p>
+      <w:pPr>
+        <w:pStyle w:val="SPScripture"/>
+      </w:pPr>
+    </w:p>
+    <w:p>
+      <w:pPr>
+        <w:pStyle w:val="SPScripture"/>
+      </w:pPr>
+    </w:p>
+    <w:p>
+      <w:pPr>
+        <w:pStyle w:val="SPBodyText"/>
+      </w:pPr>
+      <w:r>
+        <w:t>The opening of the Hail Mary is drawn from the Gospel of Luke. The angel Gabriel greets Mary with words that reveal the grace given to her and announces the presence of the Lord. Elizabeth then greets Mary as blessed among women and blesses the fruit of her womb.</w:t>
+      </w:r>
+    </w:p>
+    <w:p>
+      <w:pPr>
+        <w:pStyle w:val="SPBodyText"/>
+      </w:pPr>
+      <w:r>
+        <w:t>The Church gathers these words of Scripture into prayer. What begins as the greeting of the angel and the blessing of Elizabeth becomes our own confession of faith in the mystery of Christ and our petition for Mary's intercession.</w:t>
+      </w:r>
+    </w:p>
+    <w:p>
+      <w:pPr>
+        <w:pStyle w:val="SPScripture"/>
+      </w:pPr>
+    </w:p>
+    <w:p>
+      <w:pPr>
+        <w:pStyle w:val="SPScripture"/>
+        <w:sectPr>
+          <w:type w:val="evenPage"/>
+          <w:pgSz w:w="7920" w:h="12240" w:code="6"/>
+          <w:pgMar w:top="1080" w:right="864" w:bottom="1080" w:left="1152" w:header="576" w:footer="576" w:gutter="0"/>
+          <w:cols w:space="720"/>
+          <w:titlePg/>
+          <w:docGrid w:linePitch="360"/>
+        </w:sectPr>
+      </w:pPr>
+    </w:p>
+    <w:p>
+      <w:pPr>
+        <w:pStyle w:val="SPSectionTitle"/>
+      </w:pPr>
+      <w:r>
+        <w:lastRenderedPageBreak/>
+        <w:t>Reflection</w:t>
+      </w:r>
+    </w:p>
+    <w:p>
+      <w:pPr>
+        <w:pStyle w:val="SPBodyText"/>
+      </w:pPr>
+      <w:r>
+        <w:t xml:space="preserve">  </w:t>
+      </w:r>
+    </w:p>
+    <w:p>
+      <w:pPr>
+        <w:pStyle w:val="SPBodyText"/>
+        <w:rPr>
+          <w:b/>
+          <w:bCs/>
+        </w:rPr>
+      </w:pPr>
+      <w:r>
+        <w:rPr>
+          <w:b/>
+          <w:bCs/>
+        </w:rPr>
+        <w:t>The Words We Receive</w:t>
+      </w:r>
+    </w:p>
+    <w:p>
+      <w:pPr>
+        <w:pStyle w:val="SPBodyText"/>
+      </w:pPr>
+      <w:r>
+        <w:t>The Hail Mary begins not with our own words, but with the words of Scripture.</w:t>
+      </w:r>
+    </w:p>
+    <w:p>
+      <w:pPr>
+        <w:pStyle w:val="SPBodyText"/>
+      </w:pPr>
+      <w:r>
+        <w:t xml:space="preserve">The angel Gabriel greets Mary with words of grace: </w:t>
+      </w:r>
+      <w:r>
+        <w:rPr>
+          <w:i/>
+          <w:iCs/>
+        </w:rPr>
+        <w:t>Hail, Mary, full of grace, the Lord is with thee.</w:t>
+      </w:r>
+      <w:r>
+        <w:t xml:space="preserve"> Elizabeth then greets her as blessed among women and blesses the fruit of her womb. Before we ask for anything, we are invited to remember what God has already done.</w:t>
+      </w:r>
+    </w:p>
+    <w:p>
+      <w:pPr>
+        <w:pStyle w:val="SPBodyText"/>
+      </w:pPr>
+      <w:r>
+        <w:t>The prayer therefore begins with wonder.</w:t>
+      </w:r>
+    </w:p>
+    <w:p>
+      <w:pPr>
+        <w:pStyle w:val="SPBodyText"/>
+      </w:pPr>
+      <w:r>
+        <w:t xml:space="preserve">Mary has received a call from God, and through her </w:t>
+      </w:r>
+      <w:r>
+        <w:rPr>
+          <w:i/>
+          <w:iCs/>
+        </w:rPr>
+        <w:t>yes</w:t>
+      </w:r>
+      <w:r>
+        <w:t>, the mystery of the Incarnation unfolds. The fruit of her womb is not simply a blessing for Mary alone. It is Jesus Christ, the Son of God, given for the salvation of the world.</w:t>
+      </w:r>
+    </w:p>
+    <w:p>
+      <w:pPr>
+        <w:pStyle w:val="SPBodyText"/>
+      </w:pPr>
+      <w:r>
+        <w:t>When we pray these words, we join ourselves to the voices of Gabriel and Elizabeth. We take up the words of Scripture and allow them to become our own prayer.</w:t>
+      </w:r>
+    </w:p>
+    <w:p>
+      <w:pPr>
+        <w:pStyle w:val="SPBodyText"/>
+        <w:rPr>
+          <w:b/>
+          <w:bCs/>
+        </w:rPr>
+      </w:pPr>
+      <w:r>
+        <w:rPr>
+          <w:b/>
+          <w:bCs/>
+        </w:rPr>
+        <w:t>The Prayer We Offer</w:t>
+      </w:r>
+    </w:p>
+    <w:p>
+      <w:pPr>
+        <w:pStyle w:val="SPBodyText"/>
+      </w:pPr>
+      <w:r>
+        <w:t>Then the prayer changes.</w:t>
+      </w:r>
+    </w:p>
+    <w:p>
+      <w:pPr>
+        <w:pStyle w:val="SPBodyText"/>
+      </w:pPr>
+      <w:r>
+        <w:rPr>
+          <w:i/>
+          <w:iCs/>
+        </w:rPr>
+        <w:t>Holy Mary, Mother of God, pray for us sinners.</w:t>
+      </w:r>
+    </w:p>
+    <w:p>
+      <w:pPr>
+        <w:pStyle w:val="SPBodyText"/>
+      </w:pPr>
+      <w:r>
+        <w:t>We move from proclamation to petition.</w:t>
+      </w:r>
+    </w:p>
+    <w:p>
+      <w:pPr>
+        <w:pStyle w:val="SPBodyText"/>
+      </w:pPr>
+      <w:r>
+        <w:lastRenderedPageBreak/>
+        <w:t>We ask Mary to pray for us because we know that we do not walk the Christian life alone. We are sinners in need of mercy, and we are members of a Church in which we are called to carry one another in prayer.</w:t>
+      </w:r>
+    </w:p>
+    <w:p>
+      <w:pPr>
+        <w:pStyle w:val="SPBodyText"/>
+      </w:pPr>
+      <w:r>
+        <w:t xml:space="preserve">The title </w:t>
+      </w:r>
+      <w:r>
+        <w:rPr>
+          <w:i/>
+          <w:iCs/>
+        </w:rPr>
+        <w:t>Mother of God</w:t>
+      </w:r>
+      <w:r>
+        <w:t xml:space="preserve"> points us beyond Mary herself to the mystery of her Son. The child she bore is Jesus Christ, truly God and truly man. In honouring His Mother, we proclaim something about Him.</w:t>
+      </w:r>
+    </w:p>
+    <w:p>
+      <w:pPr>
+        <w:pStyle w:val="SPBodyText"/>
+      </w:pPr>
+      <w:r>
+        <w:t>And then we say the words that place us honestly before God:</w:t>
+      </w:r>
+    </w:p>
+    <w:p>
+      <w:pPr>
+        <w:pStyle w:val="SPBodyText"/>
+      </w:pPr>
+      <w:r>
+        <w:rPr>
+          <w:i/>
+          <w:iCs/>
+        </w:rPr>
+        <w:t>Pray for us sinners.</w:t>
+      </w:r>
+    </w:p>
+    <w:p>
+      <w:pPr>
+        <w:pStyle w:val="SPBodyText"/>
+      </w:pPr>
+      <w:r>
+        <w:t xml:space="preserve">Not </w:t>
+      </w:r>
+      <w:r>
+        <w:rPr>
+          <w:i/>
+          <w:iCs/>
+        </w:rPr>
+        <w:t>for those who have everything right.</w:t>
+      </w:r>
+      <w:r>
+        <w:br/>
+        <w:t xml:space="preserve">Not </w:t>
+      </w:r>
+      <w:r>
+        <w:rPr>
+          <w:i/>
+          <w:iCs/>
+        </w:rPr>
+        <w:t>for those who have earned God's favour.</w:t>
+      </w:r>
+    </w:p>
+    <w:p>
+      <w:pPr>
+        <w:pStyle w:val="SPBodyText"/>
+      </w:pPr>
+      <w:r>
+        <w:rPr>
+          <w:b/>
+          <w:bCs/>
+        </w:rPr>
+        <w:t>For us sinners.</w:t>
+      </w:r>
+    </w:p>
+    <w:p>
+      <w:pPr>
+        <w:pStyle w:val="SPBodyText"/>
+      </w:pPr>
+      <w:r>
+        <w:t>The prayer leaves no room for pride. We stand together in our need for grace.</w:t>
+      </w:r>
+    </w:p>
+    <w:p>
+      <w:pPr>
+        <w:pStyle w:val="SPBodyText"/>
+        <w:rPr>
+          <w:b/>
+          <w:bCs/>
+        </w:rPr>
+      </w:pPr>
+      <w:r>
+        <w:rPr>
+          <w:b/>
+          <w:bCs/>
+        </w:rPr>
+        <w:t>Now and at the Hour of Our Death</w:t>
+      </w:r>
+    </w:p>
+    <w:p>
+      <w:pPr>
+        <w:pStyle w:val="SPBodyText"/>
+      </w:pPr>
+      <w:r>
+        <w:t>The final petition reaches across the whole of our earthly life:</w:t>
+      </w:r>
+    </w:p>
+    <w:p>
+      <w:pPr>
+        <w:pStyle w:val="SPBodyText"/>
+      </w:pPr>
+      <w:r>
+        <w:rPr>
+          <w:i/>
+          <w:iCs/>
+        </w:rPr>
+        <w:t>Pray for us sinners, now and at the hour of our death.</w:t>
+      </w:r>
+    </w:p>
+    <w:p>
+      <w:pPr>
+        <w:pStyle w:val="SPBodyText"/>
+      </w:pPr>
+      <w:r>
+        <w:t>We ask for Mary's prayers in the present moment — in our joys, our struggles, our temptations, our failures, and our hopes. But we also place our final hour into God's hands.</w:t>
+      </w:r>
+    </w:p>
+    <w:p>
+      <w:pPr>
+        <w:pStyle w:val="SPBodyText"/>
+      </w:pPr>
+      <w:r>
+        <w:t>The Hail Mary therefore reminds us that our life is a journey.</w:t>
+      </w:r>
+    </w:p>
+    <w:p>
+      <w:pPr>
+        <w:pStyle w:val="SPBodyText"/>
+      </w:pPr>
+      <w:r>
+        <w:t xml:space="preserve">We need grace </w:t>
+      </w:r>
+      <w:r>
+        <w:rPr>
+          <w:b/>
+          <w:bCs/>
+        </w:rPr>
+        <w:t>now</w:t>
+      </w:r>
+      <w:r>
+        <w:t>.</w:t>
+      </w:r>
+    </w:p>
+    <w:p>
+      <w:pPr>
+        <w:pStyle w:val="SPBodyText"/>
+      </w:pPr>
+      <w:r>
+        <w:t xml:space="preserve">We will need grace </w:t>
+      </w:r>
+      <w:r>
+        <w:rPr>
+          <w:b/>
+          <w:bCs/>
+        </w:rPr>
+        <w:t>at the end</w:t>
+      </w:r>
+      <w:r>
+        <w:t>.</w:t>
+      </w:r>
+    </w:p>
+    <w:p>
+      <w:pPr>
+        <w:pStyle w:val="SPBodyText"/>
+      </w:pPr>
+      <w:r>
+        <w:lastRenderedPageBreak/>
+        <w:t>And throughout that journey, we are never beyond the reach of God's mercy.</w:t>
+      </w:r>
+    </w:p>
+    <w:p>
+      <w:pPr>
+        <w:pStyle w:val="SPBodyText"/>
+      </w:pPr>
+      <w:r>
+        <w:t>The prayer begins with the words of Scripture and ends with our humble request for intercession. Between the two stands the mystery of Christ: God who comes among us, takes flesh, and enters into our human story.</w:t>
+      </w:r>
+    </w:p>
+    <w:p>
+      <w:pPr>
+        <w:pStyle w:val="SPBodyText"/>
+      </w:pPr>
+      <w:r>
+        <w:t>So when you pray the Hail Mary, do not hurry.</w:t>
+      </w:r>
+    </w:p>
+    <w:p>
+      <w:pPr>
+        <w:pStyle w:val="SPBodyText"/>
+      </w:pPr>
+      <w:r>
+        <w:t>Hear the words of Gabriel.</w:t>
+      </w:r>
+    </w:p>
+    <w:p>
+      <w:pPr>
+        <w:pStyle w:val="SPBodyText"/>
+      </w:pPr>
+      <w:r>
+        <w:t>Hear the blessing of Elizabeth.</w:t>
+      </w:r>
+    </w:p>
+    <w:p>
+      <w:pPr>
+        <w:pStyle w:val="SPBodyText"/>
+      </w:pPr>
+      <w:r>
+        <w:t>Remember Jesus, the fruit of Mary's womb.</w:t>
+      </w:r>
+    </w:p>
+    <w:p>
+      <w:pPr>
+        <w:pStyle w:val="SPBodyText"/>
+      </w:pPr>
+      <w:r>
+        <w:t>Then bring your own life before God.</w:t>
+      </w:r>
+    </w:p>
+    <w:p>
+      <w:pPr>
+        <w:pStyle w:val="SPBodyText"/>
+      </w:pPr>
+      <w:r>
+        <w:t>Your joys.</w:t>
+      </w:r>
+      <w:r>
+        <w:br/>
+        <w:t>Your failures.</w:t>
+      </w:r>
+      <w:r>
+        <w:br/>
+        <w:t>Your loved ones.</w:t>
+      </w:r>
+      <w:r>
+        <w:br/>
+        <w:t>Those who need your prayers.</w:t>
+      </w:r>
+      <w:r>
+        <w:br/>
+        <w:t>And yourself.</w:t>
+      </w:r>
+    </w:p>
+    <w:p>
+      <w:pPr>
+        <w:pStyle w:val="SPBodyText"/>
+      </w:pPr>
+      <w:r>
+        <w:t>You are not praying alone.</w:t>
+      </w:r>
+    </w:p>
+    <w:p>
+      <w:pPr>
+        <w:pStyle w:val="SPBodyText"/>
+      </w:pPr>
+      <w:r>
+        <w:t>The words you speak have been spoken by generations of Christians before you, and they remain a simple invitation to turn again toward Christ.</w:t>
+      </w:r>
+    </w:p>
+    <w:p>
+      <w:pPr>
+        <w:pStyle w:val="SPBodyText"/>
+      </w:pPr>
+      <w:r>
+        <w:rPr>
+          <w:b/>
+          <w:bCs/>
+        </w:rPr>
+        <w:t>Hail, Mary.</w:t>
+      </w:r>
+    </w:p>
+    <w:p>
+      <w:pPr>
+        <w:pStyle w:val="SPBodyText"/>
+      </w:pPr>
+      <w:r>
+        <w:rPr>
+          <w:b/>
+          <w:bCs/>
+        </w:rPr>
+        <w:t>Pray for us.</w:t>
+      </w:r>
+    </w:p>
+    <w:p>
+      <w:pPr>
+        <w:pStyle w:val="SPBodyText"/>
+      </w:pPr>
+      <w:r>
+        <w:rPr>
+          <w:b/>
+          <w:bCs/>
+        </w:rPr>
+        <w:t>Now.</w:t>
+      </w:r>
+    </w:p>
+    <w:p>
+      <w:pPr>
+        <w:pStyle w:val="SPBodyText"/>
+      </w:pPr>
+      <w:r>
+        <w:rPr>
+          <w:b/>
+          <w:bCs/>
+        </w:rPr>
+        <w:t>And at the hour of our death.</w:t>
+      </w:r>
+    </w:p>
+    <w:p>
+      <w:pPr>
+        <w:pStyle w:val="SPBodyText"/>
+      </w:pPr>
+      <w:r>
+        <w:rPr>
+          <w:b/>
+          <w:bCs/>
+        </w:rPr>
+        <w:t>Amen.</w:t>
+      </w:r>
+    </w:p>
+    <w:p>
+      <w:pPr>
+        <w:pStyle w:val="SPBodyText"/>
+      </w:pPr>
+    </w:p>
+    <w:p>
+      <w:pPr>
+        <w:pStyle w:val="SPBodyText"/>
+      </w:pPr>
+      <w:r>
+        <w:t xml:space="preserve"> </w:t>
+      </w:r>
     </w:p>
     <w:sectPr>
       <w:type w:val="oddPage"/>

</xml_diff>

<commit_message>
Hail Mary Chapter Completed and verses checked in Bible
</commit_message>
<xml_diff>
--- a/manuscript/volume-1/sacrae-preces-volume-1.docx
+++ b/manuscript/volume-1/sacrae-preces-volume-1.docx
@@ -3388,7 +3388,16 @@
         <w:pStyle w:val="SPScripture"/>
       </w:pPr>
       <w:r>
-        <w:t>"And he came to her and said, 'Hail, full of grace, the Lord is with you!'"</w:t>
+        <w:t xml:space="preserve">And he came to her and said, </w:t>
+      </w:r>
+      <w:r>
+        <w:t>“</w:t>
+      </w:r>
+      <w:r>
+        <w:t>Hail, full of grace, the Lord is with you!</w:t>
+      </w:r>
+      <w:r>
+        <w:t>”</w:t>
       </w:r>
     </w:p>
     <w:p>
@@ -3407,7 +3416,16 @@
         <w:pStyle w:val="SPScripture"/>
       </w:pPr>
       <w:r>
-        <w:t>"And she exclaimed with a loud cry, 'Blessed are you among women, and blessed is the fruit of your womb!'"</w:t>
+        <w:t xml:space="preserve">And she exclaimed with a loud cry, </w:t>
+      </w:r>
+      <w:r>
+        <w:t>“</w:t>
+      </w:r>
+      <w:r>
+        <w:t>Blessed are you among women, and blessed is the fruit of your womb!</w:t>
+      </w:r>
+      <w:r>
+        <w:t>”</w:t>
       </w:r>
     </w:p>
     <w:p>
@@ -3555,11 +3573,20 @@
           <w:bCs/>
         </w:rPr>
       </w:pPr>
-      <w:r>
+    </w:p>
+    <w:p>
+      <w:pPr>
+        <w:pStyle w:val="SPBodyText"/>
         <w:rPr>
           <w:b/>
           <w:bCs/>
         </w:rPr>
+      </w:pPr>
+      <w:r>
+        <w:rPr>
+          <w:b/>
+          <w:bCs/>
+        </w:rPr>
         <w:t>The Prayer We Offer</w:t>
       </w:r>
     </w:p>
@@ -3629,27 +3656,36 @@
     <w:p>
       <w:pPr>
         <w:pStyle w:val="SPBodyText"/>
-      </w:pPr>
-      <w:r>
         <w:rPr>
           <w:i/>
           <w:iCs/>
         </w:rPr>
-        <w:t>Pray for us sinners.</w:t>
-      </w:r>
-    </w:p>
-    <w:p>
-      <w:pPr>
-        <w:pStyle w:val="SPBodyText"/>
-      </w:pPr>
-      <w:r>
-        <w:t xml:space="preserve">Not </w:t>
-      </w:r>
+      </w:pPr>
+    </w:p>
+    <w:p>
+      <w:pPr>
+        <w:pStyle w:val="SPBodyText"/>
+      </w:pPr>
       <w:r>
         <w:rPr>
           <w:i/>
           <w:iCs/>
         </w:rPr>
+        <w:t>Pray for us sinners.</w:t>
+      </w:r>
+    </w:p>
+    <w:p>
+      <w:pPr>
+        <w:pStyle w:val="SPBodyText"/>
+      </w:pPr>
+      <w:r>
+        <w:t xml:space="preserve">Not </w:t>
+      </w:r>
+      <w:r>
+        <w:rPr>
+          <w:i/>
+          <w:iCs/>
+        </w:rPr>
         <w:t>for those who have everything right.</w:t>
       </w:r>
       <w:r>
@@ -3680,6 +3716,11 @@
       <w:pPr>
         <w:pStyle w:val="SPBodyText"/>
       </w:pPr>
+    </w:p>
+    <w:p>
+      <w:pPr>
+        <w:pStyle w:val="SPBodyText"/>
+      </w:pPr>
       <w:r>
         <w:t>The prayer leaves no room for pride. We stand together in our need for grace.</w:t>
       </w:r>
@@ -3724,6 +3765,11 @@
       <w:pPr>
         <w:pStyle w:val="SPBodyText"/>
       </w:pPr>
+    </w:p>
+    <w:p>
+      <w:pPr>
+        <w:pStyle w:val="SPBodyText"/>
+      </w:pPr>
       <w:r>
         <w:t>We ask for Mary's prayers in the present moment — in our joys, our struggles, our temptations, our failures, and our hopes. But we also place our final hour into God's hands.</w:t>
       </w:r>
@@ -3733,6 +3779,7 @@
         <w:pStyle w:val="SPBodyText"/>
       </w:pPr>
       <w:r>
+        <w:lastRenderedPageBreak/>
         <w:t>The Hail Mary therefore reminds us that our life is a journey.</w:t>
       </w:r>
     </w:p>
@@ -3777,7 +3824,6 @@
         <w:pStyle w:val="SPBodyText"/>
       </w:pPr>
       <w:r>
-        <w:lastRenderedPageBreak/>
         <w:t>And throughout that journey, we are never beyond the reach of God's mercy.</w:t>
       </w:r>
     </w:p>
@@ -3793,8 +3839,16 @@
       <w:pPr>
         <w:pStyle w:val="SPBodyText"/>
       </w:pPr>
-      <w:r>
-        <w:t>So when you pray the Hail Mary, do not hurry.</w:t>
+    </w:p>
+    <w:p>
+      <w:pPr>
+        <w:pStyle w:val="SPBodyText"/>
+      </w:pPr>
+      <w:r>
+        <w:t>So,</w:t>
+      </w:r>
+      <w:r>
+        <w:t xml:space="preserve"> when you pray the Hail Mary, do not hurry.</w:t>
       </w:r>
     </w:p>
     <w:p>
@@ -3828,6 +3882,11 @@
       <w:r>
         <w:t>Then bring your own life before God.</w:t>
       </w:r>
+    </w:p>
+    <w:p>
+      <w:pPr>
+        <w:pStyle w:val="SPBodyText"/>
+      </w:pPr>
     </w:p>
     <w:p>
       <w:pPr>
@@ -3865,6 +3924,19 @@
       <w:pPr>
         <w:pStyle w:val="SPBodyText"/>
       </w:pPr>
+    </w:p>
+    <w:p>
+      <w:pPr>
+        <w:pStyle w:val="SPBodyText"/>
+        <w:sectPr>
+          <w:type w:val="oddPage"/>
+          <w:pgSz w:w="7920" w:h="12240" w:code="6"/>
+          <w:pgMar w:top="1080" w:right="864" w:bottom="1080" w:left="1152" w:header="576" w:footer="576" w:gutter="0"/>
+          <w:cols w:space="720"/>
+          <w:titlePg/>
+          <w:docGrid w:linePitch="360"/>
+        </w:sectPr>
+      </w:pPr>
       <w:r>
         <w:t>The words you speak have been spoken by generations of Christians before you, and they remain a simple invitation to turn again toward Christ.</w:t>
       </w:r>
@@ -3872,75 +3944,59 @@
     <w:p>
       <w:pPr>
         <w:pStyle w:val="SPBodyText"/>
-      </w:pPr>
-      <w:r>
-        <w:rPr>
-          <w:b/>
-          <w:bCs/>
-        </w:rPr>
-        <w:t>Hail, Mary.</w:t>
-      </w:r>
-    </w:p>
-    <w:p>
-      <w:pPr>
-        <w:pStyle w:val="SPBodyText"/>
-      </w:pPr>
-      <w:r>
-        <w:rPr>
-          <w:b/>
-          <w:bCs/>
-        </w:rPr>
-        <w:t>Pray for us.</w:t>
-      </w:r>
-    </w:p>
-    <w:p>
-      <w:pPr>
-        <w:pStyle w:val="SPBodyText"/>
-      </w:pPr>
-      <w:r>
-        <w:rPr>
-          <w:b/>
-          <w:bCs/>
-        </w:rPr>
-        <w:t>Now.</w:t>
-      </w:r>
-    </w:p>
-    <w:p>
-      <w:pPr>
-        <w:pStyle w:val="SPBodyText"/>
-      </w:pPr>
-      <w:r>
-        <w:rPr>
-          <w:b/>
-          <w:bCs/>
-        </w:rPr>
-        <w:t>And at the hour of our death.</w:t>
-      </w:r>
-    </w:p>
-    <w:p>
-      <w:pPr>
-        <w:pStyle w:val="SPBodyText"/>
-      </w:pPr>
-      <w:r>
-        <w:rPr>
-          <w:b/>
-          <w:bCs/>
-        </w:rPr>
-        <w:t>Amen.</w:t>
-      </w:r>
-    </w:p>
-    <w:p>
-      <w:pPr>
-        <w:pStyle w:val="SPBodyText"/>
-      </w:pPr>
-    </w:p>
-    <w:p>
-      <w:pPr>
-        <w:pStyle w:val="SPBodyText"/>
-      </w:pPr>
-      <w:r>
-        <w:t xml:space="preserve"> </w:t>
-      </w:r>
+        <w:jc w:val="center"/>
+        <w:rPr>
+          <w:rFonts w:ascii="Segoe UI Symbol" w:hAnsi="Segoe UI Symbol" w:cs="Segoe UI Symbol"/>
+        </w:rPr>
+      </w:pPr>
+      <w:r>
+        <w:rPr>
+          <w:rFonts w:ascii="Segoe UI Symbol" w:hAnsi="Segoe UI Symbol" w:cs="Segoe UI Symbol"/>
+        </w:rPr>
+        <w:lastRenderedPageBreak/>
+        <w:t>✠</w:t>
+      </w:r>
+    </w:p>
+    <w:p>
+      <w:pPr>
+        <w:pStyle w:val="SPBodyText"/>
+        <w:jc w:val="center"/>
+        <w:rPr>
+          <w:rFonts w:ascii="Segoe UI Symbol" w:hAnsi="Segoe UI Symbol" w:cs="Segoe UI Symbol"/>
+        </w:rPr>
+      </w:pPr>
+    </w:p>
+    <w:p>
+      <w:pPr>
+        <w:pStyle w:val="SPPrayerTitle"/>
+      </w:pPr>
+      <w:r>
+        <w:t xml:space="preserve">The </w:t>
+      </w:r>
+      <w:r>
+        <w:t>Glory Be</w:t>
+      </w:r>
+    </w:p>
+    <w:p>
+      <w:pPr>
+        <w:pStyle w:val="SPBodyText"/>
+      </w:pPr>
+    </w:p>
+    <w:p>
+      <w:pPr>
+        <w:pStyle w:val="SPPrayerEnglish"/>
+      </w:pPr>
+      <w:r>
+        <w:t>Pray these words slowly</w:t>
+      </w:r>
+      <w:r>
+        <w:t xml:space="preserve">. </w:t>
+      </w:r>
+    </w:p>
+    <w:p>
+      <w:pPr>
+        <w:pStyle w:val="SPBodyText"/>
+      </w:pPr>
     </w:p>
     <w:sectPr>
       <w:type w:val="oddPage"/>

</xml_diff>

<commit_message>
Glory be skeleton setup
</commit_message>
<xml_diff>
--- a/manuscript/volume-1/sacrae-preces-volume-1.docx
+++ b/manuscript/volume-1/sacrae-preces-volume-1.docx
@@ -74,7 +74,6 @@
           <w:szCs w:val="18"/>
         </w:rPr>
       </w:pPr>
-      <w:proofErr w:type="spellStart"/>
       <w:r>
         <w:rPr>
           <w:rStyle w:val="SPPrayerResponseCS"/>
@@ -82,17 +81,7 @@
           <w:sz w:val="48"/>
           <w:szCs w:val="18"/>
         </w:rPr>
-        <w:t>Sacrea</w:t>
-      </w:r>
-      <w:proofErr w:type="spellEnd"/>
-      <w:r>
-        <w:rPr>
-          <w:rStyle w:val="SPPrayerResponseCS"/>
-          <w:i w:val="0"/>
-          <w:sz w:val="48"/>
-          <w:szCs w:val="18"/>
-        </w:rPr>
-        <w:t xml:space="preserve"> preces</w:t>
+        <w:t>Sacrea preces</w:t>
       </w:r>
     </w:p>
     <w:p>
@@ -431,7 +420,15 @@
         <w:pStyle w:val="SPBodyText"/>
       </w:pPr>
       <w:r>
-        <w:t>We can spend our days surrounded by noise, responsibilities, conversations, messages, and countless things competing for our attention. In the midst of all of this, prayer calls us to stop. To become still. To turn our hearts towards God.</w:t>
+        <w:t xml:space="preserve">We can spend our days surrounded by noise, responsibilities, conversations, messages, and countless things competing for our attention. </w:t>
+      </w:r>
+      <w:proofErr w:type="gramStart"/>
+      <w:r>
+        <w:t>In the midst of</w:t>
+      </w:r>
+      <w:proofErr w:type="gramEnd"/>
+      <w:r>
+        <w:t xml:space="preserve"> all of this, prayer calls us to stop. To become still. To turn our hearts towards God.</w:t>
       </w:r>
     </w:p>
     <w:p>
@@ -515,7 +512,15 @@
         <w:t>"Sacred Prayers."</w:t>
       </w:r>
       <w:r>
-        <w:t xml:space="preserve"> The name reflects something simple: these prayers are part of a rich inheritance that has been handed down through the life of the Church. They belong not merely to one generation, one country, or one language. They have crossed centuries and borders, carried by ordinary people who have sought God in the midst of ordinary lives.</w:t>
+        <w:t xml:space="preserve"> The name reflects something simple: these prayers are part of a rich inheritance that has been handed down through the life of the Church. They belong not merely to one generation, one country, or one language. They have crossed centuries and borders, carried by ordinary people who have sought God </w:t>
+      </w:r>
+      <w:proofErr w:type="gramStart"/>
+      <w:r>
+        <w:t>in the midst of</w:t>
+      </w:r>
+      <w:proofErr w:type="gramEnd"/>
+      <w:r>
+        <w:t xml:space="preserve"> ordinary lives.</w:t>
       </w:r>
     </w:p>
     <w:p>
@@ -590,7 +595,15 @@
         <w:pStyle w:val="SPBodyText"/>
       </w:pPr>
       <w:r>
-        <w:t>For this reason, each prayer is accompanied by material intended for reflection and study. We look at its place in Scripture, consider why Christians have prayed it, explore the meaning of its petitions, and examine some of the Latin words that give the prayer its particular character.</w:t>
+        <w:t xml:space="preserve">For this reason, each prayer is accompanied by material intended for reflection and study. We look at its place in Scripture, consider why Christians have prayed it, explore the meaning of its petitions, and examine some of the Latin words that give the prayer its </w:t>
+      </w:r>
+      <w:proofErr w:type="gramStart"/>
+      <w:r>
+        <w:t>particular character</w:t>
+      </w:r>
+      <w:proofErr w:type="gramEnd"/>
+      <w:r>
+        <w:t>.</w:t>
       </w:r>
     </w:p>
     <w:p>
@@ -738,7 +751,15 @@
       </w:pPr>
       <w:r>
         <w:lastRenderedPageBreak/>
-        <w:t>And someone who learns to pray may eventually discover that prayer is not something we merely do at particular times.</w:t>
+        <w:t xml:space="preserve">And someone who learns to pray may eventually discover that prayer is not something we merely do at </w:t>
+      </w:r>
+      <w:proofErr w:type="gramStart"/>
+      <w:r>
+        <w:t>particular times</w:t>
+      </w:r>
+      <w:proofErr w:type="gramEnd"/>
+      <w:r>
+        <w:t>.</w:t>
       </w:r>
     </w:p>
     <w:p>
@@ -976,7 +997,15 @@
         <w:pStyle w:val="SPBodyText"/>
       </w:pPr>
       <w:r>
-        <w:t>It is not necessary to read this book from beginning to end. There is no particular order in which the prayers must be approached, and there is no expectation that every page must be studied before the prayers can be prayed.</w:t>
+        <w:t xml:space="preserve">It is not necessary to read this book from beginning to end. There is no </w:t>
+      </w:r>
+      <w:proofErr w:type="gramStart"/>
+      <w:r>
+        <w:t>particular order</w:t>
+      </w:r>
+      <w:proofErr w:type="gramEnd"/>
+      <w:r>
+        <w:t xml:space="preserve"> in which the prayers must be approached, and there is no expectation that every page must be studied before the prayers can be prayed.</w:t>
       </w:r>
     </w:p>
     <w:p>
@@ -1002,7 +1031,15 @@
         <w:pStyle w:val="SPBodyText"/>
       </w:pPr>
       <w:r>
-        <w:t>Perhaps there is a prayer you already know well. Perhaps there is one you have heard many times but never really considered. Perhaps you are looking for a prayer for a particular moment of the day, or simply looking for a few quiet minutes in which to turn your attention towards God.</w:t>
+        <w:t xml:space="preserve">Perhaps there is a prayer you already know well. Perhaps there is one you have heard many times but never really considered. Perhaps you are looking for a prayer for a particular moment of the </w:t>
+      </w:r>
+      <w:proofErr w:type="gramStart"/>
+      <w:r>
+        <w:t>day, or</w:t>
+      </w:r>
+      <w:proofErr w:type="gramEnd"/>
+      <w:r>
+        <w:t xml:space="preserve"> simply looking for a few quiet minutes in which to turn your attention towards God.</w:t>
       </w:r>
     </w:p>
     <w:p>
@@ -1047,7 +1084,15 @@
         <w:pStyle w:val="SPBodyText"/>
       </w:pPr>
       <w:r>
-        <w:t>There is no requirement to learn Latin in order to use this book.</w:t>
+        <w:t xml:space="preserve">There is no requirement to learn Latin </w:t>
+      </w:r>
+      <w:proofErr w:type="gramStart"/>
+      <w:r>
+        <w:t>in order to</w:t>
+      </w:r>
+      <w:proofErr w:type="gramEnd"/>
+      <w:r>
+        <w:t xml:space="preserve"> use this book.</w:t>
       </w:r>
     </w:p>
     <w:p>
@@ -1531,7 +1576,15 @@
         <w:t>Sacrae Preces</w:t>
       </w:r>
       <w:r>
-        <w:t xml:space="preserve"> is therefore not meant to be something that is simply read once and placed back on a shelf.</w:t>
+        <w:t xml:space="preserve"> is therefore not meant to </w:t>
+      </w:r>
+      <w:proofErr w:type="gramStart"/>
+      <w:r>
+        <w:t>be something that is</w:t>
+      </w:r>
+      <w:proofErr w:type="gramEnd"/>
+      <w:r>
+        <w:t xml:space="preserve"> simply read once and placed back on a shelf.</w:t>
       </w:r>
     </w:p>
     <w:p>
@@ -1625,11 +1678,9 @@
       <w:pPr>
         <w:pStyle w:val="SPBodyText"/>
       </w:pPr>
-      <w:proofErr w:type="spellStart"/>
       <w:r>
         <w:t>tt</w:t>
       </w:r>
-      <w:proofErr w:type="spellEnd"/>
     </w:p>
     <w:p>
       <w:pPr>
@@ -1791,15 +1842,7 @@
         <w:pStyle w:val="SPPrayerLatin"/>
       </w:pPr>
       <w:r>
-        <w:t xml:space="preserve"> In </w:t>
-      </w:r>
-      <w:proofErr w:type="spellStart"/>
-      <w:r>
-        <w:t>nomine</w:t>
-      </w:r>
-      <w:proofErr w:type="spellEnd"/>
-      <w:r>
-        <w:t xml:space="preserve"> Patris, </w:t>
+        <w:t xml:space="preserve"> In nomine Patris, </w:t>
       </w:r>
     </w:p>
     <w:p>
@@ -1852,58 +1895,16 @@
         <w:rPr>
           <w:rStyle w:val="Emphasis"/>
         </w:rPr>
-        <w:t>in NOH-mee-</w:t>
-      </w:r>
-      <w:proofErr w:type="spellStart"/>
+        <w:t>in NOH-mee-neh PAH-tris,</w:t>
+      </w:r>
+      <w:r>
+        <w:br/>
+      </w:r>
       <w:r>
         <w:rPr>
           <w:rStyle w:val="Emphasis"/>
         </w:rPr>
-        <w:t>neh</w:t>
-      </w:r>
-      <w:proofErr w:type="spellEnd"/>
-      <w:r>
-        <w:rPr>
-          <w:rStyle w:val="Emphasis"/>
-        </w:rPr>
-        <w:t xml:space="preserve"> PAH-tris,</w:t>
-      </w:r>
-      <w:r>
-        <w:br/>
-      </w:r>
-      <w:r>
-        <w:rPr>
-          <w:rStyle w:val="Emphasis"/>
-        </w:rPr>
-        <w:t>et FEE-lee-ee, et SPEE-</w:t>
-      </w:r>
-      <w:proofErr w:type="spellStart"/>
-      <w:r>
-        <w:rPr>
-          <w:rStyle w:val="Emphasis"/>
-        </w:rPr>
-        <w:t>ree</w:t>
-      </w:r>
-      <w:proofErr w:type="spellEnd"/>
-      <w:r>
-        <w:rPr>
-          <w:rStyle w:val="Emphasis"/>
-        </w:rPr>
-        <w:t>-</w:t>
-      </w:r>
-      <w:proofErr w:type="spellStart"/>
-      <w:r>
-        <w:rPr>
-          <w:rStyle w:val="Emphasis"/>
-        </w:rPr>
-        <w:t>toos</w:t>
-      </w:r>
-      <w:proofErr w:type="spellEnd"/>
-      <w:r>
-        <w:rPr>
-          <w:rStyle w:val="Emphasis"/>
-        </w:rPr>
-        <w:t xml:space="preserve"> SAHNK-tee.</w:t>
+        <w:t>et FEE-lee-ee, et SPEE-ree-toos SAHNK-tee.</w:t>
       </w:r>
       <w:r>
         <w:br/>
@@ -2245,65 +2246,23 @@
         <w:pStyle w:val="SPPrayerLatin"/>
       </w:pPr>
       <w:r>
-        <w:t xml:space="preserve">Pater </w:t>
-      </w:r>
-      <w:proofErr w:type="spellStart"/>
-      <w:r>
-        <w:t>noster</w:t>
-      </w:r>
-      <w:proofErr w:type="spellEnd"/>
-      <w:r>
-        <w:t xml:space="preserve">, qui es in </w:t>
-      </w:r>
-      <w:proofErr w:type="spellStart"/>
-      <w:r>
-        <w:t>caelis</w:t>
-      </w:r>
-      <w:proofErr w:type="spellEnd"/>
-      <w:r>
-        <w:t>,</w:t>
+        <w:t>Pater noster, qui es in caelis,</w:t>
       </w:r>
     </w:p>
     <w:p>
       <w:pPr>
         <w:pStyle w:val="SPPrayerLatin"/>
       </w:pPr>
-      <w:proofErr w:type="spellStart"/>
-      <w:r>
-        <w:t>Sanctificetur</w:t>
-      </w:r>
-      <w:proofErr w:type="spellEnd"/>
-      <w:r>
-        <w:t xml:space="preserve"> nomen </w:t>
-      </w:r>
-      <w:proofErr w:type="spellStart"/>
-      <w:r>
-        <w:t>tuum</w:t>
-      </w:r>
-      <w:proofErr w:type="spellEnd"/>
-      <w:r>
-        <w:t>.</w:t>
+      <w:r>
+        <w:t>Sanctificetur nomen tuum.</w:t>
       </w:r>
     </w:p>
     <w:p>
       <w:pPr>
         <w:pStyle w:val="SPPrayerLatin"/>
       </w:pPr>
-      <w:proofErr w:type="spellStart"/>
-      <w:r>
-        <w:t>Adveniat</w:t>
-      </w:r>
-      <w:proofErr w:type="spellEnd"/>
-      <w:r>
-        <w:t xml:space="preserve"> regnum </w:t>
-      </w:r>
-      <w:proofErr w:type="spellStart"/>
-      <w:r>
-        <w:t>tuum</w:t>
-      </w:r>
-      <w:proofErr w:type="spellEnd"/>
-      <w:r>
-        <w:t>.</w:t>
+      <w:r>
+        <w:t>Adveniat regnum tuum.</w:t>
       </w:r>
       <w:r>
         <w:t xml:space="preserve"> </w:t>
@@ -2314,31 +2273,7 @@
         <w:pStyle w:val="SPPrayerLatin"/>
       </w:pPr>
       <w:r>
-        <w:t xml:space="preserve">Fiat </w:t>
-      </w:r>
-      <w:proofErr w:type="spellStart"/>
-      <w:r>
-        <w:t>voluntas</w:t>
-      </w:r>
-      <w:proofErr w:type="spellEnd"/>
-      <w:r>
-        <w:t xml:space="preserve"> </w:t>
-      </w:r>
-      <w:proofErr w:type="spellStart"/>
-      <w:r>
-        <w:t>tua</w:t>
-      </w:r>
-      <w:proofErr w:type="spellEnd"/>
-      <w:r>
-        <w:t xml:space="preserve">, sicut in </w:t>
-      </w:r>
-      <w:proofErr w:type="spellStart"/>
-      <w:r>
-        <w:t>caelo</w:t>
-      </w:r>
-      <w:proofErr w:type="spellEnd"/>
-      <w:r>
-        <w:t xml:space="preserve"> et in terra.</w:t>
+        <w:t>Fiat voluntas tua, sicut in caelo et in terra.</w:t>
       </w:r>
     </w:p>
     <w:p>
@@ -2346,23 +2281,7 @@
         <w:pStyle w:val="SPPrayerLatin"/>
       </w:pPr>
       <w:r>
-        <w:t xml:space="preserve">Panem nostrum </w:t>
-      </w:r>
-      <w:proofErr w:type="spellStart"/>
-      <w:r>
-        <w:t>quotidianum</w:t>
-      </w:r>
-      <w:proofErr w:type="spellEnd"/>
-      <w:r>
-        <w:t xml:space="preserve"> do nobis </w:t>
-      </w:r>
-      <w:proofErr w:type="spellStart"/>
-      <w:r>
-        <w:t>hodie</w:t>
-      </w:r>
-      <w:proofErr w:type="spellEnd"/>
-      <w:r>
-        <w:t>,</w:t>
+        <w:t>Panem nostrum quotidianum do nobis hodie,</w:t>
       </w:r>
     </w:p>
     <w:p>
@@ -2370,23 +2289,7 @@
         <w:pStyle w:val="SPPrayerLatin"/>
       </w:pPr>
       <w:r>
-        <w:t xml:space="preserve">Et </w:t>
-      </w:r>
-      <w:proofErr w:type="spellStart"/>
-      <w:r>
-        <w:t>dimitte</w:t>
-      </w:r>
-      <w:proofErr w:type="spellEnd"/>
-      <w:r>
-        <w:t xml:space="preserve"> nobis </w:t>
-      </w:r>
-      <w:proofErr w:type="spellStart"/>
-      <w:r>
-        <w:t>debita</w:t>
-      </w:r>
-      <w:proofErr w:type="spellEnd"/>
-      <w:r>
-        <w:t xml:space="preserve"> nostra,</w:t>
+        <w:t>Et dimitte nobis debita nostra,</w:t>
       </w:r>
     </w:p>
     <w:p>
@@ -2394,39 +2297,7 @@
         <w:pStyle w:val="SPPrayerLatin"/>
       </w:pPr>
       <w:r>
-        <w:t xml:space="preserve">Sicut et </w:t>
-      </w:r>
-      <w:proofErr w:type="spellStart"/>
-      <w:r>
-        <w:t>nos</w:t>
-      </w:r>
-      <w:proofErr w:type="spellEnd"/>
-      <w:r>
-        <w:t xml:space="preserve"> </w:t>
-      </w:r>
-      <w:proofErr w:type="spellStart"/>
-      <w:r>
-        <w:t>dimittimus</w:t>
-      </w:r>
-      <w:proofErr w:type="spellEnd"/>
-      <w:r>
-        <w:t xml:space="preserve"> </w:t>
-      </w:r>
-      <w:proofErr w:type="spellStart"/>
-      <w:r>
-        <w:t>debitoribus</w:t>
-      </w:r>
-      <w:proofErr w:type="spellEnd"/>
-      <w:r>
-        <w:t xml:space="preserve"> </w:t>
-      </w:r>
-      <w:proofErr w:type="spellStart"/>
-      <w:r>
-        <w:t>nostris</w:t>
-      </w:r>
-      <w:proofErr w:type="spellEnd"/>
-      <w:r>
-        <w:t>.</w:t>
+        <w:t>Sicut et nos dimittimus debitoribus nostris.</w:t>
       </w:r>
     </w:p>
     <w:p>
@@ -2434,50 +2305,16 @@
         <w:pStyle w:val="SPPrayerLatin"/>
       </w:pPr>
       <w:r>
-        <w:t xml:space="preserve">Et ne </w:t>
-      </w:r>
-      <w:proofErr w:type="spellStart"/>
-      <w:r>
-        <w:t>nos</w:t>
-      </w:r>
-      <w:proofErr w:type="spellEnd"/>
-      <w:r>
-        <w:t xml:space="preserve"> </w:t>
-      </w:r>
-      <w:proofErr w:type="spellStart"/>
-      <w:r>
-        <w:t>inducasin</w:t>
-      </w:r>
-      <w:proofErr w:type="spellEnd"/>
-      <w:r>
-        <w:t xml:space="preserve"> </w:t>
-      </w:r>
-      <w:proofErr w:type="spellStart"/>
-      <w:r>
-        <w:t>tentationem</w:t>
-      </w:r>
-      <w:proofErr w:type="spellEnd"/>
+        <w:t>Et ne nos inducasin tentationem</w:t>
+      </w:r>
     </w:p>
     <w:p>
       <w:pPr>
         <w:pStyle w:val="SPPrayerLatin"/>
       </w:pPr>
       <w:r>
-        <w:t xml:space="preserve">Sed libera </w:t>
-      </w:r>
-      <w:proofErr w:type="spellStart"/>
-      <w:r>
-        <w:t>nos</w:t>
-      </w:r>
-      <w:proofErr w:type="spellEnd"/>
-      <w:r>
-        <w:t xml:space="preserve"> a </w:t>
-      </w:r>
-      <w:proofErr w:type="spellStart"/>
-      <w:r>
-        <w:t>malo</w:t>
-      </w:r>
-      <w:proofErr w:type="spellEnd"/>
+        <w:t>Sed libera nos a malo</w:t>
+      </w:r>
     </w:p>
     <w:p>
       <w:pPr>
@@ -2539,8 +2376,13 @@
         <w:pStyle w:val="SPScripture"/>
       </w:pPr>
       <w:r>
-        <w:t>Our Father who art in heaven, Hallowed be thy name. Thy kingdom come</w:t>
-      </w:r>
+        <w:t xml:space="preserve">Our Father who art in heaven, Hallowed be thy name. Thy kingdom </w:t>
+      </w:r>
+      <w:proofErr w:type="gramStart"/>
+      <w:r>
+        <w:t>come</w:t>
+      </w:r>
+      <w:proofErr w:type="gramEnd"/>
       <w:r>
         <w:t>.</w:t>
       </w:r>
@@ -2584,13 +2426,21 @@
         <w:t xml:space="preserve"> </w:t>
       </w:r>
       <w:r>
-        <w:t xml:space="preserve">And lead us not into temptation, </w:t>
+        <w:t xml:space="preserve">And lead us not into </w:t>
+      </w:r>
+      <w:proofErr w:type="gramStart"/>
+      <w:r>
+        <w:t xml:space="preserve">temptation, </w:t>
       </w:r>
       <w:r>
         <w:t>b</w:t>
       </w:r>
       <w:r>
-        <w:t>ut deliver us from evil.</w:t>
+        <w:t>ut</w:t>
+      </w:r>
+      <w:proofErr w:type="gramEnd"/>
+      <w:r>
+        <w:t xml:space="preserve"> deliver us from evil.</w:t>
       </w:r>
       <w:r>
         <w:t>”</w:t>
@@ -2624,13 +2474,21 @@
         <w:t>Your</w:t>
       </w:r>
       <w:r>
-        <w:t xml:space="preserve"> kingdom come. Give us each day our daily bread; and forgive us our sins, for we ourselves forgive </w:t>
-      </w:r>
-      <w:proofErr w:type="spellStart"/>
+        <w:t xml:space="preserve"> kingdom </w:t>
+      </w:r>
+      <w:proofErr w:type="gramStart"/>
+      <w:r>
+        <w:t>come</w:t>
+      </w:r>
+      <w:proofErr w:type="gramEnd"/>
+      <w:r>
+        <w:t xml:space="preserve">. Give us each day our daily bread; and forgive us our sins, for we ourselves forgive </w:t>
+      </w:r>
+      <w:proofErr w:type="gramStart"/>
       <w:r>
         <w:t>every one</w:t>
       </w:r>
-      <w:proofErr w:type="spellEnd"/>
+      <w:proofErr w:type="gramEnd"/>
       <w:r>
         <w:t xml:space="preserve"> who is indebted to us; and lead us not into temptation.</w:t>
       </w:r>
@@ -2714,6 +2572,7 @@
       <w:r>
         <w:t xml:space="preserve">The first word is not </w:t>
       </w:r>
+      <w:proofErr w:type="gramStart"/>
       <w:r>
         <w:rPr>
           <w:i/>
@@ -2721,10 +2580,11 @@
         </w:rPr>
         <w:t>my</w:t>
       </w:r>
+      <w:proofErr w:type="gramEnd"/>
       <w:r>
         <w:t xml:space="preserve">. It is </w:t>
       </w:r>
-      <w:proofErr w:type="spellStart"/>
+      <w:proofErr w:type="gramStart"/>
       <w:r>
         <w:rPr>
           <w:i/>
@@ -2732,7 +2592,7 @@
         </w:rPr>
         <w:t>our</w:t>
       </w:r>
-      <w:proofErr w:type="spellEnd"/>
+      <w:proofErr w:type="gramEnd"/>
       <w:r>
         <w:t>.</w:t>
       </w:r>
@@ -2962,13 +2822,8 @@
         <w:t xml:space="preserve">The </w:t>
       </w:r>
       <w:r>
-        <w:t xml:space="preserve">Hail </w:t>
-      </w:r>
-      <w:proofErr w:type="spellStart"/>
-      <w:r>
-        <w:t>mary</w:t>
-      </w:r>
-      <w:proofErr w:type="spellEnd"/>
+        <w:t>Hail mary</w:t>
+      </w:r>
     </w:p>
     <w:p>
       <w:pPr>
@@ -2983,7 +2838,15 @@
         <w:pStyle w:val="SPBodyText"/>
       </w:pPr>
       <w:r>
-        <w:t>The prayer then becomes our petition. We ask Mary, Mother of God, to pray for us — now, in the midst of our lives, and at the hour of our death.</w:t>
+        <w:t xml:space="preserve">The prayer then becomes our petition. We ask Mary, Mother of God, to pray for us — now, </w:t>
+      </w:r>
+      <w:proofErr w:type="gramStart"/>
+      <w:r>
+        <w:t>in the midst of</w:t>
+      </w:r>
+      <w:proofErr w:type="gramEnd"/>
+      <w:r>
+        <w:t xml:space="preserve"> our lives, and at the hour of our death.</w:t>
       </w:r>
     </w:p>
     <w:p>
@@ -3211,21 +3074,11 @@
         <w:t>a</w:t>
       </w:r>
       <w:r>
-        <w:t xml:space="preserve"> </w:t>
-      </w:r>
-      <w:proofErr w:type="spellStart"/>
-      <w:r>
-        <w:t>tu</w:t>
-      </w:r>
-      <w:proofErr w:type="spellEnd"/>
-      <w:r>
-        <w:t xml:space="preserve"> in </w:t>
-      </w:r>
-      <w:proofErr w:type="spellStart"/>
+        <w:t xml:space="preserve"> tu in </w:t>
+      </w:r>
       <w:r>
         <w:t>muliéribus</w:t>
       </w:r>
-      <w:proofErr w:type="spellEnd"/>
       <w:r>
         <w:t>,</w:t>
       </w:r>
@@ -3237,24 +3090,11 @@
       <w:r>
         <w:t xml:space="preserve">Et </w:t>
       </w:r>
-      <w:proofErr w:type="spellStart"/>
       <w:r>
         <w:t>b</w:t>
       </w:r>
       <w:r>
-        <w:t>enedictus</w:t>
-      </w:r>
-      <w:proofErr w:type="spellEnd"/>
-      <w:r>
-        <w:t xml:space="preserve"> fructus </w:t>
-      </w:r>
-      <w:proofErr w:type="spellStart"/>
-      <w:r>
-        <w:t>ventris</w:t>
-      </w:r>
-      <w:proofErr w:type="spellEnd"/>
-      <w:r>
-        <w:t xml:space="preserve"> tu</w:t>
+        <w:t>enedictus fructus ventris tu</w:t>
       </w:r>
       <w:r>
         <w:t>i,</w:t>
@@ -3285,11 +3125,7 @@
         <w:pStyle w:val="SPPrayerLatin"/>
       </w:pPr>
       <w:r>
-        <w:t xml:space="preserve">Ora pro nobis </w:t>
-      </w:r>
-      <w:proofErr w:type="spellStart"/>
-      <w:r>
-        <w:t>pec</w:t>
+        <w:t>Ora pro nobis pec</w:t>
       </w:r>
       <w:r>
         <w:t>c</w:t>
@@ -3297,7 +3133,6 @@
       <w:r>
         <w:t>atoribus</w:t>
       </w:r>
-      <w:proofErr w:type="spellEnd"/>
       <w:r>
         <w:t>,</w:t>
       </w:r>
@@ -3319,11 +3154,7 @@
         <w:t>h</w:t>
       </w:r>
       <w:r>
-        <w:t xml:space="preserve">ora mortis </w:t>
-      </w:r>
-      <w:proofErr w:type="spellStart"/>
-      <w:r>
-        <w:t>nostr</w:t>
+        <w:t>ora mortis nostr</w:t>
       </w:r>
       <w:r>
         <w:t>a</w:t>
@@ -3331,7 +3162,6 @@
       <w:r>
         <w:t>e</w:t>
       </w:r>
-      <w:proofErr w:type="spellEnd"/>
       <w:r>
         <w:t>.</w:t>
       </w:r>
@@ -3832,7 +3662,15 @@
         <w:pStyle w:val="SPBodyText"/>
       </w:pPr>
       <w:r>
-        <w:t>The prayer begins with the words of Scripture and ends with our humble request for intercession. Between the two stands the mystery of Christ: God who comes among us, takes flesh, and enters into our human story.</w:t>
+        <w:t xml:space="preserve">The prayer begins with the words of Scripture and ends with our humble request for intercession. Between the two stands the mystery of Christ: God who comes among us, takes flesh, and </w:t>
+      </w:r>
+      <w:proofErr w:type="gramStart"/>
+      <w:r>
+        <w:t>enters into</w:t>
+      </w:r>
+      <w:proofErr w:type="gramEnd"/>
+      <w:r>
+        <w:t xml:space="preserve"> our human story.</w:t>
       </w:r>
     </w:p>
     <w:p>
@@ -3985,6 +3823,14 @@
     <w:p>
       <w:pPr>
         <w:pStyle w:val="SPPrayerEnglish"/>
+        <w:sectPr>
+          <w:type w:val="oddPage"/>
+          <w:pgSz w:w="7920" w:h="12240" w:code="6"/>
+          <w:pgMar w:top="1080" w:right="864" w:bottom="1080" w:left="1152" w:header="576" w:footer="576" w:gutter="0"/>
+          <w:cols w:space="720"/>
+          <w:titlePg/>
+          <w:docGrid w:linePitch="360"/>
+        </w:sectPr>
       </w:pPr>
       <w:r>
         <w:t>Pray these words slowly</w:t>
@@ -3995,11 +3841,312 @@
     </w:p>
     <w:p>
       <w:pPr>
-        <w:pStyle w:val="SPBodyText"/>
-      </w:pPr>
+        <w:pStyle w:val="SPLanguage"/>
+      </w:pPr>
+      <w:r>
+        <w:lastRenderedPageBreak/>
+        <w:t xml:space="preserve">ENGLISH </w:t>
+      </w:r>
+    </w:p>
+    <w:p>
+      <w:pPr>
+        <w:pStyle w:val="SPPrayerEnglish"/>
+      </w:pPr>
+    </w:p>
+    <w:p>
+      <w:pPr>
+        <w:pStyle w:val="SPPrayerEnglish"/>
+      </w:pPr>
+      <w:r>
+        <w:t xml:space="preserve">Glory be to the </w:t>
+      </w:r>
+      <w:proofErr w:type="gramStart"/>
+      <w:r>
+        <w:t>Father</w:t>
+      </w:r>
+      <w:proofErr w:type="gramEnd"/>
+      <w:r>
+        <w:t>,</w:t>
+      </w:r>
+    </w:p>
+    <w:p>
+      <w:pPr>
+        <w:pStyle w:val="SPPrayerEnglish"/>
+      </w:pPr>
+      <w:r>
+        <w:t xml:space="preserve">And to the </w:t>
+      </w:r>
+      <w:proofErr w:type="gramStart"/>
+      <w:r>
+        <w:t>Son</w:t>
+      </w:r>
+      <w:proofErr w:type="gramEnd"/>
+    </w:p>
+    <w:p>
+      <w:pPr>
+        <w:pStyle w:val="SPPrayerEnglish"/>
+      </w:pPr>
+      <w:r>
+        <w:t>And to the Holy Spirit.</w:t>
+      </w:r>
+    </w:p>
+    <w:p>
+      <w:pPr>
+        <w:pStyle w:val="SPPrayerEnglish"/>
+      </w:pPr>
+      <w:r>
+        <w:t>As it was in the beginning,</w:t>
+      </w:r>
+    </w:p>
+    <w:p>
+      <w:pPr>
+        <w:pStyle w:val="SPPrayerEnglish"/>
+      </w:pPr>
+      <w:r>
+        <w:t xml:space="preserve">Is </w:t>
+      </w:r>
+      <w:proofErr w:type="gramStart"/>
+      <w:r>
+        <w:t>now, and</w:t>
+      </w:r>
+      <w:proofErr w:type="gramEnd"/>
+      <w:r>
+        <w:t xml:space="preserve"> forever shall be.</w:t>
+      </w:r>
+    </w:p>
+    <w:p>
+      <w:pPr>
+        <w:pStyle w:val="SPPrayerEnglish"/>
+      </w:pPr>
+      <w:r>
+        <w:t>World without end.</w:t>
+      </w:r>
+    </w:p>
+    <w:p>
+      <w:pPr>
+        <w:pStyle w:val="SPPrayerEnglish"/>
+      </w:pPr>
+      <w:r>
+        <w:t xml:space="preserve">Amen </w:t>
+      </w:r>
+    </w:p>
+    <w:p>
+      <w:pPr>
+        <w:pStyle w:val="SPPrayerEnglish"/>
+        <w:sectPr>
+          <w:type w:val="evenPage"/>
+          <w:pgSz w:w="7920" w:h="12240" w:code="6"/>
+          <w:pgMar w:top="1080" w:right="864" w:bottom="1080" w:left="1152" w:header="576" w:footer="576" w:gutter="0"/>
+          <w:cols w:space="720"/>
+          <w:titlePg/>
+          <w:docGrid w:linePitch="360"/>
+        </w:sectPr>
+      </w:pPr>
+      <w:r>
+        <w:t xml:space="preserve"> </w:t>
+      </w:r>
+    </w:p>
+    <w:p>
+      <w:pPr>
+        <w:pStyle w:val="SPLanguage"/>
+      </w:pPr>
+      <w:r>
+        <w:lastRenderedPageBreak/>
+        <w:t>LATIN</w:t>
+      </w:r>
+    </w:p>
+    <w:p>
+      <w:pPr>
+        <w:pStyle w:val="SPPrayerLatin"/>
+      </w:pPr>
+    </w:p>
+    <w:p>
+      <w:pPr>
+        <w:pStyle w:val="SPPrayerLatin"/>
+      </w:pPr>
+      <w:r>
+        <w:t>Gloria Patre,</w:t>
+      </w:r>
+    </w:p>
+    <w:p>
+      <w:pPr>
+        <w:pStyle w:val="SPPrayerLatin"/>
+      </w:pPr>
+      <w:r>
+        <w:t>Et Filio</w:t>
+      </w:r>
+    </w:p>
+    <w:p>
+      <w:pPr>
+        <w:pStyle w:val="SPPrayerLatin"/>
+      </w:pPr>
+      <w:r>
+        <w:t>Et Spiritui Sancto</w:t>
+      </w:r>
+    </w:p>
+    <w:p>
+      <w:pPr>
+        <w:pStyle w:val="SPPrayerLatin"/>
+      </w:pPr>
+      <w:r>
+        <w:t>Sicut erat in principio,</w:t>
+      </w:r>
+    </w:p>
+    <w:p>
+      <w:pPr>
+        <w:pStyle w:val="SPPrayerLatin"/>
+      </w:pPr>
+      <w:r>
+        <w:t>Et nunc, et semper.</w:t>
+      </w:r>
+    </w:p>
+    <w:p>
+      <w:pPr>
+        <w:pStyle w:val="SPPrayerLatin"/>
+      </w:pPr>
+      <w:r>
+        <w:t>Et in saecula saeculorum</w:t>
+      </w:r>
+    </w:p>
+    <w:p>
+      <w:pPr>
+        <w:pStyle w:val="SPPrayerLatin"/>
+      </w:pPr>
+      <w:r>
+        <w:t xml:space="preserve">Amen </w:t>
+      </w:r>
+    </w:p>
+    <w:p>
+      <w:pPr>
+        <w:pStyle w:val="SPPronunciation"/>
+        <w:rPr>
+          <w:rStyle w:val="Emphasis"/>
+        </w:rPr>
+        <w:sectPr>
+          <w:type w:val="oddPage"/>
+          <w:pgSz w:w="7920" w:h="12240" w:code="6"/>
+          <w:pgMar w:top="1080" w:right="864" w:bottom="1080" w:left="1152" w:header="576" w:footer="576" w:gutter="0"/>
+          <w:cols w:space="720"/>
+          <w:titlePg/>
+          <w:docGrid w:linePitch="360"/>
+        </w:sectPr>
+      </w:pPr>
+    </w:p>
+    <w:p>
+      <w:pPr>
+        <w:pStyle w:val="SPSectionTitle"/>
+      </w:pPr>
+      <w:r>
+        <w:lastRenderedPageBreak/>
+        <w:t>Scripture</w:t>
+      </w:r>
+    </w:p>
+    <w:p>
+      <w:pPr>
+        <w:pStyle w:val="SPScriptureReference"/>
+      </w:pPr>
+      <w:r>
+        <w:t xml:space="preserve"> </w:t>
+      </w:r>
+      <w:r>
+        <w:rPr>
+          <w:bCs/>
+        </w:rPr>
+        <w:t>Ephesians 3:21</w:t>
+      </w:r>
+      <w:r>
+        <w:t>:</w:t>
+      </w:r>
+    </w:p>
+    <w:p>
+      <w:pPr>
+        <w:pStyle w:val="SPScriptureReference"/>
+      </w:pPr>
+      <w:r>
+        <w:rPr>
+          <w:bCs/>
+        </w:rPr>
+        <w:t>Romans 11:36</w:t>
+      </w:r>
+      <w:r>
+        <w:t>:</w:t>
+      </w:r>
+    </w:p>
+    <w:p>
+      <w:pPr>
+        <w:pStyle w:val="SPScriptureReference"/>
+      </w:pPr>
+      <w:r>
+        <w:rPr>
+          <w:bCs/>
+        </w:rPr>
+        <w:t>1 Timothy 1:17</w:t>
+      </w:r>
+      <w:r>
+        <w:t>:</w:t>
+      </w:r>
+    </w:p>
+    <w:p>
+      <w:pPr>
+        <w:pStyle w:val="SPScriptureReference"/>
+      </w:pPr>
+      <w:r>
+        <w:rPr>
+          <w:bCs/>
+        </w:rPr>
+        <w:t>Revelation 1:5-6</w:t>
+      </w:r>
+      <w:r>
+        <w:t>:</w:t>
+      </w:r>
+      <w:r>
+        <w:t xml:space="preserve"> </w:t>
+      </w:r>
+    </w:p>
+    <w:p>
+      <w:pPr>
+        <w:pStyle w:val="SPScripture"/>
+        <w:sectPr>
+          <w:type w:val="evenPage"/>
+          <w:pgSz w:w="7920" w:h="12240" w:code="6"/>
+          <w:pgMar w:top="1080" w:right="864" w:bottom="1080" w:left="1152" w:header="576" w:footer="576" w:gutter="0"/>
+          <w:cols w:space="720"/>
+          <w:titlePg/>
+          <w:docGrid w:linePitch="360"/>
+        </w:sectPr>
+      </w:pPr>
+    </w:p>
+    <w:p>
+      <w:pPr>
+        <w:pStyle w:val="SPSectionTitle"/>
+      </w:pPr>
+      <w:r>
+        <w:lastRenderedPageBreak/>
+        <w:t>Reflection</w:t>
+      </w:r>
+    </w:p>
+    <w:p>
+      <w:pPr>
+        <w:pStyle w:val="SPBodyText"/>
+      </w:pPr>
+      <w:r>
+        <w:t xml:space="preserve">  </w:t>
+      </w:r>
+    </w:p>
+    <w:p>
+      <w:pPr>
+        <w:pStyle w:val="SPBodyText"/>
+      </w:pPr>
+      <w:r>
+        <w:rPr>
+          <w:b/>
+          <w:bCs/>
+        </w:rPr>
+        <w:t xml:space="preserve"> </w:t>
+      </w:r>
     </w:p>
     <w:sectPr>
-      <w:type w:val="oddPage"/>
+      <w:type w:val="evenPage"/>
       <w:pgSz w:w="7920" w:h="12240" w:code="6"/>
       <w:pgMar w:top="1080" w:right="864" w:bottom="1080" w:left="1152" w:header="576" w:footer="576" w:gutter="0"/>
       <w:cols w:space="720"/>

</xml_diff>

<commit_message>
Some more work on Glory Be prayer
</commit_message>
<xml_diff>
--- a/manuscript/volume-1/sacrae-preces-volume-1.docx
+++ b/manuscript/volume-1/sacrae-preces-volume-1.docx
@@ -74,6 +74,7 @@
           <w:szCs w:val="18"/>
         </w:rPr>
       </w:pPr>
+      <w:proofErr w:type="spellStart"/>
       <w:r>
         <w:rPr>
           <w:rStyle w:val="SPPrayerResponseCS"/>
@@ -81,7 +82,17 @@
           <w:sz w:val="48"/>
           <w:szCs w:val="18"/>
         </w:rPr>
-        <w:t>Sacrea preces</w:t>
+        <w:t>Sacrea</w:t>
+      </w:r>
+      <w:proofErr w:type="spellEnd"/>
+      <w:r>
+        <w:rPr>
+          <w:rStyle w:val="SPPrayerResponseCS"/>
+          <w:i w:val="0"/>
+          <w:sz w:val="48"/>
+          <w:szCs w:val="18"/>
+        </w:rPr>
+        <w:t xml:space="preserve"> preces</w:t>
       </w:r>
     </w:p>
     <w:p>
@@ -420,15 +431,7 @@
         <w:pStyle w:val="SPBodyText"/>
       </w:pPr>
       <w:r>
-        <w:t xml:space="preserve">We can spend our days surrounded by noise, responsibilities, conversations, messages, and countless things competing for our attention. </w:t>
-      </w:r>
-      <w:proofErr w:type="gramStart"/>
-      <w:r>
-        <w:t>In the midst of</w:t>
-      </w:r>
-      <w:proofErr w:type="gramEnd"/>
-      <w:r>
-        <w:t xml:space="preserve"> all of this, prayer calls us to stop. To become still. To turn our hearts towards God.</w:t>
+        <w:t>We can spend our days surrounded by noise, responsibilities, conversations, messages, and countless things competing for our attention. In the midst of all of this, prayer calls us to stop. To become still. To turn our hearts towards God.</w:t>
       </w:r>
     </w:p>
     <w:p>
@@ -512,15 +515,7 @@
         <w:t>"Sacred Prayers."</w:t>
       </w:r>
       <w:r>
-        <w:t xml:space="preserve"> The name reflects something simple: these prayers are part of a rich inheritance that has been handed down through the life of the Church. They belong not merely to one generation, one country, or one language. They have crossed centuries and borders, carried by ordinary people who have sought God </w:t>
-      </w:r>
-      <w:proofErr w:type="gramStart"/>
-      <w:r>
-        <w:t>in the midst of</w:t>
-      </w:r>
-      <w:proofErr w:type="gramEnd"/>
-      <w:r>
-        <w:t xml:space="preserve"> ordinary lives.</w:t>
+        <w:t xml:space="preserve"> The name reflects something simple: these prayers are part of a rich inheritance that has been handed down through the life of the Church. They belong not merely to one generation, one country, or one language. They have crossed centuries and borders, carried by ordinary people who have sought God in the midst of ordinary lives.</w:t>
       </w:r>
     </w:p>
     <w:p>
@@ -595,15 +590,7 @@
         <w:pStyle w:val="SPBodyText"/>
       </w:pPr>
       <w:r>
-        <w:t xml:space="preserve">For this reason, each prayer is accompanied by material intended for reflection and study. We look at its place in Scripture, consider why Christians have prayed it, explore the meaning of its petitions, and examine some of the Latin words that give the prayer its </w:t>
-      </w:r>
-      <w:proofErr w:type="gramStart"/>
-      <w:r>
-        <w:t>particular character</w:t>
-      </w:r>
-      <w:proofErr w:type="gramEnd"/>
-      <w:r>
-        <w:t>.</w:t>
+        <w:t>For this reason, each prayer is accompanied by material intended for reflection and study. We look at its place in Scripture, consider why Christians have prayed it, explore the meaning of its petitions, and examine some of the Latin words that give the prayer its particular character.</w:t>
       </w:r>
     </w:p>
     <w:p>
@@ -751,15 +738,7 @@
       </w:pPr>
       <w:r>
         <w:lastRenderedPageBreak/>
-        <w:t xml:space="preserve">And someone who learns to pray may eventually discover that prayer is not something we merely do at </w:t>
-      </w:r>
-      <w:proofErr w:type="gramStart"/>
-      <w:r>
-        <w:t>particular times</w:t>
-      </w:r>
-      <w:proofErr w:type="gramEnd"/>
-      <w:r>
-        <w:t>.</w:t>
+        <w:t>And someone who learns to pray may eventually discover that prayer is not something we merely do at particular times.</w:t>
       </w:r>
     </w:p>
     <w:p>
@@ -997,15 +976,7 @@
         <w:pStyle w:val="SPBodyText"/>
       </w:pPr>
       <w:r>
-        <w:t xml:space="preserve">It is not necessary to read this book from beginning to end. There is no </w:t>
-      </w:r>
-      <w:proofErr w:type="gramStart"/>
-      <w:r>
-        <w:t>particular order</w:t>
-      </w:r>
-      <w:proofErr w:type="gramEnd"/>
-      <w:r>
-        <w:t xml:space="preserve"> in which the prayers must be approached, and there is no expectation that every page must be studied before the prayers can be prayed.</w:t>
+        <w:t>It is not necessary to read this book from beginning to end. There is no particular order in which the prayers must be approached, and there is no expectation that every page must be studied before the prayers can be prayed.</w:t>
       </w:r>
     </w:p>
     <w:p>
@@ -1031,15 +1002,7 @@
         <w:pStyle w:val="SPBodyText"/>
       </w:pPr>
       <w:r>
-        <w:t xml:space="preserve">Perhaps there is a prayer you already know well. Perhaps there is one you have heard many times but never really considered. Perhaps you are looking for a prayer for a particular moment of the </w:t>
-      </w:r>
-      <w:proofErr w:type="gramStart"/>
-      <w:r>
-        <w:t>day, or</w:t>
-      </w:r>
-      <w:proofErr w:type="gramEnd"/>
-      <w:r>
-        <w:t xml:space="preserve"> simply looking for a few quiet minutes in which to turn your attention towards God.</w:t>
+        <w:t>Perhaps there is a prayer you already know well. Perhaps there is one you have heard many times but never really considered. Perhaps you are looking for a prayer for a particular moment of the day, or simply looking for a few quiet minutes in which to turn your attention towards God.</w:t>
       </w:r>
     </w:p>
     <w:p>
@@ -1084,15 +1047,7 @@
         <w:pStyle w:val="SPBodyText"/>
       </w:pPr>
       <w:r>
-        <w:t xml:space="preserve">There is no requirement to learn Latin </w:t>
-      </w:r>
-      <w:proofErr w:type="gramStart"/>
-      <w:r>
-        <w:t>in order to</w:t>
-      </w:r>
-      <w:proofErr w:type="gramEnd"/>
-      <w:r>
-        <w:t xml:space="preserve"> use this book.</w:t>
+        <w:t>There is no requirement to learn Latin in order to use this book.</w:t>
       </w:r>
     </w:p>
     <w:p>
@@ -1576,15 +1531,7 @@
         <w:t>Sacrae Preces</w:t>
       </w:r>
       <w:r>
-        <w:t xml:space="preserve"> is therefore not meant to </w:t>
-      </w:r>
-      <w:proofErr w:type="gramStart"/>
-      <w:r>
-        <w:t>be something that is</w:t>
-      </w:r>
-      <w:proofErr w:type="gramEnd"/>
-      <w:r>
-        <w:t xml:space="preserve"> simply read once and placed back on a shelf.</w:t>
+        <w:t xml:space="preserve"> is therefore not meant to be something that is simply read once and placed back on a shelf.</w:t>
       </w:r>
     </w:p>
     <w:p>
@@ -1678,9 +1625,11 @@
       <w:pPr>
         <w:pStyle w:val="SPBodyText"/>
       </w:pPr>
+      <w:proofErr w:type="spellStart"/>
       <w:r>
         <w:t>tt</w:t>
       </w:r>
+      <w:proofErr w:type="spellEnd"/>
     </w:p>
     <w:p>
       <w:pPr>
@@ -1842,7 +1791,15 @@
         <w:pStyle w:val="SPPrayerLatin"/>
       </w:pPr>
       <w:r>
-        <w:t xml:space="preserve"> In nomine Patris, </w:t>
+        <w:t xml:space="preserve"> In </w:t>
+      </w:r>
+      <w:proofErr w:type="spellStart"/>
+      <w:r>
+        <w:t>nomine</w:t>
+      </w:r>
+      <w:proofErr w:type="spellEnd"/>
+      <w:r>
+        <w:t xml:space="preserve"> Patris, </w:t>
       </w:r>
     </w:p>
     <w:p>
@@ -1895,7 +1852,21 @@
         <w:rPr>
           <w:rStyle w:val="Emphasis"/>
         </w:rPr>
-        <w:t>in NOH-mee-neh PAH-tris,</w:t>
+        <w:t>in NOH-mee-</w:t>
+      </w:r>
+      <w:proofErr w:type="spellStart"/>
+      <w:r>
+        <w:rPr>
+          <w:rStyle w:val="Emphasis"/>
+        </w:rPr>
+        <w:t>neh</w:t>
+      </w:r>
+      <w:proofErr w:type="spellEnd"/>
+      <w:r>
+        <w:rPr>
+          <w:rStyle w:val="Emphasis"/>
+        </w:rPr>
+        <w:t xml:space="preserve"> PAH-tris,</w:t>
       </w:r>
       <w:r>
         <w:br/>
@@ -1904,7 +1875,35 @@
         <w:rPr>
           <w:rStyle w:val="Emphasis"/>
         </w:rPr>
-        <w:t>et FEE-lee-ee, et SPEE-ree-toos SAHNK-tee.</w:t>
+        <w:t>et FEE-lee-ee, et SPEE-</w:t>
+      </w:r>
+      <w:proofErr w:type="spellStart"/>
+      <w:r>
+        <w:rPr>
+          <w:rStyle w:val="Emphasis"/>
+        </w:rPr>
+        <w:t>ree</w:t>
+      </w:r>
+      <w:proofErr w:type="spellEnd"/>
+      <w:r>
+        <w:rPr>
+          <w:rStyle w:val="Emphasis"/>
+        </w:rPr>
+        <w:t>-</w:t>
+      </w:r>
+      <w:proofErr w:type="spellStart"/>
+      <w:r>
+        <w:rPr>
+          <w:rStyle w:val="Emphasis"/>
+        </w:rPr>
+        <w:t>toos</w:t>
+      </w:r>
+      <w:proofErr w:type="spellEnd"/>
+      <w:r>
+        <w:rPr>
+          <w:rStyle w:val="Emphasis"/>
+        </w:rPr>
+        <w:t xml:space="preserve"> SAHNK-tee.</w:t>
       </w:r>
       <w:r>
         <w:br/>
@@ -2246,23 +2245,65 @@
         <w:pStyle w:val="SPPrayerLatin"/>
       </w:pPr>
       <w:r>
-        <w:t>Pater noster, qui es in caelis,</w:t>
+        <w:t xml:space="preserve">Pater </w:t>
+      </w:r>
+      <w:proofErr w:type="spellStart"/>
+      <w:r>
+        <w:t>noster</w:t>
+      </w:r>
+      <w:proofErr w:type="spellEnd"/>
+      <w:r>
+        <w:t xml:space="preserve">, qui es in </w:t>
+      </w:r>
+      <w:proofErr w:type="spellStart"/>
+      <w:r>
+        <w:t>caelis</w:t>
+      </w:r>
+      <w:proofErr w:type="spellEnd"/>
+      <w:r>
+        <w:t>,</w:t>
       </w:r>
     </w:p>
     <w:p>
       <w:pPr>
         <w:pStyle w:val="SPPrayerLatin"/>
       </w:pPr>
-      <w:r>
-        <w:t>Sanctificetur nomen tuum.</w:t>
+      <w:proofErr w:type="spellStart"/>
+      <w:r>
+        <w:t>Sanctificetur</w:t>
+      </w:r>
+      <w:proofErr w:type="spellEnd"/>
+      <w:r>
+        <w:t xml:space="preserve"> nomen </w:t>
+      </w:r>
+      <w:proofErr w:type="spellStart"/>
+      <w:r>
+        <w:t>tuum</w:t>
+      </w:r>
+      <w:proofErr w:type="spellEnd"/>
+      <w:r>
+        <w:t>.</w:t>
       </w:r>
     </w:p>
     <w:p>
       <w:pPr>
         <w:pStyle w:val="SPPrayerLatin"/>
       </w:pPr>
-      <w:r>
-        <w:t>Adveniat regnum tuum.</w:t>
+      <w:proofErr w:type="spellStart"/>
+      <w:r>
+        <w:t>Adveniat</w:t>
+      </w:r>
+      <w:proofErr w:type="spellEnd"/>
+      <w:r>
+        <w:t xml:space="preserve"> regnum </w:t>
+      </w:r>
+      <w:proofErr w:type="spellStart"/>
+      <w:r>
+        <w:t>tuum</w:t>
+      </w:r>
+      <w:proofErr w:type="spellEnd"/>
+      <w:r>
+        <w:t>.</w:t>
       </w:r>
       <w:r>
         <w:t xml:space="preserve"> </w:t>
@@ -2273,7 +2314,31 @@
         <w:pStyle w:val="SPPrayerLatin"/>
       </w:pPr>
       <w:r>
-        <w:t>Fiat voluntas tua, sicut in caelo et in terra.</w:t>
+        <w:t xml:space="preserve">Fiat </w:t>
+      </w:r>
+      <w:proofErr w:type="spellStart"/>
+      <w:r>
+        <w:t>voluntas</w:t>
+      </w:r>
+      <w:proofErr w:type="spellEnd"/>
+      <w:r>
+        <w:t xml:space="preserve"> </w:t>
+      </w:r>
+      <w:proofErr w:type="spellStart"/>
+      <w:r>
+        <w:t>tua</w:t>
+      </w:r>
+      <w:proofErr w:type="spellEnd"/>
+      <w:r>
+        <w:t xml:space="preserve">, sicut in </w:t>
+      </w:r>
+      <w:proofErr w:type="spellStart"/>
+      <w:r>
+        <w:t>caelo</w:t>
+      </w:r>
+      <w:proofErr w:type="spellEnd"/>
+      <w:r>
+        <w:t xml:space="preserve"> et in terra.</w:t>
       </w:r>
     </w:p>
     <w:p>
@@ -2281,7 +2346,23 @@
         <w:pStyle w:val="SPPrayerLatin"/>
       </w:pPr>
       <w:r>
-        <w:t>Panem nostrum quotidianum do nobis hodie,</w:t>
+        <w:t xml:space="preserve">Panem nostrum </w:t>
+      </w:r>
+      <w:proofErr w:type="spellStart"/>
+      <w:r>
+        <w:t>quotidianum</w:t>
+      </w:r>
+      <w:proofErr w:type="spellEnd"/>
+      <w:r>
+        <w:t xml:space="preserve"> do nobis </w:t>
+      </w:r>
+      <w:proofErr w:type="spellStart"/>
+      <w:r>
+        <w:t>hodie</w:t>
+      </w:r>
+      <w:proofErr w:type="spellEnd"/>
+      <w:r>
+        <w:t>,</w:t>
       </w:r>
     </w:p>
     <w:p>
@@ -2289,7 +2370,23 @@
         <w:pStyle w:val="SPPrayerLatin"/>
       </w:pPr>
       <w:r>
-        <w:t>Et dimitte nobis debita nostra,</w:t>
+        <w:t xml:space="preserve">Et </w:t>
+      </w:r>
+      <w:proofErr w:type="spellStart"/>
+      <w:r>
+        <w:t>dimitte</w:t>
+      </w:r>
+      <w:proofErr w:type="spellEnd"/>
+      <w:r>
+        <w:t xml:space="preserve"> nobis </w:t>
+      </w:r>
+      <w:proofErr w:type="spellStart"/>
+      <w:r>
+        <w:t>debita</w:t>
+      </w:r>
+      <w:proofErr w:type="spellEnd"/>
+      <w:r>
+        <w:t xml:space="preserve"> nostra,</w:t>
       </w:r>
     </w:p>
     <w:p>
@@ -2297,7 +2394,39 @@
         <w:pStyle w:val="SPPrayerLatin"/>
       </w:pPr>
       <w:r>
-        <w:t>Sicut et nos dimittimus debitoribus nostris.</w:t>
+        <w:t xml:space="preserve">Sicut et </w:t>
+      </w:r>
+      <w:proofErr w:type="spellStart"/>
+      <w:r>
+        <w:t>nos</w:t>
+      </w:r>
+      <w:proofErr w:type="spellEnd"/>
+      <w:r>
+        <w:t xml:space="preserve"> </w:t>
+      </w:r>
+      <w:proofErr w:type="spellStart"/>
+      <w:r>
+        <w:t>dimittimus</w:t>
+      </w:r>
+      <w:proofErr w:type="spellEnd"/>
+      <w:r>
+        <w:t xml:space="preserve"> </w:t>
+      </w:r>
+      <w:proofErr w:type="spellStart"/>
+      <w:r>
+        <w:t>debitoribus</w:t>
+      </w:r>
+      <w:proofErr w:type="spellEnd"/>
+      <w:r>
+        <w:t xml:space="preserve"> </w:t>
+      </w:r>
+      <w:proofErr w:type="spellStart"/>
+      <w:r>
+        <w:t>nostris</w:t>
+      </w:r>
+      <w:proofErr w:type="spellEnd"/>
+      <w:r>
+        <w:t>.</w:t>
       </w:r>
     </w:p>
     <w:p>
@@ -2305,16 +2434,50 @@
         <w:pStyle w:val="SPPrayerLatin"/>
       </w:pPr>
       <w:r>
-        <w:t>Et ne nos inducasin tentationem</w:t>
-      </w:r>
+        <w:t xml:space="preserve">Et ne </w:t>
+      </w:r>
+      <w:proofErr w:type="spellStart"/>
+      <w:r>
+        <w:t>nos</w:t>
+      </w:r>
+      <w:proofErr w:type="spellEnd"/>
+      <w:r>
+        <w:t xml:space="preserve"> </w:t>
+      </w:r>
+      <w:proofErr w:type="spellStart"/>
+      <w:r>
+        <w:t>inducasin</w:t>
+      </w:r>
+      <w:proofErr w:type="spellEnd"/>
+      <w:r>
+        <w:t xml:space="preserve"> </w:t>
+      </w:r>
+      <w:proofErr w:type="spellStart"/>
+      <w:r>
+        <w:t>tentationem</w:t>
+      </w:r>
+      <w:proofErr w:type="spellEnd"/>
     </w:p>
     <w:p>
       <w:pPr>
         <w:pStyle w:val="SPPrayerLatin"/>
       </w:pPr>
       <w:r>
-        <w:t>Sed libera nos a malo</w:t>
-      </w:r>
+        <w:t xml:space="preserve">Sed libera </w:t>
+      </w:r>
+      <w:proofErr w:type="spellStart"/>
+      <w:r>
+        <w:t>nos</w:t>
+      </w:r>
+      <w:proofErr w:type="spellEnd"/>
+      <w:r>
+        <w:t xml:space="preserve"> a </w:t>
+      </w:r>
+      <w:proofErr w:type="spellStart"/>
+      <w:r>
+        <w:t>malo</w:t>
+      </w:r>
+      <w:proofErr w:type="spellEnd"/>
     </w:p>
     <w:p>
       <w:pPr>
@@ -2376,13 +2539,8 @@
         <w:pStyle w:val="SPScripture"/>
       </w:pPr>
       <w:r>
-        <w:t xml:space="preserve">Our Father who art in heaven, Hallowed be thy name. Thy kingdom </w:t>
-      </w:r>
-      <w:proofErr w:type="gramStart"/>
-      <w:r>
-        <w:t>come</w:t>
-      </w:r>
-      <w:proofErr w:type="gramEnd"/>
+        <w:t>Our Father who art in heaven, Hallowed be thy name. Thy kingdom come</w:t>
+      </w:r>
       <w:r>
         <w:t>.</w:t>
       </w:r>
@@ -2426,21 +2584,13 @@
         <w:t xml:space="preserve"> </w:t>
       </w:r>
       <w:r>
-        <w:t xml:space="preserve">And lead us not into </w:t>
-      </w:r>
-      <w:proofErr w:type="gramStart"/>
-      <w:r>
-        <w:t xml:space="preserve">temptation, </w:t>
+        <w:t xml:space="preserve">And lead us not into temptation, </w:t>
       </w:r>
       <w:r>
         <w:t>b</w:t>
       </w:r>
       <w:r>
-        <w:t>ut</w:t>
-      </w:r>
-      <w:proofErr w:type="gramEnd"/>
-      <w:r>
-        <w:t xml:space="preserve"> deliver us from evil.</w:t>
+        <w:t>ut deliver us from evil.</w:t>
       </w:r>
       <w:r>
         <w:t>”</w:t>
@@ -2474,21 +2624,13 @@
         <w:t>Your</w:t>
       </w:r>
       <w:r>
-        <w:t xml:space="preserve"> kingdom </w:t>
-      </w:r>
-      <w:proofErr w:type="gramStart"/>
-      <w:r>
-        <w:t>come</w:t>
-      </w:r>
-      <w:proofErr w:type="gramEnd"/>
-      <w:r>
-        <w:t xml:space="preserve">. Give us each day our daily bread; and forgive us our sins, for we ourselves forgive </w:t>
-      </w:r>
-      <w:proofErr w:type="gramStart"/>
+        <w:t xml:space="preserve"> kingdom come. Give us each day our daily bread; and forgive us our sins, for we ourselves forgive </w:t>
+      </w:r>
+      <w:proofErr w:type="spellStart"/>
       <w:r>
         <w:t>every one</w:t>
       </w:r>
-      <w:proofErr w:type="gramEnd"/>
+      <w:proofErr w:type="spellEnd"/>
       <w:r>
         <w:t xml:space="preserve"> who is indebted to us; and lead us not into temptation.</w:t>
       </w:r>
@@ -2572,7 +2714,6 @@
       <w:r>
         <w:t xml:space="preserve">The first word is not </w:t>
       </w:r>
-      <w:proofErr w:type="gramStart"/>
       <w:r>
         <w:rPr>
           <w:i/>
@@ -2580,11 +2721,10 @@
         </w:rPr>
         <w:t>my</w:t>
       </w:r>
-      <w:proofErr w:type="gramEnd"/>
       <w:r>
         <w:t xml:space="preserve">. It is </w:t>
       </w:r>
-      <w:proofErr w:type="gramStart"/>
+      <w:proofErr w:type="spellStart"/>
       <w:r>
         <w:rPr>
           <w:i/>
@@ -2592,7 +2732,7 @@
         </w:rPr>
         <w:t>our</w:t>
       </w:r>
-      <w:proofErr w:type="gramEnd"/>
+      <w:proofErr w:type="spellEnd"/>
       <w:r>
         <w:t>.</w:t>
       </w:r>
@@ -2822,8 +2962,13 @@
         <w:t xml:space="preserve">The </w:t>
       </w:r>
       <w:r>
-        <w:t>Hail mary</w:t>
-      </w:r>
+        <w:t xml:space="preserve">Hail </w:t>
+      </w:r>
+      <w:proofErr w:type="spellStart"/>
+      <w:r>
+        <w:t>mary</w:t>
+      </w:r>
+      <w:proofErr w:type="spellEnd"/>
     </w:p>
     <w:p>
       <w:pPr>
@@ -2838,15 +2983,7 @@
         <w:pStyle w:val="SPBodyText"/>
       </w:pPr>
       <w:r>
-        <w:t xml:space="preserve">The prayer then becomes our petition. We ask Mary, Mother of God, to pray for us — now, </w:t>
-      </w:r>
-      <w:proofErr w:type="gramStart"/>
-      <w:r>
-        <w:t>in the midst of</w:t>
-      </w:r>
-      <w:proofErr w:type="gramEnd"/>
-      <w:r>
-        <w:t xml:space="preserve"> our lives, and at the hour of our death.</w:t>
+        <w:t>The prayer then becomes our petition. We ask Mary, Mother of God, to pray for us — now, in the midst of our lives, and at the hour of our death.</w:t>
       </w:r>
     </w:p>
     <w:p>
@@ -3074,11 +3211,21 @@
         <w:t>a</w:t>
       </w:r>
       <w:r>
-        <w:t xml:space="preserve"> tu in </w:t>
-      </w:r>
+        <w:t xml:space="preserve"> </w:t>
+      </w:r>
+      <w:proofErr w:type="spellStart"/>
+      <w:r>
+        <w:t>tu</w:t>
+      </w:r>
+      <w:proofErr w:type="spellEnd"/>
+      <w:r>
+        <w:t xml:space="preserve"> in </w:t>
+      </w:r>
+      <w:proofErr w:type="spellStart"/>
       <w:r>
         <w:t>muliéribus</w:t>
       </w:r>
+      <w:proofErr w:type="spellEnd"/>
       <w:r>
         <w:t>,</w:t>
       </w:r>
@@ -3090,11 +3237,24 @@
       <w:r>
         <w:t xml:space="preserve">Et </w:t>
       </w:r>
+      <w:proofErr w:type="spellStart"/>
       <w:r>
         <w:t>b</w:t>
       </w:r>
       <w:r>
-        <w:t>enedictus fructus ventris tu</w:t>
+        <w:t>enedictus</w:t>
+      </w:r>
+      <w:proofErr w:type="spellEnd"/>
+      <w:r>
+        <w:t xml:space="preserve"> fructus </w:t>
+      </w:r>
+      <w:proofErr w:type="spellStart"/>
+      <w:r>
+        <w:t>ventris</w:t>
+      </w:r>
+      <w:proofErr w:type="spellEnd"/>
+      <w:r>
+        <w:t xml:space="preserve"> tu</w:t>
       </w:r>
       <w:r>
         <w:t>i,</w:t>
@@ -3125,7 +3285,11 @@
         <w:pStyle w:val="SPPrayerLatin"/>
       </w:pPr>
       <w:r>
-        <w:t>Ora pro nobis pec</w:t>
+        <w:t xml:space="preserve">Ora pro nobis </w:t>
+      </w:r>
+      <w:proofErr w:type="spellStart"/>
+      <w:r>
+        <w:t>pec</w:t>
       </w:r>
       <w:r>
         <w:t>c</w:t>
@@ -3133,6 +3297,7 @@
       <w:r>
         <w:t>atoribus</w:t>
       </w:r>
+      <w:proofErr w:type="spellEnd"/>
       <w:r>
         <w:t>,</w:t>
       </w:r>
@@ -3154,7 +3319,11 @@
         <w:t>h</w:t>
       </w:r>
       <w:r>
-        <w:t>ora mortis nostr</w:t>
+        <w:t xml:space="preserve">ora mortis </w:t>
+      </w:r>
+      <w:proofErr w:type="spellStart"/>
+      <w:r>
+        <w:t>nostr</w:t>
       </w:r>
       <w:r>
         <w:t>a</w:t>
@@ -3162,6 +3331,7 @@
       <w:r>
         <w:t>e</w:t>
       </w:r>
+      <w:proofErr w:type="spellEnd"/>
       <w:r>
         <w:t>.</w:t>
       </w:r>
@@ -3662,15 +3832,7 @@
         <w:pStyle w:val="SPBodyText"/>
       </w:pPr>
       <w:r>
-        <w:t xml:space="preserve">The prayer begins with the words of Scripture and ends with our humble request for intercession. Between the two stands the mystery of Christ: God who comes among us, takes flesh, and </w:t>
-      </w:r>
-      <w:proofErr w:type="gramStart"/>
-      <w:r>
-        <w:t>enters into</w:t>
-      </w:r>
-      <w:proofErr w:type="gramEnd"/>
-      <w:r>
-        <w:t xml:space="preserve"> our human story.</w:t>
+        <w:t>The prayer begins with the words of Scripture and ends with our humble request for intercession. Between the two stands the mystery of Christ: God who comes among us, takes flesh, and enters into our human story.</w:t>
       </w:r>
     </w:p>
     <w:p>
@@ -3813,6 +3975,30 @@
       </w:r>
       <w:r>
         <w:t>Glory Be</w:t>
+      </w:r>
+    </w:p>
+    <w:p>
+      <w:pPr>
+        <w:pStyle w:val="SPBodyText"/>
+      </w:pPr>
+      <w:r>
+        <w:t>The Glory Be is a prayer of praise to the Holy Trinity: Father, Son, and Holy Spirit. In a few simple words, we turn our attention away from ourselves and give glory to God.</w:t>
+      </w:r>
+    </w:p>
+    <w:p>
+      <w:pPr>
+        <w:pStyle w:val="SPBodyText"/>
+      </w:pPr>
+      <w:r>
+        <w:t>We praise the Father, through the Son, in the Holy Spirit. We remember that the God who was from the beginning is the God who is with us now and who will remain forever.</w:t>
+      </w:r>
+    </w:p>
+    <w:p>
+      <w:pPr>
+        <w:pStyle w:val="SPBodyText"/>
+      </w:pPr>
+      <w:r>
+        <w:t>The prayer is short, but its horizon is eternal. It teaches us not only to ask God for what we need, but to pause and give Him glory simply because He is God.</w:t>
       </w:r>
     </w:p>
     <w:p>
@@ -3858,15 +4044,7 @@
         <w:pStyle w:val="SPPrayerEnglish"/>
       </w:pPr>
       <w:r>
-        <w:t xml:space="preserve">Glory be to the </w:t>
-      </w:r>
-      <w:proofErr w:type="gramStart"/>
-      <w:r>
-        <w:t>Father</w:t>
-      </w:r>
-      <w:proofErr w:type="gramEnd"/>
-      <w:r>
-        <w:t>,</w:t>
+        <w:t>Glory be to the Father,</w:t>
       </w:r>
     </w:p>
     <w:p>
@@ -3874,13 +4052,8 @@
         <w:pStyle w:val="SPPrayerEnglish"/>
       </w:pPr>
       <w:r>
-        <w:t xml:space="preserve">And to the </w:t>
-      </w:r>
-      <w:proofErr w:type="gramStart"/>
-      <w:r>
-        <w:t>Son</w:t>
-      </w:r>
-      <w:proofErr w:type="gramEnd"/>
+        <w:t>And to the Son</w:t>
+      </w:r>
     </w:p>
     <w:p>
       <w:pPr>
@@ -3903,15 +4076,7 @@
         <w:pStyle w:val="SPPrayerEnglish"/>
       </w:pPr>
       <w:r>
-        <w:t xml:space="preserve">Is </w:t>
-      </w:r>
-      <w:proofErr w:type="gramStart"/>
-      <w:r>
-        <w:t>now, and</w:t>
-      </w:r>
-      <w:proofErr w:type="gramEnd"/>
-      <w:r>
-        <w:t xml:space="preserve"> forever shall be.</w:t>
+        <w:t>Is now, and ever shall be.</w:t>
       </w:r>
     </w:p>
     <w:p>
@@ -3981,7 +4146,18 @@
         <w:pStyle w:val="SPPrayerLatin"/>
       </w:pPr>
       <w:r>
-        <w:t>Et Spiritui Sancto</w:t>
+        <w:t xml:space="preserve">Et </w:t>
+      </w:r>
+      <w:proofErr w:type="spellStart"/>
+      <w:r>
+        <w:t>Spiritui</w:t>
+      </w:r>
+      <w:proofErr w:type="spellEnd"/>
+      <w:r>
+        <w:t xml:space="preserve"> Sancto</w:t>
+      </w:r>
+      <w:r>
+        <w:t>.</w:t>
       </w:r>
     </w:p>
     <w:p>
@@ -3989,7 +4165,15 @@
         <w:pStyle w:val="SPPrayerLatin"/>
       </w:pPr>
       <w:r>
-        <w:t>Sicut erat in principio,</w:t>
+        <w:t xml:space="preserve">Sicut </w:t>
+      </w:r>
+      <w:proofErr w:type="spellStart"/>
+      <w:r>
+        <w:t>erat</w:t>
+      </w:r>
+      <w:proofErr w:type="spellEnd"/>
+      <w:r>
+        <w:t xml:space="preserve"> in principio,</w:t>
       </w:r>
     </w:p>
     <w:p>
@@ -4006,6 +4190,9 @@
       </w:pPr>
       <w:r>
         <w:t>Et in saecula saeculorum</w:t>
+      </w:r>
+      <w:r>
+        <w:t>.</w:t>
       </w:r>
     </w:p>
     <w:p>

</xml_diff>

<commit_message>
Completed Glory Be prayer
</commit_message>
<xml_diff>
--- a/manuscript/volume-1/sacrae-preces-volume-1.docx
+++ b/manuscript/volume-1/sacrae-preces-volume-1.docx
@@ -431,7 +431,15 @@
         <w:pStyle w:val="SPBodyText"/>
       </w:pPr>
       <w:r>
-        <w:t>We can spend our days surrounded by noise, responsibilities, conversations, messages, and countless things competing for our attention. In the midst of all of this, prayer calls us to stop. To become still. To turn our hearts towards God.</w:t>
+        <w:t xml:space="preserve">We can spend our days surrounded by noise, responsibilities, conversations, messages, and countless things competing for our attention. </w:t>
+      </w:r>
+      <w:proofErr w:type="gramStart"/>
+      <w:r>
+        <w:t>In the midst of</w:t>
+      </w:r>
+      <w:proofErr w:type="gramEnd"/>
+      <w:r>
+        <w:t xml:space="preserve"> all of this, prayer calls us to stop. To become still. To turn our hearts towards God.</w:t>
       </w:r>
     </w:p>
     <w:p>
@@ -515,7 +523,15 @@
         <w:t>"Sacred Prayers."</w:t>
       </w:r>
       <w:r>
-        <w:t xml:space="preserve"> The name reflects something simple: these prayers are part of a rich inheritance that has been handed down through the life of the Church. They belong not merely to one generation, one country, or one language. They have crossed centuries and borders, carried by ordinary people who have sought God in the midst of ordinary lives.</w:t>
+        <w:t xml:space="preserve"> The name reflects something simple: these prayers are part of a rich inheritance that has been handed down through the life of the Church. They belong not merely to one generation, one country, or one language. They have crossed centuries and borders, carried by ordinary people who have sought God </w:t>
+      </w:r>
+      <w:proofErr w:type="gramStart"/>
+      <w:r>
+        <w:t>in the midst of</w:t>
+      </w:r>
+      <w:proofErr w:type="gramEnd"/>
+      <w:r>
+        <w:t xml:space="preserve"> ordinary lives.</w:t>
       </w:r>
     </w:p>
     <w:p>
@@ -590,7 +606,15 @@
         <w:pStyle w:val="SPBodyText"/>
       </w:pPr>
       <w:r>
-        <w:t>For this reason, each prayer is accompanied by material intended for reflection and study. We look at its place in Scripture, consider why Christians have prayed it, explore the meaning of its petitions, and examine some of the Latin words that give the prayer its particular character.</w:t>
+        <w:t xml:space="preserve">For this reason, each prayer is accompanied by material intended for reflection and study. We look at its place in Scripture, consider why Christians have prayed it, explore the meaning of its petitions, and examine some of the Latin words that give the prayer its </w:t>
+      </w:r>
+      <w:proofErr w:type="gramStart"/>
+      <w:r>
+        <w:t>particular character</w:t>
+      </w:r>
+      <w:proofErr w:type="gramEnd"/>
+      <w:r>
+        <w:t>.</w:t>
       </w:r>
     </w:p>
     <w:p>
@@ -738,7 +762,15 @@
       </w:pPr>
       <w:r>
         <w:lastRenderedPageBreak/>
-        <w:t>And someone who learns to pray may eventually discover that prayer is not something we merely do at particular times.</w:t>
+        <w:t xml:space="preserve">And someone who learns to pray may eventually discover that prayer is not something we merely do at </w:t>
+      </w:r>
+      <w:proofErr w:type="gramStart"/>
+      <w:r>
+        <w:t>particular times</w:t>
+      </w:r>
+      <w:proofErr w:type="gramEnd"/>
+      <w:r>
+        <w:t>.</w:t>
       </w:r>
     </w:p>
     <w:p>
@@ -976,7 +1008,15 @@
         <w:pStyle w:val="SPBodyText"/>
       </w:pPr>
       <w:r>
-        <w:t>It is not necessary to read this book from beginning to end. There is no particular order in which the prayers must be approached, and there is no expectation that every page must be studied before the prayers can be prayed.</w:t>
+        <w:t xml:space="preserve">It is not necessary to read this book from beginning to end. There is no </w:t>
+      </w:r>
+      <w:proofErr w:type="gramStart"/>
+      <w:r>
+        <w:t>particular order</w:t>
+      </w:r>
+      <w:proofErr w:type="gramEnd"/>
+      <w:r>
+        <w:t xml:space="preserve"> in which the prayers must be approached, and there is no expectation that every page must be studied before the prayers can be prayed.</w:t>
       </w:r>
     </w:p>
     <w:p>
@@ -1002,7 +1042,15 @@
         <w:pStyle w:val="SPBodyText"/>
       </w:pPr>
       <w:r>
-        <w:t>Perhaps there is a prayer you already know well. Perhaps there is one you have heard many times but never really considered. Perhaps you are looking for a prayer for a particular moment of the day, or simply looking for a few quiet minutes in which to turn your attention towards God.</w:t>
+        <w:t xml:space="preserve">Perhaps there is a prayer you already know well. Perhaps there is one you have heard many times but never really considered. Perhaps you are looking for a prayer for a particular moment of the </w:t>
+      </w:r>
+      <w:proofErr w:type="gramStart"/>
+      <w:r>
+        <w:t>day, or</w:t>
+      </w:r>
+      <w:proofErr w:type="gramEnd"/>
+      <w:r>
+        <w:t xml:space="preserve"> simply looking for a few quiet minutes in which to turn your attention towards God.</w:t>
       </w:r>
     </w:p>
     <w:p>
@@ -1047,7 +1095,15 @@
         <w:pStyle w:val="SPBodyText"/>
       </w:pPr>
       <w:r>
-        <w:t>There is no requirement to learn Latin in order to use this book.</w:t>
+        <w:t xml:space="preserve">There is no requirement to learn Latin </w:t>
+      </w:r>
+      <w:proofErr w:type="gramStart"/>
+      <w:r>
+        <w:t>in order to</w:t>
+      </w:r>
+      <w:proofErr w:type="gramEnd"/>
+      <w:r>
+        <w:t xml:space="preserve"> use this book.</w:t>
       </w:r>
     </w:p>
     <w:p>
@@ -1080,7 +1136,7 @@
       </w:pPr>
       <w:r>
         <w:pict w14:anchorId="249FE732">
-          <v:rect id="_x0000_i1025" style="width:0;height:1.5pt" o:hralign="center" o:hrstd="t" o:hr="t" fillcolor="#a0a0a0" stroked="f"/>
+          <v:rect id="_x0000_i1049" style="width:0;height:1.5pt" o:hralign="center" o:hrstd="t" o:hr="t" fillcolor="#a0a0a0" stroked="f"/>
         </w:pict>
       </w:r>
     </w:p>
@@ -1149,7 +1205,7 @@
       </w:pPr>
       <w:r>
         <w:pict w14:anchorId="25751FDD">
-          <v:rect id="_x0000_i1026" style="width:0;height:1.5pt" o:hralign="center" o:hrstd="t" o:hr="t" fillcolor="#a0a0a0" stroked="f"/>
+          <v:rect id="_x0000_i1050" style="width:0;height:1.5pt" o:hralign="center" o:hrstd="t" o:hr="t" fillcolor="#a0a0a0" stroked="f"/>
         </w:pict>
       </w:r>
     </w:p>
@@ -1215,7 +1271,7 @@
       </w:pPr>
       <w:r>
         <w:pict w14:anchorId="19542BB1">
-          <v:rect id="_x0000_i1027" style="width:0;height:1.5pt" o:hralign="center" o:hrstd="t" o:hr="t" fillcolor="#a0a0a0" stroked="f"/>
+          <v:rect id="_x0000_i1051" style="width:0;height:1.5pt" o:hralign="center" o:hrstd="t" o:hr="t" fillcolor="#a0a0a0" stroked="f"/>
         </w:pict>
       </w:r>
     </w:p>
@@ -1282,7 +1338,7 @@
       </w:pPr>
       <w:r>
         <w:pict w14:anchorId="4D1CE6F0">
-          <v:rect id="_x0000_i1028" style="width:0;height:1.5pt" o:hralign="center" o:hrstd="t" o:hr="t" fillcolor="#a0a0a0" stroked="f"/>
+          <v:rect id="_x0000_i1052" style="width:0;height:1.5pt" o:hralign="center" o:hrstd="t" o:hr="t" fillcolor="#a0a0a0" stroked="f"/>
         </w:pict>
       </w:r>
     </w:p>
@@ -1385,7 +1441,7 @@
       </w:pPr>
       <w:r>
         <w:pict w14:anchorId="68D46385">
-          <v:rect id="_x0000_i1029" style="width:0;height:1.5pt" o:hralign="center" o:hrstd="t" o:hr="t" fillcolor="#a0a0a0" stroked="f"/>
+          <v:rect id="_x0000_i1053" style="width:0;height:1.5pt" o:hralign="center" o:hrstd="t" o:hr="t" fillcolor="#a0a0a0" stroked="f"/>
         </w:pict>
       </w:r>
     </w:p>
@@ -1514,7 +1570,7 @@
       </w:pPr>
       <w:r>
         <w:pict w14:anchorId="36FAD975">
-          <v:rect id="_x0000_i1030" style="width:0;height:1.5pt" o:hralign="center" o:hrstd="t" o:hr="t" fillcolor="#a0a0a0" stroked="f"/>
+          <v:rect id="_x0000_i1054" style="width:0;height:1.5pt" o:hralign="center" o:hrstd="t" o:hr="t" fillcolor="#a0a0a0" stroked="f"/>
         </w:pict>
       </w:r>
     </w:p>
@@ -1531,7 +1587,15 @@
         <w:t>Sacrae Preces</w:t>
       </w:r>
       <w:r>
-        <w:t xml:space="preserve"> is therefore not meant to be something that is simply read once and placed back on a shelf.</w:t>
+        <w:t xml:space="preserve"> is therefore not meant to </w:t>
+      </w:r>
+      <w:proofErr w:type="gramStart"/>
+      <w:r>
+        <w:t>be something that is</w:t>
+      </w:r>
+      <w:proofErr w:type="gramEnd"/>
+      <w:r>
+        <w:t xml:space="preserve"> simply read once and placed back on a shelf.</w:t>
       </w:r>
     </w:p>
     <w:p>
@@ -2539,8 +2603,13 @@
         <w:pStyle w:val="SPScripture"/>
       </w:pPr>
       <w:r>
-        <w:t>Our Father who art in heaven, Hallowed be thy name. Thy kingdom come</w:t>
-      </w:r>
+        <w:t xml:space="preserve">Our Father who art in heaven, Hallowed be thy name. Thy kingdom </w:t>
+      </w:r>
+      <w:proofErr w:type="gramStart"/>
+      <w:r>
+        <w:t>come</w:t>
+      </w:r>
+      <w:proofErr w:type="gramEnd"/>
       <w:r>
         <w:t>.</w:t>
       </w:r>
@@ -2584,13 +2653,21 @@
         <w:t xml:space="preserve"> </w:t>
       </w:r>
       <w:r>
-        <w:t xml:space="preserve">And lead us not into temptation, </w:t>
+        <w:t xml:space="preserve">And lead us not into </w:t>
+      </w:r>
+      <w:proofErr w:type="gramStart"/>
+      <w:r>
+        <w:t xml:space="preserve">temptation, </w:t>
       </w:r>
       <w:r>
         <w:t>b</w:t>
       </w:r>
       <w:r>
-        <w:t>ut deliver us from evil.</w:t>
+        <w:t>ut</w:t>
+      </w:r>
+      <w:proofErr w:type="gramEnd"/>
+      <w:r>
+        <w:t xml:space="preserve"> deliver us from evil.</w:t>
       </w:r>
       <w:r>
         <w:t>”</w:t>
@@ -2624,13 +2701,23 @@
         <w:t>Your</w:t>
       </w:r>
       <w:r>
-        <w:t xml:space="preserve"> kingdom come. Give us each day our daily bread; and forgive us our sins, for we ourselves forgive </w:t>
+        <w:t xml:space="preserve"> kingdom </w:t>
+      </w:r>
+      <w:proofErr w:type="gramStart"/>
+      <w:r>
+        <w:t>come</w:t>
+      </w:r>
+      <w:proofErr w:type="gramEnd"/>
+      <w:r>
+        <w:t xml:space="preserve">. Give us each day our daily bread; and forgive us our sins, for we ourselves forgive </w:t>
       </w:r>
       <w:proofErr w:type="spellStart"/>
+      <w:proofErr w:type="gramStart"/>
       <w:r>
         <w:t>every one</w:t>
       </w:r>
       <w:proofErr w:type="spellEnd"/>
+      <w:proofErr w:type="gramEnd"/>
       <w:r>
         <w:t xml:space="preserve"> who is indebted to us; and lead us not into temptation.</w:t>
       </w:r>
@@ -2714,6 +2801,7 @@
       <w:r>
         <w:t xml:space="preserve">The first word is not </w:t>
       </w:r>
+      <w:proofErr w:type="gramStart"/>
       <w:r>
         <w:rPr>
           <w:i/>
@@ -2721,10 +2809,12 @@
         </w:rPr>
         <w:t>my</w:t>
       </w:r>
+      <w:proofErr w:type="gramEnd"/>
       <w:r>
         <w:t xml:space="preserve">. It is </w:t>
       </w:r>
       <w:proofErr w:type="spellStart"/>
+      <w:proofErr w:type="gramStart"/>
       <w:r>
         <w:rPr>
           <w:i/>
@@ -2733,6 +2823,7 @@
         <w:t>our</w:t>
       </w:r>
       <w:proofErr w:type="spellEnd"/>
+      <w:proofErr w:type="gramEnd"/>
       <w:r>
         <w:t>.</w:t>
       </w:r>
@@ -2983,7 +3074,15 @@
         <w:pStyle w:val="SPBodyText"/>
       </w:pPr>
       <w:r>
-        <w:t>The prayer then becomes our petition. We ask Mary, Mother of God, to pray for us — now, in the midst of our lives, and at the hour of our death.</w:t>
+        <w:t xml:space="preserve">The prayer then becomes our petition. We ask Mary, Mother of God, to pray for us — now, </w:t>
+      </w:r>
+      <w:proofErr w:type="gramStart"/>
+      <w:r>
+        <w:t>in the midst of</w:t>
+      </w:r>
+      <w:proofErr w:type="gramEnd"/>
+      <w:r>
+        <w:t xml:space="preserve"> our lives, and at the hour of our death.</w:t>
       </w:r>
     </w:p>
     <w:p>
@@ -3832,7 +3931,15 @@
         <w:pStyle w:val="SPBodyText"/>
       </w:pPr>
       <w:r>
-        <w:t>The prayer begins with the words of Scripture and ends with our humble request for intercession. Between the two stands the mystery of Christ: God who comes among us, takes flesh, and enters into our human story.</w:t>
+        <w:t xml:space="preserve">The prayer begins with the words of Scripture and ends with our humble request for intercession. Between the two stands the mystery of Christ: God who comes among us, takes flesh, and </w:t>
+      </w:r>
+      <w:proofErr w:type="gramStart"/>
+      <w:r>
+        <w:t>enters into</w:t>
+      </w:r>
+      <w:proofErr w:type="gramEnd"/>
+      <w:r>
+        <w:t xml:space="preserve"> our human story.</w:t>
       </w:r>
     </w:p>
     <w:p>
@@ -4044,7 +4151,15 @@
         <w:pStyle w:val="SPPrayerEnglish"/>
       </w:pPr>
       <w:r>
-        <w:t>Glory be to the Father,</w:t>
+        <w:t xml:space="preserve">Glory be to the </w:t>
+      </w:r>
+      <w:proofErr w:type="gramStart"/>
+      <w:r>
+        <w:t>Father</w:t>
+      </w:r>
+      <w:proofErr w:type="gramEnd"/>
+      <w:r>
+        <w:t>,</w:t>
       </w:r>
     </w:p>
     <w:p>
@@ -4052,8 +4167,13 @@
         <w:pStyle w:val="SPPrayerEnglish"/>
       </w:pPr>
       <w:r>
-        <w:t>And to the Son</w:t>
-      </w:r>
+        <w:t xml:space="preserve">And to the </w:t>
+      </w:r>
+      <w:proofErr w:type="gramStart"/>
+      <w:r>
+        <w:t>Son</w:t>
+      </w:r>
+      <w:proofErr w:type="gramEnd"/>
     </w:p>
     <w:p>
       <w:pPr>
@@ -4076,7 +4196,15 @@
         <w:pStyle w:val="SPPrayerEnglish"/>
       </w:pPr>
       <w:r>
-        <w:t>Is now, and ever shall be.</w:t>
+        <w:t xml:space="preserve">Is </w:t>
+      </w:r>
+      <w:proofErr w:type="gramStart"/>
+      <w:r>
+        <w:t>now, and</w:t>
+      </w:r>
+      <w:proofErr w:type="gramEnd"/>
+      <w:r>
+        <w:t xml:space="preserve"> ever shall be.</w:t>
       </w:r>
     </w:p>
     <w:p>
@@ -4247,6 +4375,30 @@
     </w:p>
     <w:p>
       <w:pPr>
+        <w:pStyle w:val="SPScripture"/>
+      </w:pPr>
+      <w:r>
+        <w:t>“</w:t>
+      </w:r>
+      <w:proofErr w:type="gramStart"/>
+      <w:r>
+        <w:t>to</w:t>
+      </w:r>
+      <w:proofErr w:type="gramEnd"/>
+      <w:r>
+        <w:t xml:space="preserve"> him be glory in the Church and in Christ Jesus to all generations, </w:t>
+      </w:r>
+      <w:proofErr w:type="gramStart"/>
+      <w:r>
+        <w:t>for ever and ever</w:t>
+      </w:r>
+      <w:proofErr w:type="gramEnd"/>
+      <w:r>
+        <w:t>. Amen.”</w:t>
+      </w:r>
+    </w:p>
+    <w:p>
+      <w:pPr>
         <w:pStyle w:val="SPScriptureReference"/>
       </w:pPr>
       <w:r>
@@ -4261,6 +4413,14 @@
     </w:p>
     <w:p>
       <w:pPr>
+        <w:pStyle w:val="SPScripture"/>
+      </w:pPr>
+      <w:r>
+        <w:t>“For from him and through him and to him are all things. To him be glory for ever. Amen.”</w:t>
+      </w:r>
+    </w:p>
+    <w:p>
+      <w:pPr>
         <w:pStyle w:val="SPScriptureReference"/>
       </w:pPr>
       <w:r>
@@ -4275,6 +4435,30 @@
     </w:p>
     <w:p>
       <w:pPr>
+        <w:pStyle w:val="SPScripture"/>
+      </w:pPr>
+      <w:r>
+        <w:t xml:space="preserve">“To the King of ages, immortal, invisible, the only God, be </w:t>
+      </w:r>
+      <w:proofErr w:type="spellStart"/>
+      <w:r>
+        <w:t>honor</w:t>
+      </w:r>
+      <w:proofErr w:type="spellEnd"/>
+      <w:r>
+        <w:t xml:space="preserve"> and glory </w:t>
+      </w:r>
+      <w:proofErr w:type="gramStart"/>
+      <w:r>
+        <w:t>for ever and ever</w:t>
+      </w:r>
+      <w:proofErr w:type="gramEnd"/>
+      <w:r>
+        <w:t>. Amen.”</w:t>
+      </w:r>
+    </w:p>
+    <w:p>
+      <w:pPr>
         <w:pStyle w:val="SPScriptureReference"/>
       </w:pPr>
       <w:r>
@@ -4289,6 +4473,35 @@
       <w:r>
         <w:t xml:space="preserve"> </w:t>
       </w:r>
+    </w:p>
+    <w:p>
+      <w:pPr>
+        <w:pStyle w:val="SPScripture"/>
+      </w:pPr>
+      <w:r>
+        <w:t>“</w:t>
+      </w:r>
+      <w:proofErr w:type="gramStart"/>
+      <w:r>
+        <w:t>and</w:t>
+      </w:r>
+      <w:proofErr w:type="gramEnd"/>
+      <w:r>
+        <w:t xml:space="preserve"> from Jesus Christ the faithful witness, the first-born of the dead, and the ruler of kings on earth. To him who loves us and has freed us from our sins by his blood and made us a kingdom, priests to God and Father, to him be glory and dominion </w:t>
+      </w:r>
+      <w:proofErr w:type="gramStart"/>
+      <w:r>
+        <w:t>for ever and ever</w:t>
+      </w:r>
+      <w:proofErr w:type="gramEnd"/>
+      <w:r>
+        <w:t>. Amen.”</w:t>
+      </w:r>
+    </w:p>
+    <w:p>
+      <w:pPr>
+        <w:pStyle w:val="SPScripture"/>
+      </w:pPr>
     </w:p>
     <w:p>
       <w:pPr>
@@ -4315,10 +4528,612 @@
     <w:p>
       <w:pPr>
         <w:pStyle w:val="SPBodyText"/>
+        <w:rPr>
+          <w:b/>
+          <w:bCs/>
+        </w:rPr>
       </w:pPr>
       <w:r>
         <w:t xml:space="preserve">  </w:t>
       </w:r>
+      <w:r>
+        <w:rPr>
+          <w:b/>
+          <w:bCs/>
+        </w:rPr>
+        <w:t>The Glory We Give</w:t>
+      </w:r>
+    </w:p>
+    <w:p>
+      <w:pPr>
+        <w:pStyle w:val="SPBodyText"/>
+      </w:pPr>
+      <w:r>
+        <w:t>The Glory Be is a short prayer, but it carries within it the heart of our faith.</w:t>
+      </w:r>
+    </w:p>
+    <w:p>
+      <w:pPr>
+        <w:pStyle w:val="SPBodyText"/>
+      </w:pPr>
+      <w:r>
+        <w:t>We begin with the Father, and then we name the Son and the Holy Spirit. We are not speaking of three gods, but of the one God who has revealed Himself to us as Father, Son, and Holy Spirit.</w:t>
+      </w:r>
+    </w:p>
+    <w:p>
+      <w:pPr>
+        <w:pStyle w:val="SPBodyText"/>
+      </w:pPr>
+      <w:r>
+        <w:t xml:space="preserve">When we say </w:t>
+      </w:r>
+      <w:r>
+        <w:rPr>
+          <w:b/>
+          <w:bCs/>
+        </w:rPr>
+        <w:t xml:space="preserve">Glory be to the </w:t>
+      </w:r>
+      <w:proofErr w:type="gramStart"/>
+      <w:r>
+        <w:rPr>
+          <w:b/>
+          <w:bCs/>
+        </w:rPr>
+        <w:t>Father</w:t>
+      </w:r>
+      <w:proofErr w:type="gramEnd"/>
+      <w:r>
+        <w:t>, we turn our hearts towards the One from whom all things come.</w:t>
+      </w:r>
+    </w:p>
+    <w:p>
+      <w:pPr>
+        <w:pStyle w:val="SPBodyText"/>
+      </w:pPr>
+      <w:r>
+        <w:t xml:space="preserve">When we say </w:t>
+      </w:r>
+      <w:r>
+        <w:rPr>
+          <w:b/>
+          <w:bCs/>
+        </w:rPr>
+        <w:t>and to the Son</w:t>
+      </w:r>
+      <w:r>
+        <w:t>, we remember Jesus Christ, through whom God has come among us and through whom we have been brought into the life of God.</w:t>
+      </w:r>
+    </w:p>
+    <w:p>
+      <w:pPr>
+        <w:pStyle w:val="SPBodyText"/>
+      </w:pPr>
+      <w:r>
+        <w:t xml:space="preserve">And when we say </w:t>
+      </w:r>
+      <w:r>
+        <w:rPr>
+          <w:b/>
+          <w:bCs/>
+        </w:rPr>
+        <w:t>and to the Holy Spirit</w:t>
+      </w:r>
+      <w:r>
+        <w:t>, we remember the Spirit who gives life, sanctifies us, and remains with the Church.</w:t>
+      </w:r>
+    </w:p>
+    <w:p>
+      <w:pPr>
+        <w:pStyle w:val="SPBodyText"/>
+      </w:pPr>
+      <w:r>
+        <w:t>The prayer then carries us beyond the present moment:</w:t>
+      </w:r>
+    </w:p>
+    <w:p>
+      <w:pPr>
+        <w:pStyle w:val="SPBodyText"/>
+      </w:pPr>
+      <w:r>
+        <w:rPr>
+          <w:b/>
+          <w:bCs/>
+        </w:rPr>
+        <w:t>As it was in the beginning,</w:t>
+      </w:r>
+      <w:r>
+        <w:rPr>
+          <w:b/>
+          <w:bCs/>
+        </w:rPr>
+        <w:br/>
+        <w:t>is now, and ever shall be.</w:t>
+      </w:r>
+    </w:p>
+    <w:p>
+      <w:pPr>
+        <w:pStyle w:val="SPBodyText"/>
+      </w:pPr>
+      <w:r>
+        <w:t>God does not change with the passing of the years. Kingdoms rise and fall. Our circumstances change. Our own lives move from beginning to end. Yet God remains.</w:t>
+      </w:r>
+    </w:p>
+    <w:p>
+      <w:pPr>
+        <w:pStyle w:val="SPBodyText"/>
+      </w:pPr>
+      <w:r>
+        <w:t xml:space="preserve">The Glory </w:t>
+      </w:r>
+      <w:proofErr w:type="gramStart"/>
+      <w:r>
+        <w:t>Be</w:t>
+      </w:r>
+      <w:proofErr w:type="gramEnd"/>
+      <w:r>
+        <w:t xml:space="preserve"> teaches us to lift our eyes beyond the noise of the moment and remember what is eternal.</w:t>
+      </w:r>
+    </w:p>
+    <w:p>
+      <w:pPr>
+        <w:pStyle w:val="SPBodyText"/>
+        <w:rPr>
+          <w:b/>
+          <w:bCs/>
+        </w:rPr>
+      </w:pPr>
+      <w:r>
+        <w:rPr>
+          <w:b/>
+          <w:bCs/>
+        </w:rPr>
+        <w:t>Glory Is Not Ours to Keep</w:t>
+      </w:r>
+    </w:p>
+    <w:p>
+      <w:pPr>
+        <w:pStyle w:val="SPBodyText"/>
+      </w:pPr>
+      <w:r>
+        <w:lastRenderedPageBreak/>
+        <w:t>We live in a world that constantly asks us to seek recognition.</w:t>
+      </w:r>
+    </w:p>
+    <w:p>
+      <w:pPr>
+        <w:pStyle w:val="SPBodyText"/>
+      </w:pPr>
+      <w:r>
+        <w:t>We are encouraged to be noticed, to succeed, to be admired, to make our mark. Even our good works can quietly become things we want others to see.</w:t>
+      </w:r>
+    </w:p>
+    <w:p>
+      <w:pPr>
+        <w:pStyle w:val="SPBodyText"/>
+      </w:pPr>
+      <w:r>
+        <w:t>The Glory Be gently turns us in another direction.</w:t>
+      </w:r>
+    </w:p>
+    <w:p>
+      <w:pPr>
+        <w:pStyle w:val="SPBodyText"/>
+      </w:pPr>
+      <w:r>
+        <w:rPr>
+          <w:b/>
+          <w:bCs/>
+        </w:rPr>
+        <w:t>The glory belongs to God.</w:t>
+      </w:r>
+    </w:p>
+    <w:p>
+      <w:pPr>
+        <w:pStyle w:val="SPBodyText"/>
+      </w:pPr>
+      <w:r>
+        <w:t xml:space="preserve">Whatever good we possess is received. Whatever strength we have is given. Whatever love we </w:t>
+      </w:r>
+      <w:proofErr w:type="gramStart"/>
+      <w:r>
+        <w:t>are able to</w:t>
+      </w:r>
+      <w:proofErr w:type="gramEnd"/>
+      <w:r>
+        <w:t xml:space="preserve"> offer has its source in Him.</w:t>
+      </w:r>
+    </w:p>
+    <w:p>
+      <w:pPr>
+        <w:pStyle w:val="SPBodyText"/>
+      </w:pPr>
+      <w:r>
+        <w:t>As Scripture reminds us:</w:t>
+      </w:r>
+    </w:p>
+    <w:p>
+      <w:pPr>
+        <w:pStyle w:val="SPBodyText"/>
+      </w:pPr>
+      <w:r>
+        <w:rPr>
+          <w:i/>
+          <w:iCs/>
+        </w:rPr>
+        <w:t>“For from him and through him and to him are all things.”</w:t>
+      </w:r>
+    </w:p>
+    <w:p>
+      <w:pPr>
+        <w:pStyle w:val="SPBodyText"/>
+      </w:pPr>
+      <w:r>
+        <w:t>So,</w:t>
+      </w:r>
+      <w:r>
+        <w:t xml:space="preserve"> we do not pray the Glory Be merely with our lips. We learn to return our lives to God.</w:t>
+      </w:r>
+    </w:p>
+    <w:p>
+      <w:pPr>
+        <w:pStyle w:val="SPBodyText"/>
+      </w:pPr>
+    </w:p>
+    <w:p>
+      <w:pPr>
+        <w:pStyle w:val="SPBodyText"/>
+      </w:pPr>
+      <w:r>
+        <w:t>Our work.</w:t>
+      </w:r>
+    </w:p>
+    <w:p>
+      <w:pPr>
+        <w:pStyle w:val="SPBodyText"/>
+      </w:pPr>
+      <w:r>
+        <w:t>Our families.</w:t>
+      </w:r>
+    </w:p>
+    <w:p>
+      <w:pPr>
+        <w:pStyle w:val="SPBodyText"/>
+      </w:pPr>
+      <w:r>
+        <w:t>Our joys.</w:t>
+      </w:r>
+    </w:p>
+    <w:p>
+      <w:pPr>
+        <w:pStyle w:val="SPBodyText"/>
+      </w:pPr>
+      <w:r>
+        <w:t>Our failures.</w:t>
+      </w:r>
+    </w:p>
+    <w:p>
+      <w:pPr>
+        <w:pStyle w:val="SPBodyText"/>
+      </w:pPr>
+      <w:r>
+        <w:t>Our hopes.</w:t>
+      </w:r>
+    </w:p>
+    <w:p>
+      <w:pPr>
+        <w:pStyle w:val="SPBodyText"/>
+      </w:pPr>
+    </w:p>
+    <w:p>
+      <w:pPr>
+        <w:pStyle w:val="SPBodyText"/>
+      </w:pPr>
+      <w:r>
+        <w:t>Even the things we cannot understand.</w:t>
+      </w:r>
+    </w:p>
+    <w:p>
+      <w:pPr>
+        <w:pStyle w:val="SPBodyText"/>
+      </w:pPr>
+      <w:r>
+        <w:t>All of them can become an offering when we remember where they came from and to whom they ultimately belong.</w:t>
+      </w:r>
+    </w:p>
+    <w:p>
+      <w:pPr>
+        <w:pStyle w:val="SPBodyText"/>
+        <w:rPr>
+          <w:b/>
+          <w:bCs/>
+        </w:rPr>
+      </w:pPr>
+      <w:r>
+        <w:rPr>
+          <w:b/>
+          <w:bCs/>
+        </w:rPr>
+        <w:t>Forever</w:t>
+      </w:r>
+    </w:p>
+    <w:p>
+      <w:pPr>
+        <w:pStyle w:val="SPBodyText"/>
+      </w:pPr>
+    </w:p>
+    <w:p>
+      <w:pPr>
+        <w:pStyle w:val="SPBodyText"/>
+      </w:pPr>
+      <w:r>
+        <w:lastRenderedPageBreak/>
+        <w:t>The final words are easy to say and easy to pass over:</w:t>
+      </w:r>
+    </w:p>
+    <w:p>
+      <w:pPr>
+        <w:pStyle w:val="SPBodyText"/>
+      </w:pPr>
+      <w:r>
+        <w:rPr>
+          <w:b/>
+          <w:bCs/>
+        </w:rPr>
+        <w:t>World without end. Amen.</w:t>
+      </w:r>
+    </w:p>
+    <w:p>
+      <w:pPr>
+        <w:pStyle w:val="SPBodyText"/>
+      </w:pPr>
+      <w:r>
+        <w:t>But they ask us to remember something immense.</w:t>
+      </w:r>
+    </w:p>
+    <w:p>
+      <w:pPr>
+        <w:pStyle w:val="SPBodyText"/>
+      </w:pPr>
+      <w:r>
+        <w:t>Our lives are temporary. Our worries are temporary. Even the things that seem overwhelming today will one day pass.</w:t>
+      </w:r>
+    </w:p>
+    <w:p>
+      <w:pPr>
+        <w:pStyle w:val="SPBodyText"/>
+      </w:pPr>
+      <w:r>
+        <w:t>God does not pass away.</w:t>
+      </w:r>
+    </w:p>
+    <w:p>
+      <w:pPr>
+        <w:pStyle w:val="SPBodyText"/>
+      </w:pPr>
+      <w:r>
+        <w:t>The Father, Son, and Holy Spirit were before us, are with us now, and will remain when our earthly lives are finished.</w:t>
+      </w:r>
+    </w:p>
+    <w:p>
+      <w:pPr>
+        <w:pStyle w:val="SPBodyText"/>
+      </w:pPr>
+      <w:r>
+        <w:t>So,</w:t>
+      </w:r>
+      <w:r>
+        <w:t xml:space="preserve"> when we pray the Glory Be, we are joining a prayer that is larger than ourselves.</w:t>
+      </w:r>
+    </w:p>
+    <w:p>
+      <w:pPr>
+        <w:pStyle w:val="SPBodyText"/>
+      </w:pPr>
+      <w:r>
+        <w:t>Christians have prayed these words across generations. The same words have been spoken by people in joy and in suffering, by the strong and the weak, by those who understood their faith deeply and by those who could only manage a few words.</w:t>
+      </w:r>
+    </w:p>
+    <w:p>
+      <w:pPr>
+        <w:pStyle w:val="SPBodyText"/>
+      </w:pPr>
+      <w:r>
+        <w:t>And now they are placed in our hands.</w:t>
+      </w:r>
+    </w:p>
+    <w:p>
+      <w:pPr>
+        <w:pStyle w:val="SPBodyText"/>
+      </w:pPr>
+      <w:r>
+        <w:t>So,</w:t>
+      </w:r>
+      <w:r>
+        <w:t xml:space="preserve"> pray them slowly.</w:t>
+      </w:r>
+    </w:p>
+    <w:p>
+      <w:pPr>
+        <w:pStyle w:val="SPBodyText"/>
+      </w:pPr>
+      <w:r>
+        <w:rPr>
+          <w:b/>
+          <w:bCs/>
+        </w:rPr>
+        <w:t xml:space="preserve">Glory be to the </w:t>
+      </w:r>
+      <w:proofErr w:type="gramStart"/>
+      <w:r>
+        <w:rPr>
+          <w:b/>
+          <w:bCs/>
+        </w:rPr>
+        <w:t>Father</w:t>
+      </w:r>
+      <w:proofErr w:type="gramEnd"/>
+      <w:r>
+        <w:rPr>
+          <w:b/>
+          <w:bCs/>
+        </w:rPr>
+        <w:t>.</w:t>
+      </w:r>
+    </w:p>
+    <w:p>
+      <w:pPr>
+        <w:pStyle w:val="SPBodyText"/>
+      </w:pPr>
+      <w:r>
+        <w:t>Give thanks for the One who created you.</w:t>
+      </w:r>
+    </w:p>
+    <w:p>
+      <w:pPr>
+        <w:pStyle w:val="SPBodyText"/>
+        <w:rPr>
+          <w:b/>
+          <w:bCs/>
+        </w:rPr>
+      </w:pPr>
+    </w:p>
+    <w:p>
+      <w:pPr>
+        <w:pStyle w:val="SPBodyText"/>
+      </w:pPr>
+      <w:r>
+        <w:rPr>
+          <w:b/>
+          <w:bCs/>
+        </w:rPr>
+        <w:t xml:space="preserve">And to the </w:t>
+      </w:r>
+      <w:proofErr w:type="gramStart"/>
+      <w:r>
+        <w:rPr>
+          <w:b/>
+          <w:bCs/>
+        </w:rPr>
+        <w:t>Son</w:t>
+      </w:r>
+      <w:proofErr w:type="gramEnd"/>
+      <w:r>
+        <w:rPr>
+          <w:b/>
+          <w:bCs/>
+        </w:rPr>
+        <w:t>.</w:t>
+      </w:r>
+    </w:p>
+    <w:p>
+      <w:pPr>
+        <w:pStyle w:val="SPBodyText"/>
+      </w:pPr>
+      <w:r>
+        <w:t>Give thanks for the One who came to save you.</w:t>
+      </w:r>
+    </w:p>
+    <w:p>
+      <w:pPr>
+        <w:pStyle w:val="SPBodyText"/>
+        <w:rPr>
+          <w:b/>
+          <w:bCs/>
+        </w:rPr>
+      </w:pPr>
+    </w:p>
+    <w:p>
+      <w:pPr>
+        <w:pStyle w:val="SPBodyText"/>
+      </w:pPr>
+      <w:r>
+        <w:rPr>
+          <w:b/>
+          <w:bCs/>
+        </w:rPr>
+        <w:t>And to the Holy Spirit.</w:t>
+      </w:r>
+    </w:p>
+    <w:p>
+      <w:pPr>
+        <w:pStyle w:val="SPBodyText"/>
+      </w:pPr>
+      <w:r>
+        <w:t>Give thanks for the One who remains with you.</w:t>
+      </w:r>
+    </w:p>
+    <w:p>
+      <w:pPr>
+        <w:pStyle w:val="SPBodyText"/>
+      </w:pPr>
+      <w:r>
+        <w:rPr>
+          <w:b/>
+          <w:bCs/>
+        </w:rPr>
+        <w:lastRenderedPageBreak/>
+        <w:t>As it was in the beginning,</w:t>
+      </w:r>
+      <w:r>
+        <w:rPr>
+          <w:b/>
+          <w:bCs/>
+        </w:rPr>
+        <w:br/>
+        <w:t>is now, and ever shall be,</w:t>
+      </w:r>
+      <w:r>
+        <w:rPr>
+          <w:b/>
+          <w:bCs/>
+        </w:rPr>
+        <w:br/>
+        <w:t>world without end.</w:t>
+      </w:r>
+    </w:p>
+    <w:p>
+      <w:pPr>
+        <w:pStyle w:val="SPBodyText"/>
+      </w:pPr>
+    </w:p>
+    <w:p>
+      <w:pPr>
+        <w:pStyle w:val="SPBodyText"/>
+      </w:pPr>
+      <w:r>
+        <w:t>And then simply say:</w:t>
+      </w:r>
+    </w:p>
+    <w:p>
+      <w:pPr>
+        <w:pStyle w:val="SPBodyText"/>
+      </w:pPr>
+      <w:r>
+        <w:rPr>
+          <w:b/>
+          <w:bCs/>
+        </w:rPr>
+        <w:t>Amen.</w:t>
+      </w:r>
+    </w:p>
+    <w:p>
+      <w:pPr>
+        <w:pStyle w:val="SPBodyText"/>
+      </w:pPr>
+    </w:p>
+    <w:p>
+      <w:pPr>
+        <w:pStyle w:val="SPBodyText"/>
+      </w:pPr>
+      <w:r>
+        <w:t>Let your heart rest there.</w:t>
+      </w:r>
+    </w:p>
+    <w:p>
+      <w:pPr>
+        <w:pStyle w:val="SPBodyText"/>
+      </w:pPr>
     </w:p>
     <w:p>
       <w:pPr>
@@ -5343,7 +6158,7 @@
     <w:basedOn w:val="Normal"/>
     <w:autoRedefine/>
     <w:qFormat/>
-    <w:rsid w:val="00A8637F"/>
+    <w:rsid w:val="008D3091"/>
     <w:pPr>
       <w:keepLines/>
       <w:spacing w:after="80" w:line="288" w:lineRule="auto"/>

</xml_diff>

<commit_message>
Three prayer reflection break
</commit_message>
<xml_diff>
--- a/manuscript/volume-1/sacrae-preces-volume-1.docx
+++ b/manuscript/volume-1/sacrae-preces-volume-1.docx
@@ -11,7 +11,7 @@
           <w:rStyle w:val="SPPrayerResponseCS"/>
         </w:rPr>
         <w:sectPr>
-          <w:footerReference w:type="first" r:id="rId7"/>
+          <w:footerReference w:type="first" r:id="rId8"/>
           <w:pgSz w:w="7920" w:h="12240" w:code="6"/>
           <w:pgMar w:top="1080" w:right="864" w:bottom="1080" w:left="1152" w:header="576" w:footer="576" w:gutter="0"/>
           <w:pgNumType w:start="1"/>
@@ -5125,6 +5125,14 @@
     <w:p>
       <w:pPr>
         <w:pStyle w:val="SPBodyText"/>
+        <w:sectPr>
+          <w:type w:val="evenPage"/>
+          <w:pgSz w:w="7920" w:h="12240" w:code="6"/>
+          <w:pgMar w:top="1080" w:right="864" w:bottom="1080" w:left="1152" w:header="576" w:footer="576" w:gutter="0"/>
+          <w:cols w:space="720"/>
+          <w:titlePg/>
+          <w:docGrid w:linePitch="360"/>
+        </w:sectPr>
       </w:pPr>
       <w:r>
         <w:t>Let your heart rest there.</w:t>
@@ -5132,23 +5140,584 @@
     </w:p>
     <w:p>
       <w:pPr>
-        <w:pStyle w:val="SPBodyText"/>
-      </w:pPr>
-    </w:p>
-    <w:p>
-      <w:pPr>
-        <w:pStyle w:val="SPBodyText"/>
-      </w:pPr>
-      <w:r>
+        <w:pStyle w:val="SPSectionTitle"/>
+      </w:pPr>
+      <w:r>
+        <w:lastRenderedPageBreak/>
+        <w:t>REFLECTION</w:t>
+      </w:r>
+    </w:p>
+    <w:p>
+      <w:pPr>
+        <w:pStyle w:val="SPBodyText"/>
         <w:rPr>
           <w:b/>
           <w:bCs/>
         </w:rPr>
+      </w:pPr>
+      <w:r>
+        <w:rPr>
+          <w:b/>
+          <w:bCs/>
+        </w:rPr>
+        <w:t>Three Prayers, One Faith</w:t>
+      </w:r>
+    </w:p>
+    <w:p>
+      <w:pPr>
+        <w:pStyle w:val="SPBodyText"/>
+      </w:pPr>
+      <w:r>
+        <w:t>We have prayed three prayers that have been spoken by Christians for generations.</w:t>
+      </w:r>
+    </w:p>
+    <w:p>
+      <w:pPr>
+        <w:pStyle w:val="SPBodyText"/>
+      </w:pPr>
+    </w:p>
+    <w:p>
+      <w:pPr>
+        <w:pStyle w:val="SPBodyText"/>
+      </w:pPr>
+      <w:r>
+        <w:t xml:space="preserve">The </w:t>
+      </w:r>
+      <w:r>
+        <w:rPr>
+          <w:b/>
+          <w:bCs/>
+        </w:rPr>
+        <w:t>Our Father</w:t>
+      </w:r>
+      <w:r>
+        <w:t xml:space="preserve"> taught us to approach God as children who belong to Him.</w:t>
+      </w:r>
+    </w:p>
+    <w:p>
+      <w:pPr>
+        <w:pStyle w:val="SPBodyText"/>
+      </w:pPr>
+    </w:p>
+    <w:p>
+      <w:pPr>
+        <w:pStyle w:val="SPBodyText"/>
+      </w:pPr>
+      <w:r>
+        <w:t xml:space="preserve">The </w:t>
+      </w:r>
+      <w:r>
+        <w:rPr>
+          <w:b/>
+          <w:bCs/>
+        </w:rPr>
+        <w:t>Hail Mary</w:t>
+      </w:r>
+      <w:r>
+        <w:t xml:space="preserve"> taught us to receive the words of Scripture, to remember the mystery of Christ's Incarnation, and to ask for the prayers of His Mother.</w:t>
+      </w:r>
+    </w:p>
+    <w:p>
+      <w:pPr>
+        <w:pStyle w:val="SPBodyText"/>
+      </w:pPr>
+    </w:p>
+    <w:p>
+      <w:pPr>
+        <w:pStyle w:val="SPBodyText"/>
+      </w:pPr>
+      <w:r>
+        <w:t xml:space="preserve">The </w:t>
+      </w:r>
+      <w:r>
+        <w:rPr>
+          <w:b/>
+          <w:bCs/>
+        </w:rPr>
+        <w:t xml:space="preserve">Glory </w:t>
+      </w:r>
+      <w:proofErr w:type="gramStart"/>
+      <w:r>
+        <w:rPr>
+          <w:b/>
+          <w:bCs/>
+        </w:rPr>
+        <w:t>Be</w:t>
+      </w:r>
+      <w:proofErr w:type="gramEnd"/>
+      <w:r>
+        <w:t xml:space="preserve"> taught us to lift our hearts beyond ourselves and give praise to the Father, the Son, and the Holy Spirit.</w:t>
+      </w:r>
+    </w:p>
+    <w:p>
+      <w:pPr>
+        <w:pStyle w:val="SPBodyText"/>
+      </w:pPr>
+    </w:p>
+    <w:p>
+      <w:pPr>
+        <w:pStyle w:val="SPBodyText"/>
+      </w:pPr>
+      <w:r>
+        <w:t>Three prayers, yet one movement of faith.</w:t>
+      </w:r>
+    </w:p>
+    <w:p>
+      <w:pPr>
+        <w:pStyle w:val="SPBodyText"/>
+      </w:pPr>
+      <w:r>
+        <w:t>We ask.</w:t>
+      </w:r>
+    </w:p>
+    <w:p>
+      <w:pPr>
+        <w:pStyle w:val="SPBodyText"/>
+      </w:pPr>
+      <w:r>
+        <w:t>We receive.</w:t>
+      </w:r>
+    </w:p>
+    <w:p>
+      <w:pPr>
+        <w:pStyle w:val="SPBodyText"/>
+      </w:pPr>
+      <w:r>
+        <w:t>We praise.</w:t>
+      </w:r>
+    </w:p>
+    <w:p>
+      <w:pPr>
+        <w:pStyle w:val="SPBodyText"/>
+      </w:pPr>
+    </w:p>
+    <w:p>
+      <w:pPr>
+        <w:pStyle w:val="SPBodyText"/>
+      </w:pPr>
+      <w:r>
+        <w:t xml:space="preserve">And beneath all three is the same mystery: </w:t>
+      </w:r>
+      <w:r>
+        <w:rPr>
+          <w:b/>
+          <w:bCs/>
+        </w:rPr>
+        <w:t>God has drawn near to us.</w:t>
+      </w:r>
+    </w:p>
+    <w:p>
+      <w:pPr>
+        <w:pStyle w:val="SPBodyText"/>
+      </w:pPr>
+    </w:p>
+    <w:p>
+      <w:pPr>
+        <w:pStyle w:val="SPBodyText"/>
+      </w:pPr>
+    </w:p>
+    <w:p>
+      <w:pPr>
+        <w:pStyle w:val="SPBodyText"/>
+      </w:pPr>
+      <w:r>
+        <w:lastRenderedPageBreak/>
+        <w:t xml:space="preserve">In the Our Father, Christ teaches us to call God </w:t>
+      </w:r>
+      <w:r>
+        <w:rPr>
+          <w:i/>
+          <w:iCs/>
+        </w:rPr>
+        <w:t>Father</w:t>
+      </w:r>
+      <w:r>
+        <w:t>.</w:t>
+      </w:r>
+    </w:p>
+    <w:p>
+      <w:pPr>
+        <w:pStyle w:val="SPBodyText"/>
+      </w:pPr>
+    </w:p>
+    <w:p>
+      <w:pPr>
+        <w:pStyle w:val="SPBodyText"/>
+      </w:pPr>
+      <w:r>
+        <w:t>In the Hail Mary, we hear the words spoken to Mary at the beginning of the mystery of salvation, and we remember the Word made flesh in her womb.</w:t>
+      </w:r>
+    </w:p>
+    <w:p>
+      <w:pPr>
+        <w:pStyle w:val="SPBodyText"/>
+      </w:pPr>
+    </w:p>
+    <w:p>
+      <w:pPr>
+        <w:pStyle w:val="SPBodyText"/>
+      </w:pPr>
+      <w:r>
+        <w:t>In the Glory Be, we turn our eyes toward the eternal God — Father, Son, and Holy Spirit — from whom all things come and to whom all things return.</w:t>
+      </w:r>
+    </w:p>
+    <w:p>
+      <w:pPr>
+        <w:pStyle w:val="SPBodyText"/>
+      </w:pPr>
+    </w:p>
+    <w:p>
+      <w:pPr>
+        <w:pStyle w:val="SPBodyText"/>
+      </w:pPr>
+      <w:r>
+        <w:t>These prayers also teach us something about prayer itself.</w:t>
+      </w:r>
+    </w:p>
+    <w:p>
+      <w:pPr>
+        <w:pStyle w:val="SPBodyText"/>
+      </w:pPr>
+      <w:r>
+        <w:t>Prayer is not simply a list of things we want.</w:t>
+      </w:r>
+    </w:p>
+    <w:p>
+      <w:pPr>
+        <w:pStyle w:val="SPBodyText"/>
+      </w:pPr>
+      <w:r>
+        <w:t>It is relationship.</w:t>
+      </w:r>
+    </w:p>
+    <w:p>
+      <w:pPr>
+        <w:pStyle w:val="SPBodyText"/>
+      </w:pPr>
+      <w:r>
+        <w:t>It is remembering who God is, remembering who we are, and remembering that we do not walk this life alone.</w:t>
+      </w:r>
+    </w:p>
+    <w:p>
+      <w:pPr>
+        <w:pStyle w:val="SPBodyText"/>
+      </w:pPr>
+    </w:p>
+    <w:p>
+      <w:pPr>
+        <w:pStyle w:val="SPBodyText"/>
+      </w:pPr>
+      <w:r>
+        <w:t xml:space="preserve">We pray for </w:t>
+      </w:r>
+      <w:r>
+        <w:rPr>
+          <w:b/>
+          <w:bCs/>
+        </w:rPr>
+        <w:t>our</w:t>
+      </w:r>
+      <w:r>
+        <w:t xml:space="preserve"> daily bread.</w:t>
+      </w:r>
+    </w:p>
+    <w:p>
+      <w:pPr>
+        <w:pStyle w:val="SPBodyText"/>
+      </w:pPr>
+      <w:r>
+        <w:t xml:space="preserve">We ask for </w:t>
+      </w:r>
+      <w:r>
+        <w:rPr>
+          <w:b/>
+          <w:bCs/>
+        </w:rPr>
+        <w:t>our</w:t>
+      </w:r>
+      <w:r>
+        <w:t xml:space="preserve"> forgiveness.</w:t>
+      </w:r>
+    </w:p>
+    <w:p>
+      <w:pPr>
+        <w:pStyle w:val="SPBodyText"/>
+      </w:pPr>
+      <w:r>
+        <w:t xml:space="preserve">We ask Mary to pray for </w:t>
+      </w:r>
+      <w:r>
+        <w:rPr>
+          <w:b/>
+          <w:bCs/>
+        </w:rPr>
+        <w:t>us</w:t>
+      </w:r>
+      <w:r>
+        <w:t>.</w:t>
+      </w:r>
+    </w:p>
+    <w:p>
+      <w:pPr>
+        <w:pStyle w:val="SPBodyText"/>
+      </w:pPr>
+    </w:p>
+    <w:p>
+      <w:pPr>
+        <w:pStyle w:val="SPBodyText"/>
+      </w:pPr>
+      <w:r>
+        <w:t>And then we give glory not only with our lips, but with our lives.</w:t>
+      </w:r>
+    </w:p>
+    <w:p>
+      <w:pPr>
+        <w:pStyle w:val="SPBodyText"/>
+      </w:pPr>
+      <w:r>
+        <w:t>The prayers we have spoken are ancient, but they are never merely words from the past. Each time we pray them, they become present again.</w:t>
+      </w:r>
+    </w:p>
+    <w:p>
+      <w:pPr>
+        <w:pStyle w:val="SPBodyText"/>
+      </w:pPr>
+    </w:p>
+    <w:p>
+      <w:pPr>
+        <w:pStyle w:val="SPBodyText"/>
+      </w:pPr>
+      <w:r>
+        <w:lastRenderedPageBreak/>
+        <w:t>The words are old.</w:t>
+      </w:r>
+    </w:p>
+    <w:p>
+      <w:pPr>
+        <w:pStyle w:val="SPBodyText"/>
+      </w:pPr>
+      <w:r>
+        <w:rPr>
+          <w:b/>
+          <w:bCs/>
+        </w:rPr>
+        <w:t>The prayer is ours.</w:t>
+      </w:r>
+    </w:p>
+    <w:p>
+      <w:pPr>
+        <w:pStyle w:val="SPBodyText"/>
+      </w:pPr>
+      <w:r>
+        <w:t xml:space="preserve">And </w:t>
+      </w:r>
+      <w:r>
+        <w:t>so,</w:t>
+      </w:r>
+      <w:r>
+        <w:t xml:space="preserve"> we continue.</w:t>
+      </w:r>
+    </w:p>
+    <w:p>
+      <w:pPr>
+        <w:pStyle w:val="SPBodyText"/>
+      </w:pPr>
+      <w:r>
+        <w:t>From the prayers taught by Christ and handed down by the Church, we now turn toward the prayers that rise from the very heart of Scripture — the songs of those who waited, trusted, rejoiced, and gave themselves to God.</w:t>
+      </w:r>
+    </w:p>
+    <w:p>
+      <w:pPr>
+        <w:pStyle w:val="SPBodyText"/>
+      </w:pPr>
+    </w:p>
+    <w:p>
+      <w:pPr>
+        <w:pStyle w:val="SPBodyText"/>
+        <w:rPr>
+          <w:b/>
+          <w:bCs/>
+        </w:rPr>
+      </w:pPr>
+      <w:r>
+        <w:rPr>
+          <w:b/>
+          <w:bCs/>
+        </w:rPr>
+        <w:t>The Benedictus.</w:t>
+      </w:r>
+    </w:p>
+    <w:p>
+      <w:pPr>
+        <w:pStyle w:val="SPBodyText"/>
+        <w:rPr>
+          <w:b/>
+          <w:bCs/>
+        </w:rPr>
+      </w:pPr>
+      <w:r>
+        <w:rPr>
+          <w:b/>
+          <w:bCs/>
+        </w:rPr>
+        <w:t>The Magnificat.</w:t>
+      </w:r>
+    </w:p>
+    <w:p>
+      <w:pPr>
+        <w:pStyle w:val="SPBodyText"/>
+        <w:rPr>
+          <w:b/>
+          <w:bCs/>
+        </w:rPr>
+      </w:pPr>
+      <w:r>
+        <w:rPr>
+          <w:b/>
+          <w:bCs/>
+        </w:rPr>
+        <w:t>The Angelus.</w:t>
+      </w:r>
+    </w:p>
+    <w:p>
+      <w:pPr>
+        <w:pStyle w:val="SPBodyText"/>
+      </w:pPr>
+    </w:p>
+    <w:p>
+      <w:pPr>
+        <w:pStyle w:val="SPBodyText"/>
+      </w:pPr>
+      <w:r>
+        <w:t>And prayers that have accompanied Christians through the ordinary hours of the day:</w:t>
+      </w:r>
+    </w:p>
+    <w:p>
+      <w:pPr>
+        <w:pStyle w:val="SPBodyText"/>
+      </w:pPr>
+      <w:r>
+        <w:t>the prayer of the guardian angel,</w:t>
+      </w:r>
+    </w:p>
+    <w:p>
+      <w:pPr>
+        <w:pStyle w:val="SPBodyText"/>
+      </w:pPr>
+      <w:r>
+        <w:t xml:space="preserve">the simple cry of the </w:t>
+      </w:r>
+      <w:r>
+        <w:rPr>
+          <w:b/>
+          <w:bCs/>
+        </w:rPr>
+        <w:t>Jesus Prayer</w:t>
+      </w:r>
+      <w:r>
+        <w:t>,</w:t>
+      </w:r>
+    </w:p>
+    <w:p>
+      <w:pPr>
+        <w:pStyle w:val="SPBodyText"/>
+      </w:pPr>
+      <w:r>
+        <w:t>and prayers entrusted to the intercession of the saints.</w:t>
+      </w:r>
+    </w:p>
+    <w:p>
+      <w:pPr>
+        <w:pStyle w:val="SPBodyText"/>
+      </w:pPr>
+    </w:p>
+    <w:p>
+      <w:pPr>
+        <w:pStyle w:val="SPBodyText"/>
+      </w:pPr>
+      <w:r>
+        <w:t>Different words.</w:t>
+      </w:r>
+    </w:p>
+    <w:p>
+      <w:pPr>
+        <w:pStyle w:val="SPBodyText"/>
+      </w:pPr>
+      <w:r>
+        <w:t>Different moments.</w:t>
+      </w:r>
+    </w:p>
+    <w:p>
+      <w:pPr>
+        <w:pStyle w:val="SPBodyText"/>
+      </w:pPr>
+      <w:r>
+        <w:t>One faith.</w:t>
+      </w:r>
+    </w:p>
+    <w:p>
+      <w:pPr>
+        <w:pStyle w:val="SPBodyText"/>
+      </w:pPr>
+      <w:r>
+        <w:t>One Lord.</w:t>
+      </w:r>
+    </w:p>
+    <w:p>
+      <w:pPr>
+        <w:pStyle w:val="SPBodyText"/>
+      </w:pPr>
+      <w:r>
+        <w:t>One God.</w:t>
+      </w:r>
+    </w:p>
+    <w:p>
+      <w:pPr>
+        <w:pStyle w:val="SPBodyText"/>
+      </w:pPr>
+      <w:r>
+        <w:t>And one journey toward Him.</w:t>
+      </w:r>
+    </w:p>
+    <w:p>
+      <w:pPr>
+        <w:pStyle w:val="SPBodyText"/>
+        <w:jc w:val="center"/>
+        <w:rPr>
+          <w:rFonts w:ascii="Segoe UI Symbol" w:hAnsi="Segoe UI Symbol" w:cs="Segoe UI Symbol"/>
+        </w:rPr>
+      </w:pPr>
+      <w:r>
+        <w:rPr>
+          <w:rFonts w:ascii="Segoe UI Symbol" w:hAnsi="Segoe UI Symbol" w:cs="Segoe UI Symbol"/>
+        </w:rPr>
+        <w:t>✠</w:t>
+      </w:r>
+    </w:p>
+    <w:p>
+      <w:pPr>
+        <w:pStyle w:val="SPBodyText"/>
+      </w:pPr>
+    </w:p>
+    <w:p>
+      <w:pPr>
+        <w:pStyle w:val="SPBodyText"/>
+      </w:pPr>
+    </w:p>
+    <w:p>
+      <w:pPr>
+        <w:pStyle w:val="SPBodyText"/>
+      </w:pPr>
+      <w:r>
+        <w:rPr>
+          <w:b/>
+          <w:bCs/>
+        </w:rPr>
         <w:t xml:space="preserve"> </w:t>
       </w:r>
     </w:p>
     <w:sectPr>
-      <w:type w:val="evenPage"/>
+      <w:type w:val="oddPage"/>
       <w:pgSz w:w="7920" w:h="12240" w:code="6"/>
       <w:pgMar w:top="1080" w:right="864" w:bottom="1080" w:left="1152" w:header="576" w:footer="576" w:gutter="0"/>
       <w:cols w:space="720"/>
@@ -5223,6 +5792,619 @@
     </w:p>
   </w:footnote>
 </w:footnotes>
+</file>
+
+<file path=word/numbering.xml><?xml version="1.0" encoding="utf-8"?>
+<w:numbering xmlns:wpc="http://schemas.microsoft.com/office/word/2010/wordprocessingCanvas" xmlns:cx="http://schemas.microsoft.com/office/drawing/2014/chartex" xmlns:cx1="http://schemas.microsoft.com/office/drawing/2015/9/8/chartex" xmlns:cx2="http://schemas.microsoft.com/office/drawing/2015/10/21/chartex" xmlns:cx3="http://schemas.microsoft.com/office/drawing/2016/5/9/chartex" xmlns:cx4="http://schemas.microsoft.com/office/drawing/2016/5/10/chartex" xmlns:cx5="http://schemas.microsoft.com/office/drawing/2016/5/11/chartex" xmlns:cx6="http://schemas.microsoft.com/office/drawing/2016/5/12/chartex" xmlns:cx7="http://schemas.microsoft.com/office/drawing/2016/5/13/chartex" xmlns:cx8="http://schemas.microsoft.com/office/drawing/2016/5/14/chartex" xmlns:mc="http://schemas.openxmlformats.org/markup-compatibility/2006" xmlns:aink="http://schemas.microsoft.com/office/drawing/2016/ink" xmlns:am3d="http://schemas.microsoft.com/office/drawing/2017/model3d" xmlns:o="urn:schemas-microsoft-com:office:office" xmlns:oel="http://schemas.microsoft.com/office/2019/extlst" xmlns:r="http://schemas.openxmlformats.org/officeDocument/2006/relationships" xmlns:m="http://schemas.openxmlformats.org/officeDocument/2006/math" xmlns:v="urn:schemas-microsoft-com:vml" xmlns:wp14="http://schemas.microsoft.com/office/word/2010/wordprocessingDrawing" xmlns:wp="http://schemas.openxmlformats.org/drawingml/2006/wordprocessingDrawing" xmlns:w10="urn:schemas-microsoft-com:office:word" xmlns:w="http://schemas.openxmlformats.org/wordprocessingml/2006/main" xmlns:w14="http://schemas.microsoft.com/office/word/2010/wordml" xmlns:w15="http://schemas.microsoft.com/office/word/2012/wordml" xmlns:w16cex="http://schemas.microsoft.com/office/word/2018/wordml/cex" xmlns:w16cid="http://schemas.microsoft.com/office/word/2016/wordml/cid" xmlns:w16="http://schemas.microsoft.com/office/word/2018/wordml" xmlns:w16du="http://schemas.microsoft.com/office/word/2023/wordml/word16du" xmlns:w16sdtdh="http://schemas.microsoft.com/office/word/2020/wordml/sdtdatahash" xmlns:w16sdtfl="http://schemas.microsoft.com/office/word/2024/wordml/sdtformatlock" xmlns:w16se="http://schemas.microsoft.com/office/word/2015/wordml/symex" xmlns:wpg="http://schemas.microsoft.com/office/word/2010/wordprocessingGroup" xmlns:wpi="http://schemas.microsoft.com/office/word/2010/wordprocessingInk" xmlns:wne="http://schemas.microsoft.com/office/word/2006/wordml" xmlns:wps="http://schemas.microsoft.com/office/word/2010/wordprocessingShape" mc:Ignorable="w14 w15 w16se w16cid w16 w16cex w16sdtdh w16sdtfl w16du wp14">
+  <w:abstractNum w:abstractNumId="0" w15:restartNumberingAfterBreak="0">
+    <w:nsid w:val="24953221"/>
+    <w:multiLevelType w:val="multilevel"/>
+    <w:tmpl w:val="A77E292E"/>
+    <w:lvl w:ilvl="0">
+      <w:start w:val="1"/>
+      <w:numFmt w:val="bullet"/>
+      <w:lvlText w:val=""/>
+      <w:lvlJc w:val="left"/>
+      <w:pPr>
+        <w:tabs>
+          <w:tab w:val="num" w:pos="720"/>
+        </w:tabs>
+        <w:ind w:left="720" w:hanging="360"/>
+      </w:pPr>
+      <w:rPr>
+        <w:rFonts w:ascii="Symbol" w:hAnsi="Symbol" w:hint="default"/>
+        <w:sz w:val="20"/>
+      </w:rPr>
+    </w:lvl>
+    <w:lvl w:ilvl="1" w:tentative="1">
+      <w:start w:val="1"/>
+      <w:numFmt w:val="bullet"/>
+      <w:lvlText w:val="o"/>
+      <w:lvlJc w:val="left"/>
+      <w:pPr>
+        <w:tabs>
+          <w:tab w:val="num" w:pos="1440"/>
+        </w:tabs>
+        <w:ind w:left="1440" w:hanging="360"/>
+      </w:pPr>
+      <w:rPr>
+        <w:rFonts w:ascii="Courier New" w:hAnsi="Courier New" w:hint="default"/>
+        <w:sz w:val="20"/>
+      </w:rPr>
+    </w:lvl>
+    <w:lvl w:ilvl="2" w:tentative="1">
+      <w:start w:val="1"/>
+      <w:numFmt w:val="bullet"/>
+      <w:lvlText w:val=""/>
+      <w:lvlJc w:val="left"/>
+      <w:pPr>
+        <w:tabs>
+          <w:tab w:val="num" w:pos="2160"/>
+        </w:tabs>
+        <w:ind w:left="2160" w:hanging="360"/>
+      </w:pPr>
+      <w:rPr>
+        <w:rFonts w:ascii="Wingdings" w:hAnsi="Wingdings" w:hint="default"/>
+        <w:sz w:val="20"/>
+      </w:rPr>
+    </w:lvl>
+    <w:lvl w:ilvl="3" w:tentative="1">
+      <w:start w:val="1"/>
+      <w:numFmt w:val="bullet"/>
+      <w:lvlText w:val=""/>
+      <w:lvlJc w:val="left"/>
+      <w:pPr>
+        <w:tabs>
+          <w:tab w:val="num" w:pos="2880"/>
+        </w:tabs>
+        <w:ind w:left="2880" w:hanging="360"/>
+      </w:pPr>
+      <w:rPr>
+        <w:rFonts w:ascii="Wingdings" w:hAnsi="Wingdings" w:hint="default"/>
+        <w:sz w:val="20"/>
+      </w:rPr>
+    </w:lvl>
+    <w:lvl w:ilvl="4" w:tentative="1">
+      <w:start w:val="1"/>
+      <w:numFmt w:val="bullet"/>
+      <w:lvlText w:val=""/>
+      <w:lvlJc w:val="left"/>
+      <w:pPr>
+        <w:tabs>
+          <w:tab w:val="num" w:pos="3600"/>
+        </w:tabs>
+        <w:ind w:left="3600" w:hanging="360"/>
+      </w:pPr>
+      <w:rPr>
+        <w:rFonts w:ascii="Wingdings" w:hAnsi="Wingdings" w:hint="default"/>
+        <w:sz w:val="20"/>
+      </w:rPr>
+    </w:lvl>
+    <w:lvl w:ilvl="5" w:tentative="1">
+      <w:start w:val="1"/>
+      <w:numFmt w:val="bullet"/>
+      <w:lvlText w:val=""/>
+      <w:lvlJc w:val="left"/>
+      <w:pPr>
+        <w:tabs>
+          <w:tab w:val="num" w:pos="4320"/>
+        </w:tabs>
+        <w:ind w:left="4320" w:hanging="360"/>
+      </w:pPr>
+      <w:rPr>
+        <w:rFonts w:ascii="Wingdings" w:hAnsi="Wingdings" w:hint="default"/>
+        <w:sz w:val="20"/>
+      </w:rPr>
+    </w:lvl>
+    <w:lvl w:ilvl="6" w:tentative="1">
+      <w:start w:val="1"/>
+      <w:numFmt w:val="bullet"/>
+      <w:lvlText w:val=""/>
+      <w:lvlJc w:val="left"/>
+      <w:pPr>
+        <w:tabs>
+          <w:tab w:val="num" w:pos="5040"/>
+        </w:tabs>
+        <w:ind w:left="5040" w:hanging="360"/>
+      </w:pPr>
+      <w:rPr>
+        <w:rFonts w:ascii="Wingdings" w:hAnsi="Wingdings" w:hint="default"/>
+        <w:sz w:val="20"/>
+      </w:rPr>
+    </w:lvl>
+    <w:lvl w:ilvl="7" w:tentative="1">
+      <w:start w:val="1"/>
+      <w:numFmt w:val="bullet"/>
+      <w:lvlText w:val=""/>
+      <w:lvlJc w:val="left"/>
+      <w:pPr>
+        <w:tabs>
+          <w:tab w:val="num" w:pos="5760"/>
+        </w:tabs>
+        <w:ind w:left="5760" w:hanging="360"/>
+      </w:pPr>
+      <w:rPr>
+        <w:rFonts w:ascii="Wingdings" w:hAnsi="Wingdings" w:hint="default"/>
+        <w:sz w:val="20"/>
+      </w:rPr>
+    </w:lvl>
+    <w:lvl w:ilvl="8" w:tentative="1">
+      <w:start w:val="1"/>
+      <w:numFmt w:val="bullet"/>
+      <w:lvlText w:val=""/>
+      <w:lvlJc w:val="left"/>
+      <w:pPr>
+        <w:tabs>
+          <w:tab w:val="num" w:pos="6480"/>
+        </w:tabs>
+        <w:ind w:left="6480" w:hanging="360"/>
+      </w:pPr>
+      <w:rPr>
+        <w:rFonts w:ascii="Wingdings" w:hAnsi="Wingdings" w:hint="default"/>
+        <w:sz w:val="20"/>
+      </w:rPr>
+    </w:lvl>
+  </w:abstractNum>
+  <w:abstractNum w:abstractNumId="1" w15:restartNumberingAfterBreak="0">
+    <w:nsid w:val="2A856458"/>
+    <w:multiLevelType w:val="multilevel"/>
+    <w:tmpl w:val="EDFEAD46"/>
+    <w:lvl w:ilvl="0">
+      <w:start w:val="1"/>
+      <w:numFmt w:val="bullet"/>
+      <w:lvlText w:val=""/>
+      <w:lvlJc w:val="left"/>
+      <w:pPr>
+        <w:tabs>
+          <w:tab w:val="num" w:pos="720"/>
+        </w:tabs>
+        <w:ind w:left="720" w:hanging="360"/>
+      </w:pPr>
+      <w:rPr>
+        <w:rFonts w:ascii="Symbol" w:hAnsi="Symbol" w:hint="default"/>
+        <w:sz w:val="20"/>
+      </w:rPr>
+    </w:lvl>
+    <w:lvl w:ilvl="1" w:tentative="1">
+      <w:start w:val="1"/>
+      <w:numFmt w:val="bullet"/>
+      <w:lvlText w:val="o"/>
+      <w:lvlJc w:val="left"/>
+      <w:pPr>
+        <w:tabs>
+          <w:tab w:val="num" w:pos="1440"/>
+        </w:tabs>
+        <w:ind w:left="1440" w:hanging="360"/>
+      </w:pPr>
+      <w:rPr>
+        <w:rFonts w:ascii="Courier New" w:hAnsi="Courier New" w:hint="default"/>
+        <w:sz w:val="20"/>
+      </w:rPr>
+    </w:lvl>
+    <w:lvl w:ilvl="2" w:tentative="1">
+      <w:start w:val="1"/>
+      <w:numFmt w:val="bullet"/>
+      <w:lvlText w:val=""/>
+      <w:lvlJc w:val="left"/>
+      <w:pPr>
+        <w:tabs>
+          <w:tab w:val="num" w:pos="2160"/>
+        </w:tabs>
+        <w:ind w:left="2160" w:hanging="360"/>
+      </w:pPr>
+      <w:rPr>
+        <w:rFonts w:ascii="Wingdings" w:hAnsi="Wingdings" w:hint="default"/>
+        <w:sz w:val="20"/>
+      </w:rPr>
+    </w:lvl>
+    <w:lvl w:ilvl="3" w:tentative="1">
+      <w:start w:val="1"/>
+      <w:numFmt w:val="bullet"/>
+      <w:lvlText w:val=""/>
+      <w:lvlJc w:val="left"/>
+      <w:pPr>
+        <w:tabs>
+          <w:tab w:val="num" w:pos="2880"/>
+        </w:tabs>
+        <w:ind w:left="2880" w:hanging="360"/>
+      </w:pPr>
+      <w:rPr>
+        <w:rFonts w:ascii="Wingdings" w:hAnsi="Wingdings" w:hint="default"/>
+        <w:sz w:val="20"/>
+      </w:rPr>
+    </w:lvl>
+    <w:lvl w:ilvl="4" w:tentative="1">
+      <w:start w:val="1"/>
+      <w:numFmt w:val="bullet"/>
+      <w:lvlText w:val=""/>
+      <w:lvlJc w:val="left"/>
+      <w:pPr>
+        <w:tabs>
+          <w:tab w:val="num" w:pos="3600"/>
+        </w:tabs>
+        <w:ind w:left="3600" w:hanging="360"/>
+      </w:pPr>
+      <w:rPr>
+        <w:rFonts w:ascii="Wingdings" w:hAnsi="Wingdings" w:hint="default"/>
+        <w:sz w:val="20"/>
+      </w:rPr>
+    </w:lvl>
+    <w:lvl w:ilvl="5" w:tentative="1">
+      <w:start w:val="1"/>
+      <w:numFmt w:val="bullet"/>
+      <w:lvlText w:val=""/>
+      <w:lvlJc w:val="left"/>
+      <w:pPr>
+        <w:tabs>
+          <w:tab w:val="num" w:pos="4320"/>
+        </w:tabs>
+        <w:ind w:left="4320" w:hanging="360"/>
+      </w:pPr>
+      <w:rPr>
+        <w:rFonts w:ascii="Wingdings" w:hAnsi="Wingdings" w:hint="default"/>
+        <w:sz w:val="20"/>
+      </w:rPr>
+    </w:lvl>
+    <w:lvl w:ilvl="6" w:tentative="1">
+      <w:start w:val="1"/>
+      <w:numFmt w:val="bullet"/>
+      <w:lvlText w:val=""/>
+      <w:lvlJc w:val="left"/>
+      <w:pPr>
+        <w:tabs>
+          <w:tab w:val="num" w:pos="5040"/>
+        </w:tabs>
+        <w:ind w:left="5040" w:hanging="360"/>
+      </w:pPr>
+      <w:rPr>
+        <w:rFonts w:ascii="Wingdings" w:hAnsi="Wingdings" w:hint="default"/>
+        <w:sz w:val="20"/>
+      </w:rPr>
+    </w:lvl>
+    <w:lvl w:ilvl="7" w:tentative="1">
+      <w:start w:val="1"/>
+      <w:numFmt w:val="bullet"/>
+      <w:lvlText w:val=""/>
+      <w:lvlJc w:val="left"/>
+      <w:pPr>
+        <w:tabs>
+          <w:tab w:val="num" w:pos="5760"/>
+        </w:tabs>
+        <w:ind w:left="5760" w:hanging="360"/>
+      </w:pPr>
+      <w:rPr>
+        <w:rFonts w:ascii="Wingdings" w:hAnsi="Wingdings" w:hint="default"/>
+        <w:sz w:val="20"/>
+      </w:rPr>
+    </w:lvl>
+    <w:lvl w:ilvl="8" w:tentative="1">
+      <w:start w:val="1"/>
+      <w:numFmt w:val="bullet"/>
+      <w:lvlText w:val=""/>
+      <w:lvlJc w:val="left"/>
+      <w:pPr>
+        <w:tabs>
+          <w:tab w:val="num" w:pos="6480"/>
+        </w:tabs>
+        <w:ind w:left="6480" w:hanging="360"/>
+      </w:pPr>
+      <w:rPr>
+        <w:rFonts w:ascii="Wingdings" w:hAnsi="Wingdings" w:hint="default"/>
+        <w:sz w:val="20"/>
+      </w:rPr>
+    </w:lvl>
+  </w:abstractNum>
+  <w:abstractNum w:abstractNumId="2" w15:restartNumberingAfterBreak="0">
+    <w:nsid w:val="4F541A7A"/>
+    <w:multiLevelType w:val="multilevel"/>
+    <w:tmpl w:val="EED4D09C"/>
+    <w:lvl w:ilvl="0">
+      <w:start w:val="1"/>
+      <w:numFmt w:val="bullet"/>
+      <w:lvlText w:val=""/>
+      <w:lvlJc w:val="left"/>
+      <w:pPr>
+        <w:tabs>
+          <w:tab w:val="num" w:pos="720"/>
+        </w:tabs>
+        <w:ind w:left="720" w:hanging="360"/>
+      </w:pPr>
+      <w:rPr>
+        <w:rFonts w:ascii="Symbol" w:hAnsi="Symbol" w:hint="default"/>
+        <w:sz w:val="20"/>
+      </w:rPr>
+    </w:lvl>
+    <w:lvl w:ilvl="1" w:tentative="1">
+      <w:start w:val="1"/>
+      <w:numFmt w:val="bullet"/>
+      <w:lvlText w:val="o"/>
+      <w:lvlJc w:val="left"/>
+      <w:pPr>
+        <w:tabs>
+          <w:tab w:val="num" w:pos="1440"/>
+        </w:tabs>
+        <w:ind w:left="1440" w:hanging="360"/>
+      </w:pPr>
+      <w:rPr>
+        <w:rFonts w:ascii="Courier New" w:hAnsi="Courier New" w:hint="default"/>
+        <w:sz w:val="20"/>
+      </w:rPr>
+    </w:lvl>
+    <w:lvl w:ilvl="2" w:tentative="1">
+      <w:start w:val="1"/>
+      <w:numFmt w:val="bullet"/>
+      <w:lvlText w:val=""/>
+      <w:lvlJc w:val="left"/>
+      <w:pPr>
+        <w:tabs>
+          <w:tab w:val="num" w:pos="2160"/>
+        </w:tabs>
+        <w:ind w:left="2160" w:hanging="360"/>
+      </w:pPr>
+      <w:rPr>
+        <w:rFonts w:ascii="Wingdings" w:hAnsi="Wingdings" w:hint="default"/>
+        <w:sz w:val="20"/>
+      </w:rPr>
+    </w:lvl>
+    <w:lvl w:ilvl="3" w:tentative="1">
+      <w:start w:val="1"/>
+      <w:numFmt w:val="bullet"/>
+      <w:lvlText w:val=""/>
+      <w:lvlJc w:val="left"/>
+      <w:pPr>
+        <w:tabs>
+          <w:tab w:val="num" w:pos="2880"/>
+        </w:tabs>
+        <w:ind w:left="2880" w:hanging="360"/>
+      </w:pPr>
+      <w:rPr>
+        <w:rFonts w:ascii="Wingdings" w:hAnsi="Wingdings" w:hint="default"/>
+        <w:sz w:val="20"/>
+      </w:rPr>
+    </w:lvl>
+    <w:lvl w:ilvl="4" w:tentative="1">
+      <w:start w:val="1"/>
+      <w:numFmt w:val="bullet"/>
+      <w:lvlText w:val=""/>
+      <w:lvlJc w:val="left"/>
+      <w:pPr>
+        <w:tabs>
+          <w:tab w:val="num" w:pos="3600"/>
+        </w:tabs>
+        <w:ind w:left="3600" w:hanging="360"/>
+      </w:pPr>
+      <w:rPr>
+        <w:rFonts w:ascii="Wingdings" w:hAnsi="Wingdings" w:hint="default"/>
+        <w:sz w:val="20"/>
+      </w:rPr>
+    </w:lvl>
+    <w:lvl w:ilvl="5" w:tentative="1">
+      <w:start w:val="1"/>
+      <w:numFmt w:val="bullet"/>
+      <w:lvlText w:val=""/>
+      <w:lvlJc w:val="left"/>
+      <w:pPr>
+        <w:tabs>
+          <w:tab w:val="num" w:pos="4320"/>
+        </w:tabs>
+        <w:ind w:left="4320" w:hanging="360"/>
+      </w:pPr>
+      <w:rPr>
+        <w:rFonts w:ascii="Wingdings" w:hAnsi="Wingdings" w:hint="default"/>
+        <w:sz w:val="20"/>
+      </w:rPr>
+    </w:lvl>
+    <w:lvl w:ilvl="6" w:tentative="1">
+      <w:start w:val="1"/>
+      <w:numFmt w:val="bullet"/>
+      <w:lvlText w:val=""/>
+      <w:lvlJc w:val="left"/>
+      <w:pPr>
+        <w:tabs>
+          <w:tab w:val="num" w:pos="5040"/>
+        </w:tabs>
+        <w:ind w:left="5040" w:hanging="360"/>
+      </w:pPr>
+      <w:rPr>
+        <w:rFonts w:ascii="Wingdings" w:hAnsi="Wingdings" w:hint="default"/>
+        <w:sz w:val="20"/>
+      </w:rPr>
+    </w:lvl>
+    <w:lvl w:ilvl="7" w:tentative="1">
+      <w:start w:val="1"/>
+      <w:numFmt w:val="bullet"/>
+      <w:lvlText w:val=""/>
+      <w:lvlJc w:val="left"/>
+      <w:pPr>
+        <w:tabs>
+          <w:tab w:val="num" w:pos="5760"/>
+        </w:tabs>
+        <w:ind w:left="5760" w:hanging="360"/>
+      </w:pPr>
+      <w:rPr>
+        <w:rFonts w:ascii="Wingdings" w:hAnsi="Wingdings" w:hint="default"/>
+        <w:sz w:val="20"/>
+      </w:rPr>
+    </w:lvl>
+    <w:lvl w:ilvl="8" w:tentative="1">
+      <w:start w:val="1"/>
+      <w:numFmt w:val="bullet"/>
+      <w:lvlText w:val=""/>
+      <w:lvlJc w:val="left"/>
+      <w:pPr>
+        <w:tabs>
+          <w:tab w:val="num" w:pos="6480"/>
+        </w:tabs>
+        <w:ind w:left="6480" w:hanging="360"/>
+      </w:pPr>
+      <w:rPr>
+        <w:rFonts w:ascii="Wingdings" w:hAnsi="Wingdings" w:hint="default"/>
+        <w:sz w:val="20"/>
+      </w:rPr>
+    </w:lvl>
+  </w:abstractNum>
+  <w:abstractNum w:abstractNumId="3" w15:restartNumberingAfterBreak="0">
+    <w:nsid w:val="62D96A0A"/>
+    <w:multiLevelType w:val="multilevel"/>
+    <w:tmpl w:val="958A32D0"/>
+    <w:lvl w:ilvl="0">
+      <w:start w:val="1"/>
+      <w:numFmt w:val="bullet"/>
+      <w:lvlText w:val=""/>
+      <w:lvlJc w:val="left"/>
+      <w:pPr>
+        <w:tabs>
+          <w:tab w:val="num" w:pos="720"/>
+        </w:tabs>
+        <w:ind w:left="720" w:hanging="360"/>
+      </w:pPr>
+      <w:rPr>
+        <w:rFonts w:ascii="Symbol" w:hAnsi="Symbol" w:hint="default"/>
+        <w:sz w:val="20"/>
+      </w:rPr>
+    </w:lvl>
+    <w:lvl w:ilvl="1" w:tentative="1">
+      <w:start w:val="1"/>
+      <w:numFmt w:val="bullet"/>
+      <w:lvlText w:val="o"/>
+      <w:lvlJc w:val="left"/>
+      <w:pPr>
+        <w:tabs>
+          <w:tab w:val="num" w:pos="1440"/>
+        </w:tabs>
+        <w:ind w:left="1440" w:hanging="360"/>
+      </w:pPr>
+      <w:rPr>
+        <w:rFonts w:ascii="Courier New" w:hAnsi="Courier New" w:hint="default"/>
+        <w:sz w:val="20"/>
+      </w:rPr>
+    </w:lvl>
+    <w:lvl w:ilvl="2" w:tentative="1">
+      <w:start w:val="1"/>
+      <w:numFmt w:val="bullet"/>
+      <w:lvlText w:val=""/>
+      <w:lvlJc w:val="left"/>
+      <w:pPr>
+        <w:tabs>
+          <w:tab w:val="num" w:pos="2160"/>
+        </w:tabs>
+        <w:ind w:left="2160" w:hanging="360"/>
+      </w:pPr>
+      <w:rPr>
+        <w:rFonts w:ascii="Wingdings" w:hAnsi="Wingdings" w:hint="default"/>
+        <w:sz w:val="20"/>
+      </w:rPr>
+    </w:lvl>
+    <w:lvl w:ilvl="3" w:tentative="1">
+      <w:start w:val="1"/>
+      <w:numFmt w:val="bullet"/>
+      <w:lvlText w:val=""/>
+      <w:lvlJc w:val="left"/>
+      <w:pPr>
+        <w:tabs>
+          <w:tab w:val="num" w:pos="2880"/>
+        </w:tabs>
+        <w:ind w:left="2880" w:hanging="360"/>
+      </w:pPr>
+      <w:rPr>
+        <w:rFonts w:ascii="Wingdings" w:hAnsi="Wingdings" w:hint="default"/>
+        <w:sz w:val="20"/>
+      </w:rPr>
+    </w:lvl>
+    <w:lvl w:ilvl="4" w:tentative="1">
+      <w:start w:val="1"/>
+      <w:numFmt w:val="bullet"/>
+      <w:lvlText w:val=""/>
+      <w:lvlJc w:val="left"/>
+      <w:pPr>
+        <w:tabs>
+          <w:tab w:val="num" w:pos="3600"/>
+        </w:tabs>
+        <w:ind w:left="3600" w:hanging="360"/>
+      </w:pPr>
+      <w:rPr>
+        <w:rFonts w:ascii="Wingdings" w:hAnsi="Wingdings" w:hint="default"/>
+        <w:sz w:val="20"/>
+      </w:rPr>
+    </w:lvl>
+    <w:lvl w:ilvl="5" w:tentative="1">
+      <w:start w:val="1"/>
+      <w:numFmt w:val="bullet"/>
+      <w:lvlText w:val=""/>
+      <w:lvlJc w:val="left"/>
+      <w:pPr>
+        <w:tabs>
+          <w:tab w:val="num" w:pos="4320"/>
+        </w:tabs>
+        <w:ind w:left="4320" w:hanging="360"/>
+      </w:pPr>
+      <w:rPr>
+        <w:rFonts w:ascii="Wingdings" w:hAnsi="Wingdings" w:hint="default"/>
+        <w:sz w:val="20"/>
+      </w:rPr>
+    </w:lvl>
+    <w:lvl w:ilvl="6" w:tentative="1">
+      <w:start w:val="1"/>
+      <w:numFmt w:val="bullet"/>
+      <w:lvlText w:val=""/>
+      <w:lvlJc w:val="left"/>
+      <w:pPr>
+        <w:tabs>
+          <w:tab w:val="num" w:pos="5040"/>
+        </w:tabs>
+        <w:ind w:left="5040" w:hanging="360"/>
+      </w:pPr>
+      <w:rPr>
+        <w:rFonts w:ascii="Wingdings" w:hAnsi="Wingdings" w:hint="default"/>
+        <w:sz w:val="20"/>
+      </w:rPr>
+    </w:lvl>
+    <w:lvl w:ilvl="7" w:tentative="1">
+      <w:start w:val="1"/>
+      <w:numFmt w:val="bullet"/>
+      <w:lvlText w:val=""/>
+      <w:lvlJc w:val="left"/>
+      <w:pPr>
+        <w:tabs>
+          <w:tab w:val="num" w:pos="5760"/>
+        </w:tabs>
+        <w:ind w:left="5760" w:hanging="360"/>
+      </w:pPr>
+      <w:rPr>
+        <w:rFonts w:ascii="Wingdings" w:hAnsi="Wingdings" w:hint="default"/>
+        <w:sz w:val="20"/>
+      </w:rPr>
+    </w:lvl>
+    <w:lvl w:ilvl="8" w:tentative="1">
+      <w:start w:val="1"/>
+      <w:numFmt w:val="bullet"/>
+      <w:lvlText w:val=""/>
+      <w:lvlJc w:val="left"/>
+      <w:pPr>
+        <w:tabs>
+          <w:tab w:val="num" w:pos="6480"/>
+        </w:tabs>
+        <w:ind w:left="6480" w:hanging="360"/>
+      </w:pPr>
+      <w:rPr>
+        <w:rFonts w:ascii="Wingdings" w:hAnsi="Wingdings" w:hint="default"/>
+        <w:sz w:val="20"/>
+      </w:rPr>
+    </w:lvl>
+  </w:abstractNum>
+  <w:num w:numId="1" w16cid:durableId="2001542825">
+    <w:abstractNumId w:val="1"/>
+  </w:num>
+  <w:num w:numId="2" w16cid:durableId="1522161272">
+    <w:abstractNumId w:val="3"/>
+  </w:num>
+  <w:num w:numId="3" w16cid:durableId="1075280120">
+    <w:abstractNumId w:val="2"/>
+  </w:num>
+  <w:num w:numId="4" w16cid:durableId="221643493">
+    <w:abstractNumId w:val="0"/>
+  </w:num>
+</w:numbering>
 </file>
 
 <file path=word/styles.xml><?xml version="1.0" encoding="utf-8"?>

</xml_diff>

<commit_message>
Act of contrition and rearranging prayers into sections
</commit_message>
<xml_diff>
--- a/manuscript/volume-1/sacrae-preces-volume-1.docx
+++ b/manuscript/volume-1/sacrae-preces-volume-1.docx
@@ -323,6 +323,10 @@
     <w:p>
       <w:pPr>
         <w:pStyle w:val="SPPrayerLatin"/>
+        <w:rPr>
+          <w:i w:val="0"/>
+          <w:iCs/>
+        </w:rPr>
         <w:sectPr>
           <w:type w:val="oddPage"/>
           <w:pgSz w:w="7920" w:h="12240" w:code="6"/>
@@ -335,6 +339,8 @@
       <w:r>
         <w:rPr>
           <w:rFonts w:ascii="Segoe UI Symbol" w:hAnsi="Segoe UI Symbol" w:cs="Segoe UI Symbol"/>
+          <w:i w:val="0"/>
+          <w:iCs/>
         </w:rPr>
         <w:t>✠</w:t>
       </w:r>
@@ -1136,7 +1142,7 @@
       </w:pPr>
       <w:r>
         <w:pict w14:anchorId="249FE732">
-          <v:rect id="_x0000_i1076" style="width:0;height:1.5pt" o:hralign="center" o:hrstd="t" o:hr="t" fillcolor="#a0a0a0" stroked="f"/>
+          <v:rect id="_x0000_i1145" style="width:0;height:1.5pt" o:hralign="center" o:hrstd="t" o:hr="t" fillcolor="#a0a0a0" stroked="f"/>
         </w:pict>
       </w:r>
     </w:p>
@@ -1205,7 +1211,7 @@
       </w:pPr>
       <w:r>
         <w:pict w14:anchorId="25751FDD">
-          <v:rect id="_x0000_i1077" style="width:0;height:1.5pt" o:hralign="center" o:hrstd="t" o:hr="t" fillcolor="#a0a0a0" stroked="f"/>
+          <v:rect id="_x0000_i1146" style="width:0;height:1.5pt" o:hralign="center" o:hrstd="t" o:hr="t" fillcolor="#a0a0a0" stroked="f"/>
         </w:pict>
       </w:r>
     </w:p>
@@ -1271,7 +1277,7 @@
       </w:pPr>
       <w:r>
         <w:pict w14:anchorId="19542BB1">
-          <v:rect id="_x0000_i1078" style="width:0;height:1.5pt" o:hralign="center" o:hrstd="t" o:hr="t" fillcolor="#a0a0a0" stroked="f"/>
+          <v:rect id="_x0000_i1147" style="width:0;height:1.5pt" o:hralign="center" o:hrstd="t" o:hr="t" fillcolor="#a0a0a0" stroked="f"/>
         </w:pict>
       </w:r>
     </w:p>
@@ -1338,7 +1344,7 @@
       </w:pPr>
       <w:r>
         <w:pict w14:anchorId="4D1CE6F0">
-          <v:rect id="_x0000_i1079" style="width:0;height:1.5pt" o:hralign="center" o:hrstd="t" o:hr="t" fillcolor="#a0a0a0" stroked="f"/>
+          <v:rect id="_x0000_i1148" style="width:0;height:1.5pt" o:hralign="center" o:hrstd="t" o:hr="t" fillcolor="#a0a0a0" stroked="f"/>
         </w:pict>
       </w:r>
     </w:p>
@@ -1441,7 +1447,7 @@
       </w:pPr>
       <w:r>
         <w:pict w14:anchorId="68D46385">
-          <v:rect id="_x0000_i1080" style="width:0;height:1.5pt" o:hralign="center" o:hrstd="t" o:hr="t" fillcolor="#a0a0a0" stroked="f"/>
+          <v:rect id="_x0000_i1149" style="width:0;height:1.5pt" o:hralign="center" o:hrstd="t" o:hr="t" fillcolor="#a0a0a0" stroked="f"/>
         </w:pict>
       </w:r>
     </w:p>
@@ -1570,7 +1576,7 @@
       </w:pPr>
       <w:r>
         <w:pict w14:anchorId="36FAD975">
-          <v:rect id="_x0000_i1081" style="width:0;height:1.5pt" o:hralign="center" o:hrstd="t" o:hr="t" fillcolor="#a0a0a0" stroked="f"/>
+          <v:rect id="_x0000_i1150" style="width:0;height:1.5pt" o:hralign="center" o:hrstd="t" o:hr="t" fillcolor="#a0a0a0" stroked="f"/>
         </w:pict>
       </w:r>
     </w:p>
@@ -1688,12 +1694,8 @@
     <w:p>
       <w:pPr>
         <w:pStyle w:val="SPBodyText"/>
-      </w:pPr>
-      <w:proofErr w:type="spellStart"/>
-      <w:r>
-        <w:t>tt</w:t>
-      </w:r>
-      <w:proofErr w:type="spellEnd"/>
+        <w:ind w:left="0" w:firstLine="0"/>
+      </w:pPr>
     </w:p>
     <w:p>
       <w:pPr>
@@ -1729,6 +1731,36 @@
         </w:rPr>
         <w:t>✠</w:t>
       </w:r>
+    </w:p>
+    <w:p>
+      <w:pPr>
+        <w:pStyle w:val="SPSectionHeading"/>
+      </w:pPr>
+      <w:r>
+        <w:lastRenderedPageBreak/>
+        <w:tab/>
+      </w:r>
+      <w:r>
+        <w:t>Part I — Basic Prayers</w:t>
+      </w:r>
+      <w:r>
+        <w:tab/>
+      </w:r>
+    </w:p>
+    <w:p>
+      <w:pPr>
+        <w:rPr>
+          <w:rFonts w:ascii="Segoe UI Symbol" w:hAnsi="Segoe UI Symbol" w:cs="Segoe UI Symbol"/>
+        </w:rPr>
+        <w:sectPr>
+          <w:type w:val="oddPage"/>
+          <w:pgSz w:w="7920" w:h="12240" w:code="6"/>
+          <w:pgMar w:top="1080" w:right="864" w:bottom="1080" w:left="1152" w:header="576" w:footer="576" w:gutter="0"/>
+          <w:cols w:space="720"/>
+          <w:titlePg/>
+          <w:docGrid w:linePitch="360"/>
+        </w:sectPr>
+      </w:pPr>
     </w:p>
     <w:p>
       <w:pPr>
@@ -1805,6 +1837,11 @@
       <w:pPr>
         <w:pStyle w:val="SPPrayerEnglish"/>
       </w:pPr>
+    </w:p>
+    <w:p>
+      <w:pPr>
+        <w:pStyle w:val="SPPrayerEnglish"/>
+      </w:pPr>
       <w:r>
         <w:t xml:space="preserve">In the name of the Father, </w:t>
       </w:r>
@@ -1854,6 +1891,11 @@
       <w:pPr>
         <w:pStyle w:val="SPPrayerLatin"/>
       </w:pPr>
+    </w:p>
+    <w:p>
+      <w:pPr>
+        <w:pStyle w:val="SPPrayerLatin"/>
+      </w:pPr>
       <w:r>
         <w:t xml:space="preserve"> In </w:t>
       </w:r>
@@ -4362,9 +4404,6 @@
         </w:rPr>
         <w:t>Ephesians 3:21</w:t>
       </w:r>
-      <w:r>
-        <w:t>:</w:t>
-      </w:r>
     </w:p>
     <w:p>
       <w:pPr>
@@ -4400,9 +4439,6 @@
         </w:rPr>
         <w:t>Romans 11:36</w:t>
       </w:r>
-      <w:r>
-        <w:t>:</w:t>
-      </w:r>
     </w:p>
     <w:p>
       <w:pPr>
@@ -4422,9 +4458,6 @@
         </w:rPr>
         <w:t>1 Timothy 1:17</w:t>
       </w:r>
-      <w:r>
-        <w:t>:</w:t>
-      </w:r>
     </w:p>
     <w:p>
       <w:pPr>
@@ -4459,12 +4492,6 @@
           <w:bCs/>
         </w:rPr>
         <w:t>Revelation 1:5-6</w:t>
-      </w:r>
-      <w:r>
-        <w:t>:</w:t>
-      </w:r>
-      <w:r>
-        <w:t xml:space="preserve"> </w:t>
       </w:r>
     </w:p>
     <w:p>
@@ -5721,6 +5748,765 @@
         </w:rPr>
       </w:pPr>
       <w:r>
+        <w:lastRenderedPageBreak/>
+        <w:tab/>
+      </w:r>
+      <w:r>
+        <w:rPr>
+          <w:rFonts w:ascii="Segoe UI Symbol" w:hAnsi="Segoe UI Symbol" w:cs="Segoe UI Symbol"/>
+        </w:rPr>
+        <w:t>✠</w:t>
+      </w:r>
+    </w:p>
+    <w:p>
+      <w:pPr>
+        <w:pStyle w:val="SPBodyText"/>
+        <w:jc w:val="center"/>
+        <w:rPr>
+          <w:rFonts w:ascii="Segoe UI Symbol" w:hAnsi="Segoe UI Symbol" w:cs="Segoe UI Symbol"/>
+        </w:rPr>
+      </w:pPr>
+    </w:p>
+    <w:p>
+      <w:pPr>
+        <w:pStyle w:val="SPPrayerTitle"/>
+      </w:pPr>
+      <w:r>
+        <w:t>Act of Contrition</w:t>
+      </w:r>
+    </w:p>
+    <w:p>
+      <w:pPr>
+        <w:pStyle w:val="SPPrayerTitle"/>
+      </w:pPr>
+    </w:p>
+    <w:p>
+      <w:pPr>
+        <w:pStyle w:val="SPBodyText"/>
+        <w:sectPr>
+          <w:type w:val="oddPage"/>
+          <w:pgSz w:w="7920" w:h="12240" w:code="6"/>
+          <w:pgMar w:top="1080" w:right="864" w:bottom="1080" w:left="1152" w:header="576" w:footer="576" w:gutter="0"/>
+          <w:cols w:space="720"/>
+          <w:titlePg/>
+          <w:docGrid w:linePitch="360"/>
+        </w:sectPr>
+      </w:pPr>
+    </w:p>
+    <w:p>
+      <w:pPr>
+        <w:pStyle w:val="SPLanguage"/>
+        <w:spacing w:before="200"/>
+      </w:pPr>
+      <w:r>
+        <w:lastRenderedPageBreak/>
+        <w:t xml:space="preserve">ENGLISH </w:t>
+      </w:r>
+    </w:p>
+    <w:p>
+      <w:pPr>
+        <w:pStyle w:val="SPLanguage"/>
+      </w:pPr>
+    </w:p>
+    <w:p>
+      <w:pPr>
+        <w:pStyle w:val="SPPrayerEnglish"/>
+      </w:pPr>
+      <w:r>
+        <w:t xml:space="preserve">O my God, I am heartily sorry for having offended you and I detest all my sins, </w:t>
+      </w:r>
+    </w:p>
+    <w:p>
+      <w:pPr>
+        <w:pStyle w:val="SPPrayerEnglish"/>
+      </w:pPr>
+      <w:r>
+        <w:t xml:space="preserve">because I dread the loss of heaven and the pains of hell, </w:t>
+      </w:r>
+    </w:p>
+    <w:p>
+      <w:pPr>
+        <w:pStyle w:val="SPPrayerEnglish"/>
+      </w:pPr>
+      <w:r>
+        <w:t xml:space="preserve">but most of all because they offend you, my God, who are all good and deserving of all my love. </w:t>
+      </w:r>
+    </w:p>
+    <w:p>
+      <w:pPr>
+        <w:pStyle w:val="SPPrayerEnglish"/>
+      </w:pPr>
+      <w:r>
+        <w:t xml:space="preserve">I firmly resolve, with the help of your grace, to confess my sins, to do penance, and to amend my life. </w:t>
+      </w:r>
+    </w:p>
+    <w:p>
+      <w:pPr>
+        <w:pStyle w:val="SPPrayerEnglish"/>
+      </w:pPr>
+    </w:p>
+    <w:p>
+      <w:pPr>
+        <w:pStyle w:val="SPPrayerEnglish"/>
+        <w:sectPr>
+          <w:type w:val="evenPage"/>
+          <w:pgSz w:w="7920" w:h="12240" w:code="6"/>
+          <w:pgMar w:top="1080" w:right="864" w:bottom="1080" w:left="1152" w:header="576" w:footer="576" w:gutter="0"/>
+          <w:cols w:space="720"/>
+          <w:titlePg/>
+          <w:docGrid w:linePitch="360"/>
+        </w:sectPr>
+      </w:pPr>
+      <w:r>
+        <w:t>Amen.</w:t>
+      </w:r>
+      <w:r>
+        <w:t xml:space="preserve"> </w:t>
+      </w:r>
+    </w:p>
+    <w:p>
+      <w:pPr>
+        <w:pStyle w:val="SPLanguage"/>
+      </w:pPr>
+      <w:r>
+        <w:lastRenderedPageBreak/>
+        <w:t>LATIN</w:t>
+      </w:r>
+    </w:p>
+    <w:p>
+      <w:pPr>
+        <w:pStyle w:val="SPLanguage"/>
+      </w:pPr>
+    </w:p>
+    <w:p>
+      <w:pPr>
+        <w:pStyle w:val="SPPrayerLatin"/>
+        <w:rPr>
+          <w:iCs/>
+        </w:rPr>
+      </w:pPr>
+      <w:r>
+        <w:rPr>
+          <w:iCs/>
+        </w:rPr>
+        <w:t xml:space="preserve">O mi Deus, corde </w:t>
+      </w:r>
+      <w:proofErr w:type="spellStart"/>
+      <w:r>
+        <w:rPr>
+          <w:iCs/>
+        </w:rPr>
+        <w:t>poenitet</w:t>
+      </w:r>
+      <w:proofErr w:type="spellEnd"/>
+      <w:r>
+        <w:rPr>
+          <w:iCs/>
+        </w:rPr>
+        <w:t xml:space="preserve"> me omnium </w:t>
+      </w:r>
+      <w:proofErr w:type="spellStart"/>
+      <w:r>
+        <w:rPr>
+          <w:iCs/>
+        </w:rPr>
+        <w:t>meorum</w:t>
+      </w:r>
+      <w:proofErr w:type="spellEnd"/>
+      <w:r>
+        <w:rPr>
+          <w:iCs/>
+        </w:rPr>
+        <w:t xml:space="preserve"> </w:t>
+      </w:r>
+      <w:proofErr w:type="spellStart"/>
+      <w:r>
+        <w:rPr>
+          <w:iCs/>
+        </w:rPr>
+        <w:t>peccatorum</w:t>
+      </w:r>
+      <w:proofErr w:type="spellEnd"/>
+      <w:r>
+        <w:rPr>
+          <w:iCs/>
+        </w:rPr>
+        <w:t xml:space="preserve">, et </w:t>
+      </w:r>
+      <w:proofErr w:type="spellStart"/>
+      <w:r>
+        <w:rPr>
+          <w:iCs/>
+        </w:rPr>
+        <w:t>detestor</w:t>
+      </w:r>
+      <w:proofErr w:type="spellEnd"/>
+      <w:r>
+        <w:rPr>
+          <w:iCs/>
+        </w:rPr>
+        <w:t xml:space="preserve"> </w:t>
+      </w:r>
+      <w:proofErr w:type="spellStart"/>
+      <w:r>
+        <w:rPr>
+          <w:iCs/>
+        </w:rPr>
+        <w:t>ea</w:t>
+      </w:r>
+      <w:proofErr w:type="spellEnd"/>
+      <w:r>
+        <w:rPr>
+          <w:iCs/>
+        </w:rPr>
+        <w:t xml:space="preserve">, </w:t>
+      </w:r>
+    </w:p>
+    <w:p>
+      <w:pPr>
+        <w:pStyle w:val="SPPrayerLatin"/>
+        <w:rPr>
+          <w:iCs/>
+        </w:rPr>
+      </w:pPr>
+      <w:proofErr w:type="spellStart"/>
+      <w:r>
+        <w:rPr>
+          <w:iCs/>
+        </w:rPr>
+        <w:t>vere</w:t>
+      </w:r>
+      <w:proofErr w:type="spellEnd"/>
+      <w:r>
+        <w:rPr>
+          <w:iCs/>
+        </w:rPr>
+        <w:t xml:space="preserve"> </w:t>
+      </w:r>
+      <w:proofErr w:type="spellStart"/>
+      <w:r>
+        <w:rPr>
+          <w:iCs/>
+        </w:rPr>
+        <w:t>poenitet</w:t>
+      </w:r>
+      <w:proofErr w:type="spellEnd"/>
+      <w:r>
+        <w:rPr>
+          <w:iCs/>
+        </w:rPr>
+        <w:t xml:space="preserve"> me, quia </w:t>
+      </w:r>
+      <w:proofErr w:type="spellStart"/>
+      <w:r>
+        <w:rPr>
+          <w:iCs/>
+        </w:rPr>
+        <w:t>peccando</w:t>
+      </w:r>
+      <w:proofErr w:type="spellEnd"/>
+      <w:r>
+        <w:rPr>
+          <w:iCs/>
+        </w:rPr>
+        <w:t xml:space="preserve">, non solum </w:t>
+      </w:r>
+      <w:proofErr w:type="spellStart"/>
+      <w:r>
+        <w:rPr>
+          <w:iCs/>
+        </w:rPr>
+        <w:t>poenas</w:t>
+      </w:r>
+      <w:proofErr w:type="spellEnd"/>
+      <w:r>
+        <w:rPr>
+          <w:iCs/>
+        </w:rPr>
+        <w:t xml:space="preserve"> a </w:t>
+      </w:r>
+      <w:proofErr w:type="spellStart"/>
+      <w:r>
+        <w:rPr>
+          <w:iCs/>
+        </w:rPr>
+        <w:t>te</w:t>
+      </w:r>
+      <w:proofErr w:type="spellEnd"/>
+      <w:r>
+        <w:rPr>
+          <w:iCs/>
+        </w:rPr>
+        <w:t xml:space="preserve"> </w:t>
+      </w:r>
+      <w:proofErr w:type="spellStart"/>
+      <w:r>
+        <w:rPr>
+          <w:iCs/>
+        </w:rPr>
+        <w:t>iuste</w:t>
+      </w:r>
+      <w:proofErr w:type="spellEnd"/>
+      <w:r>
+        <w:rPr>
+          <w:iCs/>
+        </w:rPr>
+        <w:t xml:space="preserve"> </w:t>
+      </w:r>
+      <w:proofErr w:type="spellStart"/>
+      <w:r>
+        <w:rPr>
+          <w:iCs/>
+        </w:rPr>
+        <w:t>statutas</w:t>
+      </w:r>
+      <w:proofErr w:type="spellEnd"/>
+      <w:r>
+        <w:rPr>
+          <w:iCs/>
+        </w:rPr>
+        <w:t xml:space="preserve"> </w:t>
+      </w:r>
+      <w:proofErr w:type="spellStart"/>
+      <w:r>
+        <w:rPr>
+          <w:iCs/>
+        </w:rPr>
+        <w:t>promeritus</w:t>
+      </w:r>
+      <w:proofErr w:type="spellEnd"/>
+      <w:r>
+        <w:rPr>
+          <w:iCs/>
+        </w:rPr>
+        <w:t xml:space="preserve"> sum, </w:t>
+      </w:r>
+    </w:p>
+    <w:p>
+      <w:pPr>
+        <w:pStyle w:val="SPPrayerLatin"/>
+        <w:rPr>
+          <w:iCs/>
+        </w:rPr>
+      </w:pPr>
+      <w:proofErr w:type="spellStart"/>
+      <w:r>
+        <w:rPr>
+          <w:iCs/>
+        </w:rPr>
+        <w:t>sed</w:t>
+      </w:r>
+      <w:proofErr w:type="spellEnd"/>
+      <w:r>
+        <w:rPr>
+          <w:iCs/>
+        </w:rPr>
+        <w:t xml:space="preserve"> </w:t>
+      </w:r>
+      <w:proofErr w:type="spellStart"/>
+      <w:r>
+        <w:rPr>
+          <w:iCs/>
+        </w:rPr>
+        <w:t>praesertim</w:t>
+      </w:r>
+      <w:proofErr w:type="spellEnd"/>
+      <w:r>
+        <w:rPr>
+          <w:iCs/>
+        </w:rPr>
+        <w:t xml:space="preserve"> quia </w:t>
+      </w:r>
+      <w:proofErr w:type="spellStart"/>
+      <w:r>
+        <w:rPr>
+          <w:iCs/>
+        </w:rPr>
+        <w:t>offendi</w:t>
+      </w:r>
+      <w:proofErr w:type="spellEnd"/>
+      <w:r>
+        <w:rPr>
+          <w:iCs/>
+        </w:rPr>
+        <w:t xml:space="preserve"> </w:t>
+      </w:r>
+      <w:proofErr w:type="spellStart"/>
+      <w:r>
+        <w:rPr>
+          <w:iCs/>
+        </w:rPr>
+        <w:t>te</w:t>
+      </w:r>
+      <w:proofErr w:type="spellEnd"/>
+      <w:r>
+        <w:rPr>
+          <w:iCs/>
+        </w:rPr>
+        <w:t xml:space="preserve">, summum bonum, ac </w:t>
+      </w:r>
+      <w:proofErr w:type="spellStart"/>
+      <w:r>
+        <w:rPr>
+          <w:iCs/>
+        </w:rPr>
+        <w:t>dignum</w:t>
+      </w:r>
+      <w:proofErr w:type="spellEnd"/>
+      <w:r>
+        <w:rPr>
+          <w:iCs/>
+        </w:rPr>
+        <w:t xml:space="preserve"> qui super omnia </w:t>
+      </w:r>
+      <w:proofErr w:type="spellStart"/>
+      <w:r>
+        <w:rPr>
+          <w:iCs/>
+        </w:rPr>
+        <w:t>diligaris</w:t>
+      </w:r>
+      <w:proofErr w:type="spellEnd"/>
+      <w:r>
+        <w:rPr>
+          <w:iCs/>
+        </w:rPr>
+        <w:t xml:space="preserve">. </w:t>
+      </w:r>
+    </w:p>
+    <w:p>
+      <w:pPr>
+        <w:pStyle w:val="SPPrayerLatin"/>
+        <w:rPr>
+          <w:iCs/>
+        </w:rPr>
+      </w:pPr>
+      <w:proofErr w:type="spellStart"/>
+      <w:r>
+        <w:rPr>
+          <w:iCs/>
+        </w:rPr>
+        <w:t>Ideo</w:t>
+      </w:r>
+      <w:proofErr w:type="spellEnd"/>
+      <w:r>
+        <w:rPr>
+          <w:iCs/>
+        </w:rPr>
+        <w:t xml:space="preserve"> </w:t>
+      </w:r>
+      <w:proofErr w:type="spellStart"/>
+      <w:r>
+        <w:rPr>
+          <w:iCs/>
+        </w:rPr>
+        <w:t>firmiter</w:t>
+      </w:r>
+      <w:proofErr w:type="spellEnd"/>
+      <w:r>
+        <w:rPr>
+          <w:iCs/>
+        </w:rPr>
+        <w:t xml:space="preserve"> </w:t>
+      </w:r>
+      <w:proofErr w:type="spellStart"/>
+      <w:r>
+        <w:rPr>
+          <w:iCs/>
+        </w:rPr>
+        <w:t>propositum</w:t>
+      </w:r>
+      <w:proofErr w:type="spellEnd"/>
+      <w:r>
+        <w:rPr>
+          <w:iCs/>
+        </w:rPr>
+        <w:t xml:space="preserve"> </w:t>
+      </w:r>
+      <w:proofErr w:type="spellStart"/>
+      <w:r>
+        <w:rPr>
+          <w:iCs/>
+        </w:rPr>
+        <w:t>facio</w:t>
+      </w:r>
+      <w:proofErr w:type="spellEnd"/>
+      <w:r>
+        <w:rPr>
+          <w:iCs/>
+        </w:rPr>
+        <w:t xml:space="preserve">, </w:t>
+      </w:r>
+      <w:proofErr w:type="spellStart"/>
+      <w:r>
+        <w:rPr>
+          <w:iCs/>
+        </w:rPr>
+        <w:t>adiuvante</w:t>
+      </w:r>
+      <w:proofErr w:type="spellEnd"/>
+      <w:r>
+        <w:rPr>
+          <w:iCs/>
+        </w:rPr>
+        <w:t xml:space="preserve"> gratia </w:t>
+      </w:r>
+      <w:proofErr w:type="spellStart"/>
+      <w:r>
+        <w:rPr>
+          <w:iCs/>
+        </w:rPr>
+        <w:t>tua</w:t>
+      </w:r>
+      <w:proofErr w:type="spellEnd"/>
+      <w:r>
+        <w:rPr>
+          <w:iCs/>
+        </w:rPr>
+        <w:t xml:space="preserve">, de </w:t>
+      </w:r>
+      <w:proofErr w:type="spellStart"/>
+      <w:r>
+        <w:rPr>
+          <w:iCs/>
+        </w:rPr>
+        <w:t>cetero</w:t>
+      </w:r>
+      <w:proofErr w:type="spellEnd"/>
+      <w:r>
+        <w:rPr>
+          <w:iCs/>
+        </w:rPr>
+        <w:t xml:space="preserve"> me non </w:t>
+      </w:r>
+      <w:proofErr w:type="spellStart"/>
+      <w:r>
+        <w:rPr>
+          <w:iCs/>
+        </w:rPr>
+        <w:t>peccaturum</w:t>
+      </w:r>
+      <w:proofErr w:type="spellEnd"/>
+      <w:r>
+        <w:rPr>
+          <w:iCs/>
+        </w:rPr>
+        <w:t xml:space="preserve"> </w:t>
+      </w:r>
+      <w:proofErr w:type="spellStart"/>
+      <w:r>
+        <w:rPr>
+          <w:iCs/>
+        </w:rPr>
+        <w:t>peccandique</w:t>
+      </w:r>
+      <w:proofErr w:type="spellEnd"/>
+      <w:r>
+        <w:rPr>
+          <w:iCs/>
+        </w:rPr>
+        <w:t xml:space="preserve"> </w:t>
+      </w:r>
+      <w:proofErr w:type="spellStart"/>
+      <w:r>
+        <w:rPr>
+          <w:iCs/>
+        </w:rPr>
+        <w:t>occasiones</w:t>
+      </w:r>
+      <w:proofErr w:type="spellEnd"/>
+      <w:r>
+        <w:rPr>
+          <w:iCs/>
+        </w:rPr>
+        <w:t xml:space="preserve"> </w:t>
+      </w:r>
+      <w:proofErr w:type="spellStart"/>
+      <w:r>
+        <w:rPr>
+          <w:iCs/>
+        </w:rPr>
+        <w:t>proximas</w:t>
+      </w:r>
+      <w:proofErr w:type="spellEnd"/>
+      <w:r>
+        <w:rPr>
+          <w:iCs/>
+        </w:rPr>
+        <w:t xml:space="preserve"> </w:t>
+      </w:r>
+      <w:proofErr w:type="spellStart"/>
+      <w:r>
+        <w:rPr>
+          <w:iCs/>
+        </w:rPr>
+        <w:t>fugiturum</w:t>
+      </w:r>
+      <w:proofErr w:type="spellEnd"/>
+      <w:r>
+        <w:rPr>
+          <w:iCs/>
+        </w:rPr>
+        <w:t xml:space="preserve">. </w:t>
+      </w:r>
+    </w:p>
+    <w:p>
+      <w:pPr>
+        <w:pStyle w:val="SPPrayerLatin"/>
+        <w:rPr>
+          <w:iCs/>
+        </w:rPr>
+      </w:pPr>
+    </w:p>
+    <w:p>
+      <w:pPr>
+        <w:pStyle w:val="SPPrayerLatin"/>
+      </w:pPr>
+      <w:r>
+        <w:rPr>
+          <w:iCs/>
+        </w:rPr>
+        <w:t>Amen.</w:t>
+      </w:r>
+    </w:p>
+    <w:p>
+      <w:pPr>
+        <w:pStyle w:val="SPPrayerEnglish"/>
+      </w:pPr>
+      <w:r>
+        <w:br/>
+      </w:r>
+    </w:p>
+    <w:p>
+      <w:pPr>
+        <w:pStyle w:val="SPPrayerEnglish"/>
+      </w:pPr>
+      <w:r>
+        <w:br/>
+      </w:r>
+      <w:r>
+        <w:br w:type="page"/>
+      </w:r>
+    </w:p>
+    <w:p>
+      <w:pPr>
+        <w:tabs>
+          <w:tab w:val="left" w:pos="1980"/>
+        </w:tabs>
+        <w:ind w:left="0"/>
+        <w:sectPr>
+          <w:type w:val="oddPage"/>
+          <w:pgSz w:w="7920" w:h="12240" w:code="6"/>
+          <w:pgMar w:top="1080" w:right="864" w:bottom="1080" w:left="1152" w:header="576" w:footer="576" w:gutter="0"/>
+          <w:cols w:space="720"/>
+          <w:titlePg/>
+          <w:docGrid w:linePitch="360"/>
+        </w:sectPr>
+      </w:pPr>
+    </w:p>
+    <w:p>
+      <w:pPr>
+        <w:pStyle w:val="SPSectionTitle"/>
+      </w:pPr>
+      <w:r>
+        <w:lastRenderedPageBreak/>
+        <w:t>Scripture</w:t>
+      </w:r>
+    </w:p>
+    <w:p>
+      <w:pPr>
+        <w:pStyle w:val="SPScripture"/>
+      </w:pPr>
+      <w:r>
+        <w:t xml:space="preserve"> </w:t>
+      </w:r>
+    </w:p>
+    <w:p>
+      <w:pPr>
+        <w:pStyle w:val="SPScriptureReference"/>
+        <w:sectPr>
+          <w:type w:val="evenPage"/>
+          <w:pgSz w:w="7920" w:h="12240" w:code="6"/>
+          <w:pgMar w:top="1080" w:right="864" w:bottom="1080" w:left="1152" w:header="576" w:footer="576" w:gutter="0"/>
+          <w:cols w:space="720"/>
+          <w:titlePg/>
+          <w:docGrid w:linePitch="360"/>
+        </w:sectPr>
+      </w:pPr>
+      <w:r>
+        <w:t>Luke EG</w:t>
+      </w:r>
+    </w:p>
+    <w:p>
+      <w:pPr>
+        <w:pStyle w:val="SPSectionTitle"/>
+      </w:pPr>
+      <w:r>
+        <w:lastRenderedPageBreak/>
+        <w:t>Reflection</w:t>
+      </w:r>
+    </w:p>
+    <w:p>
+      <w:pPr>
+        <w:tabs>
+          <w:tab w:val="left" w:pos="1980"/>
+        </w:tabs>
+        <w:ind w:left="0"/>
+        <w:sectPr>
+          <w:type w:val="oddPage"/>
+          <w:pgSz w:w="7920" w:h="12240" w:code="6"/>
+          <w:pgMar w:top="1080" w:right="864" w:bottom="1080" w:left="1152" w:header="576" w:footer="576" w:gutter="0"/>
+          <w:cols w:space="720"/>
+          <w:titlePg/>
+          <w:docGrid w:linePitch="360"/>
+        </w:sectPr>
+      </w:pPr>
+    </w:p>
+    <w:p>
+      <w:pPr>
+        <w:pStyle w:val="SPSectionHeading"/>
+      </w:pPr>
+      <w:r>
+        <w:lastRenderedPageBreak/>
+        <w:t xml:space="preserve">Part </w:t>
+      </w:r>
+      <w:r>
+        <w:t>II</w:t>
+      </w:r>
+      <w:r>
+        <w:t xml:space="preserve"> </w:t>
+      </w:r>
+      <w:r>
+        <w:t>- Gospel canticles</w:t>
+      </w:r>
+    </w:p>
+    <w:p>
+      <w:pPr>
+        <w:tabs>
+          <w:tab w:val="left" w:pos="1425"/>
+        </w:tabs>
+        <w:sectPr>
+          <w:type w:val="oddPage"/>
+          <w:pgSz w:w="7920" w:h="12240" w:code="6"/>
+          <w:pgMar w:top="1080" w:right="864" w:bottom="1080" w:left="1152" w:header="576" w:footer="576" w:gutter="0"/>
+          <w:cols w:space="720"/>
+          <w:titlePg/>
+          <w:docGrid w:linePitch="360"/>
+        </w:sectPr>
+      </w:pPr>
+      <w:r>
+        <w:tab/>
+      </w:r>
+    </w:p>
+    <w:p>
+      <w:pPr>
+        <w:pStyle w:val="SPBodyText"/>
+        <w:jc w:val="center"/>
+        <w:rPr>
+          <w:rFonts w:ascii="Segoe UI Symbol" w:hAnsi="Segoe UI Symbol" w:cs="Segoe UI Symbol"/>
+        </w:rPr>
+      </w:pPr>
+      <w:r>
         <w:rPr>
           <w:rFonts w:ascii="Segoe UI Symbol" w:hAnsi="Segoe UI Symbol" w:cs="Segoe UI Symbol"/>
         </w:rPr>
@@ -5894,6 +6680,14 @@
     <w:p>
       <w:pPr>
         <w:pStyle w:val="SPPrayerEnglish"/>
+        <w:sectPr>
+          <w:type w:val="evenPage"/>
+          <w:pgSz w:w="7920" w:h="12240" w:code="6"/>
+          <w:pgMar w:top="1080" w:right="864" w:bottom="1080" w:left="1152" w:header="576" w:footer="576" w:gutter="0"/>
+          <w:cols w:space="720"/>
+          <w:titlePg/>
+          <w:docGrid w:linePitch="360"/>
+        </w:sectPr>
       </w:pPr>
       <w:r>
         <w:t>T</w:t>
@@ -5925,23 +6719,15 @@
     </w:p>
     <w:p>
       <w:pPr>
-        <w:pStyle w:val="SPPrayerEnglish"/>
-      </w:pPr>
-      <w:r>
-        <w:br/>
-      </w:r>
-      <w:r>
-        <w:br w:type="page"/>
-      </w:r>
-    </w:p>
-    <w:p>
-      <w:pPr>
         <w:pStyle w:val="SPLanguage"/>
       </w:pPr>
       <w:r>
         <w:lastRenderedPageBreak/>
         <w:t>LATIN</w:t>
       </w:r>
+      <w:r>
+        <w:t xml:space="preserve"> </w:t>
+      </w:r>
     </w:p>
     <w:p>
       <w:pPr>
@@ -6299,6 +7085,14 @@
     <w:p>
       <w:pPr>
         <w:pStyle w:val="SPPrayerLatin"/>
+        <w:sectPr>
+          <w:type w:val="oddPage"/>
+          <w:pgSz w:w="7920" w:h="12240" w:code="6"/>
+          <w:pgMar w:top="1080" w:right="864" w:bottom="1080" w:left="1152" w:header="576" w:footer="576" w:gutter="0"/>
+          <w:cols w:space="720"/>
+          <w:titlePg/>
+          <w:docGrid w:linePitch="360"/>
+        </w:sectPr>
       </w:pPr>
       <w:r>
         <w:t xml:space="preserve">in </w:t>
@@ -6342,36 +7136,20 @@
     </w:p>
     <w:p>
       <w:pPr>
+        <w:pStyle w:val="SPLanguage"/>
+      </w:pPr>
+      <w:r>
+        <w:lastRenderedPageBreak/>
+        <w:t xml:space="preserve">ENGLISH </w:t>
+      </w:r>
+    </w:p>
+    <w:p>
+      <w:pPr>
         <w:pStyle w:val="SPPrayerEnglish"/>
         <w:rPr>
           <w:b/>
           <w:bCs/>
         </w:rPr>
-      </w:pPr>
-      <w:r>
-        <w:rPr>
-          <w:b/>
-          <w:bCs/>
-        </w:rPr>
-        <w:br w:type="page"/>
-      </w:r>
-    </w:p>
-    <w:p>
-      <w:pPr>
-        <w:pStyle w:val="SPPrayerEnglish"/>
-        <w:rPr>
-          <w:b/>
-          <w:bCs/>
-        </w:rPr>
-      </w:pPr>
-      <w:r>
-        <w:lastRenderedPageBreak/>
-        <w:t>ENGLISH</w:t>
-      </w:r>
-    </w:p>
-    <w:p>
-      <w:pPr>
-        <w:pStyle w:val="SPPrayerEnglish"/>
       </w:pPr>
       <w:r>
         <w:rPr>
@@ -6891,7 +7669,7 @@
         <w:pStyle w:val="SPScriptureReference"/>
       </w:pPr>
       <w:r>
-        <w:t>Luke 1:68-79:</w:t>
+        <w:t>Luke 1:68-79</w:t>
       </w:r>
     </w:p>
     <w:p>
@@ -7126,8 +7904,12 @@
       <w:pPr>
         <w:pStyle w:val="SPBodyText"/>
       </w:pPr>
-      <w:r>
-        <w:lastRenderedPageBreak/>
+    </w:p>
+    <w:p>
+      <w:pPr>
+        <w:pStyle w:val="SPBodyText"/>
+      </w:pPr>
+      <w:r>
         <w:t>Sometimes faith is lived in the space between promise and fulfilment.</w:t>
       </w:r>
     </w:p>
@@ -7307,6 +8089,11 @@
       <w:pPr>
         <w:pStyle w:val="SPBodyText"/>
       </w:pPr>
+    </w:p>
+    <w:p>
+      <w:pPr>
+        <w:pStyle w:val="SPBodyText"/>
+      </w:pPr>
       <w:r>
         <w:t xml:space="preserve">And </w:t>
       </w:r>
@@ -7330,7 +8117,6 @@
           <w:b/>
           <w:bCs/>
         </w:rPr>
-        <w:lastRenderedPageBreak/>
         <w:t>A Child Who Will Prepare the Way</w:t>
       </w:r>
     </w:p>
@@ -7467,6 +8253,11 @@
       <w:pPr>
         <w:pStyle w:val="SPBodyText"/>
       </w:pPr>
+    </w:p>
+    <w:p>
+      <w:pPr>
+        <w:pStyle w:val="SPBodyText"/>
+      </w:pPr>
       <w:r>
         <w:t xml:space="preserve">The coming of salvation is described through the </w:t>
       </w:r>
@@ -7494,7 +8285,6 @@
         <w:pStyle w:val="SPBodyText"/>
       </w:pPr>
       <w:r>
-        <w:lastRenderedPageBreak/>
         <w:t>He draws near.</w:t>
       </w:r>
     </w:p>
@@ -7651,6 +8441,11 @@
       <w:pPr>
         <w:pStyle w:val="SPBodyText"/>
       </w:pPr>
+    </w:p>
+    <w:p>
+      <w:pPr>
+        <w:pStyle w:val="SPBodyText"/>
+      </w:pPr>
       <w:r>
         <w:t>They ask for something simpler:</w:t>
       </w:r>
@@ -7688,7 +8483,6 @@
         <w:pStyle w:val="SPBodyText"/>
       </w:pPr>
       <w:r>
-        <w:lastRenderedPageBreak/>
         <w:t>That may be all we need.</w:t>
       </w:r>
     </w:p>
@@ -7834,6 +8628,11 @@
       <w:pPr>
         <w:pStyle w:val="SPBodyText"/>
       </w:pPr>
+    </w:p>
+    <w:p>
+      <w:pPr>
+        <w:pStyle w:val="SPBodyText"/>
+      </w:pPr>
       <w:r>
         <w:t>But the dawn has come.</w:t>
       </w:r>
@@ -7857,38 +8656,25 @@
     <w:p>
       <w:pPr>
         <w:pStyle w:val="SPBodyText"/>
-      </w:pPr>
-    </w:p>
-    <w:p>
-      <w:pPr>
-        <w:pStyle w:val="SPBodyText"/>
-        <w:rPr>
-          <w:b/>
-          <w:bCs/>
-        </w:rPr>
-      </w:pPr>
-      <w:r>
-        <w:rPr>
-          <w:b/>
-          <w:bCs/>
-        </w:rPr>
-        <w:br w:type="page"/>
-      </w:r>
-    </w:p>
-    <w:p>
-      <w:pPr>
-        <w:pStyle w:val="SPBodyText"/>
-        <w:rPr>
-          <w:b/>
-          <w:bCs/>
-        </w:rPr>
-      </w:pPr>
-      <w:r>
-        <w:rPr>
-          <w:b/>
-          <w:bCs/>
-        </w:rPr>
-        <w:lastRenderedPageBreak/>
+        <w:rPr>
+          <w:b/>
+          <w:bCs/>
+        </w:rPr>
+      </w:pPr>
+    </w:p>
+    <w:p>
+      <w:pPr>
+        <w:pStyle w:val="SPBodyText"/>
+        <w:rPr>
+          <w:b/>
+          <w:bCs/>
+        </w:rPr>
+      </w:pPr>
+      <w:r>
+        <w:rPr>
+          <w:b/>
+          <w:bCs/>
+        </w:rPr>
         <w:t>A Prayer for the Morning</w:t>
       </w:r>
     </w:p>
@@ -8035,25 +8821,6 @@
         </w:rPr>
         <w:t>✠</w:t>
       </w:r>
-    </w:p>
-    <w:p>
-      <w:pPr>
-        <w:pStyle w:val="SPBodyText"/>
-        <w:jc w:val="center"/>
-      </w:pPr>
-    </w:p>
-    <w:p>
-      <w:pPr>
-        <w:pStyle w:val="SPBodyText"/>
-        <w:sectPr>
-          <w:type w:val="oddPage"/>
-          <w:pgSz w:w="7920" w:h="12240" w:code="6"/>
-          <w:pgMar w:top="1080" w:right="864" w:bottom="1080" w:left="1152" w:header="576" w:footer="576" w:gutter="0"/>
-          <w:cols w:space="720"/>
-          <w:titlePg/>
-          <w:docGrid w:linePitch="360"/>
-        </w:sectPr>
-      </w:pPr>
     </w:p>
     <w:p>
       <w:pPr>
@@ -8298,6 +9065,14 @@
     <w:p>
       <w:pPr>
         <w:pStyle w:val="SPPrayerEnglish"/>
+        <w:sectPr>
+          <w:type w:val="evenPage"/>
+          <w:pgSz w:w="7920" w:h="12240" w:code="6"/>
+          <w:pgMar w:top="1080" w:right="864" w:bottom="1080" w:left="1152" w:header="576" w:footer="576" w:gutter="0"/>
+          <w:cols w:space="720"/>
+          <w:titlePg/>
+          <w:docGrid w:linePitch="360"/>
+        </w:sectPr>
       </w:pPr>
       <w:r>
         <w:t>He has filled the hungry with good things,</w:t>
@@ -8306,17 +9081,6 @@
         <w:br/>
         <w:t>and the rich he has sent away empty.</w:t>
       </w:r>
-      <w:r>
-        <w:br/>
-      </w:r>
-    </w:p>
-    <w:p>
-      <w:pPr>
-        <w:pStyle w:val="SPPrayerEnglish"/>
-      </w:pPr>
-      <w:r>
-        <w:br w:type="page"/>
-      </w:r>
     </w:p>
     <w:p>
       <w:pPr>
@@ -8541,6 +9305,14 @@
     <w:p>
       <w:pPr>
         <w:pStyle w:val="SPPrayerLatin"/>
+        <w:sectPr>
+          <w:type w:val="oddPage"/>
+          <w:pgSz w:w="7920" w:h="12240" w:code="6"/>
+          <w:pgMar w:top="1080" w:right="864" w:bottom="1080" w:left="1152" w:header="576" w:footer="576" w:gutter="0"/>
+          <w:cols w:space="720"/>
+          <w:titlePg/>
+          <w:docGrid w:linePitch="360"/>
+        </w:sectPr>
       </w:pPr>
       <w:r>
         <w:br/>
@@ -8651,25 +9423,12 @@
     </w:p>
     <w:p>
       <w:pPr>
-        <w:pStyle w:val="SPPrayerEnglish"/>
-      </w:pPr>
-      <w:r>
-        <w:br w:type="page"/>
-      </w:r>
-    </w:p>
-    <w:p>
-      <w:pPr>
-        <w:pStyle w:val="SPPrayerEnglish"/>
+        <w:pStyle w:val="SPLanguage"/>
       </w:pPr>
       <w:r>
         <w:lastRenderedPageBreak/>
-        <w:t>ENGLISH</w:t>
-      </w:r>
-    </w:p>
-    <w:p>
-      <w:pPr>
-        <w:pStyle w:val="SPPrayerEnglish"/>
-      </w:pPr>
+        <w:t xml:space="preserve">ENGLISH </w:t>
+      </w:r>
     </w:p>
     <w:p>
       <w:pPr>
@@ -8709,11 +9468,14 @@
     </w:p>
     <w:p>
       <w:pPr>
+        <w:pStyle w:val="SPPrayerLatin"/>
+      </w:pPr>
+    </w:p>
+    <w:p>
+      <w:pPr>
         <w:pStyle w:val="SPPrayerEnglish"/>
-      </w:pPr>
-      <w:r>
-        <w:br/>
-      </w:r>
+        <w:jc w:val="both"/>
+      </w:pPr>
       <w:r>
         <w:br w:type="page"/>
       </w:r>
@@ -8744,12 +9506,6 @@
       <w:pPr>
         <w:pStyle w:val="SPPrayerLatin"/>
       </w:pPr>
-      <w:r>
-        <w:br/>
-      </w:r>
-      <w:r>
-        <w:br/>
-      </w:r>
       <w:proofErr w:type="spellStart"/>
       <w:r>
         <w:t>Depósuit</w:t>
@@ -9038,7 +9794,7 @@
         <w:t xml:space="preserve"> </w:t>
       </w:r>
       <w:r>
-        <w:t>Luke 1:46-55:</w:t>
+        <w:t>Luke 1:46-55</w:t>
       </w:r>
     </w:p>
     <w:p>
@@ -9977,8 +10733,35 @@
     </w:p>
     <w:p>
       <w:pPr>
-        <w:pStyle w:val="SPBodyText"/>
-        <w:jc w:val="center"/>
+        <w:pStyle w:val="SPSectionHeading"/>
+      </w:pPr>
+      <w:r>
+        <w:lastRenderedPageBreak/>
+        <w:t xml:space="preserve">Part </w:t>
+      </w:r>
+      <w:r>
+        <w:t>III</w:t>
+      </w:r>
+      <w:r>
+        <w:t xml:space="preserve"> </w:t>
+      </w:r>
+      <w:r>
+        <w:t>–</w:t>
+      </w:r>
+      <w:r>
+        <w:t xml:space="preserve"> </w:t>
+      </w:r>
+      <w:r>
+        <w:t>Devotional Prayers</w:t>
+      </w:r>
+    </w:p>
+    <w:p>
+      <w:pPr>
+        <w:pStyle w:val="SPBodyText"/>
+        <w:tabs>
+          <w:tab w:val="left" w:pos="2956"/>
+          <w:tab w:val="center" w:pos="3290"/>
+        </w:tabs>
         <w:rPr>
           <w:rFonts w:ascii="Segoe UI Symbol" w:hAnsi="Segoe UI Symbol" w:cs="Segoe UI Symbol"/>
         </w:rPr>
@@ -9987,217 +10770,11 @@
         <w:rPr>
           <w:rFonts w:ascii="Segoe UI Symbol" w:hAnsi="Segoe UI Symbol" w:cs="Segoe UI Symbol"/>
         </w:rPr>
-        <w:lastRenderedPageBreak/>
-        <w:t>✠</w:t>
-      </w:r>
-    </w:p>
-    <w:p>
-      <w:pPr>
-        <w:pStyle w:val="SPBodyText"/>
-        <w:jc w:val="center"/>
-        <w:rPr>
-          <w:rFonts w:ascii="Segoe UI Symbol" w:hAnsi="Segoe UI Symbol" w:cs="Segoe UI Symbol"/>
-        </w:rPr>
-      </w:pPr>
-    </w:p>
-    <w:p>
-      <w:pPr>
-        <w:pStyle w:val="SPPrayerTitle"/>
-      </w:pPr>
-      <w:r>
-        <w:t xml:space="preserve">The </w:t>
-      </w:r>
-      <w:r>
-        <w:t>Angelus</w:t>
-      </w:r>
-    </w:p>
-    <w:p>
-      <w:pPr>
-        <w:pStyle w:val="SPBodyText"/>
-      </w:pPr>
-    </w:p>
-    <w:p>
-      <w:pPr>
-        <w:pStyle w:val="SPBodyText"/>
-      </w:pPr>
-      <w:r>
-        <w:t xml:space="preserve">The Angelus is a traditional Catholic prayer that recalls the </w:t>
-      </w:r>
-      <w:r>
-        <w:rPr>
-          <w:b/>
-          <w:bCs/>
-        </w:rPr>
-        <w:t>Annunciation</w:t>
-      </w:r>
-      <w:r>
-        <w:t xml:space="preserve">, when the Angel Gabriel announced to Mary that she would become the </w:t>
-      </w:r>
-      <w:proofErr w:type="gramStart"/>
-      <w:r>
-        <w:t>Mother</w:t>
-      </w:r>
-      <w:proofErr w:type="gramEnd"/>
-      <w:r>
-        <w:t xml:space="preserve"> of the Son of God.</w:t>
-      </w:r>
-    </w:p>
-    <w:p>
-      <w:pPr>
-        <w:pStyle w:val="SPBodyText"/>
-      </w:pPr>
-      <w:r>
-        <w:t xml:space="preserve">Through three short verses and responses, the prayer leads us through the mystery of the </w:t>
-      </w:r>
-      <w:r>
-        <w:rPr>
-          <w:b/>
-          <w:bCs/>
-        </w:rPr>
-        <w:t>Incarnation</w:t>
-      </w:r>
-      <w:r>
-        <w:t>: Mary hears the message of the angel, gives her consent to God's will, and the Word becomes flesh.</w:t>
-      </w:r>
-    </w:p>
-    <w:p>
-      <w:pPr>
-        <w:pStyle w:val="SPBodyText"/>
-      </w:pPr>
-      <w:r>
-        <w:t xml:space="preserve">Traditionally, the Angelus is prayed </w:t>
-      </w:r>
-      <w:r>
-        <w:rPr>
-          <w:b/>
-          <w:bCs/>
-        </w:rPr>
-        <w:t>three times each day</w:t>
-      </w:r>
-      <w:r>
-        <w:t>:</w:t>
-      </w:r>
-      <w:r>
-        <w:t xml:space="preserve"> </w:t>
-      </w:r>
-      <w:r>
-        <w:rPr>
-          <w:b/>
-          <w:bCs/>
-        </w:rPr>
-        <w:t>in the morning, at noon, and in the evening.</w:t>
-      </w:r>
-    </w:p>
-    <w:p>
-      <w:pPr>
-        <w:pStyle w:val="SPBodyText"/>
-      </w:pPr>
-      <w:r>
-        <w:t xml:space="preserve">The repeated prayer invites us to pause </w:t>
-      </w:r>
-      <w:proofErr w:type="gramStart"/>
-      <w:r>
-        <w:t>in the midst of</w:t>
-      </w:r>
-      <w:proofErr w:type="gramEnd"/>
-      <w:r>
-        <w:t xml:space="preserve"> ordinary life and remember the mystery at the heart of our faith:</w:t>
-      </w:r>
-      <w:r>
-        <w:t xml:space="preserve"> </w:t>
-      </w:r>
-      <w:r>
-        <w:rPr>
-          <w:b/>
-          <w:bCs/>
-        </w:rPr>
-        <w:t xml:space="preserve">“And the Word was made </w:t>
-      </w:r>
-      <w:proofErr w:type="gramStart"/>
-      <w:r>
-        <w:rPr>
-          <w:b/>
-          <w:bCs/>
-        </w:rPr>
-        <w:t>flesh, and</w:t>
-      </w:r>
-      <w:proofErr w:type="gramEnd"/>
-      <w:r>
-        <w:rPr>
-          <w:b/>
-          <w:bCs/>
-        </w:rPr>
-        <w:t xml:space="preserve"> dwelt among us.”</w:t>
-      </w:r>
-    </w:p>
-    <w:p>
-      <w:pPr>
-        <w:pStyle w:val="SPBodyText"/>
-      </w:pPr>
-      <w:r>
-        <w:t xml:space="preserve">It is a call to remember that </w:t>
-      </w:r>
-      <w:r>
-        <w:rPr>
-          <w:b/>
-          <w:bCs/>
-        </w:rPr>
-        <w:t>God came among us</w:t>
-      </w:r>
-      <w:r>
-        <w:t xml:space="preserve">, and that Mary's </w:t>
-      </w:r>
-      <w:r>
-        <w:rPr>
-          <w:i/>
-          <w:iCs/>
-        </w:rPr>
-        <w:t>fiat</w:t>
-      </w:r>
-      <w:r>
-        <w:t xml:space="preserve"> — her “let it be done” — opened the way for the Word to take flesh.</w:t>
-      </w:r>
-    </w:p>
-    <w:p>
-      <w:pPr>
-        <w:pStyle w:val="SPBodyText"/>
-      </w:pPr>
-      <w:r>
-        <w:t>When we pray the Angelus, we join our prayer to Mary's response:</w:t>
-      </w:r>
-    </w:p>
-    <w:p>
-      <w:pPr>
-        <w:pStyle w:val="SPBodyText"/>
-        <w:rPr>
-          <w:b/>
-          <w:bCs/>
-        </w:rPr>
-      </w:pPr>
-    </w:p>
-    <w:p>
-      <w:pPr>
-        <w:pStyle w:val="SPBodyText"/>
-      </w:pPr>
-      <w:r>
-        <w:rPr>
-          <w:b/>
-          <w:bCs/>
-        </w:rPr>
-        <w:t>“Behold the handmaid of the Lord;</w:t>
-      </w:r>
-      <w:r>
-        <w:rPr>
-          <w:b/>
-          <w:bCs/>
-        </w:rPr>
-        <w:br/>
-        <w:t>be it done unto me according to your word.”</w:t>
-      </w:r>
-    </w:p>
-    <w:p>
-      <w:pPr>
-        <w:pStyle w:val="SPBodyText"/>
+        <w:tab/>
+      </w:r>
+    </w:p>
+    <w:p>
+      <w:pPr>
         <w:sectPr>
           <w:type w:val="oddPage"/>
           <w:pgSz w:w="7920" w:h="12240" w:code="6"/>
@@ -10210,338 +10787,217 @@
     </w:p>
     <w:p>
       <w:pPr>
-        <w:pStyle w:val="SPLanguage"/>
-      </w:pPr>
-      <w:r>
+        <w:pStyle w:val="SPBodyText"/>
+        <w:jc w:val="center"/>
+        <w:rPr>
+          <w:rFonts w:ascii="Segoe UI Symbol" w:hAnsi="Segoe UI Symbol" w:cs="Segoe UI Symbol"/>
+        </w:rPr>
+      </w:pPr>
+      <w:r>
+        <w:rPr>
+          <w:rFonts w:ascii="Segoe UI Symbol" w:hAnsi="Segoe UI Symbol" w:cs="Segoe UI Symbol"/>
+        </w:rPr>
         <w:lastRenderedPageBreak/>
-        <w:t xml:space="preserve">ENGLISH </w:t>
-      </w:r>
-    </w:p>
-    <w:p>
-      <w:pPr>
-        <w:pStyle w:val="SPLanguage"/>
-      </w:pPr>
-    </w:p>
-    <w:p>
-      <w:pPr>
-        <w:pStyle w:val="SPPrayerEnglish"/>
-      </w:pPr>
-      <w:r>
-        <w:t>The Angel of the Lord declared unto Mary,</w:t>
-      </w:r>
-      <w:r>
-        <w:br/>
-      </w:r>
-      <w:r>
-        <w:t>a</w:t>
-      </w:r>
-      <w:r>
-        <w:t>nd she conceived of the Holy Spirit.</w:t>
-      </w:r>
-      <w:r>
-        <w:br/>
-      </w:r>
-      <w:r>
-        <w:rPr>
-          <w:b/>
-          <w:bCs/>
-        </w:rPr>
-        <w:t>Hail Mary…</w:t>
-      </w:r>
-    </w:p>
-    <w:p>
-      <w:pPr>
-        <w:pStyle w:val="SPPrayerEnglish"/>
-      </w:pPr>
-      <w:r>
-        <w:t>Behold the handmaid of the Lord,</w:t>
-      </w:r>
-      <w:r>
-        <w:br/>
-        <w:t>Be it done unto me according to your Word.</w:t>
-      </w:r>
-      <w:r>
-        <w:br/>
-      </w:r>
-      <w:r>
-        <w:rPr>
-          <w:b/>
-          <w:bCs/>
-        </w:rPr>
-        <w:t>Hail Mary…</w:t>
-      </w:r>
-    </w:p>
-    <w:p>
-      <w:pPr>
-        <w:pStyle w:val="SPPrayerEnglish"/>
-      </w:pPr>
-      <w:r>
-        <w:t>And the Word was made flesh,</w:t>
-      </w:r>
-      <w:r>
-        <w:br/>
-      </w:r>
-      <w:r>
-        <w:t>a</w:t>
-      </w:r>
-      <w:r>
-        <w:t>nd dwelt among us.</w:t>
-      </w:r>
-      <w:r>
-        <w:br/>
-      </w:r>
-      <w:r>
-        <w:rPr>
-          <w:b/>
-          <w:bCs/>
-        </w:rPr>
-        <w:t>Hail Mary…</w:t>
-      </w:r>
-    </w:p>
-    <w:p>
-      <w:pPr>
-        <w:pStyle w:val="SPPrayerEnglish"/>
-      </w:pPr>
-      <w:r>
-        <w:t>Pray for us, O holy Mother of God,</w:t>
-      </w:r>
-      <w:r>
-        <w:br/>
-      </w:r>
-      <w:r>
-        <w:t>t</w:t>
-      </w:r>
-      <w:r>
-        <w:t>hat we may be made worthy of the promises of Christ.</w:t>
-      </w:r>
-    </w:p>
-    <w:p>
-      <w:pPr>
-        <w:pStyle w:val="SPLanguage"/>
-      </w:pPr>
-      <w:r>
-        <w:br w:type="page"/>
-      </w:r>
-    </w:p>
-    <w:p>
-      <w:pPr>
-        <w:pStyle w:val="SPLanguage"/>
-      </w:pPr>
-      <w:r>
-        <w:lastRenderedPageBreak/>
-        <w:t>LATIN</w:t>
-      </w:r>
-    </w:p>
-    <w:p>
-      <w:pPr>
-        <w:pStyle w:val="SPPrayerLatin"/>
-      </w:pPr>
-    </w:p>
-    <w:p>
-      <w:pPr>
-        <w:pStyle w:val="SPPrayerLatin"/>
-      </w:pPr>
-      <w:r>
-        <w:t xml:space="preserve">Angelus Domini </w:t>
-      </w:r>
-      <w:proofErr w:type="spellStart"/>
-      <w:r>
-        <w:t>nuntiavit</w:t>
-      </w:r>
-      <w:proofErr w:type="spellEnd"/>
-      <w:r>
-        <w:t xml:space="preserve"> Mariae.</w:t>
-      </w:r>
-      <w:r>
-        <w:br/>
-      </w:r>
-      <w:r>
-        <w:t>e</w:t>
-      </w:r>
-      <w:r>
-        <w:t xml:space="preserve">t </w:t>
-      </w:r>
-      <w:proofErr w:type="spellStart"/>
-      <w:r>
-        <w:t>concepit</w:t>
-      </w:r>
-      <w:proofErr w:type="spellEnd"/>
-      <w:r>
-        <w:t xml:space="preserve"> de </w:t>
-      </w:r>
-      <w:proofErr w:type="spellStart"/>
-      <w:r>
-        <w:t>Spiritu</w:t>
-      </w:r>
-      <w:proofErr w:type="spellEnd"/>
-      <w:r>
-        <w:t xml:space="preserve"> Sancto. </w:t>
-      </w:r>
-    </w:p>
-    <w:p>
-      <w:pPr>
-        <w:pStyle w:val="SPPrayerLatin"/>
-        <w:rPr>
-          <w:b/>
-          <w:bCs/>
-        </w:rPr>
-      </w:pPr>
-      <w:r>
-        <w:rPr>
-          <w:b/>
-          <w:bCs/>
-        </w:rPr>
-        <w:t>Ave Maria…</w:t>
-      </w:r>
-    </w:p>
-    <w:p>
-      <w:pPr>
-        <w:pStyle w:val="SPPrayerLatin"/>
-      </w:pPr>
-      <w:r>
-        <w:t>Ecce ancilla Domini</w:t>
-      </w:r>
-      <w:r>
-        <w:t>,</w:t>
-      </w:r>
-      <w:r>
-        <w:br/>
-        <w:t xml:space="preserve">Fiat mihi secundum verbum </w:t>
-      </w:r>
-      <w:proofErr w:type="spellStart"/>
-      <w:r>
-        <w:t>tuum</w:t>
-      </w:r>
-      <w:proofErr w:type="spellEnd"/>
-      <w:r>
-        <w:t xml:space="preserve">. </w:t>
-      </w:r>
-    </w:p>
-    <w:p>
-      <w:pPr>
-        <w:pStyle w:val="SPPrayerLatin"/>
-      </w:pPr>
-      <w:r>
-        <w:rPr>
-          <w:b/>
-          <w:bCs/>
-        </w:rPr>
-        <w:t>Ave Maria…</w:t>
+        <w:t>✠</w:t>
+      </w:r>
+    </w:p>
+    <w:p>
+      <w:pPr>
+        <w:pStyle w:val="SPBodyText"/>
+        <w:jc w:val="center"/>
+        <w:rPr>
+          <w:rFonts w:ascii="Segoe UI Symbol" w:hAnsi="Segoe UI Symbol" w:cs="Segoe UI Symbol"/>
+        </w:rPr>
+      </w:pPr>
+    </w:p>
+    <w:p>
+      <w:pPr>
+        <w:pStyle w:val="SPPrayerTitle"/>
+      </w:pPr>
+      <w:r>
+        <w:t xml:space="preserve">The </w:t>
+      </w:r>
+      <w:r>
+        <w:t>Angelus</w:t>
+      </w:r>
+    </w:p>
+    <w:p>
+      <w:pPr>
+        <w:pStyle w:val="SPBodyText"/>
+      </w:pPr>
+    </w:p>
+    <w:p>
+      <w:pPr>
+        <w:pStyle w:val="SPBodyText"/>
+      </w:pPr>
+      <w:r>
+        <w:t xml:space="preserve">The </w:t>
+      </w:r>
+      <w:r>
+        <w:t xml:space="preserve">Angelus </w:t>
+      </w:r>
+      <w:r>
+        <w:t xml:space="preserve">recalls the </w:t>
+      </w:r>
+      <w:r>
+        <w:rPr>
+          <w:b/>
+          <w:bCs/>
+        </w:rPr>
+        <w:t>Annunciation</w:t>
+      </w:r>
+      <w:r>
+        <w:t xml:space="preserve">, when the Angel Gabriel announced to Mary that she would become the </w:t>
+      </w:r>
+      <w:proofErr w:type="gramStart"/>
+      <w:r>
+        <w:t>Mother</w:t>
+      </w:r>
+      <w:proofErr w:type="gramEnd"/>
+      <w:r>
+        <w:t xml:space="preserve"> of the Son of God.</w:t>
+      </w:r>
+    </w:p>
+    <w:p>
+      <w:pPr>
+        <w:pStyle w:val="SPBodyText"/>
+      </w:pPr>
+      <w:r>
+        <w:t xml:space="preserve">Through three short verses and responses, the prayer leads us through the mystery of the </w:t>
+      </w:r>
+      <w:r>
+        <w:rPr>
+          <w:b/>
+          <w:bCs/>
+        </w:rPr>
+        <w:t>Incarnation</w:t>
+      </w:r>
+      <w:r>
+        <w:t>: Mary hears the message of the angel, gives her consent to God's will, and the Word becomes flesh.</w:t>
+      </w:r>
+    </w:p>
+    <w:p>
+      <w:pPr>
+        <w:pStyle w:val="SPBodyText"/>
+      </w:pPr>
+      <w:r>
+        <w:t xml:space="preserve">Traditionally, the Angelus is prayed </w:t>
+      </w:r>
+      <w:r>
+        <w:rPr>
+          <w:b/>
+          <w:bCs/>
+        </w:rPr>
+        <w:t>three times each day</w:t>
+      </w:r>
+      <w:r>
+        <w:t>:</w:t>
       </w:r>
       <w:r>
         <w:t xml:space="preserve"> </w:t>
       </w:r>
-    </w:p>
-    <w:p>
-      <w:pPr>
-        <w:pStyle w:val="SPPrayerLatin"/>
-      </w:pPr>
-      <w:r>
-        <w:t xml:space="preserve">Et Verbum </w:t>
-      </w:r>
-      <w:proofErr w:type="spellStart"/>
-      <w:r>
-        <w:t>caro</w:t>
-      </w:r>
-      <w:proofErr w:type="spellEnd"/>
-      <w:r>
-        <w:t xml:space="preserve"> factum est.</w:t>
-      </w:r>
-      <w:r>
-        <w:br/>
-      </w:r>
-      <w:r>
-        <w:t>e</w:t>
-      </w:r>
-      <w:r>
-        <w:t xml:space="preserve">t </w:t>
-      </w:r>
-      <w:proofErr w:type="spellStart"/>
-      <w:r>
-        <w:t>habitavit</w:t>
-      </w:r>
-      <w:proofErr w:type="spellEnd"/>
-      <w:r>
-        <w:t xml:space="preserve"> in nobis.</w:t>
-      </w:r>
-      <w:r>
-        <w:rPr>
-          <w:b/>
-          <w:bCs/>
-        </w:rPr>
+      <w:r>
+        <w:rPr>
+          <w:b/>
+          <w:bCs/>
+        </w:rPr>
+        <w:t>in the morning, at noon, and in the evening.</w:t>
+      </w:r>
+    </w:p>
+    <w:p>
+      <w:pPr>
+        <w:pStyle w:val="SPBodyText"/>
+      </w:pPr>
+      <w:r>
+        <w:t xml:space="preserve">The repeated prayer invites us to pause </w:t>
+      </w:r>
+      <w:proofErr w:type="gramStart"/>
+      <w:r>
+        <w:t>in the midst of</w:t>
+      </w:r>
+      <w:proofErr w:type="gramEnd"/>
+      <w:r>
+        <w:t xml:space="preserve"> ordinary life and remember the mystery at the heart of our faith:</w:t>
+      </w:r>
+      <w:r>
         <w:t xml:space="preserve"> </w:t>
       </w:r>
-    </w:p>
-    <w:p>
-      <w:pPr>
-        <w:pStyle w:val="SPPrayerLatin"/>
-        <w:rPr>
-          <w:b/>
-          <w:bCs/>
-        </w:rPr>
-      </w:pPr>
-      <w:r>
-        <w:rPr>
-          <w:b/>
-          <w:bCs/>
-        </w:rPr>
-        <w:t>Ave Maria…</w:t>
-      </w:r>
-    </w:p>
-    <w:p>
-      <w:pPr>
-        <w:pStyle w:val="SPPrayerLatin"/>
-      </w:pPr>
-      <w:r>
-        <w:t>Ora pro nobis, sancta Dei Genitrix.</w:t>
-      </w:r>
-      <w:r>
-        <w:br/>
-      </w:r>
-      <w:proofErr w:type="spellStart"/>
-      <w:r>
-        <w:t>u</w:t>
-      </w:r>
-      <w:r>
-        <w:t>t</w:t>
-      </w:r>
-      <w:proofErr w:type="spellEnd"/>
-      <w:r>
-        <w:t xml:space="preserve"> </w:t>
-      </w:r>
-      <w:proofErr w:type="spellStart"/>
-      <w:r>
-        <w:t>digni</w:t>
-      </w:r>
-      <w:proofErr w:type="spellEnd"/>
-      <w:r>
-        <w:t xml:space="preserve"> </w:t>
-      </w:r>
-      <w:proofErr w:type="spellStart"/>
-      <w:r>
-        <w:t>efficiamur</w:t>
-      </w:r>
-      <w:proofErr w:type="spellEnd"/>
-      <w:r>
-        <w:t xml:space="preserve"> </w:t>
-      </w:r>
-      <w:proofErr w:type="spellStart"/>
-      <w:r>
-        <w:t>promissionibus</w:t>
-      </w:r>
-      <w:proofErr w:type="spellEnd"/>
-      <w:r>
-        <w:t xml:space="preserve"> Christi.</w:t>
-      </w:r>
-    </w:p>
-    <w:p>
-      <w:pPr>
-        <w:pStyle w:val="SPPrayerEnglish"/>
-      </w:pPr>
-    </w:p>
-    <w:p>
-      <w:pPr>
-        <w:pStyle w:val="SPPrayerEnglish"/>
+      <w:r>
+        <w:rPr>
+          <w:b/>
+          <w:bCs/>
+        </w:rPr>
+        <w:t xml:space="preserve">“And the Word was made </w:t>
+      </w:r>
+      <w:proofErr w:type="gramStart"/>
+      <w:r>
+        <w:rPr>
+          <w:b/>
+          <w:bCs/>
+        </w:rPr>
+        <w:t>flesh, and</w:t>
+      </w:r>
+      <w:proofErr w:type="gramEnd"/>
+      <w:r>
+        <w:rPr>
+          <w:b/>
+          <w:bCs/>
+        </w:rPr>
+        <w:t xml:space="preserve"> dwelt among us.”</w:t>
+      </w:r>
+    </w:p>
+    <w:p>
+      <w:pPr>
+        <w:pStyle w:val="SPBodyText"/>
+      </w:pPr>
+      <w:r>
+        <w:t xml:space="preserve">It is a call to remember that </w:t>
+      </w:r>
+      <w:r>
+        <w:rPr>
+          <w:b/>
+          <w:bCs/>
+        </w:rPr>
+        <w:t>God came among us</w:t>
+      </w:r>
+      <w:r>
+        <w:t xml:space="preserve">, and that Mary's </w:t>
+      </w:r>
+      <w:r>
+        <w:rPr>
+          <w:i/>
+          <w:iCs/>
+        </w:rPr>
+        <w:t>fiat</w:t>
+      </w:r>
+      <w:r>
+        <w:t xml:space="preserve"> — her “let it be done” — opened the way for the Word to take flesh.</w:t>
+      </w:r>
+    </w:p>
+    <w:p>
+      <w:pPr>
+        <w:pStyle w:val="SPBodyText"/>
+      </w:pPr>
+      <w:r>
+        <w:t>When we pray the Angelus, we join our prayer to Mary's response:</w:t>
+      </w:r>
+    </w:p>
+    <w:p>
+      <w:pPr>
+        <w:pStyle w:val="SPBodyText"/>
+        <w:rPr>
+          <w:b/>
+          <w:bCs/>
+        </w:rPr>
+      </w:pPr>
+    </w:p>
+    <w:p>
+      <w:pPr>
+        <w:pStyle w:val="SPBodyText"/>
+        <w:rPr>
+          <w:b/>
+          <w:bCs/>
+        </w:rPr>
         <w:sectPr>
           <w:type w:val="oddPage"/>
           <w:pgSz w:w="7920" w:h="12240" w:code="6"/>
@@ -10551,10 +11007,26 @@
           <w:docGrid w:linePitch="360"/>
         </w:sectPr>
       </w:pPr>
+      <w:r>
+        <w:rPr>
+          <w:b/>
+          <w:bCs/>
+        </w:rPr>
+        <w:t>“Behold the handmaid of the Lord;</w:t>
+      </w:r>
+      <w:r>
+        <w:rPr>
+          <w:b/>
+          <w:bCs/>
+        </w:rPr>
+        <w:br/>
+        <w:t>be it done unto me according to your word.”</w:t>
+      </w:r>
     </w:p>
     <w:p>
       <w:pPr>
         <w:pStyle w:val="SPLanguage"/>
+        <w:spacing w:before="200"/>
       </w:pPr>
       <w:r>
         <w:lastRenderedPageBreak/>
@@ -10563,15 +11035,219 @@
     </w:p>
     <w:p>
       <w:pPr>
+        <w:pStyle w:val="SPLanguage"/>
+      </w:pPr>
+    </w:p>
+    <w:p>
+      <w:pPr>
         <w:pStyle w:val="SPPrayerEnglish"/>
       </w:pPr>
+      <w:r>
+        <w:t>The Angel of the Lord declared unto Mary,</w:t>
+      </w:r>
+      <w:r>
+        <w:br/>
+      </w:r>
+      <w:r>
+        <w:t>a</w:t>
+      </w:r>
+      <w:r>
+        <w:t>nd she conceived of the Holy Spirit.</w:t>
+      </w:r>
+      <w:r>
+        <w:br/>
+      </w:r>
+      <w:r>
+        <w:rPr>
+          <w:b/>
+          <w:bCs/>
+        </w:rPr>
+        <w:t>Hail Mary…</w:t>
+      </w:r>
     </w:p>
     <w:p>
       <w:pPr>
         <w:pStyle w:val="SPPrayerEnglish"/>
       </w:pPr>
       <w:r>
-        <w:t>Let us pray.</w:t>
+        <w:t>Behold the handmaid of the Lord,</w:t>
+      </w:r>
+      <w:r>
+        <w:br/>
+        <w:t>Be it done unto me according to your Word.</w:t>
+      </w:r>
+      <w:r>
+        <w:br/>
+      </w:r>
+      <w:r>
+        <w:rPr>
+          <w:b/>
+          <w:bCs/>
+        </w:rPr>
+        <w:t>Hail Mary…</w:t>
+      </w:r>
+    </w:p>
+    <w:p>
+      <w:pPr>
+        <w:pStyle w:val="SPPrayerEnglish"/>
+      </w:pPr>
+      <w:r>
+        <w:t>And the Word was made flesh,</w:t>
+      </w:r>
+      <w:r>
+        <w:br/>
+      </w:r>
+      <w:r>
+        <w:t>a</w:t>
+      </w:r>
+      <w:r>
+        <w:t>nd dwelt among us.</w:t>
+      </w:r>
+      <w:r>
+        <w:br/>
+      </w:r>
+      <w:r>
+        <w:rPr>
+          <w:b/>
+          <w:bCs/>
+        </w:rPr>
+        <w:t>Hail Mary…</w:t>
+      </w:r>
+    </w:p>
+    <w:p>
+      <w:pPr>
+        <w:pStyle w:val="SPPrayerEnglish"/>
+      </w:pPr>
+      <w:r>
+        <w:t>Pray for us, O holy Mother of God,</w:t>
+      </w:r>
+      <w:r>
+        <w:br/>
+      </w:r>
+      <w:r>
+        <w:t>t</w:t>
+      </w:r>
+      <w:r>
+        <w:t>hat we may be made worthy of the promises of Christ.</w:t>
+      </w:r>
+    </w:p>
+    <w:p>
+      <w:pPr>
+        <w:pStyle w:val="SPLanguage"/>
+        <w:sectPr>
+          <w:type w:val="evenPage"/>
+          <w:pgSz w:w="7920" w:h="12240" w:code="6"/>
+          <w:pgMar w:top="1080" w:right="864" w:bottom="1080" w:left="1152" w:header="576" w:footer="576" w:gutter="0"/>
+          <w:cols w:space="720"/>
+          <w:titlePg/>
+          <w:docGrid w:linePitch="360"/>
+        </w:sectPr>
+      </w:pPr>
+    </w:p>
+    <w:p>
+      <w:pPr>
+        <w:pStyle w:val="SPLanguage"/>
+      </w:pPr>
+      <w:r>
+        <w:lastRenderedPageBreak/>
+        <w:t>LATIN</w:t>
+      </w:r>
+    </w:p>
+    <w:p>
+      <w:pPr>
+        <w:pStyle w:val="SPPrayerLatin"/>
+      </w:pPr>
+    </w:p>
+    <w:p>
+      <w:pPr>
+        <w:pStyle w:val="SPPrayerLatin"/>
+      </w:pPr>
+      <w:r>
+        <w:t xml:space="preserve">Angelus Domini </w:t>
+      </w:r>
+      <w:proofErr w:type="spellStart"/>
+      <w:r>
+        <w:t>nuntiavit</w:t>
+      </w:r>
+      <w:proofErr w:type="spellEnd"/>
+      <w:r>
+        <w:t xml:space="preserve"> Mariae.</w:t>
+      </w:r>
+      <w:r>
+        <w:br/>
+      </w:r>
+      <w:r>
+        <w:t>e</w:t>
+      </w:r>
+      <w:r>
+        <w:t xml:space="preserve">t </w:t>
+      </w:r>
+      <w:proofErr w:type="spellStart"/>
+      <w:r>
+        <w:t>concepit</w:t>
+      </w:r>
+      <w:proofErr w:type="spellEnd"/>
+      <w:r>
+        <w:t xml:space="preserve"> de </w:t>
+      </w:r>
+      <w:proofErr w:type="spellStart"/>
+      <w:r>
+        <w:t>Spiritu</w:t>
+      </w:r>
+      <w:proofErr w:type="spellEnd"/>
+      <w:r>
+        <w:t xml:space="preserve"> Sancto. </w:t>
+      </w:r>
+    </w:p>
+    <w:p>
+      <w:pPr>
+        <w:pStyle w:val="SPPrayerLatin"/>
+        <w:rPr>
+          <w:b/>
+          <w:bCs/>
+        </w:rPr>
+      </w:pPr>
+      <w:r>
+        <w:rPr>
+          <w:b/>
+          <w:bCs/>
+        </w:rPr>
+        <w:t>Ave Maria…</w:t>
+      </w:r>
+    </w:p>
+    <w:p>
+      <w:pPr>
+        <w:pStyle w:val="SPPrayerLatin"/>
+      </w:pPr>
+      <w:r>
+        <w:t>Ecce ancilla Domini</w:t>
+      </w:r>
+      <w:r>
+        <w:t>,</w:t>
+      </w:r>
+      <w:r>
+        <w:br/>
+        <w:t xml:space="preserve">Fiat mihi secundum verbum </w:t>
+      </w:r>
+      <w:proofErr w:type="spellStart"/>
+      <w:r>
+        <w:t>tuum</w:t>
+      </w:r>
+      <w:proofErr w:type="spellEnd"/>
+      <w:r>
+        <w:t xml:space="preserve">. </w:t>
+      </w:r>
+    </w:p>
+    <w:p>
+      <w:pPr>
+        <w:pStyle w:val="SPPrayerLatin"/>
+      </w:pPr>
+      <w:r>
+        <w:rPr>
+          <w:b/>
+          <w:bCs/>
+        </w:rPr>
+        <w:t>Ave Maria…</w:t>
       </w:r>
       <w:r>
         <w:t xml:space="preserve"> </w:t>
@@ -10579,41 +11255,114 @@
     </w:p>
     <w:p>
       <w:pPr>
+        <w:pStyle w:val="SPPrayerLatin"/>
+      </w:pPr>
+      <w:r>
+        <w:t xml:space="preserve">Et Verbum </w:t>
+      </w:r>
+      <w:proofErr w:type="spellStart"/>
+      <w:r>
+        <w:t>caro</w:t>
+      </w:r>
+      <w:proofErr w:type="spellEnd"/>
+      <w:r>
+        <w:t xml:space="preserve"> factum est.</w:t>
+      </w:r>
+      <w:r>
+        <w:br/>
+      </w:r>
+      <w:r>
+        <w:t>e</w:t>
+      </w:r>
+      <w:r>
+        <w:t xml:space="preserve">t </w:t>
+      </w:r>
+      <w:proofErr w:type="spellStart"/>
+      <w:r>
+        <w:t>habitavit</w:t>
+      </w:r>
+      <w:proofErr w:type="spellEnd"/>
+      <w:r>
+        <w:t xml:space="preserve"> in nobis.</w:t>
+      </w:r>
+      <w:r>
+        <w:rPr>
+          <w:b/>
+          <w:bCs/>
+        </w:rPr>
+        <w:t xml:space="preserve"> </w:t>
+      </w:r>
+    </w:p>
+    <w:p>
+      <w:pPr>
+        <w:pStyle w:val="SPPrayerLatin"/>
+        <w:rPr>
+          <w:b/>
+          <w:bCs/>
+        </w:rPr>
+      </w:pPr>
+      <w:r>
+        <w:rPr>
+          <w:b/>
+          <w:bCs/>
+        </w:rPr>
+        <w:t>Ave Maria…</w:t>
+      </w:r>
+    </w:p>
+    <w:p>
+      <w:pPr>
+        <w:pStyle w:val="SPPrayerLatin"/>
+      </w:pPr>
+      <w:r>
+        <w:t>Ora pro nobis, sancta Dei Genitrix.</w:t>
+      </w:r>
+      <w:r>
+        <w:br/>
+      </w:r>
+      <w:proofErr w:type="spellStart"/>
+      <w:r>
+        <w:t>u</w:t>
+      </w:r>
+      <w:r>
+        <w:t>t</w:t>
+      </w:r>
+      <w:proofErr w:type="spellEnd"/>
+      <w:r>
+        <w:t xml:space="preserve"> </w:t>
+      </w:r>
+      <w:proofErr w:type="spellStart"/>
+      <w:r>
+        <w:t>digni</w:t>
+      </w:r>
+      <w:proofErr w:type="spellEnd"/>
+      <w:r>
+        <w:t xml:space="preserve"> </w:t>
+      </w:r>
+      <w:proofErr w:type="spellStart"/>
+      <w:r>
+        <w:t>efficiamur</w:t>
+      </w:r>
+      <w:proofErr w:type="spellEnd"/>
+      <w:r>
+        <w:t xml:space="preserve"> </w:t>
+      </w:r>
+      <w:proofErr w:type="spellStart"/>
+      <w:r>
+        <w:t>promissionibus</w:t>
+      </w:r>
+      <w:proofErr w:type="spellEnd"/>
+      <w:r>
+        <w:t xml:space="preserve"> Christi.</w:t>
+      </w:r>
+    </w:p>
+    <w:p>
+      <w:pPr>
         <w:pStyle w:val="SPPrayerEnglish"/>
       </w:pPr>
     </w:p>
     <w:p>
       <w:pPr>
-        <w:pStyle w:val="SPPrayerEnglish"/>
-      </w:pPr>
-      <w:r>
-        <w:t xml:space="preserve">Pour forth, we beseech Thee, O Lord, </w:t>
-      </w:r>
-      <w:proofErr w:type="gramStart"/>
-      <w:r>
-        <w:t>Thy</w:t>
-      </w:r>
-      <w:proofErr w:type="gramEnd"/>
-      <w:r>
-        <w:t xml:space="preserve"> grace into our hearts, that we to whom the Incarnation of Christ, Thy Son, was made known by the message of an angel, may by His Passion and Cross be brought to the glory of His resurrection. Through the same Christ our Lord. </w:t>
-      </w:r>
-    </w:p>
-    <w:p>
-      <w:pPr>
-        <w:pStyle w:val="SPPrayerEnglish"/>
-      </w:pPr>
-    </w:p>
-    <w:p>
-      <w:pPr>
-        <w:pStyle w:val="SPPrayerEnglish"/>
-      </w:pPr>
-      <w:r>
-        <w:t>Amen.</w:t>
-      </w:r>
-    </w:p>
-    <w:p>
-      <w:pPr>
-        <w:pStyle w:val="SPPrayerEnglish"/>
+        <w:pStyle w:val="SPLanguage"/>
         <w:sectPr>
           <w:type w:val="oddPage"/>
           <w:pgSz w:w="7920" w:h="12240" w:code="6"/>
@@ -10630,188 +11379,54 @@
       </w:pPr>
       <w:r>
         <w:lastRenderedPageBreak/>
-        <w:tab/>
-      </w:r>
-      <w:r>
-        <w:t>LATIN</w:t>
+        <w:t xml:space="preserve">ENGLISH </w:t>
       </w:r>
     </w:p>
     <w:p>
       <w:pPr>
         <w:pStyle w:val="SPPrayerEnglish"/>
-        <w:tabs>
-          <w:tab w:val="left" w:pos="2707"/>
-          <w:tab w:val="center" w:pos="2952"/>
-        </w:tabs>
-        <w:jc w:val="left"/>
-      </w:pPr>
-      <w:r>
-        <w:tab/>
-      </w:r>
-    </w:p>
-    <w:p>
-      <w:pPr>
-        <w:pStyle w:val="SPPrayerLatin"/>
-      </w:pPr>
-      <w:r>
-        <w:t>Oremus.</w:t>
-      </w:r>
-    </w:p>
-    <w:p>
-      <w:pPr>
-        <w:pStyle w:val="SPPrayerLatin"/>
-      </w:pPr>
-    </w:p>
-    <w:p>
-      <w:pPr>
-        <w:pStyle w:val="SPPrayerLatin"/>
-      </w:pPr>
-      <w:proofErr w:type="spellStart"/>
-      <w:r>
-        <w:t>Gratiam</w:t>
-      </w:r>
-      <w:proofErr w:type="spellEnd"/>
+      </w:pPr>
+    </w:p>
+    <w:p>
+      <w:pPr>
+        <w:pStyle w:val="SPPrayerEnglish"/>
+      </w:pPr>
+      <w:r>
+        <w:t>Let us pray.</w:t>
+      </w:r>
       <w:r>
         <w:t xml:space="preserve"> </w:t>
       </w:r>
-      <w:proofErr w:type="spellStart"/>
-      <w:r>
-        <w:t>tuam</w:t>
-      </w:r>
-      <w:proofErr w:type="spellEnd"/>
-      <w:r>
-        <w:t xml:space="preserve">, </w:t>
-      </w:r>
-      <w:proofErr w:type="spellStart"/>
-      <w:r>
-        <w:t>quaesumus</w:t>
-      </w:r>
-      <w:proofErr w:type="spellEnd"/>
-      <w:r>
-        <w:t xml:space="preserve">, Domine, </w:t>
-      </w:r>
-      <w:proofErr w:type="spellStart"/>
-      <w:r>
-        <w:t>mentibus</w:t>
-      </w:r>
-      <w:proofErr w:type="spellEnd"/>
-      <w:r>
-        <w:t xml:space="preserve"> </w:t>
-      </w:r>
-      <w:proofErr w:type="spellStart"/>
-      <w:r>
-        <w:t>nostris</w:t>
-      </w:r>
-      <w:proofErr w:type="spellEnd"/>
-      <w:r>
-        <w:t xml:space="preserve"> </w:t>
-      </w:r>
-      <w:proofErr w:type="spellStart"/>
-      <w:r>
-        <w:t>infunde</w:t>
-      </w:r>
-      <w:proofErr w:type="spellEnd"/>
-      <w:r>
-        <w:t xml:space="preserve">: </w:t>
-      </w:r>
-      <w:proofErr w:type="spellStart"/>
-      <w:r>
-        <w:t>ut</w:t>
-      </w:r>
-      <w:proofErr w:type="spellEnd"/>
-      <w:r>
-        <w:t xml:space="preserve"> qui, Angelo </w:t>
-      </w:r>
-      <w:proofErr w:type="spellStart"/>
-      <w:r>
-        <w:t>nuntiante</w:t>
-      </w:r>
-      <w:proofErr w:type="spellEnd"/>
-      <w:r>
-        <w:t xml:space="preserve">, Christi Filii tui </w:t>
-      </w:r>
-      <w:proofErr w:type="spellStart"/>
-      <w:r>
-        <w:t>incarnationem</w:t>
-      </w:r>
-      <w:proofErr w:type="spellEnd"/>
-      <w:r>
-        <w:t xml:space="preserve"> </w:t>
-      </w:r>
-      <w:proofErr w:type="spellStart"/>
-      <w:r>
-        <w:t>cognovimus</w:t>
-      </w:r>
-      <w:proofErr w:type="spellEnd"/>
-      <w:r>
-        <w:t xml:space="preserve">, per </w:t>
-      </w:r>
-      <w:proofErr w:type="spellStart"/>
-      <w:r>
-        <w:t>passionem</w:t>
-      </w:r>
-      <w:proofErr w:type="spellEnd"/>
-      <w:r>
-        <w:t xml:space="preserve"> eius et </w:t>
-      </w:r>
-      <w:proofErr w:type="spellStart"/>
-      <w:r>
-        <w:t>crucem</w:t>
-      </w:r>
-      <w:proofErr w:type="spellEnd"/>
-      <w:r>
-        <w:t xml:space="preserve"> </w:t>
-      </w:r>
-      <w:proofErr w:type="spellStart"/>
-      <w:r>
-        <w:t>ad</w:t>
-      </w:r>
-      <w:proofErr w:type="spellEnd"/>
-      <w:r>
-        <w:t xml:space="preserve"> </w:t>
-      </w:r>
-      <w:proofErr w:type="spellStart"/>
-      <w:r>
-        <w:t>resurrectionis</w:t>
-      </w:r>
-      <w:proofErr w:type="spellEnd"/>
-      <w:r>
-        <w:t xml:space="preserve"> </w:t>
-      </w:r>
-      <w:proofErr w:type="spellStart"/>
-      <w:r>
-        <w:t>gloriam</w:t>
-      </w:r>
-      <w:proofErr w:type="spellEnd"/>
-      <w:r>
-        <w:t xml:space="preserve"> </w:t>
-      </w:r>
-      <w:proofErr w:type="spellStart"/>
-      <w:r>
-        <w:t>perducamur</w:t>
-      </w:r>
-      <w:proofErr w:type="spellEnd"/>
-      <w:r>
-        <w:t xml:space="preserve">. Per eundem Christum </w:t>
-      </w:r>
-      <w:proofErr w:type="spellStart"/>
-      <w:r>
-        <w:t>Dominum</w:t>
-      </w:r>
-      <w:proofErr w:type="spellEnd"/>
-      <w:r>
-        <w:t xml:space="preserve"> nostrum. </w:t>
-      </w:r>
-    </w:p>
-    <w:p>
-      <w:pPr>
-        <w:pStyle w:val="SPPrayerLatin"/>
-      </w:pPr>
-    </w:p>
-    <w:p>
-      <w:pPr>
-        <w:pStyle w:val="SPPrayerLatin"/>
-        <w:spacing w:before="600"/>
+    </w:p>
+    <w:p>
+      <w:pPr>
+        <w:pStyle w:val="SPPrayerEnglish"/>
+      </w:pPr>
+    </w:p>
+    <w:p>
+      <w:pPr>
+        <w:pStyle w:val="SPPrayerEnglish"/>
+      </w:pPr>
+      <w:r>
+        <w:t xml:space="preserve">Pour forth, we beseech Thee, O Lord, </w:t>
+      </w:r>
+      <w:proofErr w:type="gramStart"/>
+      <w:r>
+        <w:t>Thy</w:t>
+      </w:r>
+      <w:proofErr w:type="gramEnd"/>
+      <w:r>
+        <w:t xml:space="preserve"> grace into our hearts, that we to whom the Incarnation of Christ, Thy Son, was made known by the message of an angel, may by His Passion and Cross be brought to the glory of His resurrection. Through the same Christ our Lord. </w:t>
+      </w:r>
+    </w:p>
+    <w:p>
+      <w:pPr>
+        <w:pStyle w:val="SPPrayerEnglish"/>
+      </w:pPr>
+    </w:p>
+    <w:p>
+      <w:pPr>
+        <w:pStyle w:val="SPPrayerEnglish"/>
       </w:pPr>
       <w:r>
         <w:t>Amen.</w:t>
@@ -10819,12 +11434,7 @@
     </w:p>
     <w:p>
       <w:pPr>
-        <w:pStyle w:val="SPPrayerLatin"/>
-      </w:pPr>
-    </w:p>
-    <w:p>
-      <w:pPr>
-        <w:ind w:left="0"/>
+        <w:pStyle w:val="SPLanguage"/>
         <w:sectPr>
           <w:type w:val="evenPage"/>
           <w:pgSz w:w="7920" w:h="12240" w:code="6"/>
@@ -10837,16 +11447,205 @@
     </w:p>
     <w:p>
       <w:pPr>
+        <w:pStyle w:val="SPLanguage"/>
+      </w:pPr>
+      <w:r>
+        <w:lastRenderedPageBreak/>
+        <w:tab/>
+      </w:r>
+      <w:r>
+        <w:t>LATIN</w:t>
+      </w:r>
+    </w:p>
+    <w:p>
+      <w:pPr>
+        <w:pStyle w:val="SPPrayerEnglish"/>
+        <w:tabs>
+          <w:tab w:val="left" w:pos="2707"/>
+          <w:tab w:val="center" w:pos="2952"/>
+        </w:tabs>
+        <w:jc w:val="left"/>
+      </w:pPr>
+      <w:r>
+        <w:tab/>
+      </w:r>
+    </w:p>
+    <w:p>
+      <w:pPr>
+        <w:pStyle w:val="SPPrayerLatin"/>
+      </w:pPr>
+      <w:r>
+        <w:t>Oremus.</w:t>
+      </w:r>
+    </w:p>
+    <w:p>
+      <w:pPr>
+        <w:pStyle w:val="SPPrayerLatin"/>
+      </w:pPr>
+    </w:p>
+    <w:p>
+      <w:pPr>
+        <w:pStyle w:val="SPPrayerLatin"/>
+      </w:pPr>
+      <w:proofErr w:type="spellStart"/>
+      <w:r>
+        <w:t>Gratiam</w:t>
+      </w:r>
+      <w:proofErr w:type="spellEnd"/>
+      <w:r>
+        <w:t xml:space="preserve"> </w:t>
+      </w:r>
+      <w:proofErr w:type="spellStart"/>
+      <w:r>
+        <w:t>tuam</w:t>
+      </w:r>
+      <w:proofErr w:type="spellEnd"/>
+      <w:r>
+        <w:t xml:space="preserve">, </w:t>
+      </w:r>
+      <w:proofErr w:type="spellStart"/>
+      <w:r>
+        <w:t>quaesumus</w:t>
+      </w:r>
+      <w:proofErr w:type="spellEnd"/>
+      <w:r>
+        <w:t xml:space="preserve">, Domine, </w:t>
+      </w:r>
+      <w:proofErr w:type="spellStart"/>
+      <w:r>
+        <w:t>mentibus</w:t>
+      </w:r>
+      <w:proofErr w:type="spellEnd"/>
+      <w:r>
+        <w:t xml:space="preserve"> </w:t>
+      </w:r>
+      <w:proofErr w:type="spellStart"/>
+      <w:r>
+        <w:t>nostris</w:t>
+      </w:r>
+      <w:proofErr w:type="spellEnd"/>
+      <w:r>
+        <w:t xml:space="preserve"> </w:t>
+      </w:r>
+      <w:proofErr w:type="spellStart"/>
+      <w:r>
+        <w:t>infunde</w:t>
+      </w:r>
+      <w:proofErr w:type="spellEnd"/>
+      <w:r>
+        <w:t xml:space="preserve">: </w:t>
+      </w:r>
+      <w:proofErr w:type="spellStart"/>
+      <w:r>
+        <w:t>ut</w:t>
+      </w:r>
+      <w:proofErr w:type="spellEnd"/>
+      <w:r>
+        <w:t xml:space="preserve"> qui, Angelo </w:t>
+      </w:r>
+      <w:proofErr w:type="spellStart"/>
+      <w:r>
+        <w:t>nuntiante</w:t>
+      </w:r>
+      <w:proofErr w:type="spellEnd"/>
+      <w:r>
+        <w:t xml:space="preserve">, Christi Filii tui </w:t>
+      </w:r>
+      <w:proofErr w:type="spellStart"/>
+      <w:r>
+        <w:t>incarnationem</w:t>
+      </w:r>
+      <w:proofErr w:type="spellEnd"/>
+      <w:r>
+        <w:t xml:space="preserve"> </w:t>
+      </w:r>
+      <w:proofErr w:type="spellStart"/>
+      <w:r>
+        <w:t>cognovimus</w:t>
+      </w:r>
+      <w:proofErr w:type="spellEnd"/>
+      <w:r>
+        <w:t xml:space="preserve">, per </w:t>
+      </w:r>
+      <w:proofErr w:type="spellStart"/>
+      <w:r>
+        <w:t>passionem</w:t>
+      </w:r>
+      <w:proofErr w:type="spellEnd"/>
+      <w:r>
+        <w:t xml:space="preserve"> eius et </w:t>
+      </w:r>
+      <w:proofErr w:type="spellStart"/>
+      <w:r>
+        <w:t>crucem</w:t>
+      </w:r>
+      <w:proofErr w:type="spellEnd"/>
+      <w:r>
+        <w:t xml:space="preserve"> </w:t>
+      </w:r>
+      <w:proofErr w:type="spellStart"/>
+      <w:r>
+        <w:t>ad</w:t>
+      </w:r>
+      <w:proofErr w:type="spellEnd"/>
+      <w:r>
+        <w:t xml:space="preserve"> </w:t>
+      </w:r>
+      <w:proofErr w:type="spellStart"/>
+      <w:r>
+        <w:t>resurrectionis</w:t>
+      </w:r>
+      <w:proofErr w:type="spellEnd"/>
+      <w:r>
+        <w:t xml:space="preserve"> </w:t>
+      </w:r>
+      <w:proofErr w:type="spellStart"/>
+      <w:r>
+        <w:t>gloriam</w:t>
+      </w:r>
+      <w:proofErr w:type="spellEnd"/>
+      <w:r>
+        <w:t xml:space="preserve"> </w:t>
+      </w:r>
+      <w:proofErr w:type="spellStart"/>
+      <w:r>
+        <w:t>perducamur</w:t>
+      </w:r>
+      <w:proofErr w:type="spellEnd"/>
+      <w:r>
+        <w:t xml:space="preserve">. Per eundem Christum </w:t>
+      </w:r>
+      <w:proofErr w:type="spellStart"/>
+      <w:r>
+        <w:t>Dominum</w:t>
+      </w:r>
+      <w:proofErr w:type="spellEnd"/>
+      <w:r>
+        <w:t xml:space="preserve"> nostrum. </w:t>
+      </w:r>
+    </w:p>
+    <w:p>
+      <w:pPr>
+        <w:pStyle w:val="SPPrayerLatin"/>
+      </w:pPr>
+    </w:p>
+    <w:p>
+      <w:pPr>
+        <w:pStyle w:val="SPPrayerLatin"/>
+        <w:spacing w:before="600"/>
+      </w:pPr>
+      <w:r>
+        <w:t>Amen.</w:t>
+      </w:r>
+    </w:p>
+    <w:p>
+      <w:pPr>
+        <w:pStyle w:val="SPPrayerLatin"/>
+      </w:pPr>
+    </w:p>
+    <w:p>
+      <w:pPr>
         <w:pStyle w:val="SPSectionTitle"/>
-      </w:pPr>
-      <w:r>
-        <w:lastRenderedPageBreak/>
-        <w:t>Scripture</w:t>
-      </w:r>
-    </w:p>
-    <w:p>
-      <w:pPr>
-        <w:pStyle w:val="SPScriptureReference"/>
         <w:sectPr>
           <w:type w:val="oddPage"/>
           <w:pgSz w:w="7920" w:h="12240" w:code="6"/>
@@ -10856,9 +11655,76 @@
           <w:docGrid w:linePitch="360"/>
         </w:sectPr>
       </w:pPr>
+    </w:p>
+    <w:p>
+      <w:pPr>
+        <w:pStyle w:val="SPSectionTitle"/>
+      </w:pPr>
+      <w:r>
+        <w:lastRenderedPageBreak/>
+        <w:t>Scripture</w:t>
+      </w:r>
+    </w:p>
+    <w:p>
+      <w:pPr>
+        <w:pStyle w:val="SPScriptureReference"/>
+      </w:pPr>
+      <w:r>
+        <w:t>Luke 1:26-38</w:t>
+      </w:r>
+    </w:p>
+    <w:p>
+      <w:pPr>
+        <w:pStyle w:val="SPScriptureReference"/>
+      </w:pPr>
+      <w:r>
+        <w:t>John 1:14</w:t>
+      </w:r>
+    </w:p>
+    <w:p>
+      <w:pPr>
+        <w:pStyle w:val="SPScriptureReference"/>
+      </w:pPr>
+      <w:r>
+        <w:t>Galatians 4:4-5</w:t>
+      </w:r>
+    </w:p>
+    <w:p>
+      <w:pPr>
+        <w:pStyle w:val="SPScriptureReference"/>
+      </w:pPr>
+      <w:proofErr w:type="spellStart"/>
+      <w:r>
+        <w:t>Phillipians</w:t>
+      </w:r>
+      <w:proofErr w:type="spellEnd"/>
+      <w:r>
+        <w:t xml:space="preserve"> 2:6-11</w:t>
+      </w:r>
+    </w:p>
+    <w:p>
+      <w:pPr>
+        <w:pStyle w:val="SPScriptureReference"/>
+      </w:pPr>
+      <w:r>
+        <w:t>1 Corinthians 15:3-4</w:t>
+      </w:r>
       <w:r>
         <w:t xml:space="preserve"> </w:t>
       </w:r>
+    </w:p>
+    <w:p>
+      <w:pPr>
+        <w:pStyle w:val="SPScriptureReference"/>
+        <w:sectPr>
+          <w:type w:val="evenPage"/>
+          <w:pgSz w:w="7920" w:h="12240" w:code="6"/>
+          <w:pgMar w:top="1080" w:right="864" w:bottom="1080" w:left="1152" w:header="576" w:footer="576" w:gutter="0"/>
+          <w:cols w:space="720"/>
+          <w:titlePg/>
+          <w:docGrid w:linePitch="360"/>
+        </w:sectPr>
+      </w:pPr>
     </w:p>
     <w:p>
       <w:pPr>
@@ -10871,11 +11737,703 @@
     </w:p>
     <w:p>
       <w:pPr>
-        <w:pStyle w:val="SPScriptureReference"/>
+        <w:pStyle w:val="SPBodyText"/>
+        <w:rPr>
+          <w:b/>
+          <w:bCs/>
+        </w:rPr>
       </w:pPr>
       <w:r>
         <w:t xml:space="preserve"> </w:t>
       </w:r>
+      <w:r>
+        <w:rPr>
+          <w:b/>
+          <w:bCs/>
+        </w:rPr>
+        <w:t>The Word Became Flesh</w:t>
+      </w:r>
+    </w:p>
+    <w:p>
+      <w:pPr>
+        <w:pStyle w:val="SPBodyText"/>
+      </w:pPr>
+      <w:r>
+        <w:t>The Angelus brings us back to a moment when the course of human history changed.</w:t>
+      </w:r>
+    </w:p>
+    <w:p>
+      <w:pPr>
+        <w:pStyle w:val="SPBodyText"/>
+      </w:pPr>
+      <w:r>
+        <w:t>An angel came to Mary.</w:t>
+      </w:r>
+    </w:p>
+    <w:p>
+      <w:pPr>
+        <w:pStyle w:val="SPBodyText"/>
+      </w:pPr>
+      <w:r>
+        <w:t>A promise was spoken.</w:t>
+      </w:r>
+    </w:p>
+    <w:p>
+      <w:pPr>
+        <w:pStyle w:val="SPBodyText"/>
+      </w:pPr>
+      <w:r>
+        <w:t>And Mary answered.</w:t>
+      </w:r>
+    </w:p>
+    <w:p>
+      <w:pPr>
+        <w:pStyle w:val="SPBodyText"/>
+        <w:rPr>
+          <w:b/>
+          <w:bCs/>
+        </w:rPr>
+      </w:pPr>
+    </w:p>
+    <w:p>
+      <w:pPr>
+        <w:pStyle w:val="SPBodyText"/>
+      </w:pPr>
+      <w:r>
+        <w:rPr>
+          <w:b/>
+          <w:bCs/>
+        </w:rPr>
+        <w:t>“Behold the handmaid of the Lord.”</w:t>
+      </w:r>
+    </w:p>
+    <w:p>
+      <w:pPr>
+        <w:pStyle w:val="SPBodyText"/>
+      </w:pPr>
+    </w:p>
+    <w:p>
+      <w:pPr>
+        <w:pStyle w:val="SPBodyText"/>
+      </w:pPr>
+      <w:r>
+        <w:t>Her answer was not accompanied by certainty about everything that would follow. She did not know every sorrow she would encounter, every joy she would receive, or every mystery she would carry.</w:t>
+      </w:r>
+    </w:p>
+    <w:p>
+      <w:pPr>
+        <w:pStyle w:val="SPBodyText"/>
+      </w:pPr>
+      <w:r>
+        <w:t>She simply trusted God.</w:t>
+      </w:r>
+    </w:p>
+    <w:p>
+      <w:pPr>
+        <w:pStyle w:val="SPBodyText"/>
+      </w:pPr>
+      <w:r>
+        <w:t xml:space="preserve">And through her </w:t>
+      </w:r>
+      <w:r>
+        <w:rPr>
+          <w:i/>
+          <w:iCs/>
+        </w:rPr>
+        <w:t>Fiat</w:t>
+      </w:r>
+      <w:r>
+        <w:t>, the Word became flesh.</w:t>
+      </w:r>
+    </w:p>
+    <w:p>
+      <w:pPr>
+        <w:pStyle w:val="SPBodyText"/>
+      </w:pPr>
+    </w:p>
+    <w:p>
+      <w:pPr>
+        <w:pStyle w:val="SPBodyText"/>
+      </w:pPr>
+      <w:r>
+        <w:t>The Angelus invites us to pause throughout the day and remember this mystery.</w:t>
+      </w:r>
+    </w:p>
+    <w:p>
+      <w:pPr>
+        <w:pStyle w:val="SPBodyText"/>
+      </w:pPr>
+      <w:r>
+        <w:t>In the morning, as the day begins.</w:t>
+      </w:r>
+    </w:p>
+    <w:p>
+      <w:pPr>
+        <w:pStyle w:val="SPBodyText"/>
+      </w:pPr>
+      <w:r>
+        <w:t>At midday, when the day's work is underway.</w:t>
+      </w:r>
+    </w:p>
+    <w:p>
+      <w:pPr>
+        <w:pStyle w:val="SPBodyText"/>
+      </w:pPr>
+      <w:r>
+        <w:t>In the evening, as the day draws to its close.</w:t>
+      </w:r>
+    </w:p>
+    <w:p>
+      <w:pPr>
+        <w:pStyle w:val="SPBodyText"/>
+      </w:pPr>
+      <w:r>
+        <w:t>The hours may change.</w:t>
+      </w:r>
+    </w:p>
+    <w:p>
+      <w:pPr>
+        <w:pStyle w:val="SPBodyText"/>
+      </w:pPr>
+      <w:r>
+        <w:t>Our circumstances may change.</w:t>
+      </w:r>
+    </w:p>
+    <w:p>
+      <w:pPr>
+        <w:pStyle w:val="SPBodyText"/>
+      </w:pPr>
+      <w:r>
+        <w:t>But the mystery remains.</w:t>
+      </w:r>
+    </w:p>
+    <w:p>
+      <w:pPr>
+        <w:pStyle w:val="SPBodyText"/>
+        <w:rPr>
+          <w:b/>
+          <w:bCs/>
+        </w:rPr>
+      </w:pPr>
+    </w:p>
+    <w:p>
+      <w:pPr>
+        <w:pStyle w:val="SPBodyText"/>
+      </w:pPr>
+      <w:r>
+        <w:rPr>
+          <w:b/>
+          <w:bCs/>
+        </w:rPr>
+        <w:t>God has come near.</w:t>
+      </w:r>
+    </w:p>
+    <w:p>
+      <w:pPr>
+        <w:pStyle w:val="SPBodyText"/>
+      </w:pPr>
+    </w:p>
+    <w:p>
+      <w:pPr>
+        <w:pStyle w:val="SPBodyText"/>
+      </w:pPr>
+      <w:r>
+        <w:t>The Son of God entered our humanity.</w:t>
+      </w:r>
+    </w:p>
+    <w:p>
+      <w:pPr>
+        <w:pStyle w:val="SPBodyText"/>
+      </w:pPr>
+      <w:r>
+        <w:t>He took flesh from Mary.</w:t>
+      </w:r>
+    </w:p>
+    <w:p>
+      <w:pPr>
+        <w:pStyle w:val="SPBodyText"/>
+      </w:pPr>
+      <w:r>
+        <w:t>He entered our world, not from a distance, but from within it.</w:t>
+      </w:r>
+    </w:p>
+    <w:p>
+      <w:pPr>
+        <w:pStyle w:val="SPBodyText"/>
+      </w:pPr>
+    </w:p>
+    <w:p>
+      <w:pPr>
+        <w:pStyle w:val="SPBodyText"/>
+      </w:pPr>
+      <w:r>
+        <w:t xml:space="preserve">Mary's </w:t>
+      </w:r>
+      <w:r>
+        <w:rPr>
+          <w:i/>
+          <w:iCs/>
+        </w:rPr>
+        <w:t>Fiat</w:t>
+      </w:r>
+      <w:r>
+        <w:t xml:space="preserve"> teaches us something about prayer.</w:t>
+      </w:r>
+    </w:p>
+    <w:p>
+      <w:pPr>
+        <w:pStyle w:val="SPBodyText"/>
+      </w:pPr>
+      <w:r>
+        <w:t>Prayer is not always asking God to change our circumstances.</w:t>
+      </w:r>
+    </w:p>
+    <w:p>
+      <w:pPr>
+        <w:pStyle w:val="SPBodyText"/>
+      </w:pPr>
+      <w:r>
+        <w:t>Sometimes prayer is learning to say:</w:t>
+      </w:r>
+    </w:p>
+    <w:p>
+      <w:pPr>
+        <w:pStyle w:val="SPBodyText"/>
+      </w:pPr>
+    </w:p>
+    <w:p>
+      <w:pPr>
+        <w:pStyle w:val="SPBodyText"/>
+      </w:pPr>
+      <w:r>
+        <w:rPr>
+          <w:b/>
+          <w:bCs/>
+        </w:rPr>
+        <w:t>“Let it be done to me according to your word.”</w:t>
+      </w:r>
+    </w:p>
+    <w:p>
+      <w:pPr>
+        <w:pStyle w:val="SPBodyText"/>
+      </w:pPr>
+    </w:p>
+    <w:p>
+      <w:pPr>
+        <w:pStyle w:val="SPBodyText"/>
+      </w:pPr>
+      <w:r>
+        <w:t>We may not understand what lies ahead.</w:t>
+      </w:r>
+    </w:p>
+    <w:p>
+      <w:pPr>
+        <w:pStyle w:val="SPBodyText"/>
+      </w:pPr>
+      <w:r>
+        <w:t>We may not see how God's purposes will unfold.</w:t>
+      </w:r>
+    </w:p>
+    <w:p>
+      <w:pPr>
+        <w:pStyle w:val="SPBodyText"/>
+      </w:pPr>
+      <w:r>
+        <w:t>But like Mary, we can place ourselves in His hands.</w:t>
+      </w:r>
+    </w:p>
+    <w:p>
+      <w:pPr>
+        <w:pStyle w:val="SPBodyText"/>
+      </w:pPr>
+      <w:r>
+        <w:t>Her humility made room for God.</w:t>
+      </w:r>
+    </w:p>
+    <w:p>
+      <w:pPr>
+        <w:pStyle w:val="SPBodyText"/>
+      </w:pPr>
+      <w:r>
+        <w:t>Her trust became an opening through which grace entered the world.</w:t>
+      </w:r>
+    </w:p>
+    <w:p>
+      <w:pPr>
+        <w:pStyle w:val="SPBodyText"/>
+      </w:pPr>
+    </w:p>
+    <w:p>
+      <w:pPr>
+        <w:pStyle w:val="SPBodyText"/>
+      </w:pPr>
+      <w:r>
+        <w:t>And the Angelus does not stop at Bethlehem.</w:t>
+      </w:r>
+    </w:p>
+    <w:p>
+      <w:pPr>
+        <w:pStyle w:val="SPBodyText"/>
+      </w:pPr>
+      <w:r>
+        <w:t>The prayer leads us from the Incarnation toward the Cross and the Resurrection.</w:t>
+      </w:r>
+    </w:p>
+    <w:p>
+      <w:pPr>
+        <w:pStyle w:val="SPBodyText"/>
+      </w:pPr>
+      <w:r>
+        <w:lastRenderedPageBreak/>
+        <w:t>The Child whom Mary carried would become the Christ who suffered, died, and rose again.</w:t>
+      </w:r>
+    </w:p>
+    <w:p>
+      <w:pPr>
+        <w:pStyle w:val="SPBodyText"/>
+      </w:pPr>
+      <w:r>
+        <w:t>The Word who became flesh came to redeem us.</w:t>
+      </w:r>
+    </w:p>
+    <w:p>
+      <w:pPr>
+        <w:pStyle w:val="SPBodyText"/>
+      </w:pPr>
+      <w:r>
+        <w:t>The mystery of the Incarnation is therefore also the mystery of our salvation.</w:t>
+      </w:r>
+    </w:p>
+    <w:p>
+      <w:pPr>
+        <w:pStyle w:val="SPBodyText"/>
+      </w:pPr>
+      <w:r>
+        <w:t>God did not merely come among us.</w:t>
+      </w:r>
+    </w:p>
+    <w:p>
+      <w:pPr>
+        <w:pStyle w:val="SPBodyText"/>
+        <w:rPr>
+          <w:b/>
+          <w:bCs/>
+        </w:rPr>
+      </w:pPr>
+    </w:p>
+    <w:p>
+      <w:pPr>
+        <w:pStyle w:val="SPBodyText"/>
+      </w:pPr>
+      <w:r>
+        <w:rPr>
+          <w:b/>
+          <w:bCs/>
+        </w:rPr>
+        <w:t>He came for us.</w:t>
+      </w:r>
+    </w:p>
+    <w:p>
+      <w:pPr>
+        <w:pStyle w:val="SPBodyText"/>
+      </w:pPr>
+    </w:p>
+    <w:p>
+      <w:pPr>
+        <w:pStyle w:val="SPBodyText"/>
+      </w:pPr>
+      <w:r>
+        <w:t>Perhaps that is why the Angelus is so beautiful as a prayer throughout the day.</w:t>
+      </w:r>
+    </w:p>
+    <w:p>
+      <w:pPr>
+        <w:pStyle w:val="SPBodyText"/>
+      </w:pPr>
+      <w:r>
+        <w:t>It interrupts us.</w:t>
+      </w:r>
+    </w:p>
+    <w:p>
+      <w:pPr>
+        <w:pStyle w:val="SPBodyText"/>
+      </w:pPr>
+      <w:r>
+        <w:t>For a few moments, the work can wait.</w:t>
+      </w:r>
+    </w:p>
+    <w:p>
+      <w:pPr>
+        <w:pStyle w:val="SPBodyText"/>
+      </w:pPr>
+      <w:r>
+        <w:t>The noise can wait.</w:t>
+      </w:r>
+    </w:p>
+    <w:p>
+      <w:pPr>
+        <w:pStyle w:val="SPBodyText"/>
+      </w:pPr>
+      <w:r>
+        <w:t>Our worries can wait.</w:t>
+      </w:r>
+    </w:p>
+    <w:p>
+      <w:pPr>
+        <w:pStyle w:val="SPBodyText"/>
+      </w:pPr>
+      <w:r>
+        <w:t>We remember.</w:t>
+      </w:r>
+    </w:p>
+    <w:p>
+      <w:pPr>
+        <w:pStyle w:val="SPBodyText"/>
+      </w:pPr>
+      <w:r>
+        <w:t>The angel spoke.</w:t>
+      </w:r>
+    </w:p>
+    <w:p>
+      <w:pPr>
+        <w:pStyle w:val="SPBodyText"/>
+      </w:pPr>
+      <w:r>
+        <w:t>Mary believed.</w:t>
+      </w:r>
+    </w:p>
+    <w:p>
+      <w:pPr>
+        <w:pStyle w:val="SPBodyText"/>
+      </w:pPr>
+      <w:r>
+        <w:t>The Word became flesh.</w:t>
+      </w:r>
+    </w:p>
+    <w:p>
+      <w:pPr>
+        <w:pStyle w:val="SPBodyText"/>
+      </w:pPr>
+      <w:r>
+        <w:t>And Christ dwells among us.</w:t>
+      </w:r>
+    </w:p>
+    <w:p>
+      <w:pPr>
+        <w:pStyle w:val="SPBodyText"/>
+      </w:pPr>
+    </w:p>
+    <w:p>
+      <w:pPr>
+        <w:pStyle w:val="SPBodyText"/>
+      </w:pPr>
+      <w:r>
+        <w:t>At six in the morning, we remember the beginning.</w:t>
+      </w:r>
+    </w:p>
+    <w:p>
+      <w:pPr>
+        <w:pStyle w:val="SPBodyText"/>
+      </w:pPr>
+      <w:r>
+        <w:t xml:space="preserve">At noon, we pause </w:t>
+      </w:r>
+      <w:proofErr w:type="gramStart"/>
+      <w:r>
+        <w:t>in the midst of</w:t>
+      </w:r>
+      <w:proofErr w:type="gramEnd"/>
+      <w:r>
+        <w:t xml:space="preserve"> our work.</w:t>
+      </w:r>
+    </w:p>
+    <w:p>
+      <w:pPr>
+        <w:pStyle w:val="SPBodyText"/>
+      </w:pPr>
+      <w:r>
+        <w:t>At six in the evening, we remember again as the day comes to an end.</w:t>
+      </w:r>
+    </w:p>
+    <w:p>
+      <w:pPr>
+        <w:pStyle w:val="SPBodyText"/>
+      </w:pPr>
+    </w:p>
+    <w:p>
+      <w:pPr>
+        <w:pStyle w:val="SPBodyText"/>
+      </w:pPr>
+      <w:r>
+        <w:lastRenderedPageBreak/>
+        <w:t>Three times a day, we return to the same mystery.</w:t>
+      </w:r>
+    </w:p>
+    <w:p>
+      <w:pPr>
+        <w:pStyle w:val="SPBodyText"/>
+      </w:pPr>
+      <w:r>
+        <w:t>Not because God has forgotten us,</w:t>
+      </w:r>
+    </w:p>
+    <w:p>
+      <w:pPr>
+        <w:pStyle w:val="SPBodyText"/>
+      </w:pPr>
+      <w:r>
+        <w:t xml:space="preserve">but because </w:t>
+      </w:r>
+      <w:r>
+        <w:rPr>
+          <w:b/>
+          <w:bCs/>
+        </w:rPr>
+        <w:t>we so easily forget Him.</w:t>
+      </w:r>
+    </w:p>
+    <w:p>
+      <w:pPr>
+        <w:pStyle w:val="SPBodyText"/>
+      </w:pPr>
+      <w:r>
+        <w:t>The Angelus calls us back.</w:t>
+      </w:r>
+    </w:p>
+    <w:p>
+      <w:pPr>
+        <w:pStyle w:val="SPBodyText"/>
+      </w:pPr>
+      <w:r>
+        <w:t>Back to Mary.</w:t>
+      </w:r>
+    </w:p>
+    <w:p>
+      <w:pPr>
+        <w:pStyle w:val="SPBodyText"/>
+      </w:pPr>
+      <w:r>
+        <w:t>Back to the Incarnation.</w:t>
+      </w:r>
+    </w:p>
+    <w:p>
+      <w:pPr>
+        <w:pStyle w:val="SPBodyText"/>
+      </w:pPr>
+      <w:r>
+        <w:t>Back to Christ.</w:t>
+      </w:r>
+    </w:p>
+    <w:p>
+      <w:pPr>
+        <w:pStyle w:val="SPBodyText"/>
+      </w:pPr>
+      <w:r>
+        <w:t xml:space="preserve">Back to the truth that God is </w:t>
+      </w:r>
+      <w:proofErr w:type="gramStart"/>
+      <w:r>
+        <w:t>near</w:t>
+      </w:r>
+      <w:proofErr w:type="gramEnd"/>
+      <w:r>
+        <w:t>.</w:t>
+      </w:r>
+    </w:p>
+    <w:p>
+      <w:pPr>
+        <w:pStyle w:val="SPBodyText"/>
+      </w:pPr>
+      <w:r>
+        <w:t>And perhaps, after saying the prayer, we can carry that truth with us into whatever remains of the day.</w:t>
+      </w:r>
+    </w:p>
+    <w:p>
+      <w:pPr>
+        <w:pStyle w:val="SPBodyText"/>
+        <w:rPr>
+          <w:b/>
+          <w:bCs/>
+        </w:rPr>
+      </w:pPr>
+    </w:p>
+    <w:p>
+      <w:pPr>
+        <w:pStyle w:val="SPBodyText"/>
+      </w:pPr>
+      <w:r>
+        <w:rPr>
+          <w:b/>
+          <w:bCs/>
+        </w:rPr>
+        <w:t>The Word became flesh.</w:t>
+      </w:r>
+    </w:p>
+    <w:p>
+      <w:pPr>
+        <w:pStyle w:val="SPBodyText"/>
+      </w:pPr>
+      <w:r>
+        <w:rPr>
+          <w:b/>
+          <w:bCs/>
+        </w:rPr>
+        <w:t>God came near.</w:t>
+      </w:r>
+    </w:p>
+    <w:p>
+      <w:pPr>
+        <w:pStyle w:val="SPBodyText"/>
+      </w:pPr>
+      <w:r>
+        <w:rPr>
+          <w:b/>
+          <w:bCs/>
+        </w:rPr>
+        <w:t>And He is still with us.</w:t>
+      </w:r>
+    </w:p>
+    <w:p>
+      <w:pPr>
+        <w:pStyle w:val="SPBodyText"/>
+        <w:rPr>
+          <w:rFonts w:ascii="Segoe UI Symbol" w:hAnsi="Segoe UI Symbol" w:cs="Segoe UI Symbol"/>
+        </w:rPr>
+      </w:pPr>
+    </w:p>
+    <w:p>
+      <w:pPr>
+        <w:pStyle w:val="SPBodyText"/>
+        <w:jc w:val="center"/>
+        <w:rPr>
+          <w:rFonts w:ascii="Segoe UI Symbol" w:hAnsi="Segoe UI Symbol" w:cs="Segoe UI Symbol"/>
+        </w:rPr>
+        <w:sectPr>
+          <w:type w:val="oddPage"/>
+          <w:pgSz w:w="7920" w:h="12240" w:code="6"/>
+          <w:pgMar w:top="1080" w:right="864" w:bottom="1080" w:left="1152" w:header="576" w:footer="576" w:gutter="0"/>
+          <w:cols w:space="720"/>
+          <w:titlePg/>
+          <w:docGrid w:linePitch="360"/>
+        </w:sectPr>
+      </w:pPr>
+      <w:r>
+        <w:rPr>
+          <w:rFonts w:ascii="Segoe UI Symbol" w:hAnsi="Segoe UI Symbol" w:cs="Segoe UI Symbol"/>
+        </w:rPr>
+        <w:t>✠</w:t>
+      </w:r>
+    </w:p>
+    <w:p>
+      <w:pPr>
+        <w:pStyle w:val="SPBodyText"/>
+        <w:jc w:val="center"/>
+      </w:pPr>
+    </w:p>
+    <w:p>
+      <w:pPr>
+        <w:pStyle w:val="SPBodyText"/>
+      </w:pPr>
     </w:p>
     <w:p>
       <w:pPr>
@@ -13117,6 +14675,15 @@
       <w:shd w:val="clear" w:color="auto" w:fill="E1DFDD"/>
     </w:rPr>
   </w:style>
+  <w:style w:type="paragraph" w:customStyle="1" w:styleId="SPSectionHeading">
+    <w:name w:val="SP Section Heading"/>
+    <w:basedOn w:val="SPPrayerTitle"/>
+    <w:qFormat/>
+    <w:rsid w:val="00B013F8"/>
+    <w:pPr>
+      <w:spacing w:before="1080"/>
+    </w:pPr>
+  </w:style>
 </w:styles>
 </file>
 

</xml_diff>

<commit_message>
More rearranging prayers into sections
</commit_message>
<xml_diff>
--- a/manuscript/volume-1/sacrae-preces-volume-1.docx
+++ b/manuscript/volume-1/sacrae-preces-volume-1.docx
@@ -373,10 +373,16 @@
     <w:p>
       <w:pPr>
         <w:pStyle w:val="SPPrayerLatin"/>
+        <w:rPr>
+          <w:i w:val="0"/>
+          <w:iCs/>
+        </w:rPr>
       </w:pPr>
       <w:r>
         <w:rPr>
           <w:rFonts w:ascii="Segoe UI Symbol" w:hAnsi="Segoe UI Symbol" w:cs="Segoe UI Symbol"/>
+          <w:i w:val="0"/>
+          <w:iCs/>
         </w:rPr>
         <w:lastRenderedPageBreak/>
         <w:t>✠</w:t>
@@ -1081,641 +1087,180 @@
       <w:pPr>
         <w:pStyle w:val="SPBodyText"/>
       </w:pPr>
+    </w:p>
+    <w:p>
+      <w:pPr>
+        <w:pStyle w:val="SPBodyText"/>
+      </w:pPr>
+    </w:p>
+    <w:p>
+      <w:pPr>
+        <w:pStyle w:val="SPBodyText"/>
+      </w:pPr>
+    </w:p>
+    <w:p>
+      <w:pPr>
+        <w:pStyle w:val="SPBodyText"/>
+      </w:pPr>
+    </w:p>
+    <w:p>
+      <w:pPr>
+        <w:pStyle w:val="SPBodyText"/>
+      </w:pPr>
       <w:r>
         <w:lastRenderedPageBreak/>
-        <w:t xml:space="preserve">Each prayer in this volume is presented with both its </w:t>
-      </w:r>
-      <w:r>
-        <w:rPr>
-          <w:b/>
-          <w:bCs/>
-        </w:rPr>
-        <w:t>English and Latin forms</w:t>
-      </w:r>
-      <w:r>
-        <w:t>. The English text allows the meaning of the prayer to be understood clearly, while the Latin provides an opportunity to encounter the same prayer in the language that has accompanied the Church for centuries.</w:t>
-      </w:r>
-    </w:p>
-    <w:p>
-      <w:pPr>
-        <w:pStyle w:val="SPBodyText"/>
-      </w:pPr>
-      <w:r>
-        <w:t xml:space="preserve">There is no requirement to learn Latin </w:t>
-      </w:r>
-      <w:proofErr w:type="gramStart"/>
-      <w:r>
-        <w:t>in order to</w:t>
-      </w:r>
-      <w:proofErr w:type="gramEnd"/>
-      <w:r>
-        <w:t xml:space="preserve"> use this book.</w:t>
-      </w:r>
-    </w:p>
-    <w:p>
-      <w:pPr>
-        <w:pStyle w:val="SPBodyText"/>
-      </w:pPr>
-      <w:r>
-        <w:t>Read the English first if it is more familiar to you. Consider the meaning of the words and the intention behind the prayer. Then, if you wish, return to the Latin. Read it slowly. Listen to the rhythm of the words. Over time, familiar words and phrases will begin to emerge.</w:t>
-      </w:r>
-    </w:p>
-    <w:p>
-      <w:pPr>
-        <w:pStyle w:val="SPBodyText"/>
-      </w:pPr>
-      <w:r>
-        <w:t>Even learning a single word can be worthwhile.</w:t>
-      </w:r>
-    </w:p>
-    <w:p>
-      <w:pPr>
-        <w:pStyle w:val="SPBodyText"/>
-      </w:pPr>
-      <w:r>
-        <w:t>The purpose is not to master a language, but to become more familiar with the prayers themselves.</w:t>
-      </w:r>
-    </w:p>
-    <w:p>
-      <w:pPr>
-        <w:pStyle w:val="SPBodyText"/>
-      </w:pPr>
-      <w:r>
-        <w:pict w14:anchorId="249FE732">
-          <v:rect id="_x0000_i1145" style="width:0;height:1.5pt" o:hralign="center" o:hrstd="t" o:hr="t" fillcolor="#a0a0a0" stroked="f"/>
-        </w:pict>
-      </w:r>
-    </w:p>
-    <w:p>
-      <w:pPr>
-        <w:pStyle w:val="SPSubheading"/>
-      </w:pPr>
-      <w:r>
-        <w:t>Scripture</w:t>
-      </w:r>
-    </w:p>
-    <w:p>
-      <w:pPr>
-        <w:pStyle w:val="SPBodyText"/>
-      </w:pPr>
-      <w:r>
-        <w:t xml:space="preserve">The prayers are accompanied by references to </w:t>
-      </w:r>
-      <w:r>
-        <w:rPr>
-          <w:b/>
-          <w:bCs/>
-        </w:rPr>
-        <w:t>Sacred Scripture</w:t>
-      </w:r>
-      <w:r>
-        <w:t xml:space="preserve"> wherever appropriate.</w:t>
-      </w:r>
-    </w:p>
-    <w:p>
-      <w:pPr>
-        <w:pStyle w:val="SPBodyText"/>
-      </w:pPr>
-      <w:r>
-        <w:t>These references are not intended to suggest that every prayer can be reduced to a single biblical passage. Rather, they provide a glimpse into the rich scriptural foundation from which Christian prayer has grown.</w:t>
-      </w:r>
-    </w:p>
-    <w:p>
-      <w:pPr>
-        <w:pStyle w:val="SPBodyText"/>
-      </w:pPr>
-      <w:r>
-        <w:t>Take time to read the passages.</w:t>
-      </w:r>
-    </w:p>
-    <w:p>
-      <w:pPr>
-        <w:pStyle w:val="SPBodyText"/>
-      </w:pPr>
-      <w:r>
-        <w:lastRenderedPageBreak/>
-        <w:t>A prayer may take on a different meaning when its words are considered alongside Scripture. A familiar phrase may suddenly become more meaningful. A petition that we have spoken many times may reveal something we had previously overlooked.</w:t>
-      </w:r>
-    </w:p>
-    <w:p>
-      <w:pPr>
-        <w:pStyle w:val="SPBodyText"/>
-      </w:pPr>
-      <w:r>
-        <w:t>The Scripture references are therefore invitations to explore rather than requirements to complete.</w:t>
-      </w:r>
-    </w:p>
-    <w:p>
-      <w:pPr>
-        <w:pStyle w:val="SPBodyText"/>
-      </w:pPr>
-      <w:r>
-        <w:pict w14:anchorId="25751FDD">
-          <v:rect id="_x0000_i1146" style="width:0;height:1.5pt" o:hralign="center" o:hrstd="t" o:hr="t" fillcolor="#a0a0a0" stroked="f"/>
-        </w:pict>
-      </w:r>
-    </w:p>
-    <w:p>
-      <w:pPr>
-        <w:pStyle w:val="SPSubheading"/>
-      </w:pPr>
-      <w:r>
-        <w:t>Reflection</w:t>
-      </w:r>
-    </w:p>
-    <w:p>
-      <w:pPr>
-        <w:pStyle w:val="SPBodyText"/>
-      </w:pPr>
-      <w:r>
-        <w:t>Each prayer is accompanied by a reflection intended to encourage quiet consideration.</w:t>
-      </w:r>
-    </w:p>
-    <w:p>
-      <w:pPr>
-        <w:pStyle w:val="SPBodyText"/>
-      </w:pPr>
-      <w:r>
-        <w:t>These reflections are not intended to replace personal prayer, the teaching of the Church, or the guidance of a priest or spiritual director. They are simply another way of approaching the words we pray.</w:t>
-      </w:r>
-    </w:p>
-    <w:p>
-      <w:pPr>
-        <w:pStyle w:val="SPBodyText"/>
-      </w:pPr>
-      <w:r>
-        <w:t>Read a reflection slowly.</w:t>
-      </w:r>
-    </w:p>
-    <w:p>
-      <w:pPr>
-        <w:pStyle w:val="SPBodyText"/>
-      </w:pPr>
-      <w:r>
-        <w:t>A particular sentence may speak to you one day and mean very little the next. Another may remain with you for hours.</w:t>
-      </w:r>
-    </w:p>
-    <w:p>
-      <w:pPr>
-        <w:pStyle w:val="SPBodyText"/>
-      </w:pPr>
-      <w:r>
-        <w:t>That is perfectly natural.</w:t>
-      </w:r>
-    </w:p>
-    <w:p>
-      <w:pPr>
-        <w:pStyle w:val="SPBodyText"/>
-      </w:pPr>
-      <w:r>
-        <w:t>Prayer does not always produce an immediate answer. Sometimes it simply teaches us to remain present.</w:t>
-      </w:r>
-    </w:p>
-    <w:p>
-      <w:pPr>
-        <w:pStyle w:val="SPBodyText"/>
-      </w:pPr>
-      <w:r>
-        <w:pict w14:anchorId="19542BB1">
-          <v:rect id="_x0000_i1147" style="width:0;height:1.5pt" o:hralign="center" o:hrstd="t" o:hr="t" fillcolor="#a0a0a0" stroked="f"/>
-        </w:pict>
-      </w:r>
-    </w:p>
-    <w:p>
-      <w:pPr>
-        <w:pStyle w:val="SPSubheading"/>
-      </w:pPr>
-      <w:r>
-        <w:t>Latin Vocabulary</w:t>
-      </w:r>
-    </w:p>
-    <w:p>
-      <w:pPr>
-        <w:pStyle w:val="SPBodyText"/>
-      </w:pPr>
-      <w:r>
-        <w:t>The Latin vocabulary sections introduce selected words and expressions from the prayers.</w:t>
-      </w:r>
-    </w:p>
-    <w:p>
-      <w:pPr>
-        <w:pStyle w:val="SPBodyText"/>
-      </w:pPr>
-      <w:r>
-        <w:t>You do not need to memorise them.</w:t>
-      </w:r>
-    </w:p>
-    <w:p>
-      <w:pPr>
-        <w:pStyle w:val="SPBodyText"/>
-      </w:pPr>
-      <w:r>
-        <w:lastRenderedPageBreak/>
-        <w:t>Instead, allow them to become familiar.</w:t>
-      </w:r>
-    </w:p>
-    <w:p>
-      <w:pPr>
-        <w:pStyle w:val="SPBodyText"/>
-      </w:pPr>
-      <w:r>
-        <w:t>A word encountered several times gradually becomes recognisable. A phrase that once appeared completely unfamiliar may eventually become something you can understand without translation.</w:t>
-      </w:r>
-    </w:p>
-    <w:p>
-      <w:pPr>
-        <w:pStyle w:val="SPBodyText"/>
-      </w:pPr>
-      <w:r>
-        <w:t>In this way, the Latin becomes less distant.</w:t>
-      </w:r>
-    </w:p>
-    <w:p>
-      <w:pPr>
-        <w:pStyle w:val="SPBodyText"/>
-      </w:pPr>
-      <w:r>
-        <w:t>It becomes part of the prayer.</w:t>
-      </w:r>
-    </w:p>
-    <w:p>
-      <w:pPr>
-        <w:pStyle w:val="SPBodyText"/>
-      </w:pPr>
-      <w:r>
-        <w:pict w14:anchorId="4D1CE6F0">
-          <v:rect id="_x0000_i1148" style="width:0;height:1.5pt" o:hralign="center" o:hrstd="t" o:hr="t" fillcolor="#a0a0a0" stroked="f"/>
-        </w:pict>
-      </w:r>
-    </w:p>
-    <w:p>
-      <w:pPr>
-        <w:pStyle w:val="SPSubheading"/>
-      </w:pPr>
-      <w:r>
-        <w:t>Prayer Through the Day</w:t>
-      </w:r>
-    </w:p>
-    <w:p>
-      <w:pPr>
-        <w:pStyle w:val="SPBodyText"/>
-      </w:pPr>
-      <w:r>
-        <w:t xml:space="preserve">The suggested prayer times are exactly that: </w:t>
-      </w:r>
-    </w:p>
-    <w:p>
-      <w:pPr>
-        <w:pStyle w:val="SPBodyText"/>
-      </w:pPr>
-    </w:p>
-    <w:p>
-      <w:pPr>
-        <w:pStyle w:val="SPBodyText"/>
-      </w:pPr>
-      <w:r>
-        <w:t>S</w:t>
-      </w:r>
-      <w:r>
-        <w:t>uggestions.</w:t>
-      </w:r>
-    </w:p>
-    <w:p>
-      <w:pPr>
-        <w:pStyle w:val="SPBodyText"/>
-      </w:pPr>
-    </w:p>
-    <w:p>
-      <w:pPr>
-        <w:pStyle w:val="SPBodyText"/>
-      </w:pPr>
-      <w:r>
-        <w:t>A morning prayer may help begin the day with gratitude and intention. A prayer during the day may provide a moment of stillness amid work and responsibilities. An evening prayer may help us give thanks for the day that has passed and place tomorrow into God's hands.</w:t>
-      </w:r>
-    </w:p>
-    <w:p>
-      <w:pPr>
-        <w:pStyle w:val="SPBodyText"/>
-      </w:pPr>
-      <w:r>
-        <w:t>These suggestions are not rules.</w:t>
-      </w:r>
-    </w:p>
-    <w:p>
-      <w:pPr>
-        <w:pStyle w:val="SPBodyText"/>
-      </w:pPr>
-      <w:r>
-        <w:t>Life is rarely predictable, and prayer should not become another source of pressure.</w:t>
-      </w:r>
-    </w:p>
-    <w:p>
-      <w:pPr>
-        <w:pStyle w:val="SPBodyText"/>
-      </w:pPr>
-      <w:r>
-        <w:t>If the suggested time does not suit you, choose another.</w:t>
-      </w:r>
-    </w:p>
-    <w:p>
-      <w:pPr>
-        <w:pStyle w:val="SPBodyText"/>
-      </w:pPr>
-      <w:r>
-        <w:t>If you have only a few minutes, use those minutes.</w:t>
-      </w:r>
-    </w:p>
-    <w:p>
-      <w:pPr>
-        <w:pStyle w:val="SPBodyText"/>
-      </w:pPr>
-      <w:r>
-        <w:t>If you miss a day, simply begin again.</w:t>
-      </w:r>
-    </w:p>
-    <w:p>
-      <w:pPr>
-        <w:pStyle w:val="SPBodyText"/>
-      </w:pPr>
-      <w:r>
-        <w:t>There is no failure in returning to prayer.</w:t>
-      </w:r>
-    </w:p>
-    <w:p>
-      <w:pPr>
-        <w:pStyle w:val="SPBodyText"/>
-      </w:pPr>
-      <w:r>
-        <w:pict w14:anchorId="68D46385">
-          <v:rect id="_x0000_i1149" style="width:0;height:1.5pt" o:hralign="center" o:hrstd="t" o:hr="t" fillcolor="#a0a0a0" stroked="f"/>
-        </w:pict>
-      </w:r>
-    </w:p>
-    <w:p>
-      <w:pPr>
-        <w:pStyle w:val="SPSubheading"/>
-      </w:pPr>
-      <w:r>
-        <w:lastRenderedPageBreak/>
-        <w:t>A Simple Way to Begin</w:t>
-      </w:r>
-    </w:p>
-    <w:p>
-      <w:pPr>
-        <w:pStyle w:val="SPBodyText"/>
-      </w:pPr>
-      <w:r>
-        <w:t>A useful pattern is simply:</w:t>
-      </w:r>
-    </w:p>
-    <w:p>
-      <w:pPr>
-        <w:pStyle w:val="SPBodyText"/>
-      </w:pPr>
-    </w:p>
-    <w:p>
-      <w:pPr>
-        <w:pStyle w:val="SPBodyText"/>
-      </w:pPr>
-      <w:r>
-        <w:t>Read.</w:t>
-      </w:r>
-      <w:r>
-        <w:br/>
-        <w:t>Reflect.</w:t>
-      </w:r>
-      <w:r>
-        <w:br/>
-        <w:t>Pray.</w:t>
-      </w:r>
-      <w:r>
-        <w:br/>
-        <w:t>Return.</w:t>
-      </w:r>
-    </w:p>
-    <w:p>
-      <w:pPr>
-        <w:pStyle w:val="SPBodyText"/>
-      </w:pPr>
-    </w:p>
-    <w:p>
-      <w:pPr>
-        <w:pStyle w:val="SPBodyText"/>
-      </w:pPr>
-      <w:r>
-        <w:t>Read the prayer slowly.</w:t>
-      </w:r>
-    </w:p>
-    <w:p>
-      <w:pPr>
-        <w:pStyle w:val="SPBodyText"/>
-      </w:pPr>
-      <w:r>
-        <w:t>Consider what its words are asking of you.</w:t>
-      </w:r>
-    </w:p>
-    <w:p>
-      <w:pPr>
-        <w:pStyle w:val="SPBodyText"/>
-      </w:pPr>
-      <w:r>
-        <w:t>Reflect on the Scripture and the meaning behind the prayer.</w:t>
-      </w:r>
-    </w:p>
-    <w:p>
-      <w:pPr>
-        <w:pStyle w:val="SPBodyText"/>
-      </w:pPr>
-      <w:r>
-        <w:t>Then pray it.</w:t>
-      </w:r>
-    </w:p>
-    <w:p>
-      <w:pPr>
-        <w:pStyle w:val="SPBodyText"/>
-      </w:pPr>
-      <w:r>
-        <w:t>Do not worry about finding the perfect words or creating the perfect environment. Prayer can happen in a quiet church, at a kitchen table, beside a child's bed, during a morning commute, or in the silence of a room before sleep.</w:t>
-      </w:r>
-    </w:p>
-    <w:p>
-      <w:pPr>
-        <w:pStyle w:val="SPBodyText"/>
-      </w:pPr>
-      <w:r>
-        <w:t>What matters is turning towards God.</w:t>
-      </w:r>
-    </w:p>
-    <w:p>
-      <w:pPr>
-        <w:pStyle w:val="SPBodyText"/>
-      </w:pPr>
-      <w:r>
-        <w:t>Over time, a prayer that once required deliberate attention may become part of the natural rhythm of the day.</w:t>
-      </w:r>
-    </w:p>
-    <w:p>
-      <w:pPr>
-        <w:pStyle w:val="SPBodyText"/>
-      </w:pPr>
-      <w:r>
-        <w:t>That is one of the gifts of traditional prayer.</w:t>
-      </w:r>
-    </w:p>
-    <w:p>
-      <w:pPr>
-        <w:pStyle w:val="SPBodyText"/>
-      </w:pPr>
-      <w:r>
-        <w:t>It gives us words when our own words are difficult to find.</w:t>
-      </w:r>
-    </w:p>
-    <w:p>
-      <w:pPr>
-        <w:pStyle w:val="SPBodyText"/>
-      </w:pPr>
-      <w:r>
-        <w:pict w14:anchorId="36FAD975">
-          <v:rect id="_x0000_i1150" style="width:0;height:1.5pt" o:hralign="center" o:hrstd="t" o:hr="t" fillcolor="#a0a0a0" stroked="f"/>
-        </w:pict>
-      </w:r>
-    </w:p>
-    <w:p>
-      <w:pPr>
-        <w:pStyle w:val="SPBodyText"/>
-      </w:pPr>
-      <w:r>
+        <w:t>This volume brings together a selection of traditional Catholic prayers, arranged in four sections:</w:t>
+      </w:r>
+    </w:p>
+    <w:p>
+      <w:pPr>
+        <w:pStyle w:val="SPBodyText"/>
+        <w:numPr>
+          <w:ilvl w:val="0"/>
+          <w:numId w:val="7"/>
+        </w:numPr>
+        <w:rPr>
+          <w:b/>
+          <w:bCs/>
+        </w:rPr>
+      </w:pPr>
+      <w:r>
+        <w:rPr>
+          <w:b/>
+          <w:bCs/>
+        </w:rPr>
+        <w:t>Basic prayers</w:t>
+      </w:r>
+    </w:p>
+    <w:p>
+      <w:pPr>
+        <w:pStyle w:val="SPBodyText"/>
+      </w:pPr>
+      <w:r>
+        <w:t>The prayers that form part of the foundation of Catholic prayer</w:t>
+      </w:r>
+    </w:p>
+    <w:p>
+      <w:pPr>
+        <w:pStyle w:val="SPBodyText"/>
+        <w:numPr>
+          <w:ilvl w:val="0"/>
+          <w:numId w:val="7"/>
+        </w:numPr>
+        <w:rPr>
+          <w:b/>
+          <w:bCs/>
+        </w:rPr>
+      </w:pPr>
+      <w:r>
+        <w:rPr>
+          <w:b/>
+          <w:bCs/>
+        </w:rPr>
+        <w:t>Gospel canticles</w:t>
+      </w:r>
+    </w:p>
+    <w:p>
+      <w:pPr>
+        <w:pStyle w:val="SPBodyText"/>
         <w:rPr>
           <w:i/>
           <w:iCs/>
         </w:rPr>
-        <w:lastRenderedPageBreak/>
-        <w:t>Sacrae Preces</w:t>
-      </w:r>
-      <w:r>
-        <w:t xml:space="preserve"> is therefore not meant to </w:t>
-      </w:r>
-      <w:proofErr w:type="gramStart"/>
-      <w:r>
-        <w:t>be something that is</w:t>
-      </w:r>
-      <w:proofErr w:type="gramEnd"/>
-      <w:r>
-        <w:t xml:space="preserve"> simply read once and placed back on a shelf.</w:t>
-      </w:r>
-    </w:p>
-    <w:p>
-      <w:pPr>
-        <w:pStyle w:val="SPBodyText"/>
-      </w:pPr>
-    </w:p>
-    <w:p>
-      <w:pPr>
-        <w:pStyle w:val="SPBodyText"/>
-      </w:pPr>
-      <w:r>
-        <w:t>Return to it.</w:t>
-      </w:r>
-    </w:p>
-    <w:p>
-      <w:pPr>
-        <w:pStyle w:val="SPBodyText"/>
-      </w:pPr>
-      <w:r>
-        <w:t>Pray the same prayer repeatedly.</w:t>
-      </w:r>
-    </w:p>
-    <w:p>
-      <w:pPr>
-        <w:pStyle w:val="SPBodyText"/>
-      </w:pPr>
-      <w:r>
-        <w:t>Learn a word of Latin.</w:t>
-      </w:r>
-    </w:p>
-    <w:p>
-      <w:pPr>
-        <w:pStyle w:val="SPBodyText"/>
-      </w:pPr>
-      <w:r>
-        <w:t>Read a passage of Scripture.</w:t>
-      </w:r>
-    </w:p>
-    <w:p>
-      <w:pPr>
-        <w:pStyle w:val="SPBodyText"/>
-      </w:pPr>
-      <w:r>
-        <w:t>Sit with a reflection.</w:t>
-      </w:r>
-    </w:p>
-    <w:p>
-      <w:pPr>
-        <w:pStyle w:val="SPBodyText"/>
-      </w:pPr>
-      <w:r>
-        <w:t>Teach a prayer to someone else.</w:t>
-      </w:r>
-    </w:p>
-    <w:p>
-      <w:pPr>
-        <w:pStyle w:val="SPBodyText"/>
-      </w:pPr>
-      <w:r>
-        <w:t>And then come back tomorrow.</w:t>
-      </w:r>
-    </w:p>
-    <w:p>
-      <w:pPr>
-        <w:pStyle w:val="SPBodyText"/>
-      </w:pPr>
-      <w:r>
-        <w:t>The goal is not to finish the book.</w:t>
-      </w:r>
-    </w:p>
-    <w:p>
-      <w:pPr>
-        <w:pStyle w:val="SPBodyText"/>
-      </w:pPr>
-      <w:r>
-        <w:t xml:space="preserve">The goal is to </w:t>
-      </w:r>
-      <w:r>
-        <w:rPr>
-          <w:b/>
-          <w:bCs/>
-        </w:rPr>
-        <w:t>pray</w:t>
-      </w:r>
-      <w:r>
-        <w:t>.</w:t>
-      </w:r>
-    </w:p>
-    <w:p>
-      <w:pPr>
-        <w:pStyle w:val="SPBodyText"/>
-        <w:ind w:left="0" w:firstLine="0"/>
-      </w:pPr>
-    </w:p>
-    <w:p>
-      <w:pPr>
-        <w:pStyle w:val="SPBodyText"/>
-      </w:pPr>
-      <w:r>
-        <w:t>The Sign of the Cross stands at the beginning of this collection not simply as a prayer, but as the gesture by which Christians traditionally begin and conclude their prayer. It reminds us that prayer is offered in the name of the Father, and of the Son, and of the Holy Spirit.</w:t>
-      </w:r>
-    </w:p>
-    <w:p>
-      <w:pPr>
-        <w:pStyle w:val="SPBodyText"/>
-      </w:pPr>
-    </w:p>
-    <w:p>
-      <w:pPr>
-        <w:jc w:val="center"/>
-        <w:rPr>
-          <w:rFonts w:ascii="Segoe UI Symbol" w:hAnsi="Segoe UI Symbol" w:cs="Segoe UI Symbol"/>
-        </w:rPr>
+      </w:pPr>
+      <w:r>
+        <w:t xml:space="preserve">The great canticles found in the Gospel of Luke: the </w:t>
+      </w:r>
+      <w:r>
+        <w:rPr>
+          <w:i/>
+          <w:iCs/>
+        </w:rPr>
+        <w:t xml:space="preserve">Benedictus, Magnificat, </w:t>
+      </w:r>
+      <w:r>
+        <w:t xml:space="preserve">and </w:t>
+      </w:r>
+      <w:r>
+        <w:rPr>
+          <w:i/>
+          <w:iCs/>
+        </w:rPr>
+        <w:t>Nunc Dimittis.</w:t>
+      </w:r>
+    </w:p>
+    <w:p>
+      <w:pPr>
+        <w:pStyle w:val="SPBodyText"/>
+        <w:numPr>
+          <w:ilvl w:val="0"/>
+          <w:numId w:val="7"/>
+        </w:numPr>
+        <w:rPr>
+          <w:b/>
+          <w:bCs/>
+        </w:rPr>
+      </w:pPr>
+      <w:r>
+        <w:rPr>
+          <w:b/>
+          <w:bCs/>
+        </w:rPr>
+        <w:t>Devotional prayers</w:t>
+      </w:r>
+    </w:p>
+    <w:p>
+      <w:pPr>
+        <w:pStyle w:val="SPBodyText"/>
+      </w:pPr>
+      <w:r>
+        <w:t>Prayers that invite a more personal and contemplative turning towards Christ.</w:t>
+      </w:r>
+    </w:p>
+    <w:p>
+      <w:pPr>
+        <w:pStyle w:val="SPBodyText"/>
+        <w:numPr>
+          <w:ilvl w:val="0"/>
+          <w:numId w:val="7"/>
+        </w:numPr>
+        <w:rPr>
+          <w:b/>
+          <w:bCs/>
+        </w:rPr>
+      </w:pPr>
+      <w:r>
+        <w:rPr>
+          <w:b/>
+          <w:bCs/>
+        </w:rPr>
+        <w:t>Protection and intercession</w:t>
+      </w:r>
+    </w:p>
+    <w:p>
+      <w:pPr>
+        <w:pStyle w:val="SPBodyText"/>
+      </w:pPr>
+      <w:r>
+        <w:t>Prayers seeking God’s protection and the intercession of the angels and saints.</w:t>
+      </w:r>
+    </w:p>
+    <w:p>
+      <w:pPr>
+        <w:pStyle w:val="SPBodyText"/>
+      </w:pPr>
+    </w:p>
+    <w:p>
+      <w:pPr>
+        <w:pStyle w:val="SPBodyText"/>
+      </w:pPr>
+      <w:r>
+        <w:t>The sections provide a simple structure, but they are not intended to impose an order upon prayer. You may begin anywhere and return to any prayer as often as you wish.</w:t>
+      </w:r>
+    </w:p>
+    <w:p>
+      <w:pPr>
+        <w:pStyle w:val="SPSubheading"/>
         <w:sectPr>
           <w:type w:val="evenPage"/>
           <w:pgSz w:w="7920" w:h="12240" w:code="6"/>
@@ -1725,6 +1270,983 @@
           <w:docGrid w:linePitch="360"/>
         </w:sectPr>
       </w:pPr>
+    </w:p>
+    <w:p>
+      <w:pPr>
+        <w:pStyle w:val="SPSubheading"/>
+      </w:pPr>
+      <w:r>
+        <w:lastRenderedPageBreak/>
+        <w:t>English and Latin</w:t>
+      </w:r>
+    </w:p>
+    <w:p>
+      <w:pPr>
+        <w:pStyle w:val="SPBodyText"/>
+      </w:pPr>
+      <w:r>
+        <w:t xml:space="preserve">Each prayer in this volume is presented with both its </w:t>
+      </w:r>
+      <w:r>
+        <w:rPr>
+          <w:b/>
+          <w:bCs/>
+        </w:rPr>
+        <w:t>English and Latin forms</w:t>
+      </w:r>
+      <w:r>
+        <w:t>.</w:t>
+      </w:r>
+    </w:p>
+    <w:p>
+      <w:pPr>
+        <w:pStyle w:val="SPBodyText"/>
+      </w:pPr>
+      <w:r>
+        <w:t>The English text allows the meaning of the prayer to be understood clearly, while the Latin provides an opportunity to encounter the same prayer in the language that has accompanied the Western Church for centuries.</w:t>
+      </w:r>
+    </w:p>
+    <w:p>
+      <w:pPr>
+        <w:pStyle w:val="SPBodyText"/>
+      </w:pPr>
+      <w:r>
+        <w:t xml:space="preserve">There is no requirement to learn Latin </w:t>
+      </w:r>
+      <w:proofErr w:type="gramStart"/>
+      <w:r>
+        <w:t>in order to</w:t>
+      </w:r>
+      <w:proofErr w:type="gramEnd"/>
+      <w:r>
+        <w:t xml:space="preserve"> use this book.</w:t>
+      </w:r>
+    </w:p>
+    <w:p>
+      <w:pPr>
+        <w:pStyle w:val="SPBodyText"/>
+      </w:pPr>
+      <w:r>
+        <w:t>Read the English first if it is more familiar to you. Consider the meaning of the words and the intention behind the prayer. Then, if you wish, return to the Latin. Read it slowly. Listen to the rhythm of the words. Over time, familiar words and phrases will begin to emerge.</w:t>
+      </w:r>
+    </w:p>
+    <w:p>
+      <w:pPr>
+        <w:pStyle w:val="SPBodyText"/>
+      </w:pPr>
+      <w:r>
+        <w:t>Even learning a single word can be worthwhile.</w:t>
+      </w:r>
+    </w:p>
+    <w:p>
+      <w:pPr>
+        <w:pStyle w:val="SPBodyText"/>
+      </w:pPr>
+      <w:r>
+        <w:t>The purpose is not to master a language, but to become more familiar with the prayers themselves.</w:t>
+      </w:r>
+    </w:p>
+    <w:p>
+      <w:pPr>
+        <w:pStyle w:val="SPBodyText"/>
+      </w:pPr>
+      <w:r>
+        <w:pict w14:anchorId="249FE732">
+          <v:rect id="_x0000_i1323" style="width:0;height:1.5pt" o:hralign="center" o:hrstd="t" o:hr="t" fillcolor="#a0a0a0" stroked="f"/>
+        </w:pict>
+      </w:r>
+    </w:p>
+    <w:p>
+      <w:pPr>
+        <w:pStyle w:val="SPSubheading"/>
+        <w:sectPr>
+          <w:type w:val="evenPage"/>
+          <w:pgSz w:w="7920" w:h="12240" w:code="6"/>
+          <w:pgMar w:top="1080" w:right="864" w:bottom="1080" w:left="1152" w:header="576" w:footer="576" w:gutter="0"/>
+          <w:cols w:space="720"/>
+          <w:titlePg/>
+          <w:docGrid w:linePitch="360"/>
+        </w:sectPr>
+      </w:pPr>
+    </w:p>
+    <w:p>
+      <w:pPr>
+        <w:pStyle w:val="SPSubheading"/>
+      </w:pPr>
+      <w:r>
+        <w:lastRenderedPageBreak/>
+        <w:t>The Prayer</w:t>
+      </w:r>
+    </w:p>
+    <w:p>
+      <w:pPr>
+        <w:pStyle w:val="SPBodyText"/>
+      </w:pPr>
+      <w:r>
+        <w:t>Each prayer follows a simple pattern</w:t>
+      </w:r>
+    </w:p>
+    <w:p>
+      <w:pPr>
+        <w:pStyle w:val="SPBodyText"/>
+      </w:pPr>
+      <w:r>
+        <w:rPr>
+          <w:b/>
+          <w:bCs/>
+        </w:rPr>
+        <w:t>Introduction</w:t>
+      </w:r>
+      <w:r>
+        <w:br/>
+        <w:t>A brief explanation of the prayer, its origins, meaning, or place in the life of the Church.</w:t>
+      </w:r>
+    </w:p>
+    <w:p>
+      <w:pPr>
+        <w:pStyle w:val="SPBodyText"/>
+      </w:pPr>
+      <w:r>
+        <w:rPr>
+          <w:b/>
+          <w:bCs/>
+        </w:rPr>
+        <w:t>English</w:t>
+      </w:r>
+      <w:r>
+        <w:br/>
+        <w:t>The prayer in English, allowing its meaning to be understood and contemplated.</w:t>
+      </w:r>
+    </w:p>
+    <w:p>
+      <w:pPr>
+        <w:pStyle w:val="SPBodyText"/>
+      </w:pPr>
+      <w:r>
+        <w:rPr>
+          <w:b/>
+          <w:bCs/>
+        </w:rPr>
+        <w:t>Latin</w:t>
+      </w:r>
+      <w:r>
+        <w:br/>
+        <w:t>The traditional Latin form of the prayer.</w:t>
+      </w:r>
+    </w:p>
+    <w:p>
+      <w:pPr>
+        <w:pStyle w:val="SPBodyText"/>
+      </w:pPr>
+      <w:r>
+        <w:rPr>
+          <w:b/>
+          <w:bCs/>
+        </w:rPr>
+        <w:t>Scripture</w:t>
+      </w:r>
+      <w:r>
+        <w:br/>
+        <w:t>Biblical passages connected to the prayer, where appropriate.</w:t>
+      </w:r>
+    </w:p>
+    <w:p>
+      <w:pPr>
+        <w:pStyle w:val="SPBodyText"/>
+      </w:pPr>
+      <w:r>
+        <w:rPr>
+          <w:b/>
+          <w:bCs/>
+        </w:rPr>
+        <w:t>Reflection</w:t>
+      </w:r>
+      <w:r>
+        <w:br/>
+        <w:t>A quiet meditation intended to help the reader consider the mystery, teaching, or invitation contained within the prayer.</w:t>
+      </w:r>
+    </w:p>
+    <w:p>
+      <w:pPr>
+        <w:pStyle w:val="SPBodyText"/>
+      </w:pPr>
+      <w:r>
+        <w:t>This pattern is not a formula for prayer. It is simply a way of approaching each prayer from several directions.</w:t>
+      </w:r>
+    </w:p>
+    <w:p>
+      <w:pPr>
+        <w:pStyle w:val="SPBodyText"/>
+      </w:pPr>
+    </w:p>
+    <w:p>
+      <w:pPr>
+        <w:pStyle w:val="SPBodyText"/>
+      </w:pPr>
+      <w:r>
+        <w:t>Read.</w:t>
+      </w:r>
+    </w:p>
+    <w:p>
+      <w:pPr>
+        <w:pStyle w:val="SPBodyText"/>
+      </w:pPr>
+      <w:r>
+        <w:t>Understand.</w:t>
+      </w:r>
+    </w:p>
+    <w:p>
+      <w:pPr>
+        <w:pStyle w:val="SPBodyText"/>
+      </w:pPr>
+      <w:r>
+        <w:t>Listen.</w:t>
+      </w:r>
+    </w:p>
+    <w:p>
+      <w:pPr>
+        <w:pStyle w:val="SPBodyText"/>
+      </w:pPr>
+      <w:r>
+        <w:t>Reflect.</w:t>
+      </w:r>
+    </w:p>
+    <w:p>
+      <w:pPr>
+        <w:pStyle w:val="SPBodyText"/>
+      </w:pPr>
+      <w:r>
+        <w:t>Then pray.</w:t>
+      </w:r>
+    </w:p>
+    <w:p>
+      <w:pPr>
+        <w:pStyle w:val="SPBodyText"/>
+      </w:pPr>
+    </w:p>
+    <w:p>
+      <w:pPr>
+        <w:pStyle w:val="SPBodyText"/>
+      </w:pPr>
+      <w:r>
+        <w:pict w14:anchorId="5281CFCF">
+          <v:rect id="_x0000_i1329" style="width:0;height:1.5pt" o:hralign="center" o:hrstd="t" o:hr="t" fillcolor="#a0a0a0" stroked="f"/>
+        </w:pict>
+      </w:r>
+    </w:p>
+    <w:p>
+      <w:pPr>
+        <w:pStyle w:val="SPBodyText"/>
+        <w:sectPr>
+          <w:type w:val="oddPage"/>
+          <w:pgSz w:w="7920" w:h="12240" w:code="6"/>
+          <w:pgMar w:top="1080" w:right="864" w:bottom="1080" w:left="1152" w:header="576" w:footer="576" w:gutter="0"/>
+          <w:cols w:space="720"/>
+          <w:titlePg/>
+          <w:docGrid w:linePitch="360"/>
+        </w:sectPr>
+      </w:pPr>
+    </w:p>
+    <w:p>
+      <w:pPr>
+        <w:pStyle w:val="SPBodyText"/>
+      </w:pPr>
+    </w:p>
+    <w:p>
+      <w:pPr>
+        <w:pStyle w:val="SPSubheading"/>
+      </w:pPr>
+      <w:r>
+        <w:t>Scripture</w:t>
+      </w:r>
+    </w:p>
+    <w:p>
+      <w:pPr>
+        <w:pStyle w:val="SPBodyText"/>
+      </w:pPr>
+      <w:r>
+        <w:t xml:space="preserve">The prayers are accompanied by references to </w:t>
+      </w:r>
+      <w:r>
+        <w:rPr>
+          <w:b/>
+          <w:bCs/>
+        </w:rPr>
+        <w:t>Sacred Scripture</w:t>
+      </w:r>
+      <w:r>
+        <w:t xml:space="preserve"> wherever appropriate.</w:t>
+      </w:r>
+    </w:p>
+    <w:p>
+      <w:pPr>
+        <w:pStyle w:val="SPBodyText"/>
+      </w:pPr>
+      <w:r>
+        <w:t>These references are not intended to suggest that every prayer can be reduced to a single biblical passage. Rather, they provide a glimpse into the rich scriptural foundation from which Christian prayer has grown.</w:t>
+      </w:r>
+    </w:p>
+    <w:p>
+      <w:pPr>
+        <w:pStyle w:val="SPBodyText"/>
+      </w:pPr>
+    </w:p>
+    <w:p>
+      <w:pPr>
+        <w:pStyle w:val="SPBodyText"/>
+        <w:rPr>
+          <w:b/>
+          <w:bCs/>
+        </w:rPr>
+      </w:pPr>
+      <w:r>
+        <w:rPr>
+          <w:b/>
+          <w:bCs/>
+        </w:rPr>
+        <w:t>Take time to read the passages.</w:t>
+      </w:r>
+    </w:p>
+    <w:p>
+      <w:pPr>
+        <w:pStyle w:val="SPBodyText"/>
+      </w:pPr>
+    </w:p>
+    <w:p>
+      <w:pPr>
+        <w:pStyle w:val="SPBodyText"/>
+      </w:pPr>
+      <w:r>
+        <w:t>A prayer may take on a different meaning when its words are considered alongside Scripture. A familiar phrase may suddenly become more meaningful. A petition that we have spoken many times may reveal something we had previously overlooked.</w:t>
+      </w:r>
+    </w:p>
+    <w:p>
+      <w:pPr>
+        <w:pStyle w:val="SPBodyText"/>
+      </w:pPr>
+      <w:r>
+        <w:t>The Scripture references are therefore invitations to explore rather than requirements to complete.</w:t>
+      </w:r>
+    </w:p>
+    <w:p>
+      <w:pPr>
+        <w:pStyle w:val="SPBodyText"/>
+      </w:pPr>
+      <w:r>
+        <w:pict w14:anchorId="25751FDD">
+          <v:rect id="_x0000_i1324" style="width:0;height:1.5pt" o:hralign="center" o:hrstd="t" o:hr="t" fillcolor="#a0a0a0" stroked="f"/>
+        </w:pict>
+      </w:r>
+    </w:p>
+    <w:p>
+      <w:pPr>
+        <w:pStyle w:val="SPSubheading"/>
+      </w:pPr>
+      <w:r>
+        <w:t>Reflection</w:t>
+      </w:r>
+    </w:p>
+    <w:p>
+      <w:pPr>
+        <w:pStyle w:val="SPBodyText"/>
+      </w:pPr>
+      <w:r>
+        <w:t>Each prayer is accompanied by a reflection intended to encourage quiet consideration.</w:t>
+      </w:r>
+    </w:p>
+    <w:p>
+      <w:pPr>
+        <w:pStyle w:val="SPBodyText"/>
+      </w:pPr>
+      <w:r>
+        <w:t>These reflections are not intended to replace personal prayer, the teaching of the Church, or the guidance of a priest or spiritual director. They are simply another way of approaching the words we pray.</w:t>
+      </w:r>
+    </w:p>
+    <w:p>
+      <w:pPr>
+        <w:pStyle w:val="SPBodyText"/>
+      </w:pPr>
+      <w:r>
+        <w:t>Read a reflection slowly.</w:t>
+      </w:r>
+    </w:p>
+    <w:p>
+      <w:pPr>
+        <w:pStyle w:val="SPBodyText"/>
+      </w:pPr>
+      <w:r>
+        <w:lastRenderedPageBreak/>
+        <w:t>A particular sentence may speak to you one day and mean very little the next. Another may remain with you for hours.</w:t>
+      </w:r>
+      <w:r>
+        <w:t xml:space="preserve"> </w:t>
+      </w:r>
+      <w:r>
+        <w:t>That is perfectly natural.</w:t>
+      </w:r>
+    </w:p>
+    <w:p>
+      <w:pPr>
+        <w:pStyle w:val="SPBodyText"/>
+      </w:pPr>
+      <w:r>
+        <w:t>Prayer does not always produce an immediate answer. Sometimes it simply teaches us to remain present.</w:t>
+      </w:r>
+    </w:p>
+    <w:p>
+      <w:pPr>
+        <w:pStyle w:val="SPBodyText"/>
+      </w:pPr>
+      <w:r>
+        <w:pict w14:anchorId="19542BB1">
+          <v:rect id="_x0000_i1325" style="width:0;height:1.5pt" o:hralign="center" o:hrstd="t" o:hr="t" fillcolor="#a0a0a0" stroked="f"/>
+        </w:pict>
+      </w:r>
+    </w:p>
+    <w:p>
+      <w:pPr>
+        <w:pStyle w:val="SPSubheading"/>
+      </w:pPr>
+      <w:r>
+        <w:t>Latin Vocabulary</w:t>
+      </w:r>
+    </w:p>
+    <w:p>
+      <w:pPr>
+        <w:pStyle w:val="SPBodyText"/>
+      </w:pPr>
+      <w:r>
+        <w:t xml:space="preserve">Selected prayers are accompanied by </w:t>
+      </w:r>
+      <w:r>
+        <w:rPr>
+          <w:b/>
+          <w:bCs/>
+        </w:rPr>
+        <w:t>Latin vocabulary</w:t>
+      </w:r>
+      <w:r>
+        <w:t>, highlighting individual words or short expressions that are useful for understanding and becoming familiar with the language of the prayers.</w:t>
+      </w:r>
+    </w:p>
+    <w:p>
+      <w:pPr>
+        <w:pStyle w:val="SPBodyText"/>
+      </w:pPr>
+      <w:r>
+        <w:t>These sections are intentionally simple.</w:t>
+      </w:r>
+    </w:p>
+    <w:p>
+      <w:pPr>
+        <w:pStyle w:val="SPBodyText"/>
+      </w:pPr>
+      <w:r>
+        <w:t>You do not need to memorise the words. Allow them to become familiar.</w:t>
+      </w:r>
+    </w:p>
+    <w:p>
+      <w:pPr>
+        <w:pStyle w:val="SPBodyText"/>
+      </w:pPr>
+      <w:r>
+        <w:t>A word encountered several times gradually becomes recognisable. A phrase that once appeared completely unfamiliar may eventually become something you can understand without translation.</w:t>
+      </w:r>
+    </w:p>
+    <w:p>
+      <w:pPr>
+        <w:pStyle w:val="SPBodyText"/>
+      </w:pPr>
+      <w:r>
+        <w:t>For prayers where a short vocabulary study is particularly helpful, these words are presented alongside the prayer.</w:t>
+      </w:r>
+    </w:p>
+    <w:p>
+      <w:pPr>
+        <w:pStyle w:val="SPBodyText"/>
+      </w:pPr>
+      <w:r>
+        <w:t xml:space="preserve">For a wider exploration of the language, a </w:t>
+      </w:r>
+      <w:r>
+        <w:rPr>
+          <w:b/>
+          <w:bCs/>
+        </w:rPr>
+        <w:t>Latin Glossary</w:t>
+      </w:r>
+      <w:r>
+        <w:t xml:space="preserve"> of common words and expressions used throughout </w:t>
+      </w:r>
+      <w:r>
+        <w:rPr>
+          <w:i/>
+          <w:iCs/>
+        </w:rPr>
+        <w:t>Sacrae Preces</w:t>
+      </w:r>
+      <w:r>
+        <w:t xml:space="preserve"> is provided at the end of the book.</w:t>
+      </w:r>
+    </w:p>
+    <w:p>
+      <w:pPr>
+        <w:pStyle w:val="SPBodyText"/>
+      </w:pPr>
+      <w:r>
+        <w:t>In this way, the Latin becomes less distant.</w:t>
+      </w:r>
+    </w:p>
+    <w:p>
+      <w:pPr>
+        <w:pStyle w:val="SPBodyText"/>
+      </w:pPr>
+      <w:r>
+        <w:t>It becomes part of the prayer.</w:t>
+      </w:r>
+    </w:p>
+    <w:p>
+      <w:pPr>
+        <w:pStyle w:val="SPBodyText"/>
+      </w:pPr>
+      <w:r>
+        <w:pict w14:anchorId="4D1CE6F0">
+          <v:rect id="_x0000_i1326" style="width:0;height:1.5pt" o:hralign="center" o:hrstd="t" o:hr="t" fillcolor="#a0a0a0" stroked="f"/>
+        </w:pict>
+      </w:r>
+    </w:p>
+    <w:p>
+      <w:pPr>
+        <w:pStyle w:val="SPSubheading"/>
+      </w:pPr>
+      <w:r>
+        <w:lastRenderedPageBreak/>
+        <w:t>Prayer Through the Day</w:t>
+      </w:r>
+    </w:p>
+    <w:p>
+      <w:pPr>
+        <w:pStyle w:val="SPBodyText"/>
+      </w:pPr>
+      <w:r>
+        <w:t xml:space="preserve">The suggested prayer times are exactly that: </w:t>
+      </w:r>
+    </w:p>
+    <w:p>
+      <w:pPr>
+        <w:pStyle w:val="SPBodyText"/>
+      </w:pPr>
+    </w:p>
+    <w:p>
+      <w:pPr>
+        <w:pStyle w:val="SPBodyText"/>
+      </w:pPr>
+      <w:r>
+        <w:t>S</w:t>
+      </w:r>
+      <w:r>
+        <w:t>uggestions.</w:t>
+      </w:r>
+    </w:p>
+    <w:p>
+      <w:pPr>
+        <w:pStyle w:val="SPBodyText"/>
+      </w:pPr>
+    </w:p>
+    <w:p>
+      <w:pPr>
+        <w:pStyle w:val="SPBodyText"/>
+      </w:pPr>
+      <w:r>
+        <w:t>A morning prayer may help begin the day with gratitude and intention. A prayer during the day may provide a moment of stillness amid work and responsibilities. An evening prayer may help us give thanks for the day that has passed and place tomorrow into God's hands.</w:t>
+      </w:r>
+    </w:p>
+    <w:p>
+      <w:pPr>
+        <w:pStyle w:val="SPBodyText"/>
+      </w:pPr>
+      <w:r>
+        <w:t>These suggestions are not rules.</w:t>
+      </w:r>
+    </w:p>
+    <w:p>
+      <w:pPr>
+        <w:pStyle w:val="SPBodyText"/>
+      </w:pPr>
+      <w:r>
+        <w:t>Life is rarely predictable, and prayer should not become another source of pressure.</w:t>
+      </w:r>
+    </w:p>
+    <w:p>
+      <w:pPr>
+        <w:pStyle w:val="SPBodyText"/>
+      </w:pPr>
+      <w:r>
+        <w:t>If the suggested time does not suit you, choose another.</w:t>
+      </w:r>
+    </w:p>
+    <w:p>
+      <w:pPr>
+        <w:pStyle w:val="SPBodyText"/>
+      </w:pPr>
+      <w:r>
+        <w:t>If you have only a few minutes, use those minutes.</w:t>
+      </w:r>
+    </w:p>
+    <w:p>
+      <w:pPr>
+        <w:pStyle w:val="SPBodyText"/>
+      </w:pPr>
+      <w:r>
+        <w:t>If you miss a day, simply begin again.</w:t>
+      </w:r>
+    </w:p>
+    <w:p>
+      <w:pPr>
+        <w:pStyle w:val="SPBodyText"/>
+      </w:pPr>
+      <w:r>
+        <w:t>There is no failure in returning to prayer.</w:t>
+      </w:r>
+    </w:p>
+    <w:p>
+      <w:pPr>
+        <w:pStyle w:val="SPBodyText"/>
+      </w:pPr>
+      <w:r>
+        <w:pict w14:anchorId="68D46385">
+          <v:rect id="_x0000_i1327" style="width:0;height:1.5pt" o:hralign="center" o:hrstd="t" o:hr="t" fillcolor="#a0a0a0" stroked="f"/>
+        </w:pict>
+      </w:r>
+    </w:p>
+    <w:p>
+      <w:pPr>
+        <w:pStyle w:val="SPSubheading"/>
+      </w:pPr>
+      <w:r>
+        <w:t>A Simple Way to Begin</w:t>
+      </w:r>
+    </w:p>
+    <w:p>
+      <w:pPr>
+        <w:pStyle w:val="SPBodyText"/>
+      </w:pPr>
+      <w:r>
+        <w:t>A useful pattern is simply:</w:t>
+      </w:r>
+    </w:p>
+    <w:p>
+      <w:pPr>
+        <w:pStyle w:val="SPBodyText"/>
+      </w:pPr>
+    </w:p>
+    <w:p>
+      <w:pPr>
+        <w:pStyle w:val="SPBodyText"/>
+      </w:pPr>
+      <w:r>
+        <w:t>Read.</w:t>
+      </w:r>
+      <w:r>
+        <w:br/>
+        <w:t>Reflect.</w:t>
+      </w:r>
+      <w:r>
+        <w:br/>
+        <w:t>Pray.</w:t>
+      </w:r>
+      <w:r>
+        <w:br/>
+        <w:t>Return.</w:t>
+      </w:r>
+    </w:p>
+    <w:p>
+      <w:pPr>
+        <w:pStyle w:val="SPBodyText"/>
+      </w:pPr>
+    </w:p>
+    <w:p>
+      <w:pPr>
+        <w:pStyle w:val="SPBodyText"/>
+      </w:pPr>
+      <w:r>
+        <w:lastRenderedPageBreak/>
+        <w:t>Read the prayer slowly.</w:t>
+      </w:r>
+    </w:p>
+    <w:p>
+      <w:pPr>
+        <w:pStyle w:val="SPBodyText"/>
+      </w:pPr>
+      <w:r>
+        <w:t>Consider what its words are asking of you.</w:t>
+      </w:r>
+    </w:p>
+    <w:p>
+      <w:pPr>
+        <w:pStyle w:val="SPBodyText"/>
+      </w:pPr>
+      <w:r>
+        <w:t>Reflect on the Scripture and the meaning behind the prayer.</w:t>
+      </w:r>
+    </w:p>
+    <w:p>
+      <w:pPr>
+        <w:pStyle w:val="SPBodyText"/>
+      </w:pPr>
+      <w:r>
+        <w:t>Then pray it.</w:t>
+      </w:r>
+    </w:p>
+    <w:p>
+      <w:pPr>
+        <w:pStyle w:val="SPBodyText"/>
+      </w:pPr>
+      <w:r>
+        <w:t>Do not worry about finding the perfect words or creating the perfect environment. Prayer can happen in a quiet church, at a kitchen table, beside a child's bed, during a morning commute, or in the silence of a room before sleep.</w:t>
+      </w:r>
+    </w:p>
+    <w:p>
+      <w:pPr>
+        <w:pStyle w:val="SPBodyText"/>
+      </w:pPr>
+      <w:r>
+        <w:t>What matters is turning towards God.</w:t>
+      </w:r>
+    </w:p>
+    <w:p>
+      <w:pPr>
+        <w:pStyle w:val="SPBodyText"/>
+      </w:pPr>
+      <w:r>
+        <w:t>Over time, a prayer that once required deliberate attention may become part of the natural rhythm of the day.</w:t>
+      </w:r>
+    </w:p>
+    <w:p>
+      <w:pPr>
+        <w:pStyle w:val="SPBodyText"/>
+      </w:pPr>
+      <w:r>
+        <w:t>That is one of the gifts of traditional prayer.</w:t>
+      </w:r>
+    </w:p>
+    <w:p>
+      <w:pPr>
+        <w:pStyle w:val="SPBodyText"/>
+      </w:pPr>
+      <w:r>
+        <w:t>It gives us words when our own words are difficult to find.</w:t>
+      </w:r>
+    </w:p>
+    <w:p>
+      <w:pPr>
+        <w:pStyle w:val="SPBodyText"/>
+      </w:pPr>
+      <w:r>
+        <w:pict w14:anchorId="36FAD975">
+          <v:rect id="_x0000_i1328" style="width:0;height:1.5pt" o:hralign="center" o:hrstd="t" o:hr="t" fillcolor="#a0a0a0" stroked="f"/>
+        </w:pict>
+      </w:r>
+    </w:p>
+    <w:p>
+      <w:pPr>
+        <w:pStyle w:val="SPBodyText"/>
+        <w:rPr>
+          <w:b/>
+          <w:bCs/>
+        </w:rPr>
+      </w:pPr>
+      <w:r>
+        <w:rPr>
+          <w:b/>
+          <w:bCs/>
+        </w:rPr>
+        <w:t>Return</w:t>
+      </w:r>
+    </w:p>
+    <w:p>
+      <w:pPr>
+        <w:pStyle w:val="SPBodyText"/>
+      </w:pPr>
+      <w:r>
+        <w:rPr>
+          <w:i/>
+          <w:iCs/>
+        </w:rPr>
+        <w:t>Sacrae Preces</w:t>
+      </w:r>
+      <w:r>
+        <w:t xml:space="preserve"> is not meant to </w:t>
+      </w:r>
+      <w:proofErr w:type="gramStart"/>
+      <w:r>
+        <w:t>be something that is</w:t>
+      </w:r>
+      <w:proofErr w:type="gramEnd"/>
+      <w:r>
+        <w:t xml:space="preserve"> simply read once and placed back on a shelf.</w:t>
+      </w:r>
+    </w:p>
+    <w:p>
+      <w:pPr>
+        <w:pStyle w:val="SPBodyText"/>
+      </w:pPr>
+      <w:r>
+        <w:t>Return to it.</w:t>
+      </w:r>
+    </w:p>
+    <w:p>
+      <w:pPr>
+        <w:pStyle w:val="SPBodyText"/>
+      </w:pPr>
+      <w:r>
+        <w:t>Pray the same prayer repeatedly.</w:t>
+      </w:r>
+    </w:p>
+    <w:p>
+      <w:pPr>
+        <w:pStyle w:val="SPBodyText"/>
+      </w:pPr>
+      <w:r>
+        <w:t>Learn a word of Latin.</w:t>
+      </w:r>
+    </w:p>
+    <w:p>
+      <w:pPr>
+        <w:pStyle w:val="SPBodyText"/>
+      </w:pPr>
+      <w:r>
+        <w:t>Read a passage of Scripture.</w:t>
+      </w:r>
+    </w:p>
+    <w:p>
+      <w:pPr>
+        <w:pStyle w:val="SPBodyText"/>
+      </w:pPr>
+      <w:r>
+        <w:t>Sit with a reflection.</w:t>
+      </w:r>
+    </w:p>
+    <w:p>
+      <w:pPr>
+        <w:pStyle w:val="SPBodyText"/>
+      </w:pPr>
+      <w:r>
+        <w:t>Teach a prayer to someone else.</w:t>
+      </w:r>
+    </w:p>
+    <w:p>
+      <w:pPr>
+        <w:pStyle w:val="SPBodyText"/>
+      </w:pPr>
+      <w:r>
+        <w:lastRenderedPageBreak/>
+        <w:t>And then come back tomorrow.</w:t>
+      </w:r>
+    </w:p>
+    <w:p>
+      <w:pPr>
+        <w:pStyle w:val="SPBodyText"/>
+      </w:pPr>
+      <w:r>
+        <w:t>The goal is not to finish the book.</w:t>
+      </w:r>
+    </w:p>
+    <w:p>
+      <w:pPr>
+        <w:pStyle w:val="SPBodyText"/>
+      </w:pPr>
+      <w:r>
+        <w:t xml:space="preserve">The goal is to </w:t>
+      </w:r>
+      <w:r>
+        <w:rPr>
+          <w:b/>
+          <w:bCs/>
+        </w:rPr>
+        <w:t>pray</w:t>
+      </w:r>
+      <w:r>
+        <w:t>.</w:t>
+      </w:r>
+    </w:p>
+    <w:p>
+      <w:pPr>
+        <w:pStyle w:val="SPBodyText"/>
+      </w:pPr>
+    </w:p>
+    <w:p>
+      <w:pPr>
+        <w:pStyle w:val="SPBodyText"/>
+        <w:ind w:left="0" w:firstLine="0"/>
+      </w:pPr>
+    </w:p>
+    <w:p>
+      <w:pPr>
+        <w:pStyle w:val="SPBodyText"/>
+      </w:pPr>
+      <w:r>
+        <w:t xml:space="preserve">The </w:t>
+      </w:r>
+      <w:r>
+        <w:rPr>
+          <w:b/>
+          <w:bCs/>
+        </w:rPr>
+        <w:t>Sign of the Cross</w:t>
+      </w:r>
+      <w:r>
+        <w:t xml:space="preserve"> stands at the beginning of </w:t>
+      </w:r>
+      <w:r>
+        <w:rPr>
+          <w:i/>
+          <w:iCs/>
+        </w:rPr>
+        <w:t>Sacrae Preces</w:t>
+      </w:r>
+      <w:r>
+        <w:t xml:space="preserve"> and at the beginning of </w:t>
+      </w:r>
+      <w:r>
+        <w:rPr>
+          <w:b/>
+          <w:bCs/>
+        </w:rPr>
+        <w:t>Part I — Basic Prayers</w:t>
+      </w:r>
+      <w:r>
+        <w:t>.</w:t>
+      </w:r>
+    </w:p>
+    <w:p>
+      <w:pPr>
+        <w:pStyle w:val="SPBodyText"/>
+      </w:pPr>
+      <w:r>
+        <w:t>It is not simply a prayer, but the gesture by which Christians traditionally begin and conclude their prayer. In making the Sign of the Cross, we invoke the Father, and the Son, and the Holy Spirit, placing ourselves consciously in the presence of God.</w:t>
+      </w:r>
+    </w:p>
+    <w:p>
+      <w:pPr>
+        <w:pStyle w:val="SPBodyText"/>
+      </w:pPr>
+    </w:p>
+    <w:p>
+      <w:pPr>
+        <w:jc w:val="center"/>
+        <w:rPr>
+          <w:rFonts w:ascii="Segoe UI Symbol" w:hAnsi="Segoe UI Symbol" w:cs="Segoe UI Symbol"/>
+        </w:rPr>
+        <w:sectPr>
+          <w:type w:val="evenPage"/>
+          <w:pgSz w:w="7920" w:h="12240" w:code="6"/>
+          <w:pgMar w:top="1080" w:right="864" w:bottom="1080" w:left="1152" w:header="576" w:footer="576" w:gutter="0"/>
+          <w:cols w:space="720"/>
+          <w:titlePg/>
+          <w:docGrid w:linePitch="360"/>
+        </w:sectPr>
+      </w:pPr>
       <w:r>
         <w:rPr>
           <w:rFonts w:ascii="Segoe UI Symbol" w:hAnsi="Segoe UI Symbol" w:cs="Segoe UI Symbol"/>
@@ -1743,8 +2265,140 @@
       <w:r>
         <w:t>Part I — Basic Prayers</w:t>
       </w:r>
-      <w:r>
-        <w:tab/>
+    </w:p>
+    <w:p>
+      <w:pPr>
+        <w:pStyle w:val="SPBodyText"/>
+      </w:pPr>
+      <w:r>
+        <w:t>The prayers in this first section form part of the foundation of Catholic prayer.</w:t>
+      </w:r>
+    </w:p>
+    <w:p>
+      <w:pPr>
+        <w:pStyle w:val="SPBodyText"/>
+      </w:pPr>
+      <w:r>
+        <w:t>They are prayers that many Catholics learn early in their journey of faith — prayers used at the beginning and end of the day, during personal prayer, and within the life of the Church.</w:t>
+      </w:r>
+      <w:r>
+        <w:t xml:space="preserve"> </w:t>
+      </w:r>
+      <w:r>
+        <w:t>Some may be very familiar. Others may have been learned long ago and gradually become words we say almost without thinking.</w:t>
+      </w:r>
+    </w:p>
+    <w:p>
+      <w:pPr>
+        <w:pStyle w:val="SPBodyText"/>
+      </w:pPr>
+      <w:r>
+        <w:rPr>
+          <w:i/>
+          <w:iCs/>
+        </w:rPr>
+        <w:t>Sacrae Preces</w:t>
+      </w:r>
+      <w:r>
+        <w:t xml:space="preserve"> invites us to return to these prayers with renewed attention.</w:t>
+      </w:r>
+    </w:p>
+    <w:p>
+      <w:pPr>
+        <w:pStyle w:val="SPBodyText"/>
+      </w:pPr>
+      <w:r>
+        <w:t xml:space="preserve">The </w:t>
+      </w:r>
+      <w:r>
+        <w:rPr>
+          <w:b/>
+          <w:bCs/>
+        </w:rPr>
+        <w:t>Sign of the Cross</w:t>
+      </w:r>
+      <w:r>
+        <w:t xml:space="preserve"> begins our prayer by placing us consciously in the presence of the Father, Son, and Holy Spirit.</w:t>
+      </w:r>
+    </w:p>
+    <w:p>
+      <w:pPr>
+        <w:pStyle w:val="SPBodyText"/>
+      </w:pPr>
+      <w:r>
+        <w:t xml:space="preserve">The </w:t>
+      </w:r>
+      <w:r>
+        <w:rPr>
+          <w:b/>
+          <w:bCs/>
+        </w:rPr>
+        <w:t>Our Father</w:t>
+      </w:r>
+      <w:r>
+        <w:t xml:space="preserve"> teaches us to pray as Christ taught His disciples.</w:t>
+      </w:r>
+    </w:p>
+    <w:p>
+      <w:pPr>
+        <w:pStyle w:val="SPBodyText"/>
+      </w:pPr>
+      <w:r>
+        <w:t xml:space="preserve">The </w:t>
+      </w:r>
+      <w:r>
+        <w:rPr>
+          <w:b/>
+          <w:bCs/>
+        </w:rPr>
+        <w:t>Hail Mary</w:t>
+      </w:r>
+      <w:r>
+        <w:t xml:space="preserve"> joins the words of Scripture with the Church's prayer and directs our attention towards Christ.</w:t>
+      </w:r>
+    </w:p>
+    <w:p>
+      <w:pPr>
+        <w:pStyle w:val="SPBodyText"/>
+      </w:pPr>
+      <w:r>
+        <w:t xml:space="preserve">The </w:t>
+      </w:r>
+      <w:r>
+        <w:rPr>
+          <w:b/>
+          <w:bCs/>
+        </w:rPr>
+        <w:t>Glory Be</w:t>
+      </w:r>
+      <w:r>
+        <w:t xml:space="preserve"> gives praise to the Holy Trinity.</w:t>
+      </w:r>
+    </w:p>
+    <w:p>
+      <w:pPr>
+        <w:pStyle w:val="SPBodyText"/>
+      </w:pPr>
+      <w:r>
+        <w:t xml:space="preserve">The </w:t>
+      </w:r>
+      <w:r>
+        <w:rPr>
+          <w:b/>
+          <w:bCs/>
+        </w:rPr>
+        <w:t>Act of Contrition</w:t>
+      </w:r>
+      <w:r>
+        <w:t xml:space="preserve"> turns the heart back towards God in sorrow, trust, and the desire to begin again.</w:t>
+      </w:r>
+    </w:p>
+    <w:p>
+      <w:pPr>
+        <w:pStyle w:val="SPBodyText"/>
+      </w:pPr>
+      <w:r>
+        <w:t>Together, these prayers provide a simple foundation from which a deeper life of prayer can grow.</w:t>
       </w:r>
     </w:p>
     <w:p>
@@ -2377,15 +3031,7 @@
       </w:r>
       <w:proofErr w:type="spellEnd"/>
       <w:r>
-        <w:t xml:space="preserve"> nomen </w:t>
-      </w:r>
-      <w:proofErr w:type="spellStart"/>
-      <w:r>
-        <w:t>tuum</w:t>
-      </w:r>
-      <w:proofErr w:type="spellEnd"/>
-      <w:r>
-        <w:t>.</w:t>
+        <w:t xml:space="preserve"> nomen tuum.</w:t>
       </w:r>
     </w:p>
     <w:p>
@@ -2398,15 +3044,7 @@
       </w:r>
       <w:proofErr w:type="spellEnd"/>
       <w:r>
-        <w:t xml:space="preserve"> regnum </w:t>
-      </w:r>
-      <w:proofErr w:type="spellStart"/>
-      <w:r>
-        <w:t>tuum</w:t>
-      </w:r>
-      <w:proofErr w:type="spellEnd"/>
-      <w:r>
-        <w:t>.</w:t>
+        <w:t xml:space="preserve"> regnum tuum.</w:t>
       </w:r>
       <w:r>
         <w:t xml:space="preserve"> </w:t>
@@ -5777,6 +6415,67 @@
     </w:p>
     <w:p>
       <w:pPr>
+        <w:pStyle w:val="SPBodyText"/>
+      </w:pPr>
+      <w:r>
+        <w:t>The Act of Contrition is a prayer of repentance and renewal. In it, we acknowledge our sins before God, express sorrow for having offended Him, and ask for the grace to amend our lives.</w:t>
+      </w:r>
+    </w:p>
+    <w:p>
+      <w:pPr>
+        <w:pStyle w:val="SPBodyText"/>
+      </w:pPr>
+      <w:r>
+        <w:t xml:space="preserve">True contrition is more than regret for having done wrong. It is a turning of the heart back towards God — recognising His goodness and </w:t>
+      </w:r>
+      <w:proofErr w:type="gramStart"/>
+      <w:r>
+        <w:t>mercy, and</w:t>
+      </w:r>
+      <w:proofErr w:type="gramEnd"/>
+      <w:r>
+        <w:t xml:space="preserve"> desiring to live more faithfully in His presence.</w:t>
+      </w:r>
+    </w:p>
+    <w:p>
+      <w:pPr>
+        <w:pStyle w:val="SPBodyText"/>
+      </w:pPr>
+      <w:r>
+        <w:t>The prayer also reminds us that God's forgiveness is not an invitation to remain where we are. We are called to begin again, trusting in His grace and resolving to avoid sin and the occasions that lead us towards it.</w:t>
+      </w:r>
+    </w:p>
+    <w:p>
+      <w:pPr>
+        <w:pStyle w:val="SPBodyText"/>
+      </w:pPr>
+      <w:r>
+        <w:t>The Act of Contrition may be prayed as part of preparation for the Sacrament of Reconciliation, but it can also be used at any time when we wish to examine our hearts, ask God's forgiveness, and return to Him.</w:t>
+      </w:r>
+    </w:p>
+    <w:p>
+      <w:pPr>
+        <w:pStyle w:val="SPBodyText"/>
+      </w:pPr>
+    </w:p>
+    <w:p>
+      <w:pPr>
+        <w:pStyle w:val="SPBodyText"/>
+      </w:pPr>
+      <w:r>
+        <w:t>A prayer of sorrow.</w:t>
+      </w:r>
+      <w:r>
+        <w:br/>
+        <w:t>A prayer of trust.</w:t>
+      </w:r>
+      <w:r>
+        <w:br/>
+        <w:t>A prayer to begin again.</w:t>
+      </w:r>
+    </w:p>
+    <w:p>
+      <w:pPr>
         <w:pStyle w:val="SPPrayerTitle"/>
       </w:pPr>
     </w:p>
@@ -5881,491 +6580,274 @@
     <w:p>
       <w:pPr>
         <w:pStyle w:val="SPPrayerLatin"/>
-        <w:rPr>
-          <w:iCs/>
-        </w:rPr>
-      </w:pPr>
-      <w:r>
-        <w:rPr>
-          <w:iCs/>
-        </w:rPr>
+      </w:pPr>
+      <w:r>
         <w:t xml:space="preserve">O mi Deus, corde </w:t>
       </w:r>
       <w:proofErr w:type="spellStart"/>
       <w:r>
-        <w:rPr>
-          <w:iCs/>
-        </w:rPr>
         <w:t>poenitet</w:t>
       </w:r>
       <w:proofErr w:type="spellEnd"/>
       <w:r>
-        <w:rPr>
-          <w:iCs/>
-        </w:rPr>
         <w:t xml:space="preserve"> me omnium </w:t>
       </w:r>
       <w:proofErr w:type="spellStart"/>
       <w:r>
-        <w:rPr>
-          <w:iCs/>
-        </w:rPr>
         <w:t>meorum</w:t>
       </w:r>
       <w:proofErr w:type="spellEnd"/>
       <w:r>
-        <w:rPr>
-          <w:iCs/>
-        </w:rPr>
         <w:t xml:space="preserve"> </w:t>
       </w:r>
       <w:proofErr w:type="spellStart"/>
       <w:r>
-        <w:rPr>
-          <w:iCs/>
-        </w:rPr>
         <w:t>peccatorum</w:t>
       </w:r>
       <w:proofErr w:type="spellEnd"/>
       <w:r>
-        <w:rPr>
-          <w:iCs/>
-        </w:rPr>
-        <w:t xml:space="preserve">, et </w:t>
-      </w:r>
-      <w:proofErr w:type="spellStart"/>
-      <w:r>
-        <w:rPr>
-          <w:iCs/>
-        </w:rPr>
+        <w:t>,</w:t>
+      </w:r>
+      <w:r>
+        <w:br/>
+        <w:t xml:space="preserve">et </w:t>
+      </w:r>
+      <w:proofErr w:type="spellStart"/>
+      <w:r>
         <w:t>detestor</w:t>
       </w:r>
       <w:proofErr w:type="spellEnd"/>
       <w:r>
-        <w:rPr>
-          <w:iCs/>
-        </w:rPr>
         <w:t xml:space="preserve"> </w:t>
       </w:r>
       <w:proofErr w:type="spellStart"/>
       <w:r>
-        <w:rPr>
-          <w:iCs/>
-        </w:rPr>
         <w:t>ea</w:t>
       </w:r>
       <w:proofErr w:type="spellEnd"/>
       <w:r>
-        <w:rPr>
-          <w:iCs/>
-        </w:rPr>
+        <w:t>,</w:t>
+      </w:r>
+      <w:r>
+        <w:br/>
+      </w:r>
+      <w:proofErr w:type="spellStart"/>
+      <w:r>
+        <w:t>vere</w:t>
+      </w:r>
+      <w:proofErr w:type="spellEnd"/>
+      <w:r>
+        <w:t xml:space="preserve"> </w:t>
+      </w:r>
+      <w:proofErr w:type="spellStart"/>
+      <w:r>
+        <w:t>poenitet</w:t>
+      </w:r>
+      <w:proofErr w:type="spellEnd"/>
+      <w:r>
+        <w:t xml:space="preserve"> me, quia </w:t>
+      </w:r>
+      <w:proofErr w:type="spellStart"/>
+      <w:r>
+        <w:t>peccando</w:t>
+      </w:r>
+      <w:proofErr w:type="spellEnd"/>
+      <w:r>
+        <w:t xml:space="preserve"> non solum </w:t>
+      </w:r>
+      <w:proofErr w:type="spellStart"/>
+      <w:r>
+        <w:t>poenas</w:t>
+      </w:r>
+      <w:proofErr w:type="spellEnd"/>
+      <w:r>
+        <w:t xml:space="preserve"> a </w:t>
+      </w:r>
+      <w:proofErr w:type="spellStart"/>
+      <w:r>
+        <w:t>te</w:t>
+      </w:r>
+      <w:proofErr w:type="spellEnd"/>
+      <w:r>
+        <w:t xml:space="preserve"> </w:t>
+      </w:r>
+      <w:proofErr w:type="spellStart"/>
+      <w:r>
+        <w:t>iuste</w:t>
+      </w:r>
+      <w:proofErr w:type="spellEnd"/>
+      <w:r>
+        <w:t xml:space="preserve"> </w:t>
+      </w:r>
+      <w:proofErr w:type="spellStart"/>
+      <w:r>
+        <w:t>statutas</w:t>
+      </w:r>
+      <w:proofErr w:type="spellEnd"/>
+      <w:r>
+        <w:t xml:space="preserve"> </w:t>
+      </w:r>
+      <w:proofErr w:type="spellStart"/>
+      <w:r>
+        <w:t>promeritus</w:t>
+      </w:r>
+      <w:proofErr w:type="spellEnd"/>
+      <w:r>
+        <w:t xml:space="preserve"> sum,</w:t>
+      </w:r>
+      <w:r>
+        <w:br/>
+      </w:r>
+      <w:proofErr w:type="spellStart"/>
+      <w:r>
+        <w:t>sed</w:t>
+      </w:r>
+      <w:proofErr w:type="spellEnd"/>
+      <w:r>
+        <w:t xml:space="preserve"> </w:t>
+      </w:r>
+      <w:proofErr w:type="spellStart"/>
+      <w:r>
+        <w:t>praesertim</w:t>
+      </w:r>
+      <w:proofErr w:type="spellEnd"/>
+      <w:r>
+        <w:t xml:space="preserve"> quia </w:t>
+      </w:r>
+      <w:proofErr w:type="spellStart"/>
+      <w:r>
+        <w:t>offendi</w:t>
+      </w:r>
+      <w:proofErr w:type="spellEnd"/>
+      <w:r>
+        <w:t xml:space="preserve"> </w:t>
+      </w:r>
+      <w:proofErr w:type="spellStart"/>
+      <w:r>
+        <w:t>te</w:t>
+      </w:r>
+      <w:proofErr w:type="spellEnd"/>
+      <w:r>
+        <w:t xml:space="preserve">, summum bonum, ac </w:t>
+      </w:r>
+      <w:proofErr w:type="spellStart"/>
+      <w:r>
+        <w:t>dignum</w:t>
+      </w:r>
+      <w:proofErr w:type="spellEnd"/>
+      <w:r>
+        <w:t xml:space="preserve"> qui super omnia </w:t>
+      </w:r>
+      <w:proofErr w:type="spellStart"/>
+      <w:r>
+        <w:t>diligeris</w:t>
+      </w:r>
+      <w:proofErr w:type="spellEnd"/>
+      <w:r>
+        <w:t>.</w:t>
+      </w:r>
+      <w:r>
+        <w:br/>
+      </w:r>
+      <w:proofErr w:type="spellStart"/>
+      <w:r>
+        <w:t>Ideo</w:t>
+      </w:r>
+      <w:proofErr w:type="spellEnd"/>
+      <w:r>
+        <w:t xml:space="preserve"> </w:t>
+      </w:r>
+      <w:proofErr w:type="spellStart"/>
+      <w:r>
+        <w:t>firmiter</w:t>
+      </w:r>
+      <w:proofErr w:type="spellEnd"/>
+      <w:r>
+        <w:t xml:space="preserve"> </w:t>
+      </w:r>
+      <w:proofErr w:type="spellStart"/>
+      <w:r>
+        <w:t>propono</w:t>
+      </w:r>
+      <w:proofErr w:type="spellEnd"/>
+      <w:r>
         <w:t xml:space="preserve">, </w:t>
       </w:r>
+      <w:proofErr w:type="spellStart"/>
+      <w:r>
+        <w:t>adiuvante</w:t>
+      </w:r>
+      <w:proofErr w:type="spellEnd"/>
+      <w:r>
+        <w:t xml:space="preserve"> gratia </w:t>
+      </w:r>
+      <w:proofErr w:type="spellStart"/>
+      <w:r>
+        <w:t>tua</w:t>
+      </w:r>
+      <w:proofErr w:type="spellEnd"/>
+      <w:r>
+        <w:t xml:space="preserve">, de </w:t>
+      </w:r>
+      <w:proofErr w:type="spellStart"/>
+      <w:r>
+        <w:t>cetero</w:t>
+      </w:r>
+      <w:proofErr w:type="spellEnd"/>
+      <w:r>
+        <w:t xml:space="preserve"> me non </w:t>
+      </w:r>
+      <w:proofErr w:type="spellStart"/>
+      <w:r>
+        <w:t>peccaturum</w:t>
+      </w:r>
+      <w:proofErr w:type="spellEnd"/>
+      <w:r>
+        <w:t xml:space="preserve"> </w:t>
+      </w:r>
+      <w:proofErr w:type="spellStart"/>
+      <w:r>
+        <w:t>peccandique</w:t>
+      </w:r>
+      <w:proofErr w:type="spellEnd"/>
+      <w:r>
+        <w:t xml:space="preserve"> </w:t>
+      </w:r>
+      <w:proofErr w:type="spellStart"/>
+      <w:r>
+        <w:t>occasiones</w:t>
+      </w:r>
+      <w:proofErr w:type="spellEnd"/>
+      <w:r>
+        <w:t xml:space="preserve"> </w:t>
+      </w:r>
+      <w:proofErr w:type="spellStart"/>
+      <w:r>
+        <w:t>proximas</w:t>
+      </w:r>
+      <w:proofErr w:type="spellEnd"/>
+      <w:r>
+        <w:t xml:space="preserve"> </w:t>
+      </w:r>
+      <w:proofErr w:type="spellStart"/>
+      <w:r>
+        <w:t>fugiturum</w:t>
+      </w:r>
+      <w:proofErr w:type="spellEnd"/>
+      <w:r>
+        <w:t>.</w:t>
+      </w:r>
     </w:p>
     <w:p>
       <w:pPr>
         <w:pStyle w:val="SPPrayerLatin"/>
-        <w:rPr>
-          <w:iCs/>
-        </w:rPr>
-      </w:pPr>
-      <w:proofErr w:type="spellStart"/>
-      <w:r>
-        <w:rPr>
-          <w:iCs/>
-        </w:rPr>
-        <w:t>vere</w:t>
-      </w:r>
-      <w:proofErr w:type="spellEnd"/>
-      <w:r>
-        <w:rPr>
-          <w:iCs/>
-        </w:rPr>
-        <w:t xml:space="preserve"> </w:t>
-      </w:r>
-      <w:proofErr w:type="spellStart"/>
-      <w:r>
-        <w:rPr>
-          <w:iCs/>
-        </w:rPr>
-        <w:t>poenitet</w:t>
-      </w:r>
-      <w:proofErr w:type="spellEnd"/>
-      <w:r>
-        <w:rPr>
-          <w:iCs/>
-        </w:rPr>
-        <w:t xml:space="preserve"> me, quia </w:t>
-      </w:r>
-      <w:proofErr w:type="spellStart"/>
-      <w:r>
-        <w:rPr>
-          <w:iCs/>
-        </w:rPr>
-        <w:t>peccando</w:t>
-      </w:r>
-      <w:proofErr w:type="spellEnd"/>
-      <w:r>
-        <w:rPr>
-          <w:iCs/>
-        </w:rPr>
-        <w:t xml:space="preserve">, non solum </w:t>
-      </w:r>
-      <w:proofErr w:type="spellStart"/>
-      <w:r>
-        <w:rPr>
-          <w:iCs/>
-        </w:rPr>
-        <w:t>poenas</w:t>
-      </w:r>
-      <w:proofErr w:type="spellEnd"/>
-      <w:r>
-        <w:rPr>
-          <w:iCs/>
-        </w:rPr>
-        <w:t xml:space="preserve"> a </w:t>
-      </w:r>
-      <w:proofErr w:type="spellStart"/>
-      <w:r>
-        <w:rPr>
-          <w:iCs/>
-        </w:rPr>
-        <w:t>te</w:t>
-      </w:r>
-      <w:proofErr w:type="spellEnd"/>
-      <w:r>
-        <w:rPr>
-          <w:iCs/>
-        </w:rPr>
-        <w:t xml:space="preserve"> </w:t>
-      </w:r>
-      <w:proofErr w:type="spellStart"/>
-      <w:r>
-        <w:rPr>
-          <w:iCs/>
-        </w:rPr>
-        <w:t>iuste</w:t>
-      </w:r>
-      <w:proofErr w:type="spellEnd"/>
-      <w:r>
-        <w:rPr>
-          <w:iCs/>
-        </w:rPr>
-        <w:t xml:space="preserve"> </w:t>
-      </w:r>
-      <w:proofErr w:type="spellStart"/>
-      <w:r>
-        <w:rPr>
-          <w:iCs/>
-        </w:rPr>
-        <w:t>statutas</w:t>
-      </w:r>
-      <w:proofErr w:type="spellEnd"/>
-      <w:r>
-        <w:rPr>
-          <w:iCs/>
-        </w:rPr>
-        <w:t xml:space="preserve"> </w:t>
-      </w:r>
-      <w:proofErr w:type="spellStart"/>
-      <w:r>
-        <w:rPr>
-          <w:iCs/>
-        </w:rPr>
-        <w:t>promeritus</w:t>
-      </w:r>
-      <w:proofErr w:type="spellEnd"/>
-      <w:r>
-        <w:rPr>
-          <w:iCs/>
-        </w:rPr>
-        <w:t xml:space="preserve"> sum, </w:t>
-      </w:r>
+      </w:pPr>
     </w:p>
     <w:p>
       <w:pPr>
         <w:pStyle w:val="SPPrayerLatin"/>
-        <w:rPr>
-          <w:iCs/>
-        </w:rPr>
-      </w:pPr>
-      <w:proofErr w:type="spellStart"/>
-      <w:r>
-        <w:rPr>
-          <w:iCs/>
-        </w:rPr>
-        <w:t>sed</w:t>
-      </w:r>
-      <w:proofErr w:type="spellEnd"/>
-      <w:r>
-        <w:rPr>
-          <w:iCs/>
-        </w:rPr>
-        <w:t xml:space="preserve"> </w:t>
-      </w:r>
-      <w:proofErr w:type="spellStart"/>
-      <w:r>
-        <w:rPr>
-          <w:iCs/>
-        </w:rPr>
-        <w:t>praesertim</w:t>
-      </w:r>
-      <w:proofErr w:type="spellEnd"/>
-      <w:r>
-        <w:rPr>
-          <w:iCs/>
-        </w:rPr>
-        <w:t xml:space="preserve"> quia </w:t>
-      </w:r>
-      <w:proofErr w:type="spellStart"/>
-      <w:r>
-        <w:rPr>
-          <w:iCs/>
-        </w:rPr>
-        <w:t>offendi</w:t>
-      </w:r>
-      <w:proofErr w:type="spellEnd"/>
-      <w:r>
-        <w:rPr>
-          <w:iCs/>
-        </w:rPr>
-        <w:t xml:space="preserve"> </w:t>
-      </w:r>
-      <w:proofErr w:type="spellStart"/>
-      <w:r>
-        <w:rPr>
-          <w:iCs/>
-        </w:rPr>
-        <w:t>te</w:t>
-      </w:r>
-      <w:proofErr w:type="spellEnd"/>
-      <w:r>
-        <w:rPr>
-          <w:iCs/>
-        </w:rPr>
-        <w:t xml:space="preserve">, summum bonum, ac </w:t>
-      </w:r>
-      <w:proofErr w:type="spellStart"/>
-      <w:r>
-        <w:rPr>
-          <w:iCs/>
-        </w:rPr>
-        <w:t>dignum</w:t>
-      </w:r>
-      <w:proofErr w:type="spellEnd"/>
-      <w:r>
-        <w:rPr>
-          <w:iCs/>
-        </w:rPr>
-        <w:t xml:space="preserve"> qui super omnia </w:t>
-      </w:r>
-      <w:proofErr w:type="spellStart"/>
-      <w:r>
-        <w:rPr>
-          <w:iCs/>
-        </w:rPr>
-        <w:t>diligaris</w:t>
-      </w:r>
-      <w:proofErr w:type="spellEnd"/>
-      <w:r>
-        <w:rPr>
-          <w:iCs/>
-        </w:rPr>
-        <w:t xml:space="preserve">. </w:t>
-      </w:r>
-    </w:p>
-    <w:p>
-      <w:pPr>
-        <w:pStyle w:val="SPPrayerLatin"/>
-        <w:rPr>
-          <w:iCs/>
-        </w:rPr>
-      </w:pPr>
-      <w:proofErr w:type="spellStart"/>
-      <w:r>
-        <w:rPr>
-          <w:iCs/>
-        </w:rPr>
-        <w:t>Ideo</w:t>
-      </w:r>
-      <w:proofErr w:type="spellEnd"/>
-      <w:r>
-        <w:rPr>
-          <w:iCs/>
-        </w:rPr>
-        <w:t xml:space="preserve"> </w:t>
-      </w:r>
-      <w:proofErr w:type="spellStart"/>
-      <w:r>
-        <w:rPr>
-          <w:iCs/>
-        </w:rPr>
-        <w:t>firmiter</w:t>
-      </w:r>
-      <w:proofErr w:type="spellEnd"/>
-      <w:r>
-        <w:rPr>
-          <w:iCs/>
-        </w:rPr>
-        <w:t xml:space="preserve"> </w:t>
-      </w:r>
-      <w:proofErr w:type="spellStart"/>
-      <w:r>
-        <w:rPr>
-          <w:iCs/>
-        </w:rPr>
-        <w:t>propositum</w:t>
-      </w:r>
-      <w:proofErr w:type="spellEnd"/>
-      <w:r>
-        <w:rPr>
-          <w:iCs/>
-        </w:rPr>
-        <w:t xml:space="preserve"> </w:t>
-      </w:r>
-      <w:proofErr w:type="spellStart"/>
-      <w:r>
-        <w:rPr>
-          <w:iCs/>
-        </w:rPr>
-        <w:t>facio</w:t>
-      </w:r>
-      <w:proofErr w:type="spellEnd"/>
-      <w:r>
-        <w:rPr>
-          <w:iCs/>
-        </w:rPr>
-        <w:t xml:space="preserve">, </w:t>
-      </w:r>
-      <w:proofErr w:type="spellStart"/>
-      <w:r>
-        <w:rPr>
-          <w:iCs/>
-        </w:rPr>
-        <w:t>adiuvante</w:t>
-      </w:r>
-      <w:proofErr w:type="spellEnd"/>
-      <w:r>
-        <w:rPr>
-          <w:iCs/>
-        </w:rPr>
-        <w:t xml:space="preserve"> gratia </w:t>
-      </w:r>
-      <w:proofErr w:type="spellStart"/>
-      <w:r>
-        <w:rPr>
-          <w:iCs/>
-        </w:rPr>
-        <w:t>tua</w:t>
-      </w:r>
-      <w:proofErr w:type="spellEnd"/>
-      <w:r>
-        <w:rPr>
-          <w:iCs/>
-        </w:rPr>
-        <w:t xml:space="preserve">, de </w:t>
-      </w:r>
-      <w:proofErr w:type="spellStart"/>
-      <w:r>
-        <w:rPr>
-          <w:iCs/>
-        </w:rPr>
-        <w:t>cetero</w:t>
-      </w:r>
-      <w:proofErr w:type="spellEnd"/>
-      <w:r>
-        <w:rPr>
-          <w:iCs/>
-        </w:rPr>
-        <w:t xml:space="preserve"> me non </w:t>
-      </w:r>
-      <w:proofErr w:type="spellStart"/>
-      <w:r>
-        <w:rPr>
-          <w:iCs/>
-        </w:rPr>
-        <w:t>peccaturum</w:t>
-      </w:r>
-      <w:proofErr w:type="spellEnd"/>
-      <w:r>
-        <w:rPr>
-          <w:iCs/>
-        </w:rPr>
-        <w:t xml:space="preserve"> </w:t>
-      </w:r>
-      <w:proofErr w:type="spellStart"/>
-      <w:r>
-        <w:rPr>
-          <w:iCs/>
-        </w:rPr>
-        <w:t>peccandique</w:t>
-      </w:r>
-      <w:proofErr w:type="spellEnd"/>
-      <w:r>
-        <w:rPr>
-          <w:iCs/>
-        </w:rPr>
-        <w:t xml:space="preserve"> </w:t>
-      </w:r>
-      <w:proofErr w:type="spellStart"/>
-      <w:r>
-        <w:rPr>
-          <w:iCs/>
-        </w:rPr>
-        <w:t>occasiones</w:t>
-      </w:r>
-      <w:proofErr w:type="spellEnd"/>
-      <w:r>
-        <w:rPr>
-          <w:iCs/>
-        </w:rPr>
-        <w:t xml:space="preserve"> </w:t>
-      </w:r>
-      <w:proofErr w:type="spellStart"/>
-      <w:r>
-        <w:rPr>
-          <w:iCs/>
-        </w:rPr>
-        <w:t>proximas</w:t>
-      </w:r>
-      <w:proofErr w:type="spellEnd"/>
-      <w:r>
-        <w:rPr>
-          <w:iCs/>
-        </w:rPr>
-        <w:t xml:space="preserve"> </w:t>
-      </w:r>
-      <w:proofErr w:type="spellStart"/>
-      <w:r>
-        <w:rPr>
-          <w:iCs/>
-        </w:rPr>
-        <w:t>fugiturum</w:t>
-      </w:r>
-      <w:proofErr w:type="spellEnd"/>
-      <w:r>
-        <w:rPr>
-          <w:iCs/>
-        </w:rPr>
-        <w:t xml:space="preserve">. </w:t>
-      </w:r>
-    </w:p>
-    <w:p>
-      <w:pPr>
-        <w:pStyle w:val="SPPrayerLatin"/>
-        <w:rPr>
-          <w:iCs/>
-        </w:rPr>
-      </w:pPr>
-    </w:p>
-    <w:p>
-      <w:pPr>
-        <w:pStyle w:val="SPPrayerLatin"/>
-      </w:pPr>
-      <w:r>
-        <w:rPr>
-          <w:iCs/>
-        </w:rPr>
+      </w:pPr>
+      <w:r>
         <w:t>Amen.</w:t>
       </w:r>
     </w:p>
@@ -6424,6 +6906,100 @@
     <w:p>
       <w:pPr>
         <w:pStyle w:val="SPScriptureReference"/>
+      </w:pPr>
+      <w:r>
+        <w:t>Psalm 51:17</w:t>
+      </w:r>
+    </w:p>
+    <w:p>
+      <w:pPr>
+        <w:pStyle w:val="SPScripture"/>
+      </w:pPr>
+      <w:r>
+        <w:t>The sacrifice acceptable to God is a broken spirit; a broken and contrite heart, O God, you will not despise.</w:t>
+      </w:r>
+    </w:p>
+    <w:p>
+      <w:pPr>
+        <w:pStyle w:val="SPScriptureReference"/>
+        <w:rPr>
+          <w:bCs/>
+        </w:rPr>
+      </w:pPr>
+      <w:r>
+        <w:rPr>
+          <w:bCs/>
+        </w:rPr>
+        <w:t>Luke 18:13</w:t>
+      </w:r>
+    </w:p>
+    <w:p>
+      <w:pPr>
+        <w:pStyle w:val="SPScripture"/>
+      </w:pPr>
+      <w:r>
+        <w:t>But the tax collector, standing far off, would not even lift up his eyes to heaven, but beat his breast, saying, “God, be merciful to me a sinner!”</w:t>
+      </w:r>
+    </w:p>
+    <w:p>
+      <w:pPr>
+        <w:pStyle w:val="SPScriptureReference"/>
+        <w:rPr>
+          <w:bCs/>
+        </w:rPr>
+      </w:pPr>
+      <w:r>
+        <w:rPr>
+          <w:bCs/>
+        </w:rPr>
+        <w:t>1 John 1:9</w:t>
+      </w:r>
+    </w:p>
+    <w:p>
+      <w:pPr>
+        <w:pStyle w:val="SPScripture"/>
+      </w:pPr>
+      <w:r>
+        <w:t>If we confess our sins, he is faithful and just, and will forgive our sins and cleanse us from all unrighteousness.</w:t>
+      </w:r>
+    </w:p>
+    <w:p>
+      <w:pPr>
+        <w:pStyle w:val="SPScriptureReference"/>
+        <w:rPr>
+          <w:bCs/>
+        </w:rPr>
+      </w:pPr>
+      <w:r>
+        <w:rPr>
+          <w:bCs/>
+        </w:rPr>
+        <w:t>2 Corinthians 7:10</w:t>
+      </w:r>
+    </w:p>
+    <w:p>
+      <w:pPr>
+        <w:pStyle w:val="SPScripture"/>
+      </w:pPr>
+      <w:r>
+        <w:t>For godly grief produces a repentance that leads to salvation and brings no regret, but worldly grief produces death.</w:t>
+      </w:r>
+    </w:p>
+    <w:p>
+      <w:pPr>
+        <w:pStyle w:val="SPSectionTitle"/>
+        <w:jc w:val="both"/>
+        <w:rPr>
+          <w:rFonts w:ascii="Garamond" w:hAnsi="Garamond"/>
+          <w:b/>
+          <w:color w:val="333333"/>
+          <w:sz w:val="23"/>
+        </w:rPr>
+      </w:pPr>
+    </w:p>
+    <w:p>
+      <w:pPr>
+        <w:pStyle w:val="SPSectionTitle"/>
         <w:sectPr>
           <w:type w:val="evenPage"/>
           <w:pgSz w:w="7920" w:h="12240" w:code="6"/>
@@ -6433,9 +7009,6 @@
           <w:docGrid w:linePitch="360"/>
         </w:sectPr>
       </w:pPr>
-      <w:r>
-        <w:t>Luke EG</w:t>
-      </w:r>
     </w:p>
     <w:p>
       <w:pPr>
@@ -6448,10 +7021,88 @@
     </w:p>
     <w:p>
       <w:pPr>
-        <w:tabs>
-          <w:tab w:val="left" w:pos="1980"/>
-        </w:tabs>
-        <w:ind w:left="0"/>
+        <w:pStyle w:val="SPBodyText"/>
+        <w:rPr>
+          <w:b/>
+          <w:bCs/>
+        </w:rPr>
+      </w:pPr>
+      <w:r>
+        <w:rPr>
+          <w:b/>
+          <w:bCs/>
+        </w:rPr>
+        <w:t>Returning to the Mercy of God</w:t>
+      </w:r>
+    </w:p>
+    <w:p>
+      <w:pPr>
+        <w:pStyle w:val="SPBodyText"/>
+      </w:pPr>
+    </w:p>
+    <w:p>
+      <w:pPr>
+        <w:pStyle w:val="SPBodyText"/>
+      </w:pPr>
+      <w:r>
+        <w:t>Contrition begins with honesty.</w:t>
+      </w:r>
+    </w:p>
+    <w:p>
+      <w:pPr>
+        <w:pStyle w:val="SPBodyText"/>
+      </w:pPr>
+      <w:r>
+        <w:t>We come before God without excuses or disguises and acknowledge the ways in which we have fallen short. We recognise our sins, not simply because they have consequences for us, but because they have wounded our relationship with the One who loves us.</w:t>
+      </w:r>
+    </w:p>
+    <w:p>
+      <w:pPr>
+        <w:pStyle w:val="SPBodyText"/>
+      </w:pPr>
+    </w:p>
+    <w:p>
+      <w:pPr>
+        <w:pStyle w:val="SPBodyText"/>
+      </w:pPr>
+      <w:r>
+        <w:t xml:space="preserve">The prayer of the tax collector is beautifully simple: </w:t>
+      </w:r>
+      <w:r>
+        <w:rPr>
+          <w:i/>
+          <w:iCs/>
+        </w:rPr>
+        <w:t>“God, be merciful to me, a sinner.”</w:t>
+      </w:r>
+      <w:r>
+        <w:t xml:space="preserve"> He does not attempt to justify himself. He simply places himself before God and asks for mercy.</w:t>
+      </w:r>
+    </w:p>
+    <w:p>
+      <w:pPr>
+        <w:pStyle w:val="SPBodyText"/>
+      </w:pPr>
+    </w:p>
+    <w:p>
+      <w:pPr>
+        <w:pStyle w:val="SPBodyText"/>
+      </w:pPr>
+      <w:r>
+        <w:t>Yet Christian contrition is not despair.</w:t>
+      </w:r>
+    </w:p>
+    <w:p>
+      <w:pPr>
+        <w:pStyle w:val="SPBodyText"/>
+      </w:pPr>
+      <w:r>
+        <w:t>To be sorry for our sins is not to believe that we are beyond forgiveness. It is to recognise that God's mercy is greater than our failure. The broken and contrite heart described in Psalm 51 is not rejected by God. It is precisely the heart that has begun to turn back towards Him.</w:t>
+      </w:r>
+    </w:p>
+    <w:p>
+      <w:pPr>
+        <w:pStyle w:val="SPBodyText"/>
         <w:sectPr>
           <w:type w:val="oddPage"/>
           <w:pgSz w:w="7920" w:h="12240" w:code="6"/>
@@ -6464,6 +7115,126 @@
     </w:p>
     <w:p>
       <w:pPr>
+        <w:pStyle w:val="SPBodyText"/>
+      </w:pPr>
+      <w:r>
+        <w:lastRenderedPageBreak/>
+        <w:t>This is why the Act of Contrition contains both sorrow and resolve.</w:t>
+      </w:r>
+    </w:p>
+    <w:p>
+      <w:pPr>
+        <w:pStyle w:val="SPBodyText"/>
+      </w:pPr>
+      <w:r>
+        <w:t>We say that we are sorry, but we also ask for the grace to change. We resolve to confess our sins, to do penance, to amend our lives, and to avoid those things that lead us towards sin. Our resolution does not rest entirely upon our own strength. We pray for God's grace because we know that conversion is not something we accomplish alone.</w:t>
+      </w:r>
+    </w:p>
+    <w:p>
+      <w:pPr>
+        <w:pStyle w:val="SPBodyText"/>
+      </w:pPr>
+      <w:r>
+        <w:t>There may be times when we pray this prayer and feel deeply sorry for what we have done. At other times, the words may seem difficult to feel. We may recognise our sin intellectually while our emotions remain quiet.</w:t>
+      </w:r>
+    </w:p>
+    <w:p>
+      <w:pPr>
+        <w:pStyle w:val="SPBodyText"/>
+      </w:pPr>
+      <w:r>
+        <w:t>The prayer is still worth praying.</w:t>
+      </w:r>
+    </w:p>
+    <w:p>
+      <w:pPr>
+        <w:pStyle w:val="SPBodyText"/>
+      </w:pPr>
+      <w:r>
+        <w:t>Contrition is ultimately an act of the will: a turning of the heart towards God and a desire to live differently. Even when our feelings are uncertain, we can choose to return.</w:t>
+      </w:r>
+    </w:p>
+    <w:p>
+      <w:pPr>
+        <w:pStyle w:val="SPBodyText"/>
+      </w:pPr>
+      <w:r>
+        <w:t xml:space="preserve">And </w:t>
+      </w:r>
+      <w:proofErr w:type="gramStart"/>
+      <w:r>
+        <w:t>so</w:t>
+      </w:r>
+      <w:proofErr w:type="gramEnd"/>
+      <w:r>
+        <w:t xml:space="preserve"> the Act of Contrition is not merely a prayer about the past.</w:t>
+      </w:r>
+    </w:p>
+    <w:p>
+      <w:pPr>
+        <w:pStyle w:val="SPBodyText"/>
+      </w:pPr>
+      <w:r>
+        <w:t>It is a prayer of beginning again.</w:t>
+      </w:r>
+    </w:p>
+    <w:p>
+      <w:pPr>
+        <w:pStyle w:val="SPBodyText"/>
+      </w:pPr>
+    </w:p>
+    <w:p>
+      <w:pPr>
+        <w:pStyle w:val="SPBodyText"/>
+      </w:pPr>
+      <w:r>
+        <w:t>Godly sorrow, as Saint Paul reminds us, leads towards repentance and salvation. The Christian who falls is not called to remain on the ground. We are called to rise, to receive God's mercy, and to continue the journey.</w:t>
+      </w:r>
+    </w:p>
+    <w:p>
+      <w:pPr>
+        <w:pStyle w:val="SPBodyText"/>
+      </w:pPr>
+      <w:r>
+        <w:t>Whenever we pray these words sincerely, we are reminded of something simple and profound:</w:t>
+      </w:r>
+    </w:p>
+    <w:p>
+      <w:pPr>
+        <w:pStyle w:val="SPBodyText"/>
+        <w:rPr>
+          <w:b/>
+          <w:bCs/>
+        </w:rPr>
+      </w:pPr>
+    </w:p>
+    <w:p>
+      <w:pPr>
+        <w:pStyle w:val="SPBodyText"/>
+      </w:pPr>
+      <w:r>
+        <w:rPr>
+          <w:b/>
+          <w:bCs/>
+        </w:rPr>
+        <w:t>We may fall, but God's mercy invites us to return.</w:t>
+      </w:r>
+    </w:p>
+    <w:p>
+      <w:pPr>
+        <w:pStyle w:val="SPBodyText"/>
+        <w:sectPr>
+          <w:type w:val="evenPage"/>
+          <w:pgSz w:w="7920" w:h="12240" w:code="6"/>
+          <w:pgMar w:top="1080" w:right="864" w:bottom="1080" w:left="1152" w:header="576" w:footer="576" w:gutter="0"/>
+          <w:cols w:space="720"/>
+          <w:titlePg/>
+          <w:docGrid w:linePitch="360"/>
+        </w:sectPr>
+      </w:pPr>
+    </w:p>
+    <w:p>
+      <w:pPr>
         <w:pStyle w:val="SPSectionHeading"/>
       </w:pPr>
       <w:r>
@@ -6482,9 +7253,118 @@
     </w:p>
     <w:p>
       <w:pPr>
-        <w:tabs>
-          <w:tab w:val="left" w:pos="1425"/>
-        </w:tabs>
+        <w:pStyle w:val="SPBodyText"/>
+      </w:pPr>
+      <w:r>
+        <w:t xml:space="preserve">The Gospel Canticles are </w:t>
+      </w:r>
+      <w:r>
+        <w:t xml:space="preserve">three </w:t>
+      </w:r>
+      <w:r>
+        <w:t>songs of praise found in the opening chapters of the Gospel according to Luke.</w:t>
+      </w:r>
+    </w:p>
+    <w:p>
+      <w:pPr>
+        <w:pStyle w:val="SPBodyText"/>
+      </w:pPr>
+    </w:p>
+    <w:p>
+      <w:pPr>
+        <w:pStyle w:val="SPBodyText"/>
+      </w:pPr>
+      <w:r>
+        <w:t xml:space="preserve">The </w:t>
+      </w:r>
+      <w:r>
+        <w:rPr>
+          <w:b/>
+          <w:bCs/>
+        </w:rPr>
+        <w:t>Benedictus</w:t>
+      </w:r>
+      <w:r>
+        <w:t xml:space="preserve">, spoken by Zechariah, gives thanks for God's faithfulness and the coming of salvation. </w:t>
+      </w:r>
+    </w:p>
+    <w:p>
+      <w:pPr>
+        <w:pStyle w:val="SPBodyText"/>
+      </w:pPr>
+    </w:p>
+    <w:p>
+      <w:pPr>
+        <w:pStyle w:val="SPBodyText"/>
+      </w:pPr>
+      <w:r>
+        <w:t xml:space="preserve">The </w:t>
+      </w:r>
+      <w:r>
+        <w:rPr>
+          <w:b/>
+          <w:bCs/>
+        </w:rPr>
+        <w:t>Magnificat</w:t>
+      </w:r>
+      <w:r>
+        <w:t xml:space="preserve">, spoken by Mary, rejoices in God's mercy and His work among the humble. </w:t>
+      </w:r>
+    </w:p>
+    <w:p>
+      <w:pPr>
+        <w:pStyle w:val="SPBodyText"/>
+      </w:pPr>
+    </w:p>
+    <w:p>
+      <w:pPr>
+        <w:pStyle w:val="SPBodyText"/>
+      </w:pPr>
+      <w:r>
+        <w:t xml:space="preserve">The </w:t>
+      </w:r>
+      <w:r>
+        <w:rPr>
+          <w:b/>
+          <w:bCs/>
+        </w:rPr>
+        <w:t>Nunc Dimittis</w:t>
+      </w:r>
+      <w:r>
+        <w:t>, spoken by Simeon, gives thanks for having seen the promised salvation of God.</w:t>
+      </w:r>
+    </w:p>
+    <w:p>
+      <w:pPr>
+        <w:pStyle w:val="SPBodyText"/>
+      </w:pPr>
+    </w:p>
+    <w:p>
+      <w:pPr>
+        <w:pStyle w:val="SPBodyText"/>
+      </w:pPr>
+      <w:r>
+        <w:t xml:space="preserve">Together, these canticles form a beautiful movement of </w:t>
+      </w:r>
+      <w:r>
+        <w:rPr>
+          <w:b/>
+          <w:bCs/>
+        </w:rPr>
+        <w:t>promise, praise, and fulfilment</w:t>
+      </w:r>
+      <w:r>
+        <w:t>.</w:t>
+      </w:r>
+    </w:p>
+    <w:p>
+      <w:pPr>
+        <w:pStyle w:val="SPBodyText"/>
+      </w:pPr>
+    </w:p>
+    <w:p>
+      <w:pPr>
+        <w:pStyle w:val="SPBodyText"/>
         <w:sectPr>
           <w:type w:val="oddPage"/>
           <w:pgSz w:w="7920" w:h="12240" w:code="6"/>
@@ -6495,7 +7375,67 @@
         </w:sectPr>
       </w:pPr>
       <w:r>
-        <w:tab/>
+        <w:t xml:space="preserve">They have also become deeply woven into the Church's daily prayer: the </w:t>
+      </w:r>
+      <w:r>
+        <w:rPr>
+          <w:b/>
+          <w:bCs/>
+        </w:rPr>
+        <w:t>Benedictus</w:t>
+      </w:r>
+      <w:r>
+        <w:t xml:space="preserve"> in </w:t>
+      </w:r>
+      <w:r>
+        <w:rPr>
+          <w:b/>
+          <w:bCs/>
+        </w:rPr>
+        <w:t>Morning Prayer</w:t>
+      </w:r>
+      <w:r>
+        <w:t xml:space="preserve">, the </w:t>
+      </w:r>
+      <w:r>
+        <w:rPr>
+          <w:b/>
+          <w:bCs/>
+        </w:rPr>
+        <w:t>Magnificat</w:t>
+      </w:r>
+      <w:r>
+        <w:t xml:space="preserve"> in </w:t>
+      </w:r>
+      <w:r>
+        <w:rPr>
+          <w:b/>
+          <w:bCs/>
+        </w:rPr>
+        <w:t>Evening Prayer</w:t>
+      </w:r>
+      <w:r>
+        <w:t xml:space="preserve">, and the </w:t>
+      </w:r>
+      <w:r>
+        <w:rPr>
+          <w:b/>
+          <w:bCs/>
+        </w:rPr>
+        <w:t>Nunc Dimittis</w:t>
+      </w:r>
+      <w:r>
+        <w:t xml:space="preserve"> in </w:t>
+      </w:r>
+      <w:r>
+        <w:rPr>
+          <w:b/>
+          <w:bCs/>
+        </w:rPr>
+        <w:t>Night Prayer</w:t>
+      </w:r>
+      <w:r>
+        <w:t>.</w:t>
       </w:r>
     </w:p>
     <w:p>
@@ -6766,15 +7706,7 @@
       </w:r>
       <w:proofErr w:type="spellEnd"/>
       <w:r>
-        <w:t xml:space="preserve"> </w:t>
-      </w:r>
-      <w:proofErr w:type="spellStart"/>
-      <w:r>
-        <w:t>plebis</w:t>
-      </w:r>
-      <w:proofErr w:type="spellEnd"/>
-      <w:r>
-        <w:t xml:space="preserve"> suae,</w:t>
+        <w:t xml:space="preserve"> plebis suae,</w:t>
       </w:r>
       <w:r>
         <w:br/>
@@ -7381,15 +8313,7 @@
       </w:r>
       <w:proofErr w:type="spellEnd"/>
       <w:r>
-        <w:t xml:space="preserve"> ante </w:t>
-      </w:r>
-      <w:proofErr w:type="spellStart"/>
-      <w:r>
-        <w:t>faciem</w:t>
-      </w:r>
-      <w:proofErr w:type="spellEnd"/>
-      <w:r>
-        <w:t xml:space="preserve"> Domini </w:t>
+        <w:t xml:space="preserve"> ante faciem Domini </w:t>
       </w:r>
       <w:proofErr w:type="spellStart"/>
       <w:r>
@@ -10733,6 +11657,364 @@
     </w:p>
     <w:p>
       <w:pPr>
+        <w:pStyle w:val="SPBodyText"/>
+        <w:jc w:val="center"/>
+        <w:rPr>
+          <w:rFonts w:ascii="Segoe UI Symbol" w:hAnsi="Segoe UI Symbol" w:cs="Segoe UI Symbol"/>
+        </w:rPr>
+      </w:pPr>
+      <w:r>
+        <w:rPr>
+          <w:rFonts w:ascii="Segoe UI Symbol" w:hAnsi="Segoe UI Symbol" w:cs="Segoe UI Symbol"/>
+        </w:rPr>
+        <w:lastRenderedPageBreak/>
+        <w:t>✠</w:t>
+      </w:r>
+    </w:p>
+    <w:p>
+      <w:pPr>
+        <w:pStyle w:val="SPBodyText"/>
+        <w:jc w:val="center"/>
+        <w:rPr>
+          <w:rFonts w:ascii="Segoe UI Symbol" w:hAnsi="Segoe UI Symbol" w:cs="Segoe UI Symbol"/>
+        </w:rPr>
+      </w:pPr>
+    </w:p>
+    <w:p>
+      <w:pPr>
+        <w:pStyle w:val="SPPrayerTitle"/>
+      </w:pPr>
+      <w:r>
+        <w:t>Nunc Dimmitis</w:t>
+      </w:r>
+    </w:p>
+    <w:p>
+      <w:pPr>
+        <w:pStyle w:val="SPPrayerTitle"/>
+      </w:pPr>
+      <w:r>
+        <w:t>(Canticle of Simeon)</w:t>
+      </w:r>
+    </w:p>
+    <w:p>
+      <w:pPr>
+        <w:pStyle w:val="SPLanguage"/>
+        <w:rPr>
+          <w:sz w:val="24"/>
+        </w:rPr>
+      </w:pPr>
+      <w:r>
+        <w:rPr>
+          <w:sz w:val="24"/>
+        </w:rPr>
+        <w:t>The Nunc Dimittis is the song of Simeon, an elderly and faithful man who had been waiting for the fulfilment of God's promise. When Mary and Joseph brought the infant Jesus to the Temple, Simeon recognised Him as the promised salvation of God.</w:t>
+      </w:r>
+      <w:r>
+        <w:rPr>
+          <w:sz w:val="24"/>
+        </w:rPr>
+        <w:t xml:space="preserve"> </w:t>
+      </w:r>
+      <w:r>
+        <w:rPr>
+          <w:sz w:val="24"/>
+        </w:rPr>
+        <w:t>Having seen Christ, Simeon could finally say that he was ready to depart in peace.</w:t>
+      </w:r>
+    </w:p>
+    <w:p>
+      <w:pPr>
+        <w:pStyle w:val="SPLanguage"/>
+        <w:rPr>
+          <w:sz w:val="24"/>
+        </w:rPr>
+      </w:pPr>
+      <w:r>
+        <w:rPr>
+          <w:sz w:val="24"/>
+        </w:rPr>
+        <w:t>The canticle is therefore a prayer of recognition and fulfilment. Simeon had waited, and God had been faithful to His promise. What he had hoped for was now before his eyes.</w:t>
+      </w:r>
+    </w:p>
+    <w:p>
+      <w:pPr>
+        <w:pStyle w:val="SPLanguage"/>
+        <w:rPr>
+          <w:sz w:val="24"/>
+        </w:rPr>
+      </w:pPr>
+      <w:r>
+        <w:rPr>
+          <w:sz w:val="24"/>
+        </w:rPr>
+        <w:t>His words also remind us that God's salvation is not given to one people alone. Christ is proclaimed as a light for the nations and the glory of Israel.</w:t>
+      </w:r>
+    </w:p>
+    <w:p>
+      <w:pPr>
+        <w:pStyle w:val="SPLanguage"/>
+        <w:rPr>
+          <w:sz w:val="24"/>
+        </w:rPr>
+        <w:sectPr>
+          <w:type w:val="oddPage"/>
+          <w:pgSz w:w="7920" w:h="12240" w:code="6"/>
+          <w:pgMar w:top="1080" w:right="864" w:bottom="1080" w:left="1152" w:header="576" w:footer="576" w:gutter="0"/>
+          <w:cols w:space="720"/>
+          <w:titlePg/>
+          <w:docGrid w:linePitch="360"/>
+        </w:sectPr>
+      </w:pPr>
+      <w:r>
+        <w:rPr>
+          <w:sz w:val="24"/>
+        </w:rPr>
+        <w:t xml:space="preserve">It is traditionally prayed </w:t>
+      </w:r>
+      <w:r>
+        <w:rPr>
+          <w:sz w:val="24"/>
+        </w:rPr>
+        <w:t>during Night Prayer, making it a fitting prayer at the end of the day. As we prepare for sleep, we can place the day into God's hands and rest in the knowledge that He remains faithful.</w:t>
+      </w:r>
+    </w:p>
+    <w:p>
+      <w:pPr>
+        <w:pStyle w:val="SPLanguage"/>
+      </w:pPr>
+      <w:r>
+        <w:lastRenderedPageBreak/>
+        <w:t xml:space="preserve">ENGLISH </w:t>
+      </w:r>
+    </w:p>
+    <w:p>
+      <w:pPr>
+        <w:pStyle w:val="SPLanguage"/>
+      </w:pPr>
+    </w:p>
+    <w:p>
+      <w:pPr>
+        <w:pStyle w:val="SPPrayerEnglish"/>
+      </w:pPr>
+      <w:r>
+        <w:t>Now, Lord, you may let your servant depart in peace,</w:t>
+      </w:r>
+      <w:r>
+        <w:br/>
+        <w:t>according to your word;</w:t>
+      </w:r>
+    </w:p>
+    <w:p>
+      <w:pPr>
+        <w:pStyle w:val="SPPrayerEnglish"/>
+      </w:pPr>
+      <w:r>
+        <w:t>for my own eyes have seen your salvation,</w:t>
+      </w:r>
+      <w:r>
+        <w:br/>
+        <w:t>which you have prepared in the sight of all the peoples,</w:t>
+      </w:r>
+    </w:p>
+    <w:p>
+      <w:pPr>
+        <w:pStyle w:val="SPPrayerEnglish"/>
+      </w:pPr>
+      <w:r>
+        <w:t>a light for revelation to the nations,</w:t>
+      </w:r>
+      <w:r>
+        <w:br/>
+        <w:t>and the glory of your people Israel.</w:t>
+      </w:r>
+    </w:p>
+    <w:p>
+      <w:pPr>
+        <w:pStyle w:val="SPPrayerLatin"/>
+        <w:sectPr>
+          <w:type w:val="evenPage"/>
+          <w:pgSz w:w="7920" w:h="12240" w:code="6"/>
+          <w:pgMar w:top="1080" w:right="864" w:bottom="1080" w:left="1152" w:header="576" w:footer="576" w:gutter="0"/>
+          <w:cols w:space="720"/>
+          <w:titlePg/>
+          <w:docGrid w:linePitch="360"/>
+        </w:sectPr>
+      </w:pPr>
+    </w:p>
+    <w:p>
+      <w:pPr>
+        <w:pStyle w:val="SPLanguage"/>
+      </w:pPr>
+      <w:r>
+        <w:lastRenderedPageBreak/>
+        <w:t>LATIN</w:t>
+      </w:r>
+    </w:p>
+    <w:p>
+      <w:pPr>
+        <w:pStyle w:val="SPPrayerLatin"/>
+      </w:pPr>
+      <w:r>
+        <w:t xml:space="preserve"> </w:t>
+      </w:r>
+    </w:p>
+    <w:p>
+      <w:pPr>
+        <w:pStyle w:val="SPPrayerLatin"/>
+      </w:pPr>
+      <w:r>
+        <w:t>Nunc dimittis servum tuum, Domine, secundum verbum tuum in pace:</w:t>
+      </w:r>
+    </w:p>
+    <w:p>
+      <w:pPr>
+        <w:pStyle w:val="SPPrayerLatin"/>
+      </w:pPr>
+      <w:r>
+        <w:t>Quia viderunt oculi mei salutare tuum,</w:t>
+      </w:r>
+      <w:r>
+        <w:br/>
+        <w:t xml:space="preserve">quod parasti ante faciem omnium </w:t>
+      </w:r>
+      <w:proofErr w:type="spellStart"/>
+      <w:r>
+        <w:t>populorum</w:t>
+      </w:r>
+      <w:proofErr w:type="spellEnd"/>
+      <w:r>
+        <w:t>,</w:t>
+      </w:r>
+    </w:p>
+    <w:p>
+      <w:pPr>
+        <w:pStyle w:val="SPPrayerLatin"/>
+      </w:pPr>
+      <w:r>
+        <w:t xml:space="preserve">Lumen ad </w:t>
+      </w:r>
+      <w:proofErr w:type="spellStart"/>
+      <w:r>
+        <w:t>revelationem</w:t>
+      </w:r>
+      <w:proofErr w:type="spellEnd"/>
+      <w:r>
+        <w:t xml:space="preserve"> gentium,</w:t>
+      </w:r>
+      <w:r>
+        <w:br/>
+        <w:t>et gloriam plebis tuae Israel.</w:t>
+      </w:r>
+    </w:p>
+    <w:p>
+      <w:pPr>
+        <w:pStyle w:val="SPPrayerEnglish"/>
+        <w:jc w:val="both"/>
+      </w:pPr>
+      <w:r>
+        <w:br w:type="page"/>
+      </w:r>
+    </w:p>
+    <w:p>
+      <w:pPr>
+        <w:pStyle w:val="SPPrayerEnglish"/>
+        <w:sectPr>
+          <w:type w:val="oddPage"/>
+          <w:pgSz w:w="7920" w:h="12240" w:code="6"/>
+          <w:pgMar w:top="1080" w:right="864" w:bottom="1080" w:left="1152" w:header="576" w:footer="576" w:gutter="0"/>
+          <w:cols w:space="720"/>
+          <w:titlePg/>
+          <w:docGrid w:linePitch="360"/>
+        </w:sectPr>
+      </w:pPr>
+    </w:p>
+    <w:p>
+      <w:pPr>
+        <w:pStyle w:val="SPSectionTitle"/>
+      </w:pPr>
+      <w:r>
+        <w:lastRenderedPageBreak/>
+        <w:t>Scripture</w:t>
+      </w:r>
+    </w:p>
+    <w:p>
+      <w:pPr>
+        <w:pStyle w:val="SPScriptureReference"/>
+      </w:pPr>
+      <w:r>
+        <w:t xml:space="preserve"> Luke 1:46-55</w:t>
+      </w:r>
+    </w:p>
+    <w:p>
+      <w:pPr>
+        <w:pStyle w:val="SPScripture"/>
+      </w:pPr>
+    </w:p>
+    <w:p>
+      <w:pPr>
+        <w:pStyle w:val="SPScripture"/>
+      </w:pPr>
+      <w:r>
+        <w:t xml:space="preserve"> And Mary said, </w:t>
+      </w:r>
+    </w:p>
+    <w:p>
+      <w:pPr>
+        <w:pStyle w:val="SPScripture"/>
+        <w:sectPr>
+          <w:type w:val="evenPage"/>
+          <w:pgSz w:w="7920" w:h="12240" w:code="6"/>
+          <w:pgMar w:top="1080" w:right="864" w:bottom="1080" w:left="1152" w:header="576" w:footer="576" w:gutter="0"/>
+          <w:cols w:space="720"/>
+          <w:titlePg/>
+          <w:docGrid w:linePitch="360"/>
+        </w:sectPr>
+      </w:pPr>
+    </w:p>
+    <w:p>
+      <w:pPr>
+        <w:pStyle w:val="SPSectionTitle"/>
+      </w:pPr>
+      <w:r>
+        <w:lastRenderedPageBreak/>
+        <w:t>Reflection</w:t>
+      </w:r>
+    </w:p>
+    <w:p>
+      <w:pPr>
+        <w:pStyle w:val="SPBodyText"/>
+        <w:rPr>
+          <w:b/>
+          <w:bCs/>
+        </w:rPr>
+      </w:pPr>
+      <w:r>
+        <w:rPr>
+          <w:b/>
+          <w:bCs/>
+        </w:rPr>
+        <w:t>A Soul That Magnifies God</w:t>
+      </w:r>
+    </w:p>
+    <w:p>
+      <w:pPr>
+        <w:pStyle w:val="SPBodyText"/>
+        <w:jc w:val="center"/>
+        <w:rPr>
+          <w:rFonts w:ascii="Segoe UI Symbol" w:hAnsi="Segoe UI Symbol" w:cs="Segoe UI Symbol"/>
+        </w:rPr>
+        <w:sectPr>
+          <w:type w:val="oddPage"/>
+          <w:pgSz w:w="7920" w:h="12240" w:code="6"/>
+          <w:pgMar w:top="1080" w:right="864" w:bottom="1080" w:left="1152" w:header="576" w:footer="576" w:gutter="0"/>
+          <w:cols w:space="720"/>
+          <w:titlePg/>
+          <w:docGrid w:linePitch="360"/>
+        </w:sectPr>
+      </w:pPr>
+    </w:p>
+    <w:p>
+      <w:pPr>
         <w:pStyle w:val="SPSectionHeading"/>
       </w:pPr>
       <w:r>
@@ -11227,15 +12509,7 @@
       </w:r>
       <w:r>
         <w:br/>
-        <w:t xml:space="preserve">Fiat mihi secundum verbum </w:t>
-      </w:r>
-      <w:proofErr w:type="spellStart"/>
-      <w:r>
-        <w:t>tuum</w:t>
-      </w:r>
-      <w:proofErr w:type="spellEnd"/>
-      <w:r>
-        <w:t xml:space="preserve">. </w:t>
+        <w:t xml:space="preserve">Fiat mihi secundum verbum tuum. </w:t>
       </w:r>
     </w:p>
     <w:p>
@@ -11597,15 +12871,7 @@
       </w:r>
       <w:proofErr w:type="spellEnd"/>
       <w:r>
-        <w:t xml:space="preserve"> </w:t>
-      </w:r>
-      <w:proofErr w:type="spellStart"/>
-      <w:r>
-        <w:t>gloriam</w:t>
-      </w:r>
-      <w:proofErr w:type="spellEnd"/>
-      <w:r>
-        <w:t xml:space="preserve"> </w:t>
+        <w:t xml:space="preserve"> gloriam </w:t>
       </w:r>
       <w:proofErr w:type="spellStart"/>
       <w:r>
@@ -12538,6 +13804,95 @@
 <file path=word/numbering.xml><?xml version="1.0" encoding="utf-8"?>
 <w:numbering xmlns:wpc="http://schemas.microsoft.com/office/word/2010/wordprocessingCanvas" xmlns:cx="http://schemas.microsoft.com/office/drawing/2014/chartex" xmlns:cx1="http://schemas.microsoft.com/office/drawing/2015/9/8/chartex" xmlns:cx2="http://schemas.microsoft.com/office/drawing/2015/10/21/chartex" xmlns:cx3="http://schemas.microsoft.com/office/drawing/2016/5/9/chartex" xmlns:cx4="http://schemas.microsoft.com/office/drawing/2016/5/10/chartex" xmlns:cx5="http://schemas.microsoft.com/office/drawing/2016/5/11/chartex" xmlns:cx6="http://schemas.microsoft.com/office/drawing/2016/5/12/chartex" xmlns:cx7="http://schemas.microsoft.com/office/drawing/2016/5/13/chartex" xmlns:cx8="http://schemas.microsoft.com/office/drawing/2016/5/14/chartex" xmlns:mc="http://schemas.openxmlformats.org/markup-compatibility/2006" xmlns:aink="http://schemas.microsoft.com/office/drawing/2016/ink" xmlns:am3d="http://schemas.microsoft.com/office/drawing/2017/model3d" xmlns:o="urn:schemas-microsoft-com:office:office" xmlns:oel="http://schemas.microsoft.com/office/2019/extlst" xmlns:r="http://schemas.openxmlformats.org/officeDocument/2006/relationships" xmlns:m="http://schemas.openxmlformats.org/officeDocument/2006/math" xmlns:v="urn:schemas-microsoft-com:vml" xmlns:wp14="http://schemas.microsoft.com/office/word/2010/wordprocessingDrawing" xmlns:wp="http://schemas.openxmlformats.org/drawingml/2006/wordprocessingDrawing" xmlns:w10="urn:schemas-microsoft-com:office:word" xmlns:w="http://schemas.openxmlformats.org/wordprocessingml/2006/main" xmlns:w14="http://schemas.microsoft.com/office/word/2010/wordml" xmlns:w15="http://schemas.microsoft.com/office/word/2012/wordml" xmlns:w16cei="http://schemas.microsoft.com/office/word/2026/wordml/cei" xmlns:w16cex="http://schemas.microsoft.com/office/word/2018/wordml/cex" xmlns:w16cid="http://schemas.microsoft.com/office/word/2016/wordml/cid" xmlns:w16="http://schemas.microsoft.com/office/word/2018/wordml" xmlns:w16du="http://schemas.microsoft.com/office/word/2023/wordml/word16du" xmlns:w16sdtdh="http://schemas.microsoft.com/office/word/2020/wordml/sdtdatahash" xmlns:w16sdtfl="http://schemas.microsoft.com/office/word/2024/wordml/sdtformatlock" xmlns:w16se="http://schemas.microsoft.com/office/word/2015/wordml/symex" xmlns:wpg="http://schemas.microsoft.com/office/word/2010/wordprocessingGroup" xmlns:wpi="http://schemas.microsoft.com/office/word/2010/wordprocessingInk" xmlns:wne="http://schemas.microsoft.com/office/word/2006/wordml" xmlns:wps="http://schemas.microsoft.com/office/word/2010/wordprocessingShape" mc:Ignorable="w14 w15 w16se w16cid w16 w16cex w16sdtdh w16sdtfl w16du wp14">
   <w:abstractNum w:abstractNumId="0" w15:restartNumberingAfterBreak="0">
+    <w:nsid w:val="036B3D00"/>
+    <w:multiLevelType w:val="hybridMultilevel"/>
+    <w:tmpl w:val="28DA830E"/>
+    <w:lvl w:ilvl="0" w:tplc="1C09000F">
+      <w:start w:val="1"/>
+      <w:numFmt w:val="decimal"/>
+      <w:lvlText w:val="%1."/>
+      <w:lvlJc w:val="left"/>
+      <w:pPr>
+        <w:ind w:left="720" w:hanging="360"/>
+      </w:pPr>
+      <w:rPr>
+        <w:rFonts w:hint="default"/>
+      </w:rPr>
+    </w:lvl>
+    <w:lvl w:ilvl="1" w:tplc="1C090019" w:tentative="1">
+      <w:start w:val="1"/>
+      <w:numFmt w:val="lowerLetter"/>
+      <w:lvlText w:val="%2."/>
+      <w:lvlJc w:val="left"/>
+      <w:pPr>
+        <w:ind w:left="1440" w:hanging="360"/>
+      </w:pPr>
+    </w:lvl>
+    <w:lvl w:ilvl="2" w:tplc="1C09001B" w:tentative="1">
+      <w:start w:val="1"/>
+      <w:numFmt w:val="lowerRoman"/>
+      <w:lvlText w:val="%3."/>
+      <w:lvlJc w:val="right"/>
+      <w:pPr>
+        <w:ind w:left="2160" w:hanging="180"/>
+      </w:pPr>
+    </w:lvl>
+    <w:lvl w:ilvl="3" w:tplc="1C09000F" w:tentative="1">
+      <w:start w:val="1"/>
+      <w:numFmt w:val="decimal"/>
+      <w:lvlText w:val="%4."/>
+      <w:lvlJc w:val="left"/>
+      <w:pPr>
+        <w:ind w:left="2880" w:hanging="360"/>
+      </w:pPr>
+    </w:lvl>
+    <w:lvl w:ilvl="4" w:tplc="1C090019" w:tentative="1">
+      <w:start w:val="1"/>
+      <w:numFmt w:val="lowerLetter"/>
+      <w:lvlText w:val="%5."/>
+      <w:lvlJc w:val="left"/>
+      <w:pPr>
+        <w:ind w:left="3600" w:hanging="360"/>
+      </w:pPr>
+    </w:lvl>
+    <w:lvl w:ilvl="5" w:tplc="1C09001B" w:tentative="1">
+      <w:start w:val="1"/>
+      <w:numFmt w:val="lowerRoman"/>
+      <w:lvlText w:val="%6."/>
+      <w:lvlJc w:val="right"/>
+      <w:pPr>
+        <w:ind w:left="4320" w:hanging="180"/>
+      </w:pPr>
+    </w:lvl>
+    <w:lvl w:ilvl="6" w:tplc="1C09000F" w:tentative="1">
+      <w:start w:val="1"/>
+      <w:numFmt w:val="decimal"/>
+      <w:lvlText w:val="%7."/>
+      <w:lvlJc w:val="left"/>
+      <w:pPr>
+        <w:ind w:left="5040" w:hanging="360"/>
+      </w:pPr>
+    </w:lvl>
+    <w:lvl w:ilvl="7" w:tplc="1C090019" w:tentative="1">
+      <w:start w:val="1"/>
+      <w:numFmt w:val="lowerLetter"/>
+      <w:lvlText w:val="%8."/>
+      <w:lvlJc w:val="left"/>
+      <w:pPr>
+        <w:ind w:left="5760" w:hanging="360"/>
+      </w:pPr>
+    </w:lvl>
+    <w:lvl w:ilvl="8" w:tplc="1C09001B" w:tentative="1">
+      <w:start w:val="1"/>
+      <w:numFmt w:val="lowerRoman"/>
+      <w:lvlText w:val="%9."/>
+      <w:lvlJc w:val="right"/>
+      <w:pPr>
+        <w:ind w:left="6480" w:hanging="180"/>
+      </w:pPr>
+    </w:lvl>
+  </w:abstractNum>
+  <w:abstractNum w:abstractNumId="1" w15:restartNumberingAfterBreak="0">
     <w:nsid w:val="24953221"/>
     <w:multiLevelType w:val="multilevel"/>
     <w:tmpl w:val="A77E292E"/>
@@ -12686,7 +14041,7 @@
       </w:rPr>
     </w:lvl>
   </w:abstractNum>
-  <w:abstractNum w:abstractNumId="1" w15:restartNumberingAfterBreak="0">
+  <w:abstractNum w:abstractNumId="2" w15:restartNumberingAfterBreak="0">
     <w:nsid w:val="2A856458"/>
     <w:multiLevelType w:val="multilevel"/>
     <w:tmpl w:val="EDFEAD46"/>
@@ -12835,7 +14190,7 @@
       </w:rPr>
     </w:lvl>
   </w:abstractNum>
-  <w:abstractNum w:abstractNumId="2" w15:restartNumberingAfterBreak="0">
+  <w:abstractNum w:abstractNumId="3" w15:restartNumberingAfterBreak="0">
     <w:nsid w:val="4F541A7A"/>
     <w:multiLevelType w:val="multilevel"/>
     <w:tmpl w:val="EED4D09C"/>
@@ -12984,7 +14339,7 @@
       </w:rPr>
     </w:lvl>
   </w:abstractNum>
-  <w:abstractNum w:abstractNumId="3" w15:restartNumberingAfterBreak="0">
+  <w:abstractNum w:abstractNumId="4" w15:restartNumberingAfterBreak="0">
     <w:nsid w:val="62D96A0A"/>
     <w:multiLevelType w:val="multilevel"/>
     <w:tmpl w:val="958A32D0"/>
@@ -13133,17 +14488,204 @@
       </w:rPr>
     </w:lvl>
   </w:abstractNum>
+  <w:abstractNum w:abstractNumId="5" w15:restartNumberingAfterBreak="0">
+    <w:nsid w:val="689612F7"/>
+    <w:multiLevelType w:val="hybridMultilevel"/>
+    <w:tmpl w:val="9E1622E2"/>
+    <w:lvl w:ilvl="0" w:tplc="52AAD608">
+      <w:start w:val="1"/>
+      <w:numFmt w:val="decimal"/>
+      <w:lvlText w:val="%1."/>
+      <w:lvlJc w:val="left"/>
+      <w:pPr>
+        <w:ind w:left="1037" w:hanging="360"/>
+      </w:pPr>
+      <w:rPr>
+        <w:rFonts w:hint="default"/>
+      </w:rPr>
+    </w:lvl>
+    <w:lvl w:ilvl="1" w:tplc="1C090019" w:tentative="1">
+      <w:start w:val="1"/>
+      <w:numFmt w:val="lowerLetter"/>
+      <w:lvlText w:val="%2."/>
+      <w:lvlJc w:val="left"/>
+      <w:pPr>
+        <w:ind w:left="1757" w:hanging="360"/>
+      </w:pPr>
+    </w:lvl>
+    <w:lvl w:ilvl="2" w:tplc="1C09001B" w:tentative="1">
+      <w:start w:val="1"/>
+      <w:numFmt w:val="lowerRoman"/>
+      <w:lvlText w:val="%3."/>
+      <w:lvlJc w:val="right"/>
+      <w:pPr>
+        <w:ind w:left="2477" w:hanging="180"/>
+      </w:pPr>
+    </w:lvl>
+    <w:lvl w:ilvl="3" w:tplc="1C09000F" w:tentative="1">
+      <w:start w:val="1"/>
+      <w:numFmt w:val="decimal"/>
+      <w:lvlText w:val="%4."/>
+      <w:lvlJc w:val="left"/>
+      <w:pPr>
+        <w:ind w:left="3197" w:hanging="360"/>
+      </w:pPr>
+    </w:lvl>
+    <w:lvl w:ilvl="4" w:tplc="1C090019" w:tentative="1">
+      <w:start w:val="1"/>
+      <w:numFmt w:val="lowerLetter"/>
+      <w:lvlText w:val="%5."/>
+      <w:lvlJc w:val="left"/>
+      <w:pPr>
+        <w:ind w:left="3917" w:hanging="360"/>
+      </w:pPr>
+    </w:lvl>
+    <w:lvl w:ilvl="5" w:tplc="1C09001B" w:tentative="1">
+      <w:start w:val="1"/>
+      <w:numFmt w:val="lowerRoman"/>
+      <w:lvlText w:val="%6."/>
+      <w:lvlJc w:val="right"/>
+      <w:pPr>
+        <w:ind w:left="4637" w:hanging="180"/>
+      </w:pPr>
+    </w:lvl>
+    <w:lvl w:ilvl="6" w:tplc="1C09000F" w:tentative="1">
+      <w:start w:val="1"/>
+      <w:numFmt w:val="decimal"/>
+      <w:lvlText w:val="%7."/>
+      <w:lvlJc w:val="left"/>
+      <w:pPr>
+        <w:ind w:left="5357" w:hanging="360"/>
+      </w:pPr>
+    </w:lvl>
+    <w:lvl w:ilvl="7" w:tplc="1C090019" w:tentative="1">
+      <w:start w:val="1"/>
+      <w:numFmt w:val="lowerLetter"/>
+      <w:lvlText w:val="%8."/>
+      <w:lvlJc w:val="left"/>
+      <w:pPr>
+        <w:ind w:left="6077" w:hanging="360"/>
+      </w:pPr>
+    </w:lvl>
+    <w:lvl w:ilvl="8" w:tplc="1C09001B" w:tentative="1">
+      <w:start w:val="1"/>
+      <w:numFmt w:val="lowerRoman"/>
+      <w:lvlText w:val="%9."/>
+      <w:lvlJc w:val="right"/>
+      <w:pPr>
+        <w:ind w:left="6797" w:hanging="180"/>
+      </w:pPr>
+    </w:lvl>
+  </w:abstractNum>
+  <w:abstractNum w:abstractNumId="6" w15:restartNumberingAfterBreak="0">
+    <w:nsid w:val="694717A1"/>
+    <w:multiLevelType w:val="hybridMultilevel"/>
+    <w:tmpl w:val="E2B4C186"/>
+    <w:lvl w:ilvl="0" w:tplc="5FFCB046">
+      <w:start w:val="1"/>
+      <w:numFmt w:val="decimal"/>
+      <w:lvlText w:val="%1."/>
+      <w:lvlJc w:val="left"/>
+      <w:pPr>
+        <w:ind w:left="1037" w:hanging="360"/>
+      </w:pPr>
+      <w:rPr>
+        <w:rFonts w:hint="default"/>
+      </w:rPr>
+    </w:lvl>
+    <w:lvl w:ilvl="1" w:tplc="1C090019" w:tentative="1">
+      <w:start w:val="1"/>
+      <w:numFmt w:val="lowerLetter"/>
+      <w:lvlText w:val="%2."/>
+      <w:lvlJc w:val="left"/>
+      <w:pPr>
+        <w:ind w:left="1757" w:hanging="360"/>
+      </w:pPr>
+    </w:lvl>
+    <w:lvl w:ilvl="2" w:tplc="1C09001B" w:tentative="1">
+      <w:start w:val="1"/>
+      <w:numFmt w:val="lowerRoman"/>
+      <w:lvlText w:val="%3."/>
+      <w:lvlJc w:val="right"/>
+      <w:pPr>
+        <w:ind w:left="2477" w:hanging="180"/>
+      </w:pPr>
+    </w:lvl>
+    <w:lvl w:ilvl="3" w:tplc="1C09000F" w:tentative="1">
+      <w:start w:val="1"/>
+      <w:numFmt w:val="decimal"/>
+      <w:lvlText w:val="%4."/>
+      <w:lvlJc w:val="left"/>
+      <w:pPr>
+        <w:ind w:left="3197" w:hanging="360"/>
+      </w:pPr>
+    </w:lvl>
+    <w:lvl w:ilvl="4" w:tplc="1C090019" w:tentative="1">
+      <w:start w:val="1"/>
+      <w:numFmt w:val="lowerLetter"/>
+      <w:lvlText w:val="%5."/>
+      <w:lvlJc w:val="left"/>
+      <w:pPr>
+        <w:ind w:left="3917" w:hanging="360"/>
+      </w:pPr>
+    </w:lvl>
+    <w:lvl w:ilvl="5" w:tplc="1C09001B" w:tentative="1">
+      <w:start w:val="1"/>
+      <w:numFmt w:val="lowerRoman"/>
+      <w:lvlText w:val="%6."/>
+      <w:lvlJc w:val="right"/>
+      <w:pPr>
+        <w:ind w:left="4637" w:hanging="180"/>
+      </w:pPr>
+    </w:lvl>
+    <w:lvl w:ilvl="6" w:tplc="1C09000F" w:tentative="1">
+      <w:start w:val="1"/>
+      <w:numFmt w:val="decimal"/>
+      <w:lvlText w:val="%7."/>
+      <w:lvlJc w:val="left"/>
+      <w:pPr>
+        <w:ind w:left="5357" w:hanging="360"/>
+      </w:pPr>
+    </w:lvl>
+    <w:lvl w:ilvl="7" w:tplc="1C090019" w:tentative="1">
+      <w:start w:val="1"/>
+      <w:numFmt w:val="lowerLetter"/>
+      <w:lvlText w:val="%8."/>
+      <w:lvlJc w:val="left"/>
+      <w:pPr>
+        <w:ind w:left="6077" w:hanging="360"/>
+      </w:pPr>
+    </w:lvl>
+    <w:lvl w:ilvl="8" w:tplc="1C09001B" w:tentative="1">
+      <w:start w:val="1"/>
+      <w:numFmt w:val="lowerRoman"/>
+      <w:lvlText w:val="%9."/>
+      <w:lvlJc w:val="right"/>
+      <w:pPr>
+        <w:ind w:left="6797" w:hanging="180"/>
+      </w:pPr>
+    </w:lvl>
+  </w:abstractNum>
   <w:num w:numId="1" w16cid:durableId="2001542825">
+    <w:abstractNumId w:val="2"/>
+  </w:num>
+  <w:num w:numId="2" w16cid:durableId="1522161272">
+    <w:abstractNumId w:val="4"/>
+  </w:num>
+  <w:num w:numId="3" w16cid:durableId="1075280120">
+    <w:abstractNumId w:val="3"/>
+  </w:num>
+  <w:num w:numId="4" w16cid:durableId="221643493">
     <w:abstractNumId w:val="1"/>
   </w:num>
-  <w:num w:numId="2" w16cid:durableId="1522161272">
-    <w:abstractNumId w:val="3"/>
+  <w:num w:numId="5" w16cid:durableId="1493838914">
+    <w:abstractNumId w:val="0"/>
   </w:num>
-  <w:num w:numId="3" w16cid:durableId="1075280120">
-    <w:abstractNumId w:val="2"/>
+  <w:num w:numId="6" w16cid:durableId="522675334">
+    <w:abstractNumId w:val="6"/>
   </w:num>
-  <w:num w:numId="4" w16cid:durableId="221643493">
-    <w:abstractNumId w:val="0"/>
+  <w:num w:numId="7" w16cid:durableId="879974766">
+    <w:abstractNumId w:val="5"/>
   </w:num>
 </w:numbering>
 </file>

</xml_diff>

<commit_message>
Prayer rearrangement into 4 sections. Nunc Dimmitus created. Angelus updated with scripture. Morning Offering started.
</commit_message>
<xml_diff>
--- a/manuscript/volume-1/sacrae-preces-volume-1.docx
+++ b/manuscript/volume-1/sacrae-preces-volume-1.docx
@@ -1352,7 +1352,7 @@
       </w:pPr>
       <w:r>
         <w:pict w14:anchorId="249FE732">
-          <v:rect id="_x0000_i1323" style="width:0;height:1.5pt" o:hralign="center" o:hrstd="t" o:hr="t" fillcolor="#a0a0a0" stroked="f"/>
+          <v:rect id="_x0000_i1351" style="width:0;height:1.5pt" o:hralign="center" o:hrstd="t" o:hr="t" fillcolor="#a0a0a0" stroked="f"/>
         </w:pict>
       </w:r>
     </w:p>
@@ -1530,7 +1530,7 @@
       </w:pPr>
       <w:r>
         <w:pict w14:anchorId="5281CFCF">
-          <v:rect id="_x0000_i1329" style="width:0;height:1.5pt" o:hralign="center" o:hrstd="t" o:hr="t" fillcolor="#a0a0a0" stroked="f"/>
+          <v:rect id="_x0000_i1352" style="width:0;height:1.5pt" o:hralign="center" o:hrstd="t" o:hr="t" fillcolor="#a0a0a0" stroked="f"/>
         </w:pict>
       </w:r>
     </w:p>
@@ -1634,7 +1634,7 @@
       </w:pPr>
       <w:r>
         <w:pict w14:anchorId="25751FDD">
-          <v:rect id="_x0000_i1324" style="width:0;height:1.5pt" o:hralign="center" o:hrstd="t" o:hr="t" fillcolor="#a0a0a0" stroked="f"/>
+          <v:rect id="_x0000_i1353" style="width:0;height:1.5pt" o:hralign="center" o:hrstd="t" o:hr="t" fillcolor="#a0a0a0" stroked="f"/>
         </w:pict>
       </w:r>
     </w:p>
@@ -1699,7 +1699,7 @@
       </w:pPr>
       <w:r>
         <w:pict w14:anchorId="19542BB1">
-          <v:rect id="_x0000_i1325" style="width:0;height:1.5pt" o:hralign="center" o:hrstd="t" o:hr="t" fillcolor="#a0a0a0" stroked="f"/>
+          <v:rect id="_x0000_i1354" style="width:0;height:1.5pt" o:hralign="center" o:hrstd="t" o:hr="t" fillcolor="#a0a0a0" stroked="f"/>
         </w:pict>
       </w:r>
     </w:p>
@@ -1811,7 +1811,7 @@
       </w:pPr>
       <w:r>
         <w:pict w14:anchorId="4D1CE6F0">
-          <v:rect id="_x0000_i1326" style="width:0;height:1.5pt" o:hralign="center" o:hrstd="t" o:hr="t" fillcolor="#a0a0a0" stroked="f"/>
+          <v:rect id="_x0000_i1355" style="width:0;height:1.5pt" o:hralign="center" o:hrstd="t" o:hr="t" fillcolor="#a0a0a0" stroked="f"/>
         </w:pict>
       </w:r>
     </w:p>
@@ -1915,7 +1915,7 @@
       </w:pPr>
       <w:r>
         <w:pict w14:anchorId="68D46385">
-          <v:rect id="_x0000_i1327" style="width:0;height:1.5pt" o:hralign="center" o:hrstd="t" o:hr="t" fillcolor="#a0a0a0" stroked="f"/>
+          <v:rect id="_x0000_i1356" style="width:0;height:1.5pt" o:hralign="center" o:hrstd="t" o:hr="t" fillcolor="#a0a0a0" stroked="f"/>
         </w:pict>
       </w:r>
     </w:p>
@@ -2044,7 +2044,7 @@
       </w:pPr>
       <w:r>
         <w:pict w14:anchorId="36FAD975">
-          <v:rect id="_x0000_i1328" style="width:0;height:1.5pt" o:hralign="center" o:hrstd="t" o:hr="t" fillcolor="#a0a0a0" stroked="f"/>
+          <v:rect id="_x0000_i1357" style="width:0;height:1.5pt" o:hralign="center" o:hrstd="t" o:hr="t" fillcolor="#a0a0a0" stroked="f"/>
         </w:pict>
       </w:r>
     </w:p>
@@ -6938,7 +6938,15 @@
         <w:pStyle w:val="SPScripture"/>
       </w:pPr>
       <w:r>
-        <w:t>But the tax collector, standing far off, would not even lift up his eyes to heaven, but beat his breast, saying, “God, be merciful to me a sinner!”</w:t>
+        <w:t xml:space="preserve">But the tax collector, standing far off, would not even </w:t>
+      </w:r>
+      <w:proofErr w:type="gramStart"/>
+      <w:r>
+        <w:t>lift up</w:t>
+      </w:r>
+      <w:proofErr w:type="gramEnd"/>
+      <w:r>
+        <w:t xml:space="preserve"> his eyes to heaven, but beat his breast, saying, “God, be merciful to me a sinner!”</w:t>
       </w:r>
     </w:p>
     <w:p>
@@ -6960,7 +6968,15 @@
         <w:pStyle w:val="SPScripture"/>
       </w:pPr>
       <w:r>
-        <w:t>If we confess our sins, he is faithful and just, and will forgive our sins and cleanse us from all unrighteousness.</w:t>
+        <w:t xml:space="preserve">If we confess our sins, he is faithful and </w:t>
+      </w:r>
+      <w:proofErr w:type="gramStart"/>
+      <w:r>
+        <w:t>just, and</w:t>
+      </w:r>
+      <w:proofErr w:type="gramEnd"/>
+      <w:r>
+        <w:t xml:space="preserve"> will forgive our sins and cleanse us from all unrighteousness.</w:t>
       </w:r>
     </w:p>
     <w:p>
@@ -11942,7 +11958,10 @@
         <w:pStyle w:val="SPScriptureReference"/>
       </w:pPr>
       <w:r>
-        <w:t xml:space="preserve"> Luke 1:46-55</w:t>
+        <w:t xml:space="preserve"> Luke </w:t>
+      </w:r>
+      <w:r>
+        <w:t>2:29-32</w:t>
       </w:r>
     </w:p>
     <w:p>
@@ -11955,7 +11974,13 @@
         <w:pStyle w:val="SPScripture"/>
       </w:pPr>
       <w:r>
-        <w:t xml:space="preserve"> And Mary said, </w:t>
+        <w:t xml:space="preserve"> </w:t>
+      </w:r>
+      <w:r>
+        <w:t>“Lord, now let your servant depart in peace, according to your word; for my eyes have seen your salvation which you have prepared in the presence of all peoples, a light for revelation to the Gentiles, and for glory to your people Israel”</w:t>
+      </w:r>
+      <w:r>
+        <w:t xml:space="preserve"> </w:t>
       </w:r>
     </w:p>
     <w:p>
@@ -11986,14 +12011,443 @@
         <w:rPr>
           <w:b/>
           <w:bCs/>
-        </w:rPr>
-      </w:pPr>
-      <w:r>
-        <w:rPr>
-          <w:b/>
-          <w:bCs/>
-        </w:rPr>
-        <w:t>A Soul That Magnifies God</w:t>
+          <w:lang w:eastAsia="en-ZA"/>
+        </w:rPr>
+      </w:pPr>
+      <w:r>
+        <w:rPr>
+          <w:b/>
+          <w:bCs/>
+          <w:lang w:eastAsia="en-ZA"/>
+        </w:rPr>
+        <w:t>Seeing the Light</w:t>
+      </w:r>
+    </w:p>
+    <w:p>
+      <w:pPr>
+        <w:pStyle w:val="SPBodyText"/>
+        <w:rPr>
+          <w:szCs w:val="24"/>
+          <w:lang w:eastAsia="en-ZA"/>
+        </w:rPr>
+      </w:pPr>
+      <w:r>
+        <w:rPr>
+          <w:szCs w:val="24"/>
+          <w:lang w:eastAsia="en-ZA"/>
+        </w:rPr>
+        <w:t>Simeon had waited.</w:t>
+      </w:r>
+    </w:p>
+    <w:p>
+      <w:pPr>
+        <w:pStyle w:val="SPBodyText"/>
+        <w:rPr>
+          <w:szCs w:val="24"/>
+          <w:lang w:eastAsia="en-ZA"/>
+        </w:rPr>
+      </w:pPr>
+      <w:r>
+        <w:rPr>
+          <w:szCs w:val="24"/>
+          <w:lang w:eastAsia="en-ZA"/>
+        </w:rPr>
+        <w:t>For years, he had trusted in a promise that had not yet been fulfilled. Then, in the Temple, he took the infant Jesus into his arms and recognised in Him the salvation he had been waiting for.</w:t>
+      </w:r>
+    </w:p>
+    <w:p>
+      <w:pPr>
+        <w:pStyle w:val="SPBodyText"/>
+        <w:rPr>
+          <w:szCs w:val="24"/>
+          <w:lang w:eastAsia="en-ZA"/>
+        </w:rPr>
+      </w:pPr>
+      <w:r>
+        <w:rPr>
+          <w:szCs w:val="24"/>
+          <w:lang w:eastAsia="en-ZA"/>
+        </w:rPr>
+        <w:t>His response was not a demand for more.</w:t>
+      </w:r>
+    </w:p>
+    <w:p>
+      <w:pPr>
+        <w:pStyle w:val="SPBodyText"/>
+        <w:rPr>
+          <w:szCs w:val="24"/>
+          <w:lang w:eastAsia="en-ZA"/>
+        </w:rPr>
+      </w:pPr>
+      <w:r>
+        <w:rPr>
+          <w:szCs w:val="24"/>
+          <w:lang w:eastAsia="en-ZA"/>
+        </w:rPr>
+        <w:t>It was peace.</w:t>
+      </w:r>
+    </w:p>
+    <w:p>
+      <w:pPr>
+        <w:pStyle w:val="SPBodyText"/>
+        <w:rPr>
+          <w:szCs w:val="24"/>
+          <w:lang w:eastAsia="en-ZA"/>
+        </w:rPr>
+      </w:pPr>
+    </w:p>
+    <w:p>
+      <w:pPr>
+        <w:pStyle w:val="SPScripture"/>
+        <w:rPr>
+          <w:lang w:eastAsia="en-ZA"/>
+        </w:rPr>
+      </w:pPr>
+      <w:r>
+        <w:rPr>
+          <w:lang w:eastAsia="en-ZA"/>
+        </w:rPr>
+        <w:t>“Lord, now you may let your servant depart in peace.”</w:t>
+      </w:r>
+    </w:p>
+    <w:p>
+      <w:pPr>
+        <w:pStyle w:val="SPScripture"/>
+        <w:rPr>
+          <w:lang w:eastAsia="en-ZA"/>
+        </w:rPr>
+      </w:pPr>
+    </w:p>
+    <w:p>
+      <w:pPr>
+        <w:pStyle w:val="SPBodyText"/>
+        <w:rPr>
+          <w:szCs w:val="24"/>
+          <w:lang w:eastAsia="en-ZA"/>
+        </w:rPr>
+      </w:pPr>
+      <w:r>
+        <w:rPr>
+          <w:szCs w:val="24"/>
+          <w:lang w:eastAsia="en-ZA"/>
+        </w:rPr>
+        <w:t>The Nunc Dimittis invites us to consider what it means to recognise that God has already given us what we most deeply need.</w:t>
+      </w:r>
+    </w:p>
+    <w:p>
+      <w:pPr>
+        <w:pStyle w:val="SPBodyText"/>
+        <w:rPr>
+          <w:szCs w:val="24"/>
+          <w:lang w:eastAsia="en-ZA"/>
+        </w:rPr>
+      </w:pPr>
+      <w:r>
+        <w:rPr>
+          <w:szCs w:val="24"/>
+          <w:lang w:eastAsia="en-ZA"/>
+        </w:rPr>
+        <w:t>We often move through our days looking towards what comes next — another task, another achievement, another answer, another tomorrow. Simeon's prayer reminds us to stop and recognise what is already before us.</w:t>
+      </w:r>
+    </w:p>
+    <w:p>
+      <w:pPr>
+        <w:pStyle w:val="SPBodyText"/>
+        <w:rPr>
+          <w:szCs w:val="24"/>
+          <w:lang w:eastAsia="en-ZA"/>
+        </w:rPr>
+      </w:pPr>
+    </w:p>
+    <w:p>
+      <w:pPr>
+        <w:pStyle w:val="SPBodyText"/>
+        <w:rPr>
+          <w:szCs w:val="24"/>
+          <w:lang w:eastAsia="en-ZA"/>
+        </w:rPr>
+      </w:pPr>
+      <w:r>
+        <w:rPr>
+          <w:szCs w:val="24"/>
+          <w:lang w:eastAsia="en-ZA"/>
+        </w:rPr>
+        <w:t>Christ has come.</w:t>
+      </w:r>
+    </w:p>
+    <w:p>
+      <w:pPr>
+        <w:pStyle w:val="SPBodyText"/>
+        <w:rPr>
+          <w:szCs w:val="24"/>
+          <w:lang w:eastAsia="en-ZA"/>
+        </w:rPr>
+      </w:pPr>
+      <w:r>
+        <w:rPr>
+          <w:szCs w:val="24"/>
+          <w:lang w:eastAsia="en-ZA"/>
+        </w:rPr>
+        <w:t>The light has entered the world.</w:t>
+      </w:r>
+    </w:p>
+    <w:p>
+      <w:pPr>
+        <w:pStyle w:val="SPBodyText"/>
+        <w:rPr>
+          <w:szCs w:val="24"/>
+          <w:lang w:eastAsia="en-ZA"/>
+        </w:rPr>
+      </w:pPr>
+      <w:r>
+        <w:rPr>
+          <w:szCs w:val="24"/>
+          <w:lang w:eastAsia="en-ZA"/>
+        </w:rPr>
+        <w:t>And we are invited to see Him.</w:t>
+      </w:r>
+    </w:p>
+    <w:p>
+      <w:pPr>
+        <w:pStyle w:val="SPBodyText"/>
+        <w:rPr>
+          <w:szCs w:val="24"/>
+          <w:lang w:eastAsia="en-ZA"/>
+        </w:rPr>
+      </w:pPr>
+      <w:r>
+        <w:rPr>
+          <w:szCs w:val="24"/>
+          <w:lang w:eastAsia="en-ZA"/>
+        </w:rPr>
+        <w:lastRenderedPageBreak/>
+        <w:t>The prayer also teaches us something about surrender. Simeon does not cling to the future. Having seen God's promise fulfilled, he is able to place his life peacefully into God's hands.</w:t>
+      </w:r>
+    </w:p>
+    <w:p>
+      <w:pPr>
+        <w:pStyle w:val="SPBodyText"/>
+        <w:rPr>
+          <w:szCs w:val="24"/>
+          <w:lang w:eastAsia="en-ZA"/>
+        </w:rPr>
+      </w:pPr>
+      <w:r>
+        <w:rPr>
+          <w:szCs w:val="24"/>
+          <w:lang w:eastAsia="en-ZA"/>
+        </w:rPr>
+        <w:t>There may be things we are still waiting for. There may be prayers that seem unanswered, hopes that have not yet been fulfilled, and questions for which we have no clear answer.</w:t>
+      </w:r>
+    </w:p>
+    <w:p>
+      <w:pPr>
+        <w:pStyle w:val="SPBodyText"/>
+        <w:rPr>
+          <w:szCs w:val="24"/>
+          <w:lang w:eastAsia="en-ZA"/>
+        </w:rPr>
+      </w:pPr>
+      <w:r>
+        <w:rPr>
+          <w:szCs w:val="24"/>
+          <w:lang w:eastAsia="en-ZA"/>
+        </w:rPr>
+        <w:t>Yet we can still pray.</w:t>
+      </w:r>
+    </w:p>
+    <w:p>
+      <w:pPr>
+        <w:pStyle w:val="SPBodyText"/>
+        <w:rPr>
+          <w:szCs w:val="24"/>
+          <w:lang w:eastAsia="en-ZA"/>
+        </w:rPr>
+      </w:pPr>
+      <w:r>
+        <w:rPr>
+          <w:szCs w:val="24"/>
+          <w:lang w:eastAsia="en-ZA"/>
+        </w:rPr>
+        <w:t>We can still give thanks for what God has already placed before us.</w:t>
+      </w:r>
+    </w:p>
+    <w:p>
+      <w:pPr>
+        <w:pStyle w:val="SPBodyText"/>
+        <w:rPr>
+          <w:szCs w:val="24"/>
+          <w:lang w:eastAsia="en-ZA"/>
+        </w:rPr>
+      </w:pPr>
+      <w:r>
+        <w:rPr>
+          <w:szCs w:val="24"/>
+          <w:lang w:eastAsia="en-ZA"/>
+        </w:rPr>
+        <w:t>And we can still trust Him with what remains.</w:t>
+      </w:r>
+    </w:p>
+    <w:p>
+      <w:pPr>
+        <w:pStyle w:val="SPBodyText"/>
+        <w:rPr>
+          <w:szCs w:val="24"/>
+          <w:lang w:eastAsia="en-ZA"/>
+        </w:rPr>
+      </w:pPr>
+      <w:r>
+        <w:rPr>
+          <w:szCs w:val="24"/>
+          <w:lang w:eastAsia="en-ZA"/>
+        </w:rPr>
+        <w:t>At the end of the day, the Nunc Dimittis becomes a gentle act of surrender.</w:t>
+      </w:r>
+    </w:p>
+    <w:p>
+      <w:pPr>
+        <w:pStyle w:val="SPBodyText"/>
+        <w:rPr>
+          <w:szCs w:val="24"/>
+          <w:lang w:eastAsia="en-ZA"/>
+        </w:rPr>
+      </w:pPr>
+    </w:p>
+    <w:p>
+      <w:pPr>
+        <w:pStyle w:val="SPBodyText"/>
+        <w:rPr>
+          <w:szCs w:val="24"/>
+          <w:lang w:eastAsia="en-ZA"/>
+        </w:rPr>
+      </w:pPr>
+      <w:r>
+        <w:rPr>
+          <w:szCs w:val="24"/>
+          <w:lang w:eastAsia="en-ZA"/>
+        </w:rPr>
+        <w:t>We have done what we could.</w:t>
+      </w:r>
+    </w:p>
+    <w:p>
+      <w:pPr>
+        <w:pStyle w:val="SPBodyText"/>
+        <w:rPr>
+          <w:szCs w:val="24"/>
+          <w:lang w:eastAsia="en-ZA"/>
+        </w:rPr>
+      </w:pPr>
+      <w:r>
+        <w:rPr>
+          <w:szCs w:val="24"/>
+          <w:lang w:eastAsia="en-ZA"/>
+        </w:rPr>
+        <w:t>We give thanks for what has been given.</w:t>
+      </w:r>
+    </w:p>
+    <w:p>
+      <w:pPr>
+        <w:pStyle w:val="SPBodyText"/>
+        <w:rPr>
+          <w:szCs w:val="24"/>
+          <w:lang w:eastAsia="en-ZA"/>
+        </w:rPr>
+      </w:pPr>
+      <w:r>
+        <w:rPr>
+          <w:szCs w:val="24"/>
+          <w:lang w:eastAsia="en-ZA"/>
+        </w:rPr>
+        <w:t>We place tomorrow into God's hands.</w:t>
+      </w:r>
+    </w:p>
+    <w:p>
+      <w:pPr>
+        <w:pStyle w:val="SPBodyText"/>
+        <w:rPr>
+          <w:szCs w:val="24"/>
+          <w:lang w:eastAsia="en-ZA"/>
+        </w:rPr>
+      </w:pPr>
+      <w:r>
+        <w:rPr>
+          <w:szCs w:val="24"/>
+          <w:lang w:eastAsia="en-ZA"/>
+        </w:rPr>
+        <w:t>And we rest.</w:t>
+      </w:r>
+    </w:p>
+    <w:p>
+      <w:pPr>
+        <w:pStyle w:val="SPBodyText"/>
+        <w:rPr>
+          <w:szCs w:val="24"/>
+          <w:lang w:eastAsia="en-ZA"/>
+        </w:rPr>
+      </w:pPr>
+    </w:p>
+    <w:p>
+      <w:pPr>
+        <w:pStyle w:val="SPBodyText"/>
+        <w:rPr>
+          <w:szCs w:val="24"/>
+          <w:lang w:eastAsia="en-ZA"/>
+        </w:rPr>
+      </w:pPr>
+      <w:r>
+        <w:rPr>
+          <w:szCs w:val="24"/>
+          <w:lang w:eastAsia="en-ZA"/>
+        </w:rPr>
+        <w:t>The light we seek is not something we must create for ourselves.</w:t>
+      </w:r>
+    </w:p>
+    <w:p>
+      <w:pPr>
+        <w:pStyle w:val="SPBodyText"/>
+        <w:rPr>
+          <w:szCs w:val="24"/>
+          <w:lang w:eastAsia="en-ZA"/>
+        </w:rPr>
+      </w:pPr>
+      <w:r>
+        <w:rPr>
+          <w:szCs w:val="24"/>
+          <w:lang w:eastAsia="en-ZA"/>
+        </w:rPr>
+        <w:t>It is Christ.</w:t>
+      </w:r>
+    </w:p>
+    <w:p>
+      <w:pPr>
+        <w:pStyle w:val="SPBodyText"/>
+        <w:rPr>
+          <w:szCs w:val="24"/>
+          <w:lang w:eastAsia="en-ZA"/>
+        </w:rPr>
+      </w:pPr>
+      <w:r>
+        <w:rPr>
+          <w:szCs w:val="24"/>
+          <w:lang w:eastAsia="en-ZA"/>
+        </w:rPr>
+        <w:t>“A light for revelation to the nations.”</w:t>
+      </w:r>
+    </w:p>
+    <w:p>
+      <w:pPr>
+        <w:pStyle w:val="SPBodyText"/>
+        <w:rPr>
+          <w:szCs w:val="24"/>
+          <w:lang w:eastAsia="en-ZA"/>
+        </w:rPr>
+      </w:pPr>
+      <w:r>
+        <w:rPr>
+          <w:szCs w:val="24"/>
+          <w:lang w:eastAsia="en-ZA"/>
+        </w:rPr>
+        <w:t>May we learn, like Simeon, to recognise that light when it is before us — and having seen it, to rest in peace.</w:t>
       </w:r>
     </w:p>
     <w:p>
@@ -12040,23 +12494,169 @@
     <w:p>
       <w:pPr>
         <w:pStyle w:val="SPBodyText"/>
-        <w:tabs>
-          <w:tab w:val="left" w:pos="2956"/>
-          <w:tab w:val="center" w:pos="3290"/>
-        </w:tabs>
-        <w:rPr>
-          <w:rFonts w:ascii="Segoe UI Symbol" w:hAnsi="Segoe UI Symbol" w:cs="Segoe UI Symbol"/>
-        </w:rPr>
-      </w:pPr>
-      <w:r>
-        <w:rPr>
-          <w:rFonts w:ascii="Segoe UI Symbol" w:hAnsi="Segoe UI Symbol" w:cs="Segoe UI Symbol"/>
-        </w:rPr>
+      </w:pPr>
+      <w:r>
         <w:tab/>
       </w:r>
-    </w:p>
-    <w:p>
-      <w:pPr>
+      <w:r>
+        <w:t>Catholic prayer is not limited to the prayers of the Mass or to a particular devotion.</w:t>
+      </w:r>
+    </w:p>
+    <w:p>
+      <w:pPr>
+        <w:pStyle w:val="SPBodyText"/>
+      </w:pPr>
+      <w:r>
+        <w:t>Throughout the centuries, Christians have carried simple prayers into the ordinary moments of life: upon waking, before sleep, in times of difficulty, in thanksgiving, in sorrow, and whenever the heart turns towards God.</w:t>
+      </w:r>
+    </w:p>
+    <w:p>
+      <w:pPr>
+        <w:pStyle w:val="SPBodyText"/>
+      </w:pPr>
+      <w:r>
+        <w:t xml:space="preserve">These prayers have been handed down through generations. Some are centuries old. Others grew from </w:t>
+      </w:r>
+      <w:proofErr w:type="gramStart"/>
+      <w:r>
+        <w:t>particular traditions</w:t>
+      </w:r>
+      <w:proofErr w:type="gramEnd"/>
+      <w:r>
+        <w:t xml:space="preserve"> of devotion to Christ, the Blessed Virgin Mary, the angels and the saints.</w:t>
+      </w:r>
+    </w:p>
+    <w:p>
+      <w:pPr>
+        <w:pStyle w:val="SPBodyText"/>
+      </w:pPr>
+      <w:r>
+        <w:t>They are prayers for the spaces between the great moments of the day.</w:t>
+      </w:r>
+    </w:p>
+    <w:p>
+      <w:pPr>
+        <w:pStyle w:val="SPBodyText"/>
+        <w:rPr>
+          <w:b/>
+          <w:bCs/>
+        </w:rPr>
+      </w:pPr>
+    </w:p>
+    <w:p>
+      <w:pPr>
+        <w:pStyle w:val="SPBodyText"/>
+      </w:pPr>
+      <w:r>
+        <w:rPr>
+          <w:b/>
+          <w:bCs/>
+        </w:rPr>
+        <w:t>The</w:t>
+      </w:r>
+      <w:r>
+        <w:t xml:space="preserve"> </w:t>
+      </w:r>
+      <w:r>
+        <w:rPr>
+          <w:b/>
+          <w:bCs/>
+        </w:rPr>
+        <w:t>Morning Offering</w:t>
+      </w:r>
+      <w:r>
+        <w:t xml:space="preserve"> places the day itself into God's hands.</w:t>
+      </w:r>
+      <w:r>
+        <w:t xml:space="preserve"> </w:t>
+      </w:r>
+    </w:p>
+    <w:p>
+      <w:pPr>
+        <w:pStyle w:val="SPBodyText"/>
+      </w:pPr>
+      <w:r>
+        <w:rPr>
+          <w:b/>
+          <w:bCs/>
+        </w:rPr>
+        <w:t>The Angelus</w:t>
+      </w:r>
+      <w:r>
+        <w:t xml:space="preserve"> invites us to remember the mystery of the Incarnation.</w:t>
+      </w:r>
+    </w:p>
+    <w:p>
+      <w:pPr>
+        <w:pStyle w:val="SPBodyText"/>
+      </w:pPr>
+      <w:r>
+        <w:rPr>
+          <w:b/>
+          <w:bCs/>
+        </w:rPr>
+        <w:t>The Anima Christi</w:t>
+      </w:r>
+      <w:r>
+        <w:t xml:space="preserve"> draws us towards Christ and His Passion.</w:t>
+      </w:r>
+    </w:p>
+    <w:p>
+      <w:pPr>
+        <w:pStyle w:val="SPBodyText"/>
+      </w:pPr>
+      <w:r>
+        <w:rPr>
+          <w:b/>
+          <w:bCs/>
+        </w:rPr>
+        <w:t>The Guardian Angel Prayer</w:t>
+      </w:r>
+      <w:r>
+        <w:t xml:space="preserve"> reminds us that we do not walk through life alone.</w:t>
+      </w:r>
+    </w:p>
+    <w:p>
+      <w:pPr>
+        <w:pStyle w:val="SPBodyText"/>
+      </w:pPr>
+    </w:p>
+    <w:p>
+      <w:pPr>
+        <w:pStyle w:val="SPBodyText"/>
+      </w:pPr>
+      <w:r>
+        <w:t>Other prayers teach us to entrust the departed to God's mercy, to seek protection in times of trial, and to turn our hearts again towards Christ.</w:t>
+      </w:r>
+    </w:p>
+    <w:p>
+      <w:pPr>
+        <w:pStyle w:val="SPBodyText"/>
+      </w:pPr>
+      <w:r>
+        <w:t>These prayers need not be hurried.</w:t>
+      </w:r>
+    </w:p>
+    <w:p>
+      <w:pPr>
+        <w:pStyle w:val="SPBodyText"/>
+      </w:pPr>
+      <w:r>
+        <w:t>Some may become part of a daily rhythm. Others may remain prayers we return to only when circumstances call for them.</w:t>
+      </w:r>
+    </w:p>
+    <w:p>
+      <w:pPr>
+        <w:pStyle w:val="SPBodyText"/>
+      </w:pPr>
+    </w:p>
+    <w:p>
+      <w:pPr>
+        <w:pStyle w:val="SPBodyText"/>
+        <w:rPr>
+          <w:b/>
+          <w:bCs/>
+        </w:rPr>
         <w:sectPr>
           <w:type w:val="oddPage"/>
           <w:pgSz w:w="7920" w:h="12240" w:code="6"/>
@@ -12066,6 +12666,346 @@
           <w:docGrid w:linePitch="360"/>
         </w:sectPr>
       </w:pPr>
+      <w:r>
+        <w:t>What matters is not how many prayers we know, but that through them, we learn to turn towards God.</w:t>
+      </w:r>
+    </w:p>
+    <w:p>
+      <w:pPr>
+        <w:pStyle w:val="SPBodyText"/>
+        <w:jc w:val="center"/>
+        <w:rPr>
+          <w:rFonts w:ascii="Segoe UI Symbol" w:hAnsi="Segoe UI Symbol" w:cs="Segoe UI Symbol"/>
+        </w:rPr>
+      </w:pPr>
+      <w:r>
+        <w:rPr>
+          <w:rFonts w:ascii="Segoe UI Symbol" w:hAnsi="Segoe UI Symbol" w:cs="Segoe UI Symbol"/>
+        </w:rPr>
+        <w:lastRenderedPageBreak/>
+        <w:t>✠</w:t>
+      </w:r>
+    </w:p>
+    <w:p>
+      <w:pPr>
+        <w:pStyle w:val="SPBodyText"/>
+        <w:jc w:val="center"/>
+        <w:rPr>
+          <w:rFonts w:ascii="Segoe UI Symbol" w:hAnsi="Segoe UI Symbol" w:cs="Segoe UI Symbol"/>
+        </w:rPr>
+      </w:pPr>
+    </w:p>
+    <w:p>
+      <w:pPr>
+        <w:pStyle w:val="SPPrayerTitle"/>
+      </w:pPr>
+      <w:r>
+        <w:t>Morning offering</w:t>
+      </w:r>
+    </w:p>
+    <w:p>
+      <w:pPr>
+        <w:pStyle w:val="SPPrayerTitle"/>
+      </w:pPr>
+    </w:p>
+    <w:p>
+      <w:pPr>
+        <w:pStyle w:val="SPPrayerTitle"/>
+        <w:sectPr>
+          <w:type w:val="oddPage"/>
+          <w:pgSz w:w="7920" w:h="12240" w:code="6"/>
+          <w:pgMar w:top="1080" w:right="864" w:bottom="1080" w:left="1152" w:header="576" w:footer="576" w:gutter="0"/>
+          <w:cols w:space="720"/>
+          <w:titlePg/>
+          <w:docGrid w:linePitch="360"/>
+        </w:sectPr>
+      </w:pPr>
+    </w:p>
+    <w:p>
+      <w:pPr>
+        <w:pStyle w:val="SPLanguage"/>
+        <w:spacing w:before="600"/>
+      </w:pPr>
+      <w:r>
+        <w:lastRenderedPageBreak/>
+        <w:t>ENGLISH</w:t>
+      </w:r>
+    </w:p>
+    <w:p>
+      <w:pPr>
+        <w:pStyle w:val="SPPrayerEnglish"/>
+      </w:pPr>
+      <w:r>
+        <w:t>O Jesus,</w:t>
+      </w:r>
+    </w:p>
+    <w:p>
+      <w:pPr>
+        <w:pStyle w:val="SPPrayerEnglish"/>
+      </w:pPr>
+      <w:r>
+        <w:t>through the Immaculate Heart of Mary,</w:t>
+      </w:r>
+    </w:p>
+    <w:p>
+      <w:pPr>
+        <w:pStyle w:val="SPPrayerEnglish"/>
+      </w:pPr>
+      <w:r>
+        <w:t>I offer You my prayers, works,</w:t>
+      </w:r>
+    </w:p>
+    <w:p>
+      <w:pPr>
+        <w:pStyle w:val="SPPrayerEnglish"/>
+      </w:pPr>
+      <w:r>
+        <w:t>joys and sufferings</w:t>
+      </w:r>
+    </w:p>
+    <w:p>
+      <w:pPr>
+        <w:pStyle w:val="SPPrayerEnglish"/>
+      </w:pPr>
+      <w:r>
+        <w:t>of this day for all the intentions</w:t>
+      </w:r>
+    </w:p>
+    <w:p>
+      <w:pPr>
+        <w:pStyle w:val="SPPrayerEnglish"/>
+      </w:pPr>
+      <w:r>
+        <w:t>of Your Sacred Heart,</w:t>
+      </w:r>
+    </w:p>
+    <w:p>
+      <w:pPr>
+        <w:pStyle w:val="SPPrayerEnglish"/>
+      </w:pPr>
+      <w:r>
+        <w:t>in union with the Holy Sacrifice of the Mass</w:t>
+      </w:r>
+    </w:p>
+    <w:p>
+      <w:pPr>
+        <w:pStyle w:val="SPPrayerEnglish"/>
+      </w:pPr>
+      <w:r>
+        <w:t>throughout the world,</w:t>
+      </w:r>
+    </w:p>
+    <w:p>
+      <w:pPr>
+        <w:pStyle w:val="SPPrayerEnglish"/>
+      </w:pPr>
+      <w:r>
+        <w:t>in reparation for my sins,</w:t>
+      </w:r>
+    </w:p>
+    <w:p>
+      <w:pPr>
+        <w:pStyle w:val="SPPrayerEnglish"/>
+      </w:pPr>
+      <w:r>
+        <w:t>for the intentions of all my relatives and friends,</w:t>
+      </w:r>
+    </w:p>
+    <w:p>
+      <w:pPr>
+        <w:pStyle w:val="SPPrayerEnglish"/>
+      </w:pPr>
+      <w:r>
+        <w:t>and in particular</w:t>
+      </w:r>
+    </w:p>
+    <w:p>
+      <w:pPr>
+        <w:pStyle w:val="SPPrayerEnglish"/>
+      </w:pPr>
+      <w:r>
+        <w:t>for the intentions of the Holy Father.</w:t>
+      </w:r>
+    </w:p>
+    <w:p>
+      <w:pPr>
+        <w:pStyle w:val="SPPrayerEnglish"/>
+      </w:pPr>
+      <w:r>
+        <w:t>Amen.</w:t>
+      </w:r>
+    </w:p>
+    <w:p>
+      <w:pPr>
+        <w:pStyle w:val="SPPrayerTitle"/>
+        <w:sectPr>
+          <w:type w:val="evenPage"/>
+          <w:pgSz w:w="7920" w:h="12240" w:code="6"/>
+          <w:pgMar w:top="1080" w:right="864" w:bottom="1080" w:left="1152" w:header="576" w:footer="576" w:gutter="0"/>
+          <w:cols w:space="720"/>
+          <w:titlePg/>
+          <w:docGrid w:linePitch="360"/>
+        </w:sectPr>
+      </w:pPr>
+    </w:p>
+    <w:p>
+      <w:pPr>
+        <w:pStyle w:val="SPLanguage"/>
+        <w:spacing w:before="600"/>
+      </w:pPr>
+      <w:r>
+        <w:lastRenderedPageBreak/>
+        <w:t>LATIN</w:t>
+      </w:r>
+    </w:p>
+    <w:p>
+      <w:pPr>
+        <w:pStyle w:val="SPPrayerLatin"/>
+      </w:pPr>
+      <w:r>
+        <w:t>O Iesu,</w:t>
+      </w:r>
+    </w:p>
+    <w:p>
+      <w:pPr>
+        <w:pStyle w:val="SPPrayerLatin"/>
+      </w:pPr>
+      <w:r>
+        <w:t>per Immaculatum Cor Mariae,</w:t>
+      </w:r>
+    </w:p>
+    <w:p>
+      <w:pPr>
+        <w:pStyle w:val="SPPrayerLatin"/>
+      </w:pPr>
+      <w:r>
+        <w:t>offero Tibi preces, opera,</w:t>
+      </w:r>
+      <w:r>
+        <w:br/>
+        <w:t>gaudia et dolores</w:t>
+      </w:r>
+      <w:r>
+        <w:t xml:space="preserve"> </w:t>
+      </w:r>
+      <w:r>
+        <w:t>huius diei,</w:t>
+      </w:r>
+      <w:r>
+        <w:br/>
+        <w:t>pro omnibus intentionibus</w:t>
+      </w:r>
+      <w:r>
+        <w:br/>
+        <w:t>Sacratissimi Cordis Tui,</w:t>
+      </w:r>
+    </w:p>
+    <w:p>
+      <w:pPr>
+        <w:pStyle w:val="SPPrayerLatin"/>
+      </w:pPr>
+      <w:r>
+        <w:t>in unione cum Sancto Missae Sacrificio</w:t>
+      </w:r>
+      <w:r>
+        <w:br/>
+        <w:t>per totum orbem celebrato,</w:t>
+      </w:r>
+    </w:p>
+    <w:p>
+      <w:pPr>
+        <w:pStyle w:val="SPPrayerLatin"/>
+      </w:pPr>
+      <w:r>
+        <w:t>in reparationem peccatorum meorum,</w:t>
+      </w:r>
+      <w:r>
+        <w:br/>
+        <w:t>pro intentionibus omnium propinquorum</w:t>
+      </w:r>
+      <w:r>
+        <w:br/>
+        <w:t>amicorumque meorum,</w:t>
+      </w:r>
+      <w:r>
+        <w:br/>
+        <w:t>ac praesertim pro</w:t>
+      </w:r>
+      <w:r>
+        <w:br/>
+        <w:t>intentionibus Summi Pontificis.</w:t>
+      </w:r>
+    </w:p>
+    <w:p>
+      <w:pPr>
+        <w:pStyle w:val="SPPrayerLatin"/>
+      </w:pPr>
+      <w:r>
+        <w:t>Amen.</w:t>
+      </w:r>
+    </w:p>
+    <w:p>
+      <w:pPr>
+        <w:pStyle w:val="SPSectionTitle"/>
+        <w:sectPr>
+          <w:type w:val="oddPage"/>
+          <w:pgSz w:w="7920" w:h="12240" w:code="6"/>
+          <w:pgMar w:top="1080" w:right="864" w:bottom="1080" w:left="1152" w:header="576" w:footer="576" w:gutter="0"/>
+          <w:cols w:space="720"/>
+          <w:titlePg/>
+          <w:docGrid w:linePitch="360"/>
+        </w:sectPr>
+      </w:pPr>
+    </w:p>
+    <w:p>
+      <w:pPr>
+        <w:pStyle w:val="SPSectionTitle"/>
+        <w:sectPr>
+          <w:type w:val="evenPage"/>
+          <w:pgSz w:w="7920" w:h="12240" w:code="6"/>
+          <w:pgMar w:top="1080" w:right="864" w:bottom="1080" w:left="1152" w:header="576" w:footer="576" w:gutter="0"/>
+          <w:cols w:space="720"/>
+          <w:titlePg/>
+          <w:docGrid w:linePitch="360"/>
+        </w:sectPr>
+      </w:pPr>
+      <w:r>
+        <w:lastRenderedPageBreak/>
+        <w:t>Scripture</w:t>
+      </w:r>
+    </w:p>
+    <w:p>
+      <w:pPr>
+        <w:pStyle w:val="SPSectionTitle"/>
+      </w:pPr>
+      <w:r>
+        <w:lastRenderedPageBreak/>
+        <w:t>Scripture</w:t>
+      </w:r>
+    </w:p>
+    <w:p>
+      <w:pPr>
+        <w:pStyle w:val="SPSectionTitle"/>
+      </w:pPr>
+      <w:r>
+        <w:t>Reflection</w:t>
+      </w:r>
+    </w:p>
+    <w:p>
+      <w:pPr>
+        <w:pStyle w:val="SPSectionTitle"/>
+        <w:sectPr>
+          <w:type w:val="oddPage"/>
+          <w:pgSz w:w="7920" w:h="12240" w:code="6"/>
+          <w:pgMar w:top="1080" w:right="864" w:bottom="1080" w:left="1152" w:header="576" w:footer="576" w:gutter="0"/>
+          <w:cols w:space="720"/>
+          <w:titlePg/>
+          <w:docGrid w:linePitch="360"/>
+        </w:sectPr>
+      </w:pPr>
+      <w:r>
+        <w:t>Reflection</w:t>
+      </w:r>
     </w:p>
     <w:p>
       <w:pPr>
@@ -12936,7 +13876,18 @@
         <w:pStyle w:val="SPScriptureReference"/>
       </w:pPr>
       <w:r>
-        <w:t>Luke 1:26-38</w:t>
+        <w:t>Luke 1:</w:t>
+      </w:r>
+      <w:r>
+        <w:t xml:space="preserve"> 28</w:t>
+      </w:r>
+    </w:p>
+    <w:p>
+      <w:pPr>
+        <w:pStyle w:val="SPScripture"/>
+      </w:pPr>
+      <w:r>
+        <w:t>And he came to her and said, “Hail, full of grace, the Lord is with you.”</w:t>
       </w:r>
     </w:p>
     <w:p>
@@ -12944,40 +13895,63 @@
         <w:pStyle w:val="SPScriptureReference"/>
       </w:pPr>
       <w:r>
+        <w:t>Luke</w:t>
+      </w:r>
+      <w:r>
+        <w:t xml:space="preserve"> 1:</w:t>
+      </w:r>
+      <w:r>
+        <w:t>31</w:t>
+      </w:r>
+    </w:p>
+    <w:p>
+      <w:pPr>
+        <w:pStyle w:val="SPScripture"/>
+      </w:pPr>
+      <w:r>
+        <w:t>“And behold, you will conceive in your womb and bear a son, and you shall call his name Jesus.”</w:t>
+      </w:r>
+    </w:p>
+    <w:p>
+      <w:pPr>
+        <w:pStyle w:val="SPScriptureReference"/>
+      </w:pPr>
+      <w:r>
+        <w:t>Luke 1:38</w:t>
+      </w:r>
+    </w:p>
+    <w:p>
+      <w:pPr>
+        <w:pStyle w:val="SPScripture"/>
+      </w:pPr>
+      <w:r>
+        <w:t>And Mary said, “Behold, I am the handmaiden of the Lord; let it be to me according to your word.”  And the angel departed from her.</w:t>
+      </w:r>
+    </w:p>
+    <w:p>
+      <w:pPr>
+        <w:pStyle w:val="SPScriptureReference"/>
+      </w:pPr>
+      <w:r>
         <w:t>John 1:14</w:t>
       </w:r>
     </w:p>
     <w:p>
       <w:pPr>
-        <w:pStyle w:val="SPScriptureReference"/>
-      </w:pPr>
-      <w:r>
-        <w:t>Galatians 4:4-5</w:t>
-      </w:r>
-    </w:p>
-    <w:p>
-      <w:pPr>
-        <w:pStyle w:val="SPScriptureReference"/>
-      </w:pPr>
-      <w:proofErr w:type="spellStart"/>
-      <w:r>
-        <w:t>Phillipians</w:t>
-      </w:r>
-      <w:proofErr w:type="spellEnd"/>
-      <w:r>
-        <w:t xml:space="preserve"> 2:6-11</w:t>
-      </w:r>
-    </w:p>
-    <w:p>
-      <w:pPr>
-        <w:pStyle w:val="SPScriptureReference"/>
-      </w:pPr>
-      <w:r>
-        <w:t>1 Corinthians 15:3-4</w:t>
-      </w:r>
-      <w:r>
-        <w:t xml:space="preserve"> </w:t>
-      </w:r>
+        <w:pStyle w:val="SPScripture"/>
+      </w:pPr>
+      <w:r>
+        <w:t xml:space="preserve">And </w:t>
+      </w:r>
+      <w:r>
+        <w:t>the Word became flesh and dwelt among us, full of grace and truth, we have beheld his glory, glory as the only begotten Son from the Father.</w:t>
+      </w:r>
+    </w:p>
+    <w:p>
+      <w:pPr>
+        <w:pStyle w:val="SPScripture"/>
+        <w:ind w:left="0"/>
+      </w:pPr>
     </w:p>
     <w:p>
       <w:pPr>
@@ -15652,9 +16626,11 @@
     <w:name w:val="SP Prayer Latin"/>
     <w:basedOn w:val="SPPrayerEnglish"/>
     <w:qFormat/>
-    <w:rsid w:val="00066ABD"/>
+    <w:rsid w:val="003B01C9"/>
     <w:rPr>
       <w:i/>
+      <w:noProof/>
+      <w:lang w:val="la-Latn"/>
     </w:rPr>
   </w:style>
   <w:style w:type="paragraph" w:customStyle="1" w:styleId="SPScripture">

</xml_diff>

<commit_message>
Finished Morning Offering Prayer
</commit_message>
<xml_diff>
--- a/manuscript/volume-1/sacrae-preces-volume-1.docx
+++ b/manuscript/volume-1/sacrae-preces-volume-1.docx
@@ -1352,7 +1352,7 @@
       </w:pPr>
       <w:r>
         <w:pict w14:anchorId="249FE732">
-          <v:rect id="_x0000_i1351" style="width:0;height:1.5pt" o:hralign="center" o:hrstd="t" o:hr="t" fillcolor="#a0a0a0" stroked="f"/>
+          <v:rect id="_x0000_i1025" style="width:0;height:1.5pt" o:hralign="center" o:hrstd="t" o:hr="t" fillcolor="#a0a0a0" stroked="f"/>
         </w:pict>
       </w:r>
     </w:p>
@@ -1530,7 +1530,7 @@
       </w:pPr>
       <w:r>
         <w:pict w14:anchorId="5281CFCF">
-          <v:rect id="_x0000_i1352" style="width:0;height:1.5pt" o:hralign="center" o:hrstd="t" o:hr="t" fillcolor="#a0a0a0" stroked="f"/>
+          <v:rect id="_x0000_i1026" style="width:0;height:1.5pt" o:hralign="center" o:hrstd="t" o:hr="t" fillcolor="#a0a0a0" stroked="f"/>
         </w:pict>
       </w:r>
     </w:p>
@@ -1634,7 +1634,7 @@
       </w:pPr>
       <w:r>
         <w:pict w14:anchorId="25751FDD">
-          <v:rect id="_x0000_i1353" style="width:0;height:1.5pt" o:hralign="center" o:hrstd="t" o:hr="t" fillcolor="#a0a0a0" stroked="f"/>
+          <v:rect id="_x0000_i1027" style="width:0;height:1.5pt" o:hralign="center" o:hrstd="t" o:hr="t" fillcolor="#a0a0a0" stroked="f"/>
         </w:pict>
       </w:r>
     </w:p>
@@ -1699,7 +1699,7 @@
       </w:pPr>
       <w:r>
         <w:pict w14:anchorId="19542BB1">
-          <v:rect id="_x0000_i1354" style="width:0;height:1.5pt" o:hralign="center" o:hrstd="t" o:hr="t" fillcolor="#a0a0a0" stroked="f"/>
+          <v:rect id="_x0000_i1028" style="width:0;height:1.5pt" o:hralign="center" o:hrstd="t" o:hr="t" fillcolor="#a0a0a0" stroked="f"/>
         </w:pict>
       </w:r>
     </w:p>
@@ -1811,7 +1811,7 @@
       </w:pPr>
       <w:r>
         <w:pict w14:anchorId="4D1CE6F0">
-          <v:rect id="_x0000_i1355" style="width:0;height:1.5pt" o:hralign="center" o:hrstd="t" o:hr="t" fillcolor="#a0a0a0" stroked="f"/>
+          <v:rect id="_x0000_i1029" style="width:0;height:1.5pt" o:hralign="center" o:hrstd="t" o:hr="t" fillcolor="#a0a0a0" stroked="f"/>
         </w:pict>
       </w:r>
     </w:p>
@@ -1915,7 +1915,7 @@
       </w:pPr>
       <w:r>
         <w:pict w14:anchorId="68D46385">
-          <v:rect id="_x0000_i1356" style="width:0;height:1.5pt" o:hralign="center" o:hrstd="t" o:hr="t" fillcolor="#a0a0a0" stroked="f"/>
+          <v:rect id="_x0000_i1030" style="width:0;height:1.5pt" o:hralign="center" o:hrstd="t" o:hr="t" fillcolor="#a0a0a0" stroked="f"/>
         </w:pict>
       </w:r>
     </w:p>
@@ -2044,7 +2044,7 @@
       </w:pPr>
       <w:r>
         <w:pict w14:anchorId="36FAD975">
-          <v:rect id="_x0000_i1357" style="width:0;height:1.5pt" o:hralign="center" o:hrstd="t" o:hr="t" fillcolor="#a0a0a0" stroked="f"/>
+          <v:rect id="_x0000_i1031" style="width:0;height:1.5pt" o:hralign="center" o:hrstd="t" o:hr="t" fillcolor="#a0a0a0" stroked="f"/>
         </w:pict>
       </w:r>
     </w:p>
@@ -2551,15 +2551,7 @@
         <w:pStyle w:val="SPPrayerLatin"/>
       </w:pPr>
       <w:r>
-        <w:t xml:space="preserve"> In </w:t>
-      </w:r>
-      <w:proofErr w:type="spellStart"/>
-      <w:r>
-        <w:t>nomine</w:t>
-      </w:r>
-      <w:proofErr w:type="spellEnd"/>
-      <w:r>
-        <w:t xml:space="preserve"> Patris, </w:t>
+        <w:t xml:space="preserve"> In nomine Patris, </w:t>
       </w:r>
     </w:p>
     <w:p>
@@ -3002,49 +2994,23 @@
         <w:pStyle w:val="SPPrayerLatin"/>
       </w:pPr>
       <w:r>
-        <w:t xml:space="preserve">Pater </w:t>
-      </w:r>
-      <w:proofErr w:type="spellStart"/>
-      <w:r>
-        <w:t>noster</w:t>
-      </w:r>
-      <w:proofErr w:type="spellEnd"/>
-      <w:r>
-        <w:t xml:space="preserve">, qui es in </w:t>
-      </w:r>
-      <w:proofErr w:type="spellStart"/>
-      <w:r>
-        <w:t>caelis</w:t>
-      </w:r>
-      <w:proofErr w:type="spellEnd"/>
-      <w:r>
-        <w:t>,</w:t>
+        <w:t>Pater noster, qui es in caelis,</w:t>
       </w:r>
     </w:p>
     <w:p>
       <w:pPr>
         <w:pStyle w:val="SPPrayerLatin"/>
       </w:pPr>
-      <w:proofErr w:type="spellStart"/>
-      <w:r>
-        <w:t>Sanctificetur</w:t>
-      </w:r>
-      <w:proofErr w:type="spellEnd"/>
-      <w:r>
-        <w:t xml:space="preserve"> nomen tuum.</w:t>
+      <w:r>
+        <w:t>Sanctificetur nomen tuum.</w:t>
       </w:r>
     </w:p>
     <w:p>
       <w:pPr>
         <w:pStyle w:val="SPPrayerLatin"/>
       </w:pPr>
-      <w:proofErr w:type="spellStart"/>
-      <w:r>
-        <w:t>Adveniat</w:t>
-      </w:r>
-      <w:proofErr w:type="spellEnd"/>
-      <w:r>
-        <w:t xml:space="preserve"> regnum tuum.</w:t>
+      <w:r>
+        <w:t>Adveniat regnum tuum.</w:t>
       </w:r>
       <w:r>
         <w:t xml:space="preserve"> </w:t>
@@ -3055,31 +3021,7 @@
         <w:pStyle w:val="SPPrayerLatin"/>
       </w:pPr>
       <w:r>
-        <w:t xml:space="preserve">Fiat </w:t>
-      </w:r>
-      <w:proofErr w:type="spellStart"/>
-      <w:r>
-        <w:t>voluntas</w:t>
-      </w:r>
-      <w:proofErr w:type="spellEnd"/>
-      <w:r>
-        <w:t xml:space="preserve"> </w:t>
-      </w:r>
-      <w:proofErr w:type="spellStart"/>
-      <w:r>
-        <w:t>tua</w:t>
-      </w:r>
-      <w:proofErr w:type="spellEnd"/>
-      <w:r>
-        <w:t xml:space="preserve">, sicut in </w:t>
-      </w:r>
-      <w:proofErr w:type="spellStart"/>
-      <w:r>
-        <w:t>caelo</w:t>
-      </w:r>
-      <w:proofErr w:type="spellEnd"/>
-      <w:r>
-        <w:t xml:space="preserve"> et in terra.</w:t>
+        <w:t>Fiat voluntas tua, sicut in caelo et in terra.</w:t>
       </w:r>
     </w:p>
     <w:p>
@@ -3087,23 +3029,7 @@
         <w:pStyle w:val="SPPrayerLatin"/>
       </w:pPr>
       <w:r>
-        <w:t xml:space="preserve">Panem nostrum </w:t>
-      </w:r>
-      <w:proofErr w:type="spellStart"/>
-      <w:r>
-        <w:t>quotidianum</w:t>
-      </w:r>
-      <w:proofErr w:type="spellEnd"/>
-      <w:r>
-        <w:t xml:space="preserve"> do nobis </w:t>
-      </w:r>
-      <w:proofErr w:type="spellStart"/>
-      <w:r>
-        <w:t>hodie</w:t>
-      </w:r>
-      <w:proofErr w:type="spellEnd"/>
-      <w:r>
-        <w:t>,</w:t>
+        <w:t>Panem nostrum quotidianum do nobis hodie,</w:t>
       </w:r>
     </w:p>
     <w:p>
@@ -3111,23 +3037,7 @@
         <w:pStyle w:val="SPPrayerLatin"/>
       </w:pPr>
       <w:r>
-        <w:t xml:space="preserve">Et </w:t>
-      </w:r>
-      <w:proofErr w:type="spellStart"/>
-      <w:r>
-        <w:t>dimitte</w:t>
-      </w:r>
-      <w:proofErr w:type="spellEnd"/>
-      <w:r>
-        <w:t xml:space="preserve"> nobis </w:t>
-      </w:r>
-      <w:proofErr w:type="spellStart"/>
-      <w:r>
-        <w:t>debita</w:t>
-      </w:r>
-      <w:proofErr w:type="spellEnd"/>
-      <w:r>
-        <w:t xml:space="preserve"> nostra,</w:t>
+        <w:t>Et dimitte nobis debita nostra,</w:t>
       </w:r>
     </w:p>
     <w:p>
@@ -3135,39 +3045,7 @@
         <w:pStyle w:val="SPPrayerLatin"/>
       </w:pPr>
       <w:r>
-        <w:t xml:space="preserve">Sicut et </w:t>
-      </w:r>
-      <w:proofErr w:type="spellStart"/>
-      <w:r>
-        <w:t>nos</w:t>
-      </w:r>
-      <w:proofErr w:type="spellEnd"/>
-      <w:r>
-        <w:t xml:space="preserve"> </w:t>
-      </w:r>
-      <w:proofErr w:type="spellStart"/>
-      <w:r>
-        <w:t>dimittimus</w:t>
-      </w:r>
-      <w:proofErr w:type="spellEnd"/>
-      <w:r>
-        <w:t xml:space="preserve"> </w:t>
-      </w:r>
-      <w:proofErr w:type="spellStart"/>
-      <w:r>
-        <w:t>debitoribus</w:t>
-      </w:r>
-      <w:proofErr w:type="spellEnd"/>
-      <w:r>
-        <w:t xml:space="preserve"> </w:t>
-      </w:r>
-      <w:proofErr w:type="spellStart"/>
-      <w:r>
-        <w:t>nostris</w:t>
-      </w:r>
-      <w:proofErr w:type="spellEnd"/>
-      <w:r>
-        <w:t>.</w:t>
+        <w:t>Sicut et nos dimittimus debitoribus nostris.</w:t>
       </w:r>
     </w:p>
     <w:p>
@@ -3175,50 +3053,16 @@
         <w:pStyle w:val="SPPrayerLatin"/>
       </w:pPr>
       <w:r>
-        <w:t xml:space="preserve">Et ne </w:t>
-      </w:r>
-      <w:proofErr w:type="spellStart"/>
-      <w:r>
-        <w:t>nos</w:t>
-      </w:r>
-      <w:proofErr w:type="spellEnd"/>
-      <w:r>
-        <w:t xml:space="preserve"> </w:t>
-      </w:r>
-      <w:proofErr w:type="spellStart"/>
-      <w:r>
-        <w:t>inducasin</w:t>
-      </w:r>
-      <w:proofErr w:type="spellEnd"/>
-      <w:r>
-        <w:t xml:space="preserve"> </w:t>
-      </w:r>
-      <w:proofErr w:type="spellStart"/>
-      <w:r>
-        <w:t>tentationem</w:t>
-      </w:r>
-      <w:proofErr w:type="spellEnd"/>
+        <w:t>Et ne nos inducasin tentationem</w:t>
+      </w:r>
     </w:p>
     <w:p>
       <w:pPr>
         <w:pStyle w:val="SPPrayerLatin"/>
       </w:pPr>
       <w:r>
-        <w:t xml:space="preserve">Sed libera </w:t>
-      </w:r>
-      <w:proofErr w:type="spellStart"/>
-      <w:r>
-        <w:t>nos</w:t>
-      </w:r>
-      <w:proofErr w:type="spellEnd"/>
-      <w:r>
-        <w:t xml:space="preserve"> a </w:t>
-      </w:r>
-      <w:proofErr w:type="spellStart"/>
-      <w:r>
-        <w:t>malo</w:t>
-      </w:r>
-      <w:proofErr w:type="spellEnd"/>
+        <w:t>Sed libera nos a malo</w:t>
+      </w:r>
     </w:p>
     <w:p>
       <w:pPr>
@@ -3989,21 +3833,11 @@
         <w:t>a</w:t>
       </w:r>
       <w:r>
-        <w:t xml:space="preserve"> </w:t>
-      </w:r>
-      <w:proofErr w:type="spellStart"/>
-      <w:r>
-        <w:t>tu</w:t>
-      </w:r>
-      <w:proofErr w:type="spellEnd"/>
-      <w:r>
-        <w:t xml:space="preserve"> in </w:t>
-      </w:r>
-      <w:proofErr w:type="spellStart"/>
+        <w:t xml:space="preserve"> tu in </w:t>
+      </w:r>
       <w:r>
         <w:t>muliéribus</w:t>
       </w:r>
-      <w:proofErr w:type="spellEnd"/>
       <w:r>
         <w:t>,</w:t>
       </w:r>
@@ -4015,24 +3849,11 @@
       <w:r>
         <w:t xml:space="preserve">Et </w:t>
       </w:r>
-      <w:proofErr w:type="spellStart"/>
       <w:r>
         <w:t>b</w:t>
       </w:r>
       <w:r>
-        <w:t>enedictus</w:t>
-      </w:r>
-      <w:proofErr w:type="spellEnd"/>
-      <w:r>
-        <w:t xml:space="preserve"> fructus </w:t>
-      </w:r>
-      <w:proofErr w:type="spellStart"/>
-      <w:r>
-        <w:t>ventris</w:t>
-      </w:r>
-      <w:proofErr w:type="spellEnd"/>
-      <w:r>
-        <w:t xml:space="preserve"> tu</w:t>
+        <w:t>enedictus fructus ventris tu</w:t>
       </w:r>
       <w:r>
         <w:t>i,</w:t>
@@ -4063,11 +3884,7 @@
         <w:pStyle w:val="SPPrayerLatin"/>
       </w:pPr>
       <w:r>
-        <w:t xml:space="preserve">Ora pro nobis </w:t>
-      </w:r>
-      <w:proofErr w:type="spellStart"/>
-      <w:r>
-        <w:t>pec</w:t>
+        <w:t>Ora pro nobis pec</w:t>
       </w:r>
       <w:r>
         <w:t>c</w:t>
@@ -4075,7 +3892,6 @@
       <w:r>
         <w:t>atoribus</w:t>
       </w:r>
-      <w:proofErr w:type="spellEnd"/>
       <w:r>
         <w:t>,</w:t>
       </w:r>
@@ -4097,11 +3913,7 @@
         <w:t>h</w:t>
       </w:r>
       <w:r>
-        <w:t xml:space="preserve">ora mortis </w:t>
-      </w:r>
-      <w:proofErr w:type="spellStart"/>
-      <w:r>
-        <w:t>nostr</w:t>
+        <w:t>ora mortis nostr</w:t>
       </w:r>
       <w:r>
         <w:t>a</w:t>
@@ -4109,7 +3921,6 @@
       <w:r>
         <w:t>e</w:t>
       </w:r>
-      <w:proofErr w:type="spellEnd"/>
       <w:r>
         <w:t>.</w:t>
       </w:r>
@@ -4947,15 +4758,7 @@
         <w:pStyle w:val="SPPrayerLatin"/>
       </w:pPr>
       <w:r>
-        <w:t xml:space="preserve">Et </w:t>
-      </w:r>
-      <w:proofErr w:type="spellStart"/>
-      <w:r>
-        <w:t>Spiritui</w:t>
-      </w:r>
-      <w:proofErr w:type="spellEnd"/>
-      <w:r>
-        <w:t xml:space="preserve"> Sancto</w:t>
+        <w:t>Et Spiritui Sancto</w:t>
       </w:r>
       <w:r>
         <w:t>.</w:t>
@@ -4966,15 +4769,7 @@
         <w:pStyle w:val="SPPrayerLatin"/>
       </w:pPr>
       <w:r>
-        <w:t xml:space="preserve">Sicut </w:t>
-      </w:r>
-      <w:proofErr w:type="spellStart"/>
-      <w:r>
-        <w:t>erat</w:t>
-      </w:r>
-      <w:proofErr w:type="spellEnd"/>
-      <w:r>
-        <w:t xml:space="preserve"> in principio,</w:t>
+        <w:t>Sicut erat in principio,</w:t>
       </w:r>
     </w:p>
     <w:p>
@@ -6582,260 +6377,23 @@
         <w:pStyle w:val="SPPrayerLatin"/>
       </w:pPr>
       <w:r>
-        <w:t xml:space="preserve">O mi Deus, corde </w:t>
-      </w:r>
-      <w:proofErr w:type="spellStart"/>
-      <w:r>
-        <w:t>poenitet</w:t>
-      </w:r>
-      <w:proofErr w:type="spellEnd"/>
-      <w:r>
-        <w:t xml:space="preserve"> me omnium </w:t>
-      </w:r>
-      <w:proofErr w:type="spellStart"/>
-      <w:r>
-        <w:t>meorum</w:t>
-      </w:r>
-      <w:proofErr w:type="spellEnd"/>
-      <w:r>
-        <w:t xml:space="preserve"> </w:t>
-      </w:r>
-      <w:proofErr w:type="spellStart"/>
-      <w:r>
-        <w:t>peccatorum</w:t>
-      </w:r>
-      <w:proofErr w:type="spellEnd"/>
-      <w:r>
-        <w:t>,</w:t>
+        <w:t>O mi Deus, corde poenitet me omnium meorum peccatorum,</w:t>
       </w:r>
       <w:r>
         <w:br/>
-        <w:t xml:space="preserve">et </w:t>
-      </w:r>
-      <w:proofErr w:type="spellStart"/>
-      <w:r>
-        <w:t>detestor</w:t>
-      </w:r>
-      <w:proofErr w:type="spellEnd"/>
-      <w:r>
-        <w:t xml:space="preserve"> </w:t>
-      </w:r>
-      <w:proofErr w:type="spellStart"/>
-      <w:r>
-        <w:t>ea</w:t>
-      </w:r>
-      <w:proofErr w:type="spellEnd"/>
-      <w:r>
-        <w:t>,</w:t>
+        <w:t>et detestor ea,</w:t>
       </w:r>
       <w:r>
         <w:br/>
-      </w:r>
-      <w:proofErr w:type="spellStart"/>
-      <w:r>
-        <w:t>vere</w:t>
-      </w:r>
-      <w:proofErr w:type="spellEnd"/>
-      <w:r>
-        <w:t xml:space="preserve"> </w:t>
-      </w:r>
-      <w:proofErr w:type="spellStart"/>
-      <w:r>
-        <w:t>poenitet</w:t>
-      </w:r>
-      <w:proofErr w:type="spellEnd"/>
-      <w:r>
-        <w:t xml:space="preserve"> me, quia </w:t>
-      </w:r>
-      <w:proofErr w:type="spellStart"/>
-      <w:r>
-        <w:t>peccando</w:t>
-      </w:r>
-      <w:proofErr w:type="spellEnd"/>
-      <w:r>
-        <w:t xml:space="preserve"> non solum </w:t>
-      </w:r>
-      <w:proofErr w:type="spellStart"/>
-      <w:r>
-        <w:t>poenas</w:t>
-      </w:r>
-      <w:proofErr w:type="spellEnd"/>
-      <w:r>
-        <w:t xml:space="preserve"> a </w:t>
-      </w:r>
-      <w:proofErr w:type="spellStart"/>
-      <w:r>
-        <w:t>te</w:t>
-      </w:r>
-      <w:proofErr w:type="spellEnd"/>
-      <w:r>
-        <w:t xml:space="preserve"> </w:t>
-      </w:r>
-      <w:proofErr w:type="spellStart"/>
-      <w:r>
-        <w:t>iuste</w:t>
-      </w:r>
-      <w:proofErr w:type="spellEnd"/>
-      <w:r>
-        <w:t xml:space="preserve"> </w:t>
-      </w:r>
-      <w:proofErr w:type="spellStart"/>
-      <w:r>
-        <w:t>statutas</w:t>
-      </w:r>
-      <w:proofErr w:type="spellEnd"/>
-      <w:r>
-        <w:t xml:space="preserve"> </w:t>
-      </w:r>
-      <w:proofErr w:type="spellStart"/>
-      <w:r>
-        <w:t>promeritus</w:t>
-      </w:r>
-      <w:proofErr w:type="spellEnd"/>
-      <w:r>
-        <w:t xml:space="preserve"> sum,</w:t>
+        <w:t>vere poenitet me, quia peccando non solum poenas a te iuste statutas promeritus sum,</w:t>
       </w:r>
       <w:r>
         <w:br/>
-      </w:r>
-      <w:proofErr w:type="spellStart"/>
-      <w:r>
-        <w:t>sed</w:t>
-      </w:r>
-      <w:proofErr w:type="spellEnd"/>
-      <w:r>
-        <w:t xml:space="preserve"> </w:t>
-      </w:r>
-      <w:proofErr w:type="spellStart"/>
-      <w:r>
-        <w:t>praesertim</w:t>
-      </w:r>
-      <w:proofErr w:type="spellEnd"/>
-      <w:r>
-        <w:t xml:space="preserve"> quia </w:t>
-      </w:r>
-      <w:proofErr w:type="spellStart"/>
-      <w:r>
-        <w:t>offendi</w:t>
-      </w:r>
-      <w:proofErr w:type="spellEnd"/>
-      <w:r>
-        <w:t xml:space="preserve"> </w:t>
-      </w:r>
-      <w:proofErr w:type="spellStart"/>
-      <w:r>
-        <w:t>te</w:t>
-      </w:r>
-      <w:proofErr w:type="spellEnd"/>
-      <w:r>
-        <w:t xml:space="preserve">, summum bonum, ac </w:t>
-      </w:r>
-      <w:proofErr w:type="spellStart"/>
-      <w:r>
-        <w:t>dignum</w:t>
-      </w:r>
-      <w:proofErr w:type="spellEnd"/>
-      <w:r>
-        <w:t xml:space="preserve"> qui super omnia </w:t>
-      </w:r>
-      <w:proofErr w:type="spellStart"/>
-      <w:r>
-        <w:t>diligeris</w:t>
-      </w:r>
-      <w:proofErr w:type="spellEnd"/>
-      <w:r>
-        <w:t>.</w:t>
+        <w:t>sed praesertim quia offendi te, summum bonum, ac dignum qui super omnia diligeris.</w:t>
       </w:r>
       <w:r>
         <w:br/>
-      </w:r>
-      <w:proofErr w:type="spellStart"/>
-      <w:r>
-        <w:t>Ideo</w:t>
-      </w:r>
-      <w:proofErr w:type="spellEnd"/>
-      <w:r>
-        <w:t xml:space="preserve"> </w:t>
-      </w:r>
-      <w:proofErr w:type="spellStart"/>
-      <w:r>
-        <w:t>firmiter</w:t>
-      </w:r>
-      <w:proofErr w:type="spellEnd"/>
-      <w:r>
-        <w:t xml:space="preserve"> </w:t>
-      </w:r>
-      <w:proofErr w:type="spellStart"/>
-      <w:r>
-        <w:t>propono</w:t>
-      </w:r>
-      <w:proofErr w:type="spellEnd"/>
-      <w:r>
-        <w:t xml:space="preserve">, </w:t>
-      </w:r>
-      <w:proofErr w:type="spellStart"/>
-      <w:r>
-        <w:t>adiuvante</w:t>
-      </w:r>
-      <w:proofErr w:type="spellEnd"/>
-      <w:r>
-        <w:t xml:space="preserve"> gratia </w:t>
-      </w:r>
-      <w:proofErr w:type="spellStart"/>
-      <w:r>
-        <w:t>tua</w:t>
-      </w:r>
-      <w:proofErr w:type="spellEnd"/>
-      <w:r>
-        <w:t xml:space="preserve">, de </w:t>
-      </w:r>
-      <w:proofErr w:type="spellStart"/>
-      <w:r>
-        <w:t>cetero</w:t>
-      </w:r>
-      <w:proofErr w:type="spellEnd"/>
-      <w:r>
-        <w:t xml:space="preserve"> me non </w:t>
-      </w:r>
-      <w:proofErr w:type="spellStart"/>
-      <w:r>
-        <w:t>peccaturum</w:t>
-      </w:r>
-      <w:proofErr w:type="spellEnd"/>
-      <w:r>
-        <w:t xml:space="preserve"> </w:t>
-      </w:r>
-      <w:proofErr w:type="spellStart"/>
-      <w:r>
-        <w:t>peccandique</w:t>
-      </w:r>
-      <w:proofErr w:type="spellEnd"/>
-      <w:r>
-        <w:t xml:space="preserve"> </w:t>
-      </w:r>
-      <w:proofErr w:type="spellStart"/>
-      <w:r>
-        <w:t>occasiones</w:t>
-      </w:r>
-      <w:proofErr w:type="spellEnd"/>
-      <w:r>
-        <w:t xml:space="preserve"> </w:t>
-      </w:r>
-      <w:proofErr w:type="spellStart"/>
-      <w:r>
-        <w:t>proximas</w:t>
-      </w:r>
-      <w:proofErr w:type="spellEnd"/>
-      <w:r>
-        <w:t xml:space="preserve"> </w:t>
-      </w:r>
-      <w:proofErr w:type="spellStart"/>
-      <w:r>
-        <w:t>fugiturum</w:t>
-      </w:r>
-      <w:proofErr w:type="spellEnd"/>
-      <w:r>
-        <w:t>.</w:t>
+        <w:t>Ideo firmiter propono, adiuvante gratia tua, de cetero me non peccaturum peccandique occasiones proximas fugiturum.</w:t>
       </w:r>
     </w:p>
     <w:p>
@@ -7679,10 +7237,7 @@
       </w:pPr>
       <w:r>
         <w:lastRenderedPageBreak/>
-        <w:t>LATIN</w:t>
-      </w:r>
-      <w:r>
-        <w:t xml:space="preserve"> </w:t>
+        <w:t xml:space="preserve">LATIN </w:t>
       </w:r>
     </w:p>
     <w:p>
@@ -7698,63 +7253,15 @@
       </w:r>
       <w:r>
         <w:br/>
-        <w:t xml:space="preserve">quia </w:t>
-      </w:r>
-      <w:proofErr w:type="spellStart"/>
-      <w:r>
-        <w:t>visitavit</w:t>
-      </w:r>
-      <w:proofErr w:type="spellEnd"/>
-      <w:r>
-        <w:t xml:space="preserve"> et </w:t>
-      </w:r>
-      <w:proofErr w:type="spellStart"/>
-      <w:r>
-        <w:t>fecit</w:t>
-      </w:r>
-      <w:proofErr w:type="spellEnd"/>
-      <w:r>
-        <w:t xml:space="preserve"> </w:t>
-      </w:r>
-      <w:proofErr w:type="spellStart"/>
-      <w:r>
-        <w:t>redemptionem</w:t>
-      </w:r>
-      <w:proofErr w:type="spellEnd"/>
-      <w:r>
-        <w:t xml:space="preserve"> plebis suae,</w:t>
+        <w:t>quia visitavit et fecit redemptionem plebis suae,</w:t>
       </w:r>
       <w:r>
         <w:br/>
-        <w:t xml:space="preserve">et </w:t>
-      </w:r>
-      <w:proofErr w:type="spellStart"/>
-      <w:r>
-        <w:t>erexit</w:t>
-      </w:r>
-      <w:proofErr w:type="spellEnd"/>
-      <w:r>
-        <w:t xml:space="preserve"> cornu </w:t>
-      </w:r>
-      <w:proofErr w:type="spellStart"/>
-      <w:r>
-        <w:t>salutis</w:t>
-      </w:r>
-      <w:proofErr w:type="spellEnd"/>
-      <w:r>
-        <w:t xml:space="preserve"> nobis</w:t>
+        <w:t>et erexit cornu salutis nobis</w:t>
       </w:r>
       <w:r>
         <w:br/>
-        <w:t xml:space="preserve">in domo David </w:t>
-      </w:r>
-      <w:proofErr w:type="spellStart"/>
-      <w:r>
-        <w:t>pueri</w:t>
-      </w:r>
-      <w:proofErr w:type="spellEnd"/>
-      <w:r>
-        <w:t xml:space="preserve"> sui,</w:t>
+        <w:t>in domo David pueri sui,</w:t>
       </w:r>
     </w:p>
     <w:p>
@@ -7765,100 +7272,23 @@
         <w:t>s</w:t>
       </w:r>
       <w:r>
-        <w:t xml:space="preserve">icut </w:t>
-      </w:r>
-      <w:proofErr w:type="spellStart"/>
-      <w:r>
-        <w:t>locutus</w:t>
-      </w:r>
-      <w:proofErr w:type="spellEnd"/>
-      <w:r>
-        <w:t xml:space="preserve"> est per </w:t>
-      </w:r>
-      <w:proofErr w:type="spellStart"/>
-      <w:r>
-        <w:t>os</w:t>
-      </w:r>
-      <w:proofErr w:type="spellEnd"/>
-      <w:r>
-        <w:t xml:space="preserve"> sanctorum,</w:t>
+        <w:t>icut locutus est per os sanctorum,</w:t>
       </w:r>
       <w:r>
         <w:br/>
-        <w:t xml:space="preserve">qui a </w:t>
-      </w:r>
-      <w:proofErr w:type="spellStart"/>
-      <w:r>
-        <w:t>saeculo</w:t>
-      </w:r>
-      <w:proofErr w:type="spellEnd"/>
-      <w:r>
-        <w:t xml:space="preserve"> sunt, </w:t>
-      </w:r>
-      <w:proofErr w:type="spellStart"/>
-      <w:r>
-        <w:t>prophetarum</w:t>
-      </w:r>
-      <w:proofErr w:type="spellEnd"/>
-      <w:r>
-        <w:t xml:space="preserve"> eius,</w:t>
+        <w:t>qui a saeculo sunt, prophetarum eius,</w:t>
       </w:r>
     </w:p>
     <w:p>
       <w:pPr>
         <w:pStyle w:val="SPPrayerLatin"/>
       </w:pPr>
-      <w:proofErr w:type="spellStart"/>
-      <w:r>
-        <w:t>salutem</w:t>
-      </w:r>
-      <w:proofErr w:type="spellEnd"/>
-      <w:r>
-        <w:t xml:space="preserve"> ex </w:t>
-      </w:r>
-      <w:proofErr w:type="spellStart"/>
-      <w:r>
-        <w:t>inimicis</w:t>
-      </w:r>
-      <w:proofErr w:type="spellEnd"/>
-      <w:r>
-        <w:t xml:space="preserve"> </w:t>
-      </w:r>
-      <w:proofErr w:type="spellStart"/>
-      <w:r>
-        <w:t>nostris</w:t>
-      </w:r>
-      <w:proofErr w:type="spellEnd"/>
-      <w:r>
-        <w:t>,</w:t>
+      <w:r>
+        <w:t>salutem ex inimicis nostris,</w:t>
       </w:r>
       <w:r>
         <w:br/>
-        <w:t xml:space="preserve">et de </w:t>
-      </w:r>
-      <w:proofErr w:type="spellStart"/>
-      <w:r>
-        <w:t>manu</w:t>
-      </w:r>
-      <w:proofErr w:type="spellEnd"/>
-      <w:r>
-        <w:t xml:space="preserve"> omnium qui </w:t>
-      </w:r>
-      <w:proofErr w:type="spellStart"/>
-      <w:r>
-        <w:t>oderunt</w:t>
-      </w:r>
-      <w:proofErr w:type="spellEnd"/>
-      <w:r>
-        <w:t xml:space="preserve"> </w:t>
-      </w:r>
-      <w:proofErr w:type="spellStart"/>
-      <w:r>
-        <w:t>nos</w:t>
-      </w:r>
-      <w:proofErr w:type="spellEnd"/>
-      <w:r>
-        <w:t>;</w:t>
+        <w:t>et de manu omnium qui oderunt nos;</w:t>
       </w:r>
     </w:p>
     <w:p>
@@ -7866,169 +7296,36 @@
         <w:pStyle w:val="SPPrayerLatin"/>
       </w:pPr>
       <w:r>
-        <w:t xml:space="preserve">ad </w:t>
-      </w:r>
-      <w:proofErr w:type="spellStart"/>
-      <w:r>
-        <w:t>faciendam</w:t>
-      </w:r>
-      <w:proofErr w:type="spellEnd"/>
-      <w:r>
-        <w:t xml:space="preserve"> misericordiam cum </w:t>
-      </w:r>
-      <w:proofErr w:type="spellStart"/>
-      <w:r>
-        <w:t>patribus</w:t>
-      </w:r>
-      <w:proofErr w:type="spellEnd"/>
-      <w:r>
-        <w:t xml:space="preserve"> </w:t>
-      </w:r>
-      <w:proofErr w:type="spellStart"/>
-      <w:r>
-        <w:t>nostris</w:t>
-      </w:r>
-      <w:proofErr w:type="spellEnd"/>
-      <w:r>
-        <w:t>,</w:t>
+        <w:t>ad faciendam misericordiam cum patribus nostris,</w:t>
       </w:r>
       <w:r>
         <w:br/>
-        <w:t xml:space="preserve">et </w:t>
-      </w:r>
-      <w:proofErr w:type="spellStart"/>
-      <w:r>
-        <w:t>memorari</w:t>
-      </w:r>
-      <w:proofErr w:type="spellEnd"/>
-      <w:r>
-        <w:t xml:space="preserve"> </w:t>
-      </w:r>
-      <w:proofErr w:type="spellStart"/>
-      <w:r>
-        <w:t>testamenti</w:t>
-      </w:r>
-      <w:proofErr w:type="spellEnd"/>
-      <w:r>
-        <w:t xml:space="preserve"> sui </w:t>
-      </w:r>
-      <w:proofErr w:type="spellStart"/>
-      <w:r>
-        <w:t>sancti</w:t>
-      </w:r>
-      <w:proofErr w:type="spellEnd"/>
-      <w:r>
-        <w:t>,</w:t>
+        <w:t>et memorari testamenti sui sancti,</w:t>
       </w:r>
     </w:p>
     <w:p>
       <w:pPr>
         <w:pStyle w:val="SPPrayerLatin"/>
       </w:pPr>
-      <w:proofErr w:type="spellStart"/>
-      <w:r>
-        <w:t>iusiurandum</w:t>
-      </w:r>
-      <w:proofErr w:type="spellEnd"/>
-      <w:r>
-        <w:t xml:space="preserve"> quod </w:t>
-      </w:r>
-      <w:proofErr w:type="spellStart"/>
-      <w:r>
-        <w:t>iuravit</w:t>
-      </w:r>
-      <w:proofErr w:type="spellEnd"/>
-      <w:r>
-        <w:t xml:space="preserve"> ad Abraham </w:t>
-      </w:r>
-      <w:proofErr w:type="spellStart"/>
-      <w:r>
-        <w:t>patrem</w:t>
-      </w:r>
-      <w:proofErr w:type="spellEnd"/>
-      <w:r>
-        <w:t xml:space="preserve"> nostrum,</w:t>
+      <w:r>
+        <w:t>iusiurandum quod iuravit ad Abraham patrem nostrum,</w:t>
       </w:r>
       <w:r>
         <w:br/>
-      </w:r>
-      <w:proofErr w:type="spellStart"/>
-      <w:r>
-        <w:t>daturum</w:t>
-      </w:r>
-      <w:proofErr w:type="spellEnd"/>
-      <w:r>
-        <w:t xml:space="preserve"> se nobis,</w:t>
+        <w:t>daturum se nobis,</w:t>
       </w:r>
     </w:p>
     <w:p>
       <w:pPr>
         <w:pStyle w:val="SPPrayerLatin"/>
       </w:pPr>
-      <w:proofErr w:type="spellStart"/>
-      <w:r>
-        <w:t>ut</w:t>
-      </w:r>
-      <w:proofErr w:type="spellEnd"/>
-      <w:r>
-        <w:t xml:space="preserve"> sine </w:t>
-      </w:r>
-      <w:proofErr w:type="spellStart"/>
-      <w:r>
-        <w:t>timore</w:t>
-      </w:r>
-      <w:proofErr w:type="spellEnd"/>
-      <w:r>
-        <w:t xml:space="preserve">, de </w:t>
-      </w:r>
-      <w:proofErr w:type="spellStart"/>
-      <w:r>
-        <w:t>manu</w:t>
-      </w:r>
-      <w:proofErr w:type="spellEnd"/>
-      <w:r>
-        <w:t xml:space="preserve"> </w:t>
-      </w:r>
-      <w:proofErr w:type="spellStart"/>
-      <w:r>
-        <w:t>inimicorum</w:t>
-      </w:r>
-      <w:proofErr w:type="spellEnd"/>
-      <w:r>
-        <w:t xml:space="preserve"> </w:t>
-      </w:r>
-      <w:proofErr w:type="spellStart"/>
-      <w:r>
-        <w:t>nostrorum</w:t>
-      </w:r>
-      <w:proofErr w:type="spellEnd"/>
-      <w:r>
-        <w:t xml:space="preserve"> </w:t>
-      </w:r>
-      <w:proofErr w:type="spellStart"/>
-      <w:r>
-        <w:t>liberati</w:t>
-      </w:r>
-      <w:proofErr w:type="spellEnd"/>
-      <w:r>
-        <w:t>,</w:t>
+      <w:r>
+        <w:t>ut sine timore, de manu inimicorum nostrorum liberati,</w:t>
       </w:r>
       <w:r>
         <w:br/>
-      </w:r>
-      <w:proofErr w:type="spellStart"/>
-      <w:r>
-        <w:t>serviamus</w:t>
-      </w:r>
-      <w:proofErr w:type="spellEnd"/>
-      <w:r>
-        <w:t xml:space="preserve"> </w:t>
-      </w:r>
-      <w:proofErr w:type="spellStart"/>
-      <w:r>
-        <w:t>illi</w:t>
-      </w:r>
-      <w:proofErr w:type="spellEnd"/>
+        <w:t>serviamus illi</w:t>
+      </w:r>
     </w:p>
     <w:p>
       <w:pPr>
@@ -8043,43 +7340,11 @@
         </w:sectPr>
       </w:pPr>
       <w:r>
-        <w:t xml:space="preserve">in </w:t>
-      </w:r>
-      <w:proofErr w:type="spellStart"/>
-      <w:r>
-        <w:t>sanctitate</w:t>
-      </w:r>
-      <w:proofErr w:type="spellEnd"/>
-      <w:r>
-        <w:t xml:space="preserve"> et </w:t>
-      </w:r>
-      <w:proofErr w:type="spellStart"/>
-      <w:r>
-        <w:t>iustitia</w:t>
-      </w:r>
-      <w:proofErr w:type="spellEnd"/>
-      <w:r>
-        <w:t xml:space="preserve"> coram ipso,</w:t>
+        <w:t>in sanctitate et iustitia coram ipso,</w:t>
       </w:r>
       <w:r>
         <w:br/>
-        <w:t xml:space="preserve">omnibus </w:t>
-      </w:r>
-      <w:proofErr w:type="spellStart"/>
-      <w:r>
-        <w:t>diebus</w:t>
-      </w:r>
-      <w:proofErr w:type="spellEnd"/>
-      <w:r>
-        <w:t xml:space="preserve"> </w:t>
-      </w:r>
-      <w:proofErr w:type="spellStart"/>
-      <w:r>
-        <w:t>nostris</w:t>
-      </w:r>
-      <w:proofErr w:type="spellEnd"/>
-      <w:r>
-        <w:t>.</w:t>
+        <w:t>omnibus diebus nostris.</w:t>
       </w:r>
     </w:p>
     <w:p>
@@ -8225,81 +7490,8 @@
           <w:b/>
           <w:bCs/>
         </w:rPr>
-        <w:t xml:space="preserve">Et </w:t>
-      </w:r>
-      <w:proofErr w:type="spellStart"/>
-      <w:r>
-        <w:rPr>
-          <w:b/>
-          <w:bCs/>
-        </w:rPr>
-        <w:t>tu</w:t>
-      </w:r>
-      <w:proofErr w:type="spellEnd"/>
-      <w:r>
-        <w:rPr>
-          <w:b/>
-          <w:bCs/>
-        </w:rPr>
-        <w:t xml:space="preserve">, </w:t>
-      </w:r>
-      <w:proofErr w:type="spellStart"/>
-      <w:r>
-        <w:rPr>
-          <w:b/>
-          <w:bCs/>
-        </w:rPr>
-        <w:t>puer</w:t>
-      </w:r>
-      <w:proofErr w:type="spellEnd"/>
-      <w:r>
-        <w:rPr>
-          <w:b/>
-          <w:bCs/>
-        </w:rPr>
-        <w:t xml:space="preserve">, </w:t>
-      </w:r>
-      <w:proofErr w:type="spellStart"/>
-      <w:r>
-        <w:rPr>
-          <w:b/>
-          <w:bCs/>
-        </w:rPr>
-        <w:t>propheta</w:t>
-      </w:r>
-      <w:proofErr w:type="spellEnd"/>
-      <w:r>
-        <w:rPr>
-          <w:b/>
-          <w:bCs/>
-        </w:rPr>
-        <w:t xml:space="preserve"> </w:t>
-      </w:r>
-      <w:proofErr w:type="spellStart"/>
-      <w:r>
-        <w:rPr>
-          <w:b/>
-          <w:bCs/>
-        </w:rPr>
-        <w:t>Altissimi</w:t>
-      </w:r>
-      <w:proofErr w:type="spellEnd"/>
-      <w:r>
-        <w:rPr>
-          <w:b/>
-          <w:bCs/>
-        </w:rPr>
-        <w:t xml:space="preserve"> </w:t>
-      </w:r>
-      <w:proofErr w:type="spellStart"/>
-      <w:r>
-        <w:rPr>
-          <w:b/>
-          <w:bCs/>
-        </w:rPr>
-        <w:t>vocaberis</w:t>
-      </w:r>
-      <w:proofErr w:type="spellEnd"/>
+        <w:t>Et tu, puer, propheta Altissimi vocaberis</w:t>
+      </w:r>
       <w:r>
         <w:rPr>
           <w:b/>
@@ -8315,29 +7507,8 @@
       <w:pPr>
         <w:pStyle w:val="SPPrayerLatin"/>
       </w:pPr>
-      <w:proofErr w:type="spellStart"/>
-      <w:r>
-        <w:t>praeibis</w:t>
-      </w:r>
-      <w:proofErr w:type="spellEnd"/>
-      <w:r>
-        <w:t xml:space="preserve"> </w:t>
-      </w:r>
-      <w:proofErr w:type="spellStart"/>
-      <w:r>
-        <w:t>enim</w:t>
-      </w:r>
-      <w:proofErr w:type="spellEnd"/>
-      <w:r>
-        <w:t xml:space="preserve"> ante faciem Domini </w:t>
-      </w:r>
-      <w:proofErr w:type="spellStart"/>
-      <w:r>
-        <w:t>parare</w:t>
-      </w:r>
-      <w:proofErr w:type="spellEnd"/>
-      <w:r>
-        <w:t xml:space="preserve"> vias eius,</w:t>
+      <w:r>
+        <w:t>praeibis enim ante faciem Domini parare vias eius,</w:t>
       </w:r>
     </w:p>
     <w:p>
@@ -8345,67 +7516,11 @@
         <w:pStyle w:val="SPPrayerLatin"/>
       </w:pPr>
       <w:r>
-        <w:t xml:space="preserve">ad </w:t>
-      </w:r>
-      <w:proofErr w:type="spellStart"/>
-      <w:r>
-        <w:t>dandam</w:t>
-      </w:r>
-      <w:proofErr w:type="spellEnd"/>
-      <w:r>
-        <w:t xml:space="preserve"> </w:t>
-      </w:r>
-      <w:proofErr w:type="spellStart"/>
-      <w:r>
-        <w:t>scientiam</w:t>
-      </w:r>
-      <w:proofErr w:type="spellEnd"/>
-      <w:r>
-        <w:t xml:space="preserve"> </w:t>
-      </w:r>
-      <w:proofErr w:type="spellStart"/>
-      <w:r>
-        <w:t>salutis</w:t>
-      </w:r>
-      <w:proofErr w:type="spellEnd"/>
-      <w:r>
-        <w:t xml:space="preserve"> </w:t>
-      </w:r>
-      <w:proofErr w:type="spellStart"/>
-      <w:r>
-        <w:t>plebi</w:t>
-      </w:r>
-      <w:proofErr w:type="spellEnd"/>
-      <w:r>
-        <w:t xml:space="preserve"> eius</w:t>
+        <w:t>ad dandam scientiam salutis plebi eius</w:t>
       </w:r>
       <w:r>
         <w:br/>
-        <w:t xml:space="preserve">in </w:t>
-      </w:r>
-      <w:proofErr w:type="spellStart"/>
-      <w:r>
-        <w:t>remissionem</w:t>
-      </w:r>
-      <w:proofErr w:type="spellEnd"/>
-      <w:r>
-        <w:t xml:space="preserve"> </w:t>
-      </w:r>
-      <w:proofErr w:type="spellStart"/>
-      <w:r>
-        <w:t>peccatorum</w:t>
-      </w:r>
-      <w:proofErr w:type="spellEnd"/>
-      <w:r>
-        <w:t xml:space="preserve"> </w:t>
-      </w:r>
-      <w:proofErr w:type="spellStart"/>
-      <w:r>
-        <w:t>eorum</w:t>
-      </w:r>
-      <w:proofErr w:type="spellEnd"/>
-      <w:r>
-        <w:t>,</w:t>
+        <w:t>in remissionem peccatorum eorum,</w:t>
       </w:r>
     </w:p>
     <w:p>
@@ -8413,92 +7528,23 @@
         <w:pStyle w:val="SPPrayerLatin"/>
       </w:pPr>
       <w:r>
-        <w:t xml:space="preserve">per viscera misericordiae Dei </w:t>
-      </w:r>
-      <w:proofErr w:type="spellStart"/>
-      <w:r>
-        <w:t>nostri</w:t>
-      </w:r>
-      <w:proofErr w:type="spellEnd"/>
-      <w:r>
-        <w:t>,</w:t>
+        <w:t>per viscera misericordiae Dei nostri,</w:t>
       </w:r>
       <w:r>
         <w:br/>
-        <w:t xml:space="preserve">in </w:t>
-      </w:r>
-      <w:proofErr w:type="spellStart"/>
-      <w:r>
-        <w:t>quibus</w:t>
-      </w:r>
-      <w:proofErr w:type="spellEnd"/>
-      <w:r>
-        <w:t xml:space="preserve"> </w:t>
-      </w:r>
-      <w:proofErr w:type="spellStart"/>
-      <w:r>
-        <w:t>visitabit</w:t>
-      </w:r>
-      <w:proofErr w:type="spellEnd"/>
-      <w:r>
-        <w:t xml:space="preserve"> </w:t>
-      </w:r>
-      <w:proofErr w:type="spellStart"/>
-      <w:r>
-        <w:t>nos</w:t>
-      </w:r>
-      <w:proofErr w:type="spellEnd"/>
-      <w:r>
-        <w:t xml:space="preserve"> </w:t>
-      </w:r>
-      <w:proofErr w:type="spellStart"/>
-      <w:r>
-        <w:t>oriens</w:t>
-      </w:r>
-      <w:proofErr w:type="spellEnd"/>
-      <w:r>
-        <w:t xml:space="preserve"> ex alto,</w:t>
+        <w:t>in quibus visitabit nos oriens ex alto,</w:t>
       </w:r>
     </w:p>
     <w:p>
       <w:pPr>
         <w:pStyle w:val="SPPrayerLatin"/>
       </w:pPr>
-      <w:proofErr w:type="spellStart"/>
-      <w:r>
-        <w:t>illuminare</w:t>
-      </w:r>
-      <w:proofErr w:type="spellEnd"/>
-      <w:r>
-        <w:t xml:space="preserve"> his qui in </w:t>
-      </w:r>
-      <w:proofErr w:type="spellStart"/>
-      <w:r>
-        <w:t>tenebris</w:t>
-      </w:r>
-      <w:proofErr w:type="spellEnd"/>
-      <w:r>
-        <w:t xml:space="preserve"> et in umbra mortis sedent,</w:t>
+      <w:r>
+        <w:t>illuminare his qui in tenebris et in umbra mortis sedent,</w:t>
       </w:r>
       <w:r>
         <w:br/>
-        <w:t xml:space="preserve">ad </w:t>
-      </w:r>
-      <w:proofErr w:type="spellStart"/>
-      <w:r>
-        <w:t>dirigendos</w:t>
-      </w:r>
-      <w:proofErr w:type="spellEnd"/>
-      <w:r>
-        <w:t xml:space="preserve"> pedes nostros in </w:t>
-      </w:r>
-      <w:proofErr w:type="spellStart"/>
-      <w:r>
-        <w:t>viam</w:t>
-      </w:r>
-      <w:proofErr w:type="spellEnd"/>
-      <w:r>
-        <w:t xml:space="preserve"> pacis.</w:t>
+        <w:t>ad dirigendos pedes nostros in viam pacis.</w:t>
       </w:r>
     </w:p>
     <w:p>
@@ -8519,23 +7565,7 @@
           <w:b/>
           <w:bCs/>
         </w:rPr>
-        <w:t xml:space="preserve">Gloria Patri, et Filio, et </w:t>
-      </w:r>
-      <w:proofErr w:type="spellStart"/>
-      <w:r>
-        <w:rPr>
-          <w:b/>
-          <w:bCs/>
-        </w:rPr>
-        <w:t>Spiritui</w:t>
-      </w:r>
-      <w:proofErr w:type="spellEnd"/>
-      <w:r>
-        <w:rPr>
-          <w:b/>
-          <w:bCs/>
-        </w:rPr>
-        <w:t xml:space="preserve"> Sancto.</w:t>
+        <w:t>Gloria Patri, et Filio, et Spiritui Sancto.</w:t>
       </w:r>
     </w:p>
     <w:p>
@@ -8543,15 +7573,7 @@
         <w:pStyle w:val="SPPrayerLatin"/>
       </w:pPr>
       <w:r>
-        <w:t xml:space="preserve">Sicut </w:t>
-      </w:r>
-      <w:proofErr w:type="spellStart"/>
-      <w:r>
-        <w:t>erat</w:t>
-      </w:r>
-      <w:proofErr w:type="spellEnd"/>
-      <w:r>
-        <w:t xml:space="preserve"> in principio, et nunc, et semper,</w:t>
+        <w:t>Sicut erat in principio, et nunc, et semper,</w:t>
       </w:r>
       <w:r>
         <w:br/>
@@ -9792,10 +8814,7 @@
         <w:pStyle w:val="SPPrayerTitle"/>
       </w:pPr>
       <w:r>
-        <w:t xml:space="preserve">The </w:t>
-      </w:r>
-      <w:r>
-        <w:t>Magnificat</w:t>
+        <w:t>The Magnificat</w:t>
       </w:r>
     </w:p>
     <w:p>
@@ -10051,107 +9070,22 @@
         </w:rPr>
         <w:t xml:space="preserve"> </w:t>
       </w:r>
-      <w:proofErr w:type="spellStart"/>
-      <w:r>
-        <w:t>Magníficat</w:t>
-      </w:r>
-      <w:proofErr w:type="spellEnd"/>
-      <w:r>
-        <w:t xml:space="preserve"> </w:t>
-      </w:r>
-      <w:proofErr w:type="spellStart"/>
-      <w:r>
-        <w:t>ánima</w:t>
-      </w:r>
-      <w:proofErr w:type="spellEnd"/>
-      <w:r>
-        <w:t xml:space="preserve"> </w:t>
-      </w:r>
-      <w:proofErr w:type="spellStart"/>
-      <w:r>
-        <w:t>mea</w:t>
-      </w:r>
-      <w:proofErr w:type="spellEnd"/>
-      <w:r>
-        <w:t xml:space="preserve"> </w:t>
-      </w:r>
-      <w:proofErr w:type="spellStart"/>
-      <w:r>
-        <w:t>Dóminum</w:t>
-      </w:r>
-      <w:proofErr w:type="spellEnd"/>
-      <w:r>
-        <w:t>.</w:t>
+      <w:r>
+        <w:t>Magníficat ánima mea Dóminum.</w:t>
       </w:r>
       <w:r>
         <w:br/>
       </w:r>
       <w:r>
         <w:br/>
-        <w:t xml:space="preserve">Et </w:t>
-      </w:r>
-      <w:proofErr w:type="spellStart"/>
-      <w:r>
-        <w:t>exultávit</w:t>
-      </w:r>
-      <w:proofErr w:type="spellEnd"/>
-      <w:r>
-        <w:t xml:space="preserve"> </w:t>
-      </w:r>
-      <w:proofErr w:type="spellStart"/>
-      <w:r>
-        <w:t>spíritus</w:t>
-      </w:r>
-      <w:proofErr w:type="spellEnd"/>
-      <w:r>
-        <w:t xml:space="preserve"> meus: in Deo </w:t>
-      </w:r>
-      <w:proofErr w:type="spellStart"/>
-      <w:r>
-        <w:t>salutári</w:t>
-      </w:r>
-      <w:proofErr w:type="spellEnd"/>
-      <w:r>
-        <w:t xml:space="preserve"> </w:t>
-      </w:r>
-      <w:proofErr w:type="spellStart"/>
-      <w:r>
-        <w:t>meo</w:t>
-      </w:r>
-      <w:proofErr w:type="spellEnd"/>
-      <w:r>
-        <w:t>.</w:t>
+        <w:t>Et exultávit spíritus meus: in Deo salutári meo.</w:t>
       </w:r>
       <w:r>
         <w:br/>
       </w:r>
       <w:r>
         <w:br/>
-        <w:t xml:space="preserve">Quia </w:t>
-      </w:r>
-      <w:proofErr w:type="spellStart"/>
-      <w:r>
-        <w:t>respéxit</w:t>
-      </w:r>
-      <w:proofErr w:type="spellEnd"/>
-      <w:r>
-        <w:t xml:space="preserve"> </w:t>
-      </w:r>
-      <w:proofErr w:type="spellStart"/>
-      <w:r>
-        <w:t>humilitátem</w:t>
-      </w:r>
-      <w:proofErr w:type="spellEnd"/>
-      <w:r>
-        <w:t xml:space="preserve"> </w:t>
-      </w:r>
-      <w:proofErr w:type="spellStart"/>
-      <w:r>
-        <w:t>ancíllae</w:t>
-      </w:r>
-      <w:proofErr w:type="spellEnd"/>
-      <w:r>
-        <w:t xml:space="preserve"> suae:</w:t>
+        <w:t>Quia respéxit humilitátem ancíllae suae:</w:t>
       </w:r>
     </w:p>
     <w:p>
@@ -10160,86 +9094,14 @@
       </w:pPr>
       <w:r>
         <w:br/>
-        <w:t xml:space="preserve">Ecce </w:t>
-      </w:r>
-      <w:proofErr w:type="spellStart"/>
-      <w:r>
-        <w:t>enim</w:t>
-      </w:r>
-      <w:proofErr w:type="spellEnd"/>
-      <w:r>
-        <w:t xml:space="preserve"> ex hoc </w:t>
-      </w:r>
-      <w:proofErr w:type="spellStart"/>
-      <w:r>
-        <w:t>beátam</w:t>
-      </w:r>
-      <w:proofErr w:type="spellEnd"/>
-      <w:r>
-        <w:t xml:space="preserve"> me </w:t>
-      </w:r>
-      <w:proofErr w:type="spellStart"/>
-      <w:r>
-        <w:t>dicent</w:t>
-      </w:r>
-      <w:proofErr w:type="spellEnd"/>
-      <w:r>
-        <w:t xml:space="preserve"> omnes </w:t>
-      </w:r>
-      <w:proofErr w:type="spellStart"/>
-      <w:r>
-        <w:t>generatiónes</w:t>
-      </w:r>
-      <w:proofErr w:type="spellEnd"/>
-      <w:r>
-        <w:t>.</w:t>
+        <w:t>Ecce enim ex hoc beátam me dicent omnes generatiónes.</w:t>
       </w:r>
       <w:r>
         <w:br/>
       </w:r>
       <w:r>
         <w:br/>
-        <w:t xml:space="preserve">Quia </w:t>
-      </w:r>
-      <w:proofErr w:type="spellStart"/>
-      <w:r>
-        <w:t>fécit</w:t>
-      </w:r>
-      <w:proofErr w:type="spellEnd"/>
-      <w:r>
-        <w:t xml:space="preserve"> mihi </w:t>
-      </w:r>
-      <w:proofErr w:type="spellStart"/>
-      <w:r>
-        <w:t>mágna</w:t>
-      </w:r>
-      <w:proofErr w:type="spellEnd"/>
-      <w:r>
-        <w:t xml:space="preserve"> qui </w:t>
-      </w:r>
-      <w:proofErr w:type="spellStart"/>
-      <w:r>
-        <w:t>pótens</w:t>
-      </w:r>
-      <w:proofErr w:type="spellEnd"/>
-      <w:r>
-        <w:t xml:space="preserve"> est: et </w:t>
-      </w:r>
-      <w:proofErr w:type="spellStart"/>
-      <w:r>
-        <w:t>sánctum</w:t>
-      </w:r>
-      <w:proofErr w:type="spellEnd"/>
-      <w:r>
-        <w:t xml:space="preserve"> </w:t>
-      </w:r>
-      <w:proofErr w:type="spellStart"/>
-      <w:r>
-        <w:t>nómen</w:t>
-      </w:r>
-      <w:proofErr w:type="spellEnd"/>
-      <w:r>
-        <w:t xml:space="preserve"> eius.</w:t>
+        <w:t>Quia fécit mihi mágna qui pótens est: et sánctum nómen eius.</w:t>
       </w:r>
     </w:p>
     <w:p>
@@ -10256,109 +9118,14 @@
       </w:pPr>
       <w:r>
         <w:br/>
-        <w:t xml:space="preserve">Et </w:t>
-      </w:r>
-      <w:proofErr w:type="spellStart"/>
-      <w:r>
-        <w:t>misericórdia</w:t>
-      </w:r>
-      <w:proofErr w:type="spellEnd"/>
-      <w:r>
-        <w:t xml:space="preserve"> eius in </w:t>
-      </w:r>
-      <w:proofErr w:type="spellStart"/>
-      <w:r>
-        <w:t>progénies</w:t>
-      </w:r>
-      <w:proofErr w:type="spellEnd"/>
-      <w:r>
-        <w:t xml:space="preserve"> et </w:t>
-      </w:r>
-      <w:proofErr w:type="spellStart"/>
-      <w:r>
-        <w:t>progénies</w:t>
-      </w:r>
-      <w:proofErr w:type="spellEnd"/>
-      <w:r>
-        <w:t xml:space="preserve"> </w:t>
-      </w:r>
-      <w:proofErr w:type="spellStart"/>
-      <w:r>
-        <w:t>timéntibus</w:t>
-      </w:r>
-      <w:proofErr w:type="spellEnd"/>
-      <w:r>
-        <w:t xml:space="preserve"> </w:t>
-      </w:r>
-      <w:proofErr w:type="spellStart"/>
-      <w:r>
-        <w:t>eum</w:t>
-      </w:r>
-      <w:proofErr w:type="spellEnd"/>
-      <w:r>
-        <w:t>.</w:t>
+        <w:t>Et misericórdia eius in progénies et progénies timéntibus eum.</w:t>
       </w:r>
       <w:r>
         <w:br/>
       </w:r>
       <w:r>
         <w:br/>
-      </w:r>
-      <w:proofErr w:type="spellStart"/>
-      <w:r>
-        <w:t>Fécit</w:t>
-      </w:r>
-      <w:proofErr w:type="spellEnd"/>
-      <w:r>
-        <w:t xml:space="preserve"> </w:t>
-      </w:r>
-      <w:proofErr w:type="spellStart"/>
-      <w:r>
-        <w:t>poténtiam</w:t>
-      </w:r>
-      <w:proofErr w:type="spellEnd"/>
-      <w:r>
-        <w:t xml:space="preserve"> in </w:t>
-      </w:r>
-      <w:proofErr w:type="spellStart"/>
-      <w:r>
-        <w:t>bráchio</w:t>
-      </w:r>
-      <w:proofErr w:type="spellEnd"/>
-      <w:r>
-        <w:t xml:space="preserve"> </w:t>
-      </w:r>
-      <w:proofErr w:type="spellStart"/>
-      <w:r>
-        <w:t>suo</w:t>
-      </w:r>
-      <w:proofErr w:type="spellEnd"/>
-      <w:r>
-        <w:t xml:space="preserve">: </w:t>
-      </w:r>
-      <w:proofErr w:type="spellStart"/>
-      <w:r>
-        <w:t>dispérsit</w:t>
-      </w:r>
-      <w:proofErr w:type="spellEnd"/>
-      <w:r>
-        <w:t xml:space="preserve"> </w:t>
-      </w:r>
-      <w:proofErr w:type="spellStart"/>
-      <w:r>
-        <w:t>supérbos</w:t>
-      </w:r>
-      <w:proofErr w:type="spellEnd"/>
-      <w:r>
-        <w:t xml:space="preserve"> </w:t>
-      </w:r>
-      <w:proofErr w:type="spellStart"/>
-      <w:r>
-        <w:t>mente</w:t>
-      </w:r>
-      <w:proofErr w:type="spellEnd"/>
-      <w:r>
-        <w:t xml:space="preserve"> cordis sui.</w:t>
+        <w:t>Fécit poténtiam in bráchio suo: dispérsit supérbos mente cordis sui.</w:t>
       </w:r>
     </w:p>
     <w:p>
@@ -10446,254 +9213,43 @@
       <w:pPr>
         <w:pStyle w:val="SPPrayerLatin"/>
       </w:pPr>
-      <w:proofErr w:type="spellStart"/>
-      <w:r>
-        <w:t>Depósuit</w:t>
-      </w:r>
-      <w:proofErr w:type="spellEnd"/>
-      <w:r>
-        <w:t xml:space="preserve"> </w:t>
-      </w:r>
-      <w:proofErr w:type="spellStart"/>
-      <w:r>
-        <w:t>poténtes</w:t>
-      </w:r>
-      <w:proofErr w:type="spellEnd"/>
-      <w:r>
-        <w:t xml:space="preserve"> de </w:t>
-      </w:r>
-      <w:proofErr w:type="spellStart"/>
-      <w:r>
-        <w:t>sede</w:t>
-      </w:r>
-      <w:proofErr w:type="spellEnd"/>
-      <w:r>
-        <w:t xml:space="preserve">: et </w:t>
-      </w:r>
-      <w:proofErr w:type="spellStart"/>
-      <w:r>
-        <w:t>exaltávit</w:t>
-      </w:r>
-      <w:proofErr w:type="spellEnd"/>
-      <w:r>
-        <w:t xml:space="preserve"> </w:t>
-      </w:r>
-      <w:proofErr w:type="spellStart"/>
-      <w:r>
-        <w:t>húmiles</w:t>
-      </w:r>
-      <w:proofErr w:type="spellEnd"/>
-      <w:r>
-        <w:t>.</w:t>
+      <w:r>
+        <w:t>Depósuit poténtes de sede: et exaltávit húmiles.</w:t>
       </w:r>
       <w:r>
         <w:br/>
       </w:r>
       <w:r>
         <w:br/>
-      </w:r>
-      <w:proofErr w:type="spellStart"/>
-      <w:r>
-        <w:t>Esuriéntes</w:t>
-      </w:r>
-      <w:proofErr w:type="spellEnd"/>
-      <w:r>
-        <w:t xml:space="preserve"> </w:t>
-      </w:r>
-      <w:proofErr w:type="spellStart"/>
-      <w:r>
-        <w:t>implévit</w:t>
-      </w:r>
-      <w:proofErr w:type="spellEnd"/>
-      <w:r>
-        <w:t xml:space="preserve"> </w:t>
-      </w:r>
-      <w:proofErr w:type="spellStart"/>
-      <w:r>
-        <w:t>bonis</w:t>
-      </w:r>
-      <w:proofErr w:type="spellEnd"/>
-      <w:r>
-        <w:t xml:space="preserve">: et </w:t>
-      </w:r>
-      <w:proofErr w:type="spellStart"/>
-      <w:r>
-        <w:t>dívites</w:t>
-      </w:r>
-      <w:proofErr w:type="spellEnd"/>
-      <w:r>
-        <w:t xml:space="preserve"> </w:t>
-      </w:r>
-      <w:proofErr w:type="spellStart"/>
-      <w:r>
-        <w:t>dimísit</w:t>
-      </w:r>
-      <w:proofErr w:type="spellEnd"/>
-      <w:r>
-        <w:t xml:space="preserve"> </w:t>
-      </w:r>
-      <w:proofErr w:type="spellStart"/>
-      <w:r>
-        <w:t>inánes</w:t>
-      </w:r>
-      <w:proofErr w:type="spellEnd"/>
-      <w:r>
-        <w:t>.</w:t>
+        <w:t>Esuriéntes implévit bonis: et dívites dimísit inánes.</w:t>
       </w:r>
       <w:r>
         <w:br/>
       </w:r>
       <w:r>
         <w:br/>
-      </w:r>
-      <w:proofErr w:type="spellStart"/>
-      <w:r>
-        <w:t>Suscépit</w:t>
-      </w:r>
-      <w:proofErr w:type="spellEnd"/>
-      <w:r>
-        <w:t xml:space="preserve"> </w:t>
-      </w:r>
-      <w:proofErr w:type="spellStart"/>
-      <w:r>
-        <w:t>Ísrael</w:t>
-      </w:r>
-      <w:proofErr w:type="spellEnd"/>
-      <w:r>
-        <w:t xml:space="preserve"> </w:t>
-      </w:r>
-      <w:proofErr w:type="spellStart"/>
-      <w:r>
-        <w:t>púerum</w:t>
-      </w:r>
-      <w:proofErr w:type="spellEnd"/>
-      <w:r>
-        <w:t xml:space="preserve"> </w:t>
-      </w:r>
-      <w:proofErr w:type="spellStart"/>
-      <w:r>
-        <w:t>suum</w:t>
-      </w:r>
-      <w:proofErr w:type="spellEnd"/>
-      <w:r>
-        <w:t xml:space="preserve">: </w:t>
-      </w:r>
-      <w:proofErr w:type="spellStart"/>
-      <w:r>
-        <w:t>recordátus</w:t>
-      </w:r>
-      <w:proofErr w:type="spellEnd"/>
-      <w:r>
-        <w:t xml:space="preserve"> </w:t>
-      </w:r>
-      <w:proofErr w:type="spellStart"/>
-      <w:r>
-        <w:t>misericórdiae</w:t>
-      </w:r>
-      <w:proofErr w:type="spellEnd"/>
-      <w:r>
-        <w:t xml:space="preserve"> suae.</w:t>
+        <w:t>Suscépit Ísrael púerum suum: recordátus misericórdiae suae.</w:t>
       </w:r>
       <w:r>
         <w:br/>
       </w:r>
       <w:r>
         <w:br/>
-        <w:t xml:space="preserve">Sicut </w:t>
-      </w:r>
-      <w:proofErr w:type="spellStart"/>
-      <w:r>
-        <w:t>locútus</w:t>
-      </w:r>
-      <w:proofErr w:type="spellEnd"/>
-      <w:r>
-        <w:t xml:space="preserve"> est ad </w:t>
-      </w:r>
-      <w:proofErr w:type="spellStart"/>
-      <w:r>
-        <w:t>patres</w:t>
-      </w:r>
-      <w:proofErr w:type="spellEnd"/>
-      <w:r>
-        <w:t xml:space="preserve"> nostros: </w:t>
-      </w:r>
-      <w:proofErr w:type="spellStart"/>
-      <w:r>
-        <w:t>Ábraham</w:t>
-      </w:r>
-      <w:proofErr w:type="spellEnd"/>
-      <w:r>
-        <w:t xml:space="preserve">, et </w:t>
-      </w:r>
-      <w:proofErr w:type="spellStart"/>
-      <w:r>
-        <w:t>sémini</w:t>
-      </w:r>
-      <w:proofErr w:type="spellEnd"/>
-      <w:r>
-        <w:t xml:space="preserve"> eius in saecula.</w:t>
+        <w:t>Sicut locútus est ad patres nostros: Ábraham, et sémini eius in saecula.</w:t>
       </w:r>
       <w:r>
         <w:br/>
       </w:r>
       <w:r>
         <w:br/>
-        <w:t xml:space="preserve">Glória Patri, et </w:t>
-      </w:r>
-      <w:proofErr w:type="spellStart"/>
-      <w:r>
-        <w:t>Fílio</w:t>
-      </w:r>
-      <w:proofErr w:type="spellEnd"/>
-      <w:r>
-        <w:t xml:space="preserve">, et </w:t>
-      </w:r>
-      <w:proofErr w:type="spellStart"/>
-      <w:r>
-        <w:t>Spirítui</w:t>
-      </w:r>
-      <w:proofErr w:type="spellEnd"/>
-      <w:r>
-        <w:t xml:space="preserve"> Sancto,</w:t>
+        <w:t>Glória Patri, et Fílio, et Spirítui Sancto,</w:t>
       </w:r>
       <w:r>
         <w:br/>
       </w:r>
       <w:r>
         <w:br/>
-        <w:t xml:space="preserve">Sicut </w:t>
-      </w:r>
-      <w:proofErr w:type="spellStart"/>
-      <w:r>
-        <w:t>erat</w:t>
-      </w:r>
-      <w:proofErr w:type="spellEnd"/>
-      <w:r>
-        <w:t xml:space="preserve"> in </w:t>
-      </w:r>
-      <w:proofErr w:type="spellStart"/>
-      <w:r>
-        <w:t>princípio</w:t>
-      </w:r>
-      <w:proofErr w:type="spellEnd"/>
-      <w:r>
-        <w:t xml:space="preserve">, et nunc, et semper, et in </w:t>
-      </w:r>
-      <w:proofErr w:type="spellStart"/>
-      <w:r>
-        <w:t>sæcula</w:t>
-      </w:r>
-      <w:proofErr w:type="spellEnd"/>
-      <w:r>
-        <w:t xml:space="preserve"> </w:t>
-      </w:r>
-      <w:proofErr w:type="spellStart"/>
-      <w:r>
-        <w:t>sæculórum</w:t>
-      </w:r>
-      <w:proofErr w:type="spellEnd"/>
-      <w:r>
-        <w:t>. Amen.</w:t>
+        <w:t>Sicut erat in princípio, et nunc, et semper, et in sæcula sæculórum. Amen.</w:t>
       </w:r>
     </w:p>
     <w:p>
@@ -11891,15 +10447,7 @@
       </w:r>
       <w:r>
         <w:br/>
-        <w:t xml:space="preserve">quod parasti ante faciem omnium </w:t>
-      </w:r>
-      <w:proofErr w:type="spellStart"/>
-      <w:r>
-        <w:t>populorum</w:t>
-      </w:r>
-      <w:proofErr w:type="spellEnd"/>
-      <w:r>
-        <w:t>,</w:t>
+        <w:t>quod parasti ante faciem omnium populorum,</w:t>
       </w:r>
     </w:p>
     <w:p>
@@ -11907,15 +10455,7 @@
         <w:pStyle w:val="SPPrayerLatin"/>
       </w:pPr>
       <w:r>
-        <w:t xml:space="preserve">Lumen ad </w:t>
-      </w:r>
-      <w:proofErr w:type="spellStart"/>
-      <w:r>
-        <w:t>revelationem</w:t>
-      </w:r>
-      <w:proofErr w:type="spellEnd"/>
-      <w:r>
-        <w:t xml:space="preserve"> gentium,</w:t>
+        <w:t>Lumen ad revelationem gentium,</w:t>
       </w:r>
       <w:r>
         <w:br/>
@@ -12482,13 +11022,7 @@
         <w:t xml:space="preserve"> </w:t>
       </w:r>
       <w:r>
-        <w:t>–</w:t>
-      </w:r>
-      <w:r>
-        <w:t xml:space="preserve"> </w:t>
-      </w:r>
-      <w:r>
-        <w:t>Devotional Prayers</w:t>
+        <w:t>– Devotional Prayers</w:t>
       </w:r>
     </w:p>
     <w:p>
@@ -12705,7 +11239,283 @@
     </w:p>
     <w:p>
       <w:pPr>
-        <w:pStyle w:val="SPPrayerTitle"/>
+        <w:pStyle w:val="SPBodyText"/>
+        <w:rPr>
+          <w:b/>
+          <w:bCs/>
+        </w:rPr>
+      </w:pPr>
+      <w:r>
+        <w:rPr>
+          <w:b/>
+          <w:bCs/>
+        </w:rPr>
+        <w:t>Offering the Day to God</w:t>
+      </w:r>
+    </w:p>
+    <w:p>
+      <w:pPr>
+        <w:pStyle w:val="SPBodyText"/>
+      </w:pPr>
+      <w:r>
+        <w:t>The Morning Offering is a simple prayer of beginning.</w:t>
+      </w:r>
+    </w:p>
+    <w:p>
+      <w:pPr>
+        <w:pStyle w:val="SPBodyText"/>
+      </w:pPr>
+      <w:r>
+        <w:t>Before the day has fully begun, we place it in God's hands. We offer Him not only our prayers, but also our work, our joys, our difficulties, and the ordinary moments that will make up the hours ahead.</w:t>
+      </w:r>
+    </w:p>
+    <w:p>
+      <w:pPr>
+        <w:pStyle w:val="SPBodyText"/>
+      </w:pPr>
+      <w:r>
+        <w:t>The prayer asks us to unite the day with the Holy Sacrifice of the Mass offered throughout the world. In doing so, the ordinary things of our lives are brought into a greater offering: our work, our relationships, our responsibilities, our successes, and even our sufferings.</w:t>
+      </w:r>
+    </w:p>
+    <w:p>
+      <w:pPr>
+        <w:pStyle w:val="SPBodyText"/>
+      </w:pPr>
+      <w:r>
+        <w:t>Nothing needs to be extraordinary.</w:t>
+      </w:r>
+    </w:p>
+    <w:p>
+      <w:pPr>
+        <w:pStyle w:val="SPBodyText"/>
+      </w:pPr>
+    </w:p>
+    <w:p>
+      <w:pPr>
+        <w:pStyle w:val="SPBodyText"/>
+      </w:pPr>
+      <w:r>
+        <w:t>A difficult task can be offered.</w:t>
+      </w:r>
+      <w:r>
+        <w:br/>
+        <w:t>A conversation can be offered.</w:t>
+      </w:r>
+      <w:r>
+        <w:br/>
+        <w:t>A moment of patience can be offered.</w:t>
+      </w:r>
+      <w:r>
+        <w:br/>
+        <w:t>A kindness that no one notices can be offered.</w:t>
+      </w:r>
+      <w:r>
+        <w:br/>
+        <w:t>Even an ordinary day can become an offering to God.</w:t>
+      </w:r>
+    </w:p>
+    <w:p>
+      <w:pPr>
+        <w:pStyle w:val="SPBodyText"/>
+      </w:pPr>
+    </w:p>
+    <w:p>
+      <w:pPr>
+        <w:pStyle w:val="SPBodyText"/>
+      </w:pPr>
+      <w:r>
+        <w:t xml:space="preserve">The prayer places this offering </w:t>
+      </w:r>
+      <w:r>
+        <w:rPr>
+          <w:b/>
+          <w:bCs/>
+        </w:rPr>
+        <w:t>through the Immaculate Heart of Mary</w:t>
+      </w:r>
+      <w:r>
+        <w:t xml:space="preserve">, asking that our lives may be joined to her perfect response to God. Mary's </w:t>
+      </w:r>
+      <w:r>
+        <w:rPr>
+          <w:i/>
+          <w:iCs/>
+        </w:rPr>
+        <w:t>fiat</w:t>
+      </w:r>
+      <w:r>
+        <w:t xml:space="preserve"> — her "Let it be done" — becomes a model for our own.</w:t>
+      </w:r>
+    </w:p>
+    <w:p>
+      <w:pPr>
+        <w:pStyle w:val="SPBodyText"/>
+      </w:pPr>
+      <w:r>
+        <w:lastRenderedPageBreak/>
+        <w:t>The Morning Offering also reminds us that prayer is not something separated from the rest of the day.</w:t>
+      </w:r>
+    </w:p>
+    <w:p>
+      <w:pPr>
+        <w:pStyle w:val="SPBodyText"/>
+      </w:pPr>
+      <w:r>
+        <w:t>We do not pray and then leave prayer behind.</w:t>
+      </w:r>
+    </w:p>
+    <w:p>
+      <w:pPr>
+        <w:pStyle w:val="SPBodyText"/>
+      </w:pPr>
+    </w:p>
+    <w:p>
+      <w:pPr>
+        <w:pStyle w:val="SPBodyText"/>
+      </w:pPr>
+      <w:r>
+        <w:t>We carry our prayer into our work.</w:t>
+      </w:r>
+      <w:r>
+        <w:br/>
+        <w:t>Into our families.</w:t>
+      </w:r>
+      <w:r>
+        <w:br/>
+        <w:t>Into our responsibilities.</w:t>
+      </w:r>
+      <w:r>
+        <w:br/>
+        <w:t>Into moments of joy and moments of difficulty.</w:t>
+      </w:r>
+    </w:p>
+    <w:p>
+      <w:pPr>
+        <w:pStyle w:val="SPBodyText"/>
+      </w:pPr>
+    </w:p>
+    <w:p>
+      <w:pPr>
+        <w:pStyle w:val="SPBodyText"/>
+      </w:pPr>
+      <w:r>
+        <w:t>When the day goes differently from what we expected, the offering remains.</w:t>
+      </w:r>
+    </w:p>
+    <w:p>
+      <w:pPr>
+        <w:pStyle w:val="SPBodyText"/>
+      </w:pPr>
+    </w:p>
+    <w:p>
+      <w:pPr>
+        <w:pStyle w:val="SPBodyText"/>
+      </w:pPr>
+      <w:r>
+        <w:t>When we succeed, we can give thanks.</w:t>
+      </w:r>
+      <w:r>
+        <w:br/>
+        <w:t>When we struggle, we can offer the struggle.</w:t>
+      </w:r>
+      <w:r>
+        <w:br/>
+        <w:t>When we fall, we can begin again.</w:t>
+      </w:r>
+    </w:p>
+    <w:p>
+      <w:pPr>
+        <w:pStyle w:val="SPBodyText"/>
+      </w:pPr>
+    </w:p>
+    <w:p>
+      <w:pPr>
+        <w:pStyle w:val="SPBodyText"/>
+        <w:rPr>
+          <w:b/>
+          <w:bCs/>
+        </w:rPr>
+      </w:pPr>
+      <w:r>
+        <w:t xml:space="preserve">The Morning Offering is therefore more than a prayer said once in the morning. It is an invitation to </w:t>
+      </w:r>
+      <w:r>
+        <w:rPr>
+          <w:b/>
+          <w:bCs/>
+        </w:rPr>
+        <w:t>live the day con</w:t>
+      </w:r>
+    </w:p>
+    <w:p>
+      <w:pPr>
+        <w:pStyle w:val="SPBodyText"/>
+      </w:pPr>
+      <w:proofErr w:type="spellStart"/>
+      <w:r>
+        <w:rPr>
+          <w:b/>
+          <w:bCs/>
+        </w:rPr>
+        <w:t>sciously</w:t>
+      </w:r>
+      <w:proofErr w:type="spellEnd"/>
+      <w:r>
+        <w:rPr>
+          <w:b/>
+          <w:bCs/>
+        </w:rPr>
+        <w:t xml:space="preserve"> in the presence of God</w:t>
+      </w:r>
+      <w:r>
+        <w:t>.</w:t>
+      </w:r>
+    </w:p>
+    <w:p>
+      <w:pPr>
+        <w:pStyle w:val="SPBodyText"/>
+      </w:pPr>
+      <w:r>
+        <w:t>Begin the day by offering it.</w:t>
+      </w:r>
+    </w:p>
+    <w:p>
+      <w:pPr>
+        <w:pStyle w:val="SPBodyText"/>
+      </w:pPr>
+    </w:p>
+    <w:p>
+      <w:pPr>
+        <w:pStyle w:val="SPBodyText"/>
+      </w:pPr>
+      <w:r>
+        <w:t>Then, as the hours unfold, remember the offering you have already made.</w:t>
+      </w:r>
+    </w:p>
+    <w:p>
+      <w:pPr>
+        <w:pStyle w:val="SPBodyText"/>
+        <w:rPr>
+          <w:b/>
+          <w:bCs/>
+        </w:rPr>
+      </w:pPr>
+    </w:p>
+    <w:p>
+      <w:pPr>
+        <w:pStyle w:val="SPBodyText"/>
+      </w:pPr>
+      <w:r>
+        <w:rPr>
+          <w:b/>
+          <w:bCs/>
+        </w:rPr>
+        <w:t>Your whole day can become a prayer.</w:t>
+      </w:r>
+    </w:p>
+    <w:p>
+      <w:pPr>
+        <w:pStyle w:val="SPBodyText"/>
       </w:pPr>
     </w:p>
     <w:p>
@@ -12960,6 +11770,98 @@
     <w:p>
       <w:pPr>
         <w:pStyle w:val="SPSectionTitle"/>
+      </w:pPr>
+      <w:r>
+        <w:lastRenderedPageBreak/>
+        <w:t>Scripture</w:t>
+      </w:r>
+    </w:p>
+    <w:p>
+      <w:pPr>
+        <w:pStyle w:val="SPScriptureReference"/>
+      </w:pPr>
+      <w:r>
+        <w:t>Romans 12:1</w:t>
+      </w:r>
+    </w:p>
+    <w:p>
+      <w:pPr>
+        <w:pStyle w:val="SPScripture"/>
+      </w:pPr>
+      <w:r>
+        <w:t>I appeal to you therefore, brethren, by the mercies of God, to present your bodies as a living sacrifice, holy and acceptable to God, which is your spiritual worship.</w:t>
+      </w:r>
+    </w:p>
+    <w:p>
+      <w:pPr>
+        <w:pStyle w:val="SPScriptureReference"/>
+      </w:pPr>
+      <w:r>
+        <w:t>1 Corinthians 10:31</w:t>
+      </w:r>
+    </w:p>
+    <w:p>
+      <w:pPr>
+        <w:pStyle w:val="SPScripture"/>
+      </w:pPr>
+      <w:r>
+        <w:t>So, whether you eat or drink, or whatever you do, do all to the glory of God.</w:t>
+      </w:r>
+    </w:p>
+    <w:p>
+      <w:pPr>
+        <w:pStyle w:val="SPScriptureReference"/>
+      </w:pPr>
+      <w:r>
+        <w:t>Colossians 3:17</w:t>
+      </w:r>
+    </w:p>
+    <w:p>
+      <w:pPr>
+        <w:pStyle w:val="SPScripture"/>
+      </w:pPr>
+      <w:r>
+        <w:t>And whatever you do, in word or deed, do everything in the name of the Lord Jesus, giving thanks to God the Father through him.</w:t>
+      </w:r>
+    </w:p>
+    <w:p>
+      <w:pPr>
+        <w:pStyle w:val="SPScriptureReference"/>
+      </w:pPr>
+      <w:r>
+        <w:t>1 Thessalonians 5:16–18</w:t>
+      </w:r>
+    </w:p>
+    <w:p>
+      <w:pPr>
+        <w:pStyle w:val="SPScripture"/>
+      </w:pPr>
+      <w:r>
+        <w:t>See that none of you repays evil with evil</w:t>
+      </w:r>
+      <w:r>
+        <w:t>, but always seek to do good to one another, and to all. Rejoice always, pray constantly, give thanks in all circumstances; for this is the will of God in Christ Jesus for you.</w:t>
+      </w:r>
+    </w:p>
+    <w:p>
+      <w:pPr>
+        <w:pStyle w:val="SPScriptureReference"/>
+      </w:pPr>
+      <w:r>
+        <w:t>Psalm 5:3</w:t>
+      </w:r>
+    </w:p>
+    <w:p>
+      <w:pPr>
+        <w:pStyle w:val="SPScripture"/>
+      </w:pPr>
+      <w:r>
+        <w:t>O Lord, in the morning you hear my voice; in the morning I prepare a sacrifice for you and watch.</w:t>
+      </w:r>
+    </w:p>
+    <w:p>
+      <w:pPr>
+        <w:pStyle w:val="SPScripture"/>
         <w:sectPr>
           <w:type w:val="evenPage"/>
           <w:pgSz w:w="7920" w:h="12240" w:code="6"/>
@@ -12969,27 +11871,1055 @@
           <w:docGrid w:linePitch="360"/>
         </w:sectPr>
       </w:pPr>
+    </w:p>
+    <w:p>
+      <w:pPr>
+        <w:pStyle w:val="SPSectionTitle"/>
+      </w:pPr>
       <w:r>
         <w:lastRenderedPageBreak/>
-        <w:t>Scripture</w:t>
-      </w:r>
-    </w:p>
-    <w:p>
-      <w:pPr>
-        <w:pStyle w:val="SPSectionTitle"/>
+        <w:t>Reflection</w:t>
+      </w:r>
+    </w:p>
+    <w:p>
+      <w:pPr>
+        <w:pStyle w:val="SPBodyText"/>
+        <w:rPr>
+          <w:b/>
+          <w:bCs/>
+        </w:rPr>
+      </w:pPr>
+      <w:r>
+        <w:rPr>
+          <w:b/>
+          <w:bCs/>
+        </w:rPr>
+        <w:t>A Day Given to God</w:t>
+      </w:r>
+    </w:p>
+    <w:p>
+      <w:pPr>
+        <w:pStyle w:val="SPBodyText"/>
+      </w:pPr>
+      <w:r>
+        <w:t>Every morning gives us something we cannot keep.</w:t>
+      </w:r>
+    </w:p>
+    <w:p>
+      <w:pPr>
+        <w:pStyle w:val="SPBodyText"/>
+      </w:pPr>
+      <w:r>
+        <w:t>The hours ahead are unknown. Some will bring joy, some difficulty, some moments we will remember, and many that will pass almost unnoticed. Yet before any of them arrive, we can place the whole day into God's hands.</w:t>
+      </w:r>
+    </w:p>
+    <w:p>
+      <w:pPr>
+        <w:pStyle w:val="SPBodyText"/>
+      </w:pPr>
+    </w:p>
+    <w:p>
+      <w:pPr>
+        <w:pStyle w:val="SPBodyText"/>
+      </w:pPr>
+      <w:r>
+        <w:t>This is the quiet beauty of the Morning Offering.</w:t>
+      </w:r>
+    </w:p>
+    <w:p>
+      <w:pPr>
+        <w:pStyle w:val="SPBodyText"/>
+      </w:pPr>
+    </w:p>
+    <w:p>
+      <w:pPr>
+        <w:pStyle w:val="SPBodyText"/>
+      </w:pPr>
+      <w:r>
+        <w:t>We do not know what the day will ask of us. We do not know which conversations will test our patience, which opportunities will bring joy, or which unexpected difficulties may interrupt our plans.</w:t>
+      </w:r>
+    </w:p>
+    <w:p>
+      <w:pPr>
+        <w:pStyle w:val="SPBodyText"/>
+      </w:pPr>
+      <w:r>
+        <w:t>But we can choose how we enter the day.</w:t>
+      </w:r>
+    </w:p>
+    <w:p>
+      <w:pPr>
+        <w:pStyle w:val="SPBodyText"/>
+      </w:pPr>
+      <w:r>
+        <w:t>We can begin by saying, in our own hearts:</w:t>
+      </w:r>
+    </w:p>
+    <w:p>
+      <w:pPr>
+        <w:pStyle w:val="SPBodyText"/>
+        <w:rPr>
+          <w:b/>
+          <w:bCs/>
+        </w:rPr>
+      </w:pPr>
+    </w:p>
+    <w:p>
+      <w:pPr>
+        <w:pStyle w:val="SPBodyText"/>
+      </w:pPr>
+      <w:r>
+        <w:rPr>
+          <w:b/>
+          <w:bCs/>
+        </w:rPr>
+        <w:t>This day belongs to You.</w:t>
+      </w:r>
+    </w:p>
+    <w:p>
+      <w:pPr>
+        <w:pStyle w:val="SPBodyText"/>
+      </w:pPr>
+    </w:p>
+    <w:p>
+      <w:pPr>
+        <w:pStyle w:val="SPBodyText"/>
+      </w:pPr>
+      <w:r>
+        <w:t>Our work can become an offering.</w:t>
+      </w:r>
+    </w:p>
+    <w:p>
+      <w:pPr>
+        <w:pStyle w:val="SPBodyText"/>
+      </w:pPr>
+      <w:r>
+        <w:t>Our responsibilities can become an offering.</w:t>
+      </w:r>
+    </w:p>
+    <w:p>
+      <w:pPr>
+        <w:pStyle w:val="SPBodyText"/>
+      </w:pPr>
+      <w:r>
+        <w:t>Our joys can become an offering.</w:t>
+      </w:r>
+    </w:p>
+    <w:p>
+      <w:pPr>
+        <w:pStyle w:val="SPBodyText"/>
+      </w:pPr>
+    </w:p>
+    <w:p>
+      <w:pPr>
+        <w:pStyle w:val="SPBodyText"/>
+      </w:pPr>
+      <w:r>
+        <w:t>Even our suffering can become an offering when it is united with Christ and entrusted to God.</w:t>
+      </w:r>
+    </w:p>
+    <w:p>
+      <w:pPr>
+        <w:pStyle w:val="SPBodyText"/>
       </w:pPr>
       <w:r>
         <w:lastRenderedPageBreak/>
-        <w:t>Scripture</w:t>
-      </w:r>
-    </w:p>
-    <w:p>
-      <w:pPr>
-        <w:pStyle w:val="SPSectionTitle"/>
-      </w:pPr>
-      <w:r>
-        <w:t>Reflection</w:t>
-      </w:r>
+        <w:t>This does not mean that every moment will feel holy. There will be distractions, frustrations, mistakes and moments when we forget the prayer we made that morning.</w:t>
+      </w:r>
+    </w:p>
+    <w:p>
+      <w:pPr>
+        <w:pStyle w:val="SPBodyText"/>
+      </w:pPr>
+      <w:r>
+        <w:t>That is why the offering is not a promise that we will have a perfect day.</w:t>
+      </w:r>
+    </w:p>
+    <w:p>
+      <w:pPr>
+        <w:pStyle w:val="SPBodyText"/>
+      </w:pPr>
+    </w:p>
+    <w:p>
+      <w:pPr>
+        <w:pStyle w:val="SPBodyText"/>
+      </w:pPr>
+      <w:r>
+        <w:t xml:space="preserve">It is an invitation to </w:t>
+      </w:r>
+      <w:r>
+        <w:rPr>
+          <w:b/>
+          <w:bCs/>
+        </w:rPr>
+        <w:t>return</w:t>
+      </w:r>
+      <w:r>
+        <w:t>.</w:t>
+      </w:r>
+    </w:p>
+    <w:p>
+      <w:pPr>
+        <w:pStyle w:val="SPBodyText"/>
+      </w:pPr>
+      <w:r>
+        <w:t>When we become impatient, we can return.</w:t>
+      </w:r>
+    </w:p>
+    <w:p>
+      <w:pPr>
+        <w:pStyle w:val="SPBodyText"/>
+      </w:pPr>
+      <w:r>
+        <w:t>When we become distracted, we can return.</w:t>
+      </w:r>
+    </w:p>
+    <w:p>
+      <w:pPr>
+        <w:pStyle w:val="SPBodyText"/>
+      </w:pPr>
+      <w:r>
+        <w:t>When something goes wrong, we can return.</w:t>
+      </w:r>
+    </w:p>
+    <w:p>
+      <w:pPr>
+        <w:pStyle w:val="SPBodyText"/>
+      </w:pPr>
+      <w:r>
+        <w:t>When something wonderful happens, we can return with gratitude.</w:t>
+      </w:r>
+    </w:p>
+    <w:p>
+      <w:pPr>
+        <w:pStyle w:val="SPBodyText"/>
+      </w:pPr>
+    </w:p>
+    <w:p>
+      <w:pPr>
+        <w:pStyle w:val="SPBodyText"/>
+      </w:pPr>
+      <w:r>
+        <w:t>The Morning Offering therefore does not end when the prayer ends. Its words can remain quietly in the background of the day, reminding us that even the ordinary can be given to God.</w:t>
+      </w:r>
+    </w:p>
+    <w:p>
+      <w:pPr>
+        <w:pStyle w:val="SPBodyText"/>
+      </w:pPr>
+      <w:r>
+        <w:t xml:space="preserve">Mary's </w:t>
+      </w:r>
+      <w:r>
+        <w:rPr>
+          <w:i/>
+          <w:iCs/>
+        </w:rPr>
+        <w:t>fiat</w:t>
+      </w:r>
+      <w:r>
+        <w:t xml:space="preserve"> gives us the perfect example: a simple and trusting response to God's will.</w:t>
+      </w:r>
+    </w:p>
+    <w:p>
+      <w:pPr>
+        <w:pStyle w:val="SPBodyText"/>
+      </w:pPr>
+      <w:r>
+        <w:t>We may not know what tomorrow holds. We may not even know what the next hour will bring.</w:t>
+      </w:r>
+    </w:p>
+    <w:p>
+      <w:pPr>
+        <w:pStyle w:val="SPBodyText"/>
+      </w:pPr>
+      <w:r>
+        <w:t>But we can offer God this moment.</w:t>
+      </w:r>
+    </w:p>
+    <w:p>
+      <w:pPr>
+        <w:pStyle w:val="SPBodyText"/>
+      </w:pPr>
+      <w:r>
+        <w:t>And then the next.</w:t>
+      </w:r>
+    </w:p>
+    <w:p>
+      <w:pPr>
+        <w:pStyle w:val="SPBodyText"/>
+      </w:pPr>
+      <w:r>
+        <w:t>And then the next.</w:t>
+      </w:r>
+    </w:p>
+    <w:p>
+      <w:pPr>
+        <w:pStyle w:val="SPBodyText"/>
+      </w:pPr>
+    </w:p>
+    <w:p>
+      <w:pPr>
+        <w:pStyle w:val="SPBodyText"/>
+      </w:pPr>
+      <w:r>
+        <w:lastRenderedPageBreak/>
+        <w:t>Perhaps that is what it means to make our whole life a prayer.</w:t>
+      </w:r>
+    </w:p>
+    <w:p>
+      <w:pPr>
+        <w:pStyle w:val="SPBodyText"/>
+      </w:pPr>
+      <w:r>
+        <w:t xml:space="preserve">Not that every moment is filled with religious words, but that </w:t>
+      </w:r>
+      <w:r>
+        <w:rPr>
+          <w:b/>
+          <w:bCs/>
+        </w:rPr>
+        <w:t>every moment can be turned towards God</w:t>
+      </w:r>
+      <w:r>
+        <w:t>.</w:t>
+      </w:r>
+    </w:p>
+    <w:p>
+      <w:pPr>
+        <w:pStyle w:val="SPBodyText"/>
+      </w:pPr>
+    </w:p>
+    <w:p>
+      <w:pPr>
+        <w:pStyle w:val="SPBodyText"/>
+      </w:pPr>
+      <w:proofErr w:type="gramStart"/>
+      <w:r>
+        <w:t>So</w:t>
+      </w:r>
+      <w:proofErr w:type="gramEnd"/>
+      <w:r>
+        <w:t xml:space="preserve"> begin simply.</w:t>
+      </w:r>
+    </w:p>
+    <w:p>
+      <w:pPr>
+        <w:pStyle w:val="SPBodyText"/>
+      </w:pPr>
+      <w:r>
+        <w:t>Give Him the day.</w:t>
+      </w:r>
+    </w:p>
+    <w:p>
+      <w:pPr>
+        <w:pStyle w:val="SPBodyText"/>
+      </w:pPr>
+      <w:r>
+        <w:t>Give Him your work.</w:t>
+      </w:r>
+    </w:p>
+    <w:p>
+      <w:pPr>
+        <w:pStyle w:val="SPBodyText"/>
+      </w:pPr>
+      <w:r>
+        <w:t>Give Him your joys.</w:t>
+      </w:r>
+    </w:p>
+    <w:p>
+      <w:pPr>
+        <w:pStyle w:val="SPBodyText"/>
+      </w:pPr>
+      <w:r>
+        <w:t>Give Him your difficulties.</w:t>
+      </w:r>
+    </w:p>
+    <w:p>
+      <w:pPr>
+        <w:pStyle w:val="SPBodyText"/>
+      </w:pPr>
+      <w:r>
+        <w:t>Give Him yourself.</w:t>
+      </w:r>
+    </w:p>
+    <w:p>
+      <w:pPr>
+        <w:pStyle w:val="SPBodyText"/>
+      </w:pPr>
+    </w:p>
+    <w:p>
+      <w:pPr>
+        <w:pStyle w:val="SPBodyText"/>
+      </w:pPr>
+      <w:r>
+        <w:t xml:space="preserve">And when the day is over, may we be able to look back and recognise that, even imperfectly, </w:t>
+      </w:r>
+      <w:r>
+        <w:rPr>
+          <w:b/>
+          <w:bCs/>
+        </w:rPr>
+        <w:t>we walked through it with God.</w:t>
+      </w:r>
+    </w:p>
+    <w:p>
+      <w:pPr>
+        <w:pStyle w:val="SPBodyText"/>
+        <w:sectPr>
+          <w:type w:val="oddPage"/>
+          <w:pgSz w:w="7920" w:h="12240" w:code="6"/>
+          <w:pgMar w:top="1080" w:right="864" w:bottom="1080" w:left="1152" w:header="576" w:footer="576" w:gutter="0"/>
+          <w:cols w:space="720"/>
+          <w:titlePg/>
+          <w:docGrid w:linePitch="360"/>
+        </w:sectPr>
+      </w:pPr>
+    </w:p>
+    <w:p>
+      <w:pPr>
+        <w:pStyle w:val="SPBodyText"/>
+        <w:jc w:val="center"/>
+        <w:rPr>
+          <w:rFonts w:ascii="Segoe UI Symbol" w:hAnsi="Segoe UI Symbol" w:cs="Segoe UI Symbol"/>
+        </w:rPr>
+      </w:pPr>
+      <w:r>
+        <w:rPr>
+          <w:rFonts w:ascii="Segoe UI Symbol" w:hAnsi="Segoe UI Symbol" w:cs="Segoe UI Symbol"/>
+        </w:rPr>
+        <w:lastRenderedPageBreak/>
+        <w:t>✠</w:t>
+      </w:r>
+    </w:p>
+    <w:p>
+      <w:pPr>
+        <w:pStyle w:val="SPBodyText"/>
+        <w:jc w:val="center"/>
+        <w:rPr>
+          <w:rFonts w:ascii="Segoe UI Symbol" w:hAnsi="Segoe UI Symbol" w:cs="Segoe UI Symbol"/>
+        </w:rPr>
+      </w:pPr>
+    </w:p>
+    <w:p>
+      <w:pPr>
+        <w:pStyle w:val="SPPrayerTitle"/>
+      </w:pPr>
+      <w:r>
+        <w:t>The Angelus</w:t>
+      </w:r>
+    </w:p>
+    <w:p>
+      <w:pPr>
+        <w:pStyle w:val="SPBodyText"/>
+      </w:pPr>
+    </w:p>
+    <w:p>
+      <w:pPr>
+        <w:pStyle w:val="SPBodyText"/>
+      </w:pPr>
+      <w:r>
+        <w:t xml:space="preserve">The </w:t>
+      </w:r>
+      <w:r>
+        <w:t xml:space="preserve">Angelus </w:t>
+      </w:r>
+      <w:r>
+        <w:t xml:space="preserve">recalls the </w:t>
+      </w:r>
+      <w:r>
+        <w:rPr>
+          <w:b/>
+          <w:bCs/>
+        </w:rPr>
+        <w:t>Annunciation</w:t>
+      </w:r>
+      <w:r>
+        <w:t xml:space="preserve">, when the Angel Gabriel announced to Mary that she would become the </w:t>
+      </w:r>
+      <w:proofErr w:type="gramStart"/>
+      <w:r>
+        <w:t>Mother</w:t>
+      </w:r>
+      <w:proofErr w:type="gramEnd"/>
+      <w:r>
+        <w:t xml:space="preserve"> of the Son of God.</w:t>
+      </w:r>
+    </w:p>
+    <w:p>
+      <w:pPr>
+        <w:pStyle w:val="SPBodyText"/>
+      </w:pPr>
+      <w:r>
+        <w:t xml:space="preserve">Through three short verses and responses, the prayer leads us through the mystery of the </w:t>
+      </w:r>
+      <w:r>
+        <w:rPr>
+          <w:b/>
+          <w:bCs/>
+        </w:rPr>
+        <w:t>Incarnation</w:t>
+      </w:r>
+      <w:r>
+        <w:t>: Mary hears the message of the angel, gives her consent to God's will, and the Word becomes flesh.</w:t>
+      </w:r>
+    </w:p>
+    <w:p>
+      <w:pPr>
+        <w:pStyle w:val="SPBodyText"/>
+      </w:pPr>
+      <w:r>
+        <w:t xml:space="preserve">Traditionally, the Angelus is prayed </w:t>
+      </w:r>
+      <w:r>
+        <w:rPr>
+          <w:b/>
+          <w:bCs/>
+        </w:rPr>
+        <w:t>three times each day</w:t>
+      </w:r>
+      <w:r>
+        <w:t>:</w:t>
+      </w:r>
+      <w:r>
+        <w:t xml:space="preserve"> </w:t>
+      </w:r>
+      <w:r>
+        <w:rPr>
+          <w:b/>
+          <w:bCs/>
+        </w:rPr>
+        <w:t>in the morning, at noon, and in the evening.</w:t>
+      </w:r>
+    </w:p>
+    <w:p>
+      <w:pPr>
+        <w:pStyle w:val="SPBodyText"/>
+      </w:pPr>
+      <w:r>
+        <w:t xml:space="preserve">The repeated prayer invites us to pause </w:t>
+      </w:r>
+      <w:proofErr w:type="gramStart"/>
+      <w:r>
+        <w:t>in the midst of</w:t>
+      </w:r>
+      <w:proofErr w:type="gramEnd"/>
+      <w:r>
+        <w:t xml:space="preserve"> ordinary life and remember the mystery at the heart of our faith:</w:t>
+      </w:r>
+      <w:r>
+        <w:t xml:space="preserve"> </w:t>
+      </w:r>
+      <w:r>
+        <w:rPr>
+          <w:b/>
+          <w:bCs/>
+        </w:rPr>
+        <w:t xml:space="preserve">“And the Word was made </w:t>
+      </w:r>
+      <w:proofErr w:type="gramStart"/>
+      <w:r>
+        <w:rPr>
+          <w:b/>
+          <w:bCs/>
+        </w:rPr>
+        <w:t>flesh, and</w:t>
+      </w:r>
+      <w:proofErr w:type="gramEnd"/>
+      <w:r>
+        <w:rPr>
+          <w:b/>
+          <w:bCs/>
+        </w:rPr>
+        <w:t xml:space="preserve"> dwelt among us.”</w:t>
+      </w:r>
+    </w:p>
+    <w:p>
+      <w:pPr>
+        <w:pStyle w:val="SPBodyText"/>
+      </w:pPr>
+      <w:r>
+        <w:t xml:space="preserve">It is a call to remember that </w:t>
+      </w:r>
+      <w:r>
+        <w:rPr>
+          <w:b/>
+          <w:bCs/>
+        </w:rPr>
+        <w:t>God came among us</w:t>
+      </w:r>
+      <w:r>
+        <w:t xml:space="preserve">, and that Mary's </w:t>
+      </w:r>
+      <w:r>
+        <w:rPr>
+          <w:i/>
+          <w:iCs/>
+        </w:rPr>
+        <w:t>fiat</w:t>
+      </w:r>
+      <w:r>
+        <w:t xml:space="preserve"> — her “let it be done” — opened the way for the Word to take flesh.</w:t>
+      </w:r>
+    </w:p>
+    <w:p>
+      <w:pPr>
+        <w:pStyle w:val="SPBodyText"/>
+      </w:pPr>
+      <w:r>
+        <w:t>When we pray the Angelus, we join our prayer to Mary's response:</w:t>
+      </w:r>
+    </w:p>
+    <w:p>
+      <w:pPr>
+        <w:pStyle w:val="SPBodyText"/>
+        <w:rPr>
+          <w:b/>
+          <w:bCs/>
+        </w:rPr>
+      </w:pPr>
+    </w:p>
+    <w:p>
+      <w:pPr>
+        <w:pStyle w:val="SPBodyText"/>
+        <w:rPr>
+          <w:b/>
+          <w:bCs/>
+        </w:rPr>
+        <w:sectPr>
+          <w:type w:val="oddPage"/>
+          <w:pgSz w:w="7920" w:h="12240" w:code="6"/>
+          <w:pgMar w:top="1080" w:right="864" w:bottom="1080" w:left="1152" w:header="576" w:footer="576" w:gutter="0"/>
+          <w:cols w:space="720"/>
+          <w:titlePg/>
+          <w:docGrid w:linePitch="360"/>
+        </w:sectPr>
+      </w:pPr>
+      <w:r>
+        <w:rPr>
+          <w:b/>
+          <w:bCs/>
+        </w:rPr>
+        <w:t>“Behold the handmaid of the Lord;</w:t>
+      </w:r>
+      <w:r>
+        <w:rPr>
+          <w:b/>
+          <w:bCs/>
+        </w:rPr>
+        <w:br/>
+        <w:t>be it done unto me according to your word.”</w:t>
+      </w:r>
+    </w:p>
+    <w:p>
+      <w:pPr>
+        <w:pStyle w:val="SPLanguage"/>
+        <w:spacing w:before="200"/>
+      </w:pPr>
+      <w:r>
+        <w:lastRenderedPageBreak/>
+        <w:t xml:space="preserve">ENGLISH </w:t>
+      </w:r>
+    </w:p>
+    <w:p>
+      <w:pPr>
+        <w:pStyle w:val="SPLanguage"/>
+      </w:pPr>
+    </w:p>
+    <w:p>
+      <w:pPr>
+        <w:pStyle w:val="SPPrayerEnglish"/>
+      </w:pPr>
+      <w:r>
+        <w:t>The Angel of the Lord declared unto Mary,</w:t>
+      </w:r>
+      <w:r>
+        <w:br/>
+      </w:r>
+      <w:r>
+        <w:t>a</w:t>
+      </w:r>
+      <w:r>
+        <w:t>nd she conceived of the Holy Spirit.</w:t>
+      </w:r>
+      <w:r>
+        <w:br/>
+      </w:r>
+      <w:r>
+        <w:rPr>
+          <w:b/>
+          <w:bCs/>
+        </w:rPr>
+        <w:t>Hail Mary…</w:t>
+      </w:r>
+    </w:p>
+    <w:p>
+      <w:pPr>
+        <w:pStyle w:val="SPPrayerEnglish"/>
+      </w:pPr>
+      <w:r>
+        <w:t>Behold the handmaid of the Lord,</w:t>
+      </w:r>
+      <w:r>
+        <w:br/>
+        <w:t>Be it done unto me according to your Word.</w:t>
+      </w:r>
+      <w:r>
+        <w:br/>
+      </w:r>
+      <w:r>
+        <w:rPr>
+          <w:b/>
+          <w:bCs/>
+        </w:rPr>
+        <w:t>Hail Mary…</w:t>
+      </w:r>
+    </w:p>
+    <w:p>
+      <w:pPr>
+        <w:pStyle w:val="SPPrayerEnglish"/>
+      </w:pPr>
+      <w:r>
+        <w:t>And the Word was made flesh,</w:t>
+      </w:r>
+      <w:r>
+        <w:br/>
+      </w:r>
+      <w:r>
+        <w:t>a</w:t>
+      </w:r>
+      <w:r>
+        <w:t>nd dwelt among us.</w:t>
+      </w:r>
+      <w:r>
+        <w:br/>
+      </w:r>
+      <w:r>
+        <w:rPr>
+          <w:b/>
+          <w:bCs/>
+        </w:rPr>
+        <w:t>Hail Mary…</w:t>
+      </w:r>
+    </w:p>
+    <w:p>
+      <w:pPr>
+        <w:pStyle w:val="SPPrayerEnglish"/>
+      </w:pPr>
+      <w:r>
+        <w:t>Pray for us, O holy Mother of God,</w:t>
+      </w:r>
+      <w:r>
+        <w:br/>
+      </w:r>
+      <w:r>
+        <w:t>t</w:t>
+      </w:r>
+      <w:r>
+        <w:t>hat we may be made worthy of the promises of Christ.</w:t>
+      </w:r>
+    </w:p>
+    <w:p>
+      <w:pPr>
+        <w:pStyle w:val="SPLanguage"/>
+        <w:sectPr>
+          <w:type w:val="evenPage"/>
+          <w:pgSz w:w="7920" w:h="12240" w:code="6"/>
+          <w:pgMar w:top="1080" w:right="864" w:bottom="1080" w:left="1152" w:header="576" w:footer="576" w:gutter="0"/>
+          <w:cols w:space="720"/>
+          <w:titlePg/>
+          <w:docGrid w:linePitch="360"/>
+        </w:sectPr>
+      </w:pPr>
+    </w:p>
+    <w:p>
+      <w:pPr>
+        <w:pStyle w:val="SPLanguage"/>
+      </w:pPr>
+      <w:r>
+        <w:lastRenderedPageBreak/>
+        <w:t>LATIN</w:t>
+      </w:r>
+    </w:p>
+    <w:p>
+      <w:pPr>
+        <w:pStyle w:val="SPPrayerLatin"/>
+      </w:pPr>
+    </w:p>
+    <w:p>
+      <w:pPr>
+        <w:pStyle w:val="SPPrayerLatin"/>
+      </w:pPr>
+      <w:r>
+        <w:t>Angelus Domini nuntiavit Mariae.</w:t>
+      </w:r>
+      <w:r>
+        <w:br/>
+      </w:r>
+      <w:r>
+        <w:t>e</w:t>
+      </w:r>
+      <w:r>
+        <w:t xml:space="preserve">t concepit de Spiritu Sancto. </w:t>
+      </w:r>
+    </w:p>
+    <w:p>
+      <w:pPr>
+        <w:pStyle w:val="SPPrayerLatin"/>
+        <w:rPr>
+          <w:b/>
+          <w:bCs/>
+        </w:rPr>
+      </w:pPr>
+      <w:r>
+        <w:rPr>
+          <w:b/>
+          <w:bCs/>
+        </w:rPr>
+        <w:t>Ave Maria…</w:t>
+      </w:r>
+    </w:p>
+    <w:p>
+      <w:pPr>
+        <w:pStyle w:val="SPPrayerLatin"/>
+      </w:pPr>
+      <w:r>
+        <w:t>Ecce ancilla Domini</w:t>
+      </w:r>
+      <w:r>
+        <w:t>,</w:t>
+      </w:r>
+      <w:r>
+        <w:br/>
+        <w:t xml:space="preserve">Fiat mihi secundum verbum tuum. </w:t>
+      </w:r>
+    </w:p>
+    <w:p>
+      <w:pPr>
+        <w:pStyle w:val="SPPrayerLatin"/>
+      </w:pPr>
+      <w:r>
+        <w:rPr>
+          <w:b/>
+          <w:bCs/>
+        </w:rPr>
+        <w:t>Ave Maria…</w:t>
+      </w:r>
+      <w:r>
+        <w:t xml:space="preserve"> </w:t>
+      </w:r>
+    </w:p>
+    <w:p>
+      <w:pPr>
+        <w:pStyle w:val="SPPrayerLatin"/>
+      </w:pPr>
+      <w:r>
+        <w:t>Et Verbum caro factum est.</w:t>
+      </w:r>
+      <w:r>
+        <w:br/>
+      </w:r>
+      <w:r>
+        <w:t>e</w:t>
+      </w:r>
+      <w:r>
+        <w:t>t habitavit in nobis.</w:t>
+      </w:r>
+      <w:r>
+        <w:rPr>
+          <w:b/>
+          <w:bCs/>
+        </w:rPr>
+        <w:t xml:space="preserve"> </w:t>
+      </w:r>
+    </w:p>
+    <w:p>
+      <w:pPr>
+        <w:pStyle w:val="SPPrayerLatin"/>
+        <w:rPr>
+          <w:b/>
+          <w:bCs/>
+        </w:rPr>
+      </w:pPr>
+      <w:r>
+        <w:rPr>
+          <w:b/>
+          <w:bCs/>
+        </w:rPr>
+        <w:t>Ave Maria…</w:t>
+      </w:r>
+    </w:p>
+    <w:p>
+      <w:pPr>
+        <w:pStyle w:val="SPPrayerLatin"/>
+      </w:pPr>
+      <w:r>
+        <w:t>Ora pro nobis, sancta Dei Genitrix.</w:t>
+      </w:r>
+      <w:r>
+        <w:br/>
+      </w:r>
+      <w:r>
+        <w:t>u</w:t>
+      </w:r>
+      <w:r>
+        <w:t>t digni efficiamur promissionibus Christi.</w:t>
+      </w:r>
+    </w:p>
+    <w:p>
+      <w:pPr>
+        <w:pStyle w:val="SPPrayerEnglish"/>
+      </w:pPr>
+    </w:p>
+    <w:p>
+      <w:pPr>
+        <w:pStyle w:val="SPLanguage"/>
+        <w:sectPr>
+          <w:type w:val="oddPage"/>
+          <w:pgSz w:w="7920" w:h="12240" w:code="6"/>
+          <w:pgMar w:top="1080" w:right="864" w:bottom="1080" w:left="1152" w:header="576" w:footer="576" w:gutter="0"/>
+          <w:cols w:space="720"/>
+          <w:titlePg/>
+          <w:docGrid w:linePitch="360"/>
+        </w:sectPr>
+      </w:pPr>
+    </w:p>
+    <w:p>
+      <w:pPr>
+        <w:pStyle w:val="SPLanguage"/>
+      </w:pPr>
+      <w:r>
+        <w:lastRenderedPageBreak/>
+        <w:t xml:space="preserve">ENGLISH </w:t>
+      </w:r>
+    </w:p>
+    <w:p>
+      <w:pPr>
+        <w:pStyle w:val="SPPrayerEnglish"/>
+      </w:pPr>
+    </w:p>
+    <w:p>
+      <w:pPr>
+        <w:pStyle w:val="SPPrayerEnglish"/>
+      </w:pPr>
+      <w:r>
+        <w:t>Let us pray.</w:t>
+      </w:r>
+      <w:r>
+        <w:t xml:space="preserve"> </w:t>
+      </w:r>
+    </w:p>
+    <w:p>
+      <w:pPr>
+        <w:pStyle w:val="SPPrayerEnglish"/>
+      </w:pPr>
+    </w:p>
+    <w:p>
+      <w:pPr>
+        <w:pStyle w:val="SPPrayerEnglish"/>
+      </w:pPr>
+      <w:r>
+        <w:t xml:space="preserve">Pour forth, we beseech Thee, O Lord, </w:t>
+      </w:r>
+      <w:proofErr w:type="gramStart"/>
+      <w:r>
+        <w:t>Thy</w:t>
+      </w:r>
+      <w:proofErr w:type="gramEnd"/>
+      <w:r>
+        <w:t xml:space="preserve"> grace into our hearts, that we to whom the Incarnation of Christ, Thy Son, was made known by the message of an angel, may by His Passion and Cross be brought to the glory of His resurrection. Through the same Christ our Lord. </w:t>
+      </w:r>
+    </w:p>
+    <w:p>
+      <w:pPr>
+        <w:pStyle w:val="SPPrayerEnglish"/>
+      </w:pPr>
+    </w:p>
+    <w:p>
+      <w:pPr>
+        <w:pStyle w:val="SPPrayerEnglish"/>
+      </w:pPr>
+      <w:r>
+        <w:t>Amen.</w:t>
+      </w:r>
+    </w:p>
+    <w:p>
+      <w:pPr>
+        <w:pStyle w:val="SPLanguage"/>
+        <w:sectPr>
+          <w:type w:val="evenPage"/>
+          <w:pgSz w:w="7920" w:h="12240" w:code="6"/>
+          <w:pgMar w:top="1080" w:right="864" w:bottom="1080" w:left="1152" w:header="576" w:footer="576" w:gutter="0"/>
+          <w:cols w:space="720"/>
+          <w:titlePg/>
+          <w:docGrid w:linePitch="360"/>
+        </w:sectPr>
+      </w:pPr>
+    </w:p>
+    <w:p>
+      <w:pPr>
+        <w:pStyle w:val="SPLanguage"/>
+      </w:pPr>
+      <w:r>
+        <w:lastRenderedPageBreak/>
+        <w:tab/>
+      </w:r>
+      <w:r>
+        <w:t>LATIN</w:t>
+      </w:r>
+    </w:p>
+    <w:p>
+      <w:pPr>
+        <w:pStyle w:val="SPPrayerEnglish"/>
+        <w:tabs>
+          <w:tab w:val="left" w:pos="2707"/>
+          <w:tab w:val="center" w:pos="2952"/>
+        </w:tabs>
+        <w:jc w:val="left"/>
+      </w:pPr>
+      <w:r>
+        <w:tab/>
+      </w:r>
+    </w:p>
+    <w:p>
+      <w:pPr>
+        <w:pStyle w:val="SPPrayerLatin"/>
+      </w:pPr>
+      <w:r>
+        <w:t>Oremus.</w:t>
+      </w:r>
+    </w:p>
+    <w:p>
+      <w:pPr>
+        <w:pStyle w:val="SPPrayerLatin"/>
+      </w:pPr>
+    </w:p>
+    <w:p>
+      <w:pPr>
+        <w:pStyle w:val="SPPrayerLatin"/>
+      </w:pPr>
+      <w:r>
+        <w:t xml:space="preserve">Gratiam tuam, quaesumus, Domine, mentibus nostris infunde: ut qui, Angelo nuntiante, Christi Filii tui incarnationem cognovimus, per passionem eius et crucem ad resurrectionis gloriam perducamur. Per eundem Christum Dominum nostrum. </w:t>
+      </w:r>
+    </w:p>
+    <w:p>
+      <w:pPr>
+        <w:pStyle w:val="SPPrayerLatin"/>
+      </w:pPr>
+    </w:p>
+    <w:p>
+      <w:pPr>
+        <w:pStyle w:val="SPPrayerLatin"/>
+        <w:spacing w:before="600"/>
+      </w:pPr>
+      <w:r>
+        <w:t>Amen.</w:t>
+      </w:r>
+    </w:p>
+    <w:p>
+      <w:pPr>
+        <w:pStyle w:val="SPPrayerLatin"/>
+      </w:pPr>
     </w:p>
     <w:p>
       <w:pPr>
@@ -13003,864 +12933,6 @@
           <w:docGrid w:linePitch="360"/>
         </w:sectPr>
       </w:pPr>
-      <w:r>
-        <w:t>Reflection</w:t>
-      </w:r>
-    </w:p>
-    <w:p>
-      <w:pPr>
-        <w:pStyle w:val="SPBodyText"/>
-        <w:jc w:val="center"/>
-        <w:rPr>
-          <w:rFonts w:ascii="Segoe UI Symbol" w:hAnsi="Segoe UI Symbol" w:cs="Segoe UI Symbol"/>
-        </w:rPr>
-      </w:pPr>
-      <w:r>
-        <w:rPr>
-          <w:rFonts w:ascii="Segoe UI Symbol" w:hAnsi="Segoe UI Symbol" w:cs="Segoe UI Symbol"/>
-        </w:rPr>
-        <w:lastRenderedPageBreak/>
-        <w:t>✠</w:t>
-      </w:r>
-    </w:p>
-    <w:p>
-      <w:pPr>
-        <w:pStyle w:val="SPBodyText"/>
-        <w:jc w:val="center"/>
-        <w:rPr>
-          <w:rFonts w:ascii="Segoe UI Symbol" w:hAnsi="Segoe UI Symbol" w:cs="Segoe UI Symbol"/>
-        </w:rPr>
-      </w:pPr>
-    </w:p>
-    <w:p>
-      <w:pPr>
-        <w:pStyle w:val="SPPrayerTitle"/>
-      </w:pPr>
-      <w:r>
-        <w:t xml:space="preserve">The </w:t>
-      </w:r>
-      <w:r>
-        <w:t>Angelus</w:t>
-      </w:r>
-    </w:p>
-    <w:p>
-      <w:pPr>
-        <w:pStyle w:val="SPBodyText"/>
-      </w:pPr>
-    </w:p>
-    <w:p>
-      <w:pPr>
-        <w:pStyle w:val="SPBodyText"/>
-      </w:pPr>
-      <w:r>
-        <w:t xml:space="preserve">The </w:t>
-      </w:r>
-      <w:r>
-        <w:t xml:space="preserve">Angelus </w:t>
-      </w:r>
-      <w:r>
-        <w:t xml:space="preserve">recalls the </w:t>
-      </w:r>
-      <w:r>
-        <w:rPr>
-          <w:b/>
-          <w:bCs/>
-        </w:rPr>
-        <w:t>Annunciation</w:t>
-      </w:r>
-      <w:r>
-        <w:t xml:space="preserve">, when the Angel Gabriel announced to Mary that she would become the </w:t>
-      </w:r>
-      <w:proofErr w:type="gramStart"/>
-      <w:r>
-        <w:t>Mother</w:t>
-      </w:r>
-      <w:proofErr w:type="gramEnd"/>
-      <w:r>
-        <w:t xml:space="preserve"> of the Son of God.</w:t>
-      </w:r>
-    </w:p>
-    <w:p>
-      <w:pPr>
-        <w:pStyle w:val="SPBodyText"/>
-      </w:pPr>
-      <w:r>
-        <w:t xml:space="preserve">Through three short verses and responses, the prayer leads us through the mystery of the </w:t>
-      </w:r>
-      <w:r>
-        <w:rPr>
-          <w:b/>
-          <w:bCs/>
-        </w:rPr>
-        <w:t>Incarnation</w:t>
-      </w:r>
-      <w:r>
-        <w:t>: Mary hears the message of the angel, gives her consent to God's will, and the Word becomes flesh.</w:t>
-      </w:r>
-    </w:p>
-    <w:p>
-      <w:pPr>
-        <w:pStyle w:val="SPBodyText"/>
-      </w:pPr>
-      <w:r>
-        <w:t xml:space="preserve">Traditionally, the Angelus is prayed </w:t>
-      </w:r>
-      <w:r>
-        <w:rPr>
-          <w:b/>
-          <w:bCs/>
-        </w:rPr>
-        <w:t>three times each day</w:t>
-      </w:r>
-      <w:r>
-        <w:t>:</w:t>
-      </w:r>
-      <w:r>
-        <w:t xml:space="preserve"> </w:t>
-      </w:r>
-      <w:r>
-        <w:rPr>
-          <w:b/>
-          <w:bCs/>
-        </w:rPr>
-        <w:t>in the morning, at noon, and in the evening.</w:t>
-      </w:r>
-    </w:p>
-    <w:p>
-      <w:pPr>
-        <w:pStyle w:val="SPBodyText"/>
-      </w:pPr>
-      <w:r>
-        <w:t xml:space="preserve">The repeated prayer invites us to pause </w:t>
-      </w:r>
-      <w:proofErr w:type="gramStart"/>
-      <w:r>
-        <w:t>in the midst of</w:t>
-      </w:r>
-      <w:proofErr w:type="gramEnd"/>
-      <w:r>
-        <w:t xml:space="preserve"> ordinary life and remember the mystery at the heart of our faith:</w:t>
-      </w:r>
-      <w:r>
-        <w:t xml:space="preserve"> </w:t>
-      </w:r>
-      <w:r>
-        <w:rPr>
-          <w:b/>
-          <w:bCs/>
-        </w:rPr>
-        <w:t xml:space="preserve">“And the Word was made </w:t>
-      </w:r>
-      <w:proofErr w:type="gramStart"/>
-      <w:r>
-        <w:rPr>
-          <w:b/>
-          <w:bCs/>
-        </w:rPr>
-        <w:t>flesh, and</w:t>
-      </w:r>
-      <w:proofErr w:type="gramEnd"/>
-      <w:r>
-        <w:rPr>
-          <w:b/>
-          <w:bCs/>
-        </w:rPr>
-        <w:t xml:space="preserve"> dwelt among us.”</w:t>
-      </w:r>
-    </w:p>
-    <w:p>
-      <w:pPr>
-        <w:pStyle w:val="SPBodyText"/>
-      </w:pPr>
-      <w:r>
-        <w:t xml:space="preserve">It is a call to remember that </w:t>
-      </w:r>
-      <w:r>
-        <w:rPr>
-          <w:b/>
-          <w:bCs/>
-        </w:rPr>
-        <w:t>God came among us</w:t>
-      </w:r>
-      <w:r>
-        <w:t xml:space="preserve">, and that Mary's </w:t>
-      </w:r>
-      <w:r>
-        <w:rPr>
-          <w:i/>
-          <w:iCs/>
-        </w:rPr>
-        <w:t>fiat</w:t>
-      </w:r>
-      <w:r>
-        <w:t xml:space="preserve"> — her “let it be done” — opened the way for the Word to take flesh.</w:t>
-      </w:r>
-    </w:p>
-    <w:p>
-      <w:pPr>
-        <w:pStyle w:val="SPBodyText"/>
-      </w:pPr>
-      <w:r>
-        <w:t>When we pray the Angelus, we join our prayer to Mary's response:</w:t>
-      </w:r>
-    </w:p>
-    <w:p>
-      <w:pPr>
-        <w:pStyle w:val="SPBodyText"/>
-        <w:rPr>
-          <w:b/>
-          <w:bCs/>
-        </w:rPr>
-      </w:pPr>
-    </w:p>
-    <w:p>
-      <w:pPr>
-        <w:pStyle w:val="SPBodyText"/>
-        <w:rPr>
-          <w:b/>
-          <w:bCs/>
-        </w:rPr>
-        <w:sectPr>
-          <w:type w:val="oddPage"/>
-          <w:pgSz w:w="7920" w:h="12240" w:code="6"/>
-          <w:pgMar w:top="1080" w:right="864" w:bottom="1080" w:left="1152" w:header="576" w:footer="576" w:gutter="0"/>
-          <w:cols w:space="720"/>
-          <w:titlePg/>
-          <w:docGrid w:linePitch="360"/>
-        </w:sectPr>
-      </w:pPr>
-      <w:r>
-        <w:rPr>
-          <w:b/>
-          <w:bCs/>
-        </w:rPr>
-        <w:t>“Behold the handmaid of the Lord;</w:t>
-      </w:r>
-      <w:r>
-        <w:rPr>
-          <w:b/>
-          <w:bCs/>
-        </w:rPr>
-        <w:br/>
-        <w:t>be it done unto me according to your word.”</w:t>
-      </w:r>
-    </w:p>
-    <w:p>
-      <w:pPr>
-        <w:pStyle w:val="SPLanguage"/>
-        <w:spacing w:before="200"/>
-      </w:pPr>
-      <w:r>
-        <w:lastRenderedPageBreak/>
-        <w:t xml:space="preserve">ENGLISH </w:t>
-      </w:r>
-    </w:p>
-    <w:p>
-      <w:pPr>
-        <w:pStyle w:val="SPLanguage"/>
-      </w:pPr>
-    </w:p>
-    <w:p>
-      <w:pPr>
-        <w:pStyle w:val="SPPrayerEnglish"/>
-      </w:pPr>
-      <w:r>
-        <w:t>The Angel of the Lord declared unto Mary,</w:t>
-      </w:r>
-      <w:r>
-        <w:br/>
-      </w:r>
-      <w:r>
-        <w:t>a</w:t>
-      </w:r>
-      <w:r>
-        <w:t>nd she conceived of the Holy Spirit.</w:t>
-      </w:r>
-      <w:r>
-        <w:br/>
-      </w:r>
-      <w:r>
-        <w:rPr>
-          <w:b/>
-          <w:bCs/>
-        </w:rPr>
-        <w:t>Hail Mary…</w:t>
-      </w:r>
-    </w:p>
-    <w:p>
-      <w:pPr>
-        <w:pStyle w:val="SPPrayerEnglish"/>
-      </w:pPr>
-      <w:r>
-        <w:t>Behold the handmaid of the Lord,</w:t>
-      </w:r>
-      <w:r>
-        <w:br/>
-        <w:t>Be it done unto me according to your Word.</w:t>
-      </w:r>
-      <w:r>
-        <w:br/>
-      </w:r>
-      <w:r>
-        <w:rPr>
-          <w:b/>
-          <w:bCs/>
-        </w:rPr>
-        <w:t>Hail Mary…</w:t>
-      </w:r>
-    </w:p>
-    <w:p>
-      <w:pPr>
-        <w:pStyle w:val="SPPrayerEnglish"/>
-      </w:pPr>
-      <w:r>
-        <w:t>And the Word was made flesh,</w:t>
-      </w:r>
-      <w:r>
-        <w:br/>
-      </w:r>
-      <w:r>
-        <w:t>a</w:t>
-      </w:r>
-      <w:r>
-        <w:t>nd dwelt among us.</w:t>
-      </w:r>
-      <w:r>
-        <w:br/>
-      </w:r>
-      <w:r>
-        <w:rPr>
-          <w:b/>
-          <w:bCs/>
-        </w:rPr>
-        <w:t>Hail Mary…</w:t>
-      </w:r>
-    </w:p>
-    <w:p>
-      <w:pPr>
-        <w:pStyle w:val="SPPrayerEnglish"/>
-      </w:pPr>
-      <w:r>
-        <w:t>Pray for us, O holy Mother of God,</w:t>
-      </w:r>
-      <w:r>
-        <w:br/>
-      </w:r>
-      <w:r>
-        <w:t>t</w:t>
-      </w:r>
-      <w:r>
-        <w:t>hat we may be made worthy of the promises of Christ.</w:t>
-      </w:r>
-    </w:p>
-    <w:p>
-      <w:pPr>
-        <w:pStyle w:val="SPLanguage"/>
-        <w:sectPr>
-          <w:type w:val="evenPage"/>
-          <w:pgSz w:w="7920" w:h="12240" w:code="6"/>
-          <w:pgMar w:top="1080" w:right="864" w:bottom="1080" w:left="1152" w:header="576" w:footer="576" w:gutter="0"/>
-          <w:cols w:space="720"/>
-          <w:titlePg/>
-          <w:docGrid w:linePitch="360"/>
-        </w:sectPr>
-      </w:pPr>
-    </w:p>
-    <w:p>
-      <w:pPr>
-        <w:pStyle w:val="SPLanguage"/>
-      </w:pPr>
-      <w:r>
-        <w:lastRenderedPageBreak/>
-        <w:t>LATIN</w:t>
-      </w:r>
-    </w:p>
-    <w:p>
-      <w:pPr>
-        <w:pStyle w:val="SPPrayerLatin"/>
-      </w:pPr>
-    </w:p>
-    <w:p>
-      <w:pPr>
-        <w:pStyle w:val="SPPrayerLatin"/>
-      </w:pPr>
-      <w:r>
-        <w:t xml:space="preserve">Angelus Domini </w:t>
-      </w:r>
-      <w:proofErr w:type="spellStart"/>
-      <w:r>
-        <w:t>nuntiavit</w:t>
-      </w:r>
-      <w:proofErr w:type="spellEnd"/>
-      <w:r>
-        <w:t xml:space="preserve"> Mariae.</w:t>
-      </w:r>
-      <w:r>
-        <w:br/>
-      </w:r>
-      <w:r>
-        <w:t>e</w:t>
-      </w:r>
-      <w:r>
-        <w:t xml:space="preserve">t </w:t>
-      </w:r>
-      <w:proofErr w:type="spellStart"/>
-      <w:r>
-        <w:t>concepit</w:t>
-      </w:r>
-      <w:proofErr w:type="spellEnd"/>
-      <w:r>
-        <w:t xml:space="preserve"> de </w:t>
-      </w:r>
-      <w:proofErr w:type="spellStart"/>
-      <w:r>
-        <w:t>Spiritu</w:t>
-      </w:r>
-      <w:proofErr w:type="spellEnd"/>
-      <w:r>
-        <w:t xml:space="preserve"> Sancto. </w:t>
-      </w:r>
-    </w:p>
-    <w:p>
-      <w:pPr>
-        <w:pStyle w:val="SPPrayerLatin"/>
-        <w:rPr>
-          <w:b/>
-          <w:bCs/>
-        </w:rPr>
-      </w:pPr>
-      <w:r>
-        <w:rPr>
-          <w:b/>
-          <w:bCs/>
-        </w:rPr>
-        <w:t>Ave Maria…</w:t>
-      </w:r>
-    </w:p>
-    <w:p>
-      <w:pPr>
-        <w:pStyle w:val="SPPrayerLatin"/>
-      </w:pPr>
-      <w:r>
-        <w:t>Ecce ancilla Domini</w:t>
-      </w:r>
-      <w:r>
-        <w:t>,</w:t>
-      </w:r>
-      <w:r>
-        <w:br/>
-        <w:t xml:space="preserve">Fiat mihi secundum verbum tuum. </w:t>
-      </w:r>
-    </w:p>
-    <w:p>
-      <w:pPr>
-        <w:pStyle w:val="SPPrayerLatin"/>
-      </w:pPr>
-      <w:r>
-        <w:rPr>
-          <w:b/>
-          <w:bCs/>
-        </w:rPr>
-        <w:t>Ave Maria…</w:t>
-      </w:r>
-      <w:r>
-        <w:t xml:space="preserve"> </w:t>
-      </w:r>
-    </w:p>
-    <w:p>
-      <w:pPr>
-        <w:pStyle w:val="SPPrayerLatin"/>
-      </w:pPr>
-      <w:r>
-        <w:t xml:space="preserve">Et Verbum </w:t>
-      </w:r>
-      <w:proofErr w:type="spellStart"/>
-      <w:r>
-        <w:t>caro</w:t>
-      </w:r>
-      <w:proofErr w:type="spellEnd"/>
-      <w:r>
-        <w:t xml:space="preserve"> factum est.</w:t>
-      </w:r>
-      <w:r>
-        <w:br/>
-      </w:r>
-      <w:r>
-        <w:t>e</w:t>
-      </w:r>
-      <w:r>
-        <w:t xml:space="preserve">t </w:t>
-      </w:r>
-      <w:proofErr w:type="spellStart"/>
-      <w:r>
-        <w:t>habitavit</w:t>
-      </w:r>
-      <w:proofErr w:type="spellEnd"/>
-      <w:r>
-        <w:t xml:space="preserve"> in nobis.</w:t>
-      </w:r>
-      <w:r>
-        <w:rPr>
-          <w:b/>
-          <w:bCs/>
-        </w:rPr>
-        <w:t xml:space="preserve"> </w:t>
-      </w:r>
-    </w:p>
-    <w:p>
-      <w:pPr>
-        <w:pStyle w:val="SPPrayerLatin"/>
-        <w:rPr>
-          <w:b/>
-          <w:bCs/>
-        </w:rPr>
-      </w:pPr>
-      <w:r>
-        <w:rPr>
-          <w:b/>
-          <w:bCs/>
-        </w:rPr>
-        <w:t>Ave Maria…</w:t>
-      </w:r>
-    </w:p>
-    <w:p>
-      <w:pPr>
-        <w:pStyle w:val="SPPrayerLatin"/>
-      </w:pPr>
-      <w:r>
-        <w:t>Ora pro nobis, sancta Dei Genitrix.</w:t>
-      </w:r>
-      <w:r>
-        <w:br/>
-      </w:r>
-      <w:proofErr w:type="spellStart"/>
-      <w:r>
-        <w:t>u</w:t>
-      </w:r>
-      <w:r>
-        <w:t>t</w:t>
-      </w:r>
-      <w:proofErr w:type="spellEnd"/>
-      <w:r>
-        <w:t xml:space="preserve"> </w:t>
-      </w:r>
-      <w:proofErr w:type="spellStart"/>
-      <w:r>
-        <w:t>digni</w:t>
-      </w:r>
-      <w:proofErr w:type="spellEnd"/>
-      <w:r>
-        <w:t xml:space="preserve"> </w:t>
-      </w:r>
-      <w:proofErr w:type="spellStart"/>
-      <w:r>
-        <w:t>efficiamur</w:t>
-      </w:r>
-      <w:proofErr w:type="spellEnd"/>
-      <w:r>
-        <w:t xml:space="preserve"> </w:t>
-      </w:r>
-      <w:proofErr w:type="spellStart"/>
-      <w:r>
-        <w:t>promissionibus</w:t>
-      </w:r>
-      <w:proofErr w:type="spellEnd"/>
-      <w:r>
-        <w:t xml:space="preserve"> Christi.</w:t>
-      </w:r>
-    </w:p>
-    <w:p>
-      <w:pPr>
-        <w:pStyle w:val="SPPrayerEnglish"/>
-      </w:pPr>
-    </w:p>
-    <w:p>
-      <w:pPr>
-        <w:pStyle w:val="SPLanguage"/>
-        <w:sectPr>
-          <w:type w:val="oddPage"/>
-          <w:pgSz w:w="7920" w:h="12240" w:code="6"/>
-          <w:pgMar w:top="1080" w:right="864" w:bottom="1080" w:left="1152" w:header="576" w:footer="576" w:gutter="0"/>
-          <w:cols w:space="720"/>
-          <w:titlePg/>
-          <w:docGrid w:linePitch="360"/>
-        </w:sectPr>
-      </w:pPr>
-    </w:p>
-    <w:p>
-      <w:pPr>
-        <w:pStyle w:val="SPLanguage"/>
-      </w:pPr>
-      <w:r>
-        <w:lastRenderedPageBreak/>
-        <w:t xml:space="preserve">ENGLISH </w:t>
-      </w:r>
-    </w:p>
-    <w:p>
-      <w:pPr>
-        <w:pStyle w:val="SPPrayerEnglish"/>
-      </w:pPr>
-    </w:p>
-    <w:p>
-      <w:pPr>
-        <w:pStyle w:val="SPPrayerEnglish"/>
-      </w:pPr>
-      <w:r>
-        <w:t>Let us pray.</w:t>
-      </w:r>
-      <w:r>
-        <w:t xml:space="preserve"> </w:t>
-      </w:r>
-    </w:p>
-    <w:p>
-      <w:pPr>
-        <w:pStyle w:val="SPPrayerEnglish"/>
-      </w:pPr>
-    </w:p>
-    <w:p>
-      <w:pPr>
-        <w:pStyle w:val="SPPrayerEnglish"/>
-      </w:pPr>
-      <w:r>
-        <w:t xml:space="preserve">Pour forth, we beseech Thee, O Lord, </w:t>
-      </w:r>
-      <w:proofErr w:type="gramStart"/>
-      <w:r>
-        <w:t>Thy</w:t>
-      </w:r>
-      <w:proofErr w:type="gramEnd"/>
-      <w:r>
-        <w:t xml:space="preserve"> grace into our hearts, that we to whom the Incarnation of Christ, Thy Son, was made known by the message of an angel, may by His Passion and Cross be brought to the glory of His resurrection. Through the same Christ our Lord. </w:t>
-      </w:r>
-    </w:p>
-    <w:p>
-      <w:pPr>
-        <w:pStyle w:val="SPPrayerEnglish"/>
-      </w:pPr>
-    </w:p>
-    <w:p>
-      <w:pPr>
-        <w:pStyle w:val="SPPrayerEnglish"/>
-      </w:pPr>
-      <w:r>
-        <w:t>Amen.</w:t>
-      </w:r>
-    </w:p>
-    <w:p>
-      <w:pPr>
-        <w:pStyle w:val="SPLanguage"/>
-        <w:sectPr>
-          <w:type w:val="evenPage"/>
-          <w:pgSz w:w="7920" w:h="12240" w:code="6"/>
-          <w:pgMar w:top="1080" w:right="864" w:bottom="1080" w:left="1152" w:header="576" w:footer="576" w:gutter="0"/>
-          <w:cols w:space="720"/>
-          <w:titlePg/>
-          <w:docGrid w:linePitch="360"/>
-        </w:sectPr>
-      </w:pPr>
-    </w:p>
-    <w:p>
-      <w:pPr>
-        <w:pStyle w:val="SPLanguage"/>
-      </w:pPr>
-      <w:r>
-        <w:lastRenderedPageBreak/>
-        <w:tab/>
-      </w:r>
-      <w:r>
-        <w:t>LATIN</w:t>
-      </w:r>
-    </w:p>
-    <w:p>
-      <w:pPr>
-        <w:pStyle w:val="SPPrayerEnglish"/>
-        <w:tabs>
-          <w:tab w:val="left" w:pos="2707"/>
-          <w:tab w:val="center" w:pos="2952"/>
-        </w:tabs>
-        <w:jc w:val="left"/>
-      </w:pPr>
-      <w:r>
-        <w:tab/>
-      </w:r>
-    </w:p>
-    <w:p>
-      <w:pPr>
-        <w:pStyle w:val="SPPrayerLatin"/>
-      </w:pPr>
-      <w:r>
-        <w:t>Oremus.</w:t>
-      </w:r>
-    </w:p>
-    <w:p>
-      <w:pPr>
-        <w:pStyle w:val="SPPrayerLatin"/>
-      </w:pPr>
-    </w:p>
-    <w:p>
-      <w:pPr>
-        <w:pStyle w:val="SPPrayerLatin"/>
-      </w:pPr>
-      <w:proofErr w:type="spellStart"/>
-      <w:r>
-        <w:t>Gratiam</w:t>
-      </w:r>
-      <w:proofErr w:type="spellEnd"/>
-      <w:r>
-        <w:t xml:space="preserve"> </w:t>
-      </w:r>
-      <w:proofErr w:type="spellStart"/>
-      <w:r>
-        <w:t>tuam</w:t>
-      </w:r>
-      <w:proofErr w:type="spellEnd"/>
-      <w:r>
-        <w:t xml:space="preserve">, </w:t>
-      </w:r>
-      <w:proofErr w:type="spellStart"/>
-      <w:r>
-        <w:t>quaesumus</w:t>
-      </w:r>
-      <w:proofErr w:type="spellEnd"/>
-      <w:r>
-        <w:t xml:space="preserve">, Domine, </w:t>
-      </w:r>
-      <w:proofErr w:type="spellStart"/>
-      <w:r>
-        <w:t>mentibus</w:t>
-      </w:r>
-      <w:proofErr w:type="spellEnd"/>
-      <w:r>
-        <w:t xml:space="preserve"> </w:t>
-      </w:r>
-      <w:proofErr w:type="spellStart"/>
-      <w:r>
-        <w:t>nostris</w:t>
-      </w:r>
-      <w:proofErr w:type="spellEnd"/>
-      <w:r>
-        <w:t xml:space="preserve"> </w:t>
-      </w:r>
-      <w:proofErr w:type="spellStart"/>
-      <w:r>
-        <w:t>infunde</w:t>
-      </w:r>
-      <w:proofErr w:type="spellEnd"/>
-      <w:r>
-        <w:t xml:space="preserve">: </w:t>
-      </w:r>
-      <w:proofErr w:type="spellStart"/>
-      <w:r>
-        <w:t>ut</w:t>
-      </w:r>
-      <w:proofErr w:type="spellEnd"/>
-      <w:r>
-        <w:t xml:space="preserve"> qui, Angelo </w:t>
-      </w:r>
-      <w:proofErr w:type="spellStart"/>
-      <w:r>
-        <w:t>nuntiante</w:t>
-      </w:r>
-      <w:proofErr w:type="spellEnd"/>
-      <w:r>
-        <w:t xml:space="preserve">, Christi Filii tui </w:t>
-      </w:r>
-      <w:proofErr w:type="spellStart"/>
-      <w:r>
-        <w:t>incarnationem</w:t>
-      </w:r>
-      <w:proofErr w:type="spellEnd"/>
-      <w:r>
-        <w:t xml:space="preserve"> </w:t>
-      </w:r>
-      <w:proofErr w:type="spellStart"/>
-      <w:r>
-        <w:t>cognovimus</w:t>
-      </w:r>
-      <w:proofErr w:type="spellEnd"/>
-      <w:r>
-        <w:t xml:space="preserve">, per </w:t>
-      </w:r>
-      <w:proofErr w:type="spellStart"/>
-      <w:r>
-        <w:t>passionem</w:t>
-      </w:r>
-      <w:proofErr w:type="spellEnd"/>
-      <w:r>
-        <w:t xml:space="preserve"> eius et </w:t>
-      </w:r>
-      <w:proofErr w:type="spellStart"/>
-      <w:r>
-        <w:t>crucem</w:t>
-      </w:r>
-      <w:proofErr w:type="spellEnd"/>
-      <w:r>
-        <w:t xml:space="preserve"> </w:t>
-      </w:r>
-      <w:proofErr w:type="spellStart"/>
-      <w:r>
-        <w:t>ad</w:t>
-      </w:r>
-      <w:proofErr w:type="spellEnd"/>
-      <w:r>
-        <w:t xml:space="preserve"> </w:t>
-      </w:r>
-      <w:proofErr w:type="spellStart"/>
-      <w:r>
-        <w:t>resurrectionis</w:t>
-      </w:r>
-      <w:proofErr w:type="spellEnd"/>
-      <w:r>
-        <w:t xml:space="preserve"> gloriam </w:t>
-      </w:r>
-      <w:proofErr w:type="spellStart"/>
-      <w:r>
-        <w:t>perducamur</w:t>
-      </w:r>
-      <w:proofErr w:type="spellEnd"/>
-      <w:r>
-        <w:t xml:space="preserve">. Per eundem Christum </w:t>
-      </w:r>
-      <w:proofErr w:type="spellStart"/>
-      <w:r>
-        <w:t>Dominum</w:t>
-      </w:r>
-      <w:proofErr w:type="spellEnd"/>
-      <w:r>
-        <w:t xml:space="preserve"> nostrum. </w:t>
-      </w:r>
-    </w:p>
-    <w:p>
-      <w:pPr>
-        <w:pStyle w:val="SPPrayerLatin"/>
-      </w:pPr>
-    </w:p>
-    <w:p>
-      <w:pPr>
-        <w:pStyle w:val="SPPrayerLatin"/>
-        <w:spacing w:before="600"/>
-      </w:pPr>
-      <w:r>
-        <w:t>Amen.</w:t>
-      </w:r>
-    </w:p>
-    <w:p>
-      <w:pPr>
-        <w:pStyle w:val="SPPrayerLatin"/>
-      </w:pPr>
-    </w:p>
-    <w:p>
-      <w:pPr>
-        <w:pStyle w:val="SPSectionTitle"/>
-        <w:sectPr>
-          <w:type w:val="oddPage"/>
-          <w:pgSz w:w="7920" w:h="12240" w:code="6"/>
-          <w:pgMar w:top="1080" w:right="864" w:bottom="1080" w:left="1152" w:header="576" w:footer="576" w:gutter="0"/>
-          <w:cols w:space="720"/>
-          <w:titlePg/>
-          <w:docGrid w:linePitch="360"/>
-        </w:sectPr>
-      </w:pPr>
     </w:p>
     <w:p>
       <w:pPr>
@@ -13941,10 +13013,7 @@
         <w:pStyle w:val="SPScripture"/>
       </w:pPr>
       <w:r>
-        <w:t xml:space="preserve">And </w:t>
-      </w:r>
-      <w:r>
-        <w:t>the Word became flesh and dwelt among us, full of grace and truth, we have beheld his glory, glory as the only begotten Son from the Father.</w:t>
+        <w:t>And the Word became flesh and dwelt among us, full of grace and truth, we have beheld his glory, glory as the only begotten Son from the Father.</w:t>
       </w:r>
     </w:p>
     <w:p>

</xml_diff>

<commit_message>
Added initial book cover for vol1
</commit_message>
<xml_diff>
--- a/manuscript/volume-1/sacrae-preces-volume-1.docx
+++ b/manuscript/volume-1/sacrae-preces-volume-1.docx
@@ -443,15 +443,7 @@
         <w:pStyle w:val="SPBodyText"/>
       </w:pPr>
       <w:r>
-        <w:t xml:space="preserve">We can spend our days surrounded by noise, responsibilities, conversations, messages, and countless things competing for our attention. </w:t>
-      </w:r>
-      <w:proofErr w:type="gramStart"/>
-      <w:r>
-        <w:t>In the midst of</w:t>
-      </w:r>
-      <w:proofErr w:type="gramEnd"/>
-      <w:r>
-        <w:t xml:space="preserve"> all of this, prayer calls us to stop. To become still. To turn our hearts towards God.</w:t>
+        <w:t>We can spend our days surrounded by noise, responsibilities, conversations, messages, and countless things competing for our attention. In the midst of all of this, prayer calls us to stop. To become still. To turn our hearts towards God.</w:t>
       </w:r>
     </w:p>
     <w:p>
@@ -535,15 +527,7 @@
         <w:t>"Sacred Prayers."</w:t>
       </w:r>
       <w:r>
-        <w:t xml:space="preserve"> The name reflects something simple: these prayers are part of a rich inheritance that has been handed down through the life of the Church. They belong not merely to one generation, one country, or one language. They have crossed centuries and borders, carried by ordinary people who have sought God </w:t>
-      </w:r>
-      <w:proofErr w:type="gramStart"/>
-      <w:r>
-        <w:t>in the midst of</w:t>
-      </w:r>
-      <w:proofErr w:type="gramEnd"/>
-      <w:r>
-        <w:t xml:space="preserve"> ordinary lives.</w:t>
+        <w:t xml:space="preserve"> The name reflects something simple: these prayers are part of a rich inheritance that has been handed down through the life of the Church. They belong not merely to one generation, one country, or one language. They have crossed centuries and borders, carried by ordinary people who have sought God in the midst of ordinary lives.</w:t>
       </w:r>
     </w:p>
     <w:p>
@@ -618,15 +602,7 @@
         <w:pStyle w:val="SPBodyText"/>
       </w:pPr>
       <w:r>
-        <w:t xml:space="preserve">For this reason, each prayer is accompanied by material intended for reflection and study. We look at its place in Scripture, consider why Christians have prayed it, explore the meaning of its petitions, and examine some of the Latin words that give the prayer its </w:t>
-      </w:r>
-      <w:proofErr w:type="gramStart"/>
-      <w:r>
-        <w:t>particular character</w:t>
-      </w:r>
-      <w:proofErr w:type="gramEnd"/>
-      <w:r>
-        <w:t>.</w:t>
+        <w:t>For this reason, each prayer is accompanied by material intended for reflection and study. We look at its place in Scripture, consider why Christians have prayed it, explore the meaning of its petitions, and examine some of the Latin words that give the prayer its particular character.</w:t>
       </w:r>
     </w:p>
     <w:p>
@@ -774,15 +750,7 @@
       </w:pPr>
       <w:r>
         <w:lastRenderedPageBreak/>
-        <w:t xml:space="preserve">And someone who learns to pray may eventually discover that prayer is not something we merely do at </w:t>
-      </w:r>
-      <w:proofErr w:type="gramStart"/>
-      <w:r>
-        <w:t>particular times</w:t>
-      </w:r>
-      <w:proofErr w:type="gramEnd"/>
-      <w:r>
-        <w:t>.</w:t>
+        <w:t>And someone who learns to pray may eventually discover that prayer is not something we merely do at particular times.</w:t>
       </w:r>
     </w:p>
     <w:p>
@@ -1020,15 +988,7 @@
         <w:pStyle w:val="SPBodyText"/>
       </w:pPr>
       <w:r>
-        <w:t xml:space="preserve">It is not necessary to read this book from beginning to end. There is no </w:t>
-      </w:r>
-      <w:proofErr w:type="gramStart"/>
-      <w:r>
-        <w:t>particular order</w:t>
-      </w:r>
-      <w:proofErr w:type="gramEnd"/>
-      <w:r>
-        <w:t xml:space="preserve"> in which the prayers must be approached, and there is no expectation that every page must be studied before the prayers can be prayed.</w:t>
+        <w:t>It is not necessary to read this book from beginning to end. There is no particular order in which the prayers must be approached, and there is no expectation that every page must be studied before the prayers can be prayed.</w:t>
       </w:r>
     </w:p>
     <w:p>
@@ -1054,15 +1014,7 @@
         <w:pStyle w:val="SPBodyText"/>
       </w:pPr>
       <w:r>
-        <w:t xml:space="preserve">Perhaps there is a prayer you already know well. Perhaps there is one you have heard many times but never really considered. Perhaps you are looking for a prayer for a particular moment of the </w:t>
-      </w:r>
-      <w:proofErr w:type="gramStart"/>
-      <w:r>
-        <w:t>day, or</w:t>
-      </w:r>
-      <w:proofErr w:type="gramEnd"/>
-      <w:r>
-        <w:t xml:space="preserve"> simply looking for a few quiet minutes in which to turn your attention towards God.</w:t>
+        <w:t>Perhaps there is a prayer you already know well. Perhaps there is one you have heard many times but never really considered. Perhaps you are looking for a prayer for a particular moment of the day, or simply looking for a few quiet minutes in which to turn your attention towards God.</w:t>
       </w:r>
     </w:p>
     <w:p>
@@ -1311,15 +1263,7 @@
         <w:pStyle w:val="SPBodyText"/>
       </w:pPr>
       <w:r>
-        <w:t xml:space="preserve">There is no requirement to learn Latin </w:t>
-      </w:r>
-      <w:proofErr w:type="gramStart"/>
-      <w:r>
-        <w:t>in order to</w:t>
-      </w:r>
-      <w:proofErr w:type="gramEnd"/>
-      <w:r>
-        <w:t xml:space="preserve"> use this book.</w:t>
+        <w:t>There is no requirement to learn Latin in order to use this book.</w:t>
       </w:r>
     </w:p>
     <w:p>
@@ -2076,15 +2020,7 @@
         <w:t>Sacrae Preces</w:t>
       </w:r>
       <w:r>
-        <w:t xml:space="preserve"> is not meant to </w:t>
-      </w:r>
-      <w:proofErr w:type="gramStart"/>
-      <w:r>
-        <w:t>be something that is</w:t>
-      </w:r>
-      <w:proofErr w:type="gramEnd"/>
-      <w:r>
-        <w:t xml:space="preserve"> simply read once and placed back on a shelf.</w:t>
+        <w:t xml:space="preserve"> is not meant to be something that is simply read once and placed back on a shelf.</w:t>
       </w:r>
     </w:p>
     <w:p>
@@ -3121,21 +3057,8 @@
         <w:pStyle w:val="SPScripture"/>
       </w:pPr>
       <w:r>
-        <w:t xml:space="preserve">Our Father who art in heaven, </w:t>
-      </w:r>
-      <w:proofErr w:type="gramStart"/>
-      <w:r>
-        <w:t>Hallowed</w:t>
-      </w:r>
-      <w:proofErr w:type="gramEnd"/>
-      <w:r>
-        <w:t xml:space="preserve"> be thy name. Thy kingdom </w:t>
-      </w:r>
-      <w:proofErr w:type="gramStart"/>
-      <w:r>
-        <w:t>come</w:t>
-      </w:r>
-      <w:proofErr w:type="gramEnd"/>
+        <w:t>Our Father who art in heaven, Hallowed be thy name. Thy kingdom come</w:t>
+      </w:r>
       <w:r>
         <w:t>.</w:t>
       </w:r>
@@ -3179,21 +3102,13 @@
         <w:t xml:space="preserve"> </w:t>
       </w:r>
       <w:r>
-        <w:t xml:space="preserve">And lead us not into </w:t>
-      </w:r>
-      <w:proofErr w:type="gramStart"/>
-      <w:r>
-        <w:t xml:space="preserve">temptation, </w:t>
+        <w:t xml:space="preserve">And lead us not into temptation, </w:t>
       </w:r>
       <w:r>
         <w:t>b</w:t>
       </w:r>
       <w:r>
-        <w:t>ut</w:t>
-      </w:r>
-      <w:proofErr w:type="gramEnd"/>
-      <w:r>
-        <w:t xml:space="preserve"> deliver us from evil.</w:t>
+        <w:t>ut deliver us from evil.</w:t>
       </w:r>
       <w:r>
         <w:t>”</w:t>
@@ -3227,23 +3142,13 @@
         <w:t>Your</w:t>
       </w:r>
       <w:r>
-        <w:t xml:space="preserve"> kingdom </w:t>
-      </w:r>
-      <w:proofErr w:type="gramStart"/>
-      <w:r>
-        <w:t>come</w:t>
-      </w:r>
-      <w:proofErr w:type="gramEnd"/>
-      <w:r>
-        <w:t xml:space="preserve">. Give us each day our daily bread; and forgive us our sins, for we ourselves forgive </w:t>
+        <w:t xml:space="preserve"> kingdom come. Give us each day our daily bread; and forgive us our sins, for we ourselves forgive </w:t>
       </w:r>
       <w:proofErr w:type="spellStart"/>
-      <w:proofErr w:type="gramStart"/>
       <w:r>
         <w:t>every one</w:t>
       </w:r>
       <w:proofErr w:type="spellEnd"/>
-      <w:proofErr w:type="gramEnd"/>
       <w:r>
         <w:t xml:space="preserve"> who is indebted to us; and lead us not into temptation.</w:t>
       </w:r>
@@ -3327,7 +3232,6 @@
       <w:r>
         <w:t xml:space="preserve">The first word is not </w:t>
       </w:r>
-      <w:proofErr w:type="gramStart"/>
       <w:r>
         <w:rPr>
           <w:i/>
@@ -3335,12 +3239,10 @@
         </w:rPr>
         <w:t>my</w:t>
       </w:r>
-      <w:proofErr w:type="gramEnd"/>
       <w:r>
         <w:t xml:space="preserve">. It is </w:t>
       </w:r>
       <w:proofErr w:type="spellStart"/>
-      <w:proofErr w:type="gramStart"/>
       <w:r>
         <w:rPr>
           <w:i/>
@@ -3349,7 +3251,6 @@
         <w:t>our</w:t>
       </w:r>
       <w:proofErr w:type="spellEnd"/>
-      <w:proofErr w:type="gramEnd"/>
       <w:r>
         <w:t>.</w:t>
       </w:r>
@@ -3597,15 +3498,7 @@
         <w:pStyle w:val="SPBodyText"/>
       </w:pPr>
       <w:r>
-        <w:t xml:space="preserve">The prayer then becomes our petition. We ask Mary, Mother of God, to pray for us — now, </w:t>
-      </w:r>
-      <w:proofErr w:type="gramStart"/>
-      <w:r>
-        <w:t>in the midst of</w:t>
-      </w:r>
-      <w:proofErr w:type="gramEnd"/>
-      <w:r>
-        <w:t xml:space="preserve"> our lives, and at the hour of our death.</w:t>
+        <w:t>The prayer then becomes our petition. We ask Mary, Mother of God, to pray for us — now, in the midst of our lives, and at the hour of our death.</w:t>
       </w:r>
     </w:p>
     <w:p>
@@ -4418,15 +4311,7 @@
         <w:pStyle w:val="SPBodyText"/>
       </w:pPr>
       <w:r>
-        <w:t xml:space="preserve">The prayer begins with the words of Scripture and ends with our humble request for intercession. Between the two stands the mystery of Christ: God who comes among us, takes flesh, and </w:t>
-      </w:r>
-      <w:proofErr w:type="gramStart"/>
-      <w:r>
-        <w:t>enters into</w:t>
-      </w:r>
-      <w:proofErr w:type="gramEnd"/>
-      <w:r>
-        <w:t xml:space="preserve"> our human story.</w:t>
+        <w:t>The prayer begins with the words of Scripture and ends with our humble request for intercession. Between the two stands the mystery of Christ: God who comes among us, takes flesh, and enters into our human story.</w:t>
       </w:r>
     </w:p>
     <w:p>
@@ -4635,15 +4520,7 @@
         <w:pStyle w:val="SPPrayerEnglish"/>
       </w:pPr>
       <w:r>
-        <w:t xml:space="preserve">Glory be to the </w:t>
-      </w:r>
-      <w:proofErr w:type="gramStart"/>
-      <w:r>
-        <w:t>Father</w:t>
-      </w:r>
-      <w:proofErr w:type="gramEnd"/>
-      <w:r>
-        <w:t>,</w:t>
+        <w:t>Glory be to the Father,</w:t>
       </w:r>
     </w:p>
     <w:p>
@@ -4651,13 +4528,8 @@
         <w:pStyle w:val="SPPrayerEnglish"/>
       </w:pPr>
       <w:r>
-        <w:t xml:space="preserve">And to the </w:t>
-      </w:r>
-      <w:proofErr w:type="gramStart"/>
-      <w:r>
-        <w:t>Son</w:t>
-      </w:r>
-      <w:proofErr w:type="gramEnd"/>
+        <w:t>And to the Son</w:t>
+      </w:r>
     </w:p>
     <w:p>
       <w:pPr>
@@ -4680,15 +4552,7 @@
         <w:pStyle w:val="SPPrayerEnglish"/>
       </w:pPr>
       <w:r>
-        <w:t xml:space="preserve">Is </w:t>
-      </w:r>
-      <w:proofErr w:type="gramStart"/>
-      <w:r>
-        <w:t>now, and</w:t>
-      </w:r>
-      <w:proofErr w:type="gramEnd"/>
-      <w:r>
-        <w:t xml:space="preserve"> ever shall be.</w:t>
+        <w:t>Is now, and ever shall be.</w:t>
       </w:r>
     </w:p>
     <w:p>
@@ -4843,23 +4707,7 @@
         <w:pStyle w:val="SPScripture"/>
       </w:pPr>
       <w:r>
-        <w:t>“</w:t>
-      </w:r>
-      <w:proofErr w:type="gramStart"/>
-      <w:r>
-        <w:t>to</w:t>
-      </w:r>
-      <w:proofErr w:type="gramEnd"/>
-      <w:r>
-        <w:t xml:space="preserve"> him be glory in the Church and in Christ Jesus to all generations, </w:t>
-      </w:r>
-      <w:proofErr w:type="gramStart"/>
-      <w:r>
-        <w:t>for ever and ever</w:t>
-      </w:r>
-      <w:proofErr w:type="gramEnd"/>
-      <w:r>
-        <w:t>. Amen.”</w:t>
+        <w:t>“to him be glory in the Church and in Christ Jesus to all generations, for ever and ever. Amen.”</w:t>
       </w:r>
     </w:p>
     <w:p>
@@ -4905,15 +4753,7 @@
       </w:r>
       <w:proofErr w:type="spellEnd"/>
       <w:r>
-        <w:t xml:space="preserve"> and glory </w:t>
-      </w:r>
-      <w:proofErr w:type="gramStart"/>
-      <w:r>
-        <w:t>for ever and ever</w:t>
-      </w:r>
-      <w:proofErr w:type="gramEnd"/>
-      <w:r>
-        <w:t>. Amen.”</w:t>
+        <w:t xml:space="preserve"> and glory for ever and ever. Amen.”</w:t>
       </w:r>
     </w:p>
     <w:p>
@@ -4932,23 +4772,7 @@
         <w:pStyle w:val="SPScripture"/>
       </w:pPr>
       <w:r>
-        <w:t>“</w:t>
-      </w:r>
-      <w:proofErr w:type="gramStart"/>
-      <w:r>
-        <w:t>and</w:t>
-      </w:r>
-      <w:proofErr w:type="gramEnd"/>
-      <w:r>
-        <w:t xml:space="preserve"> from Jesus Christ the faithful witness, the first-born of the dead, and the ruler of kings on earth. To him who loves us and has freed us from our sins by his blood and made us a kingdom, priests to God and Father, to him be glory and dominion </w:t>
-      </w:r>
-      <w:proofErr w:type="gramStart"/>
-      <w:r>
-        <w:t>for ever and ever</w:t>
-      </w:r>
-      <w:proofErr w:type="gramEnd"/>
-      <w:r>
-        <w:t>. Amen.”</w:t>
+        <w:t>“and from Jesus Christ the faithful witness, the first-born of the dead, and the ruler of kings on earth. To him who loves us and has freed us from our sins by his blood and made us a kingdom, priests to God and Father, to him be glory and dominion for ever and ever. Amen.”</w:t>
       </w:r>
     </w:p>
     <w:p>
@@ -5025,17 +4849,8 @@
           <w:b/>
           <w:bCs/>
         </w:rPr>
-        <w:t xml:space="preserve">Glory be to the </w:t>
-      </w:r>
-      <w:proofErr w:type="gramStart"/>
-      <w:r>
-        <w:rPr>
-          <w:b/>
-          <w:bCs/>
-        </w:rPr>
-        <w:t>Father</w:t>
-      </w:r>
-      <w:proofErr w:type="gramEnd"/>
+        <w:t>Glory be to the Father</w:t>
+      </w:r>
       <w:r>
         <w:t>, we turn our hearts towards the One from whom all things come.</w:t>
       </w:r>
@@ -5117,15 +4932,7 @@
         <w:pStyle w:val="SPBodyText"/>
       </w:pPr>
       <w:r>
-        <w:t xml:space="preserve">The Glory </w:t>
-      </w:r>
-      <w:proofErr w:type="gramStart"/>
-      <w:r>
-        <w:t>Be</w:t>
-      </w:r>
-      <w:proofErr w:type="gramEnd"/>
-      <w:r>
-        <w:t xml:space="preserve"> teaches us to lift our eyes beyond the noise of the moment and remember what is eternal.</w:t>
+        <w:t>The Glory Be teaches us to lift our eyes beyond the noise of the moment and remember what is eternal.</w:t>
       </w:r>
     </w:p>
     <w:p>
@@ -5186,15 +4993,7 @@
         <w:pStyle w:val="SPBodyText"/>
       </w:pPr>
       <w:r>
-        <w:t xml:space="preserve">Whatever good we possess is received. Whatever strength we have is given. Whatever love we </w:t>
-      </w:r>
-      <w:proofErr w:type="gramStart"/>
-      <w:r>
-        <w:t>are able to</w:t>
-      </w:r>
-      <w:proofErr w:type="gramEnd"/>
-      <w:r>
-        <w:t xml:space="preserve"> offer has its source in Him.</w:t>
+        <w:t>Whatever good we possess is received. Whatever strength we have is given. Whatever love we are able to offer has its source in Him.</w:t>
       </w:r>
     </w:p>
     <w:p>
@@ -5415,23 +5214,7 @@
           <w:b/>
           <w:bCs/>
         </w:rPr>
-        <w:t xml:space="preserve">Glory be to the </w:t>
-      </w:r>
-      <w:proofErr w:type="gramStart"/>
-      <w:r>
-        <w:rPr>
-          <w:b/>
-          <w:bCs/>
-        </w:rPr>
-        <w:t>Father</w:t>
-      </w:r>
-      <w:proofErr w:type="gramEnd"/>
-      <w:r>
-        <w:rPr>
-          <w:b/>
-          <w:bCs/>
-        </w:rPr>
-        <w:t>.</w:t>
+        <w:t>Glory be to the Father.</w:t>
       </w:r>
     </w:p>
     <w:p>
@@ -5460,23 +5243,7 @@
           <w:b/>
           <w:bCs/>
         </w:rPr>
-        <w:t xml:space="preserve">And to the </w:t>
-      </w:r>
-      <w:proofErr w:type="gramStart"/>
-      <w:r>
-        <w:rPr>
-          <w:b/>
-          <w:bCs/>
-        </w:rPr>
-        <w:t>Son</w:t>
-      </w:r>
-      <w:proofErr w:type="gramEnd"/>
-      <w:r>
-        <w:rPr>
-          <w:b/>
-          <w:bCs/>
-        </w:rPr>
-        <w:t>.</w:t>
+        <w:t>And to the Son.</w:t>
       </w:r>
     </w:p>
     <w:p>
@@ -5699,17 +5466,8 @@
           <w:b/>
           <w:bCs/>
         </w:rPr>
-        <w:t xml:space="preserve">Glory </w:t>
-      </w:r>
-      <w:proofErr w:type="gramStart"/>
-      <w:r>
-        <w:rPr>
-          <w:b/>
-          <w:bCs/>
-        </w:rPr>
-        <w:t>Be</w:t>
-      </w:r>
-      <w:proofErr w:type="gramEnd"/>
+        <w:t>Glory Be</w:t>
+      </w:r>
       <w:r>
         <w:t xml:space="preserve"> t</w:t>
       </w:r>
@@ -6221,15 +5979,7 @@
         <w:pStyle w:val="SPBodyText"/>
       </w:pPr>
       <w:r>
-        <w:t xml:space="preserve">True contrition is more than regret for having done wrong. It is a turning of the heart back towards God — recognising His goodness and </w:t>
-      </w:r>
-      <w:proofErr w:type="gramStart"/>
-      <w:r>
-        <w:t>mercy, and</w:t>
-      </w:r>
-      <w:proofErr w:type="gramEnd"/>
-      <w:r>
-        <w:t xml:space="preserve"> desiring to live more faithfully in His presence.</w:t>
+        <w:t>True contrition is more than regret for having done wrong. It is a turning of the heart back towards God — recognising His goodness and mercy, and desiring to live more faithfully in His presence.</w:t>
       </w:r>
     </w:p>
     <w:p>
@@ -6496,15 +6246,7 @@
         <w:pStyle w:val="SPScripture"/>
       </w:pPr>
       <w:r>
-        <w:t xml:space="preserve">But the tax collector, standing far off, would not even </w:t>
-      </w:r>
-      <w:proofErr w:type="gramStart"/>
-      <w:r>
-        <w:t>lift up</w:t>
-      </w:r>
-      <w:proofErr w:type="gramEnd"/>
-      <w:r>
-        <w:t xml:space="preserve"> his eyes to heaven, but beat his breast, saying, “God, be merciful to me a sinner!”</w:t>
+        <w:t>But the tax collector, standing far off, would not even lift up his eyes to heaven, but beat his breast, saying, “God, be merciful to me a sinner!”</w:t>
       </w:r>
     </w:p>
     <w:p>
@@ -6526,15 +6268,7 @@
         <w:pStyle w:val="SPScripture"/>
       </w:pPr>
       <w:r>
-        <w:t xml:space="preserve">If we confess our sins, he is faithful and </w:t>
-      </w:r>
-      <w:proofErr w:type="gramStart"/>
-      <w:r>
-        <w:t>just, and</w:t>
-      </w:r>
-      <w:proofErr w:type="gramEnd"/>
-      <w:r>
-        <w:t xml:space="preserve"> will forgive our sins and cleanse us from all unrighteousness.</w:t>
+        <w:t>If we confess our sins, he is faithful and just, and will forgive our sins and cleanse us from all unrighteousness.</w:t>
       </w:r>
     </w:p>
     <w:p>
@@ -6733,15 +6467,7 @@
         <w:pStyle w:val="SPBodyText"/>
       </w:pPr>
       <w:r>
-        <w:t xml:space="preserve">And </w:t>
-      </w:r>
-      <w:proofErr w:type="gramStart"/>
-      <w:r>
-        <w:t>so</w:t>
-      </w:r>
-      <w:proofErr w:type="gramEnd"/>
-      <w:r>
-        <w:t xml:space="preserve"> the Act of Contrition is not merely a prayer about the past.</w:t>
+        <w:t>And so the Act of Contrition is not merely a prayer about the past.</w:t>
       </w:r>
     </w:p>
     <w:p>
@@ -7681,15 +7407,7 @@
         <w:spacing w:line="360" w:lineRule="auto"/>
       </w:pPr>
       <w:r>
-        <w:t xml:space="preserve">And you, child, will be called prophet of the </w:t>
-      </w:r>
-      <w:proofErr w:type="gramStart"/>
-      <w:r>
-        <w:t>Most High</w:t>
-      </w:r>
-      <w:proofErr w:type="gramEnd"/>
-      <w:r>
-        <w:t>; for you will go before the Lord to prepare his ways, to give knowledge of salvation to his people in the forgiveness of their sins</w:t>
+        <w:t>And you, child, will be called prophet of the Most High; for you will go before the Lord to prepare his ways, to give knowledge of salvation to his people in the forgiveness of their sins</w:t>
       </w:r>
       <w:r>
         <w:t xml:space="preserve">, through the tender mercy of our God, </w:t>
@@ -9010,15 +8728,7 @@
       </w:r>
       <w:r>
         <w:br/>
-        <w:t xml:space="preserve">and has </w:t>
-      </w:r>
-      <w:proofErr w:type="gramStart"/>
-      <w:r>
-        <w:t>lifted up</w:t>
-      </w:r>
-      <w:proofErr w:type="gramEnd"/>
-      <w:r>
-        <w:t xml:space="preserve"> the lowly.</w:t>
+        <w:t>and has lifted up the lowly.</w:t>
       </w:r>
     </w:p>
     <w:p>
@@ -9341,21 +9051,13 @@
         <w:pStyle w:val="SPScripture"/>
       </w:pPr>
       <w:r>
-        <w:t xml:space="preserve">He has shown strength with his arm, he has scattered the proud in the imagination of their hearts, he has put down the mighty from their </w:t>
-      </w:r>
-      <w:proofErr w:type="gramStart"/>
-      <w:r>
-        <w:t>thrones</w:t>
+        <w:t>He has shown strength with his arm, he has scattered the proud in the imagination of their hearts, he has put down the mighty from their thrones</w:t>
       </w:r>
       <w:r>
         <w:t>,</w:t>
       </w:r>
       <w:r>
-        <w:t xml:space="preserve"> and</w:t>
-      </w:r>
-      <w:proofErr w:type="gramEnd"/>
-      <w:r>
-        <w:t xml:space="preserve"> exalted those of low degree; He has filled the hungry with good things, and the rich he has sent away empty. </w:t>
+        <w:t xml:space="preserve"> and exalted those of low degree; He has filled the hungry with good things, and the rich he has sent away empty. </w:t>
       </w:r>
     </w:p>
     <w:p>
@@ -9527,15 +9229,7 @@
         <w:pStyle w:val="SPBodyText"/>
       </w:pPr>
       <w:r>
-        <w:t xml:space="preserve">And </w:t>
-      </w:r>
-      <w:proofErr w:type="gramStart"/>
-      <w:r>
-        <w:t>so</w:t>
-      </w:r>
-      <w:proofErr w:type="gramEnd"/>
-      <w:r>
-        <w:t xml:space="preserve"> she praises Him.</w:t>
+        <w:t>And so she praises Him.</w:t>
       </w:r>
     </w:p>
     <w:p>
@@ -9589,15 +9283,7 @@
         <w:pStyle w:val="SPBodyText"/>
       </w:pPr>
       <w:r>
-        <w:t xml:space="preserve">He </w:t>
-      </w:r>
-      <w:proofErr w:type="gramStart"/>
-      <w:r>
-        <w:t>lifts up</w:t>
-      </w:r>
-      <w:proofErr w:type="gramEnd"/>
-      <w:r>
-        <w:t xml:space="preserve"> the lowly.</w:t>
+        <w:t>He lifts up the lowly.</w:t>
       </w:r>
     </w:p>
     <w:p>
@@ -9750,15 +9436,7 @@
         <w:pStyle w:val="SPBodyText"/>
       </w:pPr>
       <w:r>
-        <w:t xml:space="preserve">One phrase appears </w:t>
-      </w:r>
-      <w:proofErr w:type="gramStart"/>
-      <w:r>
-        <w:t>again and again</w:t>
-      </w:r>
-      <w:proofErr w:type="gramEnd"/>
-      <w:r>
-        <w:t xml:space="preserve"> beneath the Magnificat:</w:t>
+        <w:t>One phrase appears again and again beneath the Magnificat:</w:t>
       </w:r>
     </w:p>
     <w:p>
@@ -10118,15 +9796,7 @@
         <w:pStyle w:val="SPBodyText"/>
       </w:pPr>
       <w:r>
-        <w:t xml:space="preserve">We can praise God </w:t>
-      </w:r>
-      <w:proofErr w:type="gramStart"/>
-      <w:r>
-        <w:t>in the midst of</w:t>
-      </w:r>
-      <w:proofErr w:type="gramEnd"/>
-      <w:r>
-        <w:t xml:space="preserve"> uncertainty.</w:t>
+        <w:t>We can praise God in the midst of uncertainty.</w:t>
       </w:r>
     </w:p>
     <w:p>
@@ -11049,15 +10719,7 @@
         <w:pStyle w:val="SPBodyText"/>
       </w:pPr>
       <w:r>
-        <w:t xml:space="preserve">These prayers have been handed down through generations. Some are centuries old. Others grew from </w:t>
-      </w:r>
-      <w:proofErr w:type="gramStart"/>
-      <w:r>
-        <w:t>particular traditions</w:t>
-      </w:r>
-      <w:proofErr w:type="gramEnd"/>
-      <w:r>
-        <w:t xml:space="preserve"> of devotion to Christ, the Blessed Virgin Mary, the angels and the saints.</w:t>
+        <w:t>These prayers have been handed down through generations. Some are centuries old. Others grew from particular traditions of devotion to Christ, the Blessed Virgin Mary, the angels and the saints.</w:t>
       </w:r>
     </w:p>
     <w:p>
@@ -11431,10 +11093,6 @@
     <w:p>
       <w:pPr>
         <w:pStyle w:val="SPBodyText"/>
-        <w:rPr>
-          <w:b/>
-          <w:bCs/>
-        </w:rPr>
       </w:pPr>
       <w:r>
         <w:t xml:space="preserve">The Morning Offering is therefore more than a prayer said once in the morning. It is an invitation to </w:t>
@@ -11444,28 +11102,7 @@
           <w:b/>
           <w:bCs/>
         </w:rPr>
-        <w:t>live the day con</w:t>
-      </w:r>
-    </w:p>
-    <w:p>
-      <w:pPr>
-        <w:pStyle w:val="SPBodyText"/>
-      </w:pPr>
-      <w:proofErr w:type="spellStart"/>
-      <w:r>
-        <w:rPr>
-          <w:b/>
-          <w:bCs/>
-        </w:rPr>
-        <w:t>sciously</w:t>
-      </w:r>
-      <w:proofErr w:type="spellEnd"/>
-      <w:r>
-        <w:rPr>
-          <w:b/>
-          <w:bCs/>
-        </w:rPr>
-        <w:t xml:space="preserve"> in the presence of God</w:t>
+        <w:t>live the day consciously in the presence of God</w:t>
       </w:r>
       <w:r>
         <w:t>.</w:t>
@@ -12194,13 +11831,8 @@
       <w:pPr>
         <w:pStyle w:val="SPBodyText"/>
       </w:pPr>
-      <w:proofErr w:type="gramStart"/>
-      <w:r>
-        <w:t>So</w:t>
-      </w:r>
-      <w:proofErr w:type="gramEnd"/>
-      <w:r>
-        <w:t xml:space="preserve"> begin simply.</w:t>
+      <w:r>
+        <w:t>So begin simply.</w:t>
       </w:r>
     </w:p>
     <w:p>
@@ -12335,15 +11967,7 @@
         <w:t>Annunciation</w:t>
       </w:r>
       <w:r>
-        <w:t xml:space="preserve">, when the Angel Gabriel announced to Mary that she would become the </w:t>
-      </w:r>
-      <w:proofErr w:type="gramStart"/>
-      <w:r>
-        <w:t>Mother</w:t>
-      </w:r>
-      <w:proofErr w:type="gramEnd"/>
-      <w:r>
-        <w:t xml:space="preserve"> of the Son of God.</w:t>
+        <w:t>, when the Angel Gabriel announced to Mary that she would become the Mother of the Son of God.</w:t>
       </w:r>
     </w:p>
     <w:p>
@@ -12397,15 +12021,7 @@
         <w:pStyle w:val="SPBodyText"/>
       </w:pPr>
       <w:r>
-        <w:t xml:space="preserve">The repeated prayer invites us to pause </w:t>
-      </w:r>
-      <w:proofErr w:type="gramStart"/>
-      <w:r>
-        <w:t>in the midst of</w:t>
-      </w:r>
-      <w:proofErr w:type="gramEnd"/>
-      <w:r>
-        <w:t xml:space="preserve"> ordinary life and remember the mystery at the heart of our faith:</w:t>
+        <w:t>The repeated prayer invites us to pause in the midst of ordinary life and remember the mystery at the heart of our faith:</w:t>
       </w:r>
       <w:r>
         <w:t xml:space="preserve"> </w:t>
@@ -12415,23 +12031,7 @@
           <w:b/>
           <w:bCs/>
         </w:rPr>
-        <w:t xml:space="preserve">“And the Word was made </w:t>
-      </w:r>
-      <w:proofErr w:type="gramStart"/>
-      <w:r>
-        <w:rPr>
-          <w:b/>
-          <w:bCs/>
-        </w:rPr>
-        <w:t>flesh, and</w:t>
-      </w:r>
-      <w:proofErr w:type="gramEnd"/>
-      <w:r>
-        <w:rPr>
-          <w:b/>
-          <w:bCs/>
-        </w:rPr>
-        <w:t xml:space="preserve"> dwelt among us.”</w:t>
+        <w:t>“And the Word was made flesh, and dwelt among us.”</w:t>
       </w:r>
     </w:p>
     <w:p>
@@ -12819,15 +12419,7 @@
         <w:pStyle w:val="SPPrayerEnglish"/>
       </w:pPr>
       <w:r>
-        <w:t xml:space="preserve">Pour forth, we beseech Thee, O Lord, </w:t>
-      </w:r>
-      <w:proofErr w:type="gramStart"/>
-      <w:r>
-        <w:t>Thy</w:t>
-      </w:r>
-      <w:proofErr w:type="gramEnd"/>
-      <w:r>
-        <w:t xml:space="preserve"> grace into our hearts, that we to whom the Incarnation of Christ, Thy Son, was made known by the message of an angel, may by His Passion and Cross be brought to the glory of His resurrection. Through the same Christ our Lord. </w:t>
+        <w:t xml:space="preserve">Pour forth, we beseech Thee, O Lord, Thy grace into our hearts, that we to whom the Incarnation of Christ, Thy Son, was made known by the message of an angel, may by His Passion and Cross be brought to the glory of His resurrection. Through the same Christ our Lord. </w:t>
       </w:r>
     </w:p>
     <w:p>
@@ -13545,15 +13137,7 @@
         <w:pStyle w:val="SPBodyText"/>
       </w:pPr>
       <w:r>
-        <w:t xml:space="preserve">At noon, we pause </w:t>
-      </w:r>
-      <w:proofErr w:type="gramStart"/>
-      <w:r>
-        <w:t>in the midst of</w:t>
-      </w:r>
-      <w:proofErr w:type="gramEnd"/>
-      <w:r>
-        <w:t xml:space="preserve"> our work.</w:t>
+        <w:t>At noon, we pause in the midst of our work.</w:t>
       </w:r>
     </w:p>
     <w:p>
@@ -13638,15 +13222,7 @@
         <w:pStyle w:val="SPBodyText"/>
       </w:pPr>
       <w:r>
-        <w:t xml:space="preserve">Back to the truth that God is </w:t>
-      </w:r>
-      <w:proofErr w:type="gramStart"/>
-      <w:r>
-        <w:t>near</w:t>
-      </w:r>
-      <w:proofErr w:type="gramEnd"/>
-      <w:r>
-        <w:t>.</w:t>
+        <w:t>Back to the truth that God is near.</w:t>
       </w:r>
     </w:p>
     <w:p>

</xml_diff>

<commit_message>
Started on Anima Christi
</commit_message>
<xml_diff>
--- a/manuscript/volume-1/sacrae-preces-volume-1.docx
+++ b/manuscript/volume-1/sacrae-preces-volume-1.docx
@@ -443,7 +443,15 @@
         <w:pStyle w:val="SPBodyText"/>
       </w:pPr>
       <w:r>
-        <w:t>We can spend our days surrounded by noise, responsibilities, conversations, messages, and countless things competing for our attention. In the midst of all of this, prayer calls us to stop. To become still. To turn our hearts towards God.</w:t>
+        <w:t xml:space="preserve">We can spend our days surrounded by noise, responsibilities, conversations, messages, and countless things competing for our attention. </w:t>
+      </w:r>
+      <w:proofErr w:type="gramStart"/>
+      <w:r>
+        <w:t>In the midst of</w:t>
+      </w:r>
+      <w:proofErr w:type="gramEnd"/>
+      <w:r>
+        <w:t xml:space="preserve"> all of this, prayer calls us to stop. To become still. To turn our hearts towards God.</w:t>
       </w:r>
     </w:p>
     <w:p>
@@ -527,7 +535,15 @@
         <w:t>"Sacred Prayers."</w:t>
       </w:r>
       <w:r>
-        <w:t xml:space="preserve"> The name reflects something simple: these prayers are part of a rich inheritance that has been handed down through the life of the Church. They belong not merely to one generation, one country, or one language. They have crossed centuries and borders, carried by ordinary people who have sought God in the midst of ordinary lives.</w:t>
+        <w:t xml:space="preserve"> The name reflects something simple: these prayers are part of a rich inheritance that has been handed down through the life of the Church. They belong not merely to one generation, one country, or one language. They have crossed centuries and borders, carried by ordinary people who have sought God </w:t>
+      </w:r>
+      <w:proofErr w:type="gramStart"/>
+      <w:r>
+        <w:t>in the midst of</w:t>
+      </w:r>
+      <w:proofErr w:type="gramEnd"/>
+      <w:r>
+        <w:t xml:space="preserve"> ordinary lives.</w:t>
       </w:r>
     </w:p>
     <w:p>
@@ -602,7 +618,15 @@
         <w:pStyle w:val="SPBodyText"/>
       </w:pPr>
       <w:r>
-        <w:t>For this reason, each prayer is accompanied by material intended for reflection and study. We look at its place in Scripture, consider why Christians have prayed it, explore the meaning of its petitions, and examine some of the Latin words that give the prayer its particular character.</w:t>
+        <w:t xml:space="preserve">For this reason, each prayer is accompanied by material intended for reflection and study. We look at its place in Scripture, consider why Christians have prayed it, explore the meaning of its petitions, and examine some of the Latin words that give the prayer its </w:t>
+      </w:r>
+      <w:proofErr w:type="gramStart"/>
+      <w:r>
+        <w:t>particular character</w:t>
+      </w:r>
+      <w:proofErr w:type="gramEnd"/>
+      <w:r>
+        <w:t>.</w:t>
       </w:r>
     </w:p>
     <w:p>
@@ -750,7 +774,15 @@
       </w:pPr>
       <w:r>
         <w:lastRenderedPageBreak/>
-        <w:t>And someone who learns to pray may eventually discover that prayer is not something we merely do at particular times.</w:t>
+        <w:t xml:space="preserve">And someone who learns to pray may eventually discover that prayer is not something we merely do at </w:t>
+      </w:r>
+      <w:proofErr w:type="gramStart"/>
+      <w:r>
+        <w:t>particular times</w:t>
+      </w:r>
+      <w:proofErr w:type="gramEnd"/>
+      <w:r>
+        <w:t>.</w:t>
       </w:r>
     </w:p>
     <w:p>
@@ -988,7 +1020,15 @@
         <w:pStyle w:val="SPBodyText"/>
       </w:pPr>
       <w:r>
-        <w:t>It is not necessary to read this book from beginning to end. There is no particular order in which the prayers must be approached, and there is no expectation that every page must be studied before the prayers can be prayed.</w:t>
+        <w:t xml:space="preserve">It is not necessary to read this book from beginning to end. There is no </w:t>
+      </w:r>
+      <w:proofErr w:type="gramStart"/>
+      <w:r>
+        <w:t>particular order</w:t>
+      </w:r>
+      <w:proofErr w:type="gramEnd"/>
+      <w:r>
+        <w:t xml:space="preserve"> in which the prayers must be approached, and there is no expectation that every page must be studied before the prayers can be prayed.</w:t>
       </w:r>
     </w:p>
     <w:p>
@@ -1014,7 +1054,15 @@
         <w:pStyle w:val="SPBodyText"/>
       </w:pPr>
       <w:r>
-        <w:t>Perhaps there is a prayer you already know well. Perhaps there is one you have heard many times but never really considered. Perhaps you are looking for a prayer for a particular moment of the day, or simply looking for a few quiet minutes in which to turn your attention towards God.</w:t>
+        <w:t xml:space="preserve">Perhaps there is a prayer you already know well. Perhaps there is one you have heard many times but never really considered. Perhaps you are looking for a prayer for a particular moment of the </w:t>
+      </w:r>
+      <w:proofErr w:type="gramStart"/>
+      <w:r>
+        <w:t>day, or</w:t>
+      </w:r>
+      <w:proofErr w:type="gramEnd"/>
+      <w:r>
+        <w:t xml:space="preserve"> simply looking for a few quiet minutes in which to turn your attention towards God.</w:t>
       </w:r>
     </w:p>
     <w:p>
@@ -1263,7 +1311,15 @@
         <w:pStyle w:val="SPBodyText"/>
       </w:pPr>
       <w:r>
-        <w:t>There is no requirement to learn Latin in order to use this book.</w:t>
+        <w:t xml:space="preserve">There is no requirement to learn Latin </w:t>
+      </w:r>
+      <w:proofErr w:type="gramStart"/>
+      <w:r>
+        <w:t>in order to</w:t>
+      </w:r>
+      <w:proofErr w:type="gramEnd"/>
+      <w:r>
+        <w:t xml:space="preserve"> use this book.</w:t>
       </w:r>
     </w:p>
     <w:p>
@@ -2020,7 +2076,15 @@
         <w:t>Sacrae Preces</w:t>
       </w:r>
       <w:r>
-        <w:t xml:space="preserve"> is not meant to be something that is simply read once and placed back on a shelf.</w:t>
+        <w:t xml:space="preserve"> is not meant to </w:t>
+      </w:r>
+      <w:proofErr w:type="gramStart"/>
+      <w:r>
+        <w:t>be something that is</w:t>
+      </w:r>
+      <w:proofErr w:type="gramEnd"/>
+      <w:r>
+        <w:t xml:space="preserve"> simply read once and placed back on a shelf.</w:t>
       </w:r>
     </w:p>
     <w:p>
@@ -3057,8 +3121,21 @@
         <w:pStyle w:val="SPScripture"/>
       </w:pPr>
       <w:r>
-        <w:t>Our Father who art in heaven, Hallowed be thy name. Thy kingdom come</w:t>
-      </w:r>
+        <w:t xml:space="preserve">Our Father who art in heaven, </w:t>
+      </w:r>
+      <w:proofErr w:type="gramStart"/>
+      <w:r>
+        <w:t>Hallowed</w:t>
+      </w:r>
+      <w:proofErr w:type="gramEnd"/>
+      <w:r>
+        <w:t xml:space="preserve"> be thy name. Thy kingdom </w:t>
+      </w:r>
+      <w:proofErr w:type="gramStart"/>
+      <w:r>
+        <w:t>come</w:t>
+      </w:r>
+      <w:proofErr w:type="gramEnd"/>
       <w:r>
         <w:t>.</w:t>
       </w:r>
@@ -3102,13 +3179,21 @@
         <w:t xml:space="preserve"> </w:t>
       </w:r>
       <w:r>
-        <w:t xml:space="preserve">And lead us not into temptation, </w:t>
+        <w:t xml:space="preserve">And lead us not into </w:t>
+      </w:r>
+      <w:proofErr w:type="gramStart"/>
+      <w:r>
+        <w:t xml:space="preserve">temptation, </w:t>
       </w:r>
       <w:r>
         <w:t>b</w:t>
       </w:r>
       <w:r>
-        <w:t>ut deliver us from evil.</w:t>
+        <w:t>ut</w:t>
+      </w:r>
+      <w:proofErr w:type="gramEnd"/>
+      <w:r>
+        <w:t xml:space="preserve"> deliver us from evil.</w:t>
       </w:r>
       <w:r>
         <w:t>”</w:t>
@@ -3142,13 +3227,23 @@
         <w:t>Your</w:t>
       </w:r>
       <w:r>
-        <w:t xml:space="preserve"> kingdom come. Give us each day our daily bread; and forgive us our sins, for we ourselves forgive </w:t>
+        <w:t xml:space="preserve"> kingdom </w:t>
+      </w:r>
+      <w:proofErr w:type="gramStart"/>
+      <w:r>
+        <w:t>come</w:t>
+      </w:r>
+      <w:proofErr w:type="gramEnd"/>
+      <w:r>
+        <w:t xml:space="preserve">. Give us each day our daily bread; and forgive us our sins, for we ourselves forgive </w:t>
       </w:r>
       <w:proofErr w:type="spellStart"/>
+      <w:proofErr w:type="gramStart"/>
       <w:r>
         <w:t>every one</w:t>
       </w:r>
       <w:proofErr w:type="spellEnd"/>
+      <w:proofErr w:type="gramEnd"/>
       <w:r>
         <w:t xml:space="preserve"> who is indebted to us; and lead us not into temptation.</w:t>
       </w:r>
@@ -3232,6 +3327,7 @@
       <w:r>
         <w:t xml:space="preserve">The first word is not </w:t>
       </w:r>
+      <w:proofErr w:type="gramStart"/>
       <w:r>
         <w:rPr>
           <w:i/>
@@ -3239,10 +3335,12 @@
         </w:rPr>
         <w:t>my</w:t>
       </w:r>
+      <w:proofErr w:type="gramEnd"/>
       <w:r>
         <w:t xml:space="preserve">. It is </w:t>
       </w:r>
       <w:proofErr w:type="spellStart"/>
+      <w:proofErr w:type="gramStart"/>
       <w:r>
         <w:rPr>
           <w:i/>
@@ -3251,6 +3349,7 @@
         <w:t>our</w:t>
       </w:r>
       <w:proofErr w:type="spellEnd"/>
+      <w:proofErr w:type="gramEnd"/>
       <w:r>
         <w:t>.</w:t>
       </w:r>
@@ -3498,7 +3597,15 @@
         <w:pStyle w:val="SPBodyText"/>
       </w:pPr>
       <w:r>
-        <w:t>The prayer then becomes our petition. We ask Mary, Mother of God, to pray for us — now, in the midst of our lives, and at the hour of our death.</w:t>
+        <w:t xml:space="preserve">The prayer then becomes our petition. We ask Mary, Mother of God, to pray for us — now, </w:t>
+      </w:r>
+      <w:proofErr w:type="gramStart"/>
+      <w:r>
+        <w:t>in the midst of</w:t>
+      </w:r>
+      <w:proofErr w:type="gramEnd"/>
+      <w:r>
+        <w:t xml:space="preserve"> our lives, and at the hour of our death.</w:t>
       </w:r>
     </w:p>
     <w:p>
@@ -4311,7 +4418,15 @@
         <w:pStyle w:val="SPBodyText"/>
       </w:pPr>
       <w:r>
-        <w:t>The prayer begins with the words of Scripture and ends with our humble request for intercession. Between the two stands the mystery of Christ: God who comes among us, takes flesh, and enters into our human story.</w:t>
+        <w:t xml:space="preserve">The prayer begins with the words of Scripture and ends with our humble request for intercession. Between the two stands the mystery of Christ: God who comes among us, takes flesh, and </w:t>
+      </w:r>
+      <w:proofErr w:type="gramStart"/>
+      <w:r>
+        <w:t>enters into</w:t>
+      </w:r>
+      <w:proofErr w:type="gramEnd"/>
+      <w:r>
+        <w:t xml:space="preserve"> our human story.</w:t>
       </w:r>
     </w:p>
     <w:p>
@@ -4520,7 +4635,15 @@
         <w:pStyle w:val="SPPrayerEnglish"/>
       </w:pPr>
       <w:r>
-        <w:t>Glory be to the Father,</w:t>
+        <w:t xml:space="preserve">Glory be to the </w:t>
+      </w:r>
+      <w:proofErr w:type="gramStart"/>
+      <w:r>
+        <w:t>Father</w:t>
+      </w:r>
+      <w:proofErr w:type="gramEnd"/>
+      <w:r>
+        <w:t>,</w:t>
       </w:r>
     </w:p>
     <w:p>
@@ -4528,8 +4651,13 @@
         <w:pStyle w:val="SPPrayerEnglish"/>
       </w:pPr>
       <w:r>
-        <w:t>And to the Son</w:t>
-      </w:r>
+        <w:t xml:space="preserve">And to the </w:t>
+      </w:r>
+      <w:proofErr w:type="gramStart"/>
+      <w:r>
+        <w:t>Son</w:t>
+      </w:r>
+      <w:proofErr w:type="gramEnd"/>
     </w:p>
     <w:p>
       <w:pPr>
@@ -4552,7 +4680,15 @@
         <w:pStyle w:val="SPPrayerEnglish"/>
       </w:pPr>
       <w:r>
-        <w:t>Is now, and ever shall be.</w:t>
+        <w:t xml:space="preserve">Is </w:t>
+      </w:r>
+      <w:proofErr w:type="gramStart"/>
+      <w:r>
+        <w:t>now, and</w:t>
+      </w:r>
+      <w:proofErr w:type="gramEnd"/>
+      <w:r>
+        <w:t xml:space="preserve"> ever shall be.</w:t>
       </w:r>
     </w:p>
     <w:p>
@@ -4707,7 +4843,23 @@
         <w:pStyle w:val="SPScripture"/>
       </w:pPr>
       <w:r>
-        <w:t>“to him be glory in the Church and in Christ Jesus to all generations, for ever and ever. Amen.”</w:t>
+        <w:t>“</w:t>
+      </w:r>
+      <w:proofErr w:type="gramStart"/>
+      <w:r>
+        <w:t>to</w:t>
+      </w:r>
+      <w:proofErr w:type="gramEnd"/>
+      <w:r>
+        <w:t xml:space="preserve"> him be glory in the Church and in Christ Jesus to all generations, </w:t>
+      </w:r>
+      <w:proofErr w:type="gramStart"/>
+      <w:r>
+        <w:t>for ever and ever</w:t>
+      </w:r>
+      <w:proofErr w:type="gramEnd"/>
+      <w:r>
+        <w:t>. Amen.”</w:t>
       </w:r>
     </w:p>
     <w:p>
@@ -4753,7 +4905,15 @@
       </w:r>
       <w:proofErr w:type="spellEnd"/>
       <w:r>
-        <w:t xml:space="preserve"> and glory for ever and ever. Amen.”</w:t>
+        <w:t xml:space="preserve"> and glory </w:t>
+      </w:r>
+      <w:proofErr w:type="gramStart"/>
+      <w:r>
+        <w:t>for ever and ever</w:t>
+      </w:r>
+      <w:proofErr w:type="gramEnd"/>
+      <w:r>
+        <w:t>. Amen.”</w:t>
       </w:r>
     </w:p>
     <w:p>
@@ -4772,7 +4932,23 @@
         <w:pStyle w:val="SPScripture"/>
       </w:pPr>
       <w:r>
-        <w:t>“and from Jesus Christ the faithful witness, the first-born of the dead, and the ruler of kings on earth. To him who loves us and has freed us from our sins by his blood and made us a kingdom, priests to God and Father, to him be glory and dominion for ever and ever. Amen.”</w:t>
+        <w:t>“</w:t>
+      </w:r>
+      <w:proofErr w:type="gramStart"/>
+      <w:r>
+        <w:t>and</w:t>
+      </w:r>
+      <w:proofErr w:type="gramEnd"/>
+      <w:r>
+        <w:t xml:space="preserve"> from Jesus Christ the faithful witness, the first-born of the dead, and the ruler of kings on earth. To him who loves us and has freed us from our sins by his blood and made us a kingdom, priests to God and Father, to him be glory and dominion </w:t>
+      </w:r>
+      <w:proofErr w:type="gramStart"/>
+      <w:r>
+        <w:t>for ever and ever</w:t>
+      </w:r>
+      <w:proofErr w:type="gramEnd"/>
+      <w:r>
+        <w:t>. Amen.”</w:t>
       </w:r>
     </w:p>
     <w:p>
@@ -4849,8 +5025,17 @@
           <w:b/>
           <w:bCs/>
         </w:rPr>
-        <w:t>Glory be to the Father</w:t>
-      </w:r>
+        <w:t xml:space="preserve">Glory be to the </w:t>
+      </w:r>
+      <w:proofErr w:type="gramStart"/>
+      <w:r>
+        <w:rPr>
+          <w:b/>
+          <w:bCs/>
+        </w:rPr>
+        <w:t>Father</w:t>
+      </w:r>
+      <w:proofErr w:type="gramEnd"/>
       <w:r>
         <w:t>, we turn our hearts towards the One from whom all things come.</w:t>
       </w:r>
@@ -4932,7 +5117,15 @@
         <w:pStyle w:val="SPBodyText"/>
       </w:pPr>
       <w:r>
-        <w:t>The Glory Be teaches us to lift our eyes beyond the noise of the moment and remember what is eternal.</w:t>
+        <w:t xml:space="preserve">The Glory </w:t>
+      </w:r>
+      <w:proofErr w:type="gramStart"/>
+      <w:r>
+        <w:t>Be</w:t>
+      </w:r>
+      <w:proofErr w:type="gramEnd"/>
+      <w:r>
+        <w:t xml:space="preserve"> teaches us to lift our eyes beyond the noise of the moment and remember what is eternal.</w:t>
       </w:r>
     </w:p>
     <w:p>
@@ -4993,7 +5186,15 @@
         <w:pStyle w:val="SPBodyText"/>
       </w:pPr>
       <w:r>
-        <w:t>Whatever good we possess is received. Whatever strength we have is given. Whatever love we are able to offer has its source in Him.</w:t>
+        <w:t xml:space="preserve">Whatever good we possess is received. Whatever strength we have is given. Whatever love we </w:t>
+      </w:r>
+      <w:proofErr w:type="gramStart"/>
+      <w:r>
+        <w:t>are able to</w:t>
+      </w:r>
+      <w:proofErr w:type="gramEnd"/>
+      <w:r>
+        <w:t xml:space="preserve"> offer has its source in Him.</w:t>
       </w:r>
     </w:p>
     <w:p>
@@ -5214,7 +5415,23 @@
           <w:b/>
           <w:bCs/>
         </w:rPr>
-        <w:t>Glory be to the Father.</w:t>
+        <w:t xml:space="preserve">Glory be to the </w:t>
+      </w:r>
+      <w:proofErr w:type="gramStart"/>
+      <w:r>
+        <w:rPr>
+          <w:b/>
+          <w:bCs/>
+        </w:rPr>
+        <w:t>Father</w:t>
+      </w:r>
+      <w:proofErr w:type="gramEnd"/>
+      <w:r>
+        <w:rPr>
+          <w:b/>
+          <w:bCs/>
+        </w:rPr>
+        <w:t>.</w:t>
       </w:r>
     </w:p>
     <w:p>
@@ -5243,7 +5460,23 @@
           <w:b/>
           <w:bCs/>
         </w:rPr>
-        <w:t>And to the Son.</w:t>
+        <w:t xml:space="preserve">And to the </w:t>
+      </w:r>
+      <w:proofErr w:type="gramStart"/>
+      <w:r>
+        <w:rPr>
+          <w:b/>
+          <w:bCs/>
+        </w:rPr>
+        <w:t>Son</w:t>
+      </w:r>
+      <w:proofErr w:type="gramEnd"/>
+      <w:r>
+        <w:rPr>
+          <w:b/>
+          <w:bCs/>
+        </w:rPr>
+        <w:t>.</w:t>
       </w:r>
     </w:p>
     <w:p>
@@ -5466,8 +5699,17 @@
           <w:b/>
           <w:bCs/>
         </w:rPr>
-        <w:t>Glory Be</w:t>
-      </w:r>
+        <w:t xml:space="preserve">Glory </w:t>
+      </w:r>
+      <w:proofErr w:type="gramStart"/>
+      <w:r>
+        <w:rPr>
+          <w:b/>
+          <w:bCs/>
+        </w:rPr>
+        <w:t>Be</w:t>
+      </w:r>
+      <w:proofErr w:type="gramEnd"/>
       <w:r>
         <w:t xml:space="preserve"> t</w:t>
       </w:r>
@@ -5979,7 +6221,15 @@
         <w:pStyle w:val="SPBodyText"/>
       </w:pPr>
       <w:r>
-        <w:t>True contrition is more than regret for having done wrong. It is a turning of the heart back towards God — recognising His goodness and mercy, and desiring to live more faithfully in His presence.</w:t>
+        <w:t xml:space="preserve">True contrition is more than regret for having done wrong. It is a turning of the heart back towards God — recognising His goodness and </w:t>
+      </w:r>
+      <w:proofErr w:type="gramStart"/>
+      <w:r>
+        <w:t>mercy, and</w:t>
+      </w:r>
+      <w:proofErr w:type="gramEnd"/>
+      <w:r>
+        <w:t xml:space="preserve"> desiring to live more faithfully in His presence.</w:t>
       </w:r>
     </w:p>
     <w:p>
@@ -6246,7 +6496,15 @@
         <w:pStyle w:val="SPScripture"/>
       </w:pPr>
       <w:r>
-        <w:t>But the tax collector, standing far off, would not even lift up his eyes to heaven, but beat his breast, saying, “God, be merciful to me a sinner!”</w:t>
+        <w:t xml:space="preserve">But the tax collector, standing far off, would not even </w:t>
+      </w:r>
+      <w:proofErr w:type="gramStart"/>
+      <w:r>
+        <w:t>lift up</w:t>
+      </w:r>
+      <w:proofErr w:type="gramEnd"/>
+      <w:r>
+        <w:t xml:space="preserve"> his eyes to heaven, but beat his breast, saying, “God, be merciful to me a sinner!”</w:t>
       </w:r>
     </w:p>
     <w:p>
@@ -6268,7 +6526,15 @@
         <w:pStyle w:val="SPScripture"/>
       </w:pPr>
       <w:r>
-        <w:t>If we confess our sins, he is faithful and just, and will forgive our sins and cleanse us from all unrighteousness.</w:t>
+        <w:t xml:space="preserve">If we confess our sins, he is faithful and </w:t>
+      </w:r>
+      <w:proofErr w:type="gramStart"/>
+      <w:r>
+        <w:t>just, and</w:t>
+      </w:r>
+      <w:proofErr w:type="gramEnd"/>
+      <w:r>
+        <w:t xml:space="preserve"> will forgive our sins and cleanse us from all unrighteousness.</w:t>
       </w:r>
     </w:p>
     <w:p>
@@ -6467,7 +6733,15 @@
         <w:pStyle w:val="SPBodyText"/>
       </w:pPr>
       <w:r>
-        <w:t>And so the Act of Contrition is not merely a prayer about the past.</w:t>
+        <w:t xml:space="preserve">And </w:t>
+      </w:r>
+      <w:proofErr w:type="gramStart"/>
+      <w:r>
+        <w:t>so</w:t>
+      </w:r>
+      <w:proofErr w:type="gramEnd"/>
+      <w:r>
+        <w:t xml:space="preserve"> the Act of Contrition is not merely a prayer about the past.</w:t>
       </w:r>
     </w:p>
     <w:p>
@@ -7407,7 +7681,15 @@
         <w:spacing w:line="360" w:lineRule="auto"/>
       </w:pPr>
       <w:r>
-        <w:t>And you, child, will be called prophet of the Most High; for you will go before the Lord to prepare his ways, to give knowledge of salvation to his people in the forgiveness of their sins</w:t>
+        <w:t xml:space="preserve">And you, child, will be called prophet of the </w:t>
+      </w:r>
+      <w:proofErr w:type="gramStart"/>
+      <w:r>
+        <w:t>Most High</w:t>
+      </w:r>
+      <w:proofErr w:type="gramEnd"/>
+      <w:r>
+        <w:t>; for you will go before the Lord to prepare his ways, to give knowledge of salvation to his people in the forgiveness of their sins</w:t>
       </w:r>
       <w:r>
         <w:t xml:space="preserve">, through the tender mercy of our God, </w:t>
@@ -8728,7 +9010,15 @@
       </w:r>
       <w:r>
         <w:br/>
-        <w:t>and has lifted up the lowly.</w:t>
+        <w:t xml:space="preserve">and has </w:t>
+      </w:r>
+      <w:proofErr w:type="gramStart"/>
+      <w:r>
+        <w:t>lifted up</w:t>
+      </w:r>
+      <w:proofErr w:type="gramEnd"/>
+      <w:r>
+        <w:t xml:space="preserve"> the lowly.</w:t>
       </w:r>
     </w:p>
     <w:p>
@@ -9051,13 +9341,21 @@
         <w:pStyle w:val="SPScripture"/>
       </w:pPr>
       <w:r>
-        <w:t>He has shown strength with his arm, he has scattered the proud in the imagination of their hearts, he has put down the mighty from their thrones</w:t>
+        <w:t xml:space="preserve">He has shown strength with his arm, he has scattered the proud in the imagination of their hearts, he has put down the mighty from their </w:t>
+      </w:r>
+      <w:proofErr w:type="gramStart"/>
+      <w:r>
+        <w:t>thrones</w:t>
       </w:r>
       <w:r>
         <w:t>,</w:t>
       </w:r>
       <w:r>
-        <w:t xml:space="preserve"> and exalted those of low degree; He has filled the hungry with good things, and the rich he has sent away empty. </w:t>
+        <w:t xml:space="preserve"> and</w:t>
+      </w:r>
+      <w:proofErr w:type="gramEnd"/>
+      <w:r>
+        <w:t xml:space="preserve"> exalted those of low degree; He has filled the hungry with good things, and the rich he has sent away empty. </w:t>
       </w:r>
     </w:p>
     <w:p>
@@ -9229,7 +9527,15 @@
         <w:pStyle w:val="SPBodyText"/>
       </w:pPr>
       <w:r>
-        <w:t>And so she praises Him.</w:t>
+        <w:t xml:space="preserve">And </w:t>
+      </w:r>
+      <w:proofErr w:type="gramStart"/>
+      <w:r>
+        <w:t>so</w:t>
+      </w:r>
+      <w:proofErr w:type="gramEnd"/>
+      <w:r>
+        <w:t xml:space="preserve"> she praises Him.</w:t>
       </w:r>
     </w:p>
     <w:p>
@@ -9283,7 +9589,15 @@
         <w:pStyle w:val="SPBodyText"/>
       </w:pPr>
       <w:r>
-        <w:t>He lifts up the lowly.</w:t>
+        <w:t xml:space="preserve">He </w:t>
+      </w:r>
+      <w:proofErr w:type="gramStart"/>
+      <w:r>
+        <w:t>lifts up</w:t>
+      </w:r>
+      <w:proofErr w:type="gramEnd"/>
+      <w:r>
+        <w:t xml:space="preserve"> the lowly.</w:t>
       </w:r>
     </w:p>
     <w:p>
@@ -9436,7 +9750,15 @@
         <w:pStyle w:val="SPBodyText"/>
       </w:pPr>
       <w:r>
-        <w:t>One phrase appears again and again beneath the Magnificat:</w:t>
+        <w:t xml:space="preserve">One phrase appears </w:t>
+      </w:r>
+      <w:proofErr w:type="gramStart"/>
+      <w:r>
+        <w:t>again and again</w:t>
+      </w:r>
+      <w:proofErr w:type="gramEnd"/>
+      <w:r>
+        <w:t xml:space="preserve"> beneath the Magnificat:</w:t>
       </w:r>
     </w:p>
     <w:p>
@@ -9796,7 +10118,15 @@
         <w:pStyle w:val="SPBodyText"/>
       </w:pPr>
       <w:r>
-        <w:t>We can praise God in the midst of uncertainty.</w:t>
+        <w:t xml:space="preserve">We can praise God </w:t>
+      </w:r>
+      <w:proofErr w:type="gramStart"/>
+      <w:r>
+        <w:t>in the midst of</w:t>
+      </w:r>
+      <w:proofErr w:type="gramEnd"/>
+      <w:r>
+        <w:t xml:space="preserve"> uncertainty.</w:t>
       </w:r>
     </w:p>
     <w:p>
@@ -10719,7 +11049,15 @@
         <w:pStyle w:val="SPBodyText"/>
       </w:pPr>
       <w:r>
-        <w:t>These prayers have been handed down through generations. Some are centuries old. Others grew from particular traditions of devotion to Christ, the Blessed Virgin Mary, the angels and the saints.</w:t>
+        <w:t xml:space="preserve">These prayers have been handed down through generations. Some are centuries old. Others grew from </w:t>
+      </w:r>
+      <w:proofErr w:type="gramStart"/>
+      <w:r>
+        <w:t>particular traditions</w:t>
+      </w:r>
+      <w:proofErr w:type="gramEnd"/>
+      <w:r>
+        <w:t xml:space="preserve"> of devotion to Christ, the Blessed Virgin Mary, the angels and the saints.</w:t>
       </w:r>
     </w:p>
     <w:p>
@@ -11831,8 +12169,13 @@
       <w:pPr>
         <w:pStyle w:val="SPBodyText"/>
       </w:pPr>
-      <w:r>
-        <w:t>So begin simply.</w:t>
+      <w:proofErr w:type="gramStart"/>
+      <w:r>
+        <w:t>So</w:t>
+      </w:r>
+      <w:proofErr w:type="gramEnd"/>
+      <w:r>
+        <w:t xml:space="preserve"> begin simply.</w:t>
       </w:r>
     </w:p>
     <w:p>
@@ -11967,7 +12310,15 @@
         <w:t>Annunciation</w:t>
       </w:r>
       <w:r>
-        <w:t>, when the Angel Gabriel announced to Mary that she would become the Mother of the Son of God.</w:t>
+        <w:t xml:space="preserve">, when the Angel Gabriel announced to Mary that she would become the </w:t>
+      </w:r>
+      <w:proofErr w:type="gramStart"/>
+      <w:r>
+        <w:t>Mother</w:t>
+      </w:r>
+      <w:proofErr w:type="gramEnd"/>
+      <w:r>
+        <w:t xml:space="preserve"> of the Son of God.</w:t>
       </w:r>
     </w:p>
     <w:p>
@@ -12021,7 +12372,15 @@
         <w:pStyle w:val="SPBodyText"/>
       </w:pPr>
       <w:r>
-        <w:t>The repeated prayer invites us to pause in the midst of ordinary life and remember the mystery at the heart of our faith:</w:t>
+        <w:t xml:space="preserve">The repeated prayer invites us to pause </w:t>
+      </w:r>
+      <w:proofErr w:type="gramStart"/>
+      <w:r>
+        <w:t>in the midst of</w:t>
+      </w:r>
+      <w:proofErr w:type="gramEnd"/>
+      <w:r>
+        <w:t xml:space="preserve"> ordinary life and remember the mystery at the heart of our faith:</w:t>
       </w:r>
       <w:r>
         <w:t xml:space="preserve"> </w:t>
@@ -12031,7 +12390,23 @@
           <w:b/>
           <w:bCs/>
         </w:rPr>
-        <w:t>“And the Word was made flesh, and dwelt among us.”</w:t>
+        <w:t xml:space="preserve">“And the Word was made </w:t>
+      </w:r>
+      <w:proofErr w:type="gramStart"/>
+      <w:r>
+        <w:rPr>
+          <w:b/>
+          <w:bCs/>
+        </w:rPr>
+        <w:t>flesh, and</w:t>
+      </w:r>
+      <w:proofErr w:type="gramEnd"/>
+      <w:r>
+        <w:rPr>
+          <w:b/>
+          <w:bCs/>
+        </w:rPr>
+        <w:t xml:space="preserve"> dwelt among us.”</w:t>
       </w:r>
     </w:p>
     <w:p>
@@ -12419,7 +12794,15 @@
         <w:pStyle w:val="SPPrayerEnglish"/>
       </w:pPr>
       <w:r>
-        <w:t xml:space="preserve">Pour forth, we beseech Thee, O Lord, Thy grace into our hearts, that we to whom the Incarnation of Christ, Thy Son, was made known by the message of an angel, may by His Passion and Cross be brought to the glory of His resurrection. Through the same Christ our Lord. </w:t>
+        <w:t xml:space="preserve">Pour forth, we beseech Thee, O Lord, </w:t>
+      </w:r>
+      <w:proofErr w:type="gramStart"/>
+      <w:r>
+        <w:t>Thy</w:t>
+      </w:r>
+      <w:proofErr w:type="gramEnd"/>
+      <w:r>
+        <w:t xml:space="preserve"> grace into our hearts, that we to whom the Incarnation of Christ, Thy Son, was made known by the message of an angel, may by His Passion and Cross be brought to the glory of His resurrection. Through the same Christ our Lord. </w:t>
       </w:r>
     </w:p>
     <w:p>
@@ -13137,7 +13520,15 @@
         <w:pStyle w:val="SPBodyText"/>
       </w:pPr>
       <w:r>
-        <w:t>At noon, we pause in the midst of our work.</w:t>
+        <w:t xml:space="preserve">At noon, we pause </w:t>
+      </w:r>
+      <w:proofErr w:type="gramStart"/>
+      <w:r>
+        <w:t>in the midst of</w:t>
+      </w:r>
+      <w:proofErr w:type="gramEnd"/>
+      <w:r>
+        <w:t xml:space="preserve"> our work.</w:t>
       </w:r>
     </w:p>
     <w:p>
@@ -13222,7 +13613,15 @@
         <w:pStyle w:val="SPBodyText"/>
       </w:pPr>
       <w:r>
-        <w:t>Back to the truth that God is near.</w:t>
+        <w:t xml:space="preserve">Back to the truth that God is </w:t>
+      </w:r>
+      <w:proofErr w:type="gramStart"/>
+      <w:r>
+        <w:t>near</w:t>
+      </w:r>
+      <w:proofErr w:type="gramEnd"/>
+      <w:r>
+        <w:t>.</w:t>
       </w:r>
     </w:p>
     <w:p>
@@ -13313,37 +13712,495 @@
       <w:pPr>
         <w:pStyle w:val="SPBodyText"/>
         <w:jc w:val="center"/>
-      </w:pPr>
-    </w:p>
-    <w:p>
-      <w:pPr>
-        <w:pStyle w:val="SPBodyText"/>
-      </w:pPr>
-    </w:p>
-    <w:p>
-      <w:pPr>
-        <w:pStyle w:val="SPBodyText"/>
-      </w:pPr>
-    </w:p>
-    <w:p>
-      <w:pPr>
-        <w:pStyle w:val="SPBodyText"/>
-      </w:pPr>
-    </w:p>
-    <w:p>
-      <w:pPr>
-        <w:pStyle w:val="SPBodyText"/>
-      </w:pPr>
-      <w:r>
-        <w:rPr>
-          <w:b/>
-          <w:bCs/>
-        </w:rPr>
+        <w:rPr>
+          <w:rFonts w:ascii="Segoe UI Symbol" w:hAnsi="Segoe UI Symbol" w:cs="Segoe UI Symbol"/>
+        </w:rPr>
+      </w:pPr>
+      <w:r>
+        <w:rPr>
+          <w:rFonts w:ascii="Segoe UI Symbol" w:hAnsi="Segoe UI Symbol" w:cs="Segoe UI Symbol"/>
+        </w:rPr>
+        <w:lastRenderedPageBreak/>
+        <w:t>✠</w:t>
+      </w:r>
+    </w:p>
+    <w:p>
+      <w:pPr>
+        <w:pStyle w:val="SPBodyText"/>
+        <w:jc w:val="center"/>
+        <w:rPr>
+          <w:rFonts w:ascii="Segoe UI Symbol" w:hAnsi="Segoe UI Symbol" w:cs="Segoe UI Symbol"/>
+        </w:rPr>
+      </w:pPr>
+    </w:p>
+    <w:p>
+      <w:pPr>
+        <w:pStyle w:val="SPPrayerTitle"/>
+      </w:pPr>
+      <w:r>
+        <w:t>Anima Christi</w:t>
+      </w:r>
+    </w:p>
+    <w:p>
+      <w:pPr>
+        <w:pStyle w:val="SPBodyText"/>
+      </w:pPr>
+      <w:r>
+        <w:rPr>
+          <w:i/>
+          <w:iCs/>
+        </w:rPr>
+        <w:t>The Soul of Christ</w:t>
+      </w:r>
+    </w:p>
+    <w:p>
+      <w:pPr>
+        <w:pStyle w:val="SPBodyText"/>
+      </w:pPr>
+      <w:r>
+        <w:t xml:space="preserve">The </w:t>
+      </w:r>
+      <w:r>
+        <w:rPr>
+          <w:b/>
+          <w:bCs/>
+        </w:rPr>
+        <w:t>Anima Christi</w:t>
+      </w:r>
+      <w:r>
+        <w:t xml:space="preserve"> is an ancient Christian prayer traditionally associated with devotion to Christ and</w:t>
+      </w:r>
+      <w:proofErr w:type="gramStart"/>
+      <w:r>
+        <w:t>, in particular, with</w:t>
+      </w:r>
+      <w:proofErr w:type="gramEnd"/>
+      <w:r>
+        <w:t xml:space="preserve"> the Eucharist. Its origins are uncertain, but the prayer was already in use by the early sixteenth century and became especially beloved through its association with St. Ignatius of Loyola, who placed it at the beginning of his </w:t>
+      </w:r>
+      <w:r>
+        <w:rPr>
+          <w:i/>
+          <w:iCs/>
+        </w:rPr>
+        <w:t>Spiritual Exercises</w:t>
+      </w:r>
+      <w:r>
+        <w:t>.</w:t>
+      </w:r>
+    </w:p>
+    <w:p>
+      <w:pPr>
+        <w:pStyle w:val="SPBodyText"/>
+      </w:pPr>
+      <w:r>
+        <w:t>The prayer moves through the mysteries of Christ's Passion: His Body, Blood, wounds, and saving sacrifice. It is a prayer for sanctification, protection, perseverance, and final union with Christ.</w:t>
+      </w:r>
+    </w:p>
+    <w:p>
+      <w:pPr>
+        <w:pStyle w:val="SPBodyText"/>
+        <w:rPr>
+          <w:i/>
+          <w:iCs/>
+        </w:rPr>
+      </w:pPr>
+    </w:p>
+    <w:p>
+      <w:pPr>
+        <w:pStyle w:val="SPBodyText"/>
+      </w:pPr>
+      <w:r>
+        <w:rPr>
+          <w:i/>
+          <w:iCs/>
+        </w:rPr>
+        <w:t>Sanctify me. Save me. Wash me. Strengthen me. Hear me. Hide me. Defend me.</w:t>
+      </w:r>
+    </w:p>
+    <w:p>
+      <w:pPr>
+        <w:pStyle w:val="SPBodyText"/>
+      </w:pPr>
+      <w:r>
+        <w:t>And ultimately:</w:t>
+      </w:r>
+    </w:p>
+    <w:p>
+      <w:pPr>
+        <w:pStyle w:val="SPBodyText"/>
+      </w:pPr>
+      <w:r>
+        <w:rPr>
+          <w:i/>
+          <w:iCs/>
+        </w:rPr>
+        <w:t>Never permit me to be separated from You.</w:t>
+      </w:r>
+    </w:p>
+    <w:p>
+      <w:pPr>
+        <w:pStyle w:val="SPBodyText"/>
+      </w:pPr>
+    </w:p>
+    <w:p>
+      <w:pPr>
+        <w:pStyle w:val="SPBodyText"/>
+      </w:pPr>
+      <w:r>
+        <w:t xml:space="preserve">The Anima Christi is therefore more than a meditation on Christ's Passion. It is a prayer of </w:t>
+      </w:r>
+      <w:r>
+        <w:rPr>
+          <w:b/>
+          <w:bCs/>
+        </w:rPr>
+        <w:t>complete surrender</w:t>
+      </w:r>
+      <w:r>
+        <w:t>—asking that every part of our life may be drawn into the life of Christ.</w:t>
+      </w:r>
+    </w:p>
+    <w:p>
+      <w:pPr>
+        <w:pStyle w:val="SPBodyText"/>
+        <w:sectPr>
+          <w:type w:val="oddPage"/>
+          <w:pgSz w:w="7920" w:h="12240" w:code="6"/>
+          <w:pgMar w:top="1080" w:right="864" w:bottom="1080" w:left="1152" w:header="576" w:footer="576" w:gutter="0"/>
+          <w:cols w:space="720"/>
+          <w:titlePg/>
+          <w:docGrid w:linePitch="360"/>
+        </w:sectPr>
+      </w:pPr>
+    </w:p>
+    <w:p>
+      <w:pPr>
+        <w:pStyle w:val="SPLanguage"/>
+        <w:spacing w:before="200"/>
+      </w:pPr>
+      <w:r>
+        <w:lastRenderedPageBreak/>
+        <w:t xml:space="preserve">ENGLISH </w:t>
+      </w:r>
+    </w:p>
+    <w:p>
+      <w:pPr>
+        <w:pStyle w:val="SPLanguage"/>
+      </w:pPr>
+    </w:p>
+    <w:p>
+      <w:pPr>
+        <w:pStyle w:val="SPLanguage"/>
+        <w:spacing w:before="0"/>
+      </w:pPr>
+      <w:r>
+        <w:t>Soul of Christ, sanctify me.</w:t>
+      </w:r>
+      <w:r>
+        <w:br/>
+        <w:t>Body of Christ, save me.</w:t>
+      </w:r>
+      <w:r>
+        <w:br/>
+        <w:t>Blood of Christ, inebriate me.</w:t>
+      </w:r>
+      <w:r>
+        <w:br/>
+        <w:t>Water from the side of Christ, wash me.</w:t>
+      </w:r>
+    </w:p>
+    <w:p>
+      <w:pPr>
+        <w:pStyle w:val="SPLanguage"/>
+      </w:pPr>
+      <w:r>
+        <w:t>Passion of Christ, strengthen me.</w:t>
+      </w:r>
+      <w:r>
+        <w:br/>
+        <w:t>O good Jesus, hear me.</w:t>
+      </w:r>
+      <w:r>
+        <w:br/>
+        <w:t>Within Your wounds, hide me.</w:t>
+      </w:r>
+      <w:r>
+        <w:br/>
+        <w:t>Never permit me to be separated from You.</w:t>
+      </w:r>
+      <w:r>
+        <w:br/>
+        <w:t>From the malignant enemy, defend me.</w:t>
+      </w:r>
+    </w:p>
+    <w:p>
+      <w:pPr>
+        <w:pStyle w:val="SPLanguage"/>
+      </w:pPr>
+      <w:r>
+        <w:t>At the hour of my death, call me.</w:t>
+      </w:r>
+      <w:r>
+        <w:br/>
+        <w:t>And bid me come to You,</w:t>
+      </w:r>
+      <w:r>
+        <w:br/>
+        <w:t>that with Your Saints I may praise You</w:t>
+      </w:r>
+      <w:r>
+        <w:br/>
+        <w:t>for all eternity.</w:t>
+      </w:r>
+    </w:p>
+    <w:p>
+      <w:pPr>
+        <w:pStyle w:val="SPLanguage"/>
+      </w:pPr>
+      <w:r>
+        <w:t>Amen.</w:t>
+      </w:r>
+    </w:p>
+    <w:p>
+      <w:pPr>
+        <w:pStyle w:val="SPLanguage"/>
+        <w:sectPr>
+          <w:type w:val="evenPage"/>
+          <w:pgSz w:w="7920" w:h="12240" w:code="6"/>
+          <w:pgMar w:top="1080" w:right="864" w:bottom="1080" w:left="1152" w:header="576" w:footer="576" w:gutter="0"/>
+          <w:cols w:space="720"/>
+          <w:titlePg/>
+          <w:docGrid w:linePitch="360"/>
+        </w:sectPr>
+      </w:pPr>
+    </w:p>
+    <w:p>
+      <w:pPr>
+        <w:pStyle w:val="SPLanguage"/>
+      </w:pPr>
+      <w:r>
+        <w:lastRenderedPageBreak/>
+        <w:t>LATIN</w:t>
+      </w:r>
+    </w:p>
+    <w:p>
+      <w:pPr>
+        <w:pStyle w:val="SPPrayerLatin"/>
+        <w:rPr>
+          <w:iCs/>
+        </w:rPr>
+      </w:pPr>
+    </w:p>
+    <w:p>
+      <w:pPr>
+        <w:pStyle w:val="SPPrayerLatin"/>
+        <w:spacing w:before="240"/>
+        <w:rPr>
+          <w:iCs/>
+        </w:rPr>
+      </w:pPr>
+      <w:r>
+        <w:rPr>
+          <w:iCs/>
+        </w:rPr>
+        <w:t>Anima Christi, sanctifica me.</w:t>
+      </w:r>
+      <w:r>
+        <w:rPr>
+          <w:iCs/>
+        </w:rPr>
+        <w:br/>
+        <w:t>Corpus Christi, salva me.</w:t>
+      </w:r>
+      <w:r>
+        <w:rPr>
+          <w:iCs/>
+        </w:rPr>
+        <w:br/>
+        <w:t>Sanguis Christi, inebria me.</w:t>
+      </w:r>
+      <w:r>
+        <w:rPr>
+          <w:iCs/>
+        </w:rPr>
+        <w:br/>
+        <w:t>Aqua lateris Christi, lava me.</w:t>
+      </w:r>
+    </w:p>
+    <w:p>
+      <w:pPr>
+        <w:pStyle w:val="SPPrayerLatin"/>
+        <w:rPr>
+          <w:iCs/>
+        </w:rPr>
+      </w:pPr>
+      <w:r>
+        <w:rPr>
+          <w:iCs/>
+        </w:rPr>
+        <w:t>Passio Christi, conforta me.</w:t>
+      </w:r>
+      <w:r>
+        <w:rPr>
+          <w:iCs/>
+        </w:rPr>
+        <w:br/>
+        <w:t>O bone Iesu, exaudi me.</w:t>
+      </w:r>
+      <w:r>
+        <w:rPr>
+          <w:iCs/>
+        </w:rPr>
+        <w:br/>
+        <w:t>Intra tua vulnera absconde me.</w:t>
+      </w:r>
+      <w:r>
+        <w:rPr>
+          <w:iCs/>
+        </w:rPr>
+        <w:br/>
+        <w:t>Ne permittas me separari a te.</w:t>
+      </w:r>
+      <w:r>
+        <w:rPr>
+          <w:iCs/>
+        </w:rPr>
+        <w:br/>
+        <w:t>Ab hoste maligno defende me.</w:t>
+      </w:r>
+    </w:p>
+    <w:p>
+      <w:pPr>
+        <w:pStyle w:val="SPPrayerLatin"/>
+        <w:rPr>
+          <w:iCs/>
+        </w:rPr>
+      </w:pPr>
+      <w:r>
+        <w:rPr>
+          <w:iCs/>
+        </w:rPr>
+        <w:t>In hora mortis meae voca me.</w:t>
+      </w:r>
+      <w:r>
+        <w:rPr>
+          <w:iCs/>
+        </w:rPr>
+        <w:br/>
+        <w:t>Et iube me venire ad te,</w:t>
+      </w:r>
+      <w:r>
+        <w:rPr>
+          <w:iCs/>
+        </w:rPr>
+        <w:br/>
+        <w:t>ut cum Sanctis tuis laudem te</w:t>
+      </w:r>
+      <w:r>
+        <w:rPr>
+          <w:iCs/>
+        </w:rPr>
+        <w:br/>
+        <w:t>in saecula saeculorum.</w:t>
+      </w:r>
+    </w:p>
+    <w:p>
+      <w:pPr>
+        <w:pStyle w:val="SPPrayerLatin"/>
+        <w:rPr>
+          <w:iCs/>
+        </w:rPr>
+      </w:pPr>
+      <w:r>
+        <w:rPr>
+          <w:iCs/>
+        </w:rPr>
+        <w:t>Amen.</w:t>
+      </w:r>
+    </w:p>
+    <w:p>
+      <w:pPr>
+        <w:pStyle w:val="SPSectionTitle"/>
+        <w:sectPr>
+          <w:type w:val="oddPage"/>
+          <w:pgSz w:w="7920" w:h="12240" w:code="6"/>
+          <w:pgMar w:top="1080" w:right="864" w:bottom="1080" w:left="1152" w:header="576" w:footer="576" w:gutter="0"/>
+          <w:cols w:space="720"/>
+          <w:titlePg/>
+          <w:docGrid w:linePitch="360"/>
+        </w:sectPr>
+      </w:pPr>
+    </w:p>
+    <w:p>
+      <w:pPr>
+        <w:pStyle w:val="SPSectionTitle"/>
+      </w:pPr>
+      <w:r>
+        <w:lastRenderedPageBreak/>
+        <w:t>Scripture</w:t>
+      </w:r>
+    </w:p>
+    <w:p>
+      <w:pPr>
+        <w:pStyle w:val="SPScriptureReference"/>
+      </w:pPr>
+      <w:r>
+        <w:t>Luke 1: 28</w:t>
+      </w:r>
+    </w:p>
+    <w:p>
+      <w:pPr>
+        <w:pStyle w:val="SPScripture"/>
+      </w:pPr>
+      <w:r>
         <w:t xml:space="preserve"> </w:t>
       </w:r>
     </w:p>
+    <w:p>
+      <w:pPr>
+        <w:pStyle w:val="SPScripture"/>
+        <w:ind w:left="0"/>
+      </w:pPr>
+    </w:p>
+    <w:p>
+      <w:pPr>
+        <w:pStyle w:val="SPScriptureReference"/>
+        <w:sectPr>
+          <w:type w:val="evenPage"/>
+          <w:pgSz w:w="7920" w:h="12240" w:code="6"/>
+          <w:pgMar w:top="1080" w:right="864" w:bottom="1080" w:left="1152" w:header="576" w:footer="576" w:gutter="0"/>
+          <w:cols w:space="720"/>
+          <w:titlePg/>
+          <w:docGrid w:linePitch="360"/>
+        </w:sectPr>
+      </w:pPr>
+    </w:p>
+    <w:p>
+      <w:pPr>
+        <w:pStyle w:val="SPSectionTitle"/>
+      </w:pPr>
+      <w:r>
+        <w:lastRenderedPageBreak/>
+        <w:t>Reflection</w:t>
+      </w:r>
+    </w:p>
+    <w:p>
+      <w:pPr>
+        <w:pStyle w:val="SPBodyText"/>
+      </w:pPr>
+      <w:r>
+        <w:t xml:space="preserve"> </w:t>
+      </w:r>
+      <w:r>
+        <w:rPr>
+          <w:b/>
+          <w:bCs/>
+        </w:rPr>
+        <w:t>T</w:t>
+      </w:r>
+    </w:p>
     <w:sectPr>
-      <w:type w:val="oddPage"/>
       <w:pgSz w:w="7920" w:h="12240" w:code="6"/>
       <w:pgMar w:top="1080" w:right="864" w:bottom="1080" w:left="1152" w:header="576" w:footer="576" w:gutter="0"/>
       <w:cols w:space="720"/>
@@ -15255,12 +16112,11 @@
   </w:style>
   <w:style w:type="paragraph" w:customStyle="1" w:styleId="SPPrayerEnglish">
     <w:name w:val="SP Prayer English"/>
-    <w:basedOn w:val="SPBodyText"/>
+    <w:basedOn w:val="Normal"/>
     <w:qFormat/>
-    <w:rsid w:val="00066ABD"/>
+    <w:rsid w:val="0095058D"/>
     <w:pPr>
-      <w:spacing w:after="120" w:line="360" w:lineRule="auto"/>
-      <w:ind w:left="0" w:firstLine="0"/>
+      <w:ind w:left="0"/>
       <w:jc w:val="center"/>
     </w:pPr>
     <w:rPr>
@@ -15712,8 +16568,12 @@
     <w:qFormat/>
     <w:rsid w:val="00066ABD"/>
     <w:pPr>
+      <w:keepLines/>
       <w:spacing w:before="240"/>
     </w:pPr>
+    <w:rPr>
+      <w:color w:val="333333"/>
+    </w:rPr>
   </w:style>
   <w:style w:type="paragraph" w:customStyle="1" w:styleId="SPPronunciation">
     <w:name w:val="SP Pronunciation"/>

</xml_diff>

<commit_message>
Completed Guardian Angel. Set up structure for Faithful departed.
</commit_message>
<xml_diff>
--- a/manuscript/volume-1/sacrae-preces-volume-1.docx
+++ b/manuscript/volume-1/sacrae-preces-volume-1.docx
@@ -13902,20 +13902,36 @@
     <w:p>
       <w:pPr>
         <w:pStyle w:val="SPLanguage"/>
+        <w:keepLines/>
         <w:spacing w:before="0"/>
-      </w:pPr>
-      <w:r>
+        <w:rPr>
+          <w:color w:val="333333"/>
+        </w:rPr>
+      </w:pPr>
+      <w:r>
+        <w:rPr>
+          <w:color w:val="333333"/>
+        </w:rPr>
         <w:t>Soul of Christ, sanctify me.</w:t>
       </w:r>
       <w:r>
+        <w:rPr>
+          <w:color w:val="333333"/>
+        </w:rPr>
         <w:br/>
         <w:t>Body of Christ, save me.</w:t>
       </w:r>
       <w:r>
+        <w:rPr>
+          <w:color w:val="333333"/>
+        </w:rPr>
         <w:br/>
         <w:t>Blood of Christ, inebriate me.</w:t>
       </w:r>
       <w:r>
+        <w:rPr>
+          <w:color w:val="333333"/>
+        </w:rPr>
         <w:br/>
         <w:t>Water from the side of Christ, wash me.</w:t>
       </w:r>
@@ -13923,23 +13939,42 @@
     <w:p>
       <w:pPr>
         <w:pStyle w:val="SPLanguage"/>
-      </w:pPr>
-      <w:r>
+        <w:keepLines/>
+        <w:rPr>
+          <w:color w:val="333333"/>
+        </w:rPr>
+      </w:pPr>
+      <w:r>
+        <w:rPr>
+          <w:color w:val="333333"/>
+        </w:rPr>
         <w:t>Passion of Christ, strengthen me.</w:t>
       </w:r>
       <w:r>
+        <w:rPr>
+          <w:color w:val="333333"/>
+        </w:rPr>
         <w:br/>
         <w:t>O good Jesus, hear me.</w:t>
       </w:r>
       <w:r>
+        <w:rPr>
+          <w:color w:val="333333"/>
+        </w:rPr>
         <w:br/>
         <w:t>Within Your wounds, hide me.</w:t>
       </w:r>
       <w:r>
+        <w:rPr>
+          <w:color w:val="333333"/>
+        </w:rPr>
         <w:br/>
         <w:t>Never permit me to be separated from You.</w:t>
       </w:r>
       <w:r>
+        <w:rPr>
+          <w:color w:val="333333"/>
+        </w:rPr>
         <w:br/>
         <w:t>From the malignant enemy, defend me.</w:t>
       </w:r>
@@ -13947,19 +13982,35 @@
     <w:p>
       <w:pPr>
         <w:pStyle w:val="SPLanguage"/>
-      </w:pPr>
-      <w:r>
+        <w:keepLines/>
+        <w:rPr>
+          <w:color w:val="333333"/>
+        </w:rPr>
+      </w:pPr>
+      <w:r>
+        <w:rPr>
+          <w:color w:val="333333"/>
+        </w:rPr>
         <w:t>At the hour of my death, call me.</w:t>
       </w:r>
       <w:r>
+        <w:rPr>
+          <w:color w:val="333333"/>
+        </w:rPr>
         <w:br/>
         <w:t>And bid me come to You,</w:t>
       </w:r>
       <w:r>
+        <w:rPr>
+          <w:color w:val="333333"/>
+        </w:rPr>
         <w:br/>
         <w:t>that with Your Saints I may praise You</w:t>
       </w:r>
       <w:r>
+        <w:rPr>
+          <w:color w:val="333333"/>
+        </w:rPr>
         <w:br/>
         <w:t>for all eternity.</w:t>
       </w:r>
@@ -13967,8 +14018,15 @@
     <w:p>
       <w:pPr>
         <w:pStyle w:val="SPLanguage"/>
-      </w:pPr>
-      <w:r>
+        <w:keepLines/>
+        <w:rPr>
+          <w:color w:val="333333"/>
+        </w:rPr>
+      </w:pPr>
+      <w:r>
+        <w:rPr>
+          <w:color w:val="333333"/>
+        </w:rPr>
         <w:t>Amen.</w:t>
       </w:r>
     </w:p>
@@ -14601,6 +14659,107 @@
     <w:p>
       <w:pPr>
         <w:pStyle w:val="SPBodyText"/>
+      </w:pPr>
+      <w:r>
+        <w:t>Many of us first learned this prayer as children. Its simple words were among the first prayers we were taught, perhaps said beside our beds or taught to us by our parents and grandparents.</w:t>
+      </w:r>
+    </w:p>
+    <w:p>
+      <w:pPr>
+        <w:pStyle w:val="SPBodyText"/>
+      </w:pPr>
+      <w:r>
+        <w:t xml:space="preserve">As children, we may have understood little of the mystery behind the words. Yet </w:t>
+      </w:r>
+      <w:r>
+        <w:t>we do not outgrow this prayer</w:t>
+      </w:r>
+      <w:r>
+        <w:t>. We remain in need of God's protection, guidance, and care throughout every stage of our lives.</w:t>
+      </w:r>
+    </w:p>
+    <w:p>
+      <w:pPr>
+        <w:pStyle w:val="SPBodyText"/>
+      </w:pPr>
+      <w:r>
+        <w:t>The Church teaches that God gives His angels a particular role in His providence. They serve Him and minister to His people, accompanying us as we journey toward Him.</w:t>
+      </w:r>
+    </w:p>
+    <w:p>
+      <w:pPr>
+        <w:pStyle w:val="SPBodyText"/>
+      </w:pPr>
+      <w:r>
+        <w:t>The Guardian Angel Prayer reminds us that we do not walk this journey alone. In moments of uncertainty, temptation, danger, or simply in the ordinary circumstances of each day, we can entrust ourselves to God's loving care.</w:t>
+      </w:r>
+    </w:p>
+    <w:p>
+      <w:pPr>
+        <w:pStyle w:val="SPBodyText"/>
+      </w:pPr>
+      <w:r>
+        <w:t xml:space="preserve">The prayer we learned as children can become, with the understanding of an adult, a prayer of </w:t>
+      </w:r>
+      <w:r>
+        <w:rPr>
+          <w:b/>
+          <w:bCs/>
+        </w:rPr>
+        <w:t>trust</w:t>
+      </w:r>
+      <w:r>
+        <w:t>:</w:t>
+      </w:r>
+    </w:p>
+    <w:p>
+      <w:pPr>
+        <w:pStyle w:val="SPBodyText"/>
+        <w:rPr>
+          <w:b/>
+          <w:bCs/>
+        </w:rPr>
+      </w:pPr>
+    </w:p>
+    <w:p>
+      <w:pPr>
+        <w:pStyle w:val="SPBodyText"/>
+      </w:pPr>
+      <w:r>
+        <w:rPr>
+          <w:b/>
+          <w:bCs/>
+        </w:rPr>
+        <w:t>To light.</w:t>
+      </w:r>
+      <w:r>
+        <w:rPr>
+          <w:b/>
+          <w:bCs/>
+        </w:rPr>
+        <w:br/>
+        <w:t>To guard.</w:t>
+      </w:r>
+      <w:r>
+        <w:rPr>
+          <w:b/>
+          <w:bCs/>
+        </w:rPr>
+        <w:br/>
+        <w:t>To rule.</w:t>
+      </w:r>
+      <w:r>
+        <w:rPr>
+          <w:b/>
+          <w:bCs/>
+        </w:rPr>
+        <w:br/>
+        <w:t>And to guide.</w:t>
+      </w:r>
+    </w:p>
+    <w:p>
+      <w:pPr>
+        <w:pStyle w:val="SPBodyText"/>
         <w:sectPr>
           <w:type w:val="oddPage"/>
           <w:pgSz w:w="7920" w:h="12240" w:code="6"/>
@@ -14618,6 +14777,43 @@
       <w:r>
         <w:lastRenderedPageBreak/>
         <w:t>ENGLISH</w:t>
+      </w:r>
+    </w:p>
+    <w:p>
+      <w:pPr>
+        <w:pStyle w:val="SPPrayerEnglish"/>
+      </w:pPr>
+    </w:p>
+    <w:p>
+      <w:pPr>
+        <w:pStyle w:val="SPPrayerEnglish"/>
+      </w:pPr>
+      <w:r>
+        <w:t xml:space="preserve">Angel of God, my guardian dear, </w:t>
+      </w:r>
+    </w:p>
+    <w:p>
+      <w:pPr>
+        <w:pStyle w:val="SPPrayerEnglish"/>
+      </w:pPr>
+      <w:r>
+        <w:t xml:space="preserve">to whom God's love commits me here, </w:t>
+      </w:r>
+    </w:p>
+    <w:p>
+      <w:pPr>
+        <w:pStyle w:val="SPPrayerEnglish"/>
+      </w:pPr>
+      <w:r>
+        <w:t xml:space="preserve">ever this day be at my side, </w:t>
+      </w:r>
+    </w:p>
+    <w:p>
+      <w:pPr>
+        <w:pStyle w:val="SPPrayerEnglish"/>
+      </w:pPr>
+      <w:r>
+        <w:t xml:space="preserve">to light and guard, to rule and guide. </w:t>
       </w:r>
     </w:p>
     <w:p>
@@ -14632,6 +14828,9 @@
           <w:docGrid w:linePitch="360"/>
         </w:sectPr>
       </w:pPr>
+      <w:r>
+        <w:t>Amen.</w:t>
+      </w:r>
     </w:p>
     <w:p>
       <w:pPr>
@@ -14640,6 +14839,60 @@
       <w:r>
         <w:lastRenderedPageBreak/>
         <w:t>LATIN</w:t>
+      </w:r>
+    </w:p>
+    <w:p>
+      <w:pPr>
+        <w:pStyle w:val="SPPrayerLatin"/>
+      </w:pPr>
+    </w:p>
+    <w:p>
+      <w:pPr>
+        <w:pStyle w:val="SPPrayerLatin"/>
+        <w:spacing w:before="120"/>
+        <w:rPr>
+          <w:iCs/>
+          <w:lang w:val="en-ZA"/>
+        </w:rPr>
+      </w:pPr>
+      <w:r>
+        <w:rPr>
+          <w:iCs/>
+          <w:lang w:val="en-ZA"/>
+        </w:rPr>
+        <w:t xml:space="preserve">Angele Dei, qui custos es mei, </w:t>
+      </w:r>
+    </w:p>
+    <w:p>
+      <w:pPr>
+        <w:pStyle w:val="SPPrayerLatin"/>
+        <w:rPr>
+          <w:iCs/>
+          <w:lang w:val="en-ZA"/>
+        </w:rPr>
+      </w:pPr>
+      <w:r>
+        <w:rPr>
+          <w:iCs/>
+          <w:lang w:val="en-ZA"/>
+        </w:rPr>
+        <w:t xml:space="preserve">me, tibi commissum pietate superna, </w:t>
+      </w:r>
+    </w:p>
+    <w:p>
+      <w:pPr>
+        <w:pStyle w:val="SPPrayerLatin"/>
+        <w:rPr>
+          <w:iCs/>
+          <w:lang w:val="en-ZA"/>
+        </w:rPr>
+      </w:pPr>
+      <w:r>
+        <w:rPr>
+          <w:iCs/>
+          <w:lang w:val="en-ZA"/>
+        </w:rPr>
+        <w:t xml:space="preserve">illuminato, custodi, rege et guberna. </w:t>
       </w:r>
     </w:p>
     <w:p>
@@ -14654,6 +14907,13 @@
           <w:docGrid w:linePitch="360"/>
         </w:sectPr>
       </w:pPr>
+      <w:r>
+        <w:rPr>
+          <w:iCs/>
+          <w:lang w:val="en-ZA"/>
+        </w:rPr>
+        <w:t>Amen.</w:t>
+      </w:r>
     </w:p>
     <w:p>
       <w:pPr>
@@ -14667,6 +14927,358 @@
     <w:p>
       <w:pPr>
         <w:pStyle w:val="SPScriptureReference"/>
+      </w:pPr>
+    </w:p>
+    <w:p>
+      <w:pPr>
+        <w:pStyle w:val="SPScriptureReference"/>
+      </w:pPr>
+      <w:r>
+        <w:t>Matthew 18:10</w:t>
+      </w:r>
+      <w:r>
+        <w:t>-11</w:t>
+      </w:r>
+    </w:p>
+    <w:p>
+      <w:pPr>
+        <w:pStyle w:val="SPScripture"/>
+      </w:pPr>
+      <w:r>
+        <w:t xml:space="preserve">“See that you do not despise one of these little ones; for I tell you that in heaven their angels always behold the face of my Father who is in heaven. </w:t>
+      </w:r>
+    </w:p>
+    <w:p>
+      <w:pPr>
+        <w:pStyle w:val="SPScriptureReference"/>
+      </w:pPr>
+      <w:r>
+        <w:t>Hebrews 1:14</w:t>
+      </w:r>
+    </w:p>
+    <w:p>
+      <w:pPr>
+        <w:pStyle w:val="SPScripture"/>
+      </w:pPr>
+      <w:r>
+        <w:t>Are the not all ministering spirits sent forth to serve, for the sake of those who are to obtain salvation?</w:t>
+      </w:r>
+    </w:p>
+    <w:p>
+      <w:pPr>
+        <w:pStyle w:val="SPScriptureReference"/>
+      </w:pPr>
+      <w:r>
+        <w:t>Psalm 91:11-12</w:t>
+      </w:r>
+    </w:p>
+    <w:p>
+      <w:pPr>
+        <w:pStyle w:val="SPScripture"/>
+      </w:pPr>
+      <w:r>
+        <w:t>For he will give his angels charge of you to guard you in all your ways. On their hands they will bear you up, lest you dash your foot against a stone.</w:t>
+      </w:r>
+    </w:p>
+    <w:p>
+      <w:pPr>
+        <w:pStyle w:val="SPScriptureReference"/>
+      </w:pPr>
+      <w:r>
+        <w:t>Exodus 23:20</w:t>
+      </w:r>
+    </w:p>
+    <w:p>
+      <w:pPr>
+        <w:pStyle w:val="SPScripture"/>
+      </w:pPr>
+      <w:r>
+        <w:t>“Behold, I send an angel before you, to guard you on the way and to bring you to the place which I have prepared.”</w:t>
+      </w:r>
+    </w:p>
+    <w:p>
+      <w:pPr>
+        <w:pStyle w:val="SPScriptureReference"/>
+      </w:pPr>
+      <w:r>
+        <w:t>Psalm 34:7</w:t>
+      </w:r>
+    </w:p>
+    <w:p>
+      <w:pPr>
+        <w:pStyle w:val="SPScripture"/>
+        <w:sectPr>
+          <w:type w:val="oddPage"/>
+          <w:pgSz w:w="7920" w:h="12240" w:code="6"/>
+          <w:pgMar w:top="1080" w:right="864" w:bottom="1080" w:left="1152" w:header="576" w:footer="576" w:gutter="0"/>
+          <w:cols w:space="720"/>
+          <w:titlePg/>
+          <w:docGrid w:linePitch="360"/>
+        </w:sectPr>
+      </w:pPr>
+      <w:r>
+        <w:t xml:space="preserve">The angel of the Lord encamps around those who fear </w:t>
+      </w:r>
+      <w:proofErr w:type="gramStart"/>
+      <w:r>
+        <w:t>him, and</w:t>
+      </w:r>
+      <w:proofErr w:type="gramEnd"/>
+      <w:r>
+        <w:t xml:space="preserve"> delivers them.</w:t>
+      </w:r>
+    </w:p>
+    <w:p>
+      <w:pPr>
+        <w:pStyle w:val="SPSectionTitle"/>
+      </w:pPr>
+      <w:r>
+        <w:lastRenderedPageBreak/>
+        <w:t>REFLECTION</w:t>
+      </w:r>
+    </w:p>
+    <w:p>
+      <w:pPr>
+        <w:pStyle w:val="SPBodyText"/>
+        <w:rPr>
+          <w:b/>
+          <w:bCs/>
+        </w:rPr>
+      </w:pPr>
+      <w:r>
+        <w:rPr>
+          <w:b/>
+          <w:bCs/>
+        </w:rPr>
+        <w:t>The Care We Cannot Always See</w:t>
+      </w:r>
+    </w:p>
+    <w:p>
+      <w:pPr>
+        <w:pStyle w:val="SPBodyText"/>
+      </w:pPr>
+      <w:r>
+        <w:t>There are many things in our lives that we cannot see, yet we know them by their effects.</w:t>
+      </w:r>
+    </w:p>
+    <w:p>
+      <w:pPr>
+        <w:pStyle w:val="SPBodyText"/>
+      </w:pPr>
+      <w:r>
+        <w:t>The Guardian Angel Prayer invites us to remember that God's care for us is not limited to what we can see or understand. He gives His angels to serve Him and to accompany His people, and through them we are reminded that we never walk alone.</w:t>
+      </w:r>
+    </w:p>
+    <w:p>
+      <w:pPr>
+        <w:pStyle w:val="SPBodyText"/>
+      </w:pPr>
+      <w:r>
+        <w:t xml:space="preserve">Perhaps this is why the prayer is so easily remembered from childhood. Its words are simple enough for a child to learn, yet deep enough for an adult to return to </w:t>
+      </w:r>
+      <w:r>
+        <w:t>throughout a lifetime.</w:t>
+      </w:r>
+    </w:p>
+    <w:p>
+      <w:pPr>
+        <w:pStyle w:val="SPBodyText"/>
+        <w:rPr>
+          <w:b/>
+          <w:bCs/>
+        </w:rPr>
+      </w:pPr>
+    </w:p>
+    <w:p>
+      <w:pPr>
+        <w:pStyle w:val="SPBodyText"/>
+      </w:pPr>
+      <w:r>
+        <w:rPr>
+          <w:b/>
+          <w:bCs/>
+        </w:rPr>
+        <w:t>To light.</w:t>
+      </w:r>
+      <w:r>
+        <w:rPr>
+          <w:b/>
+          <w:bCs/>
+        </w:rPr>
+        <w:br/>
+        <w:t>To guard.</w:t>
+      </w:r>
+      <w:r>
+        <w:rPr>
+          <w:b/>
+          <w:bCs/>
+        </w:rPr>
+        <w:br/>
+        <w:t>To rule.</w:t>
+      </w:r>
+      <w:r>
+        <w:rPr>
+          <w:b/>
+          <w:bCs/>
+        </w:rPr>
+        <w:br/>
+        <w:t>And to guide.</w:t>
+      </w:r>
+    </w:p>
+    <w:p>
+      <w:pPr>
+        <w:pStyle w:val="SPBodyText"/>
+      </w:pPr>
+    </w:p>
+    <w:p>
+      <w:pPr>
+        <w:pStyle w:val="SPBodyText"/>
+      </w:pPr>
+      <w:r>
+        <w:t>These four words describe a beautiful prayer for the journey of life.</w:t>
+      </w:r>
+      <w:r>
+        <w:t xml:space="preserve"> </w:t>
+      </w:r>
+      <w:r>
+        <w:t xml:space="preserve">We ask to be </w:t>
+      </w:r>
+      <w:r>
+        <w:rPr>
+          <w:b/>
+          <w:bCs/>
+        </w:rPr>
+        <w:t>lighted</w:t>
+      </w:r>
+      <w:r>
+        <w:t xml:space="preserve"> when the way before us is uncertain.</w:t>
+      </w:r>
+      <w:r>
+        <w:br/>
+        <w:t xml:space="preserve">We ask to be </w:t>
+      </w:r>
+      <w:r>
+        <w:rPr>
+          <w:b/>
+          <w:bCs/>
+        </w:rPr>
+        <w:t>guarded</w:t>
+      </w:r>
+      <w:r>
+        <w:t xml:space="preserve"> when we are vulnerable or afraid.</w:t>
+      </w:r>
+      <w:r>
+        <w:br/>
+        <w:t xml:space="preserve">We ask to be </w:t>
+      </w:r>
+      <w:r>
+        <w:rPr>
+          <w:b/>
+          <w:bCs/>
+        </w:rPr>
+        <w:t>ruled</w:t>
+      </w:r>
+      <w:r>
+        <w:t xml:space="preserve"> when our own desires threaten to lead us away from God.</w:t>
+      </w:r>
+      <w:r>
+        <w:br/>
+        <w:t xml:space="preserve">And we ask to be </w:t>
+      </w:r>
+      <w:r>
+        <w:rPr>
+          <w:b/>
+          <w:bCs/>
+        </w:rPr>
+        <w:t>guided</w:t>
+      </w:r>
+      <w:r>
+        <w:t xml:space="preserve"> when we do not know which path to take.</w:t>
+      </w:r>
+    </w:p>
+    <w:p>
+      <w:pPr>
+        <w:pStyle w:val="SPBodyText"/>
+      </w:pPr>
+      <w:r>
+        <w:lastRenderedPageBreak/>
+        <w:t>The presence of a guardian angel does not mean that we will never suffer, make mistakes, or encounter danger. Rather, it reminds us that God's providence remains with us even in those moments. His care is often quiet. Sometimes we may recognise it only afterwards.</w:t>
+      </w:r>
+    </w:p>
+    <w:p>
+      <w:pPr>
+        <w:pStyle w:val="SPBodyText"/>
+      </w:pPr>
+      <w:r>
+        <w:t>There are moments when we may look back upon our lives and wonder how we came through a particular trial, why a certain path opened before us, or why another was closed. We cannot always know what unseen help accompanied us.</w:t>
+      </w:r>
+    </w:p>
+    <w:p>
+      <w:pPr>
+        <w:pStyle w:val="SPBodyText"/>
+      </w:pPr>
+    </w:p>
+    <w:p>
+      <w:pPr>
+        <w:pStyle w:val="SPBodyText"/>
+      </w:pPr>
+      <w:r>
+        <w:t>But we can trust the One who sees what we cannot.</w:t>
+      </w:r>
+    </w:p>
+    <w:p>
+      <w:pPr>
+        <w:pStyle w:val="SPBodyText"/>
+      </w:pPr>
+    </w:p>
+    <w:p>
+      <w:pPr>
+        <w:pStyle w:val="SPBodyText"/>
+      </w:pPr>
+      <w:r>
+        <w:t xml:space="preserve">The Guardian Angel Prayer therefore becomes more than a prayer we learned as children. It becomes a prayer of </w:t>
+      </w:r>
+      <w:r>
+        <w:rPr>
+          <w:b/>
+          <w:bCs/>
+        </w:rPr>
+        <w:t>trust</w:t>
+      </w:r>
+      <w:r>
+        <w:t>.</w:t>
+      </w:r>
+    </w:p>
+    <w:p>
+      <w:pPr>
+        <w:pStyle w:val="SPBodyText"/>
+      </w:pPr>
+      <w:r>
+        <w:t>At the beginning of the day, we can entrust ourselves to God's care.</w:t>
+      </w:r>
+      <w:r>
+        <w:br/>
+      </w:r>
+    </w:p>
+    <w:p>
+      <w:pPr>
+        <w:pStyle w:val="SPBodyText"/>
+      </w:pPr>
+      <w:r>
+        <w:t>When we are uncertain, we can ask for guidance.</w:t>
+      </w:r>
+      <w:r>
+        <w:br/>
+        <w:t>When we are afraid, we can remember that we are not abandoned.</w:t>
+      </w:r>
+      <w:r>
+        <w:br/>
+        <w:t>And at the end of the day, we can give thanks for the protection we may never have noticed.</w:t>
+      </w:r>
+    </w:p>
+    <w:p>
+      <w:pPr>
+        <w:pStyle w:val="SPBodyText"/>
         <w:sectPr>
           <w:type w:val="evenPage"/>
           <w:pgSz w:w="7920" w:h="12240" w:code="6"/>
@@ -14676,6 +15288,188 @@
           <w:docGrid w:linePitch="360"/>
         </w:sectPr>
       </w:pPr>
+    </w:p>
+    <w:p>
+      <w:pPr>
+        <w:pStyle w:val="SPBodyText"/>
+      </w:pPr>
+      <w:r>
+        <w:lastRenderedPageBreak/>
+        <w:t>The prayer is short enough to say in a moment.</w:t>
+      </w:r>
+    </w:p>
+    <w:p>
+      <w:pPr>
+        <w:pStyle w:val="SPBodyText"/>
+      </w:pPr>
+      <w:r>
+        <w:t>But the truth it teaches us is worth carrying throughout a lifetime:</w:t>
+      </w:r>
+    </w:p>
+    <w:p>
+      <w:pPr>
+        <w:pStyle w:val="SPBodyText"/>
+        <w:rPr>
+          <w:b/>
+          <w:bCs/>
+        </w:rPr>
+      </w:pPr>
+    </w:p>
+    <w:p>
+      <w:pPr>
+        <w:pStyle w:val="SPBodyText"/>
+        <w:rPr>
+          <w:b/>
+          <w:bCs/>
+        </w:rPr>
+        <w:sectPr>
+          <w:type w:val="evenPage"/>
+          <w:pgSz w:w="7920" w:h="12240" w:code="6"/>
+          <w:pgMar w:top="1080" w:right="864" w:bottom="1080" w:left="1152" w:header="576" w:footer="576" w:gutter="0"/>
+          <w:cols w:space="720"/>
+          <w:titlePg/>
+          <w:docGrid w:linePitch="360"/>
+        </w:sectPr>
+      </w:pPr>
+      <w:r>
+        <w:rPr>
+          <w:b/>
+          <w:bCs/>
+        </w:rPr>
+        <w:t>God is near.</w:t>
+      </w:r>
+      <w:r>
+        <w:rPr>
+          <w:b/>
+          <w:bCs/>
+        </w:rPr>
+        <w:br/>
+        <w:t>His care surrounds us.</w:t>
+      </w:r>
+      <w:r>
+        <w:rPr>
+          <w:b/>
+          <w:bCs/>
+        </w:rPr>
+        <w:br/>
+        <w:t>And we never walk toward Him alone.</w:t>
+      </w:r>
+    </w:p>
+    <w:p>
+      <w:pPr>
+        <w:pStyle w:val="SPBodyText"/>
+        <w:jc w:val="center"/>
+        <w:rPr>
+          <w:rFonts w:ascii="Segoe UI Symbol" w:hAnsi="Segoe UI Symbol" w:cs="Segoe UI Symbol"/>
+        </w:rPr>
+      </w:pPr>
+      <w:r>
+        <w:rPr>
+          <w:rFonts w:ascii="Segoe UI Symbol" w:hAnsi="Segoe UI Symbol" w:cs="Segoe UI Symbol"/>
+        </w:rPr>
+        <w:lastRenderedPageBreak/>
+        <w:t>✠</w:t>
+      </w:r>
+    </w:p>
+    <w:p>
+      <w:pPr>
+        <w:pStyle w:val="SPBodyText"/>
+        <w:jc w:val="center"/>
+        <w:rPr>
+          <w:rFonts w:ascii="Segoe UI Symbol" w:hAnsi="Segoe UI Symbol" w:cs="Segoe UI Symbol"/>
+        </w:rPr>
+      </w:pPr>
+    </w:p>
+    <w:p>
+      <w:pPr>
+        <w:pStyle w:val="SPPrayerTitle"/>
+        <w:sectPr>
+          <w:type w:val="oddPage"/>
+          <w:pgSz w:w="7920" w:h="12240" w:code="6"/>
+          <w:pgMar w:top="1080" w:right="864" w:bottom="1080" w:left="1152" w:header="576" w:footer="576" w:gutter="0"/>
+          <w:cols w:space="720"/>
+          <w:titlePg/>
+          <w:docGrid w:linePitch="360"/>
+        </w:sectPr>
+      </w:pPr>
+      <w:r>
+        <w:t>Prayer for the faithful departed</w:t>
+      </w:r>
+    </w:p>
+    <w:p>
+      <w:pPr>
+        <w:pStyle w:val="SPLanguage"/>
+        <w:spacing w:before="600"/>
+      </w:pPr>
+      <w:r>
+        <w:lastRenderedPageBreak/>
+        <w:tab/>
+        <w:t>ENGLISH</w:t>
+      </w:r>
+    </w:p>
+    <w:p>
+      <w:pPr>
+        <w:pStyle w:val="SPPrayerEnglish"/>
+      </w:pPr>
+      <w:r>
+        <w:tab/>
+      </w:r>
+    </w:p>
+    <w:p>
+      <w:pPr>
+        <w:sectPr>
+          <w:type w:val="evenPage"/>
+          <w:pgSz w:w="7920" w:h="12240" w:code="6"/>
+          <w:pgMar w:top="1080" w:right="864" w:bottom="1080" w:left="1152" w:header="576" w:footer="576" w:gutter="0"/>
+          <w:cols w:space="720"/>
+          <w:titlePg/>
+          <w:docGrid w:linePitch="360"/>
+        </w:sectPr>
+      </w:pPr>
+    </w:p>
+    <w:p>
+      <w:pPr>
+        <w:pStyle w:val="SPLanguage"/>
+      </w:pPr>
+      <w:r>
+        <w:lastRenderedPageBreak/>
+        <w:t>LATIN</w:t>
+      </w:r>
+    </w:p>
+    <w:p>
+      <w:pPr>
+        <w:pStyle w:val="SPPrayerLatin"/>
+      </w:pPr>
+    </w:p>
+    <w:p>
+      <w:pPr>
+        <w:pStyle w:val="SPPrayerLatin"/>
+        <w:sectPr>
+          <w:type w:val="oddPage"/>
+          <w:pgSz w:w="7920" w:h="12240" w:code="6"/>
+          <w:pgMar w:top="1080" w:right="864" w:bottom="1080" w:left="1152" w:header="576" w:footer="576" w:gutter="0"/>
+          <w:cols w:space="720"/>
+          <w:titlePg/>
+          <w:docGrid w:linePitch="360"/>
+        </w:sectPr>
+      </w:pPr>
+    </w:p>
+    <w:p>
+      <w:pPr>
+        <w:pStyle w:val="SPSectionTitle"/>
+        <w:sectPr>
+          <w:type w:val="evenPage"/>
+          <w:pgSz w:w="7920" w:h="12240" w:code="6"/>
+          <w:pgMar w:top="1080" w:right="864" w:bottom="1080" w:left="1152" w:header="576" w:footer="576" w:gutter="0"/>
+          <w:cols w:space="720"/>
+          <w:titlePg/>
+          <w:docGrid w:linePitch="360"/>
+        </w:sectPr>
+      </w:pPr>
+      <w:r>
+        <w:lastRenderedPageBreak/>
+        <w:t>SCRIPTURE</w:t>
+      </w:r>
     </w:p>
     <w:p>
       <w:pPr>
@@ -17065,12 +17859,8 @@
     <w:qFormat/>
     <w:rsid w:val="00066ABD"/>
     <w:pPr>
-      <w:keepLines/>
       <w:spacing w:before="240"/>
     </w:pPr>
-    <w:rPr>
-      <w:color w:val="333333"/>
-    </w:rPr>
   </w:style>
   <w:style w:type="paragraph" w:customStyle="1" w:styleId="SPPronunciation">
     <w:name w:val="SP Pronunciation"/>

</xml_diff>

<commit_message>
Set up structure for Faithful departed, Sacred Praises and Night Prayer
</commit_message>
<xml_diff>
--- a/manuscript/volume-1/sacrae-preces-volume-1.docx
+++ b/manuscript/volume-1/sacrae-preces-volume-1.docx
@@ -74,7 +74,6 @@
           <w:szCs w:val="18"/>
         </w:rPr>
       </w:pPr>
-      <w:proofErr w:type="spellStart"/>
       <w:r>
         <w:rPr>
           <w:rStyle w:val="SPPrayerResponseCS"/>
@@ -82,17 +81,7 @@
           <w:sz w:val="48"/>
           <w:szCs w:val="18"/>
         </w:rPr>
-        <w:t>Sacrea</w:t>
-      </w:r>
-      <w:proofErr w:type="spellEnd"/>
-      <w:r>
-        <w:rPr>
-          <w:rStyle w:val="SPPrayerResponseCS"/>
-          <w:i w:val="0"/>
-          <w:sz w:val="48"/>
-          <w:szCs w:val="18"/>
-        </w:rPr>
-        <w:t xml:space="preserve"> preces</w:t>
+        <w:t>Sacrea preces</w:t>
       </w:r>
     </w:p>
     <w:p>
@@ -443,15 +432,7 @@
         <w:pStyle w:val="SPBodyText"/>
       </w:pPr>
       <w:r>
-        <w:t xml:space="preserve">We can spend our days surrounded by noise, responsibilities, conversations, messages, and countless things competing for our attention. </w:t>
-      </w:r>
-      <w:proofErr w:type="gramStart"/>
-      <w:r>
-        <w:t>In the midst of</w:t>
-      </w:r>
-      <w:proofErr w:type="gramEnd"/>
-      <w:r>
-        <w:t xml:space="preserve"> all of this, prayer calls us to stop. To become still. To turn our hearts towards God.</w:t>
+        <w:t>We can spend our days surrounded by noise, responsibilities, conversations, messages, and countless things competing for our attention. In the midst of all of this, prayer calls us to stop. To become still. To turn our hearts towards God.</w:t>
       </w:r>
     </w:p>
     <w:p>
@@ -535,15 +516,7 @@
         <w:t>"Sacred Prayers."</w:t>
       </w:r>
       <w:r>
-        <w:t xml:space="preserve"> The name reflects something simple: these prayers are part of a rich inheritance that has been handed down through the life of the Church. They belong not merely to one generation, one country, or one language. They have crossed centuries and borders, carried by ordinary people who have sought God </w:t>
-      </w:r>
-      <w:proofErr w:type="gramStart"/>
-      <w:r>
-        <w:t>in the midst of</w:t>
-      </w:r>
-      <w:proofErr w:type="gramEnd"/>
-      <w:r>
-        <w:t xml:space="preserve"> ordinary lives.</w:t>
+        <w:t xml:space="preserve"> The name reflects something simple: these prayers are part of a rich inheritance that has been handed down through the life of the Church. They belong not merely to one generation, one country, or one language. They have crossed centuries and borders, carried by ordinary people who have sought God in the midst of ordinary lives.</w:t>
       </w:r>
     </w:p>
     <w:p>
@@ -618,15 +591,7 @@
         <w:pStyle w:val="SPBodyText"/>
       </w:pPr>
       <w:r>
-        <w:t xml:space="preserve">For this reason, each prayer is accompanied by material intended for reflection and study. We look at its place in Scripture, consider why Christians have prayed it, explore the meaning of its petitions, and examine some of the Latin words that give the prayer its </w:t>
-      </w:r>
-      <w:proofErr w:type="gramStart"/>
-      <w:r>
-        <w:t>particular character</w:t>
-      </w:r>
-      <w:proofErr w:type="gramEnd"/>
-      <w:r>
-        <w:t>.</w:t>
+        <w:t>For this reason, each prayer is accompanied by material intended for reflection and study. We look at its place in Scripture, consider why Christians have prayed it, explore the meaning of its petitions, and examine some of the Latin words that give the prayer its particular character.</w:t>
       </w:r>
     </w:p>
     <w:p>
@@ -774,15 +739,7 @@
       </w:pPr>
       <w:r>
         <w:lastRenderedPageBreak/>
-        <w:t xml:space="preserve">And someone who learns to pray may eventually discover that prayer is not something we merely do at </w:t>
-      </w:r>
-      <w:proofErr w:type="gramStart"/>
-      <w:r>
-        <w:t>particular times</w:t>
-      </w:r>
-      <w:proofErr w:type="gramEnd"/>
-      <w:r>
-        <w:t>.</w:t>
+        <w:t>And someone who learns to pray may eventually discover that prayer is not something we merely do at particular times.</w:t>
       </w:r>
     </w:p>
     <w:p>
@@ -1020,15 +977,7 @@
         <w:pStyle w:val="SPBodyText"/>
       </w:pPr>
       <w:r>
-        <w:t xml:space="preserve">It is not necessary to read this book from beginning to end. There is no </w:t>
-      </w:r>
-      <w:proofErr w:type="gramStart"/>
-      <w:r>
-        <w:t>particular order</w:t>
-      </w:r>
-      <w:proofErr w:type="gramEnd"/>
-      <w:r>
-        <w:t xml:space="preserve"> in which the prayers must be approached, and there is no expectation that every page must be studied before the prayers can be prayed.</w:t>
+        <w:t>It is not necessary to read this book from beginning to end. There is no particular order in which the prayers must be approached, and there is no expectation that every page must be studied before the prayers can be prayed.</w:t>
       </w:r>
     </w:p>
     <w:p>
@@ -1054,15 +1003,7 @@
         <w:pStyle w:val="SPBodyText"/>
       </w:pPr>
       <w:r>
-        <w:t xml:space="preserve">Perhaps there is a prayer you already know well. Perhaps there is one you have heard many times but never really considered. Perhaps you are looking for a prayer for a particular moment of the </w:t>
-      </w:r>
-      <w:proofErr w:type="gramStart"/>
-      <w:r>
-        <w:t>day, or</w:t>
-      </w:r>
-      <w:proofErr w:type="gramEnd"/>
-      <w:r>
-        <w:t xml:space="preserve"> simply looking for a few quiet minutes in which to turn your attention towards God.</w:t>
+        <w:t>Perhaps there is a prayer you already know well. Perhaps there is one you have heard many times but never really considered. Perhaps you are looking for a prayer for a particular moment of the day, or simply looking for a few quiet minutes in which to turn your attention towards God.</w:t>
       </w:r>
     </w:p>
     <w:p>
@@ -1311,15 +1252,7 @@
         <w:pStyle w:val="SPBodyText"/>
       </w:pPr>
       <w:r>
-        <w:t xml:space="preserve">There is no requirement to learn Latin </w:t>
-      </w:r>
-      <w:proofErr w:type="gramStart"/>
-      <w:r>
-        <w:t>in order to</w:t>
-      </w:r>
-      <w:proofErr w:type="gramEnd"/>
-      <w:r>
-        <w:t xml:space="preserve"> use this book.</w:t>
+        <w:t>There is no requirement to learn Latin in order to use this book.</w:t>
       </w:r>
     </w:p>
     <w:p>
@@ -2076,15 +2009,7 @@
         <w:t>Sacrae Preces</w:t>
       </w:r>
       <w:r>
-        <w:t xml:space="preserve"> is not meant to </w:t>
-      </w:r>
-      <w:proofErr w:type="gramStart"/>
-      <w:r>
-        <w:t>be something that is</w:t>
-      </w:r>
-      <w:proofErr w:type="gramEnd"/>
-      <w:r>
-        <w:t xml:space="preserve"> simply read once and placed back on a shelf.</w:t>
+        <w:t xml:space="preserve"> is not meant to be something that is simply read once and placed back on a shelf.</w:t>
       </w:r>
     </w:p>
     <w:p>
@@ -2604,58 +2529,16 @@
         <w:rPr>
           <w:rStyle w:val="Emphasis"/>
         </w:rPr>
-        <w:t>in NOH-mee-</w:t>
-      </w:r>
-      <w:proofErr w:type="spellStart"/>
+        <w:t>in NOH-mee-neh PAH-tris,</w:t>
+      </w:r>
+      <w:r>
+        <w:br/>
+      </w:r>
       <w:r>
         <w:rPr>
           <w:rStyle w:val="Emphasis"/>
         </w:rPr>
-        <w:t>neh</w:t>
-      </w:r>
-      <w:proofErr w:type="spellEnd"/>
-      <w:r>
-        <w:rPr>
-          <w:rStyle w:val="Emphasis"/>
-        </w:rPr>
-        <w:t xml:space="preserve"> PAH-tris,</w:t>
-      </w:r>
-      <w:r>
-        <w:br/>
-      </w:r>
-      <w:r>
-        <w:rPr>
-          <w:rStyle w:val="Emphasis"/>
-        </w:rPr>
-        <w:t>et FEE-lee-ee, et SPEE-</w:t>
-      </w:r>
-      <w:proofErr w:type="spellStart"/>
-      <w:r>
-        <w:rPr>
-          <w:rStyle w:val="Emphasis"/>
-        </w:rPr>
-        <w:t>ree</w:t>
-      </w:r>
-      <w:proofErr w:type="spellEnd"/>
-      <w:r>
-        <w:rPr>
-          <w:rStyle w:val="Emphasis"/>
-        </w:rPr>
-        <w:t>-</w:t>
-      </w:r>
-      <w:proofErr w:type="spellStart"/>
-      <w:r>
-        <w:rPr>
-          <w:rStyle w:val="Emphasis"/>
-        </w:rPr>
-        <w:t>toos</w:t>
-      </w:r>
-      <w:proofErr w:type="spellEnd"/>
-      <w:r>
-        <w:rPr>
-          <w:rStyle w:val="Emphasis"/>
-        </w:rPr>
-        <w:t xml:space="preserve"> SAHNK-tee.</w:t>
+        <w:t>et FEE-lee-ee, et SPEE-ree-toos SAHNK-tee.</w:t>
       </w:r>
       <w:r>
         <w:br/>
@@ -3121,21 +3004,8 @@
         <w:pStyle w:val="SPScripture"/>
       </w:pPr>
       <w:r>
-        <w:t xml:space="preserve">Our Father who art in heaven, </w:t>
-      </w:r>
-      <w:proofErr w:type="gramStart"/>
-      <w:r>
-        <w:t>Hallowed</w:t>
-      </w:r>
-      <w:proofErr w:type="gramEnd"/>
-      <w:r>
-        <w:t xml:space="preserve"> be thy name. Thy kingdom </w:t>
-      </w:r>
-      <w:proofErr w:type="gramStart"/>
-      <w:r>
-        <w:t>come</w:t>
-      </w:r>
-      <w:proofErr w:type="gramEnd"/>
+        <w:t>Our Father who art in heaven, Hallowed be thy name. Thy kingdom come</w:t>
+      </w:r>
       <w:r>
         <w:t>.</w:t>
       </w:r>
@@ -3179,21 +3049,13 @@
         <w:t xml:space="preserve"> </w:t>
       </w:r>
       <w:r>
-        <w:t xml:space="preserve">And lead us not into </w:t>
-      </w:r>
-      <w:proofErr w:type="gramStart"/>
-      <w:r>
-        <w:t xml:space="preserve">temptation, </w:t>
+        <w:t xml:space="preserve">And lead us not into temptation, </w:t>
       </w:r>
       <w:r>
         <w:t>b</w:t>
       </w:r>
       <w:r>
-        <w:t>ut</w:t>
-      </w:r>
-      <w:proofErr w:type="gramEnd"/>
-      <w:r>
-        <w:t xml:space="preserve"> deliver us from evil.</w:t>
+        <w:t>ut deliver us from evil.</w:t>
       </w:r>
       <w:r>
         <w:t>”</w:t>
@@ -3227,25 +3089,7 @@
         <w:t>Your</w:t>
       </w:r>
       <w:r>
-        <w:t xml:space="preserve"> kingdom </w:t>
-      </w:r>
-      <w:proofErr w:type="gramStart"/>
-      <w:r>
-        <w:t>come</w:t>
-      </w:r>
-      <w:proofErr w:type="gramEnd"/>
-      <w:r>
-        <w:t xml:space="preserve">. Give us each day our daily bread; and forgive us our sins, for we ourselves forgive </w:t>
-      </w:r>
-      <w:proofErr w:type="spellStart"/>
-      <w:proofErr w:type="gramStart"/>
-      <w:r>
-        <w:t>every one</w:t>
-      </w:r>
-      <w:proofErr w:type="spellEnd"/>
-      <w:proofErr w:type="gramEnd"/>
-      <w:r>
-        <w:t xml:space="preserve"> who is indebted to us; and lead us not into temptation.</w:t>
+        <w:t xml:space="preserve"> kingdom come. Give us each day our daily bread; and forgive us our sins, for we ourselves forgive every one who is indebted to us; and lead us not into temptation.</w:t>
       </w:r>
       <w:r>
         <w:t>”</w:t>
@@ -3327,7 +3171,6 @@
       <w:r>
         <w:t xml:space="preserve">The first word is not </w:t>
       </w:r>
-      <w:proofErr w:type="gramStart"/>
       <w:r>
         <w:rPr>
           <w:i/>
@@ -3335,12 +3178,9 @@
         </w:rPr>
         <w:t>my</w:t>
       </w:r>
-      <w:proofErr w:type="gramEnd"/>
       <w:r>
         <w:t xml:space="preserve">. It is </w:t>
       </w:r>
-      <w:proofErr w:type="spellStart"/>
-      <w:proofErr w:type="gramStart"/>
       <w:r>
         <w:rPr>
           <w:i/>
@@ -3348,8 +3188,6 @@
         </w:rPr>
         <w:t>our</w:t>
       </w:r>
-      <w:proofErr w:type="spellEnd"/>
-      <w:proofErr w:type="gramEnd"/>
       <w:r>
         <w:t>.</w:t>
       </w:r>
@@ -3576,13 +3414,8 @@
         <w:pStyle w:val="SPPrayerTitle"/>
       </w:pPr>
       <w:r>
-        <w:t xml:space="preserve">The Hail </w:t>
-      </w:r>
-      <w:proofErr w:type="spellStart"/>
-      <w:r>
-        <w:t>mary</w:t>
-      </w:r>
-      <w:proofErr w:type="spellEnd"/>
+        <w:t>The Hail mary</w:t>
+      </w:r>
     </w:p>
     <w:p>
       <w:pPr>
@@ -3597,15 +3430,7 @@
         <w:pStyle w:val="SPBodyText"/>
       </w:pPr>
       <w:r>
-        <w:t xml:space="preserve">The prayer then becomes our petition. We ask Mary, Mother of God, to pray for us — now, </w:t>
-      </w:r>
-      <w:proofErr w:type="gramStart"/>
-      <w:r>
-        <w:t>in the midst of</w:t>
-      </w:r>
-      <w:proofErr w:type="gramEnd"/>
-      <w:r>
-        <w:t xml:space="preserve"> our lives, and at the hour of our death.</w:t>
+        <w:t>The prayer then becomes our petition. We ask Mary, Mother of God, to pray for us — now, in the midst of our lives, and at the hour of our death.</w:t>
       </w:r>
     </w:p>
     <w:p>
@@ -4418,15 +4243,7 @@
         <w:pStyle w:val="SPBodyText"/>
       </w:pPr>
       <w:r>
-        <w:t xml:space="preserve">The prayer begins with the words of Scripture and ends with our humble request for intercession. Between the two stands the mystery of Christ: God who comes among us, takes flesh, and </w:t>
-      </w:r>
-      <w:proofErr w:type="gramStart"/>
-      <w:r>
-        <w:t>enters into</w:t>
-      </w:r>
-      <w:proofErr w:type="gramEnd"/>
-      <w:r>
-        <w:t xml:space="preserve"> our human story.</w:t>
+        <w:t>The prayer begins with the words of Scripture and ends with our humble request for intercession. Between the two stands the mystery of Christ: God who comes among us, takes flesh, and enters into our human story.</w:t>
       </w:r>
     </w:p>
     <w:p>
@@ -4635,15 +4452,7 @@
         <w:pStyle w:val="SPPrayerEnglish"/>
       </w:pPr>
       <w:r>
-        <w:t xml:space="preserve">Glory be to the </w:t>
-      </w:r>
-      <w:proofErr w:type="gramStart"/>
-      <w:r>
-        <w:t>Father</w:t>
-      </w:r>
-      <w:proofErr w:type="gramEnd"/>
-      <w:r>
-        <w:t>,</w:t>
+        <w:t>Glory be to the Father,</w:t>
       </w:r>
     </w:p>
     <w:p>
@@ -4651,13 +4460,8 @@
         <w:pStyle w:val="SPPrayerEnglish"/>
       </w:pPr>
       <w:r>
-        <w:t xml:space="preserve">And to the </w:t>
-      </w:r>
-      <w:proofErr w:type="gramStart"/>
-      <w:r>
-        <w:t>Son</w:t>
-      </w:r>
-      <w:proofErr w:type="gramEnd"/>
+        <w:t>And to the Son</w:t>
+      </w:r>
     </w:p>
     <w:p>
       <w:pPr>
@@ -4680,15 +4484,7 @@
         <w:pStyle w:val="SPPrayerEnglish"/>
       </w:pPr>
       <w:r>
-        <w:t xml:space="preserve">Is </w:t>
-      </w:r>
-      <w:proofErr w:type="gramStart"/>
-      <w:r>
-        <w:t>now, and</w:t>
-      </w:r>
-      <w:proofErr w:type="gramEnd"/>
-      <w:r>
-        <w:t xml:space="preserve"> ever shall be.</w:t>
+        <w:t>Is now, and ever shall be.</w:t>
       </w:r>
     </w:p>
     <w:p>
@@ -4843,23 +4639,7 @@
         <w:pStyle w:val="SPScripture"/>
       </w:pPr>
       <w:r>
-        <w:t>“</w:t>
-      </w:r>
-      <w:proofErr w:type="gramStart"/>
-      <w:r>
-        <w:t>to</w:t>
-      </w:r>
-      <w:proofErr w:type="gramEnd"/>
-      <w:r>
-        <w:t xml:space="preserve"> him be glory in the Church and in Christ Jesus to all generations, </w:t>
-      </w:r>
-      <w:proofErr w:type="gramStart"/>
-      <w:r>
-        <w:t>for ever and ever</w:t>
-      </w:r>
-      <w:proofErr w:type="gramEnd"/>
-      <w:r>
-        <w:t>. Amen.”</w:t>
+        <w:t>“to him be glory in the Church and in Christ Jesus to all generations, for ever and ever. Amen.”</w:t>
       </w:r>
     </w:p>
     <w:p>
@@ -4897,23 +4677,7 @@
         <w:pStyle w:val="SPScripture"/>
       </w:pPr>
       <w:r>
-        <w:t xml:space="preserve">“To the King of ages, immortal, invisible, the only God, be </w:t>
-      </w:r>
-      <w:proofErr w:type="spellStart"/>
-      <w:r>
-        <w:t>honor</w:t>
-      </w:r>
-      <w:proofErr w:type="spellEnd"/>
-      <w:r>
-        <w:t xml:space="preserve"> and glory </w:t>
-      </w:r>
-      <w:proofErr w:type="gramStart"/>
-      <w:r>
-        <w:t>for ever and ever</w:t>
-      </w:r>
-      <w:proofErr w:type="gramEnd"/>
-      <w:r>
-        <w:t>. Amen.”</w:t>
+        <w:t>“To the King of ages, immortal, invisible, the only God, be honor and glory for ever and ever. Amen.”</w:t>
       </w:r>
     </w:p>
     <w:p>
@@ -4932,23 +4696,7 @@
         <w:pStyle w:val="SPScripture"/>
       </w:pPr>
       <w:r>
-        <w:t>“</w:t>
-      </w:r>
-      <w:proofErr w:type="gramStart"/>
-      <w:r>
-        <w:t>and</w:t>
-      </w:r>
-      <w:proofErr w:type="gramEnd"/>
-      <w:r>
-        <w:t xml:space="preserve"> from Jesus Christ the faithful witness, the first-born of the dead, and the ruler of kings on earth. To him who loves us and has freed us from our sins by his blood and made us a kingdom, priests to God and Father, to him be glory and dominion </w:t>
-      </w:r>
-      <w:proofErr w:type="gramStart"/>
-      <w:r>
-        <w:t>for ever and ever</w:t>
-      </w:r>
-      <w:proofErr w:type="gramEnd"/>
-      <w:r>
-        <w:t>. Amen.”</w:t>
+        <w:t>“and from Jesus Christ the faithful witness, the first-born of the dead, and the ruler of kings on earth. To him who loves us and has freed us from our sins by his blood and made us a kingdom, priests to God and Father, to him be glory and dominion for ever and ever. Amen.”</w:t>
       </w:r>
     </w:p>
     <w:p>
@@ -5025,17 +4773,8 @@
           <w:b/>
           <w:bCs/>
         </w:rPr>
-        <w:t xml:space="preserve">Glory be to the </w:t>
-      </w:r>
-      <w:proofErr w:type="gramStart"/>
-      <w:r>
-        <w:rPr>
-          <w:b/>
-          <w:bCs/>
-        </w:rPr>
-        <w:t>Father</w:t>
-      </w:r>
-      <w:proofErr w:type="gramEnd"/>
+        <w:t>Glory be to the Father</w:t>
+      </w:r>
       <w:r>
         <w:t>, we turn our hearts towards the One from whom all things come.</w:t>
       </w:r>
@@ -5117,15 +4856,7 @@
         <w:pStyle w:val="SPBodyText"/>
       </w:pPr>
       <w:r>
-        <w:t xml:space="preserve">The Glory </w:t>
-      </w:r>
-      <w:proofErr w:type="gramStart"/>
-      <w:r>
-        <w:t>Be</w:t>
-      </w:r>
-      <w:proofErr w:type="gramEnd"/>
-      <w:r>
-        <w:t xml:space="preserve"> teaches us to lift our eyes beyond the noise of the moment and remember what is eternal.</w:t>
+        <w:t>The Glory Be teaches us to lift our eyes beyond the noise of the moment and remember what is eternal.</w:t>
       </w:r>
     </w:p>
     <w:p>
@@ -5186,15 +4917,7 @@
         <w:pStyle w:val="SPBodyText"/>
       </w:pPr>
       <w:r>
-        <w:t xml:space="preserve">Whatever good we possess is received. Whatever strength we have is given. Whatever love we </w:t>
-      </w:r>
-      <w:proofErr w:type="gramStart"/>
-      <w:r>
-        <w:t>are able to</w:t>
-      </w:r>
-      <w:proofErr w:type="gramEnd"/>
-      <w:r>
-        <w:t xml:space="preserve"> offer has its source in Him.</w:t>
+        <w:t>Whatever good we possess is received. Whatever strength we have is given. Whatever love we are able to offer has its source in Him.</w:t>
       </w:r>
     </w:p>
     <w:p>
@@ -5415,23 +5138,7 @@
           <w:b/>
           <w:bCs/>
         </w:rPr>
-        <w:t xml:space="preserve">Glory be to the </w:t>
-      </w:r>
-      <w:proofErr w:type="gramStart"/>
-      <w:r>
-        <w:rPr>
-          <w:b/>
-          <w:bCs/>
-        </w:rPr>
-        <w:t>Father</w:t>
-      </w:r>
-      <w:proofErr w:type="gramEnd"/>
-      <w:r>
-        <w:rPr>
-          <w:b/>
-          <w:bCs/>
-        </w:rPr>
-        <w:t>.</w:t>
+        <w:t>Glory be to the Father.</w:t>
       </w:r>
     </w:p>
     <w:p>
@@ -5460,23 +5167,7 @@
           <w:b/>
           <w:bCs/>
         </w:rPr>
-        <w:t xml:space="preserve">And to the </w:t>
-      </w:r>
-      <w:proofErr w:type="gramStart"/>
-      <w:r>
-        <w:rPr>
-          <w:b/>
-          <w:bCs/>
-        </w:rPr>
-        <w:t>Son</w:t>
-      </w:r>
-      <w:proofErr w:type="gramEnd"/>
-      <w:r>
-        <w:rPr>
-          <w:b/>
-          <w:bCs/>
-        </w:rPr>
-        <w:t>.</w:t>
+        <w:t>And to the Son.</w:t>
       </w:r>
     </w:p>
     <w:p>
@@ -5699,17 +5390,8 @@
           <w:b/>
           <w:bCs/>
         </w:rPr>
-        <w:t xml:space="preserve">Glory </w:t>
-      </w:r>
-      <w:proofErr w:type="gramStart"/>
-      <w:r>
-        <w:rPr>
-          <w:b/>
-          <w:bCs/>
-        </w:rPr>
-        <w:t>Be</w:t>
-      </w:r>
-      <w:proofErr w:type="gramEnd"/>
+        <w:t>Glory Be</w:t>
+      </w:r>
       <w:r>
         <w:t xml:space="preserve"> t</w:t>
       </w:r>
@@ -6221,15 +5903,7 @@
         <w:pStyle w:val="SPBodyText"/>
       </w:pPr>
       <w:r>
-        <w:t xml:space="preserve">True contrition is more than regret for having done wrong. It is a turning of the heart back towards God — recognising His goodness and </w:t>
-      </w:r>
-      <w:proofErr w:type="gramStart"/>
-      <w:r>
-        <w:t>mercy, and</w:t>
-      </w:r>
-      <w:proofErr w:type="gramEnd"/>
-      <w:r>
-        <w:t xml:space="preserve"> desiring to live more faithfully in His presence.</w:t>
+        <w:t>True contrition is more than regret for having done wrong. It is a turning of the heart back towards God — recognising His goodness and mercy, and desiring to live more faithfully in His presence.</w:t>
       </w:r>
     </w:p>
     <w:p>
@@ -6496,15 +6170,7 @@
         <w:pStyle w:val="SPScripture"/>
       </w:pPr>
       <w:r>
-        <w:t xml:space="preserve">But the tax collector, standing far off, would not even </w:t>
-      </w:r>
-      <w:proofErr w:type="gramStart"/>
-      <w:r>
-        <w:t>lift up</w:t>
-      </w:r>
-      <w:proofErr w:type="gramEnd"/>
-      <w:r>
-        <w:t xml:space="preserve"> his eyes to heaven, but beat his breast, saying, “God, be merciful to me a sinner!”</w:t>
+        <w:t>But the tax collector, standing far off, would not even lift up his eyes to heaven, but beat his breast, saying, “God, be merciful to me a sinner!”</w:t>
       </w:r>
     </w:p>
     <w:p>
@@ -6526,15 +6192,7 @@
         <w:pStyle w:val="SPScripture"/>
       </w:pPr>
       <w:r>
-        <w:t xml:space="preserve">If we confess our sins, he is faithful and </w:t>
-      </w:r>
-      <w:proofErr w:type="gramStart"/>
-      <w:r>
-        <w:t>just, and</w:t>
-      </w:r>
-      <w:proofErr w:type="gramEnd"/>
-      <w:r>
-        <w:t xml:space="preserve"> will forgive our sins and cleanse us from all unrighteousness.</w:t>
+        <w:t>If we confess our sins, he is faithful and just, and will forgive our sins and cleanse us from all unrighteousness.</w:t>
       </w:r>
     </w:p>
     <w:p>
@@ -6733,15 +6391,7 @@
         <w:pStyle w:val="SPBodyText"/>
       </w:pPr>
       <w:r>
-        <w:t xml:space="preserve">And </w:t>
-      </w:r>
-      <w:proofErr w:type="gramStart"/>
-      <w:r>
-        <w:t>so</w:t>
-      </w:r>
-      <w:proofErr w:type="gramEnd"/>
-      <w:r>
-        <w:t xml:space="preserve"> the Act of Contrition is not merely a prayer about the past.</w:t>
+        <w:t>And so the Act of Contrition is not merely a prayer about the past.</w:t>
       </w:r>
     </w:p>
     <w:p>
@@ -7146,15 +6796,7 @@
       </w:r>
       <w:r>
         <w:br/>
-        <w:t xml:space="preserve">He has raised up for us a mighty </w:t>
-      </w:r>
-      <w:proofErr w:type="spellStart"/>
-      <w:r>
-        <w:t>savior</w:t>
-      </w:r>
-      <w:proofErr w:type="spellEnd"/>
-      <w:r>
-        <w:t>,</w:t>
+        <w:t>He has raised up for us a mighty savior,</w:t>
       </w:r>
       <w:r>
         <w:br/>
@@ -7681,15 +7323,7 @@
         <w:spacing w:line="360" w:lineRule="auto"/>
       </w:pPr>
       <w:r>
-        <w:t xml:space="preserve">And you, child, will be called prophet of the </w:t>
-      </w:r>
-      <w:proofErr w:type="gramStart"/>
-      <w:r>
-        <w:t>Most High</w:t>
-      </w:r>
-      <w:proofErr w:type="gramEnd"/>
-      <w:r>
-        <w:t>; for you will go before the Lord to prepare his ways, to give knowledge of salvation to his people in the forgiveness of their sins</w:t>
+        <w:t>And you, child, will be called prophet of the Most High; for you will go before the Lord to prepare his ways, to give knowledge of salvation to his people in the forgiveness of their sins</w:t>
       </w:r>
       <w:r>
         <w:t xml:space="preserve">, through the tender mercy of our God, </w:t>
@@ -8955,15 +8589,7 @@
         <w:pStyle w:val="SPPrayerEnglish"/>
       </w:pPr>
       <w:r>
-        <w:t xml:space="preserve">for he has looked with </w:t>
-      </w:r>
-      <w:proofErr w:type="spellStart"/>
-      <w:r>
-        <w:t>favor</w:t>
-      </w:r>
-      <w:proofErr w:type="spellEnd"/>
-      <w:r>
-        <w:t xml:space="preserve"> on his lowly servant.</w:t>
+        <w:t>for he has looked with favor on his lowly servant.</w:t>
       </w:r>
       <w:r>
         <w:br/>
@@ -9010,15 +8636,7 @@
       </w:r>
       <w:r>
         <w:br/>
-        <w:t xml:space="preserve">and has </w:t>
-      </w:r>
-      <w:proofErr w:type="gramStart"/>
-      <w:r>
-        <w:t>lifted up</w:t>
-      </w:r>
-      <w:proofErr w:type="gramEnd"/>
-      <w:r>
-        <w:t xml:space="preserve"> the lowly.</w:t>
+        <w:t>and has lifted up the lowly.</w:t>
       </w:r>
     </w:p>
     <w:p>
@@ -9341,21 +8959,13 @@
         <w:pStyle w:val="SPScripture"/>
       </w:pPr>
       <w:r>
-        <w:t xml:space="preserve">He has shown strength with his arm, he has scattered the proud in the imagination of their hearts, he has put down the mighty from their </w:t>
-      </w:r>
-      <w:proofErr w:type="gramStart"/>
-      <w:r>
-        <w:t>thrones</w:t>
+        <w:t>He has shown strength with his arm, he has scattered the proud in the imagination of their hearts, he has put down the mighty from their thrones</w:t>
       </w:r>
       <w:r>
         <w:t>,</w:t>
       </w:r>
       <w:r>
-        <w:t xml:space="preserve"> and</w:t>
-      </w:r>
-      <w:proofErr w:type="gramEnd"/>
-      <w:r>
-        <w:t xml:space="preserve"> exalted those of low degree; He has filled the hungry with good things, and the rich he has sent away empty. </w:t>
+        <w:t xml:space="preserve"> and exalted those of low degree; He has filled the hungry with good things, and the rich he has sent away empty. </w:t>
       </w:r>
     </w:p>
     <w:p>
@@ -9527,15 +9137,7 @@
         <w:pStyle w:val="SPBodyText"/>
       </w:pPr>
       <w:r>
-        <w:t xml:space="preserve">And </w:t>
-      </w:r>
-      <w:proofErr w:type="gramStart"/>
-      <w:r>
-        <w:t>so</w:t>
-      </w:r>
-      <w:proofErr w:type="gramEnd"/>
-      <w:r>
-        <w:t xml:space="preserve"> she praises Him.</w:t>
+        <w:t>And so she praises Him.</w:t>
       </w:r>
     </w:p>
     <w:p>
@@ -9589,15 +9191,7 @@
         <w:pStyle w:val="SPBodyText"/>
       </w:pPr>
       <w:r>
-        <w:t xml:space="preserve">He </w:t>
-      </w:r>
-      <w:proofErr w:type="gramStart"/>
-      <w:r>
-        <w:t>lifts up</w:t>
-      </w:r>
-      <w:proofErr w:type="gramEnd"/>
-      <w:r>
-        <w:t xml:space="preserve"> the lowly.</w:t>
+        <w:t>He lifts up the lowly.</w:t>
       </w:r>
     </w:p>
     <w:p>
@@ -9750,15 +9344,7 @@
         <w:pStyle w:val="SPBodyText"/>
       </w:pPr>
       <w:r>
-        <w:t xml:space="preserve">One phrase appears </w:t>
-      </w:r>
-      <w:proofErr w:type="gramStart"/>
-      <w:r>
-        <w:t>again and again</w:t>
-      </w:r>
-      <w:proofErr w:type="gramEnd"/>
-      <w:r>
-        <w:t xml:space="preserve"> beneath the Magnificat:</w:t>
+        <w:t>One phrase appears again and again beneath the Magnificat:</w:t>
       </w:r>
     </w:p>
     <w:p>
@@ -10118,15 +9704,7 @@
         <w:pStyle w:val="SPBodyText"/>
       </w:pPr>
       <w:r>
-        <w:t xml:space="preserve">We can praise God </w:t>
-      </w:r>
-      <w:proofErr w:type="gramStart"/>
-      <w:r>
-        <w:t>in the midst of</w:t>
-      </w:r>
-      <w:proofErr w:type="gramEnd"/>
-      <w:r>
-        <w:t xml:space="preserve"> uncertainty.</w:t>
+        <w:t>We can praise God in the midst of uncertainty.</w:t>
       </w:r>
     </w:p>
     <w:p>
@@ -11049,15 +10627,7 @@
         <w:pStyle w:val="SPBodyText"/>
       </w:pPr>
       <w:r>
-        <w:t xml:space="preserve">These prayers have been handed down through generations. Some are centuries old. Others grew from </w:t>
-      </w:r>
-      <w:proofErr w:type="gramStart"/>
-      <w:r>
-        <w:t>particular traditions</w:t>
-      </w:r>
-      <w:proofErr w:type="gramEnd"/>
-      <w:r>
-        <w:t xml:space="preserve"> of devotion to Christ, the Blessed Virgin Mary, the angels and the saints.</w:t>
+        <w:t>These prayers have been handed down through generations. Some are centuries old. Others grew from particular traditions of devotion to Christ, the Blessed Virgin Mary, the angels and the saints.</w:t>
       </w:r>
     </w:p>
     <w:p>
@@ -12169,13 +11739,8 @@
       <w:pPr>
         <w:pStyle w:val="SPBodyText"/>
       </w:pPr>
-      <w:proofErr w:type="gramStart"/>
-      <w:r>
-        <w:t>So</w:t>
-      </w:r>
-      <w:proofErr w:type="gramEnd"/>
-      <w:r>
-        <w:t xml:space="preserve"> begin simply.</w:t>
+      <w:r>
+        <w:t>So begin simply.</w:t>
       </w:r>
     </w:p>
     <w:p>
@@ -12310,15 +11875,7 @@
         <w:t>Annunciation</w:t>
       </w:r>
       <w:r>
-        <w:t xml:space="preserve">, when the Angel Gabriel announced to Mary that she would become the </w:t>
-      </w:r>
-      <w:proofErr w:type="gramStart"/>
-      <w:r>
-        <w:t>Mother</w:t>
-      </w:r>
-      <w:proofErr w:type="gramEnd"/>
-      <w:r>
-        <w:t xml:space="preserve"> of the Son of God.</w:t>
+        <w:t>, when the Angel Gabriel announced to Mary that she would become the Mother of the Son of God.</w:t>
       </w:r>
     </w:p>
     <w:p>
@@ -12372,15 +11929,7 @@
         <w:pStyle w:val="SPBodyText"/>
       </w:pPr>
       <w:r>
-        <w:t xml:space="preserve">The repeated prayer invites us to pause </w:t>
-      </w:r>
-      <w:proofErr w:type="gramStart"/>
-      <w:r>
-        <w:t>in the midst of</w:t>
-      </w:r>
-      <w:proofErr w:type="gramEnd"/>
-      <w:r>
-        <w:t xml:space="preserve"> ordinary life and remember the mystery at the heart of our faith:</w:t>
+        <w:t>The repeated prayer invites us to pause in the midst of ordinary life and remember the mystery at the heart of our faith:</w:t>
       </w:r>
       <w:r>
         <w:t xml:space="preserve"> </w:t>
@@ -12390,23 +11939,7 @@
           <w:b/>
           <w:bCs/>
         </w:rPr>
-        <w:t xml:space="preserve">“And the Word was made </w:t>
-      </w:r>
-      <w:proofErr w:type="gramStart"/>
-      <w:r>
-        <w:rPr>
-          <w:b/>
-          <w:bCs/>
-        </w:rPr>
-        <w:t>flesh, and</w:t>
-      </w:r>
-      <w:proofErr w:type="gramEnd"/>
-      <w:r>
-        <w:rPr>
-          <w:b/>
-          <w:bCs/>
-        </w:rPr>
-        <w:t xml:space="preserve"> dwelt among us.”</w:t>
+        <w:t>“And the Word was made flesh, and dwelt among us.”</w:t>
       </w:r>
     </w:p>
     <w:p>
@@ -12794,15 +12327,7 @@
         <w:pStyle w:val="SPPrayerEnglish"/>
       </w:pPr>
       <w:r>
-        <w:t xml:space="preserve">Pour forth, we beseech Thee, O Lord, </w:t>
-      </w:r>
-      <w:proofErr w:type="gramStart"/>
-      <w:r>
-        <w:t>Thy</w:t>
-      </w:r>
-      <w:proofErr w:type="gramEnd"/>
-      <w:r>
-        <w:t xml:space="preserve"> grace into our hearts, that we to whom the Incarnation of Christ, Thy Son, was made known by the message of an angel, may by His Passion and Cross be brought to the glory of His resurrection. Through the same Christ our Lord. </w:t>
+        <w:t xml:space="preserve">Pour forth, we beseech Thee, O Lord, Thy grace into our hearts, that we to whom the Incarnation of Christ, Thy Son, was made known by the message of an angel, may by His Passion and Cross be brought to the glory of His resurrection. Through the same Christ our Lord. </w:t>
       </w:r>
     </w:p>
     <w:p>
@@ -13520,15 +13045,7 @@
         <w:pStyle w:val="SPBodyText"/>
       </w:pPr>
       <w:r>
-        <w:t xml:space="preserve">At noon, we pause </w:t>
-      </w:r>
-      <w:proofErr w:type="gramStart"/>
-      <w:r>
-        <w:t>in the midst of</w:t>
-      </w:r>
-      <w:proofErr w:type="gramEnd"/>
-      <w:r>
-        <w:t xml:space="preserve"> our work.</w:t>
+        <w:t>At noon, we pause in the midst of our work.</w:t>
       </w:r>
     </w:p>
     <w:p>
@@ -13618,15 +13135,7 @@
         <w:pStyle w:val="SPBodyText"/>
       </w:pPr>
       <w:r>
-        <w:t xml:space="preserve">Back to the truth that God is </w:t>
-      </w:r>
-      <w:proofErr w:type="gramStart"/>
-      <w:r>
-        <w:t>near</w:t>
-      </w:r>
-      <w:proofErr w:type="gramEnd"/>
-      <w:r>
-        <w:t>.</w:t>
+        <w:t>Back to the truth that God is near.</w:t>
       </w:r>
     </w:p>
     <w:p>
@@ -13778,15 +13287,7 @@
         <w:t>Anima Christi</w:t>
       </w:r>
       <w:r>
-        <w:t xml:space="preserve"> is an ancient Christian prayer traditionally associated with devotion to Christ and</w:t>
-      </w:r>
-      <w:proofErr w:type="gramStart"/>
-      <w:r>
-        <w:t>, in particular, with</w:t>
-      </w:r>
-      <w:proofErr w:type="gramEnd"/>
-      <w:r>
-        <w:t xml:space="preserve"> the Eucharist. Its origins are uncertain, but the prayer was already in use by the early sixteenth century and became especially beloved through its association with St. Ignatius of Loyola, who placed it at the beginning of his </w:t>
+        <w:t xml:space="preserve"> is an ancient Christian prayer traditionally associated with devotion to Christ and, in particular, with the Eucharist. Its origins are uncertain, but the prayer was already in use by the early sixteenth century and became especially beloved through its association with St. Ignatius of Loyola, who placed it at the beginning of his </w:t>
       </w:r>
       <w:r>
         <w:rPr>
@@ -14354,15 +13855,7 @@
         <w:pStyle w:val="SPBodyText"/>
       </w:pPr>
       <w:r>
-        <w:t xml:space="preserve">The Anima Christi is a prayer of drawing </w:t>
-      </w:r>
-      <w:proofErr w:type="gramStart"/>
-      <w:r>
-        <w:t>near</w:t>
-      </w:r>
-      <w:proofErr w:type="gramEnd"/>
-      <w:r>
-        <w:t>.</w:t>
+        <w:t>The Anima Christi is a prayer of drawing near.</w:t>
       </w:r>
     </w:p>
     <w:p>
@@ -15017,15 +14510,7 @@
         </w:sectPr>
       </w:pPr>
       <w:r>
-        <w:t xml:space="preserve">The angel of the Lord encamps around those who fear </w:t>
-      </w:r>
-      <w:proofErr w:type="gramStart"/>
-      <w:r>
-        <w:t>him, and</w:t>
-      </w:r>
-      <w:proofErr w:type="gramEnd"/>
-      <w:r>
-        <w:t xml:space="preserve"> delivers them.</w:t>
+        <w:t>The angel of the Lord encamps around those who fear him, and delivers them.</w:t>
       </w:r>
     </w:p>
     <w:p>
@@ -15479,6 +14964,302 @@
         <w:lastRenderedPageBreak/>
         <w:t>REFLECTION</w:t>
       </w:r>
+    </w:p>
+    <w:p>
+      <w:pPr>
+        <w:pStyle w:val="SPBodyText"/>
+      </w:pPr>
+    </w:p>
+    <w:p>
+      <w:pPr>
+        <w:pStyle w:val="SPBodyText"/>
+        <w:sectPr>
+          <w:type w:val="oddPage"/>
+          <w:pgSz w:w="7920" w:h="12240" w:code="6"/>
+          <w:pgMar w:top="1080" w:right="864" w:bottom="1080" w:left="1152" w:header="576" w:footer="576" w:gutter="0"/>
+          <w:cols w:space="720"/>
+          <w:titlePg/>
+          <w:docGrid w:linePitch="360"/>
+        </w:sectPr>
+      </w:pPr>
+    </w:p>
+    <w:p>
+      <w:pPr>
+        <w:pStyle w:val="SPBodyText"/>
+        <w:jc w:val="center"/>
+        <w:rPr>
+          <w:rFonts w:ascii="Segoe UI Symbol" w:hAnsi="Segoe UI Symbol" w:cs="Segoe UI Symbol"/>
+        </w:rPr>
+      </w:pPr>
+      <w:r>
+        <w:rPr>
+          <w:rFonts w:ascii="Segoe UI Symbol" w:hAnsi="Segoe UI Symbol" w:cs="Segoe UI Symbol"/>
+        </w:rPr>
+        <w:lastRenderedPageBreak/>
+        <w:t>✠</w:t>
+      </w:r>
+    </w:p>
+    <w:p>
+      <w:pPr>
+        <w:pStyle w:val="SPBodyText"/>
+        <w:jc w:val="center"/>
+        <w:rPr>
+          <w:rFonts w:ascii="Segoe UI Symbol" w:hAnsi="Segoe UI Symbol" w:cs="Segoe UI Symbol"/>
+        </w:rPr>
+      </w:pPr>
+    </w:p>
+    <w:p>
+      <w:pPr>
+        <w:pStyle w:val="SPPrayerTitle"/>
+        <w:sectPr>
+          <w:type w:val="oddPage"/>
+          <w:pgSz w:w="7920" w:h="12240" w:code="6"/>
+          <w:pgMar w:top="1080" w:right="864" w:bottom="1080" w:left="1152" w:header="576" w:footer="576" w:gutter="0"/>
+          <w:cols w:space="720"/>
+          <w:titlePg/>
+          <w:docGrid w:linePitch="360"/>
+        </w:sectPr>
+      </w:pPr>
+      <w:r>
+        <w:t>Divine  praises</w:t>
+      </w:r>
+    </w:p>
+    <w:p>
+      <w:pPr>
+        <w:pStyle w:val="SPLanguage"/>
+        <w:spacing w:before="600"/>
+      </w:pPr>
+      <w:r>
+        <w:lastRenderedPageBreak/>
+        <w:tab/>
+        <w:t>ENGLISH</w:t>
+      </w:r>
+    </w:p>
+    <w:p>
+      <w:pPr>
+        <w:pStyle w:val="SPPrayerEnglish"/>
+      </w:pPr>
+      <w:r>
+        <w:tab/>
+      </w:r>
+    </w:p>
+    <w:p>
+      <w:pPr>
+        <w:sectPr>
+          <w:type w:val="evenPage"/>
+          <w:pgSz w:w="7920" w:h="12240" w:code="6"/>
+          <w:pgMar w:top="1080" w:right="864" w:bottom="1080" w:left="1152" w:header="576" w:footer="576" w:gutter="0"/>
+          <w:cols w:space="720"/>
+          <w:titlePg/>
+          <w:docGrid w:linePitch="360"/>
+        </w:sectPr>
+      </w:pPr>
+    </w:p>
+    <w:p>
+      <w:pPr>
+        <w:pStyle w:val="SPLanguage"/>
+      </w:pPr>
+      <w:r>
+        <w:lastRenderedPageBreak/>
+        <w:t>LATIN</w:t>
+      </w:r>
+    </w:p>
+    <w:p>
+      <w:pPr>
+        <w:pStyle w:val="SPPrayerLatin"/>
+      </w:pPr>
+    </w:p>
+    <w:p>
+      <w:pPr>
+        <w:pStyle w:val="SPPrayerLatin"/>
+        <w:sectPr>
+          <w:type w:val="oddPage"/>
+          <w:pgSz w:w="7920" w:h="12240" w:code="6"/>
+          <w:pgMar w:top="1080" w:right="864" w:bottom="1080" w:left="1152" w:header="576" w:footer="576" w:gutter="0"/>
+          <w:cols w:space="720"/>
+          <w:titlePg/>
+          <w:docGrid w:linePitch="360"/>
+        </w:sectPr>
+      </w:pPr>
+    </w:p>
+    <w:p>
+      <w:pPr>
+        <w:pStyle w:val="SPSectionTitle"/>
+        <w:sectPr>
+          <w:type w:val="evenPage"/>
+          <w:pgSz w:w="7920" w:h="12240" w:code="6"/>
+          <w:pgMar w:top="1080" w:right="864" w:bottom="1080" w:left="1152" w:header="576" w:footer="576" w:gutter="0"/>
+          <w:cols w:space="720"/>
+          <w:titlePg/>
+          <w:docGrid w:linePitch="360"/>
+        </w:sectPr>
+      </w:pPr>
+      <w:r>
+        <w:lastRenderedPageBreak/>
+        <w:t>SCRIPTURE</w:t>
+      </w:r>
+    </w:p>
+    <w:p>
+      <w:pPr>
+        <w:pStyle w:val="SPSectionTitle"/>
+        <w:sectPr>
+          <w:type w:val="oddPage"/>
+          <w:pgSz w:w="7920" w:h="12240" w:code="6"/>
+          <w:pgMar w:top="1080" w:right="864" w:bottom="1080" w:left="1152" w:header="576" w:footer="576" w:gutter="0"/>
+          <w:cols w:space="720"/>
+          <w:titlePg/>
+          <w:docGrid w:linePitch="360"/>
+        </w:sectPr>
+      </w:pPr>
+      <w:r>
+        <w:lastRenderedPageBreak/>
+        <w:t>REFLECTION</w:t>
+      </w:r>
+    </w:p>
+    <w:p>
+      <w:pPr>
+        <w:pStyle w:val="SPBodyText"/>
+        <w:jc w:val="center"/>
+        <w:rPr>
+          <w:rFonts w:ascii="Segoe UI Symbol" w:hAnsi="Segoe UI Symbol" w:cs="Segoe UI Symbol"/>
+        </w:rPr>
+      </w:pPr>
+      <w:r>
+        <w:rPr>
+          <w:rFonts w:ascii="Segoe UI Symbol" w:hAnsi="Segoe UI Symbol" w:cs="Segoe UI Symbol"/>
+        </w:rPr>
+        <w:lastRenderedPageBreak/>
+        <w:t>✠</w:t>
+      </w:r>
+    </w:p>
+    <w:p>
+      <w:pPr>
+        <w:pStyle w:val="SPBodyText"/>
+        <w:jc w:val="center"/>
+        <w:rPr>
+          <w:rFonts w:ascii="Segoe UI Symbol" w:hAnsi="Segoe UI Symbol" w:cs="Segoe UI Symbol"/>
+        </w:rPr>
+      </w:pPr>
+    </w:p>
+    <w:p>
+      <w:pPr>
+        <w:pStyle w:val="SPPrayerTitle"/>
+        <w:sectPr>
+          <w:type w:val="oddPage"/>
+          <w:pgSz w:w="7920" w:h="12240" w:code="6"/>
+          <w:pgMar w:top="1080" w:right="864" w:bottom="1080" w:left="1152" w:header="576" w:footer="576" w:gutter="0"/>
+          <w:cols w:space="720"/>
+          <w:titlePg/>
+          <w:docGrid w:linePitch="360"/>
+        </w:sectPr>
+      </w:pPr>
+      <w:r>
+        <w:t>Night prayer</w:t>
+      </w:r>
+    </w:p>
+    <w:p>
+      <w:pPr>
+        <w:pStyle w:val="SPLanguage"/>
+        <w:spacing w:before="600"/>
+      </w:pPr>
+      <w:r>
+        <w:lastRenderedPageBreak/>
+        <w:tab/>
+        <w:t>ENGLISH</w:t>
+      </w:r>
+    </w:p>
+    <w:p>
+      <w:pPr>
+        <w:pStyle w:val="SPPrayerEnglish"/>
+      </w:pPr>
+      <w:r>
+        <w:tab/>
+      </w:r>
+    </w:p>
+    <w:p>
+      <w:pPr>
+        <w:sectPr>
+          <w:type w:val="evenPage"/>
+          <w:pgSz w:w="7920" w:h="12240" w:code="6"/>
+          <w:pgMar w:top="1080" w:right="864" w:bottom="1080" w:left="1152" w:header="576" w:footer="576" w:gutter="0"/>
+          <w:cols w:space="720"/>
+          <w:titlePg/>
+          <w:docGrid w:linePitch="360"/>
+        </w:sectPr>
+      </w:pPr>
+    </w:p>
+    <w:p>
+      <w:pPr>
+        <w:pStyle w:val="SPLanguage"/>
+      </w:pPr>
+      <w:r>
+        <w:lastRenderedPageBreak/>
+        <w:t>LATIN</w:t>
+      </w:r>
+    </w:p>
+    <w:p>
+      <w:pPr>
+        <w:pStyle w:val="SPPrayerLatin"/>
+      </w:pPr>
+    </w:p>
+    <w:p>
+      <w:pPr>
+        <w:pStyle w:val="SPPrayerLatin"/>
+        <w:sectPr>
+          <w:type w:val="oddPage"/>
+          <w:pgSz w:w="7920" w:h="12240" w:code="6"/>
+          <w:pgMar w:top="1080" w:right="864" w:bottom="1080" w:left="1152" w:header="576" w:footer="576" w:gutter="0"/>
+          <w:cols w:space="720"/>
+          <w:titlePg/>
+          <w:docGrid w:linePitch="360"/>
+        </w:sectPr>
+      </w:pPr>
+    </w:p>
+    <w:p>
+      <w:pPr>
+        <w:pStyle w:val="SPSectionTitle"/>
+        <w:sectPr>
+          <w:type w:val="evenPage"/>
+          <w:pgSz w:w="7920" w:h="12240" w:code="6"/>
+          <w:pgMar w:top="1080" w:right="864" w:bottom="1080" w:left="1152" w:header="576" w:footer="576" w:gutter="0"/>
+          <w:cols w:space="720"/>
+          <w:titlePg/>
+          <w:docGrid w:linePitch="360"/>
+        </w:sectPr>
+      </w:pPr>
+      <w:r>
+        <w:lastRenderedPageBreak/>
+        <w:t>SCRIPTURE</w:t>
+      </w:r>
+    </w:p>
+    <w:p>
+      <w:pPr>
+        <w:pStyle w:val="SPSectionTitle"/>
+      </w:pPr>
+      <w:r>
+        <w:lastRenderedPageBreak/>
+        <w:t>REFLECTION</w:t>
+      </w:r>
+    </w:p>
+    <w:p>
+      <w:pPr>
+        <w:pStyle w:val="SPBodyText"/>
+      </w:pPr>
+    </w:p>
+    <w:p>
+      <w:pPr>
+        <w:pStyle w:val="SPBodyText"/>
+      </w:pPr>
+    </w:p>
+    <w:p>
+      <w:pPr>
+        <w:pStyle w:val="SPSectionTitle"/>
+      </w:pPr>
+    </w:p>
+    <w:p>
+      <w:pPr>
+        <w:pStyle w:val="SPBodyText"/>
+      </w:pPr>
     </w:p>
     <w:p>
       <w:pPr>

</xml_diff>

<commit_message>
Faithful departed and Divine praises nearly completed.
</commit_message>
<xml_diff>
--- a/manuscript/volume-1/sacrae-preces-volume-1.docx
+++ b/manuscript/volume-1/sacrae-preces-volume-1.docx
@@ -74,6 +74,7 @@
           <w:szCs w:val="18"/>
         </w:rPr>
       </w:pPr>
+      <w:proofErr w:type="spellStart"/>
       <w:r>
         <w:rPr>
           <w:rStyle w:val="SPPrayerResponseCS"/>
@@ -81,7 +82,17 @@
           <w:sz w:val="48"/>
           <w:szCs w:val="18"/>
         </w:rPr>
-        <w:t>Sacrea preces</w:t>
+        <w:t>Sacrea</w:t>
+      </w:r>
+      <w:proofErr w:type="spellEnd"/>
+      <w:r>
+        <w:rPr>
+          <w:rStyle w:val="SPPrayerResponseCS"/>
+          <w:i w:val="0"/>
+          <w:sz w:val="48"/>
+          <w:szCs w:val="18"/>
+        </w:rPr>
+        <w:t xml:space="preserve"> preces</w:t>
       </w:r>
     </w:p>
     <w:p>
@@ -432,7 +443,15 @@
         <w:pStyle w:val="SPBodyText"/>
       </w:pPr>
       <w:r>
-        <w:t>We can spend our days surrounded by noise, responsibilities, conversations, messages, and countless things competing for our attention. In the midst of all of this, prayer calls us to stop. To become still. To turn our hearts towards God.</w:t>
+        <w:t xml:space="preserve">We can spend our days surrounded by noise, responsibilities, conversations, messages, and countless things competing for our attention. </w:t>
+      </w:r>
+      <w:proofErr w:type="gramStart"/>
+      <w:r>
+        <w:t>In the midst of</w:t>
+      </w:r>
+      <w:proofErr w:type="gramEnd"/>
+      <w:r>
+        <w:t xml:space="preserve"> all of this, prayer calls us to stop. To become still. To turn our hearts towards God.</w:t>
       </w:r>
     </w:p>
     <w:p>
@@ -516,7 +535,15 @@
         <w:t>"Sacred Prayers."</w:t>
       </w:r>
       <w:r>
-        <w:t xml:space="preserve"> The name reflects something simple: these prayers are part of a rich inheritance that has been handed down through the life of the Church. They belong not merely to one generation, one country, or one language. They have crossed centuries and borders, carried by ordinary people who have sought God in the midst of ordinary lives.</w:t>
+        <w:t xml:space="preserve"> The name reflects something simple: these prayers are part of a rich inheritance that has been handed down through the life of the Church. They belong not merely to one generation, one country, or one language. They have crossed centuries and borders, carried by ordinary people who have sought God </w:t>
+      </w:r>
+      <w:proofErr w:type="gramStart"/>
+      <w:r>
+        <w:t>in the midst of</w:t>
+      </w:r>
+      <w:proofErr w:type="gramEnd"/>
+      <w:r>
+        <w:t xml:space="preserve"> ordinary lives.</w:t>
       </w:r>
     </w:p>
     <w:p>
@@ -591,7 +618,15 @@
         <w:pStyle w:val="SPBodyText"/>
       </w:pPr>
       <w:r>
-        <w:t>For this reason, each prayer is accompanied by material intended for reflection and study. We look at its place in Scripture, consider why Christians have prayed it, explore the meaning of its petitions, and examine some of the Latin words that give the prayer its particular character.</w:t>
+        <w:t xml:space="preserve">For this reason, each prayer is accompanied by material intended for reflection and study. We look at its place in Scripture, consider why Christians have prayed it, explore the meaning of its petitions, and examine some of the Latin words that give the prayer its </w:t>
+      </w:r>
+      <w:proofErr w:type="gramStart"/>
+      <w:r>
+        <w:t>particular character</w:t>
+      </w:r>
+      <w:proofErr w:type="gramEnd"/>
+      <w:r>
+        <w:t>.</w:t>
       </w:r>
     </w:p>
     <w:p>
@@ -739,7 +774,15 @@
       </w:pPr>
       <w:r>
         <w:lastRenderedPageBreak/>
-        <w:t>And someone who learns to pray may eventually discover that prayer is not something we merely do at particular times.</w:t>
+        <w:t xml:space="preserve">And someone who learns to pray may eventually discover that prayer is not something we merely do at </w:t>
+      </w:r>
+      <w:proofErr w:type="gramStart"/>
+      <w:r>
+        <w:t>particular times</w:t>
+      </w:r>
+      <w:proofErr w:type="gramEnd"/>
+      <w:r>
+        <w:t>.</w:t>
       </w:r>
     </w:p>
     <w:p>
@@ -977,7 +1020,15 @@
         <w:pStyle w:val="SPBodyText"/>
       </w:pPr>
       <w:r>
-        <w:t>It is not necessary to read this book from beginning to end. There is no particular order in which the prayers must be approached, and there is no expectation that every page must be studied before the prayers can be prayed.</w:t>
+        <w:t xml:space="preserve">It is not necessary to read this book from beginning to end. There is no </w:t>
+      </w:r>
+      <w:proofErr w:type="gramStart"/>
+      <w:r>
+        <w:t>particular order</w:t>
+      </w:r>
+      <w:proofErr w:type="gramEnd"/>
+      <w:r>
+        <w:t xml:space="preserve"> in which the prayers must be approached, and there is no expectation that every page must be studied before the prayers can be prayed.</w:t>
       </w:r>
     </w:p>
     <w:p>
@@ -1003,7 +1054,15 @@
         <w:pStyle w:val="SPBodyText"/>
       </w:pPr>
       <w:r>
-        <w:t>Perhaps there is a prayer you already know well. Perhaps there is one you have heard many times but never really considered. Perhaps you are looking for a prayer for a particular moment of the day, or simply looking for a few quiet minutes in which to turn your attention towards God.</w:t>
+        <w:t xml:space="preserve">Perhaps there is a prayer you already know well. Perhaps there is one you have heard many times but never really considered. Perhaps you are looking for a prayer for a particular moment of the </w:t>
+      </w:r>
+      <w:proofErr w:type="gramStart"/>
+      <w:r>
+        <w:t>day, or</w:t>
+      </w:r>
+      <w:proofErr w:type="gramEnd"/>
+      <w:r>
+        <w:t xml:space="preserve"> simply looking for a few quiet minutes in which to turn your attention towards God.</w:t>
       </w:r>
     </w:p>
     <w:p>
@@ -1252,7 +1311,15 @@
         <w:pStyle w:val="SPBodyText"/>
       </w:pPr>
       <w:r>
-        <w:t>There is no requirement to learn Latin in order to use this book.</w:t>
+        <w:t xml:space="preserve">There is no requirement to learn Latin </w:t>
+      </w:r>
+      <w:proofErr w:type="gramStart"/>
+      <w:r>
+        <w:t>in order to</w:t>
+      </w:r>
+      <w:proofErr w:type="gramEnd"/>
+      <w:r>
+        <w:t xml:space="preserve"> use this book.</w:t>
       </w:r>
     </w:p>
     <w:p>
@@ -2009,7 +2076,15 @@
         <w:t>Sacrae Preces</w:t>
       </w:r>
       <w:r>
-        <w:t xml:space="preserve"> is not meant to be something that is simply read once and placed back on a shelf.</w:t>
+        <w:t xml:space="preserve"> is not meant to </w:t>
+      </w:r>
+      <w:proofErr w:type="gramStart"/>
+      <w:r>
+        <w:t>be something that is</w:t>
+      </w:r>
+      <w:proofErr w:type="gramEnd"/>
+      <w:r>
+        <w:t xml:space="preserve"> simply read once and placed back on a shelf.</w:t>
       </w:r>
     </w:p>
     <w:p>
@@ -2529,16 +2604,58 @@
         <w:rPr>
           <w:rStyle w:val="Emphasis"/>
         </w:rPr>
-        <w:t>in NOH-mee-neh PAH-tris,</w:t>
-      </w:r>
-      <w:r>
-        <w:br/>
-      </w:r>
+        <w:t>in NOH-mee-</w:t>
+      </w:r>
+      <w:proofErr w:type="spellStart"/>
       <w:r>
         <w:rPr>
           <w:rStyle w:val="Emphasis"/>
         </w:rPr>
-        <w:t>et FEE-lee-ee, et SPEE-ree-toos SAHNK-tee.</w:t>
+        <w:t>neh</w:t>
+      </w:r>
+      <w:proofErr w:type="spellEnd"/>
+      <w:r>
+        <w:rPr>
+          <w:rStyle w:val="Emphasis"/>
+        </w:rPr>
+        <w:t xml:space="preserve"> PAH-tris,</w:t>
+      </w:r>
+      <w:r>
+        <w:br/>
+      </w:r>
+      <w:r>
+        <w:rPr>
+          <w:rStyle w:val="Emphasis"/>
+        </w:rPr>
+        <w:t>et FEE-lee-ee, et SPEE-</w:t>
+      </w:r>
+      <w:proofErr w:type="spellStart"/>
+      <w:r>
+        <w:rPr>
+          <w:rStyle w:val="Emphasis"/>
+        </w:rPr>
+        <w:t>ree</w:t>
+      </w:r>
+      <w:proofErr w:type="spellEnd"/>
+      <w:r>
+        <w:rPr>
+          <w:rStyle w:val="Emphasis"/>
+        </w:rPr>
+        <w:t>-</w:t>
+      </w:r>
+      <w:proofErr w:type="spellStart"/>
+      <w:r>
+        <w:rPr>
+          <w:rStyle w:val="Emphasis"/>
+        </w:rPr>
+        <w:t>toos</w:t>
+      </w:r>
+      <w:proofErr w:type="spellEnd"/>
+      <w:r>
+        <w:rPr>
+          <w:rStyle w:val="Emphasis"/>
+        </w:rPr>
+        <w:t xml:space="preserve"> SAHNK-tee.</w:t>
       </w:r>
       <w:r>
         <w:br/>
@@ -3004,8 +3121,21 @@
         <w:pStyle w:val="SPScripture"/>
       </w:pPr>
       <w:r>
-        <w:t>Our Father who art in heaven, Hallowed be thy name. Thy kingdom come</w:t>
-      </w:r>
+        <w:t xml:space="preserve">Our Father who art in heaven, </w:t>
+      </w:r>
+      <w:proofErr w:type="gramStart"/>
+      <w:r>
+        <w:t>Hallowed</w:t>
+      </w:r>
+      <w:proofErr w:type="gramEnd"/>
+      <w:r>
+        <w:t xml:space="preserve"> be thy name. Thy kingdom </w:t>
+      </w:r>
+      <w:proofErr w:type="gramStart"/>
+      <w:r>
+        <w:t>come</w:t>
+      </w:r>
+      <w:proofErr w:type="gramEnd"/>
       <w:r>
         <w:t>.</w:t>
       </w:r>
@@ -3049,13 +3179,21 @@
         <w:t xml:space="preserve"> </w:t>
       </w:r>
       <w:r>
-        <w:t xml:space="preserve">And lead us not into temptation, </w:t>
+        <w:t xml:space="preserve">And lead us not into </w:t>
+      </w:r>
+      <w:proofErr w:type="gramStart"/>
+      <w:r>
+        <w:t xml:space="preserve">temptation, </w:t>
       </w:r>
       <w:r>
         <w:t>b</w:t>
       </w:r>
       <w:r>
-        <w:t>ut deliver us from evil.</w:t>
+        <w:t>ut</w:t>
+      </w:r>
+      <w:proofErr w:type="gramEnd"/>
+      <w:r>
+        <w:t xml:space="preserve"> deliver us from evil.</w:t>
       </w:r>
       <w:r>
         <w:t>”</w:t>
@@ -3089,7 +3227,25 @@
         <w:t>Your</w:t>
       </w:r>
       <w:r>
-        <w:t xml:space="preserve"> kingdom come. Give us each day our daily bread; and forgive us our sins, for we ourselves forgive every one who is indebted to us; and lead us not into temptation.</w:t>
+        <w:t xml:space="preserve"> kingdom </w:t>
+      </w:r>
+      <w:proofErr w:type="gramStart"/>
+      <w:r>
+        <w:t>come</w:t>
+      </w:r>
+      <w:proofErr w:type="gramEnd"/>
+      <w:r>
+        <w:t xml:space="preserve">. Give us each day our daily bread; and forgive us our sins, for we ourselves forgive </w:t>
+      </w:r>
+      <w:proofErr w:type="spellStart"/>
+      <w:proofErr w:type="gramStart"/>
+      <w:r>
+        <w:t>every one</w:t>
+      </w:r>
+      <w:proofErr w:type="spellEnd"/>
+      <w:proofErr w:type="gramEnd"/>
+      <w:r>
+        <w:t xml:space="preserve"> who is indebted to us; and lead us not into temptation.</w:t>
       </w:r>
       <w:r>
         <w:t>”</w:t>
@@ -3171,6 +3327,7 @@
       <w:r>
         <w:t xml:space="preserve">The first word is not </w:t>
       </w:r>
+      <w:proofErr w:type="gramStart"/>
       <w:r>
         <w:rPr>
           <w:i/>
@@ -3178,9 +3335,12 @@
         </w:rPr>
         <w:t>my</w:t>
       </w:r>
+      <w:proofErr w:type="gramEnd"/>
       <w:r>
         <w:t xml:space="preserve">. It is </w:t>
       </w:r>
+      <w:proofErr w:type="spellStart"/>
+      <w:proofErr w:type="gramStart"/>
       <w:r>
         <w:rPr>
           <w:i/>
@@ -3188,6 +3348,8 @@
         </w:rPr>
         <w:t>our</w:t>
       </w:r>
+      <w:proofErr w:type="spellEnd"/>
+      <w:proofErr w:type="gramEnd"/>
       <w:r>
         <w:t>.</w:t>
       </w:r>
@@ -3414,8 +3576,13 @@
         <w:pStyle w:val="SPPrayerTitle"/>
       </w:pPr>
       <w:r>
-        <w:t>The Hail mary</w:t>
-      </w:r>
+        <w:t xml:space="preserve">The Hail </w:t>
+      </w:r>
+      <w:proofErr w:type="spellStart"/>
+      <w:r>
+        <w:t>mary</w:t>
+      </w:r>
+      <w:proofErr w:type="spellEnd"/>
     </w:p>
     <w:p>
       <w:pPr>
@@ -3430,7 +3597,15 @@
         <w:pStyle w:val="SPBodyText"/>
       </w:pPr>
       <w:r>
-        <w:t>The prayer then becomes our petition. We ask Mary, Mother of God, to pray for us — now, in the midst of our lives, and at the hour of our death.</w:t>
+        <w:t xml:space="preserve">The prayer then becomes our petition. We ask Mary, Mother of God, to pray for us — now, </w:t>
+      </w:r>
+      <w:proofErr w:type="gramStart"/>
+      <w:r>
+        <w:t>in the midst of</w:t>
+      </w:r>
+      <w:proofErr w:type="gramEnd"/>
+      <w:r>
+        <w:t xml:space="preserve"> our lives, and at the hour of our death.</w:t>
       </w:r>
     </w:p>
     <w:p>
@@ -4243,7 +4418,15 @@
         <w:pStyle w:val="SPBodyText"/>
       </w:pPr>
       <w:r>
-        <w:t>The prayer begins with the words of Scripture and ends with our humble request for intercession. Between the two stands the mystery of Christ: God who comes among us, takes flesh, and enters into our human story.</w:t>
+        <w:t xml:space="preserve">The prayer begins with the words of Scripture and ends with our humble request for intercession. Between the two stands the mystery of Christ: God who comes among us, takes flesh, and </w:t>
+      </w:r>
+      <w:proofErr w:type="gramStart"/>
+      <w:r>
+        <w:t>enters into</w:t>
+      </w:r>
+      <w:proofErr w:type="gramEnd"/>
+      <w:r>
+        <w:t xml:space="preserve"> our human story.</w:t>
       </w:r>
     </w:p>
     <w:p>
@@ -4452,7 +4635,15 @@
         <w:pStyle w:val="SPPrayerEnglish"/>
       </w:pPr>
       <w:r>
-        <w:t>Glory be to the Father,</w:t>
+        <w:t xml:space="preserve">Glory be to the </w:t>
+      </w:r>
+      <w:proofErr w:type="gramStart"/>
+      <w:r>
+        <w:t>Father</w:t>
+      </w:r>
+      <w:proofErr w:type="gramEnd"/>
+      <w:r>
+        <w:t>,</w:t>
       </w:r>
     </w:p>
     <w:p>
@@ -4460,8 +4651,13 @@
         <w:pStyle w:val="SPPrayerEnglish"/>
       </w:pPr>
       <w:r>
-        <w:t>And to the Son</w:t>
-      </w:r>
+        <w:t xml:space="preserve">And to the </w:t>
+      </w:r>
+      <w:proofErr w:type="gramStart"/>
+      <w:r>
+        <w:t>Son</w:t>
+      </w:r>
+      <w:proofErr w:type="gramEnd"/>
     </w:p>
     <w:p>
       <w:pPr>
@@ -4484,7 +4680,15 @@
         <w:pStyle w:val="SPPrayerEnglish"/>
       </w:pPr>
       <w:r>
-        <w:t>Is now, and ever shall be.</w:t>
+        <w:t xml:space="preserve">Is </w:t>
+      </w:r>
+      <w:proofErr w:type="gramStart"/>
+      <w:r>
+        <w:t>now, and</w:t>
+      </w:r>
+      <w:proofErr w:type="gramEnd"/>
+      <w:r>
+        <w:t xml:space="preserve"> ever shall be.</w:t>
       </w:r>
     </w:p>
     <w:p>
@@ -4639,7 +4843,23 @@
         <w:pStyle w:val="SPScripture"/>
       </w:pPr>
       <w:r>
-        <w:t>“to him be glory in the Church and in Christ Jesus to all generations, for ever and ever. Amen.”</w:t>
+        <w:t>“</w:t>
+      </w:r>
+      <w:proofErr w:type="gramStart"/>
+      <w:r>
+        <w:t>to</w:t>
+      </w:r>
+      <w:proofErr w:type="gramEnd"/>
+      <w:r>
+        <w:t xml:space="preserve"> him be glory in the Church and in Christ Jesus to all generations, </w:t>
+      </w:r>
+      <w:proofErr w:type="gramStart"/>
+      <w:r>
+        <w:t>for ever and ever</w:t>
+      </w:r>
+      <w:proofErr w:type="gramEnd"/>
+      <w:r>
+        <w:t>. Amen.”</w:t>
       </w:r>
     </w:p>
     <w:p>
@@ -4677,7 +4897,23 @@
         <w:pStyle w:val="SPScripture"/>
       </w:pPr>
       <w:r>
-        <w:t>“To the King of ages, immortal, invisible, the only God, be honor and glory for ever and ever. Amen.”</w:t>
+        <w:t xml:space="preserve">“To the King of ages, immortal, invisible, the only God, be </w:t>
+      </w:r>
+      <w:proofErr w:type="spellStart"/>
+      <w:r>
+        <w:t>honor</w:t>
+      </w:r>
+      <w:proofErr w:type="spellEnd"/>
+      <w:r>
+        <w:t xml:space="preserve"> and glory </w:t>
+      </w:r>
+      <w:proofErr w:type="gramStart"/>
+      <w:r>
+        <w:t>for ever and ever</w:t>
+      </w:r>
+      <w:proofErr w:type="gramEnd"/>
+      <w:r>
+        <w:t>. Amen.”</w:t>
       </w:r>
     </w:p>
     <w:p>
@@ -4696,7 +4932,23 @@
         <w:pStyle w:val="SPScripture"/>
       </w:pPr>
       <w:r>
-        <w:t>“and from Jesus Christ the faithful witness, the first-born of the dead, and the ruler of kings on earth. To him who loves us and has freed us from our sins by his blood and made us a kingdom, priests to God and Father, to him be glory and dominion for ever and ever. Amen.”</w:t>
+        <w:t>“</w:t>
+      </w:r>
+      <w:proofErr w:type="gramStart"/>
+      <w:r>
+        <w:t>and</w:t>
+      </w:r>
+      <w:proofErr w:type="gramEnd"/>
+      <w:r>
+        <w:t xml:space="preserve"> from Jesus Christ the faithful witness, the first-born of the dead, and the ruler of kings on earth. To him who loves us and has freed us from our sins by his blood and made us a kingdom, priests to God and Father, to him be glory and dominion </w:t>
+      </w:r>
+      <w:proofErr w:type="gramStart"/>
+      <w:r>
+        <w:t>for ever and ever</w:t>
+      </w:r>
+      <w:proofErr w:type="gramEnd"/>
+      <w:r>
+        <w:t>. Amen.”</w:t>
       </w:r>
     </w:p>
     <w:p>
@@ -4773,8 +5025,17 @@
           <w:b/>
           <w:bCs/>
         </w:rPr>
-        <w:t>Glory be to the Father</w:t>
-      </w:r>
+        <w:t xml:space="preserve">Glory be to the </w:t>
+      </w:r>
+      <w:proofErr w:type="gramStart"/>
+      <w:r>
+        <w:rPr>
+          <w:b/>
+          <w:bCs/>
+        </w:rPr>
+        <w:t>Father</w:t>
+      </w:r>
+      <w:proofErr w:type="gramEnd"/>
       <w:r>
         <w:t>, we turn our hearts towards the One from whom all things come.</w:t>
       </w:r>
@@ -4856,7 +5117,15 @@
         <w:pStyle w:val="SPBodyText"/>
       </w:pPr>
       <w:r>
-        <w:t>The Glory Be teaches us to lift our eyes beyond the noise of the moment and remember what is eternal.</w:t>
+        <w:t xml:space="preserve">The Glory </w:t>
+      </w:r>
+      <w:proofErr w:type="gramStart"/>
+      <w:r>
+        <w:t>Be</w:t>
+      </w:r>
+      <w:proofErr w:type="gramEnd"/>
+      <w:r>
+        <w:t xml:space="preserve"> teaches us to lift our eyes beyond the noise of the moment and remember what is eternal.</w:t>
       </w:r>
     </w:p>
     <w:p>
@@ -4917,7 +5186,15 @@
         <w:pStyle w:val="SPBodyText"/>
       </w:pPr>
       <w:r>
-        <w:t>Whatever good we possess is received. Whatever strength we have is given. Whatever love we are able to offer has its source in Him.</w:t>
+        <w:t xml:space="preserve">Whatever good we possess is received. Whatever strength we have is given. Whatever love we </w:t>
+      </w:r>
+      <w:proofErr w:type="gramStart"/>
+      <w:r>
+        <w:t>are able to</w:t>
+      </w:r>
+      <w:proofErr w:type="gramEnd"/>
+      <w:r>
+        <w:t xml:space="preserve"> offer has its source in Him.</w:t>
       </w:r>
     </w:p>
     <w:p>
@@ -5138,7 +5415,23 @@
           <w:b/>
           <w:bCs/>
         </w:rPr>
-        <w:t>Glory be to the Father.</w:t>
+        <w:t xml:space="preserve">Glory be to the </w:t>
+      </w:r>
+      <w:proofErr w:type="gramStart"/>
+      <w:r>
+        <w:rPr>
+          <w:b/>
+          <w:bCs/>
+        </w:rPr>
+        <w:t>Father</w:t>
+      </w:r>
+      <w:proofErr w:type="gramEnd"/>
+      <w:r>
+        <w:rPr>
+          <w:b/>
+          <w:bCs/>
+        </w:rPr>
+        <w:t>.</w:t>
       </w:r>
     </w:p>
     <w:p>
@@ -5167,7 +5460,23 @@
           <w:b/>
           <w:bCs/>
         </w:rPr>
-        <w:t>And to the Son.</w:t>
+        <w:t xml:space="preserve">And to the </w:t>
+      </w:r>
+      <w:proofErr w:type="gramStart"/>
+      <w:r>
+        <w:rPr>
+          <w:b/>
+          <w:bCs/>
+        </w:rPr>
+        <w:t>Son</w:t>
+      </w:r>
+      <w:proofErr w:type="gramEnd"/>
+      <w:r>
+        <w:rPr>
+          <w:b/>
+          <w:bCs/>
+        </w:rPr>
+        <w:t>.</w:t>
       </w:r>
     </w:p>
     <w:p>
@@ -5390,8 +5699,17 @@
           <w:b/>
           <w:bCs/>
         </w:rPr>
-        <w:t>Glory Be</w:t>
-      </w:r>
+        <w:t xml:space="preserve">Glory </w:t>
+      </w:r>
+      <w:proofErr w:type="gramStart"/>
+      <w:r>
+        <w:rPr>
+          <w:b/>
+          <w:bCs/>
+        </w:rPr>
+        <w:t>Be</w:t>
+      </w:r>
+      <w:proofErr w:type="gramEnd"/>
       <w:r>
         <w:t xml:space="preserve"> t</w:t>
       </w:r>
@@ -5903,7 +6221,15 @@
         <w:pStyle w:val="SPBodyText"/>
       </w:pPr>
       <w:r>
-        <w:t>True contrition is more than regret for having done wrong. It is a turning of the heart back towards God — recognising His goodness and mercy, and desiring to live more faithfully in His presence.</w:t>
+        <w:t xml:space="preserve">True contrition is more than regret for having done wrong. It is a turning of the heart back towards God — recognising His goodness and </w:t>
+      </w:r>
+      <w:proofErr w:type="gramStart"/>
+      <w:r>
+        <w:t>mercy, and</w:t>
+      </w:r>
+      <w:proofErr w:type="gramEnd"/>
+      <w:r>
+        <w:t xml:space="preserve"> desiring to live more faithfully in His presence.</w:t>
       </w:r>
     </w:p>
     <w:p>
@@ -6170,7 +6496,15 @@
         <w:pStyle w:val="SPScripture"/>
       </w:pPr>
       <w:r>
-        <w:t>But the tax collector, standing far off, would not even lift up his eyes to heaven, but beat his breast, saying, “God, be merciful to me a sinner!”</w:t>
+        <w:t xml:space="preserve">But the tax collector, standing far off, would not even </w:t>
+      </w:r>
+      <w:proofErr w:type="gramStart"/>
+      <w:r>
+        <w:t>lift up</w:t>
+      </w:r>
+      <w:proofErr w:type="gramEnd"/>
+      <w:r>
+        <w:t xml:space="preserve"> his eyes to heaven, but beat his breast, saying, “God, be merciful to me a sinner!”</w:t>
       </w:r>
     </w:p>
     <w:p>
@@ -6192,7 +6526,15 @@
         <w:pStyle w:val="SPScripture"/>
       </w:pPr>
       <w:r>
-        <w:t>If we confess our sins, he is faithful and just, and will forgive our sins and cleanse us from all unrighteousness.</w:t>
+        <w:t xml:space="preserve">If we confess our sins, he is faithful and </w:t>
+      </w:r>
+      <w:proofErr w:type="gramStart"/>
+      <w:r>
+        <w:t>just, and</w:t>
+      </w:r>
+      <w:proofErr w:type="gramEnd"/>
+      <w:r>
+        <w:t xml:space="preserve"> will forgive our sins and cleanse us from all unrighteousness.</w:t>
       </w:r>
     </w:p>
     <w:p>
@@ -6391,7 +6733,15 @@
         <w:pStyle w:val="SPBodyText"/>
       </w:pPr>
       <w:r>
-        <w:t>And so the Act of Contrition is not merely a prayer about the past.</w:t>
+        <w:t xml:space="preserve">And </w:t>
+      </w:r>
+      <w:proofErr w:type="gramStart"/>
+      <w:r>
+        <w:t>so</w:t>
+      </w:r>
+      <w:proofErr w:type="gramEnd"/>
+      <w:r>
+        <w:t xml:space="preserve"> the Act of Contrition is not merely a prayer about the past.</w:t>
       </w:r>
     </w:p>
     <w:p>
@@ -6796,7 +7146,15 @@
       </w:r>
       <w:r>
         <w:br/>
-        <w:t>He has raised up for us a mighty savior,</w:t>
+        <w:t xml:space="preserve">He has raised up for us a mighty </w:t>
+      </w:r>
+      <w:proofErr w:type="spellStart"/>
+      <w:r>
+        <w:t>savior</w:t>
+      </w:r>
+      <w:proofErr w:type="spellEnd"/>
+      <w:r>
+        <w:t>,</w:t>
       </w:r>
       <w:r>
         <w:br/>
@@ -7323,7 +7681,15 @@
         <w:spacing w:line="360" w:lineRule="auto"/>
       </w:pPr>
       <w:r>
-        <w:t>And you, child, will be called prophet of the Most High; for you will go before the Lord to prepare his ways, to give knowledge of salvation to his people in the forgiveness of their sins</w:t>
+        <w:t xml:space="preserve">And you, child, will be called prophet of the </w:t>
+      </w:r>
+      <w:proofErr w:type="gramStart"/>
+      <w:r>
+        <w:t>Most High</w:t>
+      </w:r>
+      <w:proofErr w:type="gramEnd"/>
+      <w:r>
+        <w:t>; for you will go before the Lord to prepare his ways, to give knowledge of salvation to his people in the forgiveness of their sins</w:t>
       </w:r>
       <w:r>
         <w:t xml:space="preserve">, through the tender mercy of our God, </w:t>
@@ -8589,7 +8955,15 @@
         <w:pStyle w:val="SPPrayerEnglish"/>
       </w:pPr>
       <w:r>
-        <w:t>for he has looked with favor on his lowly servant.</w:t>
+        <w:t xml:space="preserve">for he has looked with </w:t>
+      </w:r>
+      <w:proofErr w:type="spellStart"/>
+      <w:r>
+        <w:t>favor</w:t>
+      </w:r>
+      <w:proofErr w:type="spellEnd"/>
+      <w:r>
+        <w:t xml:space="preserve"> on his lowly servant.</w:t>
       </w:r>
       <w:r>
         <w:br/>
@@ -8636,7 +9010,15 @@
       </w:r>
       <w:r>
         <w:br/>
-        <w:t>and has lifted up the lowly.</w:t>
+        <w:t xml:space="preserve">and has </w:t>
+      </w:r>
+      <w:proofErr w:type="gramStart"/>
+      <w:r>
+        <w:t>lifted up</w:t>
+      </w:r>
+      <w:proofErr w:type="gramEnd"/>
+      <w:r>
+        <w:t xml:space="preserve"> the lowly.</w:t>
       </w:r>
     </w:p>
     <w:p>
@@ -8959,13 +9341,21 @@
         <w:pStyle w:val="SPScripture"/>
       </w:pPr>
       <w:r>
-        <w:t>He has shown strength with his arm, he has scattered the proud in the imagination of their hearts, he has put down the mighty from their thrones</w:t>
+        <w:t xml:space="preserve">He has shown strength with his arm, he has scattered the proud in the imagination of their hearts, he has put down the mighty from their </w:t>
+      </w:r>
+      <w:proofErr w:type="gramStart"/>
+      <w:r>
+        <w:t>thrones</w:t>
       </w:r>
       <w:r>
         <w:t>,</w:t>
       </w:r>
       <w:r>
-        <w:t xml:space="preserve"> and exalted those of low degree; He has filled the hungry with good things, and the rich he has sent away empty. </w:t>
+        <w:t xml:space="preserve"> and</w:t>
+      </w:r>
+      <w:proofErr w:type="gramEnd"/>
+      <w:r>
+        <w:t xml:space="preserve"> exalted those of low degree; He has filled the hungry with good things, and the rich he has sent away empty. </w:t>
       </w:r>
     </w:p>
     <w:p>
@@ -9137,7 +9527,15 @@
         <w:pStyle w:val="SPBodyText"/>
       </w:pPr>
       <w:r>
-        <w:t>And so she praises Him.</w:t>
+        <w:t xml:space="preserve">And </w:t>
+      </w:r>
+      <w:proofErr w:type="gramStart"/>
+      <w:r>
+        <w:t>so</w:t>
+      </w:r>
+      <w:proofErr w:type="gramEnd"/>
+      <w:r>
+        <w:t xml:space="preserve"> she praises Him.</w:t>
       </w:r>
     </w:p>
     <w:p>
@@ -9191,7 +9589,15 @@
         <w:pStyle w:val="SPBodyText"/>
       </w:pPr>
       <w:r>
-        <w:t>He lifts up the lowly.</w:t>
+        <w:t xml:space="preserve">He </w:t>
+      </w:r>
+      <w:proofErr w:type="gramStart"/>
+      <w:r>
+        <w:t>lifts up</w:t>
+      </w:r>
+      <w:proofErr w:type="gramEnd"/>
+      <w:r>
+        <w:t xml:space="preserve"> the lowly.</w:t>
       </w:r>
     </w:p>
     <w:p>
@@ -9344,7 +9750,15 @@
         <w:pStyle w:val="SPBodyText"/>
       </w:pPr>
       <w:r>
-        <w:t>One phrase appears again and again beneath the Magnificat:</w:t>
+        <w:t xml:space="preserve">One phrase appears </w:t>
+      </w:r>
+      <w:proofErr w:type="gramStart"/>
+      <w:r>
+        <w:t>again and again</w:t>
+      </w:r>
+      <w:proofErr w:type="gramEnd"/>
+      <w:r>
+        <w:t xml:space="preserve"> beneath the Magnificat:</w:t>
       </w:r>
     </w:p>
     <w:p>
@@ -9704,7 +10118,15 @@
         <w:pStyle w:val="SPBodyText"/>
       </w:pPr>
       <w:r>
-        <w:t>We can praise God in the midst of uncertainty.</w:t>
+        <w:t xml:space="preserve">We can praise God </w:t>
+      </w:r>
+      <w:proofErr w:type="gramStart"/>
+      <w:r>
+        <w:t>in the midst of</w:t>
+      </w:r>
+      <w:proofErr w:type="gramEnd"/>
+      <w:r>
+        <w:t xml:space="preserve"> uncertainty.</w:t>
       </w:r>
     </w:p>
     <w:p>
@@ -10627,7 +11049,15 @@
         <w:pStyle w:val="SPBodyText"/>
       </w:pPr>
       <w:r>
-        <w:t>These prayers have been handed down through generations. Some are centuries old. Others grew from particular traditions of devotion to Christ, the Blessed Virgin Mary, the angels and the saints.</w:t>
+        <w:t xml:space="preserve">These prayers have been handed down through generations. Some are centuries old. Others grew from </w:t>
+      </w:r>
+      <w:proofErr w:type="gramStart"/>
+      <w:r>
+        <w:t>particular traditions</w:t>
+      </w:r>
+      <w:proofErr w:type="gramEnd"/>
+      <w:r>
+        <w:t xml:space="preserve"> of devotion to Christ, the Blessed Virgin Mary, the angels and the saints.</w:t>
       </w:r>
     </w:p>
     <w:p>
@@ -11739,8 +12169,13 @@
       <w:pPr>
         <w:pStyle w:val="SPBodyText"/>
       </w:pPr>
-      <w:r>
-        <w:t>So begin simply.</w:t>
+      <w:proofErr w:type="gramStart"/>
+      <w:r>
+        <w:t>So</w:t>
+      </w:r>
+      <w:proofErr w:type="gramEnd"/>
+      <w:r>
+        <w:t xml:space="preserve"> begin simply.</w:t>
       </w:r>
     </w:p>
     <w:p>
@@ -11875,7 +12310,15 @@
         <w:t>Annunciation</w:t>
       </w:r>
       <w:r>
-        <w:t>, when the Angel Gabriel announced to Mary that she would become the Mother of the Son of God.</w:t>
+        <w:t xml:space="preserve">, when the Angel Gabriel announced to Mary that she would become the </w:t>
+      </w:r>
+      <w:proofErr w:type="gramStart"/>
+      <w:r>
+        <w:t>Mother</w:t>
+      </w:r>
+      <w:proofErr w:type="gramEnd"/>
+      <w:r>
+        <w:t xml:space="preserve"> of the Son of God.</w:t>
       </w:r>
     </w:p>
     <w:p>
@@ -11929,7 +12372,15 @@
         <w:pStyle w:val="SPBodyText"/>
       </w:pPr>
       <w:r>
-        <w:t>The repeated prayer invites us to pause in the midst of ordinary life and remember the mystery at the heart of our faith:</w:t>
+        <w:t xml:space="preserve">The repeated prayer invites us to pause </w:t>
+      </w:r>
+      <w:proofErr w:type="gramStart"/>
+      <w:r>
+        <w:t>in the midst of</w:t>
+      </w:r>
+      <w:proofErr w:type="gramEnd"/>
+      <w:r>
+        <w:t xml:space="preserve"> ordinary life and remember the mystery at the heart of our faith:</w:t>
       </w:r>
       <w:r>
         <w:t xml:space="preserve"> </w:t>
@@ -11939,7 +12390,23 @@
           <w:b/>
           <w:bCs/>
         </w:rPr>
-        <w:t>“And the Word was made flesh, and dwelt among us.”</w:t>
+        <w:t xml:space="preserve">“And the Word was made </w:t>
+      </w:r>
+      <w:proofErr w:type="gramStart"/>
+      <w:r>
+        <w:rPr>
+          <w:b/>
+          <w:bCs/>
+        </w:rPr>
+        <w:t>flesh, and</w:t>
+      </w:r>
+      <w:proofErr w:type="gramEnd"/>
+      <w:r>
+        <w:rPr>
+          <w:b/>
+          <w:bCs/>
+        </w:rPr>
+        <w:t xml:space="preserve"> dwelt among us.”</w:t>
       </w:r>
     </w:p>
     <w:p>
@@ -12327,7 +12794,15 @@
         <w:pStyle w:val="SPPrayerEnglish"/>
       </w:pPr>
       <w:r>
-        <w:t xml:space="preserve">Pour forth, we beseech Thee, O Lord, Thy grace into our hearts, that we to whom the Incarnation of Christ, Thy Son, was made known by the message of an angel, may by His Passion and Cross be brought to the glory of His resurrection. Through the same Christ our Lord. </w:t>
+        <w:t xml:space="preserve">Pour forth, we beseech Thee, O Lord, </w:t>
+      </w:r>
+      <w:proofErr w:type="gramStart"/>
+      <w:r>
+        <w:t>Thy</w:t>
+      </w:r>
+      <w:proofErr w:type="gramEnd"/>
+      <w:r>
+        <w:t xml:space="preserve"> grace into our hearts, that we to whom the Incarnation of Christ, Thy Son, was made known by the message of an angel, may by His Passion and Cross be brought to the glory of His resurrection. Through the same Christ our Lord. </w:t>
       </w:r>
     </w:p>
     <w:p>
@@ -13045,7 +13520,15 @@
         <w:pStyle w:val="SPBodyText"/>
       </w:pPr>
       <w:r>
-        <w:t>At noon, we pause in the midst of our work.</w:t>
+        <w:t xml:space="preserve">At noon, we pause </w:t>
+      </w:r>
+      <w:proofErr w:type="gramStart"/>
+      <w:r>
+        <w:t>in the midst of</w:t>
+      </w:r>
+      <w:proofErr w:type="gramEnd"/>
+      <w:r>
+        <w:t xml:space="preserve"> our work.</w:t>
       </w:r>
     </w:p>
     <w:p>
@@ -13135,7 +13618,15 @@
         <w:pStyle w:val="SPBodyText"/>
       </w:pPr>
       <w:r>
-        <w:t>Back to the truth that God is near.</w:t>
+        <w:t xml:space="preserve">Back to the truth that God is </w:t>
+      </w:r>
+      <w:proofErr w:type="gramStart"/>
+      <w:r>
+        <w:t>near</w:t>
+      </w:r>
+      <w:proofErr w:type="gramEnd"/>
+      <w:r>
+        <w:t>.</w:t>
       </w:r>
     </w:p>
     <w:p>
@@ -13287,7 +13778,15 @@
         <w:t>Anima Christi</w:t>
       </w:r>
       <w:r>
-        <w:t xml:space="preserve"> is an ancient Christian prayer traditionally associated with devotion to Christ and, in particular, with the Eucharist. Its origins are uncertain, but the prayer was already in use by the early sixteenth century and became especially beloved through its association with St. Ignatius of Loyola, who placed it at the beginning of his </w:t>
+        <w:t xml:space="preserve"> is an ancient Christian prayer traditionally associated with devotion to Christ and</w:t>
+      </w:r>
+      <w:proofErr w:type="gramStart"/>
+      <w:r>
+        <w:t>, in particular, with</w:t>
+      </w:r>
+      <w:proofErr w:type="gramEnd"/>
+      <w:r>
+        <w:t xml:space="preserve"> the Eucharist. Its origins are uncertain, but the prayer was already in use by the early sixteenth century and became especially beloved through its association with St. Ignatius of Loyola, who placed it at the beginning of his </w:t>
       </w:r>
       <w:r>
         <w:rPr>
@@ -13855,7 +14354,15 @@
         <w:pStyle w:val="SPBodyText"/>
       </w:pPr>
       <w:r>
-        <w:t>The Anima Christi is a prayer of drawing near.</w:t>
+        <w:t xml:space="preserve">The Anima Christi is a prayer of drawing </w:t>
+      </w:r>
+      <w:proofErr w:type="gramStart"/>
+      <w:r>
+        <w:t>near</w:t>
+      </w:r>
+      <w:proofErr w:type="gramEnd"/>
+      <w:r>
+        <w:t>.</w:t>
       </w:r>
     </w:p>
     <w:p>
@@ -14510,7 +15017,15 @@
         </w:sectPr>
       </w:pPr>
       <w:r>
-        <w:t>The angel of the Lord encamps around those who fear him, and delivers them.</w:t>
+        <w:t xml:space="preserve">The angel of the Lord encamps around those who fear </w:t>
+      </w:r>
+      <w:proofErr w:type="gramStart"/>
+      <w:r>
+        <w:t>him, and</w:t>
+      </w:r>
+      <w:proofErr w:type="gramEnd"/>
+      <w:r>
+        <w:t xml:space="preserve"> delivers them.</w:t>
       </w:r>
     </w:p>
     <w:p>
@@ -14868,6 +15383,61 @@
     <w:p>
       <w:pPr>
         <w:pStyle w:val="SPPrayerTitle"/>
+      </w:pPr>
+      <w:r>
+        <w:t>Prayer for the faithful departed</w:t>
+      </w:r>
+    </w:p>
+    <w:p>
+      <w:pPr>
+        <w:pStyle w:val="SPBodyText"/>
+      </w:pPr>
+      <w:r>
+        <w:t>Death is a mystery we all encounter, yet as Christians we do not grieve without hope. We entrust those who have gone before us to the mercy and love of God, believing that death is not the end, but a passage toward the fullness of life in Christ.</w:t>
+      </w:r>
+    </w:p>
+    <w:p>
+      <w:pPr>
+        <w:pStyle w:val="SPBodyText"/>
+      </w:pPr>
+    </w:p>
+    <w:p>
+      <w:pPr>
+        <w:pStyle w:val="SPBodyText"/>
+      </w:pPr>
+      <w:r>
+        <w:t>From the earliest days of the Church, Christians have prayed for the faithful departed. In doing so, we remember those we have loved, commend them to God's care, and place our hope in Christ, who conquered death and promises eternal life.</w:t>
+      </w:r>
+    </w:p>
+    <w:p>
+      <w:pPr>
+        <w:pStyle w:val="SPBodyText"/>
+        <w:rPr>
+          <w:b/>
+          <w:bCs/>
+        </w:rPr>
+      </w:pPr>
+    </w:p>
+    <w:p>
+      <w:pPr>
+        <w:pStyle w:val="SPBodyText"/>
+      </w:pPr>
+      <w:r>
+        <w:rPr>
+          <w:b/>
+          <w:bCs/>
+        </w:rPr>
+        <w:t>Eternal rest grant unto them, O Lord.</w:t>
+      </w:r>
+    </w:p>
+    <w:p>
+      <w:pPr>
+        <w:pStyle w:val="SPBodyText"/>
+      </w:pPr>
+    </w:p>
+    <w:p>
+      <w:pPr>
+        <w:pStyle w:val="SPBodyText"/>
         <w:sectPr>
           <w:type w:val="oddPage"/>
           <w:pgSz w:w="7920" w:h="12240" w:code="6"/>
@@ -14877,14 +15447,11 @@
           <w:docGrid w:linePitch="360"/>
         </w:sectPr>
       </w:pPr>
-      <w:r>
-        <w:t>Prayer for the faithful departed</w:t>
-      </w:r>
     </w:p>
     <w:p>
       <w:pPr>
         <w:pStyle w:val="SPLanguage"/>
-        <w:spacing w:before="600"/>
+        <w:spacing w:before="200"/>
       </w:pPr>
       <w:r>
         <w:lastRenderedPageBreak/>
@@ -14896,8 +15463,56 @@
       <w:pPr>
         <w:pStyle w:val="SPPrayerEnglish"/>
       </w:pPr>
+    </w:p>
+    <w:p>
+      <w:pPr>
+        <w:pStyle w:val="SPPrayerEnglish"/>
+      </w:pPr>
       <w:r>
         <w:tab/>
+      </w:r>
+      <w:r>
+        <w:t>Eternal rest grant unto them, O Lord.</w:t>
+      </w:r>
+    </w:p>
+    <w:p>
+      <w:pPr>
+        <w:pStyle w:val="SPPrayerEnglish"/>
+      </w:pPr>
+      <w:r>
+        <w:t>And let perpetual light shine upon them.</w:t>
+      </w:r>
+    </w:p>
+    <w:p>
+      <w:pPr>
+        <w:pStyle w:val="SPPrayerEnglish"/>
+      </w:pPr>
+      <w:r>
+        <w:t>May the souls of all the faithful departed,</w:t>
+      </w:r>
+    </w:p>
+    <w:p>
+      <w:pPr>
+        <w:pStyle w:val="SPPrayerEnglish"/>
+      </w:pPr>
+      <w:r>
+        <w:t>t</w:t>
+      </w:r>
+      <w:r>
+        <w:t>hrough the mercy of God, rest in peace.</w:t>
+      </w:r>
+    </w:p>
+    <w:p>
+      <w:pPr>
+        <w:pStyle w:val="SPPrayerEnglish"/>
+      </w:pPr>
+    </w:p>
+    <w:p>
+      <w:pPr>
+        <w:pStyle w:val="SPPrayerEnglish"/>
+      </w:pPr>
+      <w:r>
+        <w:t>Amen.</w:t>
       </w:r>
     </w:p>
     <w:p>
@@ -14919,6 +15534,68 @@
       <w:r>
         <w:lastRenderedPageBreak/>
         <w:t>LATIN</w:t>
+      </w:r>
+    </w:p>
+    <w:p>
+      <w:pPr>
+        <w:pStyle w:val="SPPrayerLatin"/>
+      </w:pPr>
+    </w:p>
+    <w:p>
+      <w:pPr>
+        <w:pStyle w:val="SPPrayerLatin"/>
+        <w:rPr>
+          <w:lang w:val="en-ZA"/>
+        </w:rPr>
+      </w:pPr>
+      <w:r>
+        <w:rPr>
+          <w:iCs/>
+          <w:lang w:val="en-ZA"/>
+        </w:rPr>
+        <w:t>Réquiem ætérnam dona eis, Dómine.</w:t>
+      </w:r>
+    </w:p>
+    <w:p>
+      <w:pPr>
+        <w:pStyle w:val="SPPrayerLatin"/>
+        <w:rPr>
+          <w:lang w:val="en-ZA"/>
+        </w:rPr>
+      </w:pPr>
+      <w:r>
+        <w:rPr>
+          <w:iCs/>
+          <w:lang w:val="en-ZA"/>
+        </w:rPr>
+        <w:t>Et lux perpétua lúceat eis.</w:t>
+      </w:r>
+    </w:p>
+    <w:p>
+      <w:pPr>
+        <w:pStyle w:val="SPPrayerLatin"/>
+        <w:rPr>
+          <w:lang w:val="en-ZA"/>
+        </w:rPr>
+      </w:pPr>
+      <w:r>
+        <w:rPr>
+          <w:iCs/>
+          <w:lang w:val="en-ZA"/>
+        </w:rPr>
+        <w:t>Fidélium ánimæ per misericórdiam Dei</w:t>
+      </w:r>
+    </w:p>
+    <w:p>
+      <w:pPr>
+        <w:pStyle w:val="SPPrayerLatin"/>
+      </w:pPr>
+      <w:r>
+        <w:rPr>
+          <w:iCs/>
+          <w:lang w:val="en-ZA"/>
+        </w:rPr>
+        <w:t>requiéscant in pace.</w:t>
       </w:r>
     </w:p>
     <w:p>
@@ -14938,10 +15615,74 @@
           <w:docGrid w:linePitch="360"/>
         </w:sectPr>
       </w:pPr>
+      <w:r>
+        <w:t>Amen</w:t>
+      </w:r>
     </w:p>
     <w:p>
       <w:pPr>
         <w:pStyle w:val="SPSectionTitle"/>
+      </w:pPr>
+      <w:r>
+        <w:lastRenderedPageBreak/>
+        <w:t>SCRIPTURE</w:t>
+      </w:r>
+    </w:p>
+    <w:p>
+      <w:pPr>
+        <w:pStyle w:val="SPScriptureReference"/>
+      </w:pPr>
+      <w:r>
+        <w:t>Wisdom 3:1-4</w:t>
+      </w:r>
+    </w:p>
+    <w:p>
+      <w:pPr>
+        <w:pStyle w:val="SPScripture"/>
+      </w:pPr>
+    </w:p>
+    <w:p>
+      <w:pPr>
+        <w:pStyle w:val="SPScriptureReference"/>
+      </w:pPr>
+      <w:r>
+        <w:t>2 Maccabees 12:44-46</w:t>
+      </w:r>
+    </w:p>
+    <w:p>
+      <w:pPr>
+        <w:pStyle w:val="SPScripture"/>
+      </w:pPr>
+    </w:p>
+    <w:p>
+      <w:pPr>
+        <w:pStyle w:val="SPScriptureReference"/>
+      </w:pPr>
+      <w:r>
+        <w:t>John 11:25-26</w:t>
+      </w:r>
+    </w:p>
+    <w:p>
+      <w:pPr>
+        <w:pStyle w:val="SPScripture"/>
+      </w:pPr>
+    </w:p>
+    <w:p>
+      <w:pPr>
+        <w:pStyle w:val="SPScriptureReference"/>
+      </w:pPr>
+      <w:r>
+        <w:t>1 Thessalonians 4:13-14</w:t>
+      </w:r>
+    </w:p>
+    <w:p>
+      <w:pPr>
+        <w:pStyle w:val="SPScriptureReference"/>
+      </w:pPr>
+    </w:p>
+    <w:p>
+      <w:pPr>
+        <w:pStyle w:val="SPScripture"/>
         <w:sectPr>
           <w:type w:val="evenPage"/>
           <w:pgSz w:w="7920" w:h="12240" w:code="6"/>
@@ -14951,10 +15692,6 @@
           <w:docGrid w:linePitch="360"/>
         </w:sectPr>
       </w:pPr>
-      <w:r>
-        <w:lastRenderedPageBreak/>
-        <w:t>SCRIPTURE</w:t>
-      </w:r>
     </w:p>
     <w:p>
       <w:pPr>
@@ -14968,7 +15705,195 @@
     <w:p>
       <w:pPr>
         <w:pStyle w:val="SPBodyText"/>
-      </w:pPr>
+        <w:rPr>
+          <w:b/>
+          <w:bCs/>
+        </w:rPr>
+      </w:pPr>
+      <w:r>
+        <w:rPr>
+          <w:b/>
+          <w:bCs/>
+        </w:rPr>
+        <w:t>I</w:t>
+      </w:r>
+      <w:r>
+        <w:rPr>
+          <w:b/>
+          <w:bCs/>
+        </w:rPr>
+        <w:t>n the Hands of Mercy</w:t>
+      </w:r>
+    </w:p>
+    <w:p>
+      <w:pPr>
+        <w:pStyle w:val="SPBodyText"/>
+      </w:pPr>
+      <w:r>
+        <w:t>There are names we carry in our hearts long after we can no longer hear the voices of those who bore them.</w:t>
+      </w:r>
+    </w:p>
+    <w:p>
+      <w:pPr>
+        <w:pStyle w:val="SPBodyText"/>
+      </w:pPr>
+      <w:r>
+        <w:t>The Prayer for the Faithful Departed gives us a simple way to remember them before God. We speak their names, remember their lives, and entrust their souls to the mercy of the One who knows them more completely than we ever could.</w:t>
+      </w:r>
+    </w:p>
+    <w:p>
+      <w:pPr>
+        <w:pStyle w:val="SPBodyText"/>
+      </w:pPr>
+    </w:p>
+    <w:p>
+      <w:pPr>
+        <w:pStyle w:val="SPBodyText"/>
+      </w:pPr>
+      <w:r>
+        <w:rPr>
+          <w:b/>
+          <w:bCs/>
+        </w:rPr>
+        <w:t>“Eternal rest grant unto them, O Lord.”</w:t>
+      </w:r>
+    </w:p>
+    <w:p>
+      <w:pPr>
+        <w:pStyle w:val="SPBodyText"/>
+      </w:pPr>
+    </w:p>
+    <w:p>
+      <w:pPr>
+        <w:pStyle w:val="SPBodyText"/>
+      </w:pPr>
+      <w:r>
+        <w:t>These words are not merely an expression of sorrow. They are an act of faith.</w:t>
+      </w:r>
+    </w:p>
+    <w:p>
+      <w:pPr>
+        <w:pStyle w:val="SPBodyText"/>
+      </w:pPr>
+      <w:r>
+        <w:t>We believe that every human life is known and loved by God, and that death does not place a person outside His care. The Church therefore continues to pray for those who have died, trusting them to God's mercy and looking toward the resurrection promised through Christ.</w:t>
+      </w:r>
+    </w:p>
+    <w:p>
+      <w:pPr>
+        <w:pStyle w:val="SPBodyText"/>
+      </w:pPr>
+      <w:r>
+        <w:t>When we pray for the departed, we also acknowledge something humble about ourselves: we do not know the whole story of another person's life. We know their joys and their struggles, their kindnesses and their weaknesses, perhaps only in part. God alone sees the heart completely.</w:t>
+      </w:r>
+    </w:p>
+    <w:p>
+      <w:pPr>
+        <w:pStyle w:val="SPBodyText"/>
+      </w:pPr>
+    </w:p>
+    <w:p>
+      <w:pPr>
+        <w:pStyle w:val="SPBodyText"/>
+      </w:pPr>
+      <w:r>
+        <w:lastRenderedPageBreak/>
+        <w:t>We ask Him to forgive, to purify, to receive, and to grant eternal rest. In this prayer, our grief becomes an offering of love.</w:t>
+      </w:r>
+    </w:p>
+    <w:p>
+      <w:pPr>
+        <w:pStyle w:val="SPBodyText"/>
+      </w:pPr>
+      <w:r>
+        <w:t xml:space="preserve">The words </w:t>
+      </w:r>
+      <w:r>
+        <w:rPr>
+          <w:b/>
+          <w:bCs/>
+        </w:rPr>
+        <w:t>“May perpetual light shine upon them”</w:t>
+      </w:r>
+      <w:r>
+        <w:t xml:space="preserve"> are especially beautiful. Light is one of Scripture's great images of God's presence. We ask that those who have died may be brought from the darkness of death into the everlasting light of God.</w:t>
+      </w:r>
+    </w:p>
+    <w:p>
+      <w:pPr>
+        <w:pStyle w:val="SPBodyText"/>
+      </w:pPr>
+      <w:r>
+        <w:t>And perhaps, when we pray these words, we should remember that one day someone may pray them for us.</w:t>
+      </w:r>
+    </w:p>
+    <w:p>
+      <w:pPr>
+        <w:pStyle w:val="SPBodyText"/>
+      </w:pPr>
+      <w:r>
+        <w:t>That thought need not frighten us. Rather, it can remind us to live with our hearts turned toward God while we still have the gift of this earthly life.</w:t>
+      </w:r>
+    </w:p>
+    <w:p>
+      <w:pPr>
+        <w:pStyle w:val="SPBodyText"/>
+      </w:pPr>
+      <w:r>
+        <w:t>For the Christian, death is not the final word.</w:t>
+      </w:r>
+    </w:p>
+    <w:p>
+      <w:pPr>
+        <w:pStyle w:val="SPBodyText"/>
+      </w:pPr>
+      <w:r>
+        <w:t>Christ is.</w:t>
+      </w:r>
+    </w:p>
+    <w:p>
+      <w:pPr>
+        <w:pStyle w:val="SPBodyText"/>
+      </w:pPr>
+      <w:r>
+        <w:t>He is the Resurrection and the Life. Because He has passed through death and risen again, we can entrust our departed loved ones to Him with hope. We may mourn them deeply, miss them terribly, and still believe that they are held within the mercy of God.</w:t>
+      </w:r>
+    </w:p>
+    <w:p>
+      <w:pPr>
+        <w:pStyle w:val="SPBodyText"/>
+      </w:pPr>
+      <w:r>
+        <w:t>So,</w:t>
+      </w:r>
+      <w:r>
+        <w:t xml:space="preserve"> when we </w:t>
+      </w:r>
+      <w:r>
+        <w:t>pray,</w:t>
+      </w:r>
+      <w:r>
+        <w:t xml:space="preserve"> </w:t>
+      </w:r>
+      <w:r>
+        <w:t>we are doing more than remembering the dead.</w:t>
+      </w:r>
+    </w:p>
+    <w:p>
+      <w:pPr>
+        <w:pStyle w:val="SPBodyText"/>
+      </w:pPr>
+      <w:r>
+        <w:t>We are placing them into God's hands.</w:t>
+      </w:r>
+    </w:p>
+    <w:p>
+      <w:pPr>
+        <w:pStyle w:val="SPBodyText"/>
+      </w:pPr>
+      <w:r>
+        <w:t>And perhaps, in doing so, we discover that our own hearts are placed there too.</w:t>
+      </w:r>
     </w:p>
     <w:p>
       <w:pPr>
@@ -15011,6 +15936,83 @@
     <w:p>
       <w:pPr>
         <w:pStyle w:val="SPPrayerTitle"/>
+      </w:pPr>
+      <w:r>
+        <w:t>Divine  praises</w:t>
+      </w:r>
+    </w:p>
+    <w:p>
+      <w:pPr>
+        <w:pStyle w:val="SPBodyText"/>
+      </w:pPr>
+      <w:r>
+        <w:t xml:space="preserve">The Divine Praises is a traditional Catholic prayer of praise and adoration. It is especially associated with Benediction of the Blessed Sacrament, </w:t>
+      </w:r>
+      <w:r>
+        <w:t>where it is traditionally prayed in response to the blessing of the Blessed Sacrament.</w:t>
+      </w:r>
+    </w:p>
+    <w:p>
+      <w:pPr>
+        <w:pStyle w:val="SPBodyText"/>
+      </w:pPr>
+    </w:p>
+    <w:p>
+      <w:pPr>
+        <w:pStyle w:val="SPBodyText"/>
+      </w:pPr>
+      <w:r>
+        <w:t xml:space="preserve">Its repeated </w:t>
+      </w:r>
+      <w:r>
+        <w:rPr>
+          <w:b/>
+          <w:bCs/>
+        </w:rPr>
+        <w:t>“Blessed be...”</w:t>
+      </w:r>
+      <w:r>
+        <w:t xml:space="preserve"> turns our attention away from ourselves and toward God: Father, Son, and Holy Spirit; Christ in the Eucharist; the Blessed Virgin Mary; St. Joseph; and all the angels and saints.</w:t>
+      </w:r>
+    </w:p>
+    <w:p>
+      <w:pPr>
+        <w:pStyle w:val="SPBodyText"/>
+      </w:pPr>
+    </w:p>
+    <w:p>
+      <w:pPr>
+        <w:pStyle w:val="SPBodyText"/>
+      </w:pPr>
+      <w:r>
+        <w:t xml:space="preserve">It is a fitting prayer at the close of the day, reminding us that whatever the day has brought, </w:t>
+      </w:r>
+    </w:p>
+    <w:p>
+      <w:pPr>
+        <w:pStyle w:val="SPBodyText"/>
+      </w:pPr>
+    </w:p>
+    <w:p>
+      <w:pPr>
+        <w:pStyle w:val="SPBodyText"/>
+      </w:pPr>
+      <w:r>
+        <w:rPr>
+          <w:b/>
+          <w:bCs/>
+        </w:rPr>
+        <w:t>God remains worthy of our praise.</w:t>
+      </w:r>
+    </w:p>
+    <w:p>
+      <w:pPr>
+        <w:pStyle w:val="SPBodyText"/>
+      </w:pPr>
+    </w:p>
+    <w:p>
+      <w:pPr>
+        <w:pStyle w:val="SPBodyText"/>
         <w:sectPr>
           <w:type w:val="oddPage"/>
           <w:pgSz w:w="7920" w:h="12240" w:code="6"/>
@@ -15020,14 +16022,11 @@
           <w:docGrid w:linePitch="360"/>
         </w:sectPr>
       </w:pPr>
-      <w:r>
-        <w:t>Divine  praises</w:t>
-      </w:r>
     </w:p>
     <w:p>
       <w:pPr>
         <w:pStyle w:val="SPLanguage"/>
-        <w:spacing w:before="600"/>
+        <w:spacing w:before="200"/>
       </w:pPr>
       <w:r>
         <w:lastRenderedPageBreak/>
@@ -15042,6 +16041,79 @@
       <w:r>
         <w:tab/>
       </w:r>
+    </w:p>
+    <w:p>
+      <w:pPr>
+        <w:pStyle w:val="SPPrayerEnglish"/>
+      </w:pPr>
+      <w:r>
+        <w:t>Blessed be God.</w:t>
+      </w:r>
+      <w:r>
+        <w:br/>
+        <w:t>Blessed be His Holy Name.</w:t>
+      </w:r>
+      <w:r>
+        <w:br/>
+        <w:t>Blessed be Jesus Christ, true God and true Man.</w:t>
+      </w:r>
+      <w:r>
+        <w:br/>
+        <w:t>Blessed be the Name of Jesus.</w:t>
+      </w:r>
+      <w:r>
+        <w:br/>
+        <w:t>Blessed be His Most Sacred Heart.</w:t>
+      </w:r>
+      <w:r>
+        <w:br/>
+        <w:t>Blessed be His Most Precious Blood.</w:t>
+      </w:r>
+      <w:r>
+        <w:br/>
+        <w:t>Blessed be Jesus in the Most Holy Sacrament of the Altar.</w:t>
+      </w:r>
+      <w:r>
+        <w:br/>
+        <w:t>Blessed be the Holy Spirit, the Paraclete.</w:t>
+      </w:r>
+      <w:r>
+        <w:br/>
+        <w:t>Blessed be the great Mother of God, Mary most holy.</w:t>
+      </w:r>
+      <w:r>
+        <w:br/>
+        <w:t>Blessed be her holy and Immaculate Conception.</w:t>
+      </w:r>
+      <w:r>
+        <w:br/>
+        <w:t>Blessed be her glorious Assumption.</w:t>
+      </w:r>
+      <w:r>
+        <w:br/>
+        <w:t>Blessed be the name of Mary, Virgin and Mother.</w:t>
+      </w:r>
+      <w:r>
+        <w:br/>
+        <w:t>Blessed be St. Joseph, her most chaste spouse.</w:t>
+      </w:r>
+      <w:r>
+        <w:br/>
+        <w:t>Blessed be God in His angels and in His saints.</w:t>
+      </w:r>
+    </w:p>
+    <w:p>
+      <w:pPr>
+        <w:pStyle w:val="SPPrayerEnglish"/>
+      </w:pPr>
+      <w:r>
+        <w:t>Amen.</w:t>
+      </w:r>
+    </w:p>
+    <w:p>
+      <w:pPr>
+        <w:pStyle w:val="SPPrayerEnglish"/>
+      </w:pPr>
     </w:p>
     <w:p>
       <w:pPr>
@@ -15062,6 +16134,79 @@
       <w:r>
         <w:lastRenderedPageBreak/>
         <w:t>LATIN</w:t>
+      </w:r>
+    </w:p>
+    <w:p>
+      <w:pPr>
+        <w:pStyle w:val="SPPrayerLatin"/>
+      </w:pPr>
+    </w:p>
+    <w:p>
+      <w:pPr>
+        <w:pStyle w:val="SPPrayerLatin"/>
+      </w:pPr>
+      <w:r>
+        <w:t>Benedictus Deus.</w:t>
+      </w:r>
+      <w:r>
+        <w:br/>
+        <w:t>Benedictum nomen sanctum eius.</w:t>
+      </w:r>
+      <w:r>
+        <w:br/>
+        <w:t>Benedictus Iesus Christus, verus Deus et verus homo.</w:t>
+      </w:r>
+      <w:r>
+        <w:br/>
+        <w:t>Benedictum nomen Iesu.</w:t>
+      </w:r>
+      <w:r>
+        <w:br/>
+        <w:t>Benedictum Cor eius sacratissimum.</w:t>
+      </w:r>
+      <w:r>
+        <w:br/>
+        <w:t>Benedictus Sanguis eius pretiosissimus.</w:t>
+      </w:r>
+      <w:r>
+        <w:br/>
+        <w:t>Benedictus Iesus in sanctissimo altaris Sacramento.</w:t>
+      </w:r>
+      <w:r>
+        <w:br/>
+        <w:t>Benedictus Spiritus Sanctus, Paraclitus.</w:t>
+      </w:r>
+      <w:r>
+        <w:br/>
+        <w:t>Benedicta excelsa Dei Mater, Maria sanctissima.</w:t>
+      </w:r>
+      <w:r>
+        <w:br/>
+        <w:t>Benedicta sancta eius et immaculata Conceptio.</w:t>
+      </w:r>
+      <w:r>
+        <w:br/>
+        <w:t>Benedicta eius gloriosa Assumptio.</w:t>
+      </w:r>
+      <w:r>
+        <w:br/>
+        <w:t>Benedictum nomen Mariae, Virginis et Matris.</w:t>
+      </w:r>
+      <w:r>
+        <w:br/>
+        <w:t>Benedictus sanctus Ioseph, eius castissimus sponsus.</w:t>
+      </w:r>
+      <w:r>
+        <w:br/>
+        <w:t>Benedictus Deus in angelis suis et in sanctis suis.</w:t>
+      </w:r>
+    </w:p>
+    <w:p>
+      <w:pPr>
+        <w:pStyle w:val="SPPrayerLatin"/>
+      </w:pPr>
+      <w:r>
+        <w:t>Amen.</w:t>
       </w:r>
     </w:p>
     <w:p>
@@ -15085,6 +16230,62 @@
     <w:p>
       <w:pPr>
         <w:pStyle w:val="SPSectionTitle"/>
+      </w:pPr>
+      <w:r>
+        <w:lastRenderedPageBreak/>
+        <w:t>SCRIPTURE</w:t>
+      </w:r>
+    </w:p>
+    <w:p>
+      <w:pPr>
+        <w:pStyle w:val="SPScriptureReference"/>
+      </w:pPr>
+      <w:r>
+        <w:t>Psalm 113:1–3</w:t>
+      </w:r>
+    </w:p>
+    <w:p>
+      <w:pPr>
+        <w:pStyle w:val="SPScriptureReference"/>
+      </w:pPr>
+    </w:p>
+    <w:p>
+      <w:pPr>
+        <w:pStyle w:val="SPScriptureReference"/>
+      </w:pPr>
+      <w:r>
+        <w:t>Philippians 2:9–11</w:t>
+      </w:r>
+    </w:p>
+    <w:p>
+      <w:pPr>
+        <w:pStyle w:val="SPScriptureReference"/>
+      </w:pPr>
+    </w:p>
+    <w:p>
+      <w:pPr>
+        <w:pStyle w:val="SPScriptureReference"/>
+      </w:pPr>
+      <w:r>
+        <w:t>Revelation 7:11–12</w:t>
+      </w:r>
+    </w:p>
+    <w:p>
+      <w:pPr>
+        <w:pStyle w:val="SPScriptureReference"/>
+      </w:pPr>
+    </w:p>
+    <w:p>
+      <w:pPr>
+        <w:pStyle w:val="SPScriptureReference"/>
+      </w:pPr>
+      <w:r>
+        <w:t>John 6:51</w:t>
+      </w:r>
+    </w:p>
+    <w:p>
+      <w:pPr>
+        <w:pStyle w:val="SPScriptureReference"/>
         <w:sectPr>
           <w:type w:val="evenPage"/>
           <w:pgSz w:w="7920" w:h="12240" w:code="6"/>
@@ -15094,14 +16295,244 @@
           <w:docGrid w:linePitch="360"/>
         </w:sectPr>
       </w:pPr>
+    </w:p>
+    <w:p>
+      <w:pPr>
+        <w:pStyle w:val="SPSectionTitle"/>
+      </w:pPr>
       <w:r>
         <w:lastRenderedPageBreak/>
-        <w:t>SCRIPTURE</w:t>
-      </w:r>
-    </w:p>
-    <w:p>
-      <w:pPr>
-        <w:pStyle w:val="SPSectionTitle"/>
+        <w:t>REFLECTION</w:t>
+      </w:r>
+    </w:p>
+    <w:p>
+      <w:pPr>
+        <w:pStyle w:val="SPBodyText"/>
+        <w:rPr>
+          <w:b/>
+          <w:bCs/>
+        </w:rPr>
+      </w:pPr>
+      <w:r>
+        <w:rPr>
+          <w:b/>
+          <w:bCs/>
+        </w:rPr>
+        <w:t>A Heart That Gives Thanks</w:t>
+      </w:r>
+    </w:p>
+    <w:p>
+      <w:pPr>
+        <w:pStyle w:val="SPBodyText"/>
+      </w:pPr>
+      <w:r>
+        <w:t>Praise is one of the simplest forms of prayer, and yet it can be one of the hardest for us to practise.</w:t>
+      </w:r>
+    </w:p>
+    <w:p>
+      <w:pPr>
+        <w:pStyle w:val="SPBodyText"/>
+      </w:pPr>
+      <w:r>
+        <w:t xml:space="preserve">We are naturally inclined to come before God with our needs: asking for help, forgiveness, healing, protection, guidance, and strength. These are good and necessary prayers. But the Divine Praises reminds us that prayer is also an act of simply </w:t>
+      </w:r>
+      <w:r>
+        <w:rPr>
+          <w:b/>
+          <w:bCs/>
+        </w:rPr>
+        <w:t>adoring God for who He is</w:t>
+      </w:r>
+      <w:r>
+        <w:t>.</w:t>
+      </w:r>
+    </w:p>
+    <w:p>
+      <w:pPr>
+        <w:pStyle w:val="SPBodyText"/>
+      </w:pPr>
+      <w:r>
+        <w:t>Repeatedly</w:t>
+      </w:r>
+      <w:r>
+        <w:t>, the prayer gives us the same words:</w:t>
+      </w:r>
+    </w:p>
+    <w:p>
+      <w:pPr>
+        <w:pStyle w:val="SPBodyText"/>
+        <w:rPr>
+          <w:b/>
+          <w:bCs/>
+        </w:rPr>
+      </w:pPr>
+    </w:p>
+    <w:p>
+      <w:pPr>
+        <w:pStyle w:val="SPBodyText"/>
+      </w:pPr>
+      <w:r>
+        <w:rPr>
+          <w:b/>
+          <w:bCs/>
+        </w:rPr>
+        <w:t>Blessed be...</w:t>
+      </w:r>
+    </w:p>
+    <w:p>
+      <w:pPr>
+        <w:pStyle w:val="SPBodyText"/>
+      </w:pPr>
+    </w:p>
+    <w:p>
+      <w:pPr>
+        <w:pStyle w:val="SPBodyText"/>
+      </w:pPr>
+      <w:r>
+        <w:t>God.</w:t>
+      </w:r>
+      <w:r>
+        <w:br/>
+        <w:t>His holy Name.</w:t>
+      </w:r>
+      <w:r>
+        <w:br/>
+        <w:t>Jesus Christ.</w:t>
+      </w:r>
+      <w:r>
+        <w:br/>
+        <w:t>His Sacred Heart.</w:t>
+      </w:r>
+      <w:r>
+        <w:br/>
+        <w:t>His Precious Blood.</w:t>
+      </w:r>
+      <w:r>
+        <w:br/>
+        <w:t>The Holy Spirit.</w:t>
+      </w:r>
+      <w:r>
+        <w:br/>
+        <w:t>Mary.</w:t>
+      </w:r>
+      <w:r>
+        <w:br/>
+        <w:t>St. Joseph.</w:t>
+      </w:r>
+      <w:r>
+        <w:br/>
+        <w:t>The angels and the saints.</w:t>
+      </w:r>
+    </w:p>
+    <w:p>
+      <w:pPr>
+        <w:pStyle w:val="SPBodyText"/>
+      </w:pPr>
+    </w:p>
+    <w:p>
+      <w:pPr>
+        <w:pStyle w:val="SPBodyText"/>
+      </w:pPr>
+      <w:r>
+        <w:t>The repetition is itself a form of prayer. It teaches the heart to pause and recognise the goodness of God before asking anything from Him.</w:t>
+      </w:r>
+    </w:p>
+    <w:p>
+      <w:pPr>
+        <w:pStyle w:val="SPBodyText"/>
+      </w:pPr>
+      <w:r>
+        <w:lastRenderedPageBreak/>
+        <w:t>The Divine Praises also draws us into the wider family of the Church. We praise Christ present in the Blessed Sacrament, honour His Mother and St. Joseph, and join our voices to those of the angels and saints.</w:t>
+      </w:r>
+    </w:p>
+    <w:p>
+      <w:pPr>
+        <w:pStyle w:val="SPBodyText"/>
+      </w:pPr>
+      <w:r>
+        <w:t>We are reminded that our prayer does not begin and end with our own small lives. Every Mass, every act of worship, every whispered prayer joins us to a greater chorus of praise that has no end.</w:t>
+      </w:r>
+    </w:p>
+    <w:p>
+      <w:pPr>
+        <w:pStyle w:val="SPBodyText"/>
+      </w:pPr>
+      <w:r>
+        <w:t>Perhaps this is why the prayer is so fitting at the close of the day.</w:t>
+      </w:r>
+    </w:p>
+    <w:p>
+      <w:pPr>
+        <w:pStyle w:val="SPBodyText"/>
+      </w:pPr>
+      <w:r>
+        <w:t>Whatever has happened today—whether it has been joyful or difficult, peaceful or exhausting—we can still end by saying:</w:t>
+      </w:r>
+    </w:p>
+    <w:p>
+      <w:pPr>
+        <w:pStyle w:val="SPBodyText"/>
+      </w:pPr>
+    </w:p>
+    <w:p>
+      <w:pPr>
+        <w:pStyle w:val="SPBodyText"/>
+        <w:rPr>
+          <w:b/>
+          <w:bCs/>
+        </w:rPr>
+      </w:pPr>
+      <w:r>
+        <w:rPr>
+          <w:b/>
+          <w:bCs/>
+        </w:rPr>
+        <w:t>Blessed be God.</w:t>
+      </w:r>
+    </w:p>
+    <w:p>
+      <w:pPr>
+        <w:pStyle w:val="SPBodyText"/>
+      </w:pPr>
+    </w:p>
+    <w:p>
+      <w:pPr>
+        <w:pStyle w:val="SPBodyText"/>
+      </w:pPr>
+      <w:r>
+        <w:t>We may not understand everything that has happened. We may still carry worries into tomorrow. But gratitude does not require that everything be perfect.</w:t>
+      </w:r>
+    </w:p>
+    <w:p>
+      <w:pPr>
+        <w:pStyle w:val="SPBodyText"/>
+      </w:pPr>
+      <w:r>
+        <w:t xml:space="preserve">It simply requires that we remember </w:t>
+      </w:r>
+      <w:r>
+        <w:rPr>
+          <w:b/>
+          <w:bCs/>
+        </w:rPr>
+        <w:t>who God is</w:t>
+      </w:r>
+      <w:r>
+        <w:t>.</w:t>
+      </w:r>
+    </w:p>
+    <w:p>
+      <w:pPr>
+        <w:pStyle w:val="SPBodyText"/>
+      </w:pPr>
+      <w:r>
+        <w:t>And so, before we enter the quiet of the night, we turn once more toward Him.</w:t>
+      </w:r>
+    </w:p>
+    <w:p>
+      <w:pPr>
+        <w:pStyle w:val="SPBodyText"/>
         <w:sectPr>
           <w:type w:val="oddPage"/>
           <w:pgSz w:w="7920" w:h="12240" w:code="6"/>
@@ -15111,10 +16542,6 @@
           <w:docGrid w:linePitch="360"/>
         </w:sectPr>
       </w:pPr>
-      <w:r>
-        <w:lastRenderedPageBreak/>
-        <w:t>REFLECTION</w:t>
-      </w:r>
     </w:p>
     <w:p>
       <w:pPr>

</xml_diff>

<commit_message>
Faithful departed and Divine praises completed.
</commit_message>
<xml_diff>
--- a/manuscript/volume-1/sacrae-preces-volume-1.docx
+++ b/manuscript/volume-1/sacrae-preces-volume-1.docx
@@ -74,7 +74,6 @@
           <w:szCs w:val="18"/>
         </w:rPr>
       </w:pPr>
-      <w:proofErr w:type="spellStart"/>
       <w:r>
         <w:rPr>
           <w:rStyle w:val="SPPrayerResponseCS"/>
@@ -82,17 +81,7 @@
           <w:sz w:val="48"/>
           <w:szCs w:val="18"/>
         </w:rPr>
-        <w:t>Sacrea</w:t>
-      </w:r>
-      <w:proofErr w:type="spellEnd"/>
-      <w:r>
-        <w:rPr>
-          <w:rStyle w:val="SPPrayerResponseCS"/>
-          <w:i w:val="0"/>
-          <w:sz w:val="48"/>
-          <w:szCs w:val="18"/>
-        </w:rPr>
-        <w:t xml:space="preserve"> preces</w:t>
+        <w:t>Sacrea preces</w:t>
       </w:r>
     </w:p>
     <w:p>
@@ -443,15 +432,7 @@
         <w:pStyle w:val="SPBodyText"/>
       </w:pPr>
       <w:r>
-        <w:t xml:space="preserve">We can spend our days surrounded by noise, responsibilities, conversations, messages, and countless things competing for our attention. </w:t>
-      </w:r>
-      <w:proofErr w:type="gramStart"/>
-      <w:r>
-        <w:t>In the midst of</w:t>
-      </w:r>
-      <w:proofErr w:type="gramEnd"/>
-      <w:r>
-        <w:t xml:space="preserve"> all of this, prayer calls us to stop. To become still. To turn our hearts towards God.</w:t>
+        <w:t>We can spend our days surrounded by noise, responsibilities, conversations, messages, and countless things competing for our attention. In the midst of all of this, prayer calls us to stop. To become still. To turn our hearts towards God.</w:t>
       </w:r>
     </w:p>
     <w:p>
@@ -535,15 +516,7 @@
         <w:t>"Sacred Prayers."</w:t>
       </w:r>
       <w:r>
-        <w:t xml:space="preserve"> The name reflects something simple: these prayers are part of a rich inheritance that has been handed down through the life of the Church. They belong not merely to one generation, one country, or one language. They have crossed centuries and borders, carried by ordinary people who have sought God </w:t>
-      </w:r>
-      <w:proofErr w:type="gramStart"/>
-      <w:r>
-        <w:t>in the midst of</w:t>
-      </w:r>
-      <w:proofErr w:type="gramEnd"/>
-      <w:r>
-        <w:t xml:space="preserve"> ordinary lives.</w:t>
+        <w:t xml:space="preserve"> The name reflects something simple: these prayers are part of a rich inheritance that has been handed down through the life of the Church. They belong not merely to one generation, one country, or one language. They have crossed centuries and borders, carried by ordinary people who have sought God in the midst of ordinary lives.</w:t>
       </w:r>
     </w:p>
     <w:p>
@@ -618,15 +591,7 @@
         <w:pStyle w:val="SPBodyText"/>
       </w:pPr>
       <w:r>
-        <w:t xml:space="preserve">For this reason, each prayer is accompanied by material intended for reflection and study. We look at its place in Scripture, consider why Christians have prayed it, explore the meaning of its petitions, and examine some of the Latin words that give the prayer its </w:t>
-      </w:r>
-      <w:proofErr w:type="gramStart"/>
-      <w:r>
-        <w:t>particular character</w:t>
-      </w:r>
-      <w:proofErr w:type="gramEnd"/>
-      <w:r>
-        <w:t>.</w:t>
+        <w:t>For this reason, each prayer is accompanied by material intended for reflection and study. We look at its place in Scripture, consider why Christians have prayed it, explore the meaning of its petitions, and examine some of the Latin words that give the prayer its particular character.</w:t>
       </w:r>
     </w:p>
     <w:p>
@@ -774,15 +739,7 @@
       </w:pPr>
       <w:r>
         <w:lastRenderedPageBreak/>
-        <w:t xml:space="preserve">And someone who learns to pray may eventually discover that prayer is not something we merely do at </w:t>
-      </w:r>
-      <w:proofErr w:type="gramStart"/>
-      <w:r>
-        <w:t>particular times</w:t>
-      </w:r>
-      <w:proofErr w:type="gramEnd"/>
-      <w:r>
-        <w:t>.</w:t>
+        <w:t>And someone who learns to pray may eventually discover that prayer is not something we merely do at particular times.</w:t>
       </w:r>
     </w:p>
     <w:p>
@@ -1020,15 +977,7 @@
         <w:pStyle w:val="SPBodyText"/>
       </w:pPr>
       <w:r>
-        <w:t xml:space="preserve">It is not necessary to read this book from beginning to end. There is no </w:t>
-      </w:r>
-      <w:proofErr w:type="gramStart"/>
-      <w:r>
-        <w:t>particular order</w:t>
-      </w:r>
-      <w:proofErr w:type="gramEnd"/>
-      <w:r>
-        <w:t xml:space="preserve"> in which the prayers must be approached, and there is no expectation that every page must be studied before the prayers can be prayed.</w:t>
+        <w:t>It is not necessary to read this book from beginning to end. There is no particular order in which the prayers must be approached, and there is no expectation that every page must be studied before the prayers can be prayed.</w:t>
       </w:r>
     </w:p>
     <w:p>
@@ -1054,15 +1003,7 @@
         <w:pStyle w:val="SPBodyText"/>
       </w:pPr>
       <w:r>
-        <w:t xml:space="preserve">Perhaps there is a prayer you already know well. Perhaps there is one you have heard many times but never really considered. Perhaps you are looking for a prayer for a particular moment of the </w:t>
-      </w:r>
-      <w:proofErr w:type="gramStart"/>
-      <w:r>
-        <w:t>day, or</w:t>
-      </w:r>
-      <w:proofErr w:type="gramEnd"/>
-      <w:r>
-        <w:t xml:space="preserve"> simply looking for a few quiet minutes in which to turn your attention towards God.</w:t>
+        <w:t>Perhaps there is a prayer you already know well. Perhaps there is one you have heard many times but never really considered. Perhaps you are looking for a prayer for a particular moment of the day, or simply looking for a few quiet minutes in which to turn your attention towards God.</w:t>
       </w:r>
     </w:p>
     <w:p>
@@ -1311,15 +1252,7 @@
         <w:pStyle w:val="SPBodyText"/>
       </w:pPr>
       <w:r>
-        <w:t xml:space="preserve">There is no requirement to learn Latin </w:t>
-      </w:r>
-      <w:proofErr w:type="gramStart"/>
-      <w:r>
-        <w:t>in order to</w:t>
-      </w:r>
-      <w:proofErr w:type="gramEnd"/>
-      <w:r>
-        <w:t xml:space="preserve"> use this book.</w:t>
+        <w:t>There is no requirement to learn Latin in order to use this book.</w:t>
       </w:r>
     </w:p>
     <w:p>
@@ -2076,15 +2009,7 @@
         <w:t>Sacrae Preces</w:t>
       </w:r>
       <w:r>
-        <w:t xml:space="preserve"> is not meant to </w:t>
-      </w:r>
-      <w:proofErr w:type="gramStart"/>
-      <w:r>
-        <w:t>be something that is</w:t>
-      </w:r>
-      <w:proofErr w:type="gramEnd"/>
-      <w:r>
-        <w:t xml:space="preserve"> simply read once and placed back on a shelf.</w:t>
+        <w:t xml:space="preserve"> is not meant to be something that is simply read once and placed back on a shelf.</w:t>
       </w:r>
     </w:p>
     <w:p>
@@ -2604,58 +2529,16 @@
         <w:rPr>
           <w:rStyle w:val="Emphasis"/>
         </w:rPr>
-        <w:t>in NOH-mee-</w:t>
-      </w:r>
-      <w:proofErr w:type="spellStart"/>
+        <w:t>in NOH-mee-neh PAH-tris,</w:t>
+      </w:r>
+      <w:r>
+        <w:br/>
+      </w:r>
       <w:r>
         <w:rPr>
           <w:rStyle w:val="Emphasis"/>
         </w:rPr>
-        <w:t>neh</w:t>
-      </w:r>
-      <w:proofErr w:type="spellEnd"/>
-      <w:r>
-        <w:rPr>
-          <w:rStyle w:val="Emphasis"/>
-        </w:rPr>
-        <w:t xml:space="preserve"> PAH-tris,</w:t>
-      </w:r>
-      <w:r>
-        <w:br/>
-      </w:r>
-      <w:r>
-        <w:rPr>
-          <w:rStyle w:val="Emphasis"/>
-        </w:rPr>
-        <w:t>et FEE-lee-ee, et SPEE-</w:t>
-      </w:r>
-      <w:proofErr w:type="spellStart"/>
-      <w:r>
-        <w:rPr>
-          <w:rStyle w:val="Emphasis"/>
-        </w:rPr>
-        <w:t>ree</w:t>
-      </w:r>
-      <w:proofErr w:type="spellEnd"/>
-      <w:r>
-        <w:rPr>
-          <w:rStyle w:val="Emphasis"/>
-        </w:rPr>
-        <w:t>-</w:t>
-      </w:r>
-      <w:proofErr w:type="spellStart"/>
-      <w:r>
-        <w:rPr>
-          <w:rStyle w:val="Emphasis"/>
-        </w:rPr>
-        <w:t>toos</w:t>
-      </w:r>
-      <w:proofErr w:type="spellEnd"/>
-      <w:r>
-        <w:rPr>
-          <w:rStyle w:val="Emphasis"/>
-        </w:rPr>
-        <w:t xml:space="preserve"> SAHNK-tee.</w:t>
+        <w:t>et FEE-lee-ee, et SPEE-ree-toos SAHNK-tee.</w:t>
       </w:r>
       <w:r>
         <w:br/>
@@ -3121,21 +3004,8 @@
         <w:pStyle w:val="SPScripture"/>
       </w:pPr>
       <w:r>
-        <w:t xml:space="preserve">Our Father who art in heaven, </w:t>
-      </w:r>
-      <w:proofErr w:type="gramStart"/>
-      <w:r>
-        <w:t>Hallowed</w:t>
-      </w:r>
-      <w:proofErr w:type="gramEnd"/>
-      <w:r>
-        <w:t xml:space="preserve"> be thy name. Thy kingdom </w:t>
-      </w:r>
-      <w:proofErr w:type="gramStart"/>
-      <w:r>
-        <w:t>come</w:t>
-      </w:r>
-      <w:proofErr w:type="gramEnd"/>
+        <w:t>Our Father who art in heaven, Hallowed be thy name. Thy kingdom come</w:t>
+      </w:r>
       <w:r>
         <w:t>.</w:t>
       </w:r>
@@ -3179,21 +3049,13 @@
         <w:t xml:space="preserve"> </w:t>
       </w:r>
       <w:r>
-        <w:t xml:space="preserve">And lead us not into </w:t>
-      </w:r>
-      <w:proofErr w:type="gramStart"/>
-      <w:r>
-        <w:t xml:space="preserve">temptation, </w:t>
+        <w:t xml:space="preserve">And lead us not into temptation, </w:t>
       </w:r>
       <w:r>
         <w:t>b</w:t>
       </w:r>
       <w:r>
-        <w:t>ut</w:t>
-      </w:r>
-      <w:proofErr w:type="gramEnd"/>
-      <w:r>
-        <w:t xml:space="preserve"> deliver us from evil.</w:t>
+        <w:t>ut deliver us from evil.</w:t>
       </w:r>
       <w:r>
         <w:t>”</w:t>
@@ -3227,25 +3089,7 @@
         <w:t>Your</w:t>
       </w:r>
       <w:r>
-        <w:t xml:space="preserve"> kingdom </w:t>
-      </w:r>
-      <w:proofErr w:type="gramStart"/>
-      <w:r>
-        <w:t>come</w:t>
-      </w:r>
-      <w:proofErr w:type="gramEnd"/>
-      <w:r>
-        <w:t xml:space="preserve">. Give us each day our daily bread; and forgive us our sins, for we ourselves forgive </w:t>
-      </w:r>
-      <w:proofErr w:type="spellStart"/>
-      <w:proofErr w:type="gramStart"/>
-      <w:r>
-        <w:t>every one</w:t>
-      </w:r>
-      <w:proofErr w:type="spellEnd"/>
-      <w:proofErr w:type="gramEnd"/>
-      <w:r>
-        <w:t xml:space="preserve"> who is indebted to us; and lead us not into temptation.</w:t>
+        <w:t xml:space="preserve"> kingdom come. Give us each day our daily bread; and forgive us our sins, for we ourselves forgive every one who is indebted to us; and lead us not into temptation.</w:t>
       </w:r>
       <w:r>
         <w:t>”</w:t>
@@ -3327,7 +3171,6 @@
       <w:r>
         <w:t xml:space="preserve">The first word is not </w:t>
       </w:r>
-      <w:proofErr w:type="gramStart"/>
       <w:r>
         <w:rPr>
           <w:i/>
@@ -3335,12 +3178,9 @@
         </w:rPr>
         <w:t>my</w:t>
       </w:r>
-      <w:proofErr w:type="gramEnd"/>
       <w:r>
         <w:t xml:space="preserve">. It is </w:t>
       </w:r>
-      <w:proofErr w:type="spellStart"/>
-      <w:proofErr w:type="gramStart"/>
       <w:r>
         <w:rPr>
           <w:i/>
@@ -3348,8 +3188,6 @@
         </w:rPr>
         <w:t>our</w:t>
       </w:r>
-      <w:proofErr w:type="spellEnd"/>
-      <w:proofErr w:type="gramEnd"/>
       <w:r>
         <w:t>.</w:t>
       </w:r>
@@ -3576,13 +3414,8 @@
         <w:pStyle w:val="SPPrayerTitle"/>
       </w:pPr>
       <w:r>
-        <w:t xml:space="preserve">The Hail </w:t>
-      </w:r>
-      <w:proofErr w:type="spellStart"/>
-      <w:r>
-        <w:t>mary</w:t>
-      </w:r>
-      <w:proofErr w:type="spellEnd"/>
+        <w:t>The Hail mary</w:t>
+      </w:r>
     </w:p>
     <w:p>
       <w:pPr>
@@ -3597,15 +3430,7 @@
         <w:pStyle w:val="SPBodyText"/>
       </w:pPr>
       <w:r>
-        <w:t xml:space="preserve">The prayer then becomes our petition. We ask Mary, Mother of God, to pray for us — now, </w:t>
-      </w:r>
-      <w:proofErr w:type="gramStart"/>
-      <w:r>
-        <w:t>in the midst of</w:t>
-      </w:r>
-      <w:proofErr w:type="gramEnd"/>
-      <w:r>
-        <w:t xml:space="preserve"> our lives, and at the hour of our death.</w:t>
+        <w:t>The prayer then becomes our petition. We ask Mary, Mother of God, to pray for us — now, in the midst of our lives, and at the hour of our death.</w:t>
       </w:r>
     </w:p>
     <w:p>
@@ -4418,15 +4243,7 @@
         <w:pStyle w:val="SPBodyText"/>
       </w:pPr>
       <w:r>
-        <w:t xml:space="preserve">The prayer begins with the words of Scripture and ends with our humble request for intercession. Between the two stands the mystery of Christ: God who comes among us, takes flesh, and </w:t>
-      </w:r>
-      <w:proofErr w:type="gramStart"/>
-      <w:r>
-        <w:t>enters into</w:t>
-      </w:r>
-      <w:proofErr w:type="gramEnd"/>
-      <w:r>
-        <w:t xml:space="preserve"> our human story.</w:t>
+        <w:t>The prayer begins with the words of Scripture and ends with our humble request for intercession. Between the two stands the mystery of Christ: God who comes among us, takes flesh, and enters into our human story.</w:t>
       </w:r>
     </w:p>
     <w:p>
@@ -4635,15 +4452,7 @@
         <w:pStyle w:val="SPPrayerEnglish"/>
       </w:pPr>
       <w:r>
-        <w:t xml:space="preserve">Glory be to the </w:t>
-      </w:r>
-      <w:proofErr w:type="gramStart"/>
-      <w:r>
-        <w:t>Father</w:t>
-      </w:r>
-      <w:proofErr w:type="gramEnd"/>
-      <w:r>
-        <w:t>,</w:t>
+        <w:t>Glory be to the Father,</w:t>
       </w:r>
     </w:p>
     <w:p>
@@ -4651,13 +4460,8 @@
         <w:pStyle w:val="SPPrayerEnglish"/>
       </w:pPr>
       <w:r>
-        <w:t xml:space="preserve">And to the </w:t>
-      </w:r>
-      <w:proofErr w:type="gramStart"/>
-      <w:r>
-        <w:t>Son</w:t>
-      </w:r>
-      <w:proofErr w:type="gramEnd"/>
+        <w:t>And to the Son</w:t>
+      </w:r>
     </w:p>
     <w:p>
       <w:pPr>
@@ -4680,15 +4484,7 @@
         <w:pStyle w:val="SPPrayerEnglish"/>
       </w:pPr>
       <w:r>
-        <w:t xml:space="preserve">Is </w:t>
-      </w:r>
-      <w:proofErr w:type="gramStart"/>
-      <w:r>
-        <w:t>now, and</w:t>
-      </w:r>
-      <w:proofErr w:type="gramEnd"/>
-      <w:r>
-        <w:t xml:space="preserve"> ever shall be.</w:t>
+        <w:t>Is now, and ever shall be.</w:t>
       </w:r>
     </w:p>
     <w:p>
@@ -4843,23 +4639,7 @@
         <w:pStyle w:val="SPScripture"/>
       </w:pPr>
       <w:r>
-        <w:t>“</w:t>
-      </w:r>
-      <w:proofErr w:type="gramStart"/>
-      <w:r>
-        <w:t>to</w:t>
-      </w:r>
-      <w:proofErr w:type="gramEnd"/>
-      <w:r>
-        <w:t xml:space="preserve"> him be glory in the Church and in Christ Jesus to all generations, </w:t>
-      </w:r>
-      <w:proofErr w:type="gramStart"/>
-      <w:r>
-        <w:t>for ever and ever</w:t>
-      </w:r>
-      <w:proofErr w:type="gramEnd"/>
-      <w:r>
-        <w:t>. Amen.”</w:t>
+        <w:t>“to him be glory in the Church and in Christ Jesus to all generations, for ever and ever. Amen.”</w:t>
       </w:r>
     </w:p>
     <w:p>
@@ -4897,23 +4677,7 @@
         <w:pStyle w:val="SPScripture"/>
       </w:pPr>
       <w:r>
-        <w:t xml:space="preserve">“To the King of ages, immortal, invisible, the only God, be </w:t>
-      </w:r>
-      <w:proofErr w:type="spellStart"/>
-      <w:r>
-        <w:t>honor</w:t>
-      </w:r>
-      <w:proofErr w:type="spellEnd"/>
-      <w:r>
-        <w:t xml:space="preserve"> and glory </w:t>
-      </w:r>
-      <w:proofErr w:type="gramStart"/>
-      <w:r>
-        <w:t>for ever and ever</w:t>
-      </w:r>
-      <w:proofErr w:type="gramEnd"/>
-      <w:r>
-        <w:t>. Amen.”</w:t>
+        <w:t>“To the King of ages, immortal, invisible, the only God, be honor and glory for ever and ever. Amen.”</w:t>
       </w:r>
     </w:p>
     <w:p>
@@ -4932,23 +4696,7 @@
         <w:pStyle w:val="SPScripture"/>
       </w:pPr>
       <w:r>
-        <w:t>“</w:t>
-      </w:r>
-      <w:proofErr w:type="gramStart"/>
-      <w:r>
-        <w:t>and</w:t>
-      </w:r>
-      <w:proofErr w:type="gramEnd"/>
-      <w:r>
-        <w:t xml:space="preserve"> from Jesus Christ the faithful witness, the first-born of the dead, and the ruler of kings on earth. To him who loves us and has freed us from our sins by his blood and made us a kingdom, priests to God and Father, to him be glory and dominion </w:t>
-      </w:r>
-      <w:proofErr w:type="gramStart"/>
-      <w:r>
-        <w:t>for ever and ever</w:t>
-      </w:r>
-      <w:proofErr w:type="gramEnd"/>
-      <w:r>
-        <w:t>. Amen.”</w:t>
+        <w:t>“and from Jesus Christ the faithful witness, the first-born of the dead, and the ruler of kings on earth. To him who loves us and has freed us from our sins by his blood and made us a kingdom, priests to God and Father, to him be glory and dominion for ever and ever. Amen.”</w:t>
       </w:r>
     </w:p>
     <w:p>
@@ -5025,17 +4773,8 @@
           <w:b/>
           <w:bCs/>
         </w:rPr>
-        <w:t xml:space="preserve">Glory be to the </w:t>
-      </w:r>
-      <w:proofErr w:type="gramStart"/>
-      <w:r>
-        <w:rPr>
-          <w:b/>
-          <w:bCs/>
-        </w:rPr>
-        <w:t>Father</w:t>
-      </w:r>
-      <w:proofErr w:type="gramEnd"/>
+        <w:t>Glory be to the Father</w:t>
+      </w:r>
       <w:r>
         <w:t>, we turn our hearts towards the One from whom all things come.</w:t>
       </w:r>
@@ -5117,15 +4856,7 @@
         <w:pStyle w:val="SPBodyText"/>
       </w:pPr>
       <w:r>
-        <w:t xml:space="preserve">The Glory </w:t>
-      </w:r>
-      <w:proofErr w:type="gramStart"/>
-      <w:r>
-        <w:t>Be</w:t>
-      </w:r>
-      <w:proofErr w:type="gramEnd"/>
-      <w:r>
-        <w:t xml:space="preserve"> teaches us to lift our eyes beyond the noise of the moment and remember what is eternal.</w:t>
+        <w:t>The Glory Be teaches us to lift our eyes beyond the noise of the moment and remember what is eternal.</w:t>
       </w:r>
     </w:p>
     <w:p>
@@ -5186,15 +4917,7 @@
         <w:pStyle w:val="SPBodyText"/>
       </w:pPr>
       <w:r>
-        <w:t xml:space="preserve">Whatever good we possess is received. Whatever strength we have is given. Whatever love we </w:t>
-      </w:r>
-      <w:proofErr w:type="gramStart"/>
-      <w:r>
-        <w:t>are able to</w:t>
-      </w:r>
-      <w:proofErr w:type="gramEnd"/>
-      <w:r>
-        <w:t xml:space="preserve"> offer has its source in Him.</w:t>
+        <w:t>Whatever good we possess is received. Whatever strength we have is given. Whatever love we are able to offer has its source in Him.</w:t>
       </w:r>
     </w:p>
     <w:p>
@@ -5415,23 +5138,7 @@
           <w:b/>
           <w:bCs/>
         </w:rPr>
-        <w:t xml:space="preserve">Glory be to the </w:t>
-      </w:r>
-      <w:proofErr w:type="gramStart"/>
-      <w:r>
-        <w:rPr>
-          <w:b/>
-          <w:bCs/>
-        </w:rPr>
-        <w:t>Father</w:t>
-      </w:r>
-      <w:proofErr w:type="gramEnd"/>
-      <w:r>
-        <w:rPr>
-          <w:b/>
-          <w:bCs/>
-        </w:rPr>
-        <w:t>.</w:t>
+        <w:t>Glory be to the Father.</w:t>
       </w:r>
     </w:p>
     <w:p>
@@ -5460,23 +5167,7 @@
           <w:b/>
           <w:bCs/>
         </w:rPr>
-        <w:t xml:space="preserve">And to the </w:t>
-      </w:r>
-      <w:proofErr w:type="gramStart"/>
-      <w:r>
-        <w:rPr>
-          <w:b/>
-          <w:bCs/>
-        </w:rPr>
-        <w:t>Son</w:t>
-      </w:r>
-      <w:proofErr w:type="gramEnd"/>
-      <w:r>
-        <w:rPr>
-          <w:b/>
-          <w:bCs/>
-        </w:rPr>
-        <w:t>.</w:t>
+        <w:t>And to the Son.</w:t>
       </w:r>
     </w:p>
     <w:p>
@@ -5699,17 +5390,8 @@
           <w:b/>
           <w:bCs/>
         </w:rPr>
-        <w:t xml:space="preserve">Glory </w:t>
-      </w:r>
-      <w:proofErr w:type="gramStart"/>
-      <w:r>
-        <w:rPr>
-          <w:b/>
-          <w:bCs/>
-        </w:rPr>
-        <w:t>Be</w:t>
-      </w:r>
-      <w:proofErr w:type="gramEnd"/>
+        <w:t>Glory Be</w:t>
+      </w:r>
       <w:r>
         <w:t xml:space="preserve"> t</w:t>
       </w:r>
@@ -6221,15 +5903,7 @@
         <w:pStyle w:val="SPBodyText"/>
       </w:pPr>
       <w:r>
-        <w:t xml:space="preserve">True contrition is more than regret for having done wrong. It is a turning of the heart back towards God — recognising His goodness and </w:t>
-      </w:r>
-      <w:proofErr w:type="gramStart"/>
-      <w:r>
-        <w:t>mercy, and</w:t>
-      </w:r>
-      <w:proofErr w:type="gramEnd"/>
-      <w:r>
-        <w:t xml:space="preserve"> desiring to live more faithfully in His presence.</w:t>
+        <w:t>True contrition is more than regret for having done wrong. It is a turning of the heart back towards God — recognising His goodness and mercy, and desiring to live more faithfully in His presence.</w:t>
       </w:r>
     </w:p>
     <w:p>
@@ -6496,15 +6170,7 @@
         <w:pStyle w:val="SPScripture"/>
       </w:pPr>
       <w:r>
-        <w:t xml:space="preserve">But the tax collector, standing far off, would not even </w:t>
-      </w:r>
-      <w:proofErr w:type="gramStart"/>
-      <w:r>
-        <w:t>lift up</w:t>
-      </w:r>
-      <w:proofErr w:type="gramEnd"/>
-      <w:r>
-        <w:t xml:space="preserve"> his eyes to heaven, but beat his breast, saying, “God, be merciful to me a sinner!”</w:t>
+        <w:t>But the tax collector, standing far off, would not even lift up his eyes to heaven, but beat his breast, saying, “God, be merciful to me a sinner!”</w:t>
       </w:r>
     </w:p>
     <w:p>
@@ -6526,15 +6192,7 @@
         <w:pStyle w:val="SPScripture"/>
       </w:pPr>
       <w:r>
-        <w:t xml:space="preserve">If we confess our sins, he is faithful and </w:t>
-      </w:r>
-      <w:proofErr w:type="gramStart"/>
-      <w:r>
-        <w:t>just, and</w:t>
-      </w:r>
-      <w:proofErr w:type="gramEnd"/>
-      <w:r>
-        <w:t xml:space="preserve"> will forgive our sins and cleanse us from all unrighteousness.</w:t>
+        <w:t>If we confess our sins, he is faithful and just, and will forgive our sins and cleanse us from all unrighteousness.</w:t>
       </w:r>
     </w:p>
     <w:p>
@@ -6733,15 +6391,7 @@
         <w:pStyle w:val="SPBodyText"/>
       </w:pPr>
       <w:r>
-        <w:t xml:space="preserve">And </w:t>
-      </w:r>
-      <w:proofErr w:type="gramStart"/>
-      <w:r>
-        <w:t>so</w:t>
-      </w:r>
-      <w:proofErr w:type="gramEnd"/>
-      <w:r>
-        <w:t xml:space="preserve"> the Act of Contrition is not merely a prayer about the past.</w:t>
+        <w:t>And so the Act of Contrition is not merely a prayer about the past.</w:t>
       </w:r>
     </w:p>
     <w:p>
@@ -7146,15 +6796,7 @@
       </w:r>
       <w:r>
         <w:br/>
-        <w:t xml:space="preserve">He has raised up for us a mighty </w:t>
-      </w:r>
-      <w:proofErr w:type="spellStart"/>
-      <w:r>
-        <w:t>savior</w:t>
-      </w:r>
-      <w:proofErr w:type="spellEnd"/>
-      <w:r>
-        <w:t>,</w:t>
+        <w:t>He has raised up for us a mighty savior,</w:t>
       </w:r>
       <w:r>
         <w:br/>
@@ -7681,15 +7323,7 @@
         <w:spacing w:line="360" w:lineRule="auto"/>
       </w:pPr>
       <w:r>
-        <w:t xml:space="preserve">And you, child, will be called prophet of the </w:t>
-      </w:r>
-      <w:proofErr w:type="gramStart"/>
-      <w:r>
-        <w:t>Most High</w:t>
-      </w:r>
-      <w:proofErr w:type="gramEnd"/>
-      <w:r>
-        <w:t>; for you will go before the Lord to prepare his ways, to give knowledge of salvation to his people in the forgiveness of their sins</w:t>
+        <w:t>And you, child, will be called prophet of the Most High; for you will go before the Lord to prepare his ways, to give knowledge of salvation to his people in the forgiveness of their sins</w:t>
       </w:r>
       <w:r>
         <w:t xml:space="preserve">, through the tender mercy of our God, </w:t>
@@ -8955,15 +8589,7 @@
         <w:pStyle w:val="SPPrayerEnglish"/>
       </w:pPr>
       <w:r>
-        <w:t xml:space="preserve">for he has looked with </w:t>
-      </w:r>
-      <w:proofErr w:type="spellStart"/>
-      <w:r>
-        <w:t>favor</w:t>
-      </w:r>
-      <w:proofErr w:type="spellEnd"/>
-      <w:r>
-        <w:t xml:space="preserve"> on his lowly servant.</w:t>
+        <w:t>for he has looked with favor on his lowly servant.</w:t>
       </w:r>
       <w:r>
         <w:br/>
@@ -9010,15 +8636,7 @@
       </w:r>
       <w:r>
         <w:br/>
-        <w:t xml:space="preserve">and has </w:t>
-      </w:r>
-      <w:proofErr w:type="gramStart"/>
-      <w:r>
-        <w:t>lifted up</w:t>
-      </w:r>
-      <w:proofErr w:type="gramEnd"/>
-      <w:r>
-        <w:t xml:space="preserve"> the lowly.</w:t>
+        <w:t>and has lifted up the lowly.</w:t>
       </w:r>
     </w:p>
     <w:p>
@@ -9341,21 +8959,13 @@
         <w:pStyle w:val="SPScripture"/>
       </w:pPr>
       <w:r>
-        <w:t xml:space="preserve">He has shown strength with his arm, he has scattered the proud in the imagination of their hearts, he has put down the mighty from their </w:t>
-      </w:r>
-      <w:proofErr w:type="gramStart"/>
-      <w:r>
-        <w:t>thrones</w:t>
+        <w:t>He has shown strength with his arm, he has scattered the proud in the imagination of their hearts, he has put down the mighty from their thrones</w:t>
       </w:r>
       <w:r>
         <w:t>,</w:t>
       </w:r>
       <w:r>
-        <w:t xml:space="preserve"> and</w:t>
-      </w:r>
-      <w:proofErr w:type="gramEnd"/>
-      <w:r>
-        <w:t xml:space="preserve"> exalted those of low degree; He has filled the hungry with good things, and the rich he has sent away empty. </w:t>
+        <w:t xml:space="preserve"> and exalted those of low degree; He has filled the hungry with good things, and the rich he has sent away empty. </w:t>
       </w:r>
     </w:p>
     <w:p>
@@ -9527,15 +9137,7 @@
         <w:pStyle w:val="SPBodyText"/>
       </w:pPr>
       <w:r>
-        <w:t xml:space="preserve">And </w:t>
-      </w:r>
-      <w:proofErr w:type="gramStart"/>
-      <w:r>
-        <w:t>so</w:t>
-      </w:r>
-      <w:proofErr w:type="gramEnd"/>
-      <w:r>
-        <w:t xml:space="preserve"> she praises Him.</w:t>
+        <w:t>And so she praises Him.</w:t>
       </w:r>
     </w:p>
     <w:p>
@@ -9589,15 +9191,7 @@
         <w:pStyle w:val="SPBodyText"/>
       </w:pPr>
       <w:r>
-        <w:t xml:space="preserve">He </w:t>
-      </w:r>
-      <w:proofErr w:type="gramStart"/>
-      <w:r>
-        <w:t>lifts up</w:t>
-      </w:r>
-      <w:proofErr w:type="gramEnd"/>
-      <w:r>
-        <w:t xml:space="preserve"> the lowly.</w:t>
+        <w:t>He lifts up the lowly.</w:t>
       </w:r>
     </w:p>
     <w:p>
@@ -9750,15 +9344,7 @@
         <w:pStyle w:val="SPBodyText"/>
       </w:pPr>
       <w:r>
-        <w:t xml:space="preserve">One phrase appears </w:t>
-      </w:r>
-      <w:proofErr w:type="gramStart"/>
-      <w:r>
-        <w:t>again and again</w:t>
-      </w:r>
-      <w:proofErr w:type="gramEnd"/>
-      <w:r>
-        <w:t xml:space="preserve"> beneath the Magnificat:</w:t>
+        <w:t>One phrase appears again and again beneath the Magnificat:</w:t>
       </w:r>
     </w:p>
     <w:p>
@@ -10118,15 +9704,7 @@
         <w:pStyle w:val="SPBodyText"/>
       </w:pPr>
       <w:r>
-        <w:t xml:space="preserve">We can praise God </w:t>
-      </w:r>
-      <w:proofErr w:type="gramStart"/>
-      <w:r>
-        <w:t>in the midst of</w:t>
-      </w:r>
-      <w:proofErr w:type="gramEnd"/>
-      <w:r>
-        <w:t xml:space="preserve"> uncertainty.</w:t>
+        <w:t>We can praise God in the midst of uncertainty.</w:t>
       </w:r>
     </w:p>
     <w:p>
@@ -11049,15 +10627,7 @@
         <w:pStyle w:val="SPBodyText"/>
       </w:pPr>
       <w:r>
-        <w:t xml:space="preserve">These prayers have been handed down through generations. Some are centuries old. Others grew from </w:t>
-      </w:r>
-      <w:proofErr w:type="gramStart"/>
-      <w:r>
-        <w:t>particular traditions</w:t>
-      </w:r>
-      <w:proofErr w:type="gramEnd"/>
-      <w:r>
-        <w:t xml:space="preserve"> of devotion to Christ, the Blessed Virgin Mary, the angels and the saints.</w:t>
+        <w:t>These prayers have been handed down through generations. Some are centuries old. Others grew from particular traditions of devotion to Christ, the Blessed Virgin Mary, the angels and the saints.</w:t>
       </w:r>
     </w:p>
     <w:p>
@@ -12169,13 +11739,8 @@
       <w:pPr>
         <w:pStyle w:val="SPBodyText"/>
       </w:pPr>
-      <w:proofErr w:type="gramStart"/>
-      <w:r>
-        <w:t>So</w:t>
-      </w:r>
-      <w:proofErr w:type="gramEnd"/>
-      <w:r>
-        <w:t xml:space="preserve"> begin simply.</w:t>
+      <w:r>
+        <w:t>So begin simply.</w:t>
       </w:r>
     </w:p>
     <w:p>
@@ -12310,15 +11875,7 @@
         <w:t>Annunciation</w:t>
       </w:r>
       <w:r>
-        <w:t xml:space="preserve">, when the Angel Gabriel announced to Mary that she would become the </w:t>
-      </w:r>
-      <w:proofErr w:type="gramStart"/>
-      <w:r>
-        <w:t>Mother</w:t>
-      </w:r>
-      <w:proofErr w:type="gramEnd"/>
-      <w:r>
-        <w:t xml:space="preserve"> of the Son of God.</w:t>
+        <w:t>, when the Angel Gabriel announced to Mary that she would become the Mother of the Son of God.</w:t>
       </w:r>
     </w:p>
     <w:p>
@@ -12372,15 +11929,7 @@
         <w:pStyle w:val="SPBodyText"/>
       </w:pPr>
       <w:r>
-        <w:t xml:space="preserve">The repeated prayer invites us to pause </w:t>
-      </w:r>
-      <w:proofErr w:type="gramStart"/>
-      <w:r>
-        <w:t>in the midst of</w:t>
-      </w:r>
-      <w:proofErr w:type="gramEnd"/>
-      <w:r>
-        <w:t xml:space="preserve"> ordinary life and remember the mystery at the heart of our faith:</w:t>
+        <w:t>The repeated prayer invites us to pause in the midst of ordinary life and remember the mystery at the heart of our faith:</w:t>
       </w:r>
       <w:r>
         <w:t xml:space="preserve"> </w:t>
@@ -12390,23 +11939,7 @@
           <w:b/>
           <w:bCs/>
         </w:rPr>
-        <w:t xml:space="preserve">“And the Word was made </w:t>
-      </w:r>
-      <w:proofErr w:type="gramStart"/>
-      <w:r>
-        <w:rPr>
-          <w:b/>
-          <w:bCs/>
-        </w:rPr>
-        <w:t>flesh, and</w:t>
-      </w:r>
-      <w:proofErr w:type="gramEnd"/>
-      <w:r>
-        <w:rPr>
-          <w:b/>
-          <w:bCs/>
-        </w:rPr>
-        <w:t xml:space="preserve"> dwelt among us.”</w:t>
+        <w:t>“And the Word was made flesh, and dwelt among us.”</w:t>
       </w:r>
     </w:p>
     <w:p>
@@ -12794,15 +12327,7 @@
         <w:pStyle w:val="SPPrayerEnglish"/>
       </w:pPr>
       <w:r>
-        <w:t xml:space="preserve">Pour forth, we beseech Thee, O Lord, </w:t>
-      </w:r>
-      <w:proofErr w:type="gramStart"/>
-      <w:r>
-        <w:t>Thy</w:t>
-      </w:r>
-      <w:proofErr w:type="gramEnd"/>
-      <w:r>
-        <w:t xml:space="preserve"> grace into our hearts, that we to whom the Incarnation of Christ, Thy Son, was made known by the message of an angel, may by His Passion and Cross be brought to the glory of His resurrection. Through the same Christ our Lord. </w:t>
+        <w:t xml:space="preserve">Pour forth, we beseech Thee, O Lord, Thy grace into our hearts, that we to whom the Incarnation of Christ, Thy Son, was made known by the message of an angel, may by His Passion and Cross be brought to the glory of His resurrection. Through the same Christ our Lord. </w:t>
       </w:r>
     </w:p>
     <w:p>
@@ -13520,15 +13045,7 @@
         <w:pStyle w:val="SPBodyText"/>
       </w:pPr>
       <w:r>
-        <w:t xml:space="preserve">At noon, we pause </w:t>
-      </w:r>
-      <w:proofErr w:type="gramStart"/>
-      <w:r>
-        <w:t>in the midst of</w:t>
-      </w:r>
-      <w:proofErr w:type="gramEnd"/>
-      <w:r>
-        <w:t xml:space="preserve"> our work.</w:t>
+        <w:t>At noon, we pause in the midst of our work.</w:t>
       </w:r>
     </w:p>
     <w:p>
@@ -13618,15 +13135,7 @@
         <w:pStyle w:val="SPBodyText"/>
       </w:pPr>
       <w:r>
-        <w:t xml:space="preserve">Back to the truth that God is </w:t>
-      </w:r>
-      <w:proofErr w:type="gramStart"/>
-      <w:r>
-        <w:t>near</w:t>
-      </w:r>
-      <w:proofErr w:type="gramEnd"/>
-      <w:r>
-        <w:t>.</w:t>
+        <w:t>Back to the truth that God is near.</w:t>
       </w:r>
     </w:p>
     <w:p>
@@ -13778,15 +13287,7 @@
         <w:t>Anima Christi</w:t>
       </w:r>
       <w:r>
-        <w:t xml:space="preserve"> is an ancient Christian prayer traditionally associated with devotion to Christ and</w:t>
-      </w:r>
-      <w:proofErr w:type="gramStart"/>
-      <w:r>
-        <w:t>, in particular, with</w:t>
-      </w:r>
-      <w:proofErr w:type="gramEnd"/>
-      <w:r>
-        <w:t xml:space="preserve"> the Eucharist. Its origins are uncertain, but the prayer was already in use by the early sixteenth century and became especially beloved through its association with St. Ignatius of Loyola, who placed it at the beginning of his </w:t>
+        <w:t xml:space="preserve"> is an ancient Christian prayer traditionally associated with devotion to Christ and, in particular, with the Eucharist. Its origins are uncertain, but the prayer was already in use by the early sixteenth century and became especially beloved through its association with St. Ignatius of Loyola, who placed it at the beginning of his </w:t>
       </w:r>
       <w:r>
         <w:rPr>
@@ -14354,15 +13855,7 @@
         <w:pStyle w:val="SPBodyText"/>
       </w:pPr>
       <w:r>
-        <w:t xml:space="preserve">The Anima Christi is a prayer of drawing </w:t>
-      </w:r>
-      <w:proofErr w:type="gramStart"/>
-      <w:r>
-        <w:t>near</w:t>
-      </w:r>
-      <w:proofErr w:type="gramEnd"/>
-      <w:r>
-        <w:t>.</w:t>
+        <w:t>The Anima Christi is a prayer of drawing near.</w:t>
       </w:r>
     </w:p>
     <w:p>
@@ -15017,15 +14510,7 @@
         </w:sectPr>
       </w:pPr>
       <w:r>
-        <w:t xml:space="preserve">The angel of the Lord encamps around those who fear </w:t>
-      </w:r>
-      <w:proofErr w:type="gramStart"/>
-      <w:r>
-        <w:t>him, and</w:t>
-      </w:r>
-      <w:proofErr w:type="gramEnd"/>
-      <w:r>
-        <w:t xml:space="preserve"> delivers them.</w:t>
+        <w:t>The angel of the Lord encamps around those who fear him, and delivers them.</w:t>
       </w:r>
     </w:p>
     <w:p>
@@ -15633,26 +15118,38 @@
         <w:pStyle w:val="SPScriptureReference"/>
       </w:pPr>
       <w:r>
-        <w:t>Wisdom 3:1-4</w:t>
+        <w:t>Wisdom 3:1-</w:t>
+      </w:r>
+      <w:r>
+        <w:t>3</w:t>
       </w:r>
     </w:p>
     <w:p>
       <w:pPr>
         <w:pStyle w:val="SPScripture"/>
       </w:pPr>
+      <w:r>
+        <w:t xml:space="preserve">But the souls of the righteous are in the hand of God, and no torment will ever touch them. In the eyes of the foolish they seemed to have died, and their departure was though to be an affliction, and their going from us to be their destruction; but they are at peace. </w:t>
+      </w:r>
     </w:p>
     <w:p>
       <w:pPr>
         <w:pStyle w:val="SPScriptureReference"/>
       </w:pPr>
       <w:r>
-        <w:t>2 Maccabees 12:44-46</w:t>
+        <w:t>2 Maccabees 12:44-4</w:t>
+      </w:r>
+      <w:r>
+        <w:t>5</w:t>
       </w:r>
     </w:p>
     <w:p>
       <w:pPr>
         <w:pStyle w:val="SPScripture"/>
       </w:pPr>
+      <w:r>
+        <w:t>For if he were not expecting that those who had fallen would rise again, it would have been superfluous and foolish to pray for the dead. But if he was looking to the splendid reward that is laid up for those who fall asleep in godliness, it was a holy and pious thought. Therefore he made atonement for the dead, that they might be delivered from their sin.</w:t>
+      </w:r>
     </w:p>
     <w:p>
       <w:pPr>
@@ -15666,6 +15163,9 @@
       <w:pPr>
         <w:pStyle w:val="SPScripture"/>
       </w:pPr>
+      <w:r>
+        <w:t xml:space="preserve">Jesus said to her, “I am the resurrection and the life, he who believes in me, though he die, yet shall he live, and whoever lives and believes in me shall never die. Do you believe this?” </w:t>
+      </w:r>
     </w:p>
     <w:p>
       <w:pPr>
@@ -15674,11 +15174,6 @@
       <w:r>
         <w:t>1 Thessalonians 4:13-14</w:t>
       </w:r>
-    </w:p>
-    <w:p>
-      <w:pPr>
-        <w:pStyle w:val="SPScriptureReference"/>
-      </w:pPr>
     </w:p>
     <w:p>
       <w:pPr>
@@ -15692,6 +15187,12 @@
           <w:docGrid w:linePitch="360"/>
         </w:sectPr>
       </w:pPr>
+      <w:r>
+        <w:t>But we would not have you ignorant, brethren, concerning those who are asleep, that you may not grieve as others do who have no hope.</w:t>
+      </w:r>
+      <w:r>
+        <w:t xml:space="preserve"> For since we believe that  Jesus died and rose again, even so, through Jesus, God will bring with him those who have fallen asleep.</w:t>
+      </w:r>
     </w:p>
     <w:p>
       <w:pPr>
@@ -16246,46 +15747,55 @@
     </w:p>
     <w:p>
       <w:pPr>
+        <w:pStyle w:val="SPScripture"/>
+      </w:pPr>
+      <w:r>
+        <w:t>Praise the Lord! Praise, O servants of the Lord, praise the name of the Lord! Blessed be the name of the Lord for this time forth and for evermore! From the rising of the sun to it’s setting the name of the Lord is to be praised!</w:t>
+      </w:r>
+    </w:p>
+    <w:p>
+      <w:pPr>
         <w:pStyle w:val="SPScriptureReference"/>
       </w:pPr>
+      <w:r>
+        <w:t>Philippians 2:9–11</w:t>
+      </w:r>
+    </w:p>
+    <w:p>
+      <w:pPr>
+        <w:pStyle w:val="SPScripture"/>
+      </w:pPr>
+      <w:r>
+        <w:t>Therefore God has highly exalted him and bestowed on him the name which is above every name, that at the name of Jesus every knee should bow, in heaven and on earth and under the earth, and every tongue confess that Jesus Christ is Lord, to the glory of God the father.</w:t>
+      </w:r>
     </w:p>
     <w:p>
       <w:pPr>
         <w:pStyle w:val="SPScriptureReference"/>
       </w:pPr>
       <w:r>
-        <w:t>Philippians 2:9–11</w:t>
+        <w:t>Revelation 7:11–12</w:t>
+      </w:r>
+    </w:p>
+    <w:p>
+      <w:pPr>
+        <w:pStyle w:val="SPScripture"/>
+      </w:pPr>
+      <w:r>
+        <w:t>And all the angels stood round the throne and round the elders and the four living creatures, and they fell on their faces before the throne and worshiped God, saying, “Amen! Blessing and glory and wisdom and thanksgiving and honor and power and might be to our God for ever and ever! Amen!”</w:t>
       </w:r>
     </w:p>
     <w:p>
       <w:pPr>
         <w:pStyle w:val="SPScriptureReference"/>
       </w:pPr>
-    </w:p>
-    <w:p>
-      <w:pPr>
-        <w:pStyle w:val="SPScriptureReference"/>
-      </w:pPr>
-      <w:r>
-        <w:t>Revelation 7:11–12</w:t>
-      </w:r>
-    </w:p>
-    <w:p>
-      <w:pPr>
-        <w:pStyle w:val="SPScriptureReference"/>
-      </w:pPr>
-    </w:p>
-    <w:p>
-      <w:pPr>
-        <w:pStyle w:val="SPScriptureReference"/>
-      </w:pPr>
       <w:r>
         <w:t>John 6:51</w:t>
       </w:r>
     </w:p>
     <w:p>
       <w:pPr>
-        <w:pStyle w:val="SPScriptureReference"/>
+        <w:pStyle w:val="SPScripture"/>
         <w:sectPr>
           <w:type w:val="evenPage"/>
           <w:pgSz w:w="7920" w:h="12240" w:code="6"/>
@@ -16295,6 +15805,15 @@
           <w:docGrid w:linePitch="360"/>
         </w:sectPr>
       </w:pPr>
+      <w:r>
+        <w:t>“</w:t>
+      </w:r>
+      <w:r>
+        <w:t>I am the living bread which came down from heaven</w:t>
+      </w:r>
+      <w:r>
+        <w:t>; if any one eats of this bread, he will live forever; and the  bread which I shall give for the life of the world is my flesh.”</w:t>
+      </w:r>
     </w:p>
     <w:p>
       <w:pPr>

</xml_diff>

<commit_message>
Part IV structure put in place
</commit_message>
<xml_diff>
--- a/manuscript/volume-1/sacrae-preces-volume-1.docx
+++ b/manuscript/volume-1/sacrae-preces-volume-1.docx
@@ -1175,7 +1175,14 @@
           <w:b/>
           <w:bCs/>
         </w:rPr>
-        <w:t>Protection and intercession</w:t>
+        <w:t>Prayers of p</w:t>
+      </w:r>
+      <w:r>
+        <w:rPr>
+          <w:b/>
+          <w:bCs/>
+        </w:rPr>
+        <w:t>rotection and intercession</w:t>
       </w:r>
     </w:p>
     <w:p>
@@ -16090,6 +16097,84 @@
     <w:p>
       <w:pPr>
         <w:pStyle w:val="SPPrayerTitle"/>
+      </w:pPr>
+      <w:r>
+        <w:t>Night prayer</w:t>
+      </w:r>
+    </w:p>
+    <w:p>
+      <w:pPr>
+        <w:pStyle w:val="SPBodyText"/>
+        <w:rPr>
+          <w:b/>
+          <w:bCs/>
+        </w:rPr>
+      </w:pPr>
+      <w:r>
+        <w:rPr>
+          <w:b/>
+          <w:bCs/>
+        </w:rPr>
+        <w:t>Resting in His Peace</w:t>
+      </w:r>
+    </w:p>
+    <w:p>
+      <w:pPr>
+        <w:pStyle w:val="SPBodyText"/>
+      </w:pPr>
+      <w:r>
+        <w:t>As the day comes to an end, the Church invites us to place ourselves once more in the hands of God.</w:t>
+      </w:r>
+    </w:p>
+    <w:p>
+      <w:pPr>
+        <w:pStyle w:val="SPBodyText"/>
+      </w:pPr>
+      <w:r>
+        <w:t>Night reminds us of our dependence upon Him. We cannot remain watchful forever; eventually we must surrender our work, our worries, and even our waking hours, and allow ourselves to rest.</w:t>
+      </w:r>
+    </w:p>
+    <w:p>
+      <w:pPr>
+        <w:pStyle w:val="SPBodyText"/>
+      </w:pPr>
+    </w:p>
+    <w:p>
+      <w:pPr>
+        <w:pStyle w:val="SPBodyText"/>
+      </w:pPr>
+      <w:r>
+        <w:t xml:space="preserve">This short prayer expresses that surrender simply: </w:t>
+      </w:r>
+    </w:p>
+    <w:p>
+      <w:pPr>
+        <w:pStyle w:val="SPBodyText"/>
+      </w:pPr>
+      <w:r>
+        <w:rPr>
+          <w:b/>
+          <w:bCs/>
+        </w:rPr>
+        <w:t>Christ watches over us while we sleep, and in Him we may rest in peace.</w:t>
+      </w:r>
+    </w:p>
+    <w:p>
+      <w:pPr>
+        <w:pStyle w:val="SPBodyText"/>
+      </w:pPr>
+    </w:p>
+    <w:p>
+      <w:pPr>
+        <w:pStyle w:val="SPBodyText"/>
+      </w:pPr>
+      <w:r>
+        <w:t>It is a quiet act of trust before we close our eyes and entrust tomorrow to God.</w:t>
+      </w:r>
+    </w:p>
+    <w:p>
+      <w:pPr>
+        <w:pStyle w:val="SPBodyText"/>
         <w:sectPr>
           <w:type w:val="oddPage"/>
           <w:pgSz w:w="7920" w:h="12240" w:code="6"/>
@@ -16099,14 +16184,11 @@
           <w:docGrid w:linePitch="360"/>
         </w:sectPr>
       </w:pPr>
-      <w:r>
-        <w:t>Night prayer</w:t>
-      </w:r>
     </w:p>
     <w:p>
       <w:pPr>
         <w:pStyle w:val="SPLanguage"/>
-        <w:spacing w:before="600"/>
+        <w:spacing w:before="200"/>
       </w:pPr>
       <w:r>
         <w:lastRenderedPageBreak/>
@@ -16124,6 +16206,27 @@
     </w:p>
     <w:p>
       <w:pPr>
+        <w:pStyle w:val="SPPrayerEnglish"/>
+      </w:pPr>
+      <w:r>
+        <w:t>Protect us, Lord, as we stay awake;</w:t>
+      </w:r>
+      <w:r>
+        <w:br/>
+        <w:t>watch over us as we sleep,</w:t>
+      </w:r>
+      <w:r>
+        <w:br/>
+        <w:t>that awake we may keep watch with Christ</w:t>
+      </w:r>
+      <w:r>
+        <w:br/>
+        <w:t>and asleep rest in His peace.</w:t>
+      </w:r>
+    </w:p>
+    <w:p>
+      <w:pPr>
+        <w:pStyle w:val="SPPrayerEnglish"/>
         <w:sectPr>
           <w:type w:val="evenPage"/>
           <w:pgSz w:w="7920" w:h="12240" w:code="6"/>
@@ -16133,6 +16236,9 @@
           <w:docGrid w:linePitch="360"/>
         </w:sectPr>
       </w:pPr>
+      <w:r>
+        <w:t>Amen</w:t>
+      </w:r>
     </w:p>
     <w:p>
       <w:pPr>
@@ -16141,6 +16247,44 @@
       <w:r>
         <w:lastRenderedPageBreak/>
         <w:t>LATIN</w:t>
+      </w:r>
+    </w:p>
+    <w:p>
+      <w:pPr>
+        <w:pStyle w:val="SPPrayerLatin"/>
+        <w:rPr>
+          <w:b/>
+          <w:bCs/>
+          <w:lang w:val="en-ZA"/>
+        </w:rPr>
+      </w:pPr>
+    </w:p>
+    <w:p>
+      <w:pPr>
+        <w:pStyle w:val="SPPrayerLatin"/>
+      </w:pPr>
+      <w:r>
+        <w:t>Protege nos, Domine, vigilantes,</w:t>
+      </w:r>
+      <w:r>
+        <w:br/>
+        <w:t>custodi nos dormientes,</w:t>
+      </w:r>
+      <w:r>
+        <w:br/>
+        <w:t>ut vigilemus cum Christo</w:t>
+      </w:r>
+      <w:r>
+        <w:br/>
+        <w:t>et requiescamus in pace.</w:t>
+      </w:r>
+    </w:p>
+    <w:p>
+      <w:pPr>
+        <w:pStyle w:val="SPPrayerLatin"/>
+      </w:pPr>
+      <w:r>
+        <w:t>Amen.</w:t>
       </w:r>
     </w:p>
     <w:p>
@@ -16164,6 +16308,352 @@
     <w:p>
       <w:pPr>
         <w:pStyle w:val="SPSectionTitle"/>
+      </w:pPr>
+      <w:r>
+        <w:lastRenderedPageBreak/>
+        <w:t>SCRIPTURE</w:t>
+      </w:r>
+    </w:p>
+    <w:p>
+      <w:pPr>
+        <w:pStyle w:val="SPScriptureReference"/>
+      </w:pPr>
+      <w:r>
+        <w:t>Psalm 4:8</w:t>
+      </w:r>
+    </w:p>
+    <w:p>
+      <w:pPr>
+        <w:pStyle w:val="SPScripture"/>
+      </w:pPr>
+      <w:r>
+        <w:t>In peace I will both lie down and sleep; for you alone, O Lord, make me dwell in safety.</w:t>
+      </w:r>
+    </w:p>
+    <w:p>
+      <w:pPr>
+        <w:pStyle w:val="SPScriptureReference"/>
+      </w:pPr>
+      <w:r>
+        <w:t>Psalm 121:</w:t>
+      </w:r>
+      <w:r>
+        <w:t>3-4</w:t>
+      </w:r>
+    </w:p>
+    <w:p>
+      <w:pPr>
+        <w:pStyle w:val="SPScripture"/>
+      </w:pPr>
+      <w:r>
+        <w:t>He will not let your foot be moved, he who keeps you will not slumber. Behold, he who keeps Israel will neither slumber nor sleep.</w:t>
+      </w:r>
+    </w:p>
+    <w:p>
+      <w:pPr>
+        <w:pStyle w:val="SPScriptureReference"/>
+      </w:pPr>
+      <w:r>
+        <w:t>John 14:27</w:t>
+      </w:r>
+    </w:p>
+    <w:p>
+      <w:pPr>
+        <w:pStyle w:val="SPScripture"/>
+      </w:pPr>
+      <w:r>
+        <w:t>Peace I leave with you; my peace I give to you; not as the world gives do I give to you. Let not your hearts be troubled, neither let them be afraid.</w:t>
+      </w:r>
+    </w:p>
+    <w:p>
+      <w:pPr>
+        <w:pStyle w:val="SPSectionTitle"/>
+        <w:sectPr>
+          <w:type w:val="oddPage"/>
+          <w:pgSz w:w="7920" w:h="12240" w:code="6"/>
+          <w:pgMar w:top="1080" w:right="864" w:bottom="1080" w:left="1152" w:header="576" w:footer="576" w:gutter="0"/>
+          <w:cols w:space="720"/>
+          <w:titlePg/>
+          <w:docGrid w:linePitch="360"/>
+        </w:sectPr>
+      </w:pPr>
+    </w:p>
+    <w:p>
+      <w:pPr>
+        <w:pStyle w:val="SPSectionTitle"/>
+      </w:pPr>
+      <w:r>
+        <w:lastRenderedPageBreak/>
+        <w:t>REFLECTION</w:t>
+      </w:r>
+    </w:p>
+    <w:p>
+      <w:pPr>
+        <w:pStyle w:val="SPBodyText"/>
+        <w:rPr>
+          <w:b/>
+          <w:bCs/>
+        </w:rPr>
+      </w:pPr>
+      <w:r>
+        <w:rPr>
+          <w:b/>
+          <w:bCs/>
+          <w:i/>
+          <w:iCs/>
+        </w:rPr>
+        <w:t>Resting in God's Care</w:t>
+      </w:r>
+    </w:p>
+    <w:p>
+      <w:pPr>
+        <w:pStyle w:val="SPBodyText"/>
+      </w:pPr>
+      <w:r>
+        <w:t>There is something deeply human about the end of the day.</w:t>
+      </w:r>
+      <w:r>
+        <w:br/>
+        <w:t>The work is finished, the noise begins to fade, and we are left with our thoughts. Some days end peacefully. Others leave us carrying worries, regrets, unfinished tasks, or questions for tomorrow.</w:t>
+      </w:r>
+    </w:p>
+    <w:p>
+      <w:pPr>
+        <w:pStyle w:val="SPBodyText"/>
+      </w:pPr>
+      <w:r>
+        <w:t>The Night Prayer teaches us that we do not have to carry everything into the darkness.</w:t>
+      </w:r>
+    </w:p>
+    <w:p>
+      <w:pPr>
+        <w:pStyle w:val="SPBodyText"/>
+      </w:pPr>
+    </w:p>
+    <w:p>
+      <w:pPr>
+        <w:pStyle w:val="SPBodyText"/>
+      </w:pPr>
+      <w:r>
+        <w:rPr>
+          <w:b/>
+          <w:bCs/>
+        </w:rPr>
+        <w:t>Protect us, Lord, as we stay awake;</w:t>
+      </w:r>
+      <w:r>
+        <w:rPr>
+          <w:b/>
+          <w:bCs/>
+        </w:rPr>
+        <w:br/>
+        <w:t>watch over us as we sleep.</w:t>
+      </w:r>
+    </w:p>
+    <w:p>
+      <w:pPr>
+        <w:pStyle w:val="SPBodyText"/>
+      </w:pPr>
+    </w:p>
+    <w:p>
+      <w:pPr>
+        <w:pStyle w:val="SPBodyText"/>
+      </w:pPr>
+      <w:r>
+        <w:t>These words are simple, but they express a profound act of trust. We place ourselves, our loved ones, and all that concerns us into the hands of God. We cannot control what tomorrow will bring. We cannot solve every problem before we sleep. But we can surrender the day we have been given.</w:t>
+      </w:r>
+    </w:p>
+    <w:p>
+      <w:pPr>
+        <w:pStyle w:val="SPBodyText"/>
+      </w:pPr>
+      <w:r>
+        <w:t xml:space="preserve">The prayer also reminds us that </w:t>
+      </w:r>
+      <w:r>
+        <w:rPr>
+          <w:b/>
+          <w:bCs/>
+        </w:rPr>
+        <w:t>God does not cease to watch over us when we cease to watch over ourselves</w:t>
+      </w:r>
+      <w:r>
+        <w:t>. While we sleep, He remains awake. While our minds rest, His care does not.</w:t>
+      </w:r>
+    </w:p>
+    <w:p>
+      <w:pPr>
+        <w:pStyle w:val="SPBodyText"/>
+      </w:pPr>
+      <w:r>
+        <w:t>There is therefore no need to end every day perfectly.</w:t>
+      </w:r>
+    </w:p>
+    <w:p>
+      <w:pPr>
+        <w:pStyle w:val="SPBodyText"/>
+      </w:pPr>
+      <w:r>
+        <w:lastRenderedPageBreak/>
+        <w:t>Some days we will have succeeded.</w:t>
+      </w:r>
+      <w:r>
+        <w:br/>
+        <w:t>Some days we will have failed.</w:t>
+      </w:r>
+      <w:r>
+        <w:br/>
+        <w:t>Some days we will have spoken kindly, and others when we wish we had chosen our words more carefully. There will be things we are grateful for and things we wish we could change.</w:t>
+      </w:r>
+    </w:p>
+    <w:p>
+      <w:pPr>
+        <w:pStyle w:val="SPBodyText"/>
+      </w:pPr>
+      <w:r>
+        <w:t>We can place all of them before God.</w:t>
+      </w:r>
+    </w:p>
+    <w:p>
+      <w:pPr>
+        <w:pStyle w:val="SPBodyText"/>
+      </w:pPr>
+      <w:r>
+        <w:t>The Christian life is not lived only in moments of strength and certainty. It is also lived in surrender — in trusting God when we cannot see what lies ahead.</w:t>
+      </w:r>
+    </w:p>
+    <w:p>
+      <w:pPr>
+        <w:pStyle w:val="SPBodyText"/>
+      </w:pPr>
+      <w:r>
+        <w:t>And so, as night comes, we can release what belongs to today.</w:t>
+      </w:r>
+    </w:p>
+    <w:p>
+      <w:pPr>
+        <w:pStyle w:val="SPBodyText"/>
+      </w:pPr>
+    </w:p>
+    <w:p>
+      <w:pPr>
+        <w:pStyle w:val="SPBodyText"/>
+      </w:pPr>
+      <w:r>
+        <w:rPr>
+          <w:b/>
+          <w:bCs/>
+        </w:rPr>
+        <w:t>The worries we cannot solve.</w:t>
+      </w:r>
+      <w:r>
+        <w:rPr>
+          <w:b/>
+          <w:bCs/>
+        </w:rPr>
+        <w:br/>
+        <w:t>The mistakes we cannot undo.</w:t>
+      </w:r>
+      <w:r>
+        <w:rPr>
+          <w:b/>
+          <w:bCs/>
+        </w:rPr>
+        <w:br/>
+        <w:t>The questions we cannot yet answer.</w:t>
+      </w:r>
+      <w:r>
+        <w:rPr>
+          <w:b/>
+          <w:bCs/>
+        </w:rPr>
+        <w:br/>
+        <w:t>The people we cannot protect by our own strength.</w:t>
+      </w:r>
+    </w:p>
+    <w:p>
+      <w:pPr>
+        <w:pStyle w:val="SPBodyText"/>
+      </w:pPr>
+    </w:p>
+    <w:p>
+      <w:pPr>
+        <w:pStyle w:val="SPBodyText"/>
+      </w:pPr>
+      <w:r>
+        <w:t>We entrust them all to God.</w:t>
+      </w:r>
+    </w:p>
+    <w:p>
+      <w:pPr>
+        <w:pStyle w:val="SPBodyText"/>
+      </w:pPr>
+      <w:r>
+        <w:t>And then we rest.</w:t>
+      </w:r>
+    </w:p>
+    <w:p>
+      <w:pPr>
+        <w:pStyle w:val="SPBodyText"/>
+      </w:pPr>
+      <w:r>
+        <w:t>For the night is not an absence of God's presence. It is another opportunity to trust it.</w:t>
+      </w:r>
+    </w:p>
+    <w:p>
+      <w:pPr>
+        <w:pStyle w:val="SPBodyText"/>
+        <w:rPr>
+          <w:b/>
+          <w:bCs/>
+        </w:rPr>
+      </w:pPr>
+    </w:p>
+    <w:p>
+      <w:pPr>
+        <w:pStyle w:val="SPBodyText"/>
+      </w:pPr>
+      <w:r>
+        <w:rPr>
+          <w:b/>
+          <w:bCs/>
+        </w:rPr>
+        <w:t>Awake, we keep watch with Christ.</w:t>
+      </w:r>
+      <w:r>
+        <w:rPr>
+          <w:b/>
+          <w:bCs/>
+        </w:rPr>
+        <w:br/>
+        <w:t>Asleep, we rest in His peace.</w:t>
+      </w:r>
+    </w:p>
+    <w:p>
+      <w:pPr>
+        <w:pStyle w:val="SPBodyText"/>
+      </w:pPr>
+      <w:r>
+        <w:lastRenderedPageBreak/>
+        <w:t>May the end of each day become more than simply the moment when we close our eyes. May it become a small act of faith — a quiet acknowledgement that God has been with us throughout the day, and that He will remain with us through the night.</w:t>
+      </w:r>
+    </w:p>
+    <w:p>
+      <w:pPr>
+        <w:pStyle w:val="SPBodyText"/>
+        <w:rPr>
+          <w:b/>
+          <w:bCs/>
+        </w:rPr>
+      </w:pPr>
+    </w:p>
+    <w:p>
+      <w:pPr>
+        <w:pStyle w:val="SPBodyText"/>
+        <w:rPr>
+          <w:b/>
+          <w:bCs/>
+        </w:rPr>
         <w:sectPr>
           <w:type w:val="evenPage"/>
           <w:pgSz w:w="7920" w:h="12240" w:code="6"/>
@@ -16174,13 +16664,277 @@
         </w:sectPr>
       </w:pPr>
       <w:r>
+        <w:rPr>
+          <w:b/>
+          <w:bCs/>
+        </w:rPr>
+        <w:t>The day is finished.</w:t>
+      </w:r>
+      <w:r>
+        <w:rPr>
+          <w:b/>
+          <w:bCs/>
+        </w:rPr>
+        <w:br/>
+        <w:t>The burdens may be laid down.</w:t>
+      </w:r>
+      <w:r>
+        <w:rPr>
+          <w:b/>
+          <w:bCs/>
+        </w:rPr>
+        <w:br/>
+        <w:t>God is near.</w:t>
+      </w:r>
+      <w:r>
+        <w:rPr>
+          <w:b/>
+          <w:bCs/>
+        </w:rPr>
+        <w:br/>
+        <w:t>And we may rest in His peace.</w:t>
+      </w:r>
+    </w:p>
+    <w:p>
+      <w:pPr>
+        <w:pStyle w:val="SPSectionHeading"/>
+      </w:pPr>
+      <w:r>
+        <w:lastRenderedPageBreak/>
+        <w:t xml:space="preserve">Part </w:t>
+      </w:r>
+      <w:r>
+        <w:t>I</w:t>
+      </w:r>
+      <w:r>
+        <w:t>v</w:t>
+      </w:r>
+      <w:r>
+        <w:t xml:space="preserve"> </w:t>
+      </w:r>
+      <w:r>
+        <w:t xml:space="preserve">– </w:t>
+      </w:r>
+      <w:r>
+        <w:t xml:space="preserve">prayers of </w:t>
+      </w:r>
+      <w:r>
+        <w:t>Protection and intercession</w:t>
+      </w:r>
+    </w:p>
+    <w:p>
+      <w:pPr>
+        <w:pStyle w:val="SPBodyText"/>
+      </w:pPr>
+      <w:r>
+        <w:t>Throughout the Christian life, we are reminded that we do not walk alone. The Church invites us to seek the intercession of the saints, who have gone before us in faith and now share in the glory of God.</w:t>
+      </w:r>
+    </w:p>
+    <w:p>
+      <w:pPr>
+        <w:pStyle w:val="SPBodyText"/>
+      </w:pPr>
+      <w:r>
+        <w:t>These prayers turn our hearts toward God while asking the saints and angels to intercede for us in particular needs</w:t>
+      </w:r>
+      <w:r>
+        <w:t>;</w:t>
+      </w:r>
+      <w:r>
+        <w:t xml:space="preserve"> for protection, guidance, strength, safe journeys, and perseverance in faith.</w:t>
+      </w:r>
+    </w:p>
+    <w:p>
+      <w:pPr>
+        <w:pStyle w:val="SPBodyText"/>
+      </w:pPr>
+    </w:p>
+    <w:p>
+      <w:pPr>
+        <w:pStyle w:val="SPBodyText"/>
+        <w:sectPr>
+          <w:type w:val="oddPage"/>
+          <w:pgSz w:w="7920" w:h="12240" w:code="6"/>
+          <w:pgMar w:top="1080" w:right="864" w:bottom="1080" w:left="1152" w:header="576" w:footer="576" w:gutter="0"/>
+          <w:cols w:space="720"/>
+          <w:titlePg/>
+          <w:docGrid w:linePitch="360"/>
+        </w:sectPr>
+      </w:pPr>
+      <w:r>
+        <w:t>May these prayers remind us that God's grace is always near, and that the communion of saints surrounds us with a witness of faith, hope, and love.</w:t>
+      </w:r>
+    </w:p>
+    <w:p>
+      <w:pPr>
+        <w:pStyle w:val="SPBodyText"/>
+        <w:jc w:val="center"/>
+        <w:rPr>
+          <w:rFonts w:ascii="Segoe UI Symbol" w:hAnsi="Segoe UI Symbol" w:cs="Segoe UI Symbol"/>
+        </w:rPr>
+      </w:pPr>
+      <w:r>
+        <w:rPr>
+          <w:rFonts w:ascii="Segoe UI Symbol" w:hAnsi="Segoe UI Symbol" w:cs="Segoe UI Symbol"/>
+        </w:rPr>
+        <w:lastRenderedPageBreak/>
+        <w:t>✠</w:t>
+      </w:r>
+    </w:p>
+    <w:p>
+      <w:pPr>
+        <w:pStyle w:val="SPPrayerTitle"/>
+      </w:pPr>
+      <w:r>
+        <w:t>Saint Michael the Archangel</w:t>
+      </w:r>
+    </w:p>
+    <w:p>
+      <w:pPr>
+        <w:pStyle w:val="SPBodyText"/>
+      </w:pPr>
+      <w:r>
+        <w:rPr>
+          <w:b/>
+          <w:bCs/>
+        </w:rPr>
+        <w:t xml:space="preserve"> </w:t>
+      </w:r>
+    </w:p>
+    <w:p>
+      <w:pPr>
+        <w:pStyle w:val="SPBodyText"/>
+        <w:sectPr>
+          <w:type w:val="oddPage"/>
+          <w:pgSz w:w="7920" w:h="12240" w:code="6"/>
+          <w:pgMar w:top="1080" w:right="864" w:bottom="1080" w:left="1152" w:header="576" w:footer="576" w:gutter="0"/>
+          <w:cols w:space="720"/>
+          <w:titlePg/>
+          <w:docGrid w:linePitch="360"/>
+        </w:sectPr>
+      </w:pPr>
+    </w:p>
+    <w:p>
+      <w:pPr>
+        <w:pStyle w:val="SPLanguage"/>
+        <w:spacing w:before="200"/>
+      </w:pPr>
+      <w:r>
+        <w:lastRenderedPageBreak/>
+        <w:tab/>
+        <w:t>ENGLISH</w:t>
+      </w:r>
+    </w:p>
+    <w:p>
+      <w:pPr>
+        <w:pStyle w:val="SPPrayerEnglish"/>
+      </w:pPr>
+      <w:r>
+        <w:tab/>
+      </w:r>
+    </w:p>
+    <w:p>
+      <w:pPr>
+        <w:pStyle w:val="SPPrayerEnglish"/>
+        <w:sectPr>
+          <w:type w:val="evenPage"/>
+          <w:pgSz w:w="7920" w:h="12240" w:code="6"/>
+          <w:pgMar w:top="1080" w:right="864" w:bottom="1080" w:left="1152" w:header="576" w:footer="576" w:gutter="0"/>
+          <w:cols w:space="720"/>
+          <w:titlePg/>
+          <w:docGrid w:linePitch="360"/>
+        </w:sectPr>
+      </w:pPr>
+      <w:r>
+        <w:t xml:space="preserve"> </w:t>
+      </w:r>
+    </w:p>
+    <w:p>
+      <w:pPr>
+        <w:pStyle w:val="SPLanguage"/>
+      </w:pPr>
+      <w:r>
+        <w:lastRenderedPageBreak/>
+        <w:t>LATIN</w:t>
+      </w:r>
+    </w:p>
+    <w:p>
+      <w:pPr>
+        <w:pStyle w:val="SPPrayerLatin"/>
+        <w:rPr>
+          <w:b/>
+          <w:bCs/>
+          <w:lang w:val="en-ZA"/>
+        </w:rPr>
+      </w:pPr>
+    </w:p>
+    <w:p>
+      <w:pPr>
+        <w:pStyle w:val="SPPrayerLatin"/>
+      </w:pPr>
+      <w:r>
+        <w:t xml:space="preserve"> </w:t>
+      </w:r>
+    </w:p>
+    <w:p>
+      <w:pPr>
+        <w:pStyle w:val="SPPrayerLatin"/>
+      </w:pPr>
+    </w:p>
+    <w:p>
+      <w:pPr>
+        <w:pStyle w:val="SPPrayerLatin"/>
+        <w:sectPr>
+          <w:type w:val="oddPage"/>
+          <w:pgSz w:w="7920" w:h="12240" w:code="6"/>
+          <w:pgMar w:top="1080" w:right="864" w:bottom="1080" w:left="1152" w:header="576" w:footer="576" w:gutter="0"/>
+          <w:cols w:space="720"/>
+          <w:titlePg/>
+          <w:docGrid w:linePitch="360"/>
+        </w:sectPr>
+      </w:pPr>
+    </w:p>
+    <w:p>
+      <w:pPr>
+        <w:pStyle w:val="SPSectionTitle"/>
+      </w:pPr>
+      <w:r>
         <w:lastRenderedPageBreak/>
         <w:t>SCRIPTURE</w:t>
       </w:r>
     </w:p>
     <w:p>
       <w:pPr>
+        <w:pStyle w:val="SPScripture"/>
+      </w:pPr>
+      <w:r>
+        <w:t xml:space="preserve"> </w:t>
+      </w:r>
+    </w:p>
+    <w:p>
+      <w:pPr>
         <w:pStyle w:val="SPSectionTitle"/>
+        <w:sectPr>
+          <w:type w:val="oddPage"/>
+          <w:pgSz w:w="7920" w:h="12240" w:code="6"/>
+          <w:pgMar w:top="1080" w:right="864" w:bottom="1080" w:left="1152" w:header="576" w:footer="576" w:gutter="0"/>
+          <w:cols w:space="720"/>
+          <w:titlePg/>
+          <w:docGrid w:linePitch="360"/>
+        </w:sectPr>
+      </w:pPr>
+    </w:p>
+    <w:p>
+      <w:pPr>
+        <w:pStyle w:val="SPSectionTitle"/>
+        <w:sectPr>
+          <w:type w:val="oddPage"/>
+          <w:pgSz w:w="7920" w:h="12240" w:code="6"/>
+          <w:pgMar w:top="1080" w:right="864" w:bottom="1080" w:left="1152" w:header="576" w:footer="576" w:gutter="0"/>
+          <w:cols w:space="720"/>
+          <w:titlePg/>
+          <w:docGrid w:linePitch="360"/>
+        </w:sectPr>
       </w:pPr>
       <w:r>
         <w:lastRenderedPageBreak/>
@@ -16190,12 +16944,748 @@
     <w:p>
       <w:pPr>
         <w:pStyle w:val="SPBodyText"/>
-      </w:pPr>
-    </w:p>
-    <w:p>
-      <w:pPr>
-        <w:pStyle w:val="SPBodyText"/>
-      </w:pPr>
+        <w:jc w:val="center"/>
+        <w:rPr>
+          <w:rFonts w:ascii="Segoe UI Symbol" w:hAnsi="Segoe UI Symbol" w:cs="Segoe UI Symbol"/>
+        </w:rPr>
+      </w:pPr>
+      <w:r>
+        <w:rPr>
+          <w:rFonts w:ascii="Segoe UI Symbol" w:hAnsi="Segoe UI Symbol" w:cs="Segoe UI Symbol"/>
+        </w:rPr>
+        <w:lastRenderedPageBreak/>
+        <w:t>✠</w:t>
+      </w:r>
+    </w:p>
+    <w:p>
+      <w:pPr>
+        <w:pStyle w:val="SPPrayerTitle"/>
+      </w:pPr>
+      <w:r>
+        <w:t xml:space="preserve">Saint </w:t>
+      </w:r>
+      <w:r>
+        <w:t>benedict</w:t>
+      </w:r>
+    </w:p>
+    <w:p>
+      <w:pPr>
+        <w:pStyle w:val="SPBodyText"/>
+      </w:pPr>
+      <w:r>
+        <w:rPr>
+          <w:b/>
+          <w:bCs/>
+        </w:rPr>
+        <w:t xml:space="preserve"> </w:t>
+      </w:r>
+    </w:p>
+    <w:p>
+      <w:pPr>
+        <w:pStyle w:val="SPBodyText"/>
+        <w:sectPr>
+          <w:type w:val="oddPage"/>
+          <w:pgSz w:w="7920" w:h="12240" w:code="6"/>
+          <w:pgMar w:top="1080" w:right="864" w:bottom="1080" w:left="1152" w:header="576" w:footer="576" w:gutter="0"/>
+          <w:cols w:space="720"/>
+          <w:titlePg/>
+          <w:docGrid w:linePitch="360"/>
+        </w:sectPr>
+      </w:pPr>
+    </w:p>
+    <w:p>
+      <w:pPr>
+        <w:pStyle w:val="SPLanguage"/>
+        <w:spacing w:before="200"/>
+      </w:pPr>
+      <w:r>
+        <w:lastRenderedPageBreak/>
+        <w:tab/>
+        <w:t>ENGLISH</w:t>
+      </w:r>
+    </w:p>
+    <w:p>
+      <w:pPr>
+        <w:pStyle w:val="SPPrayerEnglish"/>
+      </w:pPr>
+      <w:r>
+        <w:tab/>
+      </w:r>
+    </w:p>
+    <w:p>
+      <w:pPr>
+        <w:pStyle w:val="SPPrayerEnglish"/>
+        <w:sectPr>
+          <w:type w:val="evenPage"/>
+          <w:pgSz w:w="7920" w:h="12240" w:code="6"/>
+          <w:pgMar w:top="1080" w:right="864" w:bottom="1080" w:left="1152" w:header="576" w:footer="576" w:gutter="0"/>
+          <w:cols w:space="720"/>
+          <w:titlePg/>
+          <w:docGrid w:linePitch="360"/>
+        </w:sectPr>
+      </w:pPr>
+      <w:r>
+        <w:t xml:space="preserve"> </w:t>
+      </w:r>
+    </w:p>
+    <w:p>
+      <w:pPr>
+        <w:pStyle w:val="SPLanguage"/>
+        <w:sectPr>
+          <w:type w:val="oddPage"/>
+          <w:pgSz w:w="7920" w:h="12240" w:code="6"/>
+          <w:pgMar w:top="1080" w:right="864" w:bottom="1080" w:left="1152" w:header="576" w:footer="576" w:gutter="0"/>
+          <w:cols w:space="720"/>
+          <w:titlePg/>
+          <w:docGrid w:linePitch="360"/>
+        </w:sectPr>
+      </w:pPr>
+      <w:r>
+        <w:lastRenderedPageBreak/>
+        <w:t>LATIN</w:t>
+      </w:r>
+    </w:p>
+    <w:p>
+      <w:pPr>
+        <w:pStyle w:val="SPSectionTitle"/>
+      </w:pPr>
+      <w:r>
+        <w:lastRenderedPageBreak/>
+        <w:t>SCRIPTURE</w:t>
+      </w:r>
+    </w:p>
+    <w:p>
+      <w:pPr>
+        <w:pStyle w:val="SPLanguage"/>
+      </w:pPr>
+    </w:p>
+    <w:p>
+      <w:pPr>
+        <w:pStyle w:val="SPPrayerLatin"/>
+        <w:rPr>
+          <w:b/>
+          <w:bCs/>
+          <w:lang w:val="en-ZA"/>
+        </w:rPr>
+      </w:pPr>
+    </w:p>
+    <w:p>
+      <w:pPr>
+        <w:pStyle w:val="SPPrayerLatin"/>
+      </w:pPr>
+      <w:r>
+        <w:t xml:space="preserve"> </w:t>
+      </w:r>
+    </w:p>
+    <w:p>
+      <w:pPr>
+        <w:pStyle w:val="SPPrayerLatin"/>
+      </w:pPr>
+    </w:p>
+    <w:p>
+      <w:pPr>
+        <w:pStyle w:val="SPPrayerLatin"/>
+        <w:sectPr>
+          <w:type w:val="evenPage"/>
+          <w:pgSz w:w="7920" w:h="12240" w:code="6"/>
+          <w:pgMar w:top="1080" w:right="864" w:bottom="1080" w:left="1152" w:header="576" w:footer="576" w:gutter="0"/>
+          <w:cols w:space="720"/>
+          <w:titlePg/>
+          <w:docGrid w:linePitch="360"/>
+        </w:sectPr>
+      </w:pPr>
+    </w:p>
+    <w:p>
+      <w:pPr>
+        <w:pStyle w:val="SPSectionTitle"/>
+      </w:pPr>
+      <w:r>
+        <w:lastRenderedPageBreak/>
+        <w:t>reflection</w:t>
+      </w:r>
+    </w:p>
+    <w:p>
+      <w:pPr>
+        <w:pStyle w:val="SPScripture"/>
+      </w:pPr>
+      <w:r>
+        <w:t xml:space="preserve"> </w:t>
+      </w:r>
+    </w:p>
+    <w:p>
+      <w:pPr>
+        <w:pStyle w:val="SPSectionTitle"/>
+        <w:rPr>
+          <w:color w:val="333333"/>
+        </w:rPr>
+      </w:pPr>
+    </w:p>
+    <w:p>
+      <w:pPr>
+        <w:pStyle w:val="SPBodyText"/>
+      </w:pPr>
+    </w:p>
+    <w:p>
+      <w:pPr>
+        <w:pStyle w:val="SPBodyText"/>
+      </w:pPr>
+    </w:p>
+    <w:p>
+      <w:pPr>
+        <w:pStyle w:val="SPBodyText"/>
+      </w:pPr>
+    </w:p>
+    <w:p>
+      <w:pPr>
+        <w:pStyle w:val="SPSectionTitle"/>
+        <w:sectPr>
+          <w:type w:val="oddPage"/>
+          <w:pgSz w:w="7920" w:h="12240" w:code="6"/>
+          <w:pgMar w:top="1080" w:right="864" w:bottom="1080" w:left="1152" w:header="576" w:footer="576" w:gutter="0"/>
+          <w:cols w:space="720"/>
+          <w:titlePg/>
+          <w:docGrid w:linePitch="360"/>
+        </w:sectPr>
+      </w:pPr>
+    </w:p>
+    <w:p>
+      <w:pPr>
+        <w:pStyle w:val="SPBodyText"/>
+        <w:jc w:val="center"/>
+        <w:rPr>
+          <w:rFonts w:ascii="Segoe UI Symbol" w:hAnsi="Segoe UI Symbol" w:cs="Segoe UI Symbol"/>
+        </w:rPr>
+      </w:pPr>
+      <w:r>
+        <w:rPr>
+          <w:rFonts w:ascii="Segoe UI Symbol" w:hAnsi="Segoe UI Symbol" w:cs="Segoe UI Symbol"/>
+        </w:rPr>
+        <w:lastRenderedPageBreak/>
+        <w:t>✠</w:t>
+      </w:r>
+    </w:p>
+    <w:p>
+      <w:pPr>
+        <w:pStyle w:val="SPPrayerTitle"/>
+      </w:pPr>
+      <w:r>
+        <w:t xml:space="preserve">Saint </w:t>
+      </w:r>
+      <w:r>
+        <w:t>joseph</w:t>
+      </w:r>
+    </w:p>
+    <w:p>
+      <w:pPr>
+        <w:pStyle w:val="SPBodyText"/>
+      </w:pPr>
+      <w:r>
+        <w:rPr>
+          <w:b/>
+          <w:bCs/>
+        </w:rPr>
+        <w:t xml:space="preserve"> </w:t>
+      </w:r>
+    </w:p>
+    <w:p>
+      <w:pPr>
+        <w:pStyle w:val="SPBodyText"/>
+        <w:sectPr>
+          <w:type w:val="oddPage"/>
+          <w:pgSz w:w="7920" w:h="12240" w:code="6"/>
+          <w:pgMar w:top="1080" w:right="864" w:bottom="1080" w:left="1152" w:header="576" w:footer="576" w:gutter="0"/>
+          <w:cols w:space="720"/>
+          <w:titlePg/>
+          <w:docGrid w:linePitch="360"/>
+        </w:sectPr>
+      </w:pPr>
+    </w:p>
+    <w:p>
+      <w:pPr>
+        <w:pStyle w:val="SPLanguage"/>
+        <w:spacing w:before="200"/>
+      </w:pPr>
+      <w:r>
+        <w:lastRenderedPageBreak/>
+        <w:tab/>
+        <w:t>ENGLISH</w:t>
+      </w:r>
+    </w:p>
+    <w:p>
+      <w:pPr>
+        <w:pStyle w:val="SPPrayerEnglish"/>
+      </w:pPr>
+      <w:r>
+        <w:tab/>
+      </w:r>
+    </w:p>
+    <w:p>
+      <w:pPr>
+        <w:pStyle w:val="SPPrayerEnglish"/>
+        <w:sectPr>
+          <w:type w:val="evenPage"/>
+          <w:pgSz w:w="7920" w:h="12240" w:code="6"/>
+          <w:pgMar w:top="1080" w:right="864" w:bottom="1080" w:left="1152" w:header="576" w:footer="576" w:gutter="0"/>
+          <w:cols w:space="720"/>
+          <w:titlePg/>
+          <w:docGrid w:linePitch="360"/>
+        </w:sectPr>
+      </w:pPr>
+      <w:r>
+        <w:t xml:space="preserve"> </w:t>
+      </w:r>
+    </w:p>
+    <w:p>
+      <w:pPr>
+        <w:pStyle w:val="SPLanguage"/>
+        <w:sectPr>
+          <w:type w:val="oddPage"/>
+          <w:pgSz w:w="7920" w:h="12240" w:code="6"/>
+          <w:pgMar w:top="1080" w:right="864" w:bottom="1080" w:left="1152" w:header="576" w:footer="576" w:gutter="0"/>
+          <w:cols w:space="720"/>
+          <w:titlePg/>
+          <w:docGrid w:linePitch="360"/>
+        </w:sectPr>
+      </w:pPr>
+      <w:r>
+        <w:lastRenderedPageBreak/>
+        <w:t>LATIN</w:t>
+      </w:r>
+    </w:p>
+    <w:p>
+      <w:pPr>
+        <w:pStyle w:val="SPSectionTitle"/>
+      </w:pPr>
+      <w:r>
+        <w:lastRenderedPageBreak/>
+        <w:t>SCRIPTURE</w:t>
+      </w:r>
+    </w:p>
+    <w:p>
+      <w:pPr>
+        <w:pStyle w:val="SPLanguage"/>
+      </w:pPr>
+    </w:p>
+    <w:p>
+      <w:pPr>
+        <w:pStyle w:val="SPPrayerLatin"/>
+        <w:rPr>
+          <w:b/>
+          <w:bCs/>
+          <w:lang w:val="en-ZA"/>
+        </w:rPr>
+      </w:pPr>
+    </w:p>
+    <w:p>
+      <w:pPr>
+        <w:pStyle w:val="SPPrayerLatin"/>
+      </w:pPr>
+      <w:r>
+        <w:t xml:space="preserve"> </w:t>
+      </w:r>
+    </w:p>
+    <w:p>
+      <w:pPr>
+        <w:pStyle w:val="SPPrayerLatin"/>
+      </w:pPr>
+    </w:p>
+    <w:p>
+      <w:pPr>
+        <w:pStyle w:val="SPPrayerLatin"/>
+        <w:sectPr>
+          <w:type w:val="evenPage"/>
+          <w:pgSz w:w="7920" w:h="12240" w:code="6"/>
+          <w:pgMar w:top="1080" w:right="864" w:bottom="1080" w:left="1152" w:header="576" w:footer="576" w:gutter="0"/>
+          <w:cols w:space="720"/>
+          <w:titlePg/>
+          <w:docGrid w:linePitch="360"/>
+        </w:sectPr>
+      </w:pPr>
+    </w:p>
+    <w:p>
+      <w:pPr>
+        <w:pStyle w:val="SPSectionTitle"/>
+        <w:sectPr>
+          <w:type w:val="oddPage"/>
+          <w:pgSz w:w="7920" w:h="12240" w:code="6"/>
+          <w:pgMar w:top="1080" w:right="864" w:bottom="1080" w:left="1152" w:header="576" w:footer="576" w:gutter="0"/>
+          <w:cols w:space="720"/>
+          <w:titlePg/>
+          <w:docGrid w:linePitch="360"/>
+        </w:sectPr>
+      </w:pPr>
+      <w:r>
+        <w:lastRenderedPageBreak/>
+        <w:t>reflection</w:t>
+      </w:r>
+    </w:p>
+    <w:p>
+      <w:pPr>
+        <w:pStyle w:val="SPBodyText"/>
+        <w:jc w:val="center"/>
+        <w:rPr>
+          <w:rFonts w:ascii="Segoe UI Symbol" w:hAnsi="Segoe UI Symbol" w:cs="Segoe UI Symbol"/>
+        </w:rPr>
+      </w:pPr>
+      <w:r>
+        <w:rPr>
+          <w:rFonts w:ascii="Segoe UI Symbol" w:hAnsi="Segoe UI Symbol" w:cs="Segoe UI Symbol"/>
+        </w:rPr>
+        <w:lastRenderedPageBreak/>
+        <w:t>✠</w:t>
+      </w:r>
+    </w:p>
+    <w:p>
+      <w:pPr>
+        <w:pStyle w:val="SPPrayerTitle"/>
+      </w:pPr>
+      <w:r>
+        <w:t xml:space="preserve">Saint </w:t>
+      </w:r>
+      <w:r>
+        <w:t>anthony</w:t>
+      </w:r>
+    </w:p>
+    <w:p>
+      <w:pPr>
+        <w:pStyle w:val="SPBodyText"/>
+      </w:pPr>
+      <w:r>
+        <w:rPr>
+          <w:b/>
+          <w:bCs/>
+        </w:rPr>
+        <w:t xml:space="preserve"> </w:t>
+      </w:r>
+    </w:p>
+    <w:p>
+      <w:pPr>
+        <w:pStyle w:val="SPBodyText"/>
+        <w:sectPr>
+          <w:type w:val="oddPage"/>
+          <w:pgSz w:w="7920" w:h="12240" w:code="6"/>
+          <w:pgMar w:top="1080" w:right="864" w:bottom="1080" w:left="1152" w:header="576" w:footer="576" w:gutter="0"/>
+          <w:cols w:space="720"/>
+          <w:titlePg/>
+          <w:docGrid w:linePitch="360"/>
+        </w:sectPr>
+      </w:pPr>
+    </w:p>
+    <w:p>
+      <w:pPr>
+        <w:pStyle w:val="SPLanguage"/>
+        <w:spacing w:before="200"/>
+      </w:pPr>
+      <w:r>
+        <w:lastRenderedPageBreak/>
+        <w:tab/>
+        <w:t>ENGLISH</w:t>
+      </w:r>
+    </w:p>
+    <w:p>
+      <w:pPr>
+        <w:pStyle w:val="SPPrayerEnglish"/>
+      </w:pPr>
+      <w:r>
+        <w:tab/>
+      </w:r>
+    </w:p>
+    <w:p>
+      <w:pPr>
+        <w:pStyle w:val="SPPrayerEnglish"/>
+        <w:sectPr>
+          <w:type w:val="evenPage"/>
+          <w:pgSz w:w="7920" w:h="12240" w:code="6"/>
+          <w:pgMar w:top="1080" w:right="864" w:bottom="1080" w:left="1152" w:header="576" w:footer="576" w:gutter="0"/>
+          <w:cols w:space="720"/>
+          <w:titlePg/>
+          <w:docGrid w:linePitch="360"/>
+        </w:sectPr>
+      </w:pPr>
+      <w:r>
+        <w:t xml:space="preserve"> </w:t>
+      </w:r>
+    </w:p>
+    <w:p>
+      <w:pPr>
+        <w:pStyle w:val="SPLanguage"/>
+        <w:sectPr>
+          <w:type w:val="oddPage"/>
+          <w:pgSz w:w="7920" w:h="12240" w:code="6"/>
+          <w:pgMar w:top="1080" w:right="864" w:bottom="1080" w:left="1152" w:header="576" w:footer="576" w:gutter="0"/>
+          <w:cols w:space="720"/>
+          <w:titlePg/>
+          <w:docGrid w:linePitch="360"/>
+        </w:sectPr>
+      </w:pPr>
+      <w:r>
+        <w:lastRenderedPageBreak/>
+        <w:t>LATIN</w:t>
+      </w:r>
+    </w:p>
+    <w:p>
+      <w:pPr>
+        <w:pStyle w:val="SPSectionTitle"/>
+      </w:pPr>
+      <w:r>
+        <w:lastRenderedPageBreak/>
+        <w:t>SCRIPTURE</w:t>
+      </w:r>
+    </w:p>
+    <w:p>
+      <w:pPr>
+        <w:pStyle w:val="SPLanguage"/>
+      </w:pPr>
+    </w:p>
+    <w:p>
+      <w:pPr>
+        <w:pStyle w:val="SPPrayerLatin"/>
+        <w:rPr>
+          <w:b/>
+          <w:bCs/>
+          <w:lang w:val="en-ZA"/>
+        </w:rPr>
+      </w:pPr>
+    </w:p>
+    <w:p>
+      <w:pPr>
+        <w:pStyle w:val="SPPrayerLatin"/>
+      </w:pPr>
+      <w:r>
+        <w:t xml:space="preserve"> </w:t>
+      </w:r>
+    </w:p>
+    <w:p>
+      <w:pPr>
+        <w:pStyle w:val="SPPrayerLatin"/>
+      </w:pPr>
+    </w:p>
+    <w:p>
+      <w:pPr>
+        <w:pStyle w:val="SPPrayerLatin"/>
+        <w:sectPr>
+          <w:type w:val="evenPage"/>
+          <w:pgSz w:w="7920" w:h="12240" w:code="6"/>
+          <w:pgMar w:top="1080" w:right="864" w:bottom="1080" w:left="1152" w:header="576" w:footer="576" w:gutter="0"/>
+          <w:cols w:space="720"/>
+          <w:titlePg/>
+          <w:docGrid w:linePitch="360"/>
+        </w:sectPr>
+      </w:pPr>
+    </w:p>
+    <w:p>
+      <w:pPr>
+        <w:pStyle w:val="SPSectionTitle"/>
+        <w:sectPr>
+          <w:type w:val="oddPage"/>
+          <w:pgSz w:w="7920" w:h="12240" w:code="6"/>
+          <w:pgMar w:top="1080" w:right="864" w:bottom="1080" w:left="1152" w:header="576" w:footer="576" w:gutter="0"/>
+          <w:cols w:space="720"/>
+          <w:titlePg/>
+          <w:docGrid w:linePitch="360"/>
+        </w:sectPr>
+      </w:pPr>
+      <w:r>
+        <w:lastRenderedPageBreak/>
+        <w:t>reflection</w:t>
+      </w:r>
+    </w:p>
+    <w:p>
+      <w:pPr>
+        <w:pStyle w:val="SPBodyText"/>
+        <w:jc w:val="center"/>
+        <w:rPr>
+          <w:rFonts w:ascii="Segoe UI Symbol" w:hAnsi="Segoe UI Symbol" w:cs="Segoe UI Symbol"/>
+        </w:rPr>
+      </w:pPr>
+      <w:r>
+        <w:rPr>
+          <w:rFonts w:ascii="Segoe UI Symbol" w:hAnsi="Segoe UI Symbol" w:cs="Segoe UI Symbol"/>
+        </w:rPr>
+        <w:lastRenderedPageBreak/>
+        <w:t>✠</w:t>
+      </w:r>
+    </w:p>
+    <w:p>
+      <w:pPr>
+        <w:pStyle w:val="SPPrayerTitle"/>
+      </w:pPr>
+      <w:r>
+        <w:t xml:space="preserve">Saint </w:t>
+      </w:r>
+      <w:r>
+        <w:t>christopher</w:t>
+      </w:r>
+    </w:p>
+    <w:p>
+      <w:pPr>
+        <w:pStyle w:val="SPBodyText"/>
+      </w:pPr>
+      <w:r>
+        <w:rPr>
+          <w:b/>
+          <w:bCs/>
+        </w:rPr>
+        <w:t xml:space="preserve"> </w:t>
+      </w:r>
+    </w:p>
+    <w:p>
+      <w:pPr>
+        <w:pStyle w:val="SPBodyText"/>
+        <w:sectPr>
+          <w:type w:val="oddPage"/>
+          <w:pgSz w:w="7920" w:h="12240" w:code="6"/>
+          <w:pgMar w:top="1080" w:right="864" w:bottom="1080" w:left="1152" w:header="576" w:footer="576" w:gutter="0"/>
+          <w:cols w:space="720"/>
+          <w:titlePg/>
+          <w:docGrid w:linePitch="360"/>
+        </w:sectPr>
+      </w:pPr>
+    </w:p>
+    <w:p>
+      <w:pPr>
+        <w:pStyle w:val="SPLanguage"/>
+        <w:spacing w:before="200"/>
+      </w:pPr>
+      <w:r>
+        <w:lastRenderedPageBreak/>
+        <w:tab/>
+        <w:t>ENGLISH</w:t>
+      </w:r>
+    </w:p>
+    <w:p>
+      <w:pPr>
+        <w:pStyle w:val="SPPrayerEnglish"/>
+      </w:pPr>
+      <w:r>
+        <w:tab/>
+      </w:r>
+    </w:p>
+    <w:p>
+      <w:pPr>
+        <w:pStyle w:val="SPPrayerEnglish"/>
+        <w:sectPr>
+          <w:type w:val="evenPage"/>
+          <w:pgSz w:w="7920" w:h="12240" w:code="6"/>
+          <w:pgMar w:top="1080" w:right="864" w:bottom="1080" w:left="1152" w:header="576" w:footer="576" w:gutter="0"/>
+          <w:cols w:space="720"/>
+          <w:titlePg/>
+          <w:docGrid w:linePitch="360"/>
+        </w:sectPr>
+      </w:pPr>
+      <w:r>
+        <w:t xml:space="preserve"> </w:t>
+      </w:r>
+    </w:p>
+    <w:p>
+      <w:pPr>
+        <w:pStyle w:val="SPLanguage"/>
+        <w:sectPr>
+          <w:type w:val="oddPage"/>
+          <w:pgSz w:w="7920" w:h="12240" w:code="6"/>
+          <w:pgMar w:top="1080" w:right="864" w:bottom="1080" w:left="1152" w:header="576" w:footer="576" w:gutter="0"/>
+          <w:cols w:space="720"/>
+          <w:titlePg/>
+          <w:docGrid w:linePitch="360"/>
+        </w:sectPr>
+      </w:pPr>
+      <w:r>
+        <w:lastRenderedPageBreak/>
+        <w:t>LATIN</w:t>
+      </w:r>
+    </w:p>
+    <w:p>
+      <w:pPr>
+        <w:pStyle w:val="SPSectionTitle"/>
+      </w:pPr>
+      <w:r>
+        <w:lastRenderedPageBreak/>
+        <w:t>SCRIPTURE</w:t>
+      </w:r>
+    </w:p>
+    <w:p>
+      <w:pPr>
+        <w:pStyle w:val="SPLanguage"/>
+      </w:pPr>
+    </w:p>
+    <w:p>
+      <w:pPr>
+        <w:pStyle w:val="SPPrayerLatin"/>
+        <w:rPr>
+          <w:b/>
+          <w:bCs/>
+          <w:lang w:val="en-ZA"/>
+        </w:rPr>
+      </w:pPr>
+    </w:p>
+    <w:p>
+      <w:pPr>
+        <w:pStyle w:val="SPPrayerLatin"/>
+      </w:pPr>
+      <w:r>
+        <w:t xml:space="preserve"> </w:t>
+      </w:r>
+    </w:p>
+    <w:p>
+      <w:pPr>
+        <w:pStyle w:val="SPPrayerLatin"/>
+      </w:pPr>
+    </w:p>
+    <w:p>
+      <w:pPr>
+        <w:pStyle w:val="SPPrayerLatin"/>
+        <w:sectPr>
+          <w:type w:val="evenPage"/>
+          <w:pgSz w:w="7920" w:h="12240" w:code="6"/>
+          <w:pgMar w:top="1080" w:right="864" w:bottom="1080" w:left="1152" w:header="576" w:footer="576" w:gutter="0"/>
+          <w:cols w:space="720"/>
+          <w:titlePg/>
+          <w:docGrid w:linePitch="360"/>
+        </w:sectPr>
+      </w:pPr>
+    </w:p>
+    <w:p>
+      <w:pPr>
+        <w:pStyle w:val="SPSectionTitle"/>
+      </w:pPr>
+      <w:r>
+        <w:lastRenderedPageBreak/>
+        <w:t>reflection</w:t>
+      </w:r>
+    </w:p>
+    <w:p>
+      <w:pPr>
+        <w:pStyle w:val="SPScripture"/>
+      </w:pPr>
+      <w:r>
+        <w:t xml:space="preserve"> </w:t>
+      </w:r>
+    </w:p>
+    <w:p>
+      <w:pPr>
+        <w:pStyle w:val="SPSectionTitle"/>
+      </w:pPr>
+    </w:p>
+    <w:p>
+      <w:pPr>
+        <w:pStyle w:val="SPScripture"/>
+      </w:pPr>
+      <w:r>
+        <w:t xml:space="preserve"> </w:t>
+      </w:r>
+    </w:p>
+    <w:p>
+      <w:pPr>
+        <w:pStyle w:val="SPSectionTitle"/>
+      </w:pPr>
+    </w:p>
+    <w:p>
+      <w:pPr>
+        <w:pStyle w:val="SPScripture"/>
+      </w:pPr>
+      <w:r>
+        <w:t xml:space="preserve"> </w:t>
+      </w:r>
     </w:p>
     <w:p>
       <w:pPr>

</xml_diff>

<commit_message>
St Michael Prayer completed.
</commit_message>
<xml_diff>
--- a/manuscript/volume-1/sacrae-preces-volume-1.docx
+++ b/manuscript/volume-1/sacrae-preces-volume-1.docx
@@ -74,6 +74,7 @@
           <w:szCs w:val="18"/>
         </w:rPr>
       </w:pPr>
+      <w:proofErr w:type="spellStart"/>
       <w:r>
         <w:rPr>
           <w:rStyle w:val="SPPrayerResponseCS"/>
@@ -81,7 +82,17 @@
           <w:sz w:val="48"/>
           <w:szCs w:val="18"/>
         </w:rPr>
-        <w:t>Sacrea preces</w:t>
+        <w:t>Sacrea</w:t>
+      </w:r>
+      <w:proofErr w:type="spellEnd"/>
+      <w:r>
+        <w:rPr>
+          <w:rStyle w:val="SPPrayerResponseCS"/>
+          <w:i w:val="0"/>
+          <w:sz w:val="48"/>
+          <w:szCs w:val="18"/>
+        </w:rPr>
+        <w:t xml:space="preserve"> preces</w:t>
       </w:r>
     </w:p>
     <w:p>
@@ -1003,7 +1014,15 @@
         <w:pStyle w:val="SPBodyText"/>
       </w:pPr>
       <w:r>
-        <w:t>Perhaps there is a prayer you already know well. Perhaps there is one you have heard many times but never really considered. Perhaps you are looking for a prayer for a particular moment of the day, or simply looking for a few quiet minutes in which to turn your attention towards God.</w:t>
+        <w:t xml:space="preserve">Perhaps there is a prayer you already know well. Perhaps there is one you have heard many times but never really considered. Perhaps you are looking for a prayer for a particular moment of the </w:t>
+      </w:r>
+      <w:proofErr w:type="gramStart"/>
+      <w:r>
+        <w:t>day, or</w:t>
+      </w:r>
+      <w:proofErr w:type="gramEnd"/>
+      <w:r>
+        <w:t xml:space="preserve"> simply looking for a few quiet minutes in which to turn your attention towards God.</w:t>
       </w:r>
     </w:p>
     <w:p>
@@ -2536,16 +2555,58 @@
         <w:rPr>
           <w:rStyle w:val="Emphasis"/>
         </w:rPr>
-        <w:t>in NOH-mee-neh PAH-tris,</w:t>
-      </w:r>
-      <w:r>
-        <w:br/>
-      </w:r>
+        <w:t>in NOH-mee-</w:t>
+      </w:r>
+      <w:proofErr w:type="spellStart"/>
       <w:r>
         <w:rPr>
           <w:rStyle w:val="Emphasis"/>
         </w:rPr>
-        <w:t>et FEE-lee-ee, et SPEE-ree-toos SAHNK-tee.</w:t>
+        <w:t>neh</w:t>
+      </w:r>
+      <w:proofErr w:type="spellEnd"/>
+      <w:r>
+        <w:rPr>
+          <w:rStyle w:val="Emphasis"/>
+        </w:rPr>
+        <w:t xml:space="preserve"> PAH-tris,</w:t>
+      </w:r>
+      <w:r>
+        <w:br/>
+      </w:r>
+      <w:r>
+        <w:rPr>
+          <w:rStyle w:val="Emphasis"/>
+        </w:rPr>
+        <w:t>et FEE-lee-ee, et SPEE-</w:t>
+      </w:r>
+      <w:proofErr w:type="spellStart"/>
+      <w:r>
+        <w:rPr>
+          <w:rStyle w:val="Emphasis"/>
+        </w:rPr>
+        <w:t>ree</w:t>
+      </w:r>
+      <w:proofErr w:type="spellEnd"/>
+      <w:r>
+        <w:rPr>
+          <w:rStyle w:val="Emphasis"/>
+        </w:rPr>
+        <w:t>-</w:t>
+      </w:r>
+      <w:proofErr w:type="spellStart"/>
+      <w:r>
+        <w:rPr>
+          <w:rStyle w:val="Emphasis"/>
+        </w:rPr>
+        <w:t>toos</w:t>
+      </w:r>
+      <w:proofErr w:type="spellEnd"/>
+      <w:r>
+        <w:rPr>
+          <w:rStyle w:val="Emphasis"/>
+        </w:rPr>
+        <w:t xml:space="preserve"> SAHNK-tee.</w:t>
       </w:r>
       <w:r>
         <w:br/>
@@ -3011,7 +3072,15 @@
         <w:pStyle w:val="SPScripture"/>
       </w:pPr>
       <w:r>
-        <w:t>Our Father who art in heaven, Hallowed be thy name. Thy kingdom come</w:t>
+        <w:t xml:space="preserve">Our Father who art in heaven, </w:t>
+      </w:r>
+      <w:proofErr w:type="gramStart"/>
+      <w:r>
+        <w:t>Hallowed</w:t>
+      </w:r>
+      <w:proofErr w:type="gramEnd"/>
+      <w:r>
+        <w:t xml:space="preserve"> be thy name. Thy kingdom come</w:t>
       </w:r>
       <w:r>
         <w:t>.</w:t>
@@ -3056,13 +3125,21 @@
         <w:t xml:space="preserve"> </w:t>
       </w:r>
       <w:r>
-        <w:t xml:space="preserve">And lead us not into temptation, </w:t>
+        <w:t xml:space="preserve">And lead us not into </w:t>
+      </w:r>
+      <w:proofErr w:type="gramStart"/>
+      <w:r>
+        <w:t xml:space="preserve">temptation, </w:t>
       </w:r>
       <w:r>
         <w:t>b</w:t>
       </w:r>
       <w:r>
-        <w:t>ut deliver us from evil.</w:t>
+        <w:t>ut</w:t>
+      </w:r>
+      <w:proofErr w:type="gramEnd"/>
+      <w:r>
+        <w:t xml:space="preserve"> deliver us from evil.</w:t>
       </w:r>
       <w:r>
         <w:t>”</w:t>
@@ -3096,7 +3173,17 @@
         <w:t>Your</w:t>
       </w:r>
       <w:r>
-        <w:t xml:space="preserve"> kingdom come. Give us each day our daily bread; and forgive us our sins, for we ourselves forgive every one who is indebted to us; and lead us not into temptation.</w:t>
+        <w:t xml:space="preserve"> kingdom come. Give us each day our daily bread; and forgive us our sins, for we ourselves forgive </w:t>
+      </w:r>
+      <w:proofErr w:type="spellStart"/>
+      <w:proofErr w:type="gramStart"/>
+      <w:r>
+        <w:t>every one</w:t>
+      </w:r>
+      <w:proofErr w:type="spellEnd"/>
+      <w:proofErr w:type="gramEnd"/>
+      <w:r>
+        <w:t xml:space="preserve"> who is indebted to us; and lead us not into temptation.</w:t>
       </w:r>
       <w:r>
         <w:t>”</w:t>
@@ -3178,6 +3265,7 @@
       <w:r>
         <w:t xml:space="preserve">The first word is not </w:t>
       </w:r>
+      <w:proofErr w:type="gramStart"/>
       <w:r>
         <w:rPr>
           <w:i/>
@@ -3185,9 +3273,12 @@
         </w:rPr>
         <w:t>my</w:t>
       </w:r>
+      <w:proofErr w:type="gramEnd"/>
       <w:r>
         <w:t xml:space="preserve">. It is </w:t>
       </w:r>
+      <w:proofErr w:type="spellStart"/>
+      <w:proofErr w:type="gramStart"/>
       <w:r>
         <w:rPr>
           <w:i/>
@@ -3195,6 +3286,8 @@
         </w:rPr>
         <w:t>our</w:t>
       </w:r>
+      <w:proofErr w:type="spellEnd"/>
+      <w:proofErr w:type="gramEnd"/>
       <w:r>
         <w:t>.</w:t>
       </w:r>
@@ -3421,8 +3514,13 @@
         <w:pStyle w:val="SPPrayerTitle"/>
       </w:pPr>
       <w:r>
-        <w:t>The Hail mary</w:t>
-      </w:r>
+        <w:t xml:space="preserve">The Hail </w:t>
+      </w:r>
+      <w:proofErr w:type="spellStart"/>
+      <w:r>
+        <w:t>mary</w:t>
+      </w:r>
+      <w:proofErr w:type="spellEnd"/>
     </w:p>
     <w:p>
       <w:pPr>
@@ -4459,7 +4557,15 @@
         <w:pStyle w:val="SPPrayerEnglish"/>
       </w:pPr>
       <w:r>
-        <w:t>Glory be to the Father,</w:t>
+        <w:t xml:space="preserve">Glory be to the </w:t>
+      </w:r>
+      <w:proofErr w:type="gramStart"/>
+      <w:r>
+        <w:t>Father</w:t>
+      </w:r>
+      <w:proofErr w:type="gramEnd"/>
+      <w:r>
+        <w:t>,</w:t>
       </w:r>
     </w:p>
     <w:p>
@@ -4467,8 +4573,13 @@
         <w:pStyle w:val="SPPrayerEnglish"/>
       </w:pPr>
       <w:r>
-        <w:t>And to the Son</w:t>
-      </w:r>
+        <w:t xml:space="preserve">And to the </w:t>
+      </w:r>
+      <w:proofErr w:type="gramStart"/>
+      <w:r>
+        <w:t>Son</w:t>
+      </w:r>
+      <w:proofErr w:type="gramEnd"/>
     </w:p>
     <w:p>
       <w:pPr>
@@ -4491,7 +4602,15 @@
         <w:pStyle w:val="SPPrayerEnglish"/>
       </w:pPr>
       <w:r>
-        <w:t>Is now, and ever shall be.</w:t>
+        <w:t xml:space="preserve">Is </w:t>
+      </w:r>
+      <w:proofErr w:type="gramStart"/>
+      <w:r>
+        <w:t>now, and</w:t>
+      </w:r>
+      <w:proofErr w:type="gramEnd"/>
+      <w:r>
+        <w:t xml:space="preserve"> ever shall be.</w:t>
       </w:r>
     </w:p>
     <w:p>
@@ -4646,7 +4765,15 @@
         <w:pStyle w:val="SPScripture"/>
       </w:pPr>
       <w:r>
-        <w:t>“to him be glory in the Church and in Christ Jesus to all generations, for ever and ever. Amen.”</w:t>
+        <w:t>“</w:t>
+      </w:r>
+      <w:proofErr w:type="gramStart"/>
+      <w:r>
+        <w:t>to</w:t>
+      </w:r>
+      <w:proofErr w:type="gramEnd"/>
+      <w:r>
+        <w:t xml:space="preserve"> him be glory in the Church and in Christ Jesus to all generations, for ever and ever. Amen.”</w:t>
       </w:r>
     </w:p>
     <w:p>
@@ -4703,7 +4830,15 @@
         <w:pStyle w:val="SPScripture"/>
       </w:pPr>
       <w:r>
-        <w:t>“and from Jesus Christ the faithful witness, the first-born of the dead, and the ruler of kings on earth. To him who loves us and has freed us from our sins by his blood and made us a kingdom, priests to God and Father, to him be glory and dominion for ever and ever. Amen.”</w:t>
+        <w:t>“</w:t>
+      </w:r>
+      <w:proofErr w:type="gramStart"/>
+      <w:r>
+        <w:t>and</w:t>
+      </w:r>
+      <w:proofErr w:type="gramEnd"/>
+      <w:r>
+        <w:t xml:space="preserve"> from Jesus Christ the faithful witness, the first-born of the dead, and the ruler of kings on earth. To him who loves us and has freed us from our sins by his blood and made us a kingdom, priests to God and Father, to him be glory and dominion for ever and ever. Amen.”</w:t>
       </w:r>
     </w:p>
     <w:p>
@@ -4780,8 +4915,17 @@
           <w:b/>
           <w:bCs/>
         </w:rPr>
-        <w:t>Glory be to the Father</w:t>
-      </w:r>
+        <w:t xml:space="preserve">Glory be to the </w:t>
+      </w:r>
+      <w:proofErr w:type="gramStart"/>
+      <w:r>
+        <w:rPr>
+          <w:b/>
+          <w:bCs/>
+        </w:rPr>
+        <w:t>Father</w:t>
+      </w:r>
+      <w:proofErr w:type="gramEnd"/>
       <w:r>
         <w:t>, we turn our hearts towards the One from whom all things come.</w:t>
       </w:r>
@@ -4863,7 +5007,15 @@
         <w:pStyle w:val="SPBodyText"/>
       </w:pPr>
       <w:r>
-        <w:t>The Glory Be teaches us to lift our eyes beyond the noise of the moment and remember what is eternal.</w:t>
+        <w:t xml:space="preserve">The Glory </w:t>
+      </w:r>
+      <w:proofErr w:type="gramStart"/>
+      <w:r>
+        <w:t>Be</w:t>
+      </w:r>
+      <w:proofErr w:type="gramEnd"/>
+      <w:r>
+        <w:t xml:space="preserve"> teaches us to lift our eyes beyond the noise of the moment and remember what is eternal.</w:t>
       </w:r>
     </w:p>
     <w:p>
@@ -5145,7 +5297,23 @@
           <w:b/>
           <w:bCs/>
         </w:rPr>
-        <w:t>Glory be to the Father.</w:t>
+        <w:t xml:space="preserve">Glory be to the </w:t>
+      </w:r>
+      <w:proofErr w:type="gramStart"/>
+      <w:r>
+        <w:rPr>
+          <w:b/>
+          <w:bCs/>
+        </w:rPr>
+        <w:t>Father</w:t>
+      </w:r>
+      <w:proofErr w:type="gramEnd"/>
+      <w:r>
+        <w:rPr>
+          <w:b/>
+          <w:bCs/>
+        </w:rPr>
+        <w:t>.</w:t>
       </w:r>
     </w:p>
     <w:p>
@@ -5174,7 +5342,23 @@
           <w:b/>
           <w:bCs/>
         </w:rPr>
-        <w:t>And to the Son.</w:t>
+        <w:t xml:space="preserve">And to the </w:t>
+      </w:r>
+      <w:proofErr w:type="gramStart"/>
+      <w:r>
+        <w:rPr>
+          <w:b/>
+          <w:bCs/>
+        </w:rPr>
+        <w:t>Son</w:t>
+      </w:r>
+      <w:proofErr w:type="gramEnd"/>
+      <w:r>
+        <w:rPr>
+          <w:b/>
+          <w:bCs/>
+        </w:rPr>
+        <w:t>.</w:t>
       </w:r>
     </w:p>
     <w:p>
@@ -5397,8 +5581,17 @@
           <w:b/>
           <w:bCs/>
         </w:rPr>
-        <w:t>Glory Be</w:t>
-      </w:r>
+        <w:t xml:space="preserve">Glory </w:t>
+      </w:r>
+      <w:proofErr w:type="gramStart"/>
+      <w:r>
+        <w:rPr>
+          <w:b/>
+          <w:bCs/>
+        </w:rPr>
+        <w:t>Be</w:t>
+      </w:r>
+      <w:proofErr w:type="gramEnd"/>
       <w:r>
         <w:t xml:space="preserve"> t</w:t>
       </w:r>
@@ -5910,7 +6103,15 @@
         <w:pStyle w:val="SPBodyText"/>
       </w:pPr>
       <w:r>
-        <w:t>True contrition is more than regret for having done wrong. It is a turning of the heart back towards God — recognising His goodness and mercy, and desiring to live more faithfully in His presence.</w:t>
+        <w:t xml:space="preserve">True contrition is more than regret for having done wrong. It is a turning of the heart back towards God — recognising His goodness and </w:t>
+      </w:r>
+      <w:proofErr w:type="gramStart"/>
+      <w:r>
+        <w:t>mercy, and</w:t>
+      </w:r>
+      <w:proofErr w:type="gramEnd"/>
+      <w:r>
+        <w:t xml:space="preserve"> desiring to live more faithfully in His presence.</w:t>
       </w:r>
     </w:p>
     <w:p>
@@ -6199,7 +6400,15 @@
         <w:pStyle w:val="SPScripture"/>
       </w:pPr>
       <w:r>
-        <w:t>If we confess our sins, he is faithful and just, and will forgive our sins and cleanse us from all unrighteousness.</w:t>
+        <w:t xml:space="preserve">If we confess our sins, he is faithful and </w:t>
+      </w:r>
+      <w:proofErr w:type="gramStart"/>
+      <w:r>
+        <w:t>just, and</w:t>
+      </w:r>
+      <w:proofErr w:type="gramEnd"/>
+      <w:r>
+        <w:t xml:space="preserve"> will forgive our sins and cleanse us from all unrighteousness.</w:t>
       </w:r>
     </w:p>
     <w:p>
@@ -6803,7 +7012,15 @@
       </w:r>
       <w:r>
         <w:br/>
-        <w:t>He has raised up for us a mighty savior,</w:t>
+        <w:t xml:space="preserve">He has raised up for us a mighty </w:t>
+      </w:r>
+      <w:proofErr w:type="spellStart"/>
+      <w:r>
+        <w:t>savior</w:t>
+      </w:r>
+      <w:proofErr w:type="spellEnd"/>
+      <w:r>
+        <w:t>,</w:t>
       </w:r>
       <w:r>
         <w:br/>
@@ -7330,7 +7547,15 @@
         <w:spacing w:line="360" w:lineRule="auto"/>
       </w:pPr>
       <w:r>
-        <w:t>And you, child, will be called prophet of the Most High; for you will go before the Lord to prepare his ways, to give knowledge of salvation to his people in the forgiveness of their sins</w:t>
+        <w:t xml:space="preserve">And you, child, will be called prophet of the </w:t>
+      </w:r>
+      <w:proofErr w:type="gramStart"/>
+      <w:r>
+        <w:t>Most High</w:t>
+      </w:r>
+      <w:proofErr w:type="gramEnd"/>
+      <w:r>
+        <w:t>; for you will go before the Lord to prepare his ways, to give knowledge of salvation to his people in the forgiveness of their sins</w:t>
       </w:r>
       <w:r>
         <w:t xml:space="preserve">, through the tender mercy of our God, </w:t>
@@ -8596,7 +8821,15 @@
         <w:pStyle w:val="SPPrayerEnglish"/>
       </w:pPr>
       <w:r>
-        <w:t>for he has looked with favor on his lowly servant.</w:t>
+        <w:t xml:space="preserve">for he has looked with </w:t>
+      </w:r>
+      <w:proofErr w:type="spellStart"/>
+      <w:r>
+        <w:t>favor</w:t>
+      </w:r>
+      <w:proofErr w:type="spellEnd"/>
+      <w:r>
+        <w:t xml:space="preserve"> on his lowly servant.</w:t>
       </w:r>
       <w:r>
         <w:br/>
@@ -8966,13 +9199,21 @@
         <w:pStyle w:val="SPScripture"/>
       </w:pPr>
       <w:r>
-        <w:t>He has shown strength with his arm, he has scattered the proud in the imagination of their hearts, he has put down the mighty from their thrones</w:t>
+        <w:t xml:space="preserve">He has shown strength with his arm, he has scattered the proud in the imagination of their hearts, he has put down the mighty from their </w:t>
+      </w:r>
+      <w:proofErr w:type="gramStart"/>
+      <w:r>
+        <w:t>thrones</w:t>
       </w:r>
       <w:r>
         <w:t>,</w:t>
       </w:r>
       <w:r>
-        <w:t xml:space="preserve"> and exalted those of low degree; He has filled the hungry with good things, and the rich he has sent away empty. </w:t>
+        <w:t xml:space="preserve"> and</w:t>
+      </w:r>
+      <w:proofErr w:type="gramEnd"/>
+      <w:r>
+        <w:t xml:space="preserve"> exalted those of low degree; He has filled the hungry with good things, and the rich he has sent away empty. </w:t>
       </w:r>
     </w:p>
     <w:p>
@@ -11882,7 +12123,15 @@
         <w:t>Annunciation</w:t>
       </w:r>
       <w:r>
-        <w:t>, when the Angel Gabriel announced to Mary that she would become the Mother of the Son of God.</w:t>
+        <w:t xml:space="preserve">, when the Angel Gabriel announced to Mary that she would become the </w:t>
+      </w:r>
+      <w:proofErr w:type="gramStart"/>
+      <w:r>
+        <w:t>Mother</w:t>
+      </w:r>
+      <w:proofErr w:type="gramEnd"/>
+      <w:r>
+        <w:t xml:space="preserve"> of the Son of God.</w:t>
       </w:r>
     </w:p>
     <w:p>
@@ -11946,7 +12195,23 @@
           <w:b/>
           <w:bCs/>
         </w:rPr>
-        <w:t>“And the Word was made flesh, and dwelt among us.”</w:t>
+        <w:t xml:space="preserve">“And the Word was made </w:t>
+      </w:r>
+      <w:proofErr w:type="gramStart"/>
+      <w:r>
+        <w:rPr>
+          <w:b/>
+          <w:bCs/>
+        </w:rPr>
+        <w:t>flesh, and</w:t>
+      </w:r>
+      <w:proofErr w:type="gramEnd"/>
+      <w:r>
+        <w:rPr>
+          <w:b/>
+          <w:bCs/>
+        </w:rPr>
+        <w:t xml:space="preserve"> dwelt among us.”</w:t>
       </w:r>
     </w:p>
     <w:p>
@@ -12334,7 +12599,15 @@
         <w:pStyle w:val="SPPrayerEnglish"/>
       </w:pPr>
       <w:r>
-        <w:t xml:space="preserve">Pour forth, we beseech Thee, O Lord, Thy grace into our hearts, that we to whom the Incarnation of Christ, Thy Son, was made known by the message of an angel, may by His Passion and Cross be brought to the glory of His resurrection. Through the same Christ our Lord. </w:t>
+        <w:t xml:space="preserve">Pour forth, we beseech Thee, O Lord, </w:t>
+      </w:r>
+      <w:proofErr w:type="gramStart"/>
+      <w:r>
+        <w:t>Thy</w:t>
+      </w:r>
+      <w:proofErr w:type="gramEnd"/>
+      <w:r>
+        <w:t xml:space="preserve"> grace into our hearts, that we to whom the Incarnation of Christ, Thy Son, was made known by the message of an angel, may by His Passion and Cross be brought to the glory of His resurrection. Through the same Christ our Lord. </w:t>
       </w:r>
     </w:p>
     <w:p>
@@ -13142,7 +13415,15 @@
         <w:pStyle w:val="SPBodyText"/>
       </w:pPr>
       <w:r>
-        <w:t>Back to the truth that God is near.</w:t>
+        <w:t xml:space="preserve">Back to the truth that God is </w:t>
+      </w:r>
+      <w:proofErr w:type="gramStart"/>
+      <w:r>
+        <w:t>near</w:t>
+      </w:r>
+      <w:proofErr w:type="gramEnd"/>
+      <w:r>
+        <w:t>.</w:t>
       </w:r>
     </w:p>
     <w:p>
@@ -13862,7 +14143,15 @@
         <w:pStyle w:val="SPBodyText"/>
       </w:pPr>
       <w:r>
-        <w:t>The Anima Christi is a prayer of drawing near.</w:t>
+        <w:t xml:space="preserve">The Anima Christi is a prayer of drawing </w:t>
+      </w:r>
+      <w:proofErr w:type="gramStart"/>
+      <w:r>
+        <w:t>near</w:t>
+      </w:r>
+      <w:proofErr w:type="gramEnd"/>
+      <w:r>
+        <w:t>.</w:t>
       </w:r>
     </w:p>
     <w:p>
@@ -14517,7 +14806,15 @@
         </w:sectPr>
       </w:pPr>
       <w:r>
-        <w:t>The angel of the Lord encamps around those who fear him, and delivers them.</w:t>
+        <w:t xml:space="preserve">The angel of the Lord encamps around those who fear </w:t>
+      </w:r>
+      <w:proofErr w:type="gramStart"/>
+      <w:r>
+        <w:t>him, and</w:t>
+      </w:r>
+      <w:proofErr w:type="gramEnd"/>
+      <w:r>
+        <w:t xml:space="preserve"> delivers them.</w:t>
       </w:r>
     </w:p>
     <w:p>
@@ -15773,7 +16070,15 @@
         <w:pStyle w:val="SPScripture"/>
       </w:pPr>
       <w:r>
-        <w:t>Therefore God has highly exalted him and bestowed on him the name which is above every name, that at the name of Jesus every knee should bow, in heaven and on earth and under the earth, and every tongue confess that Jesus Christ is Lord, to the glory of God the father.</w:t>
+        <w:t xml:space="preserve">Therefore God has highly exalted him and bestowed on him the </w:t>
+      </w:r>
+      <w:proofErr w:type="gramStart"/>
+      <w:r>
+        <w:t>name</w:t>
+      </w:r>
+      <w:proofErr w:type="gramEnd"/>
+      <w:r>
+        <w:t xml:space="preserve"> which is above every name, that at the name of Jesus every knee should bow, in heaven and on earth and under the earth, and every tongue confess that Jesus Christ is Lord, to the glory of God the father.</w:t>
       </w:r>
     </w:p>
     <w:p>
@@ -15819,7 +16124,15 @@
         <w:t>I am the living bread which came down from heaven</w:t>
       </w:r>
       <w:r>
-        <w:t>; if any one eats of this bread, he will live forever; and the  bread which I shall give for the life of the world is my flesh.”</w:t>
+        <w:t xml:space="preserve">; if </w:t>
+      </w:r>
+      <w:proofErr w:type="gramStart"/>
+      <w:r>
+        <w:t>any one</w:t>
+      </w:r>
+      <w:proofErr w:type="gramEnd"/>
+      <w:r>
+        <w:t xml:space="preserve"> eats of this bread, he will live forever; and the  bread which I shall give for the life of the world is my flesh.”</w:t>
       </w:r>
     </w:p>
     <w:p>
@@ -16361,8 +16674,13 @@
       <w:pPr>
         <w:pStyle w:val="SPScripture"/>
       </w:pPr>
-      <w:r>
-        <w:t>Peace I leave with you; my peace I give to you; not as the world gives do I give to you. Let not your hearts be troubled, neither let them be afraid.</w:t>
+      <w:proofErr w:type="gramStart"/>
+      <w:r>
+        <w:t>Peace</w:t>
+      </w:r>
+      <w:proofErr w:type="gramEnd"/>
+      <w:r>
+        <w:t xml:space="preserve"> I leave with you; my peace I give to you; not as the world gives do I give to you. Let not your hearts be troubled, neither let them be afraid.</w:t>
       </w:r>
     </w:p>
     <w:p>
@@ -16804,6 +17122,33 @@
     <w:p>
       <w:pPr>
         <w:pStyle w:val="SPBodyText"/>
+      </w:pPr>
+      <w:r>
+        <w:t>T</w:t>
+      </w:r>
+      <w:r>
+        <w:t>he Church invokes Saint Michael the Archangel as a defender of God's people and a powerful witness to the victory of good over evil.</w:t>
+      </w:r>
+    </w:p>
+    <w:p>
+      <w:pPr>
+        <w:pStyle w:val="SPBodyText"/>
+      </w:pPr>
+      <w:r>
+        <w:t>This prayer does not place our trust in an angel instead of God. Rather, it asks Saint Michael to defend us by the power of God and to help us remain steadfast in faith when we encounter temptation, fear, or evil.</w:t>
+      </w:r>
+    </w:p>
+    <w:p>
+      <w:pPr>
+        <w:pStyle w:val="SPBodyText"/>
+      </w:pPr>
+      <w:r>
+        <w:t>In praying it, we are reminded that the Christian life is a spiritual battle, but one in which Christ has already won the victory.</w:t>
+      </w:r>
+    </w:p>
+    <w:p>
+      <w:pPr>
+        <w:pStyle w:val="SPBodyText"/>
         <w:sectPr>
           <w:type w:val="oddPage"/>
           <w:pgSz w:w="7920" w:h="12240" w:code="6"/>
@@ -16831,6 +17176,53 @@
       </w:pPr>
       <w:r>
         <w:tab/>
+      </w:r>
+    </w:p>
+    <w:p>
+      <w:pPr>
+        <w:pStyle w:val="SPPrayerEnglish"/>
+      </w:pPr>
+      <w:r>
+        <w:t>S</w:t>
+      </w:r>
+      <w:r>
+        <w:t>aint Michael the Archangel,</w:t>
+      </w:r>
+      <w:r>
+        <w:br/>
+        <w:t>be our protection against the wickedness and snares of the devil.</w:t>
+      </w:r>
+    </w:p>
+    <w:p>
+      <w:pPr>
+        <w:pStyle w:val="SPPrayerEnglish"/>
+      </w:pPr>
+      <w:r>
+        <w:t>May God rebuke him, we humbly pray;</w:t>
+      </w:r>
+      <w:r>
+        <w:br/>
+        <w:t>and do thou, O Prince of the heavenly host,</w:t>
+      </w:r>
+      <w:r>
+        <w:br/>
+        <w:t>by the power of God, cast into hell Satan</w:t>
+      </w:r>
+      <w:r>
+        <w:br/>
+        <w:t>and all the evil spirits who prowl about the world</w:t>
+      </w:r>
+      <w:r>
+        <w:br/>
+        <w:t>seeking the ruin of souls.</w:t>
+      </w:r>
+    </w:p>
+    <w:p>
+      <w:pPr>
+        <w:pStyle w:val="SPPrayerEnglish"/>
+      </w:pPr>
+      <w:r>
+        <w:t>Amen.</w:t>
       </w:r>
     </w:p>
     <w:p>
@@ -16873,13 +17265,43 @@
         <w:pStyle w:val="SPPrayerLatin"/>
       </w:pPr>
       <w:r>
-        <w:t xml:space="preserve"> </w:t>
+        <w:t>S</w:t>
+      </w:r>
+      <w:r>
+        <w:t>ancte Michael Archangele,</w:t>
+      </w:r>
+      <w:r>
+        <w:br/>
+        <w:t>defende nos in proelio;</w:t>
+      </w:r>
+      <w:r>
+        <w:br/>
+        <w:t>contra nequitiam et insidias diaboli esto praesidium.</w:t>
       </w:r>
     </w:p>
     <w:p>
       <w:pPr>
         <w:pStyle w:val="SPPrayerLatin"/>
       </w:pPr>
+      <w:r>
+        <w:t>Imperet illi Deus, supplices deprecamur;</w:t>
+      </w:r>
+      <w:r>
+        <w:br/>
+        <w:t>tuque, Princeps militiae caelestis,</w:t>
+      </w:r>
+      <w:r>
+        <w:br/>
+        <w:t>Satanam aliosque spiritus malignos,</w:t>
+      </w:r>
+      <w:r>
+        <w:br/>
+        <w:t>qui ad perditionem animarum pervagantur in mundo,</w:t>
+      </w:r>
+      <w:r>
+        <w:br/>
+        <w:t>divina virtute in infernum detrude.</w:t>
+      </w:r>
     </w:p>
     <w:p>
       <w:pPr>
@@ -16893,6 +17315,532 @@
           <w:docGrid w:linePitch="360"/>
         </w:sectPr>
       </w:pPr>
+      <w:r>
+        <w:t>Amen.</w:t>
+      </w:r>
+    </w:p>
+    <w:p>
+      <w:pPr>
+        <w:pStyle w:val="SPSectionTitle"/>
+      </w:pPr>
+      <w:r>
+        <w:lastRenderedPageBreak/>
+        <w:tab/>
+      </w:r>
+      <w:r>
+        <w:t>SCRIPTURE</w:t>
+      </w:r>
+    </w:p>
+    <w:p>
+      <w:pPr>
+        <w:pStyle w:val="SPScriptureReference"/>
+      </w:pPr>
+      <w:r>
+        <w:t>Daniel 10:12-13</w:t>
+      </w:r>
+    </w:p>
+    <w:p>
+      <w:pPr>
+        <w:pStyle w:val="SPScripture"/>
+      </w:pPr>
+      <w:r>
+        <w:t>Then he said to me, “Fear not, Daniel, for from the first day that you set your mind to understand and humbled yourself before your God, your words have been heard, and I have come because of your words. The prince of the kingdom of Persia withstood me twenty-one days; but Michael, one of the chief princes, came to help me, so I left him there with the prince of the kingdom of Persia.”</w:t>
+      </w:r>
+    </w:p>
+    <w:p>
+      <w:pPr>
+        <w:pStyle w:val="SPScriptureReference"/>
+      </w:pPr>
+      <w:r>
+        <w:t>Revelation 12:7-9</w:t>
+      </w:r>
+    </w:p>
+    <w:p>
+      <w:pPr>
+        <w:pStyle w:val="SPScripture"/>
+      </w:pPr>
+      <w:r>
+        <w:t>Now war arose in heaven, Michael and his angels fighting against the dragon; and the dragon and his angels fought, but they were defeated and there was no longer any place for them in heaven. And the great dragon was thrown down, that ancient serpent, who is called the Devil and Satan, the deceiver of the whole world – he was thrown down to the earth, and his angels were thrown down with him.</w:t>
+      </w:r>
+    </w:p>
+    <w:p>
+      <w:pPr>
+        <w:pStyle w:val="SPScriptureReference"/>
+      </w:pPr>
+      <w:r>
+        <w:t>Jude 1:9</w:t>
+      </w:r>
+    </w:p>
+    <w:p>
+      <w:pPr>
+        <w:pStyle w:val="SPScripture"/>
+      </w:pPr>
+      <w:r>
+        <w:t>But when the archangel Michael, contending with the devil, disputed about the body of Moses, he did not presume to pronounce a reviling judgement upon him, but said, “The Lord rebuke you.”</w:t>
+      </w:r>
+      <w:r>
+        <w:tab/>
+      </w:r>
+    </w:p>
+    <w:p>
+      <w:pPr>
+        <w:rPr>
+          <w:lang w:val="la-Latn"/>
+        </w:rPr>
+        <w:sectPr>
+          <w:type w:val="evenPage"/>
+          <w:pgSz w:w="7920" w:h="12240" w:code="6"/>
+          <w:pgMar w:top="1080" w:right="864" w:bottom="1080" w:left="1152" w:header="576" w:footer="576" w:gutter="0"/>
+          <w:cols w:space="720"/>
+          <w:titlePg/>
+          <w:docGrid w:linePitch="360"/>
+        </w:sectPr>
+      </w:pPr>
+    </w:p>
+    <w:p>
+      <w:pPr>
+        <w:pStyle w:val="SPSectionTitle"/>
+      </w:pPr>
+      <w:r>
+        <w:lastRenderedPageBreak/>
+        <w:t>REFLECTION</w:t>
+      </w:r>
+    </w:p>
+    <w:p>
+      <w:pPr>
+        <w:pStyle w:val="SPBodyText"/>
+        <w:rPr>
+          <w:b/>
+          <w:bCs/>
+        </w:rPr>
+      </w:pPr>
+      <w:r>
+        <w:rPr>
+          <w:b/>
+          <w:bCs/>
+        </w:rPr>
+        <w:t>The Battle Belongs to God</w:t>
+      </w:r>
+    </w:p>
+    <w:p>
+      <w:pPr>
+        <w:pStyle w:val="SPBodyText"/>
+      </w:pPr>
+      <w:r>
+        <w:t xml:space="preserve">The prayer to Saint Michael can initially seem very different from the quiet prayers that surround it. Its language is strong: protection, battle, evil, and the defence of souls. </w:t>
+      </w:r>
+    </w:p>
+    <w:p>
+      <w:pPr>
+        <w:pStyle w:val="SPBodyText"/>
+      </w:pPr>
+      <w:r>
+        <w:t xml:space="preserve">Yet at its heart is not fear, but </w:t>
+      </w:r>
+      <w:r>
+        <w:rPr>
+          <w:b/>
+          <w:bCs/>
+        </w:rPr>
+        <w:t>trust</w:t>
+      </w:r>
+      <w:r>
+        <w:t>.</w:t>
+      </w:r>
+    </w:p>
+    <w:p>
+      <w:pPr>
+        <w:pStyle w:val="SPBodyText"/>
+      </w:pPr>
+    </w:p>
+    <w:p>
+      <w:pPr>
+        <w:pStyle w:val="SPBodyText"/>
+      </w:pPr>
+      <w:r>
+        <w:t>Scripture presents Saint Michael as a defender of God's people. In Daniel, he comes to the aid of God's messenger. In Revelation, Michael and his angels stand against the dragon. And in the brief but striking passage from Jude, Michael contends with the devil but does not claim authority for himself.</w:t>
+      </w:r>
+    </w:p>
+    <w:p>
+      <w:pPr>
+        <w:pStyle w:val="SPBodyText"/>
+        <w:rPr>
+          <w:b/>
+          <w:bCs/>
+        </w:rPr>
+      </w:pPr>
+    </w:p>
+    <w:p>
+      <w:pPr>
+        <w:pStyle w:val="SPBodyText"/>
+      </w:pPr>
+      <w:r>
+        <w:rPr>
+          <w:b/>
+          <w:bCs/>
+        </w:rPr>
+        <w:t>“The Lord rebuke you.”</w:t>
+      </w:r>
+    </w:p>
+    <w:p>
+      <w:pPr>
+        <w:pStyle w:val="SPBodyText"/>
+      </w:pPr>
+    </w:p>
+    <w:p>
+      <w:pPr>
+        <w:pStyle w:val="SPBodyText"/>
+      </w:pPr>
+      <w:r>
+        <w:t>Those words are worth lingering over.</w:t>
+      </w:r>
+    </w:p>
+    <w:p>
+      <w:pPr>
+        <w:pStyle w:val="SPBodyText"/>
+      </w:pPr>
+      <w:r>
+        <w:t>Michael's strength is not independent of God. He does not rely upon his own power or boast of his authority. He places the matter in God's hands.</w:t>
+      </w:r>
+    </w:p>
+    <w:p>
+      <w:pPr>
+        <w:pStyle w:val="SPBodyText"/>
+      </w:pPr>
+      <w:r>
+        <w:t>This is an important lesson for us. There are battles in life that cannot be overcome by our own strength. We encounter temptation, fear, discouragement, anger, doubt, and those things that draw our hearts away from God. Sometimes the battle is obvious; sometimes it is hidden even from us.</w:t>
+      </w:r>
+    </w:p>
+    <w:p>
+      <w:pPr>
+        <w:pStyle w:val="SPBodyText"/>
+      </w:pPr>
+      <w:r>
+        <w:lastRenderedPageBreak/>
+        <w:t xml:space="preserve">The prayer to Saint Michael reminds us that </w:t>
+      </w:r>
+      <w:r>
+        <w:rPr>
+          <w:b/>
+          <w:bCs/>
+        </w:rPr>
+        <w:t>we are not expected to fight every battle alone</w:t>
+      </w:r>
+      <w:r>
+        <w:t>.</w:t>
+      </w:r>
+    </w:p>
+    <w:p>
+      <w:pPr>
+        <w:pStyle w:val="SPBodyText"/>
+      </w:pPr>
+      <w:r>
+        <w:t>To ask for Saint Michael's protection is ultimately to ask that God strengthen and defend us. It is to acknowledge that God's power is greater than anything that seeks to separate us from Him.</w:t>
+      </w:r>
+    </w:p>
+    <w:p>
+      <w:pPr>
+        <w:pStyle w:val="SPBodyText"/>
+      </w:pPr>
+      <w:r>
+        <w:t>And perhaps that is why this prayer need not be prayed only in moments of fear.</w:t>
+      </w:r>
+    </w:p>
+    <w:p>
+      <w:pPr>
+        <w:pStyle w:val="SPBodyText"/>
+      </w:pPr>
+      <w:r>
+        <w:t>It can be prayed before beginning a difficult day.</w:t>
+      </w:r>
+      <w:r>
+        <w:br/>
+        <w:t>Before entering a difficult situation.</w:t>
+      </w:r>
+      <w:r>
+        <w:br/>
+        <w:t>When temptation feels particularly strong.</w:t>
+      </w:r>
+      <w:r>
+        <w:br/>
+        <w:t>When we feel spiritually weary.</w:t>
+      </w:r>
+      <w:r>
+        <w:br/>
+        <w:t>Or simply when we need to remember whose side we are on.</w:t>
+      </w:r>
+    </w:p>
+    <w:p>
+      <w:pPr>
+        <w:pStyle w:val="SPBodyText"/>
+      </w:pPr>
+      <w:r>
+        <w:t xml:space="preserve">The Christian does not stand against evil because evil is stronger than us. </w:t>
+      </w:r>
+    </w:p>
+    <w:p>
+      <w:pPr>
+        <w:pStyle w:val="SPBodyText"/>
+      </w:pPr>
+    </w:p>
+    <w:p>
+      <w:pPr>
+        <w:pStyle w:val="SPBodyText"/>
+      </w:pPr>
+      <w:r>
+        <w:t xml:space="preserve">We stand because </w:t>
+      </w:r>
+      <w:r>
+        <w:rPr>
+          <w:b/>
+          <w:bCs/>
+        </w:rPr>
+        <w:t>God is stronger than evil</w:t>
+      </w:r>
+      <w:r>
+        <w:t>.</w:t>
+      </w:r>
+    </w:p>
+    <w:p>
+      <w:pPr>
+        <w:pStyle w:val="SPBodyText"/>
+      </w:pPr>
+    </w:p>
+    <w:p>
+      <w:pPr>
+        <w:pStyle w:val="SPBodyText"/>
+      </w:pPr>
+      <w:r>
+        <w:t xml:space="preserve">Saint Michael's example therefore teaches us both </w:t>
+      </w:r>
+      <w:r>
+        <w:rPr>
+          <w:b/>
+          <w:bCs/>
+        </w:rPr>
+        <w:t>courage and humility</w:t>
+      </w:r>
+      <w:r>
+        <w:t>: courage to stand firm, and humility to know that the victory belongs to God.</w:t>
+      </w:r>
+    </w:p>
+    <w:p>
+      <w:pPr>
+        <w:pStyle w:val="SPBodyText"/>
+      </w:pPr>
+      <w:r>
+        <w:t>When we pray:</w:t>
+      </w:r>
+    </w:p>
+    <w:p>
+      <w:pPr>
+        <w:pStyle w:val="SPBodyText"/>
+        <w:rPr>
+          <w:b/>
+          <w:bCs/>
+        </w:rPr>
+      </w:pPr>
+    </w:p>
+    <w:p>
+      <w:pPr>
+        <w:pStyle w:val="SPBodyText"/>
+      </w:pPr>
+      <w:r>
+        <w:rPr>
+          <w:b/>
+          <w:bCs/>
+        </w:rPr>
+        <w:t>Saint Michael the Archangel, be our protection...</w:t>
+      </w:r>
+    </w:p>
+    <w:p>
+      <w:pPr>
+        <w:pStyle w:val="SPBodyText"/>
+      </w:pPr>
+    </w:p>
+    <w:p>
+      <w:pPr>
+        <w:pStyle w:val="SPBodyText"/>
+      </w:pPr>
+      <w:r>
+        <w:t>we can place our fears, our struggles, and our weaknesses before God.</w:t>
+      </w:r>
+    </w:p>
+    <w:p>
+      <w:pPr>
+        <w:pStyle w:val="SPBodyText"/>
+      </w:pPr>
+      <w:r>
+        <w:lastRenderedPageBreak/>
+        <w:t>We do not need to be afraid.</w:t>
+      </w:r>
+    </w:p>
+    <w:p>
+      <w:pPr>
+        <w:pStyle w:val="SPBodyText"/>
+      </w:pPr>
+      <w:r>
+        <w:t>We need only to remain faithful, to seek God's grace, and to trust the One whose victory is already assured.</w:t>
+      </w:r>
+    </w:p>
+    <w:p>
+      <w:pPr>
+        <w:pStyle w:val="SPBodyText"/>
+        <w:rPr>
+          <w:b/>
+          <w:bCs/>
+        </w:rPr>
+      </w:pPr>
+    </w:p>
+    <w:p>
+      <w:pPr>
+        <w:pStyle w:val="SPBodyText"/>
+      </w:pPr>
+      <w:r>
+        <w:rPr>
+          <w:b/>
+          <w:bCs/>
+        </w:rPr>
+        <w:t>The battle belongs to God.</w:t>
+      </w:r>
+      <w:r>
+        <w:rPr>
+          <w:b/>
+          <w:bCs/>
+        </w:rPr>
+        <w:br/>
+        <w:t>Our task is to remain faithful.</w:t>
+      </w:r>
+      <w:r>
+        <w:rPr>
+          <w:b/>
+          <w:bCs/>
+        </w:rPr>
+        <w:br/>
+        <w:t>And in every struggle, we need not stand alone.</w:t>
+      </w:r>
+    </w:p>
+    <w:p>
+      <w:pPr>
+        <w:pStyle w:val="SPBodyText"/>
+        <w:sectPr>
+          <w:type w:val="oddPage"/>
+          <w:pgSz w:w="7920" w:h="12240" w:code="6"/>
+          <w:pgMar w:top="1080" w:right="864" w:bottom="1080" w:left="1152" w:header="576" w:footer="576" w:gutter="0"/>
+          <w:cols w:space="720"/>
+          <w:titlePg/>
+          <w:docGrid w:linePitch="360"/>
+        </w:sectPr>
+      </w:pPr>
+    </w:p>
+    <w:p>
+      <w:pPr>
+        <w:pStyle w:val="SPBodyText"/>
+        <w:jc w:val="center"/>
+        <w:rPr>
+          <w:rFonts w:ascii="Segoe UI Symbol" w:hAnsi="Segoe UI Symbol" w:cs="Segoe UI Symbol"/>
+        </w:rPr>
+      </w:pPr>
+      <w:r>
+        <w:rPr>
+          <w:rFonts w:ascii="Segoe UI Symbol" w:hAnsi="Segoe UI Symbol" w:cs="Segoe UI Symbol"/>
+        </w:rPr>
+        <w:lastRenderedPageBreak/>
+        <w:t>✠</w:t>
+      </w:r>
+    </w:p>
+    <w:p>
+      <w:pPr>
+        <w:pStyle w:val="SPPrayerTitle"/>
+      </w:pPr>
+      <w:r>
+        <w:t xml:space="preserve">Saint </w:t>
+      </w:r>
+      <w:r>
+        <w:t>benedict</w:t>
+      </w:r>
+    </w:p>
+    <w:p>
+      <w:pPr>
+        <w:pStyle w:val="SPBodyText"/>
+      </w:pPr>
+    </w:p>
+    <w:p>
+      <w:pPr>
+        <w:pStyle w:val="SPBodyText"/>
+      </w:pPr>
+      <w:r>
+        <w:rPr>
+          <w:b/>
+          <w:bCs/>
+        </w:rPr>
+        <w:t xml:space="preserve"> </w:t>
+      </w:r>
+    </w:p>
+    <w:p>
+      <w:pPr>
+        <w:pStyle w:val="SPBodyText"/>
+        <w:sectPr>
+          <w:type w:val="oddPage"/>
+          <w:pgSz w:w="7920" w:h="12240" w:code="6"/>
+          <w:pgMar w:top="1080" w:right="864" w:bottom="1080" w:left="1152" w:header="576" w:footer="576" w:gutter="0"/>
+          <w:cols w:space="720"/>
+          <w:titlePg/>
+          <w:docGrid w:linePitch="360"/>
+        </w:sectPr>
+      </w:pPr>
+    </w:p>
+    <w:p>
+      <w:pPr>
+        <w:pStyle w:val="SPLanguage"/>
+        <w:spacing w:before="200"/>
+      </w:pPr>
+      <w:r>
+        <w:lastRenderedPageBreak/>
+        <w:tab/>
+        <w:t>ENGLISH</w:t>
+      </w:r>
+    </w:p>
+    <w:p>
+      <w:pPr>
+        <w:pStyle w:val="SPPrayerEnglish"/>
+      </w:pPr>
+      <w:r>
+        <w:tab/>
+      </w:r>
+    </w:p>
+    <w:p>
+      <w:pPr>
+        <w:pStyle w:val="SPPrayerEnglish"/>
+        <w:sectPr>
+          <w:type w:val="evenPage"/>
+          <w:pgSz w:w="7920" w:h="12240" w:code="6"/>
+          <w:pgMar w:top="1080" w:right="864" w:bottom="1080" w:left="1152" w:header="576" w:footer="576" w:gutter="0"/>
+          <w:cols w:space="720"/>
+          <w:titlePg/>
+          <w:docGrid w:linePitch="360"/>
+        </w:sectPr>
+      </w:pPr>
+      <w:r>
+        <w:t xml:space="preserve"> </w:t>
+      </w:r>
+    </w:p>
+    <w:p>
+      <w:pPr>
+        <w:pStyle w:val="SPLanguage"/>
+        <w:sectPr>
+          <w:type w:val="oddPage"/>
+          <w:pgSz w:w="7920" w:h="12240" w:code="6"/>
+          <w:pgMar w:top="1080" w:right="864" w:bottom="1080" w:left="1152" w:header="576" w:footer="576" w:gutter="0"/>
+          <w:cols w:space="720"/>
+          <w:titlePg/>
+          <w:docGrid w:linePitch="360"/>
+        </w:sectPr>
+      </w:pPr>
+      <w:r>
+        <w:lastRenderedPageBreak/>
+        <w:t>LATIN</w:t>
+      </w:r>
     </w:p>
     <w:p>
       <w:pPr>
@@ -16905,11 +17853,84 @@
     </w:p>
     <w:p>
       <w:pPr>
+        <w:pStyle w:val="SPLanguage"/>
+      </w:pPr>
+    </w:p>
+    <w:p>
+      <w:pPr>
+        <w:pStyle w:val="SPPrayerLatin"/>
+        <w:rPr>
+          <w:b/>
+          <w:bCs/>
+          <w:lang w:val="en-ZA"/>
+        </w:rPr>
+      </w:pPr>
+    </w:p>
+    <w:p>
+      <w:pPr>
+        <w:pStyle w:val="SPPrayerLatin"/>
+      </w:pPr>
+      <w:r>
+        <w:t xml:space="preserve"> </w:t>
+      </w:r>
+    </w:p>
+    <w:p>
+      <w:pPr>
+        <w:pStyle w:val="SPPrayerLatin"/>
+      </w:pPr>
+    </w:p>
+    <w:p>
+      <w:pPr>
+        <w:pStyle w:val="SPPrayerLatin"/>
+        <w:sectPr>
+          <w:type w:val="evenPage"/>
+          <w:pgSz w:w="7920" w:h="12240" w:code="6"/>
+          <w:pgMar w:top="1080" w:right="864" w:bottom="1080" w:left="1152" w:header="576" w:footer="576" w:gutter="0"/>
+          <w:cols w:space="720"/>
+          <w:titlePg/>
+          <w:docGrid w:linePitch="360"/>
+        </w:sectPr>
+      </w:pPr>
+    </w:p>
+    <w:p>
+      <w:pPr>
+        <w:pStyle w:val="SPSectionTitle"/>
+      </w:pPr>
+      <w:r>
+        <w:lastRenderedPageBreak/>
+        <w:t>reflection</w:t>
+      </w:r>
+    </w:p>
+    <w:p>
+      <w:pPr>
         <w:pStyle w:val="SPScripture"/>
       </w:pPr>
       <w:r>
         <w:t xml:space="preserve"> </w:t>
       </w:r>
+    </w:p>
+    <w:p>
+      <w:pPr>
+        <w:pStyle w:val="SPSectionTitle"/>
+        <w:rPr>
+          <w:color w:val="333333"/>
+        </w:rPr>
+      </w:pPr>
+    </w:p>
+    <w:p>
+      <w:pPr>
+        <w:pStyle w:val="SPBodyText"/>
+      </w:pPr>
+    </w:p>
+    <w:p>
+      <w:pPr>
+        <w:pStyle w:val="SPBodyText"/>
+      </w:pPr>
+    </w:p>
+    <w:p>
+      <w:pPr>
+        <w:pStyle w:val="SPBodyText"/>
+      </w:pPr>
     </w:p>
     <w:p>
       <w:pPr>
@@ -16926,6 +17947,160 @@
     </w:p>
     <w:p>
       <w:pPr>
+        <w:pStyle w:val="SPBodyText"/>
+        <w:jc w:val="center"/>
+        <w:rPr>
+          <w:rFonts w:ascii="Segoe UI Symbol" w:hAnsi="Segoe UI Symbol" w:cs="Segoe UI Symbol"/>
+        </w:rPr>
+      </w:pPr>
+      <w:r>
+        <w:rPr>
+          <w:rFonts w:ascii="Segoe UI Symbol" w:hAnsi="Segoe UI Symbol" w:cs="Segoe UI Symbol"/>
+        </w:rPr>
+        <w:lastRenderedPageBreak/>
+        <w:t>✠</w:t>
+      </w:r>
+    </w:p>
+    <w:p>
+      <w:pPr>
+        <w:pStyle w:val="SPPrayerTitle"/>
+      </w:pPr>
+      <w:r>
+        <w:t xml:space="preserve">Saint </w:t>
+      </w:r>
+      <w:r>
+        <w:t>joseph</w:t>
+      </w:r>
+    </w:p>
+    <w:p>
+      <w:pPr>
+        <w:pStyle w:val="SPBodyText"/>
+      </w:pPr>
+      <w:r>
+        <w:rPr>
+          <w:b/>
+          <w:bCs/>
+        </w:rPr>
+        <w:t xml:space="preserve"> </w:t>
+      </w:r>
+    </w:p>
+    <w:p>
+      <w:pPr>
+        <w:pStyle w:val="SPBodyText"/>
+        <w:sectPr>
+          <w:type w:val="oddPage"/>
+          <w:pgSz w:w="7920" w:h="12240" w:code="6"/>
+          <w:pgMar w:top="1080" w:right="864" w:bottom="1080" w:left="1152" w:header="576" w:footer="576" w:gutter="0"/>
+          <w:cols w:space="720"/>
+          <w:titlePg/>
+          <w:docGrid w:linePitch="360"/>
+        </w:sectPr>
+      </w:pPr>
+    </w:p>
+    <w:p>
+      <w:pPr>
+        <w:pStyle w:val="SPLanguage"/>
+        <w:spacing w:before="200"/>
+      </w:pPr>
+      <w:r>
+        <w:lastRenderedPageBreak/>
+        <w:tab/>
+        <w:t>ENGLISH</w:t>
+      </w:r>
+    </w:p>
+    <w:p>
+      <w:pPr>
+        <w:pStyle w:val="SPPrayerEnglish"/>
+      </w:pPr>
+      <w:r>
+        <w:tab/>
+      </w:r>
+    </w:p>
+    <w:p>
+      <w:pPr>
+        <w:pStyle w:val="SPPrayerEnglish"/>
+        <w:sectPr>
+          <w:type w:val="evenPage"/>
+          <w:pgSz w:w="7920" w:h="12240" w:code="6"/>
+          <w:pgMar w:top="1080" w:right="864" w:bottom="1080" w:left="1152" w:header="576" w:footer="576" w:gutter="0"/>
+          <w:cols w:space="720"/>
+          <w:titlePg/>
+          <w:docGrid w:linePitch="360"/>
+        </w:sectPr>
+      </w:pPr>
+      <w:r>
+        <w:t xml:space="preserve"> </w:t>
+      </w:r>
+    </w:p>
+    <w:p>
+      <w:pPr>
+        <w:pStyle w:val="SPLanguage"/>
+        <w:sectPr>
+          <w:type w:val="oddPage"/>
+          <w:pgSz w:w="7920" w:h="12240" w:code="6"/>
+          <w:pgMar w:top="1080" w:right="864" w:bottom="1080" w:left="1152" w:header="576" w:footer="576" w:gutter="0"/>
+          <w:cols w:space="720"/>
+          <w:titlePg/>
+          <w:docGrid w:linePitch="360"/>
+        </w:sectPr>
+      </w:pPr>
+      <w:r>
+        <w:lastRenderedPageBreak/>
+        <w:t>LATIN</w:t>
+      </w:r>
+    </w:p>
+    <w:p>
+      <w:pPr>
+        <w:pStyle w:val="SPSectionTitle"/>
+      </w:pPr>
+      <w:r>
+        <w:lastRenderedPageBreak/>
+        <w:t>SCRIPTURE</w:t>
+      </w:r>
+    </w:p>
+    <w:p>
+      <w:pPr>
+        <w:pStyle w:val="SPLanguage"/>
+      </w:pPr>
+    </w:p>
+    <w:p>
+      <w:pPr>
+        <w:pStyle w:val="SPPrayerLatin"/>
+        <w:rPr>
+          <w:b/>
+          <w:bCs/>
+          <w:lang w:val="en-ZA"/>
+        </w:rPr>
+      </w:pPr>
+    </w:p>
+    <w:p>
+      <w:pPr>
+        <w:pStyle w:val="SPPrayerLatin"/>
+      </w:pPr>
+      <w:r>
+        <w:t xml:space="preserve"> </w:t>
+      </w:r>
+    </w:p>
+    <w:p>
+      <w:pPr>
+        <w:pStyle w:val="SPPrayerLatin"/>
+      </w:pPr>
+    </w:p>
+    <w:p>
+      <w:pPr>
+        <w:pStyle w:val="SPPrayerLatin"/>
+        <w:sectPr>
+          <w:type w:val="evenPage"/>
+          <w:pgSz w:w="7920" w:h="12240" w:code="6"/>
+          <w:pgMar w:top="1080" w:right="864" w:bottom="1080" w:left="1152" w:header="576" w:footer="576" w:gutter="0"/>
+          <w:cols w:space="720"/>
+          <w:titlePg/>
+          <w:docGrid w:linePitch="360"/>
+        </w:sectPr>
+      </w:pPr>
+    </w:p>
+    <w:p>
+      <w:pPr>
         <w:pStyle w:val="SPSectionTitle"/>
         <w:sectPr>
           <w:type w:val="oddPage"/>
@@ -16938,7 +18113,7 @@
       </w:pPr>
       <w:r>
         <w:lastRenderedPageBreak/>
-        <w:t>REFLECTION</w:t>
+        <w:t>reflection</w:t>
       </w:r>
     </w:p>
     <w:p>
@@ -16964,9 +18139,11 @@
       <w:r>
         <w:t xml:space="preserve">Saint </w:t>
       </w:r>
-      <w:r>
-        <w:t>benedict</w:t>
-      </w:r>
+      <w:proofErr w:type="spellStart"/>
+      <w:r>
+        <w:t>anthony</w:t>
+      </w:r>
+      <w:proofErr w:type="spellEnd"/>
     </w:p>
     <w:p>
       <w:pPr>
@@ -17098,46 +18275,6 @@
     <w:p>
       <w:pPr>
         <w:pStyle w:val="SPSectionTitle"/>
-      </w:pPr>
-      <w:r>
-        <w:lastRenderedPageBreak/>
-        <w:t>reflection</w:t>
-      </w:r>
-    </w:p>
-    <w:p>
-      <w:pPr>
-        <w:pStyle w:val="SPScripture"/>
-      </w:pPr>
-      <w:r>
-        <w:t xml:space="preserve"> </w:t>
-      </w:r>
-    </w:p>
-    <w:p>
-      <w:pPr>
-        <w:pStyle w:val="SPSectionTitle"/>
-        <w:rPr>
-          <w:color w:val="333333"/>
-        </w:rPr>
-      </w:pPr>
-    </w:p>
-    <w:p>
-      <w:pPr>
-        <w:pStyle w:val="SPBodyText"/>
-      </w:pPr>
-    </w:p>
-    <w:p>
-      <w:pPr>
-        <w:pStyle w:val="SPBodyText"/>
-      </w:pPr>
-    </w:p>
-    <w:p>
-      <w:pPr>
-        <w:pStyle w:val="SPBodyText"/>
-      </w:pPr>
-    </w:p>
-    <w:p>
-      <w:pPr>
-        <w:pStyle w:val="SPSectionTitle"/>
         <w:sectPr>
           <w:type w:val="oddPage"/>
           <w:pgSz w:w="7920" w:h="12240" w:code="6"/>
@@ -17147,6 +18284,10 @@
           <w:docGrid w:linePitch="360"/>
         </w:sectPr>
       </w:pPr>
+      <w:r>
+        <w:lastRenderedPageBreak/>
+        <w:t>reflection</w:t>
+      </w:r>
     </w:p>
     <w:p>
       <w:pPr>
@@ -17171,351 +18312,11 @@
       <w:r>
         <w:t xml:space="preserve">Saint </w:t>
       </w:r>
-      <w:r>
-        <w:t>joseph</w:t>
-      </w:r>
-    </w:p>
-    <w:p>
-      <w:pPr>
-        <w:pStyle w:val="SPBodyText"/>
-      </w:pPr>
-      <w:r>
-        <w:rPr>
-          <w:b/>
-          <w:bCs/>
-        </w:rPr>
-        <w:t xml:space="preserve"> </w:t>
-      </w:r>
-    </w:p>
-    <w:p>
-      <w:pPr>
-        <w:pStyle w:val="SPBodyText"/>
-        <w:sectPr>
-          <w:type w:val="oddPage"/>
-          <w:pgSz w:w="7920" w:h="12240" w:code="6"/>
-          <w:pgMar w:top="1080" w:right="864" w:bottom="1080" w:left="1152" w:header="576" w:footer="576" w:gutter="0"/>
-          <w:cols w:space="720"/>
-          <w:titlePg/>
-          <w:docGrid w:linePitch="360"/>
-        </w:sectPr>
-      </w:pPr>
-    </w:p>
-    <w:p>
-      <w:pPr>
-        <w:pStyle w:val="SPLanguage"/>
-        <w:spacing w:before="200"/>
-      </w:pPr>
-      <w:r>
-        <w:lastRenderedPageBreak/>
-        <w:tab/>
-        <w:t>ENGLISH</w:t>
-      </w:r>
-    </w:p>
-    <w:p>
-      <w:pPr>
-        <w:pStyle w:val="SPPrayerEnglish"/>
-      </w:pPr>
-      <w:r>
-        <w:tab/>
-      </w:r>
-    </w:p>
-    <w:p>
-      <w:pPr>
-        <w:pStyle w:val="SPPrayerEnglish"/>
-        <w:sectPr>
-          <w:type w:val="evenPage"/>
-          <w:pgSz w:w="7920" w:h="12240" w:code="6"/>
-          <w:pgMar w:top="1080" w:right="864" w:bottom="1080" w:left="1152" w:header="576" w:footer="576" w:gutter="0"/>
-          <w:cols w:space="720"/>
-          <w:titlePg/>
-          <w:docGrid w:linePitch="360"/>
-        </w:sectPr>
-      </w:pPr>
-      <w:r>
-        <w:t xml:space="preserve"> </w:t>
-      </w:r>
-    </w:p>
-    <w:p>
-      <w:pPr>
-        <w:pStyle w:val="SPLanguage"/>
-        <w:sectPr>
-          <w:type w:val="oddPage"/>
-          <w:pgSz w:w="7920" w:h="12240" w:code="6"/>
-          <w:pgMar w:top="1080" w:right="864" w:bottom="1080" w:left="1152" w:header="576" w:footer="576" w:gutter="0"/>
-          <w:cols w:space="720"/>
-          <w:titlePg/>
-          <w:docGrid w:linePitch="360"/>
-        </w:sectPr>
-      </w:pPr>
-      <w:r>
-        <w:lastRenderedPageBreak/>
-        <w:t>LATIN</w:t>
-      </w:r>
-    </w:p>
-    <w:p>
-      <w:pPr>
-        <w:pStyle w:val="SPSectionTitle"/>
-      </w:pPr>
-      <w:r>
-        <w:lastRenderedPageBreak/>
-        <w:t>SCRIPTURE</w:t>
-      </w:r>
-    </w:p>
-    <w:p>
-      <w:pPr>
-        <w:pStyle w:val="SPLanguage"/>
-      </w:pPr>
-    </w:p>
-    <w:p>
-      <w:pPr>
-        <w:pStyle w:val="SPPrayerLatin"/>
-        <w:rPr>
-          <w:b/>
-          <w:bCs/>
-          <w:lang w:val="en-ZA"/>
-        </w:rPr>
-      </w:pPr>
-    </w:p>
-    <w:p>
-      <w:pPr>
-        <w:pStyle w:val="SPPrayerLatin"/>
-      </w:pPr>
-      <w:r>
-        <w:t xml:space="preserve"> </w:t>
-      </w:r>
-    </w:p>
-    <w:p>
-      <w:pPr>
-        <w:pStyle w:val="SPPrayerLatin"/>
-      </w:pPr>
-    </w:p>
-    <w:p>
-      <w:pPr>
-        <w:pStyle w:val="SPPrayerLatin"/>
-        <w:sectPr>
-          <w:type w:val="evenPage"/>
-          <w:pgSz w:w="7920" w:h="12240" w:code="6"/>
-          <w:pgMar w:top="1080" w:right="864" w:bottom="1080" w:left="1152" w:header="576" w:footer="576" w:gutter="0"/>
-          <w:cols w:space="720"/>
-          <w:titlePg/>
-          <w:docGrid w:linePitch="360"/>
-        </w:sectPr>
-      </w:pPr>
-    </w:p>
-    <w:p>
-      <w:pPr>
-        <w:pStyle w:val="SPSectionTitle"/>
-        <w:sectPr>
-          <w:type w:val="oddPage"/>
-          <w:pgSz w:w="7920" w:h="12240" w:code="6"/>
-          <w:pgMar w:top="1080" w:right="864" w:bottom="1080" w:left="1152" w:header="576" w:footer="576" w:gutter="0"/>
-          <w:cols w:space="720"/>
-          <w:titlePg/>
-          <w:docGrid w:linePitch="360"/>
-        </w:sectPr>
-      </w:pPr>
-      <w:r>
-        <w:lastRenderedPageBreak/>
-        <w:t>reflection</w:t>
-      </w:r>
-    </w:p>
-    <w:p>
-      <w:pPr>
-        <w:pStyle w:val="SPBodyText"/>
-        <w:jc w:val="center"/>
-        <w:rPr>
-          <w:rFonts w:ascii="Segoe UI Symbol" w:hAnsi="Segoe UI Symbol" w:cs="Segoe UI Symbol"/>
-        </w:rPr>
-      </w:pPr>
-      <w:r>
-        <w:rPr>
-          <w:rFonts w:ascii="Segoe UI Symbol" w:hAnsi="Segoe UI Symbol" w:cs="Segoe UI Symbol"/>
-        </w:rPr>
-        <w:lastRenderedPageBreak/>
-        <w:t>✠</w:t>
-      </w:r>
-    </w:p>
-    <w:p>
-      <w:pPr>
-        <w:pStyle w:val="SPPrayerTitle"/>
-      </w:pPr>
-      <w:r>
-        <w:t xml:space="preserve">Saint </w:t>
-      </w:r>
-      <w:r>
-        <w:t>anthony</w:t>
-      </w:r>
-    </w:p>
-    <w:p>
-      <w:pPr>
-        <w:pStyle w:val="SPBodyText"/>
-      </w:pPr>
-      <w:r>
-        <w:rPr>
-          <w:b/>
-          <w:bCs/>
-        </w:rPr>
-        <w:t xml:space="preserve"> </w:t>
-      </w:r>
-    </w:p>
-    <w:p>
-      <w:pPr>
-        <w:pStyle w:val="SPBodyText"/>
-        <w:sectPr>
-          <w:type w:val="oddPage"/>
-          <w:pgSz w:w="7920" w:h="12240" w:code="6"/>
-          <w:pgMar w:top="1080" w:right="864" w:bottom="1080" w:left="1152" w:header="576" w:footer="576" w:gutter="0"/>
-          <w:cols w:space="720"/>
-          <w:titlePg/>
-          <w:docGrid w:linePitch="360"/>
-        </w:sectPr>
-      </w:pPr>
-    </w:p>
-    <w:p>
-      <w:pPr>
-        <w:pStyle w:val="SPLanguage"/>
-        <w:spacing w:before="200"/>
-      </w:pPr>
-      <w:r>
-        <w:lastRenderedPageBreak/>
-        <w:tab/>
-        <w:t>ENGLISH</w:t>
-      </w:r>
-    </w:p>
-    <w:p>
-      <w:pPr>
-        <w:pStyle w:val="SPPrayerEnglish"/>
-      </w:pPr>
-      <w:r>
-        <w:tab/>
-      </w:r>
-    </w:p>
-    <w:p>
-      <w:pPr>
-        <w:pStyle w:val="SPPrayerEnglish"/>
-        <w:sectPr>
-          <w:type w:val="evenPage"/>
-          <w:pgSz w:w="7920" w:h="12240" w:code="6"/>
-          <w:pgMar w:top="1080" w:right="864" w:bottom="1080" w:left="1152" w:header="576" w:footer="576" w:gutter="0"/>
-          <w:cols w:space="720"/>
-          <w:titlePg/>
-          <w:docGrid w:linePitch="360"/>
-        </w:sectPr>
-      </w:pPr>
-      <w:r>
-        <w:t xml:space="preserve"> </w:t>
-      </w:r>
-    </w:p>
-    <w:p>
-      <w:pPr>
-        <w:pStyle w:val="SPLanguage"/>
-        <w:sectPr>
-          <w:type w:val="oddPage"/>
-          <w:pgSz w:w="7920" w:h="12240" w:code="6"/>
-          <w:pgMar w:top="1080" w:right="864" w:bottom="1080" w:left="1152" w:header="576" w:footer="576" w:gutter="0"/>
-          <w:cols w:space="720"/>
-          <w:titlePg/>
-          <w:docGrid w:linePitch="360"/>
-        </w:sectPr>
-      </w:pPr>
-      <w:r>
-        <w:lastRenderedPageBreak/>
-        <w:t>LATIN</w:t>
-      </w:r>
-    </w:p>
-    <w:p>
-      <w:pPr>
-        <w:pStyle w:val="SPSectionTitle"/>
-      </w:pPr>
-      <w:r>
-        <w:lastRenderedPageBreak/>
-        <w:t>SCRIPTURE</w:t>
-      </w:r>
-    </w:p>
-    <w:p>
-      <w:pPr>
-        <w:pStyle w:val="SPLanguage"/>
-      </w:pPr>
-    </w:p>
-    <w:p>
-      <w:pPr>
-        <w:pStyle w:val="SPPrayerLatin"/>
-        <w:rPr>
-          <w:b/>
-          <w:bCs/>
-          <w:lang w:val="en-ZA"/>
-        </w:rPr>
-      </w:pPr>
-    </w:p>
-    <w:p>
-      <w:pPr>
-        <w:pStyle w:val="SPPrayerLatin"/>
-      </w:pPr>
-      <w:r>
-        <w:t xml:space="preserve"> </w:t>
-      </w:r>
-    </w:p>
-    <w:p>
-      <w:pPr>
-        <w:pStyle w:val="SPPrayerLatin"/>
-      </w:pPr>
-    </w:p>
-    <w:p>
-      <w:pPr>
-        <w:pStyle w:val="SPPrayerLatin"/>
-        <w:sectPr>
-          <w:type w:val="evenPage"/>
-          <w:pgSz w:w="7920" w:h="12240" w:code="6"/>
-          <w:pgMar w:top="1080" w:right="864" w:bottom="1080" w:left="1152" w:header="576" w:footer="576" w:gutter="0"/>
-          <w:cols w:space="720"/>
-          <w:titlePg/>
-          <w:docGrid w:linePitch="360"/>
-        </w:sectPr>
-      </w:pPr>
-    </w:p>
-    <w:p>
-      <w:pPr>
-        <w:pStyle w:val="SPSectionTitle"/>
-        <w:sectPr>
-          <w:type w:val="oddPage"/>
-          <w:pgSz w:w="7920" w:h="12240" w:code="6"/>
-          <w:pgMar w:top="1080" w:right="864" w:bottom="1080" w:left="1152" w:header="576" w:footer="576" w:gutter="0"/>
-          <w:cols w:space="720"/>
-          <w:titlePg/>
-          <w:docGrid w:linePitch="360"/>
-        </w:sectPr>
-      </w:pPr>
-      <w:r>
-        <w:lastRenderedPageBreak/>
-        <w:t>reflection</w:t>
-      </w:r>
-    </w:p>
-    <w:p>
-      <w:pPr>
-        <w:pStyle w:val="SPBodyText"/>
-        <w:jc w:val="center"/>
-        <w:rPr>
-          <w:rFonts w:ascii="Segoe UI Symbol" w:hAnsi="Segoe UI Symbol" w:cs="Segoe UI Symbol"/>
-        </w:rPr>
-      </w:pPr>
-      <w:r>
-        <w:rPr>
-          <w:rFonts w:ascii="Segoe UI Symbol" w:hAnsi="Segoe UI Symbol" w:cs="Segoe UI Symbol"/>
-        </w:rPr>
-        <w:lastRenderedPageBreak/>
-        <w:t>✠</w:t>
-      </w:r>
-    </w:p>
-    <w:p>
-      <w:pPr>
-        <w:pStyle w:val="SPPrayerTitle"/>
-      </w:pPr>
-      <w:r>
-        <w:t xml:space="preserve">Saint </w:t>
-      </w:r>
+      <w:proofErr w:type="spellStart"/>
       <w:r>
         <w:t>christopher</w:t>
       </w:r>
+      <w:proofErr w:type="spellEnd"/>
     </w:p>
     <w:p>
       <w:pPr>

</xml_diff>

<commit_message>
St Benedict Prayer completed.
</commit_message>
<xml_diff>
--- a/manuscript/volume-1/sacrae-preces-volume-1.docx
+++ b/manuscript/volume-1/sacrae-preces-volume-1.docx
@@ -1014,15 +1014,7 @@
         <w:pStyle w:val="SPBodyText"/>
       </w:pPr>
       <w:r>
-        <w:t xml:space="preserve">Perhaps there is a prayer you already know well. Perhaps there is one you have heard many times but never really considered. Perhaps you are looking for a prayer for a particular moment of the </w:t>
-      </w:r>
-      <w:proofErr w:type="gramStart"/>
-      <w:r>
-        <w:t>day, or</w:t>
-      </w:r>
-      <w:proofErr w:type="gramEnd"/>
-      <w:r>
-        <w:t xml:space="preserve"> simply looking for a few quiet minutes in which to turn your attention towards God.</w:t>
+        <w:t>Perhaps there is a prayer you already know well. Perhaps there is one you have heard many times but never really considered. Perhaps you are looking for a prayer for a particular moment of the day, or simply looking for a few quiet minutes in which to turn your attention towards God.</w:t>
       </w:r>
     </w:p>
     <w:p>
@@ -3072,15 +3064,7 @@
         <w:pStyle w:val="SPScripture"/>
       </w:pPr>
       <w:r>
-        <w:t xml:space="preserve">Our Father who art in heaven, </w:t>
-      </w:r>
-      <w:proofErr w:type="gramStart"/>
-      <w:r>
-        <w:t>Hallowed</w:t>
-      </w:r>
-      <w:proofErr w:type="gramEnd"/>
-      <w:r>
-        <w:t xml:space="preserve"> be thy name. Thy kingdom come</w:t>
+        <w:t>Our Father who art in heaven, Hallowed be thy name. Thy kingdom come</w:t>
       </w:r>
       <w:r>
         <w:t>.</w:t>
@@ -3125,21 +3109,13 @@
         <w:t xml:space="preserve"> </w:t>
       </w:r>
       <w:r>
-        <w:t xml:space="preserve">And lead us not into </w:t>
-      </w:r>
-      <w:proofErr w:type="gramStart"/>
-      <w:r>
-        <w:t xml:space="preserve">temptation, </w:t>
+        <w:t xml:space="preserve">And lead us not into temptation, </w:t>
       </w:r>
       <w:r>
         <w:t>b</w:t>
       </w:r>
       <w:r>
-        <w:t>ut</w:t>
-      </w:r>
-      <w:proofErr w:type="gramEnd"/>
-      <w:r>
-        <w:t xml:space="preserve"> deliver us from evil.</w:t>
+        <w:t>ut deliver us from evil.</w:t>
       </w:r>
       <w:r>
         <w:t>”</w:t>
@@ -3176,12 +3152,10 @@
         <w:t xml:space="preserve"> kingdom come. Give us each day our daily bread; and forgive us our sins, for we ourselves forgive </w:t>
       </w:r>
       <w:proofErr w:type="spellStart"/>
-      <w:proofErr w:type="gramStart"/>
       <w:r>
         <w:t>every one</w:t>
       </w:r>
       <w:proofErr w:type="spellEnd"/>
-      <w:proofErr w:type="gramEnd"/>
       <w:r>
         <w:t xml:space="preserve"> who is indebted to us; and lead us not into temptation.</w:t>
       </w:r>
@@ -3265,7 +3239,6 @@
       <w:r>
         <w:t xml:space="preserve">The first word is not </w:t>
       </w:r>
-      <w:proofErr w:type="gramStart"/>
       <w:r>
         <w:rPr>
           <w:i/>
@@ -3273,12 +3246,10 @@
         </w:rPr>
         <w:t>my</w:t>
       </w:r>
-      <w:proofErr w:type="gramEnd"/>
       <w:r>
         <w:t xml:space="preserve">. It is </w:t>
       </w:r>
       <w:proofErr w:type="spellStart"/>
-      <w:proofErr w:type="gramStart"/>
       <w:r>
         <w:rPr>
           <w:i/>
@@ -3287,7 +3258,6 @@
         <w:t>our</w:t>
       </w:r>
       <w:proofErr w:type="spellEnd"/>
-      <w:proofErr w:type="gramEnd"/>
       <w:r>
         <w:t>.</w:t>
       </w:r>
@@ -4557,15 +4527,7 @@
         <w:pStyle w:val="SPPrayerEnglish"/>
       </w:pPr>
       <w:r>
-        <w:t xml:space="preserve">Glory be to the </w:t>
-      </w:r>
-      <w:proofErr w:type="gramStart"/>
-      <w:r>
-        <w:t>Father</w:t>
-      </w:r>
-      <w:proofErr w:type="gramEnd"/>
-      <w:r>
-        <w:t>,</w:t>
+        <w:t>Glory be to the Father,</w:t>
       </w:r>
     </w:p>
     <w:p>
@@ -4573,13 +4535,8 @@
         <w:pStyle w:val="SPPrayerEnglish"/>
       </w:pPr>
       <w:r>
-        <w:t xml:space="preserve">And to the </w:t>
-      </w:r>
-      <w:proofErr w:type="gramStart"/>
-      <w:r>
-        <w:t>Son</w:t>
-      </w:r>
-      <w:proofErr w:type="gramEnd"/>
+        <w:t>And to the Son</w:t>
+      </w:r>
     </w:p>
     <w:p>
       <w:pPr>
@@ -4602,15 +4559,7 @@
         <w:pStyle w:val="SPPrayerEnglish"/>
       </w:pPr>
       <w:r>
-        <w:t xml:space="preserve">Is </w:t>
-      </w:r>
-      <w:proofErr w:type="gramStart"/>
-      <w:r>
-        <w:t>now, and</w:t>
-      </w:r>
-      <w:proofErr w:type="gramEnd"/>
-      <w:r>
-        <w:t xml:space="preserve"> ever shall be.</w:t>
+        <w:t>Is now, and ever shall be.</w:t>
       </w:r>
     </w:p>
     <w:p>
@@ -4765,15 +4714,7 @@
         <w:pStyle w:val="SPScripture"/>
       </w:pPr>
       <w:r>
-        <w:t>“</w:t>
-      </w:r>
-      <w:proofErr w:type="gramStart"/>
-      <w:r>
-        <w:t>to</w:t>
-      </w:r>
-      <w:proofErr w:type="gramEnd"/>
-      <w:r>
-        <w:t xml:space="preserve"> him be glory in the Church and in Christ Jesus to all generations, for ever and ever. Amen.”</w:t>
+        <w:t>“to him be glory in the Church and in Christ Jesus to all generations, for ever and ever. Amen.”</w:t>
       </w:r>
     </w:p>
     <w:p>
@@ -4830,15 +4771,7 @@
         <w:pStyle w:val="SPScripture"/>
       </w:pPr>
       <w:r>
-        <w:t>“</w:t>
-      </w:r>
-      <w:proofErr w:type="gramStart"/>
-      <w:r>
-        <w:t>and</w:t>
-      </w:r>
-      <w:proofErr w:type="gramEnd"/>
-      <w:r>
-        <w:t xml:space="preserve"> from Jesus Christ the faithful witness, the first-born of the dead, and the ruler of kings on earth. To him who loves us and has freed us from our sins by his blood and made us a kingdom, priests to God and Father, to him be glory and dominion for ever and ever. Amen.”</w:t>
+        <w:t>“and from Jesus Christ the faithful witness, the first-born of the dead, and the ruler of kings on earth. To him who loves us and has freed us from our sins by his blood and made us a kingdom, priests to God and Father, to him be glory and dominion for ever and ever. Amen.”</w:t>
       </w:r>
     </w:p>
     <w:p>
@@ -4915,17 +4848,8 @@
           <w:b/>
           <w:bCs/>
         </w:rPr>
-        <w:t xml:space="preserve">Glory be to the </w:t>
-      </w:r>
-      <w:proofErr w:type="gramStart"/>
-      <w:r>
-        <w:rPr>
-          <w:b/>
-          <w:bCs/>
-        </w:rPr>
-        <w:t>Father</w:t>
-      </w:r>
-      <w:proofErr w:type="gramEnd"/>
+        <w:t>Glory be to the Father</w:t>
+      </w:r>
       <w:r>
         <w:t>, we turn our hearts towards the One from whom all things come.</w:t>
       </w:r>
@@ -5007,15 +4931,7 @@
         <w:pStyle w:val="SPBodyText"/>
       </w:pPr>
       <w:r>
-        <w:t xml:space="preserve">The Glory </w:t>
-      </w:r>
-      <w:proofErr w:type="gramStart"/>
-      <w:r>
-        <w:t>Be</w:t>
-      </w:r>
-      <w:proofErr w:type="gramEnd"/>
-      <w:r>
-        <w:t xml:space="preserve"> teaches us to lift our eyes beyond the noise of the moment and remember what is eternal.</w:t>
+        <w:t>The Glory Be teaches us to lift our eyes beyond the noise of the moment and remember what is eternal.</w:t>
       </w:r>
     </w:p>
     <w:p>
@@ -5297,23 +5213,7 @@
           <w:b/>
           <w:bCs/>
         </w:rPr>
-        <w:t xml:space="preserve">Glory be to the </w:t>
-      </w:r>
-      <w:proofErr w:type="gramStart"/>
-      <w:r>
-        <w:rPr>
-          <w:b/>
-          <w:bCs/>
-        </w:rPr>
-        <w:t>Father</w:t>
-      </w:r>
-      <w:proofErr w:type="gramEnd"/>
-      <w:r>
-        <w:rPr>
-          <w:b/>
-          <w:bCs/>
-        </w:rPr>
-        <w:t>.</w:t>
+        <w:t>Glory be to the Father.</w:t>
       </w:r>
     </w:p>
     <w:p>
@@ -5342,23 +5242,7 @@
           <w:b/>
           <w:bCs/>
         </w:rPr>
-        <w:t xml:space="preserve">And to the </w:t>
-      </w:r>
-      <w:proofErr w:type="gramStart"/>
-      <w:r>
-        <w:rPr>
-          <w:b/>
-          <w:bCs/>
-        </w:rPr>
-        <w:t>Son</w:t>
-      </w:r>
-      <w:proofErr w:type="gramEnd"/>
-      <w:r>
-        <w:rPr>
-          <w:b/>
-          <w:bCs/>
-        </w:rPr>
-        <w:t>.</w:t>
+        <w:t>And to the Son.</w:t>
       </w:r>
     </w:p>
     <w:p>
@@ -5581,17 +5465,8 @@
           <w:b/>
           <w:bCs/>
         </w:rPr>
-        <w:t xml:space="preserve">Glory </w:t>
-      </w:r>
-      <w:proofErr w:type="gramStart"/>
-      <w:r>
-        <w:rPr>
-          <w:b/>
-          <w:bCs/>
-        </w:rPr>
-        <w:t>Be</w:t>
-      </w:r>
-      <w:proofErr w:type="gramEnd"/>
+        <w:t>Glory Be</w:t>
+      </w:r>
       <w:r>
         <w:t xml:space="preserve"> t</w:t>
       </w:r>
@@ -6103,15 +5978,7 @@
         <w:pStyle w:val="SPBodyText"/>
       </w:pPr>
       <w:r>
-        <w:t xml:space="preserve">True contrition is more than regret for having done wrong. It is a turning of the heart back towards God — recognising His goodness and </w:t>
-      </w:r>
-      <w:proofErr w:type="gramStart"/>
-      <w:r>
-        <w:t>mercy, and</w:t>
-      </w:r>
-      <w:proofErr w:type="gramEnd"/>
-      <w:r>
-        <w:t xml:space="preserve"> desiring to live more faithfully in His presence.</w:t>
+        <w:t>True contrition is more than regret for having done wrong. It is a turning of the heart back towards God — recognising His goodness and mercy, and desiring to live more faithfully in His presence.</w:t>
       </w:r>
     </w:p>
     <w:p>
@@ -6400,15 +6267,7 @@
         <w:pStyle w:val="SPScripture"/>
       </w:pPr>
       <w:r>
-        <w:t xml:space="preserve">If we confess our sins, he is faithful and </w:t>
-      </w:r>
-      <w:proofErr w:type="gramStart"/>
-      <w:r>
-        <w:t>just, and</w:t>
-      </w:r>
-      <w:proofErr w:type="gramEnd"/>
-      <w:r>
-        <w:t xml:space="preserve"> will forgive our sins and cleanse us from all unrighteousness.</w:t>
+        <w:t>If we confess our sins, he is faithful and just, and will forgive our sins and cleanse us from all unrighteousness.</w:t>
       </w:r>
     </w:p>
     <w:p>
@@ -7547,15 +7406,7 @@
         <w:spacing w:line="360" w:lineRule="auto"/>
       </w:pPr>
       <w:r>
-        <w:t xml:space="preserve">And you, child, will be called prophet of the </w:t>
-      </w:r>
-      <w:proofErr w:type="gramStart"/>
-      <w:r>
-        <w:t>Most High</w:t>
-      </w:r>
-      <w:proofErr w:type="gramEnd"/>
-      <w:r>
-        <w:t>; for you will go before the Lord to prepare his ways, to give knowledge of salvation to his people in the forgiveness of their sins</w:t>
+        <w:t>And you, child, will be called prophet of the Most High; for you will go before the Lord to prepare his ways, to give knowledge of salvation to his people in the forgiveness of their sins</w:t>
       </w:r>
       <w:r>
         <w:t xml:space="preserve">, through the tender mercy of our God, </w:t>
@@ -9199,21 +9050,13 @@
         <w:pStyle w:val="SPScripture"/>
       </w:pPr>
       <w:r>
-        <w:t xml:space="preserve">He has shown strength with his arm, he has scattered the proud in the imagination of their hearts, he has put down the mighty from their </w:t>
-      </w:r>
-      <w:proofErr w:type="gramStart"/>
-      <w:r>
-        <w:t>thrones</w:t>
+        <w:t>He has shown strength with his arm, he has scattered the proud in the imagination of their hearts, he has put down the mighty from their thrones</w:t>
       </w:r>
       <w:r>
         <w:t>,</w:t>
       </w:r>
       <w:r>
-        <w:t xml:space="preserve"> and</w:t>
-      </w:r>
-      <w:proofErr w:type="gramEnd"/>
-      <w:r>
-        <w:t xml:space="preserve"> exalted those of low degree; He has filled the hungry with good things, and the rich he has sent away empty. </w:t>
+        <w:t xml:space="preserve"> and exalted those of low degree; He has filled the hungry with good things, and the rich he has sent away empty. </w:t>
       </w:r>
     </w:p>
     <w:p>
@@ -12123,15 +11966,7 @@
         <w:t>Annunciation</w:t>
       </w:r>
       <w:r>
-        <w:t xml:space="preserve">, when the Angel Gabriel announced to Mary that she would become the </w:t>
-      </w:r>
-      <w:proofErr w:type="gramStart"/>
-      <w:r>
-        <w:t>Mother</w:t>
-      </w:r>
-      <w:proofErr w:type="gramEnd"/>
-      <w:r>
-        <w:t xml:space="preserve"> of the Son of God.</w:t>
+        <w:t>, when the Angel Gabriel announced to Mary that she would become the Mother of the Son of God.</w:t>
       </w:r>
     </w:p>
     <w:p>
@@ -12195,23 +12030,7 @@
           <w:b/>
           <w:bCs/>
         </w:rPr>
-        <w:t xml:space="preserve">“And the Word was made </w:t>
-      </w:r>
-      <w:proofErr w:type="gramStart"/>
-      <w:r>
-        <w:rPr>
-          <w:b/>
-          <w:bCs/>
-        </w:rPr>
-        <w:t>flesh, and</w:t>
-      </w:r>
-      <w:proofErr w:type="gramEnd"/>
-      <w:r>
-        <w:rPr>
-          <w:b/>
-          <w:bCs/>
-        </w:rPr>
-        <w:t xml:space="preserve"> dwelt among us.”</w:t>
+        <w:t>“And the Word was made flesh, and dwelt among us.”</w:t>
       </w:r>
     </w:p>
     <w:p>
@@ -12599,15 +12418,7 @@
         <w:pStyle w:val="SPPrayerEnglish"/>
       </w:pPr>
       <w:r>
-        <w:t xml:space="preserve">Pour forth, we beseech Thee, O Lord, </w:t>
-      </w:r>
-      <w:proofErr w:type="gramStart"/>
-      <w:r>
-        <w:t>Thy</w:t>
-      </w:r>
-      <w:proofErr w:type="gramEnd"/>
-      <w:r>
-        <w:t xml:space="preserve"> grace into our hearts, that we to whom the Incarnation of Christ, Thy Son, was made known by the message of an angel, may by His Passion and Cross be brought to the glory of His resurrection. Through the same Christ our Lord. </w:t>
+        <w:t xml:space="preserve">Pour forth, we beseech Thee, O Lord, Thy grace into our hearts, that we to whom the Incarnation of Christ, Thy Son, was made known by the message of an angel, may by His Passion and Cross be brought to the glory of His resurrection. Through the same Christ our Lord. </w:t>
       </w:r>
     </w:p>
     <w:p>
@@ -13415,15 +13226,7 @@
         <w:pStyle w:val="SPBodyText"/>
       </w:pPr>
       <w:r>
-        <w:t xml:space="preserve">Back to the truth that God is </w:t>
-      </w:r>
-      <w:proofErr w:type="gramStart"/>
-      <w:r>
-        <w:t>near</w:t>
-      </w:r>
-      <w:proofErr w:type="gramEnd"/>
-      <w:r>
-        <w:t>.</w:t>
+        <w:t>Back to the truth that God is near.</w:t>
       </w:r>
     </w:p>
     <w:p>
@@ -14143,15 +13946,7 @@
         <w:pStyle w:val="SPBodyText"/>
       </w:pPr>
       <w:r>
-        <w:t xml:space="preserve">The Anima Christi is a prayer of drawing </w:t>
-      </w:r>
-      <w:proofErr w:type="gramStart"/>
-      <w:r>
-        <w:t>near</w:t>
-      </w:r>
-      <w:proofErr w:type="gramEnd"/>
-      <w:r>
-        <w:t>.</w:t>
+        <w:t>The Anima Christi is a prayer of drawing near.</w:t>
       </w:r>
     </w:p>
     <w:p>
@@ -14806,15 +14601,7 @@
         </w:sectPr>
       </w:pPr>
       <w:r>
-        <w:t xml:space="preserve">The angel of the Lord encamps around those who fear </w:t>
-      </w:r>
-      <w:proofErr w:type="gramStart"/>
-      <w:r>
-        <w:t>him, and</w:t>
-      </w:r>
-      <w:proofErr w:type="gramEnd"/>
-      <w:r>
-        <w:t xml:space="preserve"> delivers them.</w:t>
+        <w:t>The angel of the Lord encamps around those who fear him, and delivers them.</w:t>
       </w:r>
     </w:p>
     <w:p>
@@ -16070,15 +15857,7 @@
         <w:pStyle w:val="SPScripture"/>
       </w:pPr>
       <w:r>
-        <w:t xml:space="preserve">Therefore God has highly exalted him and bestowed on him the </w:t>
-      </w:r>
-      <w:proofErr w:type="gramStart"/>
-      <w:r>
-        <w:t>name</w:t>
-      </w:r>
-      <w:proofErr w:type="gramEnd"/>
-      <w:r>
-        <w:t xml:space="preserve"> which is above every name, that at the name of Jesus every knee should bow, in heaven and on earth and under the earth, and every tongue confess that Jesus Christ is Lord, to the glory of God the father.</w:t>
+        <w:t>Therefore God has highly exalted him and bestowed on him the name which is above every name, that at the name of Jesus every knee should bow, in heaven and on earth and under the earth, and every tongue confess that Jesus Christ is Lord, to the glory of God the father.</w:t>
       </w:r>
     </w:p>
     <w:p>
@@ -16124,15 +15903,7 @@
         <w:t>I am the living bread which came down from heaven</w:t>
       </w:r>
       <w:r>
-        <w:t xml:space="preserve">; if </w:t>
-      </w:r>
-      <w:proofErr w:type="gramStart"/>
-      <w:r>
-        <w:t>any one</w:t>
-      </w:r>
-      <w:proofErr w:type="gramEnd"/>
-      <w:r>
-        <w:t xml:space="preserve"> eats of this bread, he will live forever; and the  bread which I shall give for the life of the world is my flesh.”</w:t>
+        <w:t>; if any one eats of this bread, he will live forever; and the  bread which I shall give for the life of the world is my flesh.”</w:t>
       </w:r>
     </w:p>
     <w:p>
@@ -16674,13 +16445,8 @@
       <w:pPr>
         <w:pStyle w:val="SPScripture"/>
       </w:pPr>
-      <w:proofErr w:type="gramStart"/>
-      <w:r>
-        <w:t>Peace</w:t>
-      </w:r>
-      <w:proofErr w:type="gramEnd"/>
-      <w:r>
-        <w:t xml:space="preserve"> I leave with you; my peace I give to you; not as the world gives do I give to you. Let not your hearts be troubled, neither let them be afraid.</w:t>
+      <w:r>
+        <w:t>Peace I leave with you; my peace I give to you; not as the world gives do I give to you. Let not your hearts be troubled, neither let them be afraid.</w:t>
       </w:r>
     </w:p>
     <w:p>
@@ -17764,6 +17530,71 @@
       <w:pPr>
         <w:pStyle w:val="SPBodyText"/>
       </w:pPr>
+      <w:r>
+        <w:t>Saint Benedict is remembered as a model of Christian virtue, humility, obedience, and steadfast faith. His life and Rule have shaped Christian monasticism for centuries, while devotion to him has also become closely associated with protection from evil and temptation.</w:t>
+      </w:r>
+    </w:p>
+    <w:p>
+      <w:pPr>
+        <w:pStyle w:val="SPBodyText"/>
+      </w:pPr>
+    </w:p>
+    <w:p>
+      <w:pPr>
+        <w:pStyle w:val="SPBodyText"/>
+      </w:pPr>
+      <w:r>
+        <w:t>The familiar words associated with the Medal of Saint Benedict express this confidence:</w:t>
+      </w:r>
+    </w:p>
+    <w:p>
+      <w:pPr>
+        <w:pStyle w:val="SPBodyText"/>
+        <w:rPr>
+          <w:b/>
+          <w:bCs/>
+        </w:rPr>
+      </w:pPr>
+    </w:p>
+    <w:p>
+      <w:pPr>
+        <w:pStyle w:val="SPBodyText"/>
+      </w:pPr>
+      <w:r>
+        <w:rPr>
+          <w:b/>
+          <w:bCs/>
+        </w:rPr>
+        <w:t>Crux sacra sit mihi lux.</w:t>
+      </w:r>
+      <w:r>
+        <w:br/>
+      </w:r>
+      <w:r>
+        <w:rPr>
+          <w:i/>
+          <w:iCs/>
+        </w:rPr>
+        <w:t>May the Holy Cross be my light.</w:t>
+      </w:r>
+    </w:p>
+    <w:p>
+      <w:pPr>
+        <w:pStyle w:val="SPBodyText"/>
+      </w:pPr>
+    </w:p>
+    <w:p>
+      <w:pPr>
+        <w:pStyle w:val="SPBodyText"/>
+      </w:pPr>
+      <w:r>
+        <w:t>The prayers that follow ask, through the intercession of Saint Benedict, for the grace to remain faithful to Christ, resist temptation, grow in virtue, and trust in God's providence.</w:t>
+      </w:r>
+    </w:p>
+    <w:p>
+      <w:pPr>
+        <w:pStyle w:val="SPBodyText"/>
+      </w:pPr>
     </w:p>
     <w:p>
       <w:pPr>
@@ -17807,6 +17638,92 @@
       </w:pPr>
       <w:r>
         <w:tab/>
+      </w:r>
+    </w:p>
+    <w:p>
+      <w:pPr>
+        <w:pStyle w:val="SPPrayerEnglish"/>
+      </w:pPr>
+      <w:r>
+        <w:t>O glorious Saint Benedict,</w:t>
+      </w:r>
+      <w:r>
+        <w:br/>
+      </w:r>
+      <w:r>
+        <w:t>sublime model of all virtues,</w:t>
+      </w:r>
+      <w:r>
+        <w:br/>
+        <w:t>pure vessel of God's grace,</w:t>
+      </w:r>
+      <w:r>
+        <w:br/>
+        <w:t>I humbly kneel before you.</w:t>
+      </w:r>
+    </w:p>
+    <w:p>
+      <w:pPr>
+        <w:pStyle w:val="SPPrayerEnglish"/>
+      </w:pPr>
+      <w:r>
+        <w:t>I ask you, in your loving kindness,</w:t>
+      </w:r>
+      <w:r>
+        <w:br/>
+        <w:t>to pray for me before the throne of God.</w:t>
+      </w:r>
+    </w:p>
+    <w:p>
+      <w:pPr>
+        <w:pStyle w:val="SPPrayerEnglish"/>
+      </w:pPr>
+      <w:r>
+        <w:t>To you I have recourse</w:t>
+      </w:r>
+      <w:r>
+        <w:br/>
+        <w:t>in the dangers that surround me each day.</w:t>
+      </w:r>
+      <w:r>
+        <w:br/>
+        <w:t>Shield me against my enemies</w:t>
+      </w:r>
+      <w:r>
+        <w:br/>
+        <w:t>and inspire me to imitate you in all things.</w:t>
+      </w:r>
+    </w:p>
+    <w:p>
+      <w:pPr>
+        <w:pStyle w:val="SPPrayerEnglish"/>
+      </w:pPr>
+      <w:r>
+        <w:t>May your blessing be with me always,</w:t>
+      </w:r>
+      <w:r>
+        <w:br/>
+        <w:t>so that I may shun whatever God forbids</w:t>
+      </w:r>
+      <w:r>
+        <w:br/>
+        <w:t>and avoid the occasions of sin.</w:t>
+      </w:r>
+    </w:p>
+    <w:p>
+      <w:pPr>
+        <w:pStyle w:val="SPPrayerEnglish"/>
+      </w:pPr>
+      <w:r>
+        <w:t>Obtain for me from God</w:t>
+      </w:r>
+      <w:r>
+        <w:br/>
+        <w:t>the graces I need in the trials,</w:t>
+      </w:r>
+      <w:r>
+        <w:br/>
+        <w:t>difficulties, and afflictions of life.</w:t>
       </w:r>
     </w:p>
     <w:p>
@@ -17821,8 +17738,106 @@
           <w:docGrid w:linePitch="360"/>
         </w:sectPr>
       </w:pPr>
-      <w:r>
-        <w:t xml:space="preserve"> </w:t>
+    </w:p>
+    <w:p>
+      <w:pPr>
+        <w:pStyle w:val="SPLanguage"/>
+      </w:pPr>
+      <w:r>
+        <w:lastRenderedPageBreak/>
+        <w:t>LATIN</w:t>
+      </w:r>
+    </w:p>
+    <w:p>
+      <w:pPr>
+        <w:pStyle w:val="SPLanguage"/>
+      </w:pPr>
+      <w:r>
+        <w:t>(Note this is a Latin rendering of the English Prayer, as there is no traditional Latin prayer).</w:t>
+      </w:r>
+    </w:p>
+    <w:p>
+      <w:pPr>
+        <w:pStyle w:val="SPPrayerLatin"/>
+      </w:pPr>
+      <w:r>
+        <w:t>O glorióse Sancte Benedicte,</w:t>
+      </w:r>
+      <w:r>
+        <w:br/>
+        <w:t>sublime exemplar omnium virtutum,</w:t>
+      </w:r>
+      <w:r>
+        <w:br/>
+        <w:t>vas gratiae Dei purissimum,</w:t>
+      </w:r>
+      <w:r>
+        <w:br/>
+        <w:t>humiliter ante te genibus flexis adsto.</w:t>
+      </w:r>
+    </w:p>
+    <w:p>
+      <w:pPr>
+        <w:pStyle w:val="SPPrayerLatin"/>
+      </w:pPr>
+      <w:r>
+        <w:t>Te, benignissime, oro,</w:t>
+      </w:r>
+      <w:r>
+        <w:br/>
+        <w:t>ut pro me apud thronum Dei intercedere digneris.</w:t>
+      </w:r>
+    </w:p>
+    <w:p>
+      <w:pPr>
+        <w:pStyle w:val="SPPrayerLatin"/>
+      </w:pPr>
+      <w:r>
+        <w:t>Ad te confugio in periculis</w:t>
+      </w:r>
+      <w:r>
+        <w:br/>
+        <w:t>quae me cotidie circumdant.</w:t>
+      </w:r>
+      <w:r>
+        <w:br/>
+        <w:t>Defende me ab inimicis meis</w:t>
+      </w:r>
+      <w:r>
+        <w:br/>
+        <w:t>et inspira mihi ut te in omnibus imitari studeam.</w:t>
+      </w:r>
+    </w:p>
+    <w:p>
+      <w:pPr>
+        <w:pStyle w:val="SPPrayerLatin"/>
+      </w:pPr>
+      <w:r>
+        <w:t>Sit benedictio tua semper mecum,</w:t>
+      </w:r>
+      <w:r>
+        <w:br/>
+        <w:t>ut quidquid Deus vetat vitare valeam</w:t>
+      </w:r>
+      <w:r>
+        <w:br/>
+        <w:t>et occasiones peccandi fugiam.</w:t>
+      </w:r>
+    </w:p>
+    <w:p>
+      <w:pPr>
+        <w:pStyle w:val="SPPrayerLatin"/>
+      </w:pPr>
+      <w:r>
+        <w:t>Impetrā mihi a Deo</w:t>
+      </w:r>
+      <w:r>
+        <w:br/>
+        <w:t>gratias quibus indigeo</w:t>
+      </w:r>
+      <w:r>
+        <w:br/>
+        <w:t>in tribulationibus, difficultatibus et afflictionibus vitae.</w:t>
       </w:r>
     </w:p>
     <w:p>
@@ -17837,6 +17852,63 @@
           <w:docGrid w:linePitch="360"/>
         </w:sectPr>
       </w:pPr>
+    </w:p>
+    <w:p>
+      <w:pPr>
+        <w:pStyle w:val="SPPrayerEnglish"/>
+        <w:spacing w:before="240"/>
+      </w:pPr>
+      <w:r>
+        <w:lastRenderedPageBreak/>
+        <w:t>ENGLISH</w:t>
+      </w:r>
+    </w:p>
+    <w:p>
+      <w:pPr>
+        <w:pStyle w:val="SPPrayerEnglish"/>
+      </w:pPr>
+      <w:r>
+        <w:t>Help me to remain faithful to Christ,</w:t>
+      </w:r>
+      <w:r>
+        <w:br/>
+        <w:t>to grow in humility and virtue,</w:t>
+      </w:r>
+      <w:r>
+        <w:br/>
+        <w:t>and to trust always in God's providence.</w:t>
+      </w:r>
+    </w:p>
+    <w:p>
+      <w:pPr>
+        <w:pStyle w:val="SPPrayerEnglish"/>
+      </w:pPr>
+      <w:r>
+        <w:t>Amen.</w:t>
+      </w:r>
+    </w:p>
+    <w:p>
+      <w:pPr>
+        <w:pStyle w:val="SPPrayerEnglish"/>
+      </w:pPr>
+    </w:p>
+    <w:p>
+      <w:pPr>
+        <w:pStyle w:val="SPLanguage"/>
+        <w:sectPr>
+          <w:type w:val="evenPage"/>
+          <w:pgSz w:w="7920" w:h="12240" w:code="6"/>
+          <w:pgMar w:top="1080" w:right="864" w:bottom="1080" w:left="1152" w:header="576" w:footer="576" w:gutter="0"/>
+          <w:cols w:space="720"/>
+          <w:titlePg/>
+          <w:docGrid w:linePitch="360"/>
+        </w:sectPr>
+      </w:pPr>
+    </w:p>
+    <w:p>
+      <w:pPr>
+        <w:pStyle w:val="SPLanguage"/>
+      </w:pPr>
       <w:r>
         <w:lastRenderedPageBreak/>
         <w:t>LATIN</w:t>
@@ -17844,6 +17916,43 @@
     </w:p>
     <w:p>
       <w:pPr>
+        <w:pStyle w:val="SPPrayerLatin"/>
+      </w:pPr>
+      <w:r>
+        <w:t>Adiuva me ut Christo fidelis permaneam,</w:t>
+      </w:r>
+      <w:r>
+        <w:br/>
+        <w:t>in humilitate et virtute crescam,</w:t>
+      </w:r>
+      <w:r>
+        <w:br/>
+        <w:t>atque semper divinae providentiae confidam.</w:t>
+      </w:r>
+    </w:p>
+    <w:p>
+      <w:pPr>
+        <w:pStyle w:val="SPPrayerLatin"/>
+      </w:pPr>
+      <w:r>
+        <w:t>Amen.</w:t>
+      </w:r>
+    </w:p>
+    <w:p>
+      <w:pPr>
+        <w:pStyle w:val="SPLanguage"/>
+        <w:sectPr>
+          <w:type w:val="oddPage"/>
+          <w:pgSz w:w="7920" w:h="12240" w:code="6"/>
+          <w:pgMar w:top="1080" w:right="864" w:bottom="1080" w:left="1152" w:header="576" w:footer="576" w:gutter="0"/>
+          <w:cols w:space="720"/>
+          <w:titlePg/>
+          <w:docGrid w:linePitch="360"/>
+        </w:sectPr>
+      </w:pPr>
+    </w:p>
+    <w:p>
+      <w:pPr>
         <w:pStyle w:val="SPSectionTitle"/>
       </w:pPr>
       <w:r>
@@ -17853,8 +17962,70 @@
     </w:p>
     <w:p>
       <w:pPr>
-        <w:pStyle w:val="SPLanguage"/>
-      </w:pPr>
+        <w:pStyle w:val="SPScriptureReference"/>
+      </w:pPr>
+      <w:r>
+        <w:t>Matthew 4:10</w:t>
+      </w:r>
+    </w:p>
+    <w:p>
+      <w:pPr>
+        <w:pStyle w:val="SPScripture"/>
+      </w:pPr>
+      <w:r>
+        <w:t>Then Jesus said to him, “Begone, Satan! for it is written, ‘You shall worship the Lord your God and him only shall you serve.’”</w:t>
+      </w:r>
+    </w:p>
+    <w:p>
+      <w:pPr>
+        <w:pStyle w:val="SPScriptureReference"/>
+      </w:pPr>
+      <w:r>
+        <w:t>James 4:7</w:t>
+      </w:r>
+    </w:p>
+    <w:p>
+      <w:pPr>
+        <w:pStyle w:val="SPScripture"/>
+      </w:pPr>
+      <w:r>
+        <w:t>Submit yourselves therefore to God. Resist the devil and he will flee from you.</w:t>
+      </w:r>
+    </w:p>
+    <w:p>
+      <w:pPr>
+        <w:pStyle w:val="SPScriptureReference"/>
+      </w:pPr>
+      <w:r>
+        <w:t>1 Peter 5:8-9</w:t>
+      </w:r>
+    </w:p>
+    <w:p>
+      <w:pPr>
+        <w:pStyle w:val="SPScripture"/>
+      </w:pPr>
+      <w:r>
+        <w:t>Be sober, be watchful. Your adversary the devil prowls around like a roaring lion, seeking someone to devour. Resist him, firm in your faith, knowing that the same experience of suffering is required of your brotherhood throughout the world.</w:t>
+      </w:r>
+    </w:p>
+    <w:p>
+      <w:pPr>
+        <w:pStyle w:val="SPScriptureReference"/>
+      </w:pPr>
+      <w:r>
+        <w:t>Philippians</w:t>
+      </w:r>
+      <w:r>
+        <w:t xml:space="preserve"> 4:13</w:t>
+      </w:r>
+    </w:p>
+    <w:p>
+      <w:pPr>
+        <w:pStyle w:val="SPScripture"/>
+      </w:pPr>
+      <w:r>
+        <w:t>I can do all things in him who strengthens me.</w:t>
+      </w:r>
     </w:p>
     <w:p>
       <w:pPr>
@@ -17903,19 +18074,246 @@
     </w:p>
     <w:p>
       <w:pPr>
-        <w:pStyle w:val="SPScripture"/>
+        <w:pStyle w:val="SPBodyText"/>
+        <w:rPr>
+          <w:b/>
+          <w:bCs/>
+        </w:rPr>
       </w:pPr>
       <w:r>
         <w:t xml:space="preserve"> </w:t>
       </w:r>
-    </w:p>
-    <w:p>
-      <w:pPr>
-        <w:pStyle w:val="SPSectionTitle"/>
-        <w:rPr>
-          <w:color w:val="333333"/>
-        </w:rPr>
-      </w:pPr>
+      <w:r>
+        <w:rPr>
+          <w:b/>
+          <w:bCs/>
+        </w:rPr>
+        <w:t>The Cross as Our Light</w:t>
+      </w:r>
+    </w:p>
+    <w:p>
+      <w:pPr>
+        <w:pStyle w:val="SPBodyText"/>
+      </w:pPr>
+      <w:r>
+        <w:t>There is something striking about the traditional words associated with Saint Benedict:</w:t>
+      </w:r>
+    </w:p>
+    <w:p>
+      <w:pPr>
+        <w:pStyle w:val="SPBodyText"/>
+        <w:rPr>
+          <w:b/>
+          <w:bCs/>
+        </w:rPr>
+      </w:pPr>
+    </w:p>
+    <w:p>
+      <w:pPr>
+        <w:pStyle w:val="SPBodyText"/>
+      </w:pPr>
+      <w:r>
+        <w:rPr>
+          <w:b/>
+          <w:bCs/>
+        </w:rPr>
+        <w:t>Crux sacra sit mihi lux.</w:t>
+      </w:r>
+      <w:r>
+        <w:br/>
+      </w:r>
+      <w:r>
+        <w:rPr>
+          <w:i/>
+          <w:iCs/>
+        </w:rPr>
+        <w:t>May the Holy Cross be my light.</w:t>
+      </w:r>
+    </w:p>
+    <w:p>
+      <w:pPr>
+        <w:pStyle w:val="SPBodyText"/>
+      </w:pPr>
+    </w:p>
+    <w:p>
+      <w:pPr>
+        <w:pStyle w:val="SPBodyText"/>
+      </w:pPr>
+      <w:r>
+        <w:t>We often think of protection as being kept safe from everything that might harm us. But the Christian life does not promise that we will never encounter temptation, suffering, uncertainty, or difficulty. Instead, Christ promises to remain with us through them.</w:t>
+      </w:r>
+    </w:p>
+    <w:p>
+      <w:pPr>
+        <w:pStyle w:val="SPBodyText"/>
+      </w:pPr>
+      <w:r>
+        <w:t xml:space="preserve">The Cross therefore becomes more than a symbol of protection. It becomes a </w:t>
+      </w:r>
+      <w:r>
+        <w:rPr>
+          <w:b/>
+          <w:bCs/>
+        </w:rPr>
+        <w:t>light by which we learn how to walk</w:t>
+      </w:r>
+      <w:r>
+        <w:t>.</w:t>
+      </w:r>
+    </w:p>
+    <w:p>
+      <w:pPr>
+        <w:pStyle w:val="SPBodyText"/>
+      </w:pPr>
+      <w:r>
+        <w:t>Saint Benedict understood that holiness is not achieved through one great act, but through a life of faithfulness. In his Rule, he placed great emphasis on humility, obedience, discipline, prayer, and perseverance. These virtues may seem ordinary, but it is often through such ordinary things that God gradually transforms the heart.</w:t>
+      </w:r>
+    </w:p>
+    <w:p>
+      <w:pPr>
+        <w:pStyle w:val="SPBodyText"/>
+      </w:pPr>
+      <w:r>
+        <w:t>When we ask Saint Benedict to pray for us, we are not asking him to take the place of Christ. We are asking for the prayers of one who faithfully followed Christ and now stands before Him.</w:t>
+      </w:r>
+    </w:p>
+    <w:p>
+      <w:pPr>
+        <w:pStyle w:val="SPBodyText"/>
+      </w:pPr>
+      <w:r>
+        <w:lastRenderedPageBreak/>
+        <w:t xml:space="preserve">The words of Scripture remind us that we are called to resist evil, but also to </w:t>
+      </w:r>
+      <w:r>
+        <w:rPr>
+          <w:b/>
+          <w:bCs/>
+        </w:rPr>
+        <w:t>submit ourselves to God</w:t>
+      </w:r>
+      <w:r>
+        <w:t>. Our strength does not come from ourselves. We remain steadfast because God gives us the grace to persevere.</w:t>
+      </w:r>
+    </w:p>
+    <w:p>
+      <w:pPr>
+        <w:pStyle w:val="SPBodyText"/>
+      </w:pPr>
+      <w:r>
+        <w:t>There will be times when the path ahead is unclear. There will be moments when temptation is strong, when fear unsettles us, or when we simply grow weary of doing what is good.</w:t>
+      </w:r>
+    </w:p>
+    <w:p>
+      <w:pPr>
+        <w:pStyle w:val="SPBodyText"/>
+      </w:pPr>
+      <w:r>
+        <w:t>In those moments, we can return to the Cross.</w:t>
+      </w:r>
+    </w:p>
+    <w:p>
+      <w:pPr>
+        <w:pStyle w:val="SPBodyText"/>
+        <w:rPr>
+          <w:b/>
+          <w:bCs/>
+        </w:rPr>
+      </w:pPr>
+    </w:p>
+    <w:p>
+      <w:pPr>
+        <w:pStyle w:val="SPBodyText"/>
+      </w:pPr>
+      <w:r>
+        <w:rPr>
+          <w:b/>
+          <w:bCs/>
+        </w:rPr>
+        <w:t>Crux sacra sit mihi lux.</w:t>
+      </w:r>
+      <w:r>
+        <w:br/>
+      </w:r>
+      <w:r>
+        <w:rPr>
+          <w:i/>
+          <w:iCs/>
+        </w:rPr>
+        <w:t>May the Holy Cross be my light.</w:t>
+      </w:r>
+    </w:p>
+    <w:p>
+      <w:pPr>
+        <w:pStyle w:val="SPBodyText"/>
+      </w:pPr>
+    </w:p>
+    <w:p>
+      <w:pPr>
+        <w:pStyle w:val="SPBodyText"/>
+      </w:pPr>
+      <w:r>
+        <w:t xml:space="preserve">Not merely to show me what lies ahead, but to remind me </w:t>
+      </w:r>
+      <w:r>
+        <w:rPr>
+          <w:b/>
+          <w:bCs/>
+        </w:rPr>
+        <w:t>who walks with me</w:t>
+      </w:r>
+      <w:r>
+        <w:t>.</w:t>
+      </w:r>
+    </w:p>
+    <w:p>
+      <w:pPr>
+        <w:pStyle w:val="SPBodyText"/>
+      </w:pPr>
+      <w:r>
+        <w:t>And so the prayer to Saint Benedict becomes a prayer for a faithful life: to remain close to Christ, to resist what leads us away from Him, to grow in humility and virtue, and to trust God's providence even when we cannot yet see where He is leading us.</w:t>
+      </w:r>
+    </w:p>
+    <w:p>
+      <w:pPr>
+        <w:pStyle w:val="SPBodyText"/>
+      </w:pPr>
+    </w:p>
+    <w:p>
+      <w:pPr>
+        <w:pStyle w:val="SPBodyText"/>
+      </w:pPr>
+      <w:r>
+        <w:rPr>
+          <w:b/>
+          <w:bCs/>
+        </w:rPr>
+        <w:t>May Christ be our strength.</w:t>
+      </w:r>
+      <w:r>
+        <w:rPr>
+          <w:b/>
+          <w:bCs/>
+        </w:rPr>
+        <w:br/>
+        <w:t>May His Cross be our light.</w:t>
+      </w:r>
+      <w:r>
+        <w:rPr>
+          <w:b/>
+          <w:bCs/>
+        </w:rPr>
+        <w:br/>
+        <w:t>And may we remain faithful to Him,</w:t>
+      </w:r>
+      <w:r>
+        <w:rPr>
+          <w:b/>
+          <w:bCs/>
+        </w:rPr>
+        <w:br/>
+        <w:t>one day and one step at a time.</w:t>
+      </w:r>
     </w:p>
     <w:p>
       <w:pPr>

</xml_diff>

<commit_message>
St Joseph Prayer completed.
</commit_message>
<xml_diff>
--- a/manuscript/volume-1/sacrae-preces-volume-1.docx
+++ b/manuscript/volume-1/sacrae-preces-volume-1.docx
@@ -3064,7 +3064,15 @@
         <w:pStyle w:val="SPScripture"/>
       </w:pPr>
       <w:r>
-        <w:t>Our Father who art in heaven, Hallowed be thy name. Thy kingdom come</w:t>
+        <w:t xml:space="preserve">Our Father who art in heaven, </w:t>
+      </w:r>
+      <w:proofErr w:type="gramStart"/>
+      <w:r>
+        <w:t>Hallowed</w:t>
+      </w:r>
+      <w:proofErr w:type="gramEnd"/>
+      <w:r>
+        <w:t xml:space="preserve"> be thy name. Thy kingdom come</w:t>
       </w:r>
       <w:r>
         <w:t>.</w:t>
@@ -3152,10 +3160,12 @@
         <w:t xml:space="preserve"> kingdom come. Give us each day our daily bread; and forgive us our sins, for we ourselves forgive </w:t>
       </w:r>
       <w:proofErr w:type="spellStart"/>
+      <w:proofErr w:type="gramStart"/>
       <w:r>
         <w:t>every one</w:t>
       </w:r>
       <w:proofErr w:type="spellEnd"/>
+      <w:proofErr w:type="gramEnd"/>
       <w:r>
         <w:t xml:space="preserve"> who is indebted to us; and lead us not into temptation.</w:t>
       </w:r>
@@ -3239,6 +3249,7 @@
       <w:r>
         <w:t xml:space="preserve">The first word is not </w:t>
       </w:r>
+      <w:proofErr w:type="gramStart"/>
       <w:r>
         <w:rPr>
           <w:i/>
@@ -3246,10 +3257,12 @@
         </w:rPr>
         <w:t>my</w:t>
       </w:r>
+      <w:proofErr w:type="gramEnd"/>
       <w:r>
         <w:t xml:space="preserve">. It is </w:t>
       </w:r>
       <w:proofErr w:type="spellStart"/>
+      <w:proofErr w:type="gramStart"/>
       <w:r>
         <w:rPr>
           <w:i/>
@@ -3258,6 +3271,7 @@
         <w:t>our</w:t>
       </w:r>
       <w:proofErr w:type="spellEnd"/>
+      <w:proofErr w:type="gramEnd"/>
       <w:r>
         <w:t>.</w:t>
       </w:r>
@@ -4527,7 +4541,15 @@
         <w:pStyle w:val="SPPrayerEnglish"/>
       </w:pPr>
       <w:r>
-        <w:t>Glory be to the Father,</w:t>
+        <w:t xml:space="preserve">Glory be to the </w:t>
+      </w:r>
+      <w:proofErr w:type="gramStart"/>
+      <w:r>
+        <w:t>Father</w:t>
+      </w:r>
+      <w:proofErr w:type="gramEnd"/>
+      <w:r>
+        <w:t>,</w:t>
       </w:r>
     </w:p>
     <w:p>
@@ -4535,8 +4557,13 @@
         <w:pStyle w:val="SPPrayerEnglish"/>
       </w:pPr>
       <w:r>
-        <w:t>And to the Son</w:t>
-      </w:r>
+        <w:t xml:space="preserve">And to the </w:t>
+      </w:r>
+      <w:proofErr w:type="gramStart"/>
+      <w:r>
+        <w:t>Son</w:t>
+      </w:r>
+      <w:proofErr w:type="gramEnd"/>
     </w:p>
     <w:p>
       <w:pPr>
@@ -4714,7 +4741,15 @@
         <w:pStyle w:val="SPScripture"/>
       </w:pPr>
       <w:r>
-        <w:t>“to him be glory in the Church and in Christ Jesus to all generations, for ever and ever. Amen.”</w:t>
+        <w:t>“</w:t>
+      </w:r>
+      <w:proofErr w:type="gramStart"/>
+      <w:r>
+        <w:t>to</w:t>
+      </w:r>
+      <w:proofErr w:type="gramEnd"/>
+      <w:r>
+        <w:t xml:space="preserve"> him be glory in the Church and in Christ Jesus to all generations, for ever and ever. Amen.”</w:t>
       </w:r>
     </w:p>
     <w:p>
@@ -4771,7 +4806,15 @@
         <w:pStyle w:val="SPScripture"/>
       </w:pPr>
       <w:r>
-        <w:t>“and from Jesus Christ the faithful witness, the first-born of the dead, and the ruler of kings on earth. To him who loves us and has freed us from our sins by his blood and made us a kingdom, priests to God and Father, to him be glory and dominion for ever and ever. Amen.”</w:t>
+        <w:t>“</w:t>
+      </w:r>
+      <w:proofErr w:type="gramStart"/>
+      <w:r>
+        <w:t>and</w:t>
+      </w:r>
+      <w:proofErr w:type="gramEnd"/>
+      <w:r>
+        <w:t xml:space="preserve"> from Jesus Christ the faithful witness, the first-born of the dead, and the ruler of kings on earth. To him who loves us and has freed us from our sins by his blood and made us a kingdom, priests to God and Father, to him be glory and dominion for ever and ever. Amen.”</w:t>
       </w:r>
     </w:p>
     <w:p>
@@ -4848,8 +4891,17 @@
           <w:b/>
           <w:bCs/>
         </w:rPr>
-        <w:t>Glory be to the Father</w:t>
-      </w:r>
+        <w:t xml:space="preserve">Glory be to the </w:t>
+      </w:r>
+      <w:proofErr w:type="gramStart"/>
+      <w:r>
+        <w:rPr>
+          <w:b/>
+          <w:bCs/>
+        </w:rPr>
+        <w:t>Father</w:t>
+      </w:r>
+      <w:proofErr w:type="gramEnd"/>
       <w:r>
         <w:t>, we turn our hearts towards the One from whom all things come.</w:t>
       </w:r>
@@ -4931,7 +4983,15 @@
         <w:pStyle w:val="SPBodyText"/>
       </w:pPr>
       <w:r>
-        <w:t>The Glory Be teaches us to lift our eyes beyond the noise of the moment and remember what is eternal.</w:t>
+        <w:t xml:space="preserve">The Glory </w:t>
+      </w:r>
+      <w:proofErr w:type="gramStart"/>
+      <w:r>
+        <w:t>Be</w:t>
+      </w:r>
+      <w:proofErr w:type="gramEnd"/>
+      <w:r>
+        <w:t xml:space="preserve"> teaches us to lift our eyes beyond the noise of the moment and remember what is eternal.</w:t>
       </w:r>
     </w:p>
     <w:p>
@@ -5213,7 +5273,23 @@
           <w:b/>
           <w:bCs/>
         </w:rPr>
-        <w:t>Glory be to the Father.</w:t>
+        <w:t xml:space="preserve">Glory be to the </w:t>
+      </w:r>
+      <w:proofErr w:type="gramStart"/>
+      <w:r>
+        <w:rPr>
+          <w:b/>
+          <w:bCs/>
+        </w:rPr>
+        <w:t>Father</w:t>
+      </w:r>
+      <w:proofErr w:type="gramEnd"/>
+      <w:r>
+        <w:rPr>
+          <w:b/>
+          <w:bCs/>
+        </w:rPr>
+        <w:t>.</w:t>
       </w:r>
     </w:p>
     <w:p>
@@ -5242,7 +5318,23 @@
           <w:b/>
           <w:bCs/>
         </w:rPr>
-        <w:t>And to the Son.</w:t>
+        <w:t xml:space="preserve">And to the </w:t>
+      </w:r>
+      <w:proofErr w:type="gramStart"/>
+      <w:r>
+        <w:rPr>
+          <w:b/>
+          <w:bCs/>
+        </w:rPr>
+        <w:t>Son</w:t>
+      </w:r>
+      <w:proofErr w:type="gramEnd"/>
+      <w:r>
+        <w:rPr>
+          <w:b/>
+          <w:bCs/>
+        </w:rPr>
+        <w:t>.</w:t>
       </w:r>
     </w:p>
     <w:p>
@@ -5465,8 +5557,17 @@
           <w:b/>
           <w:bCs/>
         </w:rPr>
-        <w:t>Glory Be</w:t>
-      </w:r>
+        <w:t xml:space="preserve">Glory </w:t>
+      </w:r>
+      <w:proofErr w:type="gramStart"/>
+      <w:r>
+        <w:rPr>
+          <w:b/>
+          <w:bCs/>
+        </w:rPr>
+        <w:t>Be</w:t>
+      </w:r>
+      <w:proofErr w:type="gramEnd"/>
       <w:r>
         <w:t xml:space="preserve"> t</w:t>
       </w:r>
@@ -7406,7 +7507,15 @@
         <w:spacing w:line="360" w:lineRule="auto"/>
       </w:pPr>
       <w:r>
-        <w:t>And you, child, will be called prophet of the Most High; for you will go before the Lord to prepare his ways, to give knowledge of salvation to his people in the forgiveness of their sins</w:t>
+        <w:t xml:space="preserve">And you, child, will be called prophet of the </w:t>
+      </w:r>
+      <w:proofErr w:type="gramStart"/>
+      <w:r>
+        <w:t>Most High</w:t>
+      </w:r>
+      <w:proofErr w:type="gramEnd"/>
+      <w:r>
+        <w:t>; for you will go before the Lord to prepare his ways, to give knowledge of salvation to his people in the forgiveness of their sins</w:t>
       </w:r>
       <w:r>
         <w:t xml:space="preserve">, through the tender mercy of our God, </w:t>
@@ -11966,7 +12075,15 @@
         <w:t>Annunciation</w:t>
       </w:r>
       <w:r>
-        <w:t>, when the Angel Gabriel announced to Mary that she would become the Mother of the Son of God.</w:t>
+        <w:t xml:space="preserve">, when the Angel Gabriel announced to Mary that she would become the </w:t>
+      </w:r>
+      <w:proofErr w:type="gramStart"/>
+      <w:r>
+        <w:t>Mother</w:t>
+      </w:r>
+      <w:proofErr w:type="gramEnd"/>
+      <w:r>
+        <w:t xml:space="preserve"> of the Son of God.</w:t>
       </w:r>
     </w:p>
     <w:p>
@@ -12418,7 +12535,15 @@
         <w:pStyle w:val="SPPrayerEnglish"/>
       </w:pPr>
       <w:r>
-        <w:t xml:space="preserve">Pour forth, we beseech Thee, O Lord, Thy grace into our hearts, that we to whom the Incarnation of Christ, Thy Son, was made known by the message of an angel, may by His Passion and Cross be brought to the glory of His resurrection. Through the same Christ our Lord. </w:t>
+        <w:t xml:space="preserve">Pour forth, we beseech Thee, O Lord, </w:t>
+      </w:r>
+      <w:proofErr w:type="gramStart"/>
+      <w:r>
+        <w:t>Thy</w:t>
+      </w:r>
+      <w:proofErr w:type="gramEnd"/>
+      <w:r>
+        <w:t xml:space="preserve"> grace into our hearts, that we to whom the Incarnation of Christ, Thy Son, was made known by the message of an angel, may by His Passion and Cross be brought to the glory of His resurrection. Through the same Christ our Lord. </w:t>
       </w:r>
     </w:p>
     <w:p>
@@ -13226,7 +13351,15 @@
         <w:pStyle w:val="SPBodyText"/>
       </w:pPr>
       <w:r>
-        <w:t>Back to the truth that God is near.</w:t>
+        <w:t xml:space="preserve">Back to the truth that God is </w:t>
+      </w:r>
+      <w:proofErr w:type="gramStart"/>
+      <w:r>
+        <w:t>near</w:t>
+      </w:r>
+      <w:proofErr w:type="gramEnd"/>
+      <w:r>
+        <w:t>.</w:t>
       </w:r>
     </w:p>
     <w:p>
@@ -13946,7 +14079,15 @@
         <w:pStyle w:val="SPBodyText"/>
       </w:pPr>
       <w:r>
-        <w:t>The Anima Christi is a prayer of drawing near.</w:t>
+        <w:t xml:space="preserve">The Anima Christi is a prayer of drawing </w:t>
+      </w:r>
+      <w:proofErr w:type="gramStart"/>
+      <w:r>
+        <w:t>near</w:t>
+      </w:r>
+      <w:proofErr w:type="gramEnd"/>
+      <w:r>
+        <w:t>.</w:t>
       </w:r>
     </w:p>
     <w:p>
@@ -15857,7 +15998,15 @@
         <w:pStyle w:val="SPScripture"/>
       </w:pPr>
       <w:r>
-        <w:t>Therefore God has highly exalted him and bestowed on him the name which is above every name, that at the name of Jesus every knee should bow, in heaven and on earth and under the earth, and every tongue confess that Jesus Christ is Lord, to the glory of God the father.</w:t>
+        <w:t xml:space="preserve">Therefore God has highly exalted him and bestowed on him the </w:t>
+      </w:r>
+      <w:proofErr w:type="gramStart"/>
+      <w:r>
+        <w:t>name</w:t>
+      </w:r>
+      <w:proofErr w:type="gramEnd"/>
+      <w:r>
+        <w:t xml:space="preserve"> which is above every name, that at the name of Jesus every knee should bow, in heaven and on earth and under the earth, and every tongue confess that Jesus Christ is Lord, to the glory of God the father.</w:t>
       </w:r>
     </w:p>
     <w:p>
@@ -15903,7 +16052,15 @@
         <w:t>I am the living bread which came down from heaven</w:t>
       </w:r>
       <w:r>
-        <w:t>; if any one eats of this bread, he will live forever; and the  bread which I shall give for the life of the world is my flesh.”</w:t>
+        <w:t xml:space="preserve">; if </w:t>
+      </w:r>
+      <w:proofErr w:type="gramStart"/>
+      <w:r>
+        <w:t>any one</w:t>
+      </w:r>
+      <w:proofErr w:type="gramEnd"/>
+      <w:r>
+        <w:t xml:space="preserve"> eats of this bread, he will live forever; and the  bread which I shall give for the life of the world is my flesh.”</w:t>
       </w:r>
     </w:p>
     <w:p>
@@ -16445,8 +16602,13 @@
       <w:pPr>
         <w:pStyle w:val="SPScripture"/>
       </w:pPr>
-      <w:r>
-        <w:t>Peace I leave with you; my peace I give to you; not as the world gives do I give to you. Let not your hearts be troubled, neither let them be afraid.</w:t>
+      <w:proofErr w:type="gramStart"/>
+      <w:r>
+        <w:t>Peace</w:t>
+      </w:r>
+      <w:proofErr w:type="gramEnd"/>
+      <w:r>
+        <w:t xml:space="preserve"> I leave with you; my peace I give to you; not as the world gives do I give to you. Let not your hearts be troubled, neither let them be afraid.</w:t>
       </w:r>
     </w:p>
     <w:p>
@@ -17713,6 +17875,132 @@
     <w:p>
       <w:pPr>
         <w:pStyle w:val="SPPrayerEnglish"/>
+        <w:sectPr>
+          <w:type w:val="evenPage"/>
+          <w:pgSz w:w="7920" w:h="12240" w:code="6"/>
+          <w:pgMar w:top="1080" w:right="864" w:bottom="1080" w:left="1152" w:header="576" w:footer="576" w:gutter="0"/>
+          <w:cols w:space="720"/>
+          <w:titlePg/>
+          <w:docGrid w:linePitch="360"/>
+        </w:sectPr>
+      </w:pPr>
+    </w:p>
+    <w:p>
+      <w:pPr>
+        <w:pStyle w:val="SPLanguage"/>
+      </w:pPr>
+      <w:r>
+        <w:lastRenderedPageBreak/>
+        <w:t>LATIN</w:t>
+      </w:r>
+    </w:p>
+    <w:p>
+      <w:pPr>
+        <w:pStyle w:val="SPLanguage"/>
+      </w:pPr>
+      <w:r>
+        <w:t>(Note this is a Latin rendering of the English Prayer, as there is no traditional Latin prayer).</w:t>
+      </w:r>
+    </w:p>
+    <w:p>
+      <w:pPr>
+        <w:pStyle w:val="SPPrayerLatin"/>
+      </w:pPr>
+    </w:p>
+    <w:p>
+      <w:pPr>
+        <w:pStyle w:val="SPPrayerLatin"/>
+      </w:pPr>
+      <w:r>
+        <w:t>O glorióse Sancte Benedicte,</w:t>
+      </w:r>
+      <w:r>
+        <w:br/>
+        <w:t>sublime exemplar omnium virtutum,</w:t>
+      </w:r>
+      <w:r>
+        <w:br/>
+        <w:t>vas gratiae Dei purissimum,</w:t>
+      </w:r>
+      <w:r>
+        <w:br/>
+        <w:t>humiliter ante te genibus flexis adsto.</w:t>
+      </w:r>
+    </w:p>
+    <w:p>
+      <w:pPr>
+        <w:pStyle w:val="SPPrayerLatin"/>
+      </w:pPr>
+      <w:r>
+        <w:t>Te, benignissime, oro,</w:t>
+      </w:r>
+      <w:r>
+        <w:br/>
+        <w:t>ut pro me apud thronum Dei intercedere digneris.</w:t>
+      </w:r>
+    </w:p>
+    <w:p>
+      <w:pPr>
+        <w:pStyle w:val="SPPrayerLatin"/>
+      </w:pPr>
+      <w:r>
+        <w:t>Ad te confugio in periculis</w:t>
+      </w:r>
+      <w:r>
+        <w:br/>
+        <w:t>quae me cotidie circumdant.</w:t>
+      </w:r>
+      <w:r>
+        <w:br/>
+        <w:t>Defende me ab inimicis meis</w:t>
+      </w:r>
+      <w:r>
+        <w:br/>
+        <w:t>et inspira mihi ut te in omnibus imitari studeam.</w:t>
+      </w:r>
+    </w:p>
+    <w:p>
+      <w:pPr>
+        <w:pStyle w:val="SPPrayerLatin"/>
+      </w:pPr>
+      <w:r>
+        <w:t>Sit benedictio tua semper mecum,</w:t>
+      </w:r>
+      <w:r>
+        <w:br/>
+        <w:t>ut quidquid Deus vetat vitare valeam</w:t>
+      </w:r>
+      <w:r>
+        <w:br/>
+        <w:t>et occasiones peccandi fugiam.</w:t>
+      </w:r>
+    </w:p>
+    <w:p>
+      <w:pPr>
+        <w:pStyle w:val="SPLanguage"/>
+        <w:sectPr>
+          <w:type w:val="oddPage"/>
+          <w:pgSz w:w="7920" w:h="12240" w:code="6"/>
+          <w:pgMar w:top="1080" w:right="864" w:bottom="1080" w:left="1152" w:header="576" w:footer="576" w:gutter="0"/>
+          <w:cols w:space="720"/>
+          <w:titlePg/>
+          <w:docGrid w:linePitch="360"/>
+        </w:sectPr>
+      </w:pPr>
+    </w:p>
+    <w:p>
+      <w:pPr>
+        <w:pStyle w:val="SPPrayerEnglish"/>
+        <w:spacing w:before="240"/>
+      </w:pPr>
+      <w:r>
+        <w:lastRenderedPageBreak/>
+        <w:t>ENGLISH</w:t>
+      </w:r>
+    </w:p>
+    <w:p>
+      <w:pPr>
+        <w:pStyle w:val="SPPrayerEnglish"/>
       </w:pPr>
       <w:r>
         <w:t>Obtain for me from God</w:t>
@@ -17724,6 +18012,679 @@
       <w:r>
         <w:br/>
         <w:t>difficulties, and afflictions of life.</w:t>
+      </w:r>
+    </w:p>
+    <w:p>
+      <w:pPr>
+        <w:pStyle w:val="SPPrayerEnglish"/>
+      </w:pPr>
+      <w:r>
+        <w:t>Help me to remain faithful to Christ,</w:t>
+      </w:r>
+      <w:r>
+        <w:br/>
+        <w:t>to grow in humility and virtue,</w:t>
+      </w:r>
+      <w:r>
+        <w:br/>
+        <w:t>and to trust always in God's providence.</w:t>
+      </w:r>
+    </w:p>
+    <w:p>
+      <w:pPr>
+        <w:pStyle w:val="SPPrayerEnglish"/>
+      </w:pPr>
+      <w:r>
+        <w:t>Amen.</w:t>
+      </w:r>
+    </w:p>
+    <w:p>
+      <w:pPr>
+        <w:pStyle w:val="SPPrayerEnglish"/>
+      </w:pPr>
+    </w:p>
+    <w:p>
+      <w:pPr>
+        <w:pStyle w:val="SPLanguage"/>
+        <w:sectPr>
+          <w:type w:val="evenPage"/>
+          <w:pgSz w:w="7920" w:h="12240" w:code="6"/>
+          <w:pgMar w:top="1080" w:right="864" w:bottom="1080" w:left="1152" w:header="576" w:footer="576" w:gutter="0"/>
+          <w:cols w:space="720"/>
+          <w:titlePg/>
+          <w:docGrid w:linePitch="360"/>
+        </w:sectPr>
+      </w:pPr>
+    </w:p>
+    <w:p>
+      <w:pPr>
+        <w:pStyle w:val="SPLanguage"/>
+      </w:pPr>
+      <w:r>
+        <w:lastRenderedPageBreak/>
+        <w:t>LATIN</w:t>
+      </w:r>
+    </w:p>
+    <w:p>
+      <w:pPr>
+        <w:pStyle w:val="SPPrayerLatin"/>
+      </w:pPr>
+      <w:r>
+        <w:t>Impetrā mihi a Deo</w:t>
+      </w:r>
+      <w:r>
+        <w:br/>
+        <w:t>gratias quibus indigeo</w:t>
+      </w:r>
+      <w:r>
+        <w:br/>
+        <w:t>in tribulationibus, difficultatibus et afflictionibus vitae.</w:t>
+      </w:r>
+    </w:p>
+    <w:p>
+      <w:pPr>
+        <w:pStyle w:val="SPPrayerLatin"/>
+      </w:pPr>
+      <w:r>
+        <w:t>Adiuva me ut Christo fidelis permaneam,</w:t>
+      </w:r>
+      <w:r>
+        <w:br/>
+        <w:t>in humilitate et virtute crescam,</w:t>
+      </w:r>
+      <w:r>
+        <w:br/>
+        <w:t>atque semper divinae providentiae confidam.</w:t>
+      </w:r>
+    </w:p>
+    <w:p>
+      <w:pPr>
+        <w:pStyle w:val="SPPrayerLatin"/>
+      </w:pPr>
+      <w:r>
+        <w:t>Amen.</w:t>
+      </w:r>
+    </w:p>
+    <w:p>
+      <w:pPr>
+        <w:pStyle w:val="SPLanguage"/>
+        <w:sectPr>
+          <w:type w:val="oddPage"/>
+          <w:pgSz w:w="7920" w:h="12240" w:code="6"/>
+          <w:pgMar w:top="1080" w:right="864" w:bottom="1080" w:left="1152" w:header="576" w:footer="576" w:gutter="0"/>
+          <w:cols w:space="720"/>
+          <w:titlePg/>
+          <w:docGrid w:linePitch="360"/>
+        </w:sectPr>
+      </w:pPr>
+    </w:p>
+    <w:p>
+      <w:pPr>
+        <w:pStyle w:val="SPSectionTitle"/>
+      </w:pPr>
+      <w:r>
+        <w:lastRenderedPageBreak/>
+        <w:t>SCRIPTURE</w:t>
+      </w:r>
+    </w:p>
+    <w:p>
+      <w:pPr>
+        <w:pStyle w:val="SPScriptureReference"/>
+      </w:pPr>
+      <w:r>
+        <w:t>Matthew 4:10</w:t>
+      </w:r>
+    </w:p>
+    <w:p>
+      <w:pPr>
+        <w:pStyle w:val="SPScripture"/>
+      </w:pPr>
+      <w:r>
+        <w:t>Then Jesus said to him, “Begone, Satan! for it is written, ‘You shall worship the Lord your God and him only shall you serve.’”</w:t>
+      </w:r>
+    </w:p>
+    <w:p>
+      <w:pPr>
+        <w:pStyle w:val="SPScriptureReference"/>
+      </w:pPr>
+      <w:r>
+        <w:t>James 4:7</w:t>
+      </w:r>
+    </w:p>
+    <w:p>
+      <w:pPr>
+        <w:pStyle w:val="SPScripture"/>
+      </w:pPr>
+      <w:r>
+        <w:t>Submit yourselves therefore to God. Resist the devil and he will flee from you.</w:t>
+      </w:r>
+    </w:p>
+    <w:p>
+      <w:pPr>
+        <w:pStyle w:val="SPScriptureReference"/>
+      </w:pPr>
+      <w:r>
+        <w:t>1 Peter 5:8-9</w:t>
+      </w:r>
+    </w:p>
+    <w:p>
+      <w:pPr>
+        <w:pStyle w:val="SPScripture"/>
+      </w:pPr>
+      <w:r>
+        <w:t>Be sober, be watchful. Your adversary the devil prowls around like a roaring lion, seeking someone to devour. Resist him, firm in your faith, knowing that the same experience of suffering is required of your brotherhood throughout the world.</w:t>
+      </w:r>
+    </w:p>
+    <w:p>
+      <w:pPr>
+        <w:pStyle w:val="SPScriptureReference"/>
+      </w:pPr>
+      <w:r>
+        <w:t>Philippians</w:t>
+      </w:r>
+      <w:r>
+        <w:t xml:space="preserve"> 4:13</w:t>
+      </w:r>
+    </w:p>
+    <w:p>
+      <w:pPr>
+        <w:pStyle w:val="SPScripture"/>
+      </w:pPr>
+      <w:r>
+        <w:t>I can do all things in him who strengthens me.</w:t>
+      </w:r>
+    </w:p>
+    <w:p>
+      <w:pPr>
+        <w:pStyle w:val="SPPrayerLatin"/>
+        <w:rPr>
+          <w:b/>
+          <w:bCs/>
+          <w:lang w:val="en-ZA"/>
+        </w:rPr>
+      </w:pPr>
+    </w:p>
+    <w:p>
+      <w:pPr>
+        <w:pStyle w:val="SPPrayerLatin"/>
+      </w:pPr>
+      <w:r>
+        <w:t xml:space="preserve"> </w:t>
+      </w:r>
+    </w:p>
+    <w:p>
+      <w:pPr>
+        <w:pStyle w:val="SPPrayerLatin"/>
+      </w:pPr>
+    </w:p>
+    <w:p>
+      <w:pPr>
+        <w:pStyle w:val="SPPrayerLatin"/>
+        <w:sectPr>
+          <w:type w:val="evenPage"/>
+          <w:pgSz w:w="7920" w:h="12240" w:code="6"/>
+          <w:pgMar w:top="1080" w:right="864" w:bottom="1080" w:left="1152" w:header="576" w:footer="576" w:gutter="0"/>
+          <w:cols w:space="720"/>
+          <w:titlePg/>
+          <w:docGrid w:linePitch="360"/>
+        </w:sectPr>
+      </w:pPr>
+    </w:p>
+    <w:p>
+      <w:pPr>
+        <w:pStyle w:val="SPSectionTitle"/>
+      </w:pPr>
+      <w:r>
+        <w:lastRenderedPageBreak/>
+        <w:t>reflection</w:t>
+      </w:r>
+    </w:p>
+    <w:p>
+      <w:pPr>
+        <w:pStyle w:val="SPBodyText"/>
+        <w:rPr>
+          <w:b/>
+          <w:bCs/>
+        </w:rPr>
+      </w:pPr>
+      <w:r>
+        <w:t xml:space="preserve"> </w:t>
+      </w:r>
+      <w:r>
+        <w:rPr>
+          <w:b/>
+          <w:bCs/>
+        </w:rPr>
+        <w:t>The Cross as Our Light</w:t>
+      </w:r>
+    </w:p>
+    <w:p>
+      <w:pPr>
+        <w:pStyle w:val="SPBodyText"/>
+      </w:pPr>
+      <w:r>
+        <w:t>There is something striking about the traditional words associated with Saint Benedict:</w:t>
+      </w:r>
+    </w:p>
+    <w:p>
+      <w:pPr>
+        <w:pStyle w:val="SPBodyText"/>
+        <w:rPr>
+          <w:b/>
+          <w:bCs/>
+        </w:rPr>
+      </w:pPr>
+    </w:p>
+    <w:p>
+      <w:pPr>
+        <w:pStyle w:val="SPBodyText"/>
+      </w:pPr>
+      <w:r>
+        <w:rPr>
+          <w:b/>
+          <w:bCs/>
+        </w:rPr>
+        <w:t>Crux sacra sit mihi lux.</w:t>
+      </w:r>
+      <w:r>
+        <w:br/>
+      </w:r>
+      <w:r>
+        <w:rPr>
+          <w:i/>
+          <w:iCs/>
+        </w:rPr>
+        <w:t>May the Holy Cross be my light.</w:t>
+      </w:r>
+    </w:p>
+    <w:p>
+      <w:pPr>
+        <w:pStyle w:val="SPBodyText"/>
+      </w:pPr>
+    </w:p>
+    <w:p>
+      <w:pPr>
+        <w:pStyle w:val="SPBodyText"/>
+      </w:pPr>
+      <w:r>
+        <w:t>We often think of protection as being kept safe from everything that might harm us. But the Christian life does not promise that we will never encounter temptation, suffering, uncertainty, or difficulty. Instead, Christ promises to remain with us through them.</w:t>
+      </w:r>
+    </w:p>
+    <w:p>
+      <w:pPr>
+        <w:pStyle w:val="SPBodyText"/>
+      </w:pPr>
+      <w:r>
+        <w:t xml:space="preserve">The Cross therefore becomes more than a symbol of protection. It becomes a </w:t>
+      </w:r>
+      <w:r>
+        <w:rPr>
+          <w:b/>
+          <w:bCs/>
+        </w:rPr>
+        <w:t>light by which we learn how to walk</w:t>
+      </w:r>
+      <w:r>
+        <w:t>.</w:t>
+      </w:r>
+    </w:p>
+    <w:p>
+      <w:pPr>
+        <w:pStyle w:val="SPBodyText"/>
+      </w:pPr>
+      <w:r>
+        <w:t>Saint Benedict understood that holiness is not achieved through one great act, but through a life of faithfulness. In his Rule, he placed great emphasis on humility, obedience, discipline, prayer, and perseverance. These virtues may seem ordinary, but it is often through such ordinary things that God gradually transforms the heart.</w:t>
+      </w:r>
+    </w:p>
+    <w:p>
+      <w:pPr>
+        <w:pStyle w:val="SPBodyText"/>
+      </w:pPr>
+      <w:r>
+        <w:t>When we ask Saint Benedict to pray for us, we are not asking him to take the place of Christ. We are asking for the prayers of one who faithfully followed Christ and now stands before Him.</w:t>
+      </w:r>
+    </w:p>
+    <w:p>
+      <w:pPr>
+        <w:pStyle w:val="SPBodyText"/>
+      </w:pPr>
+      <w:r>
+        <w:lastRenderedPageBreak/>
+        <w:t xml:space="preserve">The words of Scripture remind us that we are called to resist evil, but also to </w:t>
+      </w:r>
+      <w:r>
+        <w:rPr>
+          <w:b/>
+          <w:bCs/>
+        </w:rPr>
+        <w:t>submit ourselves to God</w:t>
+      </w:r>
+      <w:r>
+        <w:t>. Our strength does not come from ourselves. We remain steadfast because God gives us the grace to persevere.</w:t>
+      </w:r>
+    </w:p>
+    <w:p>
+      <w:pPr>
+        <w:pStyle w:val="SPBodyText"/>
+      </w:pPr>
+      <w:r>
+        <w:t>There will be times when the path ahead is unclear. There will be moments when temptation is strong, when fear unsettles us, or when we simply grow weary of doing what is good.</w:t>
+      </w:r>
+    </w:p>
+    <w:p>
+      <w:pPr>
+        <w:pStyle w:val="SPBodyText"/>
+      </w:pPr>
+      <w:r>
+        <w:t>In those moments, we can return to the Cross.</w:t>
+      </w:r>
+    </w:p>
+    <w:p>
+      <w:pPr>
+        <w:pStyle w:val="SPBodyText"/>
+        <w:rPr>
+          <w:b/>
+          <w:bCs/>
+        </w:rPr>
+      </w:pPr>
+    </w:p>
+    <w:p>
+      <w:pPr>
+        <w:pStyle w:val="SPBodyText"/>
+      </w:pPr>
+      <w:r>
+        <w:rPr>
+          <w:b/>
+          <w:bCs/>
+        </w:rPr>
+        <w:t>Crux sacra sit mihi lux.</w:t>
+      </w:r>
+      <w:r>
+        <w:br/>
+      </w:r>
+      <w:r>
+        <w:rPr>
+          <w:i/>
+          <w:iCs/>
+        </w:rPr>
+        <w:t>May the Holy Cross be my light.</w:t>
+      </w:r>
+    </w:p>
+    <w:p>
+      <w:pPr>
+        <w:pStyle w:val="SPBodyText"/>
+      </w:pPr>
+    </w:p>
+    <w:p>
+      <w:pPr>
+        <w:pStyle w:val="SPBodyText"/>
+      </w:pPr>
+      <w:r>
+        <w:t xml:space="preserve">Not merely to show me what lies ahead, but to remind me </w:t>
+      </w:r>
+      <w:r>
+        <w:rPr>
+          <w:b/>
+          <w:bCs/>
+        </w:rPr>
+        <w:t>who walks with me</w:t>
+      </w:r>
+      <w:r>
+        <w:t>.</w:t>
+      </w:r>
+    </w:p>
+    <w:p>
+      <w:pPr>
+        <w:pStyle w:val="SPBodyText"/>
+      </w:pPr>
+      <w:r>
+        <w:t>And so the prayer to Saint Benedict becomes a prayer for a faithful life: to remain close to Christ, to resist what leads us away from Him, to grow in humility and virtue, and to trust God's providence even when we cannot yet see where He is leading us.</w:t>
+      </w:r>
+    </w:p>
+    <w:p>
+      <w:pPr>
+        <w:pStyle w:val="SPBodyText"/>
+      </w:pPr>
+    </w:p>
+    <w:p>
+      <w:pPr>
+        <w:pStyle w:val="SPBodyText"/>
+      </w:pPr>
+      <w:r>
+        <w:rPr>
+          <w:b/>
+          <w:bCs/>
+        </w:rPr>
+        <w:t>May Christ be our strength.</w:t>
+      </w:r>
+      <w:r>
+        <w:rPr>
+          <w:b/>
+          <w:bCs/>
+        </w:rPr>
+        <w:br/>
+        <w:t>May His Cross be our light.</w:t>
+      </w:r>
+      <w:r>
+        <w:rPr>
+          <w:b/>
+          <w:bCs/>
+        </w:rPr>
+        <w:br/>
+        <w:t>And may we remain faithful to Him,</w:t>
+      </w:r>
+      <w:r>
+        <w:rPr>
+          <w:b/>
+          <w:bCs/>
+        </w:rPr>
+        <w:br/>
+        <w:t>one day and one step at a time.</w:t>
+      </w:r>
+    </w:p>
+    <w:p>
+      <w:pPr>
+        <w:pStyle w:val="SPBodyText"/>
+      </w:pPr>
+    </w:p>
+    <w:p>
+      <w:pPr>
+        <w:pStyle w:val="SPBodyText"/>
+      </w:pPr>
+    </w:p>
+    <w:p>
+      <w:pPr>
+        <w:pStyle w:val="SPBodyText"/>
+      </w:pPr>
+    </w:p>
+    <w:p>
+      <w:pPr>
+        <w:pStyle w:val="SPSectionTitle"/>
+        <w:sectPr>
+          <w:type w:val="oddPage"/>
+          <w:pgSz w:w="7920" w:h="12240" w:code="6"/>
+          <w:pgMar w:top="1080" w:right="864" w:bottom="1080" w:left="1152" w:header="576" w:footer="576" w:gutter="0"/>
+          <w:cols w:space="720"/>
+          <w:titlePg/>
+          <w:docGrid w:linePitch="360"/>
+        </w:sectPr>
+      </w:pPr>
+    </w:p>
+    <w:p>
+      <w:pPr>
+        <w:pStyle w:val="SPBodyText"/>
+        <w:jc w:val="center"/>
+        <w:rPr>
+          <w:rFonts w:ascii="Segoe UI Symbol" w:hAnsi="Segoe UI Symbol" w:cs="Segoe UI Symbol"/>
+        </w:rPr>
+      </w:pPr>
+      <w:r>
+        <w:rPr>
+          <w:rFonts w:ascii="Segoe UI Symbol" w:hAnsi="Segoe UI Symbol" w:cs="Segoe UI Symbol"/>
+        </w:rPr>
+        <w:lastRenderedPageBreak/>
+        <w:t>✠</w:t>
+      </w:r>
+    </w:p>
+    <w:p>
+      <w:pPr>
+        <w:pStyle w:val="SPPrayerTitle"/>
+      </w:pPr>
+      <w:r>
+        <w:t xml:space="preserve">Saint </w:t>
+      </w:r>
+      <w:r>
+        <w:t>joseph</w:t>
+      </w:r>
+    </w:p>
+    <w:p>
+      <w:pPr>
+        <w:pStyle w:val="SPBodyText"/>
+      </w:pPr>
+      <w:r>
+        <w:rPr>
+          <w:b/>
+          <w:bCs/>
+        </w:rPr>
+        <w:t xml:space="preserve"> </w:t>
+      </w:r>
+      <w:r>
+        <w:t>Saint Joseph stands quietly at the heart of the Gospel story. Scripture does not record a single word spoken by him, yet his life speaks through faithful action. He listened to God, protected Mary and Jesus, worked faithfully, and accepted each responsibility placed before him.</w:t>
+      </w:r>
+    </w:p>
+    <w:p>
+      <w:pPr>
+        <w:pStyle w:val="SPBodyText"/>
+      </w:pPr>
+      <w:r>
+        <w:t xml:space="preserve">The Church honours Joseph as the </w:t>
+      </w:r>
+      <w:r>
+        <w:rPr>
+          <w:b/>
+          <w:bCs/>
+        </w:rPr>
+        <w:t>guardian of the Holy Family</w:t>
+      </w:r>
+      <w:r>
+        <w:t xml:space="preserve"> and as a model of humility, obedience, purity, and trust in God's providence.</w:t>
+      </w:r>
+    </w:p>
+    <w:p>
+      <w:pPr>
+        <w:pStyle w:val="SPBodyText"/>
+      </w:pPr>
+      <w:r>
+        <w:t>His example reminds us that holiness is often found not in extraordinary deeds, but in faithfully carrying out the duties God places before us.</w:t>
+      </w:r>
+    </w:p>
+    <w:p>
+      <w:pPr>
+        <w:pStyle w:val="SPBodyText"/>
+      </w:pPr>
+      <w:r>
+        <w:t xml:space="preserve">In our families, our work, and the responsibilities entrusted to us, we can ask Saint Joseph to pray for us: </w:t>
+      </w:r>
+      <w:r>
+        <w:rPr>
+          <w:b/>
+          <w:bCs/>
+        </w:rPr>
+        <w:t>that we may serve faithfully, protect those placed in our care, and trust God even when His path is not yet clear.</w:t>
+      </w:r>
+    </w:p>
+    <w:p>
+      <w:pPr>
+        <w:pStyle w:val="SPBodyText"/>
+        <w:sectPr>
+          <w:type w:val="oddPage"/>
+          <w:pgSz w:w="7920" w:h="12240" w:code="6"/>
+          <w:pgMar w:top="1080" w:right="864" w:bottom="1080" w:left="1152" w:header="576" w:footer="576" w:gutter="0"/>
+          <w:cols w:space="720"/>
+          <w:titlePg/>
+          <w:docGrid w:linePitch="360"/>
+        </w:sectPr>
+      </w:pPr>
+    </w:p>
+    <w:p>
+      <w:pPr>
+        <w:pStyle w:val="SPLanguage"/>
+        <w:spacing w:before="200"/>
+      </w:pPr>
+      <w:r>
+        <w:lastRenderedPageBreak/>
+        <w:tab/>
+        <w:t>ENGLISH</w:t>
+      </w:r>
+    </w:p>
+    <w:p>
+      <w:pPr>
+        <w:pStyle w:val="SPPrayerEnglish"/>
+      </w:pPr>
+      <w:r>
+        <w:tab/>
+      </w:r>
+      <w:r>
+        <w:br/>
+      </w:r>
+      <w:r>
+        <w:t>O glorious Saint Joseph,</w:t>
+      </w:r>
+      <w:r>
+        <w:br/>
+        <w:t>good and faithful servant,</w:t>
+      </w:r>
+      <w:r>
+        <w:br/>
+        <w:t>God was pleased to place His own family in your care.</w:t>
+      </w:r>
+    </w:p>
+    <w:p>
+      <w:pPr>
+        <w:pStyle w:val="SPPrayerEnglish"/>
+      </w:pPr>
+      <w:r>
+        <w:t>With a father's heart you protected the Virgin Mary</w:t>
+      </w:r>
+      <w:r>
+        <w:br/>
+        <w:t>and watched over Jesus Christ, the Son of God.</w:t>
+      </w:r>
+      <w:r>
+        <w:br/>
+        <w:t>You served them faithfully in the ordinary work of each day,</w:t>
+      </w:r>
+      <w:r>
+        <w:br/>
+        <w:t>and through your example taught us the dignity of humble service.</w:t>
+      </w:r>
+    </w:p>
+    <w:p>
+      <w:pPr>
+        <w:pStyle w:val="SPPrayerEnglish"/>
+      </w:pPr>
+      <w:r>
+        <w:t>Pray for me, that I may follow your example</w:t>
+      </w:r>
+      <w:r>
+        <w:br/>
+        <w:t>of faith, humility, purity, and obedience.</w:t>
+      </w:r>
+    </w:p>
+    <w:p>
+      <w:pPr>
+        <w:pStyle w:val="SPPrayerEnglish"/>
+      </w:pPr>
+      <w:r>
+        <w:t>Protect my family and those entrusted to my care.</w:t>
+      </w:r>
+      <w:r>
+        <w:br/>
+        <w:t>Guide me in my work and responsibilities,</w:t>
+      </w:r>
+      <w:r>
+        <w:br/>
+        <w:t>and help me to fulfil them faithfully.</w:t>
       </w:r>
     </w:p>
     <w:p>
@@ -17759,85 +18720,844 @@
     <w:p>
       <w:pPr>
         <w:pStyle w:val="SPPrayerLatin"/>
-      </w:pPr>
-      <w:r>
-        <w:t>O glorióse Sancte Benedicte,</w:t>
-      </w:r>
-      <w:r>
-        <w:br/>
-        <w:t>sublime exemplar omnium virtutum,</w:t>
-      </w:r>
-      <w:r>
-        <w:br/>
-        <w:t>vas gratiae Dei purissimum,</w:t>
-      </w:r>
-      <w:r>
-        <w:br/>
-        <w:t>humiliter ante te genibus flexis adsto.</w:t>
-      </w:r>
+        <w:rPr>
+          <w:lang w:val="en-ZA"/>
+        </w:rPr>
+      </w:pPr>
     </w:p>
     <w:p>
       <w:pPr>
         <w:pStyle w:val="SPPrayerLatin"/>
-      </w:pPr>
-      <w:r>
-        <w:t>Te, benignissime, oro,</w:t>
-      </w:r>
-      <w:r>
-        <w:br/>
-        <w:t>ut pro me apud thronum Dei intercedere digneris.</w:t>
+        <w:rPr>
+          <w:lang w:val="en-ZA"/>
+        </w:rPr>
+      </w:pPr>
+      <w:r>
+        <w:rPr>
+          <w:lang w:val="en-ZA"/>
+        </w:rPr>
+        <w:t>O glorióse Sancte Ioseph,</w:t>
+      </w:r>
+      <w:r>
+        <w:rPr>
+          <w:lang w:val="en-ZA"/>
+        </w:rPr>
+        <w:br/>
+        <w:t>bone et fidelis serve,</w:t>
+      </w:r>
+      <w:r>
+        <w:rPr>
+          <w:lang w:val="en-ZA"/>
+        </w:rPr>
+        <w:br/>
+        <w:t>Deo placuit ut familiam suam ipsam curae tuae committeret.</w:t>
       </w:r>
     </w:p>
     <w:p>
       <w:pPr>
         <w:pStyle w:val="SPPrayerLatin"/>
-      </w:pPr>
-      <w:r>
-        <w:t>Ad te confugio in periculis</w:t>
-      </w:r>
-      <w:r>
-        <w:br/>
-        <w:t>quae me cotidie circumdant.</w:t>
-      </w:r>
-      <w:r>
-        <w:br/>
-        <w:t>Defende me ab inimicis meis</w:t>
-      </w:r>
-      <w:r>
-        <w:br/>
-        <w:t>et inspira mihi ut te in omnibus imitari studeam.</w:t>
+        <w:rPr>
+          <w:lang w:val="en-ZA"/>
+        </w:rPr>
+      </w:pPr>
+      <w:r>
+        <w:rPr>
+          <w:lang w:val="en-ZA"/>
+        </w:rPr>
+        <w:t>Corde patris Virginem Mariam protexisti</w:t>
+      </w:r>
+      <w:r>
+        <w:rPr>
+          <w:lang w:val="en-ZA"/>
+        </w:rPr>
+        <w:br/>
+        <w:t>et Iesum Christum, Filium Dei, custodivisti.</w:t>
+      </w:r>
+      <w:r>
+        <w:rPr>
+          <w:lang w:val="en-ZA"/>
+        </w:rPr>
+        <w:br/>
+        <w:t>Eis fideliter in ordinario opere cuiusque diei servivisti,</w:t>
+      </w:r>
+      <w:r>
+        <w:rPr>
+          <w:lang w:val="en-ZA"/>
+        </w:rPr>
+        <w:br/>
+        <w:t>atque exemplo tuo nos docuisti</w:t>
+      </w:r>
+      <w:r>
+        <w:rPr>
+          <w:lang w:val="en-ZA"/>
+        </w:rPr>
+        <w:br/>
+        <w:t>dignitatem humilis servitii.</w:t>
       </w:r>
     </w:p>
     <w:p>
       <w:pPr>
         <w:pStyle w:val="SPPrayerLatin"/>
-      </w:pPr>
-      <w:r>
-        <w:t>Sit benedictio tua semper mecum,</w:t>
-      </w:r>
-      <w:r>
-        <w:br/>
-        <w:t>ut quidquid Deus vetat vitare valeam</w:t>
-      </w:r>
-      <w:r>
-        <w:br/>
-        <w:t>et occasiones peccandi fugiam.</w:t>
+        <w:rPr>
+          <w:lang w:val="en-ZA"/>
+        </w:rPr>
+      </w:pPr>
+      <w:r>
+        <w:rPr>
+          <w:lang w:val="en-ZA"/>
+        </w:rPr>
+        <w:t>Ora pro me, ut exemplum tuum sequar</w:t>
+      </w:r>
+      <w:r>
+        <w:rPr>
+          <w:lang w:val="en-ZA"/>
+        </w:rPr>
+        <w:br/>
+        <w:t>fidei, humilitatis, castitatis et oboedientiae.</w:t>
       </w:r>
     </w:p>
     <w:p>
       <w:pPr>
         <w:pStyle w:val="SPPrayerLatin"/>
-      </w:pPr>
-      <w:r>
-        <w:t>Impetrā mihi a Deo</w:t>
-      </w:r>
-      <w:r>
-        <w:br/>
-        <w:t>gratias quibus indigeo</w:t>
-      </w:r>
-      <w:r>
-        <w:br/>
-        <w:t>in tribulationibus, difficultatibus et afflictionibus vitae.</w:t>
+        <w:sectPr>
+          <w:type w:val="oddPage"/>
+          <w:pgSz w:w="7920" w:h="12240" w:code="6"/>
+          <w:pgMar w:top="1080" w:right="864" w:bottom="1080" w:left="1152" w:header="576" w:footer="576" w:gutter="0"/>
+          <w:cols w:space="720"/>
+          <w:titlePg/>
+          <w:docGrid w:linePitch="360"/>
+        </w:sectPr>
+      </w:pPr>
+      <w:r>
+        <w:rPr>
+          <w:lang w:val="en-ZA"/>
+        </w:rPr>
+        <w:t>Protege familiam meam</w:t>
+      </w:r>
+      <w:r>
+        <w:rPr>
+          <w:lang w:val="en-ZA"/>
+        </w:rPr>
+        <w:br/>
+        <w:t>et eos qui curae meae commissi sunt.</w:t>
+      </w:r>
+      <w:r>
+        <w:rPr>
+          <w:lang w:val="en-ZA"/>
+        </w:rPr>
+        <w:br/>
+        <w:t>Duc me in opere meo et officiis meis,</w:t>
+      </w:r>
+      <w:r>
+        <w:rPr>
+          <w:lang w:val="en-ZA"/>
+        </w:rPr>
+        <w:br/>
+        <w:t>et adiuva me ut ea fideliter exsequar</w:t>
+      </w:r>
+      <w:r>
+        <w:t>.</w:t>
+      </w:r>
+    </w:p>
+    <w:p>
+      <w:pPr>
+        <w:pStyle w:val="SPPrayerEnglish"/>
+        <w:spacing w:before="240"/>
+      </w:pPr>
+      <w:r>
+        <w:lastRenderedPageBreak/>
+        <w:t>ENGLISH</w:t>
+      </w:r>
+      <w:r>
+        <w:tab/>
+      </w:r>
+    </w:p>
+    <w:p>
+      <w:pPr>
+        <w:pStyle w:val="SPPrayerEnglish"/>
+      </w:pPr>
+    </w:p>
+    <w:p>
+      <w:pPr>
+        <w:pStyle w:val="SPPrayerEnglish"/>
+      </w:pPr>
+      <w:r>
+        <w:t>In times of difficulty, obtain for me the grace</w:t>
+      </w:r>
+      <w:r>
+        <w:br/>
+        <w:t>to trust in God's providence</w:t>
+      </w:r>
+      <w:r>
+        <w:br/>
+        <w:t>and to remain faithful to His will.</w:t>
+      </w:r>
+    </w:p>
+    <w:p>
+      <w:pPr>
+        <w:pStyle w:val="SPPrayerEnglish"/>
+      </w:pPr>
+      <w:r>
+        <w:t>Saint Joseph, guardian of the Holy Family,</w:t>
+      </w:r>
+      <w:r>
+        <w:br/>
+        <w:t>pray for us.</w:t>
+      </w:r>
+    </w:p>
+    <w:p>
+      <w:pPr>
+        <w:pStyle w:val="SPPrayerEnglish"/>
+      </w:pPr>
+      <w:r>
+        <w:t>Amen.</w:t>
+      </w:r>
+    </w:p>
+    <w:p>
+      <w:pPr>
+        <w:pStyle w:val="SPPrayerEnglish"/>
+      </w:pPr>
+    </w:p>
+    <w:p>
+      <w:pPr>
+        <w:pStyle w:val="SPLanguage"/>
+        <w:tabs>
+          <w:tab w:val="left" w:pos="2533"/>
+          <w:tab w:val="center" w:pos="2952"/>
+        </w:tabs>
+        <w:jc w:val="left"/>
+        <w:sectPr>
+          <w:type w:val="evenPage"/>
+          <w:pgSz w:w="7920" w:h="12240" w:code="6"/>
+          <w:pgMar w:top="1080" w:right="864" w:bottom="1080" w:left="1152" w:header="576" w:footer="576" w:gutter="0"/>
+          <w:cols w:space="720"/>
+          <w:titlePg/>
+          <w:docGrid w:linePitch="360"/>
+        </w:sectPr>
+      </w:pPr>
+    </w:p>
+    <w:p>
+      <w:pPr>
+        <w:pStyle w:val="SPLanguage"/>
+      </w:pPr>
+      <w:r>
+        <w:lastRenderedPageBreak/>
+        <w:tab/>
+      </w:r>
+      <w:r>
+        <w:t>LATIN</w:t>
+      </w:r>
+    </w:p>
+    <w:p>
+      <w:pPr>
+        <w:pStyle w:val="SPPrayerLatin"/>
+        <w:rPr>
+          <w:lang w:val="en-ZA"/>
+        </w:rPr>
+      </w:pPr>
+      <w:r>
+        <w:rPr>
+          <w:lang w:val="en-ZA"/>
+        </w:rPr>
+        <w:t xml:space="preserve"> </w:t>
+      </w:r>
+    </w:p>
+    <w:p>
+      <w:pPr>
+        <w:pStyle w:val="SPPrayerLatin"/>
+        <w:rPr>
+          <w:lang w:val="en-ZA"/>
+        </w:rPr>
+      </w:pPr>
+      <w:r>
+        <w:rPr>
+          <w:lang w:val="en-ZA"/>
+        </w:rPr>
+        <w:t>In difficultatibus, impetra mihi gratiam</w:t>
+      </w:r>
+      <w:r>
+        <w:rPr>
+          <w:lang w:val="en-ZA"/>
+        </w:rPr>
+        <w:br/>
+        <w:t>divinae providentiae confidendi</w:t>
+      </w:r>
+      <w:r>
+        <w:rPr>
+          <w:lang w:val="en-ZA"/>
+        </w:rPr>
+        <w:br/>
+        <w:t>atque voluntati Dei fideliter obsequendi.</w:t>
+      </w:r>
+    </w:p>
+    <w:p>
+      <w:pPr>
+        <w:pStyle w:val="SPPrayerLatin"/>
+        <w:rPr>
+          <w:lang w:val="en-ZA"/>
+        </w:rPr>
+      </w:pPr>
+      <w:r>
+        <w:rPr>
+          <w:lang w:val="en-ZA"/>
+        </w:rPr>
+        <w:t>Sancte Ioseph, Custos Sanctae Familiae,</w:t>
+      </w:r>
+      <w:r>
+        <w:rPr>
+          <w:lang w:val="en-ZA"/>
+        </w:rPr>
+        <w:br/>
+        <w:t>ora pro nobis.</w:t>
+      </w:r>
+    </w:p>
+    <w:p>
+      <w:pPr>
+        <w:pStyle w:val="SPPrayerLatin"/>
+        <w:rPr>
+          <w:lang w:val="en-ZA"/>
+        </w:rPr>
+      </w:pPr>
+      <w:r>
+        <w:rPr>
+          <w:lang w:val="en-ZA"/>
+        </w:rPr>
+        <w:t>Amen.</w:t>
+      </w:r>
+    </w:p>
+    <w:p>
+      <w:pPr>
+        <w:pStyle w:val="SPPrayerLatin"/>
+        <w:sectPr>
+          <w:type w:val="oddPage"/>
+          <w:pgSz w:w="7920" w:h="12240" w:code="6"/>
+          <w:pgMar w:top="1080" w:right="864" w:bottom="1080" w:left="1152" w:header="576" w:footer="576" w:gutter="0"/>
+          <w:cols w:space="720"/>
+          <w:titlePg/>
+          <w:docGrid w:linePitch="360"/>
+        </w:sectPr>
+      </w:pPr>
+    </w:p>
+    <w:p>
+      <w:pPr>
+        <w:pStyle w:val="SPSectionTitle"/>
+      </w:pPr>
+      <w:r>
+        <w:lastRenderedPageBreak/>
+        <w:t>SCRIPTURE</w:t>
+      </w:r>
+    </w:p>
+    <w:p>
+      <w:pPr>
+        <w:pStyle w:val="SPScriptureReference"/>
+      </w:pPr>
+      <w:r>
+        <w:t>Matthew 1:20-21</w:t>
+      </w:r>
+    </w:p>
+    <w:p>
+      <w:pPr>
+        <w:pStyle w:val="SPScripture"/>
+      </w:pPr>
+      <w:r>
+        <w:t>But as he considered this, behold, an angel of the Lord appeared to him in a dream, saying, “Joseph, son of David, do not fear to take Mary your wife, for that which is conceived in her is of the Holy Spirit; she will bear a son, and you shall call his name Jesus, for he will save his people from their sins.”</w:t>
+      </w:r>
+    </w:p>
+    <w:p>
+      <w:pPr>
+        <w:pStyle w:val="SPScriptureReference"/>
+      </w:pPr>
+      <w:r>
+        <w:t>Matthew 1:24-25</w:t>
+      </w:r>
+    </w:p>
+    <w:p>
+      <w:pPr>
+        <w:pStyle w:val="SPScripture"/>
+      </w:pPr>
+      <w:r>
+        <w:t>When Joseph woke from sleep, he did as the angel of the Lord commanded him; he took his wife, but knew her not until she had borne a son and he called his name Jesus.</w:t>
+      </w:r>
+    </w:p>
+    <w:p>
+      <w:pPr>
+        <w:pStyle w:val="SPScriptureReference"/>
+      </w:pPr>
+      <w:r>
+        <w:t>Matthew 2:13</w:t>
+      </w:r>
+    </w:p>
+    <w:p>
+      <w:pPr>
+        <w:pStyle w:val="SPScripture"/>
+      </w:pPr>
+      <w:r>
+        <w:t>Now when they had departed, behold, an angel of the Lord appeared to Joseph in a dream and said, “Rise, take the child and his mother, and flee to Egypt, and remain there till I tell you; for Herod is about to search for the child, to destroy him.”</w:t>
+      </w:r>
+    </w:p>
+    <w:p>
+      <w:pPr>
+        <w:pStyle w:val="SPScriptureReference"/>
+      </w:pPr>
+      <w:r>
+        <w:t>Colossians 3:23-24</w:t>
+      </w:r>
+    </w:p>
+    <w:p>
+      <w:pPr>
+        <w:pStyle w:val="SPScripture"/>
+      </w:pPr>
+      <w:r>
+        <w:t>Whatever your task, work heartily</w:t>
+      </w:r>
+      <w:r>
+        <w:t>,</w:t>
+      </w:r>
+      <w:r>
+        <w:t xml:space="preserve"> as serving the Lord</w:t>
+      </w:r>
+      <w:r>
+        <w:t xml:space="preserve"> and not men, knowing that form the Lord you will receive the inheritance as your reward; you are serving the Lord Christ.</w:t>
+      </w:r>
+    </w:p>
+    <w:p>
+      <w:pPr>
+        <w:pStyle w:val="SPPrayerLatin"/>
+      </w:pPr>
+      <w:r>
+        <w:t xml:space="preserve"> </w:t>
+      </w:r>
+    </w:p>
+    <w:p>
+      <w:pPr>
+        <w:pStyle w:val="SPPrayerLatin"/>
+      </w:pPr>
+    </w:p>
+    <w:p>
+      <w:pPr>
+        <w:pStyle w:val="SPPrayerLatin"/>
+        <w:sectPr>
+          <w:type w:val="evenPage"/>
+          <w:pgSz w:w="7920" w:h="12240" w:code="6"/>
+          <w:pgMar w:top="1080" w:right="864" w:bottom="1080" w:left="1152" w:header="576" w:footer="576" w:gutter="0"/>
+          <w:cols w:space="720"/>
+          <w:titlePg/>
+          <w:docGrid w:linePitch="360"/>
+        </w:sectPr>
+      </w:pPr>
+    </w:p>
+    <w:p>
+      <w:pPr>
+        <w:pStyle w:val="SPSectionTitle"/>
+      </w:pPr>
+      <w:r>
+        <w:lastRenderedPageBreak/>
+        <w:t>reflection</w:t>
+      </w:r>
+    </w:p>
+    <w:p>
+      <w:pPr>
+        <w:pStyle w:val="SPBodyText"/>
+        <w:rPr>
+          <w:b/>
+          <w:bCs/>
+        </w:rPr>
+      </w:pPr>
+      <w:r>
+        <w:rPr>
+          <w:b/>
+          <w:bCs/>
+        </w:rPr>
+        <w:t>The Quiet Strength of Saint Joseph</w:t>
+      </w:r>
+    </w:p>
+    <w:p>
+      <w:pPr>
+        <w:pStyle w:val="SPBodyText"/>
+      </w:pPr>
+      <w:r>
+        <w:t>Saint Joseph is one of the quietest figures in the Gospel. We hear no words spoken by him, yet his life is marked by a deep and unmistakable faith.</w:t>
+      </w:r>
+    </w:p>
+    <w:p>
+      <w:pPr>
+        <w:pStyle w:val="SPBodyText"/>
+      </w:pPr>
+      <w:r>
+        <w:t>When God revealed His plan to Joseph, the path before him was not easy or obvious. He was asked to take Mary as his wife, to become the guardian of a child who was not his own by blood, and to trust a mystery he could not fully understand.</w:t>
+      </w:r>
+    </w:p>
+    <w:p>
+      <w:pPr>
+        <w:pStyle w:val="SPBodyText"/>
+      </w:pPr>
+      <w:r>
+        <w:t>Joseph responded by doing what God asked.</w:t>
+      </w:r>
+    </w:p>
+    <w:p>
+      <w:pPr>
+        <w:pStyle w:val="SPBodyText"/>
+      </w:pPr>
+      <w:r>
+        <w:t>He did not demand to know everything that lay ahead. He did not seek recognition. He simply trusted, obeyed, and acted.</w:t>
+      </w:r>
+    </w:p>
+    <w:p>
+      <w:pPr>
+        <w:pStyle w:val="SPBodyText"/>
+      </w:pPr>
+      <w:r>
+        <w:t>This quiet obedience became the way Joseph served God.</w:t>
+      </w:r>
+    </w:p>
+    <w:p>
+      <w:pPr>
+        <w:pStyle w:val="SPBodyText"/>
+      </w:pPr>
+      <w:r>
+        <w:t>When danger came, he protected Mary and Jesus. When God called him to leave, he left. When he was told to return, he returned. His life was shaped by a willingness to listen for God's voice and then faithfully carry out what was asked of him.</w:t>
+      </w:r>
+    </w:p>
+    <w:p>
+      <w:pPr>
+        <w:pStyle w:val="SPBodyText"/>
+        <w:sectPr>
+          <w:type w:val="oddPage"/>
+          <w:pgSz w:w="7920" w:h="12240" w:code="6"/>
+          <w:pgMar w:top="1080" w:right="864" w:bottom="1080" w:left="1152" w:header="576" w:footer="576" w:gutter="0"/>
+          <w:cols w:space="720"/>
+          <w:titlePg/>
+          <w:docGrid w:linePitch="360"/>
+        </w:sectPr>
+      </w:pPr>
+    </w:p>
+    <w:p>
+      <w:pPr>
+        <w:pStyle w:val="SPBodyText"/>
+      </w:pPr>
+      <w:r>
+        <w:lastRenderedPageBreak/>
+        <w:t>There is something deeply comforting in Joseph's example because much of our own lives is made up of things that seem ordinary.</w:t>
+      </w:r>
+    </w:p>
+    <w:p>
+      <w:pPr>
+        <w:pStyle w:val="SPBodyText"/>
+      </w:pPr>
+    </w:p>
+    <w:p>
+      <w:pPr>
+        <w:pStyle w:val="SPBodyText"/>
+      </w:pPr>
+      <w:r>
+        <w:t>Work.</w:t>
+      </w:r>
+      <w:r>
+        <w:br/>
+        <w:t>Family.</w:t>
+      </w:r>
+      <w:r>
+        <w:br/>
+        <w:t>Responsibility.</w:t>
+      </w:r>
+      <w:r>
+        <w:br/>
+        <w:t>Providing for others.</w:t>
+      </w:r>
+      <w:r>
+        <w:br/>
+        <w:t>Making difficult decisions.</w:t>
+      </w:r>
+      <w:r>
+        <w:br/>
+        <w:t>Doing what needs to be done even when nobody notices.</w:t>
+      </w:r>
+    </w:p>
+    <w:p>
+      <w:pPr>
+        <w:pStyle w:val="SPBodyText"/>
+      </w:pPr>
+    </w:p>
+    <w:p>
+      <w:pPr>
+        <w:pStyle w:val="SPBodyText"/>
+      </w:pPr>
+      <w:r>
+        <w:t>Joseph reminds us that these things can become acts of holiness when they are offered faithfully to God.</w:t>
+      </w:r>
+    </w:p>
+    <w:p>
+      <w:pPr>
+        <w:pStyle w:val="SPBodyText"/>
+      </w:pPr>
+      <w:r>
+        <w:t>The Gospel does not tell us that Joseph performed great miracles or preached before crowds. Instead, we find him working quietly, protecting his family, and faithfully fulfilling the responsibilities entrusted to him.</w:t>
+      </w:r>
+    </w:p>
+    <w:p>
+      <w:pPr>
+        <w:pStyle w:val="SPBodyText"/>
+      </w:pPr>
+      <w:r>
+        <w:t xml:space="preserve">His example teaches us that </w:t>
+      </w:r>
+      <w:r>
+        <w:rPr>
+          <w:b/>
+          <w:bCs/>
+        </w:rPr>
+        <w:t>holiness does not always look extraordinary</w:t>
+      </w:r>
+      <w:r>
+        <w:t>.</w:t>
+      </w:r>
+    </w:p>
+    <w:p>
+      <w:pPr>
+        <w:pStyle w:val="SPBodyText"/>
+      </w:pPr>
+    </w:p>
+    <w:p>
+      <w:pPr>
+        <w:pStyle w:val="SPBodyText"/>
+      </w:pPr>
+      <w:r>
+        <w:t>Sometimes holiness is simply getting up in the morning and doing what God has placed before us with love.</w:t>
+      </w:r>
+    </w:p>
+    <w:p>
+      <w:pPr>
+        <w:pStyle w:val="SPBodyText"/>
+      </w:pPr>
+      <w:r>
+        <w:t>Sometimes it is protecting those entrusted to our care.</w:t>
+      </w:r>
+    </w:p>
+    <w:p>
+      <w:pPr>
+        <w:pStyle w:val="SPBodyText"/>
+      </w:pPr>
+      <w:r>
+        <w:t>Sometimes it is continuing faithfully when the path is uncertain.</w:t>
+      </w:r>
+    </w:p>
+    <w:p>
+      <w:pPr>
+        <w:pStyle w:val="SPBodyText"/>
+      </w:pPr>
+      <w:r>
+        <w:t xml:space="preserve">And sometimes it is trusting God enough to say </w:t>
+      </w:r>
+      <w:r>
+        <w:rPr>
+          <w:b/>
+          <w:bCs/>
+        </w:rPr>
+        <w:t>yes</w:t>
+      </w:r>
+      <w:r>
+        <w:t>, even when we cannot yet see where that yes will lead.</w:t>
+      </w:r>
+    </w:p>
+    <w:p>
+      <w:pPr>
+        <w:pStyle w:val="SPBodyText"/>
+      </w:pPr>
+      <w:r>
+        <w:lastRenderedPageBreak/>
+        <w:t>Saint Joseph therefore becomes a companion for all who carry responsibilities, provide for others, work with their hands and minds, care for their families, or quietly bear burdens known only to God.</w:t>
+      </w:r>
+    </w:p>
+    <w:p>
+      <w:pPr>
+        <w:pStyle w:val="SPBodyText"/>
+      </w:pPr>
+      <w:r>
+        <w:t xml:space="preserve">We can ask him to teach us his quiet strength: </w:t>
+      </w:r>
+      <w:r>
+        <w:rPr>
+          <w:b/>
+          <w:bCs/>
+        </w:rPr>
+        <w:t>to listen when God calls, to obey when the way is difficult, to work faithfully, and to trust that no act of love offered to God is ever insignificant.</w:t>
+      </w:r>
+    </w:p>
+    <w:p>
+      <w:pPr>
+        <w:pStyle w:val="SPBodyText"/>
+      </w:pPr>
+    </w:p>
+    <w:p>
+      <w:pPr>
+        <w:pStyle w:val="SPBodyText"/>
+      </w:pPr>
+      <w:r>
+        <w:t>May Saint Joseph pray for us,</w:t>
+      </w:r>
+      <w:r>
+        <w:br/>
+        <w:t>that we may serve without seeking recognition,</w:t>
+      </w:r>
+      <w:r>
+        <w:br/>
+        <w:t>protect without seeking praise,</w:t>
+      </w:r>
+      <w:r>
+        <w:br/>
+        <w:t>work without losing heart,</w:t>
+      </w:r>
+      <w:r>
+        <w:br/>
+        <w:t xml:space="preserve">and trust without needing to know </w:t>
+      </w:r>
+      <w:r>
+        <w:t xml:space="preserve">all </w:t>
+      </w:r>
+      <w:r>
+        <w:t>that lies ahead.</w:t>
+      </w:r>
+    </w:p>
+    <w:p>
+      <w:pPr>
+        <w:pStyle w:val="SPBodyText"/>
+        <w:rPr>
+          <w:b/>
+          <w:bCs/>
+        </w:rPr>
+      </w:pPr>
+    </w:p>
+    <w:p>
+      <w:pPr>
+        <w:pStyle w:val="SPBodyText"/>
+      </w:pPr>
+      <w:r>
+        <w:rPr>
+          <w:b/>
+          <w:bCs/>
+        </w:rPr>
+        <w:t>Saint Joseph, faithful servant of God, pray for us.</w:t>
+      </w:r>
+      <w:r>
+        <w:br/>
+      </w:r>
+      <w:r>
+        <w:rPr>
+          <w:b/>
+          <w:bCs/>
+        </w:rPr>
+        <w:t>Guardian of the Holy Family, pray for us.</w:t>
+      </w:r>
+      <w:r>
+        <w:br/>
+      </w:r>
+      <w:r>
+        <w:rPr>
+          <w:b/>
+          <w:bCs/>
+        </w:rPr>
+        <w:t>Help us to make our ordinary lives an offering to God.</w:t>
+      </w:r>
+    </w:p>
+    <w:p>
+      <w:pPr>
+        <w:pStyle w:val="SPBodyText"/>
+        <w:sectPr>
+          <w:type w:val="evenPage"/>
+          <w:pgSz w:w="7920" w:h="12240" w:code="6"/>
+          <w:pgMar w:top="1080" w:right="864" w:bottom="1080" w:left="1152" w:header="576" w:footer="576" w:gutter="0"/>
+          <w:cols w:space="720"/>
+          <w:titlePg/>
+          <w:docGrid w:linePitch="360"/>
+        </w:sectPr>
+      </w:pPr>
+    </w:p>
+    <w:p>
+      <w:pPr>
+        <w:pStyle w:val="SPBodyText"/>
+        <w:jc w:val="center"/>
+        <w:rPr>
+          <w:rFonts w:ascii="Segoe UI Symbol" w:hAnsi="Segoe UI Symbol" w:cs="Segoe UI Symbol"/>
+        </w:rPr>
+      </w:pPr>
+      <w:r>
+        <w:rPr>
+          <w:rFonts w:ascii="Segoe UI Symbol" w:hAnsi="Segoe UI Symbol" w:cs="Segoe UI Symbol"/>
+        </w:rPr>
+        <w:lastRenderedPageBreak/>
+        <w:t>✠</w:t>
+      </w:r>
+    </w:p>
+    <w:p>
+      <w:pPr>
+        <w:pStyle w:val="SPPrayerTitle"/>
+      </w:pPr>
+      <w:r>
+        <w:t xml:space="preserve">Saint </w:t>
+      </w:r>
+      <w:r>
+        <w:t>anthony</w:t>
+      </w:r>
+    </w:p>
+    <w:p>
+      <w:pPr>
+        <w:pStyle w:val="SPBodyText"/>
+      </w:pPr>
+      <w:r>
+        <w:rPr>
+          <w:b/>
+          <w:bCs/>
+        </w:rPr>
+        <w:t xml:space="preserve"> </w:t>
+      </w:r>
+    </w:p>
+    <w:p>
+      <w:pPr>
+        <w:pStyle w:val="SPBodyText"/>
+        <w:sectPr>
+          <w:type w:val="oddPage"/>
+          <w:pgSz w:w="7920" w:h="12240" w:code="6"/>
+          <w:pgMar w:top="1080" w:right="864" w:bottom="1080" w:left="1152" w:header="576" w:footer="576" w:gutter="0"/>
+          <w:cols w:space="720"/>
+          <w:titlePg/>
+          <w:docGrid w:linePitch="360"/>
+        </w:sectPr>
+      </w:pPr>
+    </w:p>
+    <w:p>
+      <w:pPr>
+        <w:pStyle w:val="SPLanguage"/>
+        <w:spacing w:before="200"/>
+      </w:pPr>
+      <w:r>
+        <w:lastRenderedPageBreak/>
+        <w:tab/>
+        <w:t>ENGLISH</w:t>
+      </w:r>
+    </w:p>
+    <w:p>
+      <w:pPr>
+        <w:pStyle w:val="SPPrayerEnglish"/>
+      </w:pPr>
+      <w:r>
+        <w:tab/>
+      </w:r>
+    </w:p>
+    <w:p>
+      <w:pPr>
+        <w:pStyle w:val="SPPrayerEnglish"/>
+        <w:sectPr>
+          <w:type w:val="evenPage"/>
+          <w:pgSz w:w="7920" w:h="12240" w:code="6"/>
+          <w:pgMar w:top="1080" w:right="864" w:bottom="1080" w:left="1152" w:header="576" w:footer="576" w:gutter="0"/>
+          <w:cols w:space="720"/>
+          <w:titlePg/>
+          <w:docGrid w:linePitch="360"/>
+        </w:sectPr>
+      </w:pPr>
+      <w:r>
+        <w:t xml:space="preserve"> </w:t>
       </w:r>
     </w:p>
     <w:p>
@@ -17852,63 +19572,6 @@
           <w:docGrid w:linePitch="360"/>
         </w:sectPr>
       </w:pPr>
-    </w:p>
-    <w:p>
-      <w:pPr>
-        <w:pStyle w:val="SPPrayerEnglish"/>
-        <w:spacing w:before="240"/>
-      </w:pPr>
-      <w:r>
-        <w:lastRenderedPageBreak/>
-        <w:t>ENGLISH</w:t>
-      </w:r>
-    </w:p>
-    <w:p>
-      <w:pPr>
-        <w:pStyle w:val="SPPrayerEnglish"/>
-      </w:pPr>
-      <w:r>
-        <w:t>Help me to remain faithful to Christ,</w:t>
-      </w:r>
-      <w:r>
-        <w:br/>
-        <w:t>to grow in humility and virtue,</w:t>
-      </w:r>
-      <w:r>
-        <w:br/>
-        <w:t>and to trust always in God's providence.</w:t>
-      </w:r>
-    </w:p>
-    <w:p>
-      <w:pPr>
-        <w:pStyle w:val="SPPrayerEnglish"/>
-      </w:pPr>
-      <w:r>
-        <w:t>Amen.</w:t>
-      </w:r>
-    </w:p>
-    <w:p>
-      <w:pPr>
-        <w:pStyle w:val="SPPrayerEnglish"/>
-      </w:pPr>
-    </w:p>
-    <w:p>
-      <w:pPr>
-        <w:pStyle w:val="SPLanguage"/>
-        <w:sectPr>
-          <w:type w:val="evenPage"/>
-          <w:pgSz w:w="7920" w:h="12240" w:code="6"/>
-          <w:pgMar w:top="1080" w:right="864" w:bottom="1080" w:left="1152" w:header="576" w:footer="576" w:gutter="0"/>
-          <w:cols w:space="720"/>
-          <w:titlePg/>
-          <w:docGrid w:linePitch="360"/>
-        </w:sectPr>
-      </w:pPr>
-    </w:p>
-    <w:p>
-      <w:pPr>
-        <w:pStyle w:val="SPLanguage"/>
-      </w:pPr>
       <w:r>
         <w:lastRenderedPageBreak/>
         <w:t>LATIN</w:t>
@@ -17916,43 +19579,6 @@
     </w:p>
     <w:p>
       <w:pPr>
-        <w:pStyle w:val="SPPrayerLatin"/>
-      </w:pPr>
-      <w:r>
-        <w:t>Adiuva me ut Christo fidelis permaneam,</w:t>
-      </w:r>
-      <w:r>
-        <w:br/>
-        <w:t>in humilitate et virtute crescam,</w:t>
-      </w:r>
-      <w:r>
-        <w:br/>
-        <w:t>atque semper divinae providentiae confidam.</w:t>
-      </w:r>
-    </w:p>
-    <w:p>
-      <w:pPr>
-        <w:pStyle w:val="SPPrayerLatin"/>
-      </w:pPr>
-      <w:r>
-        <w:t>Amen.</w:t>
-      </w:r>
-    </w:p>
-    <w:p>
-      <w:pPr>
-        <w:pStyle w:val="SPLanguage"/>
-        <w:sectPr>
-          <w:type w:val="oddPage"/>
-          <w:pgSz w:w="7920" w:h="12240" w:code="6"/>
-          <w:pgMar w:top="1080" w:right="864" w:bottom="1080" w:left="1152" w:header="576" w:footer="576" w:gutter="0"/>
-          <w:cols w:space="720"/>
-          <w:titlePg/>
-          <w:docGrid w:linePitch="360"/>
-        </w:sectPr>
-      </w:pPr>
-    </w:p>
-    <w:p>
-      <w:pPr>
         <w:pStyle w:val="SPSectionTitle"/>
       </w:pPr>
       <w:r>
@@ -17962,70 +19588,8 @@
     </w:p>
     <w:p>
       <w:pPr>
-        <w:pStyle w:val="SPScriptureReference"/>
-      </w:pPr>
-      <w:r>
-        <w:t>Matthew 4:10</w:t>
-      </w:r>
-    </w:p>
-    <w:p>
-      <w:pPr>
-        <w:pStyle w:val="SPScripture"/>
-      </w:pPr>
-      <w:r>
-        <w:t>Then Jesus said to him, “Begone, Satan! for it is written, ‘You shall worship the Lord your God and him only shall you serve.’”</w:t>
-      </w:r>
-    </w:p>
-    <w:p>
-      <w:pPr>
-        <w:pStyle w:val="SPScriptureReference"/>
-      </w:pPr>
-      <w:r>
-        <w:t>James 4:7</w:t>
-      </w:r>
-    </w:p>
-    <w:p>
-      <w:pPr>
-        <w:pStyle w:val="SPScripture"/>
-      </w:pPr>
-      <w:r>
-        <w:t>Submit yourselves therefore to God. Resist the devil and he will flee from you.</w:t>
-      </w:r>
-    </w:p>
-    <w:p>
-      <w:pPr>
-        <w:pStyle w:val="SPScriptureReference"/>
-      </w:pPr>
-      <w:r>
-        <w:t>1 Peter 5:8-9</w:t>
-      </w:r>
-    </w:p>
-    <w:p>
-      <w:pPr>
-        <w:pStyle w:val="SPScripture"/>
-      </w:pPr>
-      <w:r>
-        <w:t>Be sober, be watchful. Your adversary the devil prowls around like a roaring lion, seeking someone to devour. Resist him, firm in your faith, knowing that the same experience of suffering is required of your brotherhood throughout the world.</w:t>
-      </w:r>
-    </w:p>
-    <w:p>
-      <w:pPr>
-        <w:pStyle w:val="SPScriptureReference"/>
-      </w:pPr>
-      <w:r>
-        <w:t>Philippians</w:t>
-      </w:r>
-      <w:r>
-        <w:t xml:space="preserve"> 4:13</w:t>
-      </w:r>
-    </w:p>
-    <w:p>
-      <w:pPr>
-        <w:pStyle w:val="SPScripture"/>
-      </w:pPr>
-      <w:r>
-        <w:t>I can do all things in him who strengthens me.</w:t>
-      </w:r>
+        <w:pStyle w:val="SPLanguage"/>
+      </w:pPr>
     </w:p>
     <w:p>
       <w:pPr>
@@ -18066,273 +19630,6 @@
     <w:p>
       <w:pPr>
         <w:pStyle w:val="SPSectionTitle"/>
-      </w:pPr>
-      <w:r>
-        <w:lastRenderedPageBreak/>
-        <w:t>reflection</w:t>
-      </w:r>
-    </w:p>
-    <w:p>
-      <w:pPr>
-        <w:pStyle w:val="SPBodyText"/>
-        <w:rPr>
-          <w:b/>
-          <w:bCs/>
-        </w:rPr>
-      </w:pPr>
-      <w:r>
-        <w:t xml:space="preserve"> </w:t>
-      </w:r>
-      <w:r>
-        <w:rPr>
-          <w:b/>
-          <w:bCs/>
-        </w:rPr>
-        <w:t>The Cross as Our Light</w:t>
-      </w:r>
-    </w:p>
-    <w:p>
-      <w:pPr>
-        <w:pStyle w:val="SPBodyText"/>
-      </w:pPr>
-      <w:r>
-        <w:t>There is something striking about the traditional words associated with Saint Benedict:</w:t>
-      </w:r>
-    </w:p>
-    <w:p>
-      <w:pPr>
-        <w:pStyle w:val="SPBodyText"/>
-        <w:rPr>
-          <w:b/>
-          <w:bCs/>
-        </w:rPr>
-      </w:pPr>
-    </w:p>
-    <w:p>
-      <w:pPr>
-        <w:pStyle w:val="SPBodyText"/>
-      </w:pPr>
-      <w:r>
-        <w:rPr>
-          <w:b/>
-          <w:bCs/>
-        </w:rPr>
-        <w:t>Crux sacra sit mihi lux.</w:t>
-      </w:r>
-      <w:r>
-        <w:br/>
-      </w:r>
-      <w:r>
-        <w:rPr>
-          <w:i/>
-          <w:iCs/>
-        </w:rPr>
-        <w:t>May the Holy Cross be my light.</w:t>
-      </w:r>
-    </w:p>
-    <w:p>
-      <w:pPr>
-        <w:pStyle w:val="SPBodyText"/>
-      </w:pPr>
-    </w:p>
-    <w:p>
-      <w:pPr>
-        <w:pStyle w:val="SPBodyText"/>
-      </w:pPr>
-      <w:r>
-        <w:t>We often think of protection as being kept safe from everything that might harm us. But the Christian life does not promise that we will never encounter temptation, suffering, uncertainty, or difficulty. Instead, Christ promises to remain with us through them.</w:t>
-      </w:r>
-    </w:p>
-    <w:p>
-      <w:pPr>
-        <w:pStyle w:val="SPBodyText"/>
-      </w:pPr>
-      <w:r>
-        <w:t xml:space="preserve">The Cross therefore becomes more than a symbol of protection. It becomes a </w:t>
-      </w:r>
-      <w:r>
-        <w:rPr>
-          <w:b/>
-          <w:bCs/>
-        </w:rPr>
-        <w:t>light by which we learn how to walk</w:t>
-      </w:r>
-      <w:r>
-        <w:t>.</w:t>
-      </w:r>
-    </w:p>
-    <w:p>
-      <w:pPr>
-        <w:pStyle w:val="SPBodyText"/>
-      </w:pPr>
-      <w:r>
-        <w:t>Saint Benedict understood that holiness is not achieved through one great act, but through a life of faithfulness. In his Rule, he placed great emphasis on humility, obedience, discipline, prayer, and perseverance. These virtues may seem ordinary, but it is often through such ordinary things that God gradually transforms the heart.</w:t>
-      </w:r>
-    </w:p>
-    <w:p>
-      <w:pPr>
-        <w:pStyle w:val="SPBodyText"/>
-      </w:pPr>
-      <w:r>
-        <w:t>When we ask Saint Benedict to pray for us, we are not asking him to take the place of Christ. We are asking for the prayers of one who faithfully followed Christ and now stands before Him.</w:t>
-      </w:r>
-    </w:p>
-    <w:p>
-      <w:pPr>
-        <w:pStyle w:val="SPBodyText"/>
-      </w:pPr>
-      <w:r>
-        <w:lastRenderedPageBreak/>
-        <w:t xml:space="preserve">The words of Scripture remind us that we are called to resist evil, but also to </w:t>
-      </w:r>
-      <w:r>
-        <w:rPr>
-          <w:b/>
-          <w:bCs/>
-        </w:rPr>
-        <w:t>submit ourselves to God</w:t>
-      </w:r>
-      <w:r>
-        <w:t>. Our strength does not come from ourselves. We remain steadfast because God gives us the grace to persevere.</w:t>
-      </w:r>
-    </w:p>
-    <w:p>
-      <w:pPr>
-        <w:pStyle w:val="SPBodyText"/>
-      </w:pPr>
-      <w:r>
-        <w:t>There will be times when the path ahead is unclear. There will be moments when temptation is strong, when fear unsettles us, or when we simply grow weary of doing what is good.</w:t>
-      </w:r>
-    </w:p>
-    <w:p>
-      <w:pPr>
-        <w:pStyle w:val="SPBodyText"/>
-      </w:pPr>
-      <w:r>
-        <w:t>In those moments, we can return to the Cross.</w:t>
-      </w:r>
-    </w:p>
-    <w:p>
-      <w:pPr>
-        <w:pStyle w:val="SPBodyText"/>
-        <w:rPr>
-          <w:b/>
-          <w:bCs/>
-        </w:rPr>
-      </w:pPr>
-    </w:p>
-    <w:p>
-      <w:pPr>
-        <w:pStyle w:val="SPBodyText"/>
-      </w:pPr>
-      <w:r>
-        <w:rPr>
-          <w:b/>
-          <w:bCs/>
-        </w:rPr>
-        <w:t>Crux sacra sit mihi lux.</w:t>
-      </w:r>
-      <w:r>
-        <w:br/>
-      </w:r>
-      <w:r>
-        <w:rPr>
-          <w:i/>
-          <w:iCs/>
-        </w:rPr>
-        <w:t>May the Holy Cross be my light.</w:t>
-      </w:r>
-    </w:p>
-    <w:p>
-      <w:pPr>
-        <w:pStyle w:val="SPBodyText"/>
-      </w:pPr>
-    </w:p>
-    <w:p>
-      <w:pPr>
-        <w:pStyle w:val="SPBodyText"/>
-      </w:pPr>
-      <w:r>
-        <w:t xml:space="preserve">Not merely to show me what lies ahead, but to remind me </w:t>
-      </w:r>
-      <w:r>
-        <w:rPr>
-          <w:b/>
-          <w:bCs/>
-        </w:rPr>
-        <w:t>who walks with me</w:t>
-      </w:r>
-      <w:r>
-        <w:t>.</w:t>
-      </w:r>
-    </w:p>
-    <w:p>
-      <w:pPr>
-        <w:pStyle w:val="SPBodyText"/>
-      </w:pPr>
-      <w:r>
-        <w:t>And so the prayer to Saint Benedict becomes a prayer for a faithful life: to remain close to Christ, to resist what leads us away from Him, to grow in humility and virtue, and to trust God's providence even when we cannot yet see where He is leading us.</w:t>
-      </w:r>
-    </w:p>
-    <w:p>
-      <w:pPr>
-        <w:pStyle w:val="SPBodyText"/>
-      </w:pPr>
-    </w:p>
-    <w:p>
-      <w:pPr>
-        <w:pStyle w:val="SPBodyText"/>
-      </w:pPr>
-      <w:r>
-        <w:rPr>
-          <w:b/>
-          <w:bCs/>
-        </w:rPr>
-        <w:t>May Christ be our strength.</w:t>
-      </w:r>
-      <w:r>
-        <w:rPr>
-          <w:b/>
-          <w:bCs/>
-        </w:rPr>
-        <w:br/>
-        <w:t>May His Cross be our light.</w:t>
-      </w:r>
-      <w:r>
-        <w:rPr>
-          <w:b/>
-          <w:bCs/>
-        </w:rPr>
-        <w:br/>
-        <w:t>And may we remain faithful to Him,</w:t>
-      </w:r>
-      <w:r>
-        <w:rPr>
-          <w:b/>
-          <w:bCs/>
-        </w:rPr>
-        <w:br/>
-        <w:t>one day and one step at a time.</w:t>
-      </w:r>
-    </w:p>
-    <w:p>
-      <w:pPr>
-        <w:pStyle w:val="SPBodyText"/>
-      </w:pPr>
-    </w:p>
-    <w:p>
-      <w:pPr>
-        <w:pStyle w:val="SPBodyText"/>
-      </w:pPr>
-    </w:p>
-    <w:p>
-      <w:pPr>
-        <w:pStyle w:val="SPBodyText"/>
-      </w:pPr>
-    </w:p>
-    <w:p>
-      <w:pPr>
-        <w:pStyle w:val="SPSectionTitle"/>
         <w:sectPr>
           <w:type w:val="oddPage"/>
           <w:pgSz w:w="7920" w:h="12240" w:code="6"/>
@@ -18342,6 +19639,10 @@
           <w:docGrid w:linePitch="360"/>
         </w:sectPr>
       </w:pPr>
+      <w:r>
+        <w:lastRenderedPageBreak/>
+        <w:t>reflection</w:t>
+      </w:r>
     </w:p>
     <w:p>
       <w:pPr>
@@ -18367,354 +19668,8 @@
         <w:t xml:space="preserve">Saint </w:t>
       </w:r>
       <w:r>
-        <w:t>joseph</w:t>
-      </w:r>
-    </w:p>
-    <w:p>
-      <w:pPr>
-        <w:pStyle w:val="SPBodyText"/>
-      </w:pPr>
-      <w:r>
-        <w:rPr>
-          <w:b/>
-          <w:bCs/>
-        </w:rPr>
-        <w:t xml:space="preserve"> </w:t>
-      </w:r>
-    </w:p>
-    <w:p>
-      <w:pPr>
-        <w:pStyle w:val="SPBodyText"/>
-        <w:sectPr>
-          <w:type w:val="oddPage"/>
-          <w:pgSz w:w="7920" w:h="12240" w:code="6"/>
-          <w:pgMar w:top="1080" w:right="864" w:bottom="1080" w:left="1152" w:header="576" w:footer="576" w:gutter="0"/>
-          <w:cols w:space="720"/>
-          <w:titlePg/>
-          <w:docGrid w:linePitch="360"/>
-        </w:sectPr>
-      </w:pPr>
-    </w:p>
-    <w:p>
-      <w:pPr>
-        <w:pStyle w:val="SPLanguage"/>
-        <w:spacing w:before="200"/>
-      </w:pPr>
-      <w:r>
-        <w:lastRenderedPageBreak/>
-        <w:tab/>
-        <w:t>ENGLISH</w:t>
-      </w:r>
-    </w:p>
-    <w:p>
-      <w:pPr>
-        <w:pStyle w:val="SPPrayerEnglish"/>
-      </w:pPr>
-      <w:r>
-        <w:tab/>
-      </w:r>
-    </w:p>
-    <w:p>
-      <w:pPr>
-        <w:pStyle w:val="SPPrayerEnglish"/>
-        <w:sectPr>
-          <w:type w:val="evenPage"/>
-          <w:pgSz w:w="7920" w:h="12240" w:code="6"/>
-          <w:pgMar w:top="1080" w:right="864" w:bottom="1080" w:left="1152" w:header="576" w:footer="576" w:gutter="0"/>
-          <w:cols w:space="720"/>
-          <w:titlePg/>
-          <w:docGrid w:linePitch="360"/>
-        </w:sectPr>
-      </w:pPr>
-      <w:r>
-        <w:t xml:space="preserve"> </w:t>
-      </w:r>
-    </w:p>
-    <w:p>
-      <w:pPr>
-        <w:pStyle w:val="SPLanguage"/>
-        <w:sectPr>
-          <w:type w:val="oddPage"/>
-          <w:pgSz w:w="7920" w:h="12240" w:code="6"/>
-          <w:pgMar w:top="1080" w:right="864" w:bottom="1080" w:left="1152" w:header="576" w:footer="576" w:gutter="0"/>
-          <w:cols w:space="720"/>
-          <w:titlePg/>
-          <w:docGrid w:linePitch="360"/>
-        </w:sectPr>
-      </w:pPr>
-      <w:r>
-        <w:lastRenderedPageBreak/>
-        <w:t>LATIN</w:t>
-      </w:r>
-    </w:p>
-    <w:p>
-      <w:pPr>
-        <w:pStyle w:val="SPSectionTitle"/>
-      </w:pPr>
-      <w:r>
-        <w:lastRenderedPageBreak/>
-        <w:t>SCRIPTURE</w:t>
-      </w:r>
-    </w:p>
-    <w:p>
-      <w:pPr>
-        <w:pStyle w:val="SPLanguage"/>
-      </w:pPr>
-    </w:p>
-    <w:p>
-      <w:pPr>
-        <w:pStyle w:val="SPPrayerLatin"/>
-        <w:rPr>
-          <w:b/>
-          <w:bCs/>
-          <w:lang w:val="en-ZA"/>
-        </w:rPr>
-      </w:pPr>
-    </w:p>
-    <w:p>
-      <w:pPr>
-        <w:pStyle w:val="SPPrayerLatin"/>
-      </w:pPr>
-      <w:r>
-        <w:t xml:space="preserve"> </w:t>
-      </w:r>
-    </w:p>
-    <w:p>
-      <w:pPr>
-        <w:pStyle w:val="SPPrayerLatin"/>
-      </w:pPr>
-    </w:p>
-    <w:p>
-      <w:pPr>
-        <w:pStyle w:val="SPPrayerLatin"/>
-        <w:sectPr>
-          <w:type w:val="evenPage"/>
-          <w:pgSz w:w="7920" w:h="12240" w:code="6"/>
-          <w:pgMar w:top="1080" w:right="864" w:bottom="1080" w:left="1152" w:header="576" w:footer="576" w:gutter="0"/>
-          <w:cols w:space="720"/>
-          <w:titlePg/>
-          <w:docGrid w:linePitch="360"/>
-        </w:sectPr>
-      </w:pPr>
-    </w:p>
-    <w:p>
-      <w:pPr>
-        <w:pStyle w:val="SPSectionTitle"/>
-        <w:sectPr>
-          <w:type w:val="oddPage"/>
-          <w:pgSz w:w="7920" w:h="12240" w:code="6"/>
-          <w:pgMar w:top="1080" w:right="864" w:bottom="1080" w:left="1152" w:header="576" w:footer="576" w:gutter="0"/>
-          <w:cols w:space="720"/>
-          <w:titlePg/>
-          <w:docGrid w:linePitch="360"/>
-        </w:sectPr>
-      </w:pPr>
-      <w:r>
-        <w:lastRenderedPageBreak/>
-        <w:t>reflection</w:t>
-      </w:r>
-    </w:p>
-    <w:p>
-      <w:pPr>
-        <w:pStyle w:val="SPBodyText"/>
-        <w:jc w:val="center"/>
-        <w:rPr>
-          <w:rFonts w:ascii="Segoe UI Symbol" w:hAnsi="Segoe UI Symbol" w:cs="Segoe UI Symbol"/>
-        </w:rPr>
-      </w:pPr>
-      <w:r>
-        <w:rPr>
-          <w:rFonts w:ascii="Segoe UI Symbol" w:hAnsi="Segoe UI Symbol" w:cs="Segoe UI Symbol"/>
-        </w:rPr>
-        <w:lastRenderedPageBreak/>
-        <w:t>✠</w:t>
-      </w:r>
-    </w:p>
-    <w:p>
-      <w:pPr>
-        <w:pStyle w:val="SPPrayerTitle"/>
-      </w:pPr>
-      <w:r>
-        <w:t xml:space="preserve">Saint </w:t>
-      </w:r>
-      <w:proofErr w:type="spellStart"/>
-      <w:r>
-        <w:t>anthony</w:t>
-      </w:r>
-      <w:proofErr w:type="spellEnd"/>
-    </w:p>
-    <w:p>
-      <w:pPr>
-        <w:pStyle w:val="SPBodyText"/>
-      </w:pPr>
-      <w:r>
-        <w:rPr>
-          <w:b/>
-          <w:bCs/>
-        </w:rPr>
-        <w:t xml:space="preserve"> </w:t>
-      </w:r>
-    </w:p>
-    <w:p>
-      <w:pPr>
-        <w:pStyle w:val="SPBodyText"/>
-        <w:sectPr>
-          <w:type w:val="oddPage"/>
-          <w:pgSz w:w="7920" w:h="12240" w:code="6"/>
-          <w:pgMar w:top="1080" w:right="864" w:bottom="1080" w:left="1152" w:header="576" w:footer="576" w:gutter="0"/>
-          <w:cols w:space="720"/>
-          <w:titlePg/>
-          <w:docGrid w:linePitch="360"/>
-        </w:sectPr>
-      </w:pPr>
-    </w:p>
-    <w:p>
-      <w:pPr>
-        <w:pStyle w:val="SPLanguage"/>
-        <w:spacing w:before="200"/>
-      </w:pPr>
-      <w:r>
-        <w:lastRenderedPageBreak/>
-        <w:tab/>
-        <w:t>ENGLISH</w:t>
-      </w:r>
-    </w:p>
-    <w:p>
-      <w:pPr>
-        <w:pStyle w:val="SPPrayerEnglish"/>
-      </w:pPr>
-      <w:r>
-        <w:tab/>
-      </w:r>
-    </w:p>
-    <w:p>
-      <w:pPr>
-        <w:pStyle w:val="SPPrayerEnglish"/>
-        <w:sectPr>
-          <w:type w:val="evenPage"/>
-          <w:pgSz w:w="7920" w:h="12240" w:code="6"/>
-          <w:pgMar w:top="1080" w:right="864" w:bottom="1080" w:left="1152" w:header="576" w:footer="576" w:gutter="0"/>
-          <w:cols w:space="720"/>
-          <w:titlePg/>
-          <w:docGrid w:linePitch="360"/>
-        </w:sectPr>
-      </w:pPr>
-      <w:r>
-        <w:t xml:space="preserve"> </w:t>
-      </w:r>
-    </w:p>
-    <w:p>
-      <w:pPr>
-        <w:pStyle w:val="SPLanguage"/>
-        <w:sectPr>
-          <w:type w:val="oddPage"/>
-          <w:pgSz w:w="7920" w:h="12240" w:code="6"/>
-          <w:pgMar w:top="1080" w:right="864" w:bottom="1080" w:left="1152" w:header="576" w:footer="576" w:gutter="0"/>
-          <w:cols w:space="720"/>
-          <w:titlePg/>
-          <w:docGrid w:linePitch="360"/>
-        </w:sectPr>
-      </w:pPr>
-      <w:r>
-        <w:lastRenderedPageBreak/>
-        <w:t>LATIN</w:t>
-      </w:r>
-    </w:p>
-    <w:p>
-      <w:pPr>
-        <w:pStyle w:val="SPSectionTitle"/>
-      </w:pPr>
-      <w:r>
-        <w:lastRenderedPageBreak/>
-        <w:t>SCRIPTURE</w:t>
-      </w:r>
-    </w:p>
-    <w:p>
-      <w:pPr>
-        <w:pStyle w:val="SPLanguage"/>
-      </w:pPr>
-    </w:p>
-    <w:p>
-      <w:pPr>
-        <w:pStyle w:val="SPPrayerLatin"/>
-        <w:rPr>
-          <w:b/>
-          <w:bCs/>
-          <w:lang w:val="en-ZA"/>
-        </w:rPr>
-      </w:pPr>
-    </w:p>
-    <w:p>
-      <w:pPr>
-        <w:pStyle w:val="SPPrayerLatin"/>
-      </w:pPr>
-      <w:r>
-        <w:t xml:space="preserve"> </w:t>
-      </w:r>
-    </w:p>
-    <w:p>
-      <w:pPr>
-        <w:pStyle w:val="SPPrayerLatin"/>
-      </w:pPr>
-    </w:p>
-    <w:p>
-      <w:pPr>
-        <w:pStyle w:val="SPPrayerLatin"/>
-        <w:sectPr>
-          <w:type w:val="evenPage"/>
-          <w:pgSz w:w="7920" w:h="12240" w:code="6"/>
-          <w:pgMar w:top="1080" w:right="864" w:bottom="1080" w:left="1152" w:header="576" w:footer="576" w:gutter="0"/>
-          <w:cols w:space="720"/>
-          <w:titlePg/>
-          <w:docGrid w:linePitch="360"/>
-        </w:sectPr>
-      </w:pPr>
-    </w:p>
-    <w:p>
-      <w:pPr>
-        <w:pStyle w:val="SPSectionTitle"/>
-        <w:sectPr>
-          <w:type w:val="oddPage"/>
-          <w:pgSz w:w="7920" w:h="12240" w:code="6"/>
-          <w:pgMar w:top="1080" w:right="864" w:bottom="1080" w:left="1152" w:header="576" w:footer="576" w:gutter="0"/>
-          <w:cols w:space="720"/>
-          <w:titlePg/>
-          <w:docGrid w:linePitch="360"/>
-        </w:sectPr>
-      </w:pPr>
-      <w:r>
-        <w:lastRenderedPageBreak/>
-        <w:t>reflection</w:t>
-      </w:r>
-    </w:p>
-    <w:p>
-      <w:pPr>
-        <w:pStyle w:val="SPBodyText"/>
-        <w:jc w:val="center"/>
-        <w:rPr>
-          <w:rFonts w:ascii="Segoe UI Symbol" w:hAnsi="Segoe UI Symbol" w:cs="Segoe UI Symbol"/>
-        </w:rPr>
-      </w:pPr>
-      <w:r>
-        <w:rPr>
-          <w:rFonts w:ascii="Segoe UI Symbol" w:hAnsi="Segoe UI Symbol" w:cs="Segoe UI Symbol"/>
-        </w:rPr>
-        <w:lastRenderedPageBreak/>
-        <w:t>✠</w:t>
-      </w:r>
-    </w:p>
-    <w:p>
-      <w:pPr>
-        <w:pStyle w:val="SPPrayerTitle"/>
-      </w:pPr>
-      <w:r>
-        <w:t xml:space="preserve">Saint </w:t>
-      </w:r>
-      <w:proofErr w:type="spellStart"/>
-      <w:r>
         <w:t>christopher</w:t>
       </w:r>
-      <w:proofErr w:type="spellEnd"/>
     </w:p>
     <w:p>
       <w:pPr>

</xml_diff>

<commit_message>
St Anthony prayer started.
</commit_message>
<xml_diff>
--- a/manuscript/volume-1/sacrae-preces-volume-1.docx
+++ b/manuscript/volume-1/sacrae-preces-volume-1.docx
@@ -74,7 +74,6 @@
           <w:szCs w:val="18"/>
         </w:rPr>
       </w:pPr>
-      <w:proofErr w:type="spellStart"/>
       <w:r>
         <w:rPr>
           <w:rStyle w:val="SPPrayerResponseCS"/>
@@ -82,17 +81,7 @@
           <w:sz w:val="48"/>
           <w:szCs w:val="18"/>
         </w:rPr>
-        <w:t>Sacrea</w:t>
-      </w:r>
-      <w:proofErr w:type="spellEnd"/>
-      <w:r>
-        <w:rPr>
-          <w:rStyle w:val="SPPrayerResponseCS"/>
-          <w:i w:val="0"/>
-          <w:sz w:val="48"/>
-          <w:szCs w:val="18"/>
-        </w:rPr>
-        <w:t xml:space="preserve"> preces</w:t>
+        <w:t>Sacrea preces</w:t>
       </w:r>
     </w:p>
     <w:p>
@@ -2547,58 +2536,16 @@
         <w:rPr>
           <w:rStyle w:val="Emphasis"/>
         </w:rPr>
-        <w:t>in NOH-mee-</w:t>
-      </w:r>
-      <w:proofErr w:type="spellStart"/>
+        <w:t>in NOH-mee-neh PAH-tris,</w:t>
+      </w:r>
+      <w:r>
+        <w:br/>
+      </w:r>
       <w:r>
         <w:rPr>
           <w:rStyle w:val="Emphasis"/>
         </w:rPr>
-        <w:t>neh</w:t>
-      </w:r>
-      <w:proofErr w:type="spellEnd"/>
-      <w:r>
-        <w:rPr>
-          <w:rStyle w:val="Emphasis"/>
-        </w:rPr>
-        <w:t xml:space="preserve"> PAH-tris,</w:t>
-      </w:r>
-      <w:r>
-        <w:br/>
-      </w:r>
-      <w:r>
-        <w:rPr>
-          <w:rStyle w:val="Emphasis"/>
-        </w:rPr>
-        <w:t>et FEE-lee-ee, et SPEE-</w:t>
-      </w:r>
-      <w:proofErr w:type="spellStart"/>
-      <w:r>
-        <w:rPr>
-          <w:rStyle w:val="Emphasis"/>
-        </w:rPr>
-        <w:t>ree</w:t>
-      </w:r>
-      <w:proofErr w:type="spellEnd"/>
-      <w:r>
-        <w:rPr>
-          <w:rStyle w:val="Emphasis"/>
-        </w:rPr>
-        <w:t>-</w:t>
-      </w:r>
-      <w:proofErr w:type="spellStart"/>
-      <w:r>
-        <w:rPr>
-          <w:rStyle w:val="Emphasis"/>
-        </w:rPr>
-        <w:t>toos</w:t>
-      </w:r>
-      <w:proofErr w:type="spellEnd"/>
-      <w:r>
-        <w:rPr>
-          <w:rStyle w:val="Emphasis"/>
-        </w:rPr>
-        <w:t xml:space="preserve"> SAHNK-tee.</w:t>
+        <w:t>et FEE-lee-ee, et SPEE-ree-toos SAHNK-tee.</w:t>
       </w:r>
       <w:r>
         <w:br/>
@@ -3064,15 +3011,7 @@
         <w:pStyle w:val="SPScripture"/>
       </w:pPr>
       <w:r>
-        <w:t xml:space="preserve">Our Father who art in heaven, </w:t>
-      </w:r>
-      <w:proofErr w:type="gramStart"/>
-      <w:r>
-        <w:t>Hallowed</w:t>
-      </w:r>
-      <w:proofErr w:type="gramEnd"/>
-      <w:r>
-        <w:t xml:space="preserve"> be thy name. Thy kingdom come</w:t>
+        <w:t>Our Father who art in heaven, Hallowed be thy name. Thy kingdom come</w:t>
       </w:r>
       <w:r>
         <w:t>.</w:t>
@@ -3157,17 +3096,7 @@
         <w:t>Your</w:t>
       </w:r>
       <w:r>
-        <w:t xml:space="preserve"> kingdom come. Give us each day our daily bread; and forgive us our sins, for we ourselves forgive </w:t>
-      </w:r>
-      <w:proofErr w:type="spellStart"/>
-      <w:proofErr w:type="gramStart"/>
-      <w:r>
-        <w:t>every one</w:t>
-      </w:r>
-      <w:proofErr w:type="spellEnd"/>
-      <w:proofErr w:type="gramEnd"/>
-      <w:r>
-        <w:t xml:space="preserve"> who is indebted to us; and lead us not into temptation.</w:t>
+        <w:t xml:space="preserve"> kingdom come. Give us each day our daily bread; and forgive us our sins, for we ourselves forgive every one who is indebted to us; and lead us not into temptation.</w:t>
       </w:r>
       <w:r>
         <w:t>”</w:t>
@@ -3249,7 +3178,6 @@
       <w:r>
         <w:t xml:space="preserve">The first word is not </w:t>
       </w:r>
-      <w:proofErr w:type="gramStart"/>
       <w:r>
         <w:rPr>
           <w:i/>
@@ -3257,12 +3185,9 @@
         </w:rPr>
         <w:t>my</w:t>
       </w:r>
-      <w:proofErr w:type="gramEnd"/>
       <w:r>
         <w:t xml:space="preserve">. It is </w:t>
       </w:r>
-      <w:proofErr w:type="spellStart"/>
-      <w:proofErr w:type="gramStart"/>
       <w:r>
         <w:rPr>
           <w:i/>
@@ -3270,8 +3195,6 @@
         </w:rPr>
         <w:t>our</w:t>
       </w:r>
-      <w:proofErr w:type="spellEnd"/>
-      <w:proofErr w:type="gramEnd"/>
       <w:r>
         <w:t>.</w:t>
       </w:r>
@@ -3498,13 +3421,8 @@
         <w:pStyle w:val="SPPrayerTitle"/>
       </w:pPr>
       <w:r>
-        <w:t xml:space="preserve">The Hail </w:t>
-      </w:r>
-      <w:proofErr w:type="spellStart"/>
-      <w:r>
-        <w:t>mary</w:t>
-      </w:r>
-      <w:proofErr w:type="spellEnd"/>
+        <w:t>The Hail mary</w:t>
+      </w:r>
     </w:p>
     <w:p>
       <w:pPr>
@@ -4541,15 +4459,7 @@
         <w:pStyle w:val="SPPrayerEnglish"/>
       </w:pPr>
       <w:r>
-        <w:t xml:space="preserve">Glory be to the </w:t>
-      </w:r>
-      <w:proofErr w:type="gramStart"/>
-      <w:r>
-        <w:t>Father</w:t>
-      </w:r>
-      <w:proofErr w:type="gramEnd"/>
-      <w:r>
-        <w:t>,</w:t>
+        <w:t>Glory be to the Father,</w:t>
       </w:r>
     </w:p>
     <w:p>
@@ -4557,13 +4467,8 @@
         <w:pStyle w:val="SPPrayerEnglish"/>
       </w:pPr>
       <w:r>
-        <w:t xml:space="preserve">And to the </w:t>
-      </w:r>
-      <w:proofErr w:type="gramStart"/>
-      <w:r>
-        <w:t>Son</w:t>
-      </w:r>
-      <w:proofErr w:type="gramEnd"/>
+        <w:t>And to the Son</w:t>
+      </w:r>
     </w:p>
     <w:p>
       <w:pPr>
@@ -4741,15 +4646,7 @@
         <w:pStyle w:val="SPScripture"/>
       </w:pPr>
       <w:r>
-        <w:t>“</w:t>
-      </w:r>
-      <w:proofErr w:type="gramStart"/>
-      <w:r>
-        <w:t>to</w:t>
-      </w:r>
-      <w:proofErr w:type="gramEnd"/>
-      <w:r>
-        <w:t xml:space="preserve"> him be glory in the Church and in Christ Jesus to all generations, for ever and ever. Amen.”</w:t>
+        <w:t>“to him be glory in the Church and in Christ Jesus to all generations, for ever and ever. Amen.”</w:t>
       </w:r>
     </w:p>
     <w:p>
@@ -4806,15 +4703,7 @@
         <w:pStyle w:val="SPScripture"/>
       </w:pPr>
       <w:r>
-        <w:t>“</w:t>
-      </w:r>
-      <w:proofErr w:type="gramStart"/>
-      <w:r>
-        <w:t>and</w:t>
-      </w:r>
-      <w:proofErr w:type="gramEnd"/>
-      <w:r>
-        <w:t xml:space="preserve"> from Jesus Christ the faithful witness, the first-born of the dead, and the ruler of kings on earth. To him who loves us and has freed us from our sins by his blood and made us a kingdom, priests to God and Father, to him be glory and dominion for ever and ever. Amen.”</w:t>
+        <w:t>“and from Jesus Christ the faithful witness, the first-born of the dead, and the ruler of kings on earth. To him who loves us and has freed us from our sins by his blood and made us a kingdom, priests to God and Father, to him be glory and dominion for ever and ever. Amen.”</w:t>
       </w:r>
     </w:p>
     <w:p>
@@ -4891,17 +4780,8 @@
           <w:b/>
           <w:bCs/>
         </w:rPr>
-        <w:t xml:space="preserve">Glory be to the </w:t>
-      </w:r>
-      <w:proofErr w:type="gramStart"/>
-      <w:r>
-        <w:rPr>
-          <w:b/>
-          <w:bCs/>
-        </w:rPr>
-        <w:t>Father</w:t>
-      </w:r>
-      <w:proofErr w:type="gramEnd"/>
+        <w:t>Glory be to the Father</w:t>
+      </w:r>
       <w:r>
         <w:t>, we turn our hearts towards the One from whom all things come.</w:t>
       </w:r>
@@ -4983,15 +4863,7 @@
         <w:pStyle w:val="SPBodyText"/>
       </w:pPr>
       <w:r>
-        <w:t xml:space="preserve">The Glory </w:t>
-      </w:r>
-      <w:proofErr w:type="gramStart"/>
-      <w:r>
-        <w:t>Be</w:t>
-      </w:r>
-      <w:proofErr w:type="gramEnd"/>
-      <w:r>
-        <w:t xml:space="preserve"> teaches us to lift our eyes beyond the noise of the moment and remember what is eternal.</w:t>
+        <w:t>The Glory Be teaches us to lift our eyes beyond the noise of the moment and remember what is eternal.</w:t>
       </w:r>
     </w:p>
     <w:p>
@@ -5273,23 +5145,7 @@
           <w:b/>
           <w:bCs/>
         </w:rPr>
-        <w:t xml:space="preserve">Glory be to the </w:t>
-      </w:r>
-      <w:proofErr w:type="gramStart"/>
-      <w:r>
-        <w:rPr>
-          <w:b/>
-          <w:bCs/>
-        </w:rPr>
-        <w:t>Father</w:t>
-      </w:r>
-      <w:proofErr w:type="gramEnd"/>
-      <w:r>
-        <w:rPr>
-          <w:b/>
-          <w:bCs/>
-        </w:rPr>
-        <w:t>.</w:t>
+        <w:t>Glory be to the Father.</w:t>
       </w:r>
     </w:p>
     <w:p>
@@ -5318,23 +5174,7 @@
           <w:b/>
           <w:bCs/>
         </w:rPr>
-        <w:t xml:space="preserve">And to the </w:t>
-      </w:r>
-      <w:proofErr w:type="gramStart"/>
-      <w:r>
-        <w:rPr>
-          <w:b/>
-          <w:bCs/>
-        </w:rPr>
-        <w:t>Son</w:t>
-      </w:r>
-      <w:proofErr w:type="gramEnd"/>
-      <w:r>
-        <w:rPr>
-          <w:b/>
-          <w:bCs/>
-        </w:rPr>
-        <w:t>.</w:t>
+        <w:t>And to the Son.</w:t>
       </w:r>
     </w:p>
     <w:p>
@@ -5557,17 +5397,8 @@
           <w:b/>
           <w:bCs/>
         </w:rPr>
-        <w:t xml:space="preserve">Glory </w:t>
-      </w:r>
-      <w:proofErr w:type="gramStart"/>
-      <w:r>
-        <w:rPr>
-          <w:b/>
-          <w:bCs/>
-        </w:rPr>
-        <w:t>Be</w:t>
-      </w:r>
-      <w:proofErr w:type="gramEnd"/>
+        <w:t>Glory Be</w:t>
+      </w:r>
       <w:r>
         <w:t xml:space="preserve"> t</w:t>
       </w:r>
@@ -6972,15 +6803,7 @@
       </w:r>
       <w:r>
         <w:br/>
-        <w:t xml:space="preserve">He has raised up for us a mighty </w:t>
-      </w:r>
-      <w:proofErr w:type="spellStart"/>
-      <w:r>
-        <w:t>savior</w:t>
-      </w:r>
-      <w:proofErr w:type="spellEnd"/>
-      <w:r>
-        <w:t>,</w:t>
+        <w:t>He has raised up for us a mighty savior,</w:t>
       </w:r>
       <w:r>
         <w:br/>
@@ -7507,15 +7330,7 @@
         <w:spacing w:line="360" w:lineRule="auto"/>
       </w:pPr>
       <w:r>
-        <w:t xml:space="preserve">And you, child, will be called prophet of the </w:t>
-      </w:r>
-      <w:proofErr w:type="gramStart"/>
-      <w:r>
-        <w:t>Most High</w:t>
-      </w:r>
-      <w:proofErr w:type="gramEnd"/>
-      <w:r>
-        <w:t>; for you will go before the Lord to prepare his ways, to give knowledge of salvation to his people in the forgiveness of their sins</w:t>
+        <w:t>And you, child, will be called prophet of the Most High; for you will go before the Lord to prepare his ways, to give knowledge of salvation to his people in the forgiveness of their sins</w:t>
       </w:r>
       <w:r>
         <w:t xml:space="preserve">, through the tender mercy of our God, </w:t>
@@ -8781,15 +8596,7 @@
         <w:pStyle w:val="SPPrayerEnglish"/>
       </w:pPr>
       <w:r>
-        <w:t xml:space="preserve">for he has looked with </w:t>
-      </w:r>
-      <w:proofErr w:type="spellStart"/>
-      <w:r>
-        <w:t>favor</w:t>
-      </w:r>
-      <w:proofErr w:type="spellEnd"/>
-      <w:r>
-        <w:t xml:space="preserve"> on his lowly servant.</w:t>
+        <w:t>for he has looked with favor on his lowly servant.</w:t>
       </w:r>
       <w:r>
         <w:br/>
@@ -12075,15 +11882,7 @@
         <w:t>Annunciation</w:t>
       </w:r>
       <w:r>
-        <w:t xml:space="preserve">, when the Angel Gabriel announced to Mary that she would become the </w:t>
-      </w:r>
-      <w:proofErr w:type="gramStart"/>
-      <w:r>
-        <w:t>Mother</w:t>
-      </w:r>
-      <w:proofErr w:type="gramEnd"/>
-      <w:r>
-        <w:t xml:space="preserve"> of the Son of God.</w:t>
+        <w:t>, when the Angel Gabriel announced to Mary that she would become the Mother of the Son of God.</w:t>
       </w:r>
     </w:p>
     <w:p>
@@ -12535,15 +12334,7 @@
         <w:pStyle w:val="SPPrayerEnglish"/>
       </w:pPr>
       <w:r>
-        <w:t xml:space="preserve">Pour forth, we beseech Thee, O Lord, </w:t>
-      </w:r>
-      <w:proofErr w:type="gramStart"/>
-      <w:r>
-        <w:t>Thy</w:t>
-      </w:r>
-      <w:proofErr w:type="gramEnd"/>
-      <w:r>
-        <w:t xml:space="preserve"> grace into our hearts, that we to whom the Incarnation of Christ, Thy Son, was made known by the message of an angel, may by His Passion and Cross be brought to the glory of His resurrection. Through the same Christ our Lord. </w:t>
+        <w:t xml:space="preserve">Pour forth, we beseech Thee, O Lord, Thy grace into our hearts, that we to whom the Incarnation of Christ, Thy Son, was made known by the message of an angel, may by His Passion and Cross be brought to the glory of His resurrection. Through the same Christ our Lord. </w:t>
       </w:r>
     </w:p>
     <w:p>
@@ -13351,15 +13142,7 @@
         <w:pStyle w:val="SPBodyText"/>
       </w:pPr>
       <w:r>
-        <w:t xml:space="preserve">Back to the truth that God is </w:t>
-      </w:r>
-      <w:proofErr w:type="gramStart"/>
-      <w:r>
-        <w:t>near</w:t>
-      </w:r>
-      <w:proofErr w:type="gramEnd"/>
-      <w:r>
-        <w:t>.</w:t>
+        <w:t>Back to the truth that God is near.</w:t>
       </w:r>
     </w:p>
     <w:p>
@@ -14079,15 +13862,7 @@
         <w:pStyle w:val="SPBodyText"/>
       </w:pPr>
       <w:r>
-        <w:t xml:space="preserve">The Anima Christi is a prayer of drawing </w:t>
-      </w:r>
-      <w:proofErr w:type="gramStart"/>
-      <w:r>
-        <w:t>near</w:t>
-      </w:r>
-      <w:proofErr w:type="gramEnd"/>
-      <w:r>
-        <w:t>.</w:t>
+        <w:t>The Anima Christi is a prayer of drawing near.</w:t>
       </w:r>
     </w:p>
     <w:p>
@@ -15998,15 +15773,7 @@
         <w:pStyle w:val="SPScripture"/>
       </w:pPr>
       <w:r>
-        <w:t xml:space="preserve">Therefore God has highly exalted him and bestowed on him the </w:t>
-      </w:r>
-      <w:proofErr w:type="gramStart"/>
-      <w:r>
-        <w:t>name</w:t>
-      </w:r>
-      <w:proofErr w:type="gramEnd"/>
-      <w:r>
-        <w:t xml:space="preserve"> which is above every name, that at the name of Jesus every knee should bow, in heaven and on earth and under the earth, and every tongue confess that Jesus Christ is Lord, to the glory of God the father.</w:t>
+        <w:t>Therefore God has highly exalted him and bestowed on him the name which is above every name, that at the name of Jesus every knee should bow, in heaven and on earth and under the earth, and every tongue confess that Jesus Christ is Lord, to the glory of God the father.</w:t>
       </w:r>
     </w:p>
     <w:p>
@@ -16052,15 +15819,7 @@
         <w:t>I am the living bread which came down from heaven</w:t>
       </w:r>
       <w:r>
-        <w:t xml:space="preserve">; if </w:t>
-      </w:r>
-      <w:proofErr w:type="gramStart"/>
-      <w:r>
-        <w:t>any one</w:t>
-      </w:r>
-      <w:proofErr w:type="gramEnd"/>
-      <w:r>
-        <w:t xml:space="preserve"> eats of this bread, he will live forever; and the  bread which I shall give for the life of the world is my flesh.”</w:t>
+        <w:t>; if any one eats of this bread, he will live forever; and the  bread which I shall give for the life of the world is my flesh.”</w:t>
       </w:r>
     </w:p>
     <w:p>
@@ -16602,13 +16361,8 @@
       <w:pPr>
         <w:pStyle w:val="SPScripture"/>
       </w:pPr>
-      <w:proofErr w:type="gramStart"/>
-      <w:r>
-        <w:t>Peace</w:t>
-      </w:r>
-      <w:proofErr w:type="gramEnd"/>
-      <w:r>
-        <w:t xml:space="preserve"> I leave with you; my peace I give to you; not as the world gives do I give to you. Let not your hearts be troubled, neither let them be afraid.</w:t>
+      <w:r>
+        <w:t>Peace I leave with you; my peace I give to you; not as the world gives do I give to you. Let not your hearts be troubled, neither let them be afraid.</w:t>
       </w:r>
     </w:p>
     <w:p>
@@ -17899,7 +17653,16 @@
         <w:pStyle w:val="SPLanguage"/>
       </w:pPr>
       <w:r>
-        <w:t>(Note this is a Latin rendering of the English Prayer, as there is no traditional Latin prayer).</w:t>
+        <w:t>(</w:t>
+      </w:r>
+      <w:r>
+        <w:t>Note: This is a Latin rendering of the English prayer, as there is no traditional Latin version of this particular prayer</w:t>
+      </w:r>
+      <w:r>
+        <w:t>.</w:t>
+      </w:r>
+      <w:r>
+        <w:t>)</w:t>
       </w:r>
     </w:p>
     <w:p>
@@ -18002,6 +17765,11 @@
       <w:pPr>
         <w:pStyle w:val="SPPrayerEnglish"/>
       </w:pPr>
+    </w:p>
+    <w:p>
+      <w:pPr>
+        <w:pStyle w:val="SPPrayerEnglish"/>
+      </w:pPr>
       <w:r>
         <w:t>Obtain for me from God</w:t>
       </w:r>
@@ -18069,6 +17837,11 @@
       <w:pPr>
         <w:pStyle w:val="SPPrayerLatin"/>
       </w:pPr>
+    </w:p>
+    <w:p>
+      <w:pPr>
+        <w:pStyle w:val="SPPrayerLatin"/>
+      </w:pPr>
       <w:r>
         <w:t>Impetrā mihi a Deo</w:t>
       </w:r>
@@ -18714,7 +18487,16 @@
         <w:pStyle w:val="SPLanguage"/>
       </w:pPr>
       <w:r>
-        <w:t>(Note this is a Latin rendering of the English Prayer, as there is no traditional Latin prayer).</w:t>
+        <w:t>(</w:t>
+      </w:r>
+      <w:r>
+        <w:t>Note: This is a Latin rendering of the English prayer, as there is no traditional Latin version of this particular prayer</w:t>
+      </w:r>
+      <w:r>
+        <w:t>.</w:t>
+      </w:r>
+      <w:r>
+        <w:t>)</w:t>
       </w:r>
     </w:p>
     <w:p>
@@ -19505,6 +19287,53 @@
         <w:pStyle w:val="SPBodyText"/>
       </w:pPr>
       <w:r>
+        <w:t>Saint Anthony is remembered as a faithful servant of Christ, a preacher of the Gospel, and a friend to those who seek God's help. He is especially known as the patron of those who have lost something, reminding us that what is lost is not always an object. Sometimes we lose our way, our peace, our hope, or even our sense of closeness to God.</w:t>
+      </w:r>
+    </w:p>
+    <w:p>
+      <w:pPr>
+        <w:pStyle w:val="SPBodyText"/>
+      </w:pPr>
+    </w:p>
+    <w:p>
+      <w:pPr>
+        <w:pStyle w:val="SPBodyText"/>
+      </w:pPr>
+      <w:r>
+        <w:t>This prayer asks Saint Anthony to intercede for us as we seek what has been lost and, above all, to help us find our way back to Christ.</w:t>
+      </w:r>
+    </w:p>
+    <w:p>
+      <w:pPr>
+        <w:pStyle w:val="SPBodyText"/>
+        <w:rPr>
+          <w:b/>
+          <w:bCs/>
+        </w:rPr>
+      </w:pPr>
+    </w:p>
+    <w:p>
+      <w:pPr>
+        <w:pStyle w:val="SPBodyText"/>
+      </w:pPr>
+      <w:r>
+        <w:rPr>
+          <w:b/>
+          <w:bCs/>
+        </w:rPr>
+        <w:t>When we are lost, may we never forget whom we are seeking.</w:t>
+      </w:r>
+    </w:p>
+    <w:p>
+      <w:pPr>
+        <w:pStyle w:val="SPBodyText"/>
+      </w:pPr>
+    </w:p>
+    <w:p>
+      <w:pPr>
+        <w:pStyle w:val="SPBodyText"/>
+      </w:pPr>
+      <w:r>
         <w:rPr>
           <w:b/>
           <w:bCs/>
@@ -19543,6 +19372,87 @@
       <w:r>
         <w:tab/>
       </w:r>
+    </w:p>
+    <w:p>
+      <w:pPr>
+        <w:pStyle w:val="SPPrayerEnglish"/>
+      </w:pPr>
+      <w:r>
+        <w:t>Blessed Saint Anthony,</w:t>
+      </w:r>
+      <w:r>
+        <w:br/>
+        <w:t>you loved God above all things</w:t>
+      </w:r>
+      <w:r>
+        <w:t>,</w:t>
+      </w:r>
+      <w:r>
+        <w:br/>
+        <w:t>and devoted your life to proclaiming the Gospel.</w:t>
+      </w:r>
+      <w:r>
+        <w:br/>
+        <w:t>Help me to seek Christ with the same love and devotion.</w:t>
+      </w:r>
+    </w:p>
+    <w:p>
+      <w:pPr>
+        <w:pStyle w:val="SPPrayerEnglish"/>
+      </w:pPr>
+      <w:r>
+        <w:t>When I am lost, lead me back to the way.</w:t>
+      </w:r>
+      <w:r>
+        <w:br/>
+        <w:t>When I am discouraged, strengthen my hope.</w:t>
+      </w:r>
+      <w:r>
+        <w:br/>
+        <w:t>When I have lost something important,</w:t>
+      </w:r>
+      <w:r>
+        <w:br/>
+        <w:t>help me to trust in God's providence.</w:t>
+      </w:r>
+    </w:p>
+    <w:p>
+      <w:pPr>
+        <w:pStyle w:val="SPPrayerEnglish"/>
+      </w:pPr>
+      <w:r>
+        <w:t>Pray for me, Saint Anthony,</w:t>
+      </w:r>
+      <w:r>
+        <w:br/>
+        <w:t>that I may always seek what is true,</w:t>
+      </w:r>
+      <w:r>
+        <w:br/>
+        <w:t>love what is good,</w:t>
+      </w:r>
+      <w:r>
+        <w:br/>
+        <w:t>and remain faithful to Christ.</w:t>
+      </w:r>
+    </w:p>
+    <w:p>
+      <w:pPr>
+        <w:pStyle w:val="SPPrayerEnglish"/>
+      </w:pPr>
+    </w:p>
+    <w:p>
+      <w:pPr>
+        <w:pStyle w:val="SPPrayerEnglish"/>
+      </w:pPr>
+      <w:r>
+        <w:t>Amen.</w:t>
+      </w:r>
+    </w:p>
+    <w:p>
+      <w:pPr>
+        <w:pStyle w:val="SPPrayerEnglish"/>
+      </w:pPr>
     </w:p>
     <w:p>
       <w:pPr>
@@ -19563,6 +19473,107 @@
     <w:p>
       <w:pPr>
         <w:pStyle w:val="SPLanguage"/>
+      </w:pPr>
+      <w:r>
+        <w:lastRenderedPageBreak/>
+        <w:t>LATIN</w:t>
+      </w:r>
+    </w:p>
+    <w:p>
+      <w:pPr>
+        <w:pStyle w:val="SPLanguage"/>
+      </w:pPr>
+      <w:r>
+        <w:t>(</w:t>
+      </w:r>
+      <w:r>
+        <w:t>Note: This is a Latin rendering of the English prayer, as there is no traditional Latin version of this particular prayer</w:t>
+      </w:r>
+      <w:r>
+        <w:t>.)</w:t>
+      </w:r>
+    </w:p>
+    <w:p>
+      <w:pPr>
+        <w:pStyle w:val="SPPrayerLatin"/>
+      </w:pPr>
+    </w:p>
+    <w:p>
+      <w:pPr>
+        <w:pStyle w:val="SPPrayerLatin"/>
+      </w:pPr>
+      <w:r>
+        <w:t>Beate Antoni,</w:t>
+      </w:r>
+      <w:r>
+        <w:br/>
+        <w:t>Deum super omnia dilexisti</w:t>
+      </w:r>
+      <w:r>
+        <w:br/>
+        <w:t>et vitam tuam Evangelii nuntiando devovisti.</w:t>
+      </w:r>
+      <w:r>
+        <w:br/>
+        <w:t>Adiuva me Christum eodem amore ac devotione quaerere.</w:t>
+      </w:r>
+    </w:p>
+    <w:p>
+      <w:pPr>
+        <w:pStyle w:val="SPPrayerLatin"/>
+      </w:pPr>
+      <w:r>
+        <w:t>Cum viam amiserim, ad viam me reduc.</w:t>
+      </w:r>
+      <w:r>
+        <w:br/>
+        <w:t>Cum animo defecerim, spem meam confirma.</w:t>
+      </w:r>
+      <w:r>
+        <w:br/>
+        <w:t>Cum aliquid magni momenti amiserim,</w:t>
+      </w:r>
+      <w:r>
+        <w:br/>
+        <w:t>doce me divinae Providentiae confidere.</w:t>
+      </w:r>
+    </w:p>
+    <w:p>
+      <w:pPr>
+        <w:pStyle w:val="SPPrayerLatin"/>
+      </w:pPr>
+      <w:r>
+        <w:t>Ora pro me, Sancte Antoni,</w:t>
+      </w:r>
+      <w:r>
+        <w:br/>
+        <w:t>ut semper quaeram quod verum est,</w:t>
+      </w:r>
+      <w:r>
+        <w:br/>
+        <w:t>diligam quod bonum est,</w:t>
+      </w:r>
+      <w:r>
+        <w:br/>
+        <w:t>et Christo fidelis maneam.</w:t>
+      </w:r>
+    </w:p>
+    <w:p>
+      <w:pPr>
+        <w:pStyle w:val="SPPrayerLatin"/>
+      </w:pPr>
+    </w:p>
+    <w:p>
+      <w:pPr>
+        <w:pStyle w:val="SPPrayerLatin"/>
+      </w:pPr>
+      <w:r>
+        <w:t>Amen.</w:t>
+      </w:r>
+    </w:p>
+    <w:p>
+      <w:pPr>
+        <w:pStyle w:val="SPPrayerLatin"/>
         <w:sectPr>
           <w:type w:val="oddPage"/>
           <w:pgSz w:w="7920" w:h="12240" w:code="6"/>
@@ -19572,10 +19583,6 @@
           <w:docGrid w:linePitch="360"/>
         </w:sectPr>
       </w:pPr>
-      <w:r>
-        <w:lastRenderedPageBreak/>
-        <w:t>LATIN</w:t>
-      </w:r>
     </w:p>
     <w:p>
       <w:pPr>
@@ -19588,8 +19595,19 @@
     </w:p>
     <w:p>
       <w:pPr>
-        <w:pStyle w:val="SPLanguage"/>
-      </w:pPr>
+        <w:pStyle w:val="SPScriptureReference"/>
+      </w:pPr>
+      <w:r>
+        <w:t>Matthew 7:7-8</w:t>
+      </w:r>
+    </w:p>
+    <w:p>
+      <w:pPr>
+        <w:pStyle w:val="SPScriptureReference"/>
+      </w:pPr>
+      <w:r>
+        <w:t>Luke 15:4-7</w:t>
+      </w:r>
     </w:p>
     <w:p>
       <w:pPr>

</xml_diff>

<commit_message>
Checking styles for each section.
</commit_message>
<xml_diff>
--- a/manuscript/volume-1/sacrae-preces-volume-1.docx
+++ b/manuscript/volume-1/sacrae-preces-volume-1.docx
@@ -11,10 +11,10 @@
           <w:rStyle w:val="SPPrayerResponseCS"/>
         </w:rPr>
         <w:sectPr>
-          <w:footerReference w:type="first" r:id="rId8"/>
+          <w:footerReference w:type="default" r:id="rId8"/>
           <w:pgSz w:w="7920" w:h="12240" w:code="6"/>
           <w:pgMar w:top="1080" w:right="864" w:bottom="1080" w:left="1152" w:header="576" w:footer="576" w:gutter="0"/>
-          <w:pgNumType w:start="1"/>
+          <w:pgNumType w:fmt="lowerRoman" w:start="1"/>
           <w:cols w:space="720"/>
           <w:titlePg/>
           <w:docGrid w:linePitch="360"/>
@@ -28,6 +28,136 @@
           <w:rStyle w:val="SPPrayerResponseCS"/>
           <w:i w:val="0"/>
         </w:rPr>
+        <w:sectPr>
+          <w:type w:val="oddPage"/>
+          <w:pgSz w:w="7920" w:h="12240" w:code="6"/>
+          <w:pgMar w:top="1080" w:right="864" w:bottom="1080" w:left="1152" w:header="576" w:footer="576" w:gutter="0"/>
+          <w:pgNumType w:fmt="lowerRoman" w:start="1"/>
+          <w:cols w:space="720"/>
+          <w:titlePg/>
+          <w:docGrid w:linePitch="360"/>
+        </w:sectPr>
+      </w:pPr>
+      <w:r>
+        <w:rPr>
+          <w:rStyle w:val="SPPrayerResponseCS"/>
+          <w:i w:val="0"/>
+        </w:rPr>
+        <w:lastRenderedPageBreak/>
+        <w:t>Sacrae preces</w:t>
+      </w:r>
+    </w:p>
+    <w:p>
+      <w:pPr>
+        <w:pStyle w:val="SPCoverTitle"/>
+        <w:jc w:val="center"/>
+        <w:rPr>
+          <w:rStyle w:val="SPPrayerResponseCS"/>
+          <w:i w:val="0"/>
+        </w:rPr>
+      </w:pPr>
+      <w:r>
+        <w:rPr>
+          <w:rFonts w:ascii="Segoe UI Symbol" w:hAnsi="Segoe UI Symbol" w:cs="Segoe UI Symbol"/>
+        </w:rPr>
+        <w:lastRenderedPageBreak/>
+        <w:t>✠</w:t>
+      </w:r>
+    </w:p>
+    <w:p>
+      <w:pPr>
+        <w:pStyle w:val="SPCoverTitle"/>
+        <w:jc w:val="center"/>
+        <w:rPr>
+          <w:rStyle w:val="SPPrayerResponseCS"/>
+          <w:i w:val="0"/>
+          <w:sz w:val="48"/>
+          <w:szCs w:val="18"/>
+        </w:rPr>
+      </w:pPr>
+      <w:r>
+        <w:rPr>
+          <w:rStyle w:val="SPPrayerResponseCS"/>
+          <w:i w:val="0"/>
+          <w:sz w:val="48"/>
+          <w:szCs w:val="18"/>
+        </w:rPr>
+        <w:t>Sacr</w:t>
+      </w:r>
+      <w:r>
+        <w:rPr>
+          <w:rStyle w:val="SPPrayerResponseCS"/>
+          <w:i w:val="0"/>
+          <w:sz w:val="48"/>
+          <w:szCs w:val="18"/>
+        </w:rPr>
+        <w:t>Ae</w:t>
+      </w:r>
+      <w:r>
+        <w:rPr>
+          <w:rStyle w:val="SPPrayerResponseCS"/>
+          <w:i w:val="0"/>
+          <w:sz w:val="48"/>
+          <w:szCs w:val="18"/>
+        </w:rPr>
+        <w:t xml:space="preserve"> preces</w:t>
+      </w:r>
+    </w:p>
+    <w:p>
+      <w:pPr>
+        <w:pStyle w:val="SPCoverSubtitle"/>
+        <w:spacing w:after="240"/>
+      </w:pPr>
+      <w:r>
+        <w:t xml:space="preserve">Volume </w:t>
+      </w:r>
+      <w:r>
+        <w:t>I</w:t>
+      </w:r>
+    </w:p>
+    <w:p>
+      <w:pPr>
+        <w:pStyle w:val="SPCoverSubtitle"/>
+        <w:spacing w:after="120"/>
+      </w:pPr>
+      <w:r>
+        <w:rPr>
+          <w:sz w:val="28"/>
+          <w:szCs w:val="24"/>
+        </w:rPr>
+        <w:t>Daily prayers</w:t>
+      </w:r>
+    </w:p>
+    <w:p>
+      <w:pPr>
+        <w:pStyle w:val="SPCoverSubtitle"/>
+        <w:rPr>
+          <w:rStyle w:val="SPCatechismrefCS"/>
+          <w:smallCaps w:val="0"/>
+        </w:rPr>
+      </w:pPr>
+      <w:r>
+        <w:rPr>
+          <w:rStyle w:val="SPCatechismrefCS"/>
+          <w:smallCaps w:val="0"/>
+        </w:rPr>
+        <w:t>English &amp; Latin</w:t>
+      </w:r>
+    </w:p>
+    <w:p>
+      <w:pPr>
+        <w:pStyle w:val="SPAuthor"/>
+        <w:spacing w:before="1800"/>
+      </w:pPr>
+      <w:r>
+        <w:t>Lance Martincich</w:t>
+      </w:r>
+    </w:p>
+    <w:p>
+      <w:pPr>
+        <w:spacing w:after="0"/>
+        <w:ind w:left="0"/>
+        <w:jc w:val="left"/>
         <w:sectPr>
           <w:type w:val="oddPage"/>
           <w:pgSz w:w="7920" w:h="12240" w:code="6"/>
@@ -37,137 +167,6 @@
           <w:docGrid w:linePitch="360"/>
         </w:sectPr>
       </w:pPr>
-      <w:r>
-        <w:rPr>
-          <w:rStyle w:val="SPPrayerResponseCS"/>
-          <w:i w:val="0"/>
-        </w:rPr>
-        <w:lastRenderedPageBreak/>
-        <w:t>Sacrae preces</w:t>
-      </w:r>
-    </w:p>
-    <w:p>
-      <w:pPr>
-        <w:pStyle w:val="SPCoverTitle"/>
-        <w:jc w:val="center"/>
-        <w:rPr>
-          <w:rStyle w:val="SPPrayerResponseCS"/>
-          <w:i w:val="0"/>
-        </w:rPr>
-      </w:pPr>
-      <w:r>
-        <w:rPr>
-          <w:rFonts w:ascii="Segoe UI Symbol" w:hAnsi="Segoe UI Symbol" w:cs="Segoe UI Symbol"/>
-        </w:rPr>
-        <w:lastRenderedPageBreak/>
-        <w:t>✠</w:t>
-      </w:r>
-    </w:p>
-    <w:p>
-      <w:pPr>
-        <w:pStyle w:val="SPCoverTitle"/>
-        <w:jc w:val="center"/>
-        <w:rPr>
-          <w:rStyle w:val="SPPrayerResponseCS"/>
-          <w:i w:val="0"/>
-          <w:sz w:val="48"/>
-          <w:szCs w:val="18"/>
-        </w:rPr>
-      </w:pPr>
-      <w:r>
-        <w:rPr>
-          <w:rStyle w:val="SPPrayerResponseCS"/>
-          <w:i w:val="0"/>
-          <w:sz w:val="48"/>
-          <w:szCs w:val="18"/>
-        </w:rPr>
-        <w:t>Sacr</w:t>
-      </w:r>
-      <w:r>
-        <w:rPr>
-          <w:rStyle w:val="SPPrayerResponseCS"/>
-          <w:i w:val="0"/>
-          <w:sz w:val="48"/>
-          <w:szCs w:val="18"/>
-        </w:rPr>
-        <w:t>Ae</w:t>
-      </w:r>
-      <w:r>
-        <w:rPr>
-          <w:rStyle w:val="SPPrayerResponseCS"/>
-          <w:i w:val="0"/>
-          <w:sz w:val="48"/>
-          <w:szCs w:val="18"/>
-        </w:rPr>
-        <w:t xml:space="preserve"> preces</w:t>
-      </w:r>
-    </w:p>
-    <w:p>
-      <w:pPr>
-        <w:pStyle w:val="SPCoverSubtitle"/>
-        <w:spacing w:after="240"/>
-      </w:pPr>
-      <w:r>
-        <w:t xml:space="preserve">Volume </w:t>
-      </w:r>
-      <w:r>
-        <w:t>I</w:t>
-      </w:r>
-    </w:p>
-    <w:p>
-      <w:pPr>
-        <w:pStyle w:val="SPCoverSubtitle"/>
-        <w:spacing w:after="120"/>
-      </w:pPr>
-      <w:r>
-        <w:rPr>
-          <w:sz w:val="28"/>
-          <w:szCs w:val="24"/>
-        </w:rPr>
-        <w:t>Daily prayers</w:t>
-      </w:r>
-    </w:p>
-    <w:p>
-      <w:pPr>
-        <w:pStyle w:val="SPCoverSubtitle"/>
-        <w:rPr>
-          <w:rStyle w:val="SPCatechismrefCS"/>
-          <w:smallCaps w:val="0"/>
-        </w:rPr>
-      </w:pPr>
-      <w:r>
-        <w:rPr>
-          <w:rStyle w:val="SPCatechismrefCS"/>
-          <w:smallCaps w:val="0"/>
-        </w:rPr>
-        <w:t>English &amp; Latin</w:t>
-      </w:r>
-    </w:p>
-    <w:p>
-      <w:pPr>
-        <w:pStyle w:val="SPAuthor"/>
-        <w:spacing w:before="1800"/>
-      </w:pPr>
-      <w:r>
-        <w:t>Lance Martincich</w:t>
-      </w:r>
-    </w:p>
-    <w:p>
-      <w:pPr>
-        <w:spacing w:after="0"/>
-        <w:ind w:left="0"/>
-        <w:jc w:val="left"/>
-        <w:rPr>
-          <w:rStyle w:val="SPPrayerResponseCS"/>
-          <w:sz w:val="20"/>
-        </w:rPr>
-      </w:pPr>
-      <w:r>
-        <w:rPr>
-          <w:rStyle w:val="SPPrayerResponseCS"/>
-        </w:rPr>
-        <w:br w:type="page"/>
-      </w:r>
     </w:p>
     <w:p>
       <w:pPr>
@@ -434,7 +433,7 @@
           <w:r>
             <w:fldChar w:fldCharType="separate"/>
           </w:r>
-          <w:hyperlink w:anchor="_Toc238726727" w:history="1">
+          <w:hyperlink w:anchor="_Toc238794820" w:history="1">
             <w:r>
               <w:rPr>
                 <w:rStyle w:val="Hyperlink"/>
@@ -461,7 +460,7 @@
                 <w:noProof/>
                 <w:webHidden/>
               </w:rPr>
-              <w:instrText xml:space="preserve"> PAGEREF _Toc238726727 \h </w:instrText>
+              <w:instrText xml:space="preserve"> PAGEREF _Toc238794820 \h </w:instrText>
             </w:r>
             <w:r>
               <w:rPr>
@@ -481,7 +480,7 @@
                 <w:noProof/>
                 <w:webHidden/>
               </w:rPr>
-              <w:t>13</w:t>
+              <w:t>1</w:t>
             </w:r>
             <w:r>
               <w:rPr>
@@ -506,7 +505,7 @@
               <w:lang w:eastAsia="en-ZA"/>
             </w:rPr>
           </w:pPr>
-          <w:hyperlink w:anchor="_Toc238726728" w:history="1">
+          <w:hyperlink w:anchor="_Toc238794821" w:history="1">
             <w:r>
               <w:rPr>
                 <w:rStyle w:val="Hyperlink"/>
@@ -533,7 +532,7 @@
                 <w:noProof/>
                 <w:webHidden/>
               </w:rPr>
-              <w:instrText xml:space="preserve"> PAGEREF _Toc238726728 \h </w:instrText>
+              <w:instrText xml:space="preserve"> PAGEREF _Toc238794821 \h </w:instrText>
             </w:r>
             <w:r>
               <w:rPr>
@@ -553,7 +552,7 @@
                 <w:noProof/>
                 <w:webHidden/>
               </w:rPr>
-              <w:t>20</w:t>
+              <w:t>8</w:t>
             </w:r>
             <w:r>
               <w:rPr>
@@ -578,7 +577,7 @@
               <w:lang w:eastAsia="en-ZA"/>
             </w:rPr>
           </w:pPr>
-          <w:hyperlink w:anchor="_Toc238726729" w:history="1">
+          <w:hyperlink w:anchor="_Toc238794822" w:history="1">
             <w:r>
               <w:rPr>
                 <w:rStyle w:val="Hyperlink"/>
@@ -605,7 +604,7 @@
                 <w:noProof/>
                 <w:webHidden/>
               </w:rPr>
-              <w:instrText xml:space="preserve"> PAGEREF _Toc238726729 \h </w:instrText>
+              <w:instrText xml:space="preserve"> PAGEREF _Toc238794822 \h </w:instrText>
             </w:r>
             <w:r>
               <w:rPr>
@@ -625,7 +624,7 @@
                 <w:noProof/>
                 <w:webHidden/>
               </w:rPr>
-              <w:t>22</w:t>
+              <w:t>10</w:t>
             </w:r>
             <w:r>
               <w:rPr>
@@ -650,7 +649,7 @@
               <w:lang w:eastAsia="en-ZA"/>
             </w:rPr>
           </w:pPr>
-          <w:hyperlink w:anchor="_Toc238726730" w:history="1">
+          <w:hyperlink w:anchor="_Toc238794823" w:history="1">
             <w:r>
               <w:rPr>
                 <w:rStyle w:val="Hyperlink"/>
@@ -677,7 +676,7 @@
                 <w:noProof/>
                 <w:webHidden/>
               </w:rPr>
-              <w:instrText xml:space="preserve"> PAGEREF _Toc238726730 \h </w:instrText>
+              <w:instrText xml:space="preserve"> PAGEREF _Toc238794823 \h </w:instrText>
             </w:r>
             <w:r>
               <w:rPr>
@@ -697,7 +696,7 @@
                 <w:noProof/>
                 <w:webHidden/>
               </w:rPr>
-              <w:t>23</w:t>
+              <w:t>11</w:t>
             </w:r>
             <w:r>
               <w:rPr>
@@ -722,7 +721,7 @@
               <w:lang w:eastAsia="en-ZA"/>
             </w:rPr>
           </w:pPr>
-          <w:hyperlink w:anchor="_Toc238726731" w:history="1">
+          <w:hyperlink w:anchor="_Toc238794824" w:history="1">
             <w:r>
               <w:rPr>
                 <w:rStyle w:val="Hyperlink"/>
@@ -749,7 +748,7 @@
                 <w:noProof/>
                 <w:webHidden/>
               </w:rPr>
-              <w:instrText xml:space="preserve"> PAGEREF _Toc238726731 \h </w:instrText>
+              <w:instrText xml:space="preserve"> PAGEREF _Toc238794824 \h </w:instrText>
             </w:r>
             <w:r>
               <w:rPr>
@@ -769,7 +768,7 @@
                 <w:noProof/>
                 <w:webHidden/>
               </w:rPr>
-              <w:t>24</w:t>
+              <w:t>12</w:t>
             </w:r>
             <w:r>
               <w:rPr>
@@ -794,7 +793,7 @@
               <w:lang w:eastAsia="en-ZA"/>
             </w:rPr>
           </w:pPr>
-          <w:hyperlink w:anchor="_Toc238726732" w:history="1">
+          <w:hyperlink w:anchor="_Toc238794825" w:history="1">
             <w:r>
               <w:rPr>
                 <w:rStyle w:val="Hyperlink"/>
@@ -821,7 +820,7 @@
                 <w:noProof/>
                 <w:webHidden/>
               </w:rPr>
-              <w:instrText xml:space="preserve"> PAGEREF _Toc238726732 \h </w:instrText>
+              <w:instrText xml:space="preserve"> PAGEREF _Toc238794825 \h </w:instrText>
             </w:r>
             <w:r>
               <w:rPr>
@@ -841,7 +840,7 @@
                 <w:noProof/>
                 <w:webHidden/>
               </w:rPr>
-              <w:t>24</w:t>
+              <w:t>12</w:t>
             </w:r>
             <w:r>
               <w:rPr>
@@ -866,7 +865,7 @@
               <w:lang w:eastAsia="en-ZA"/>
             </w:rPr>
           </w:pPr>
-          <w:hyperlink w:anchor="_Toc238726733" w:history="1">
+          <w:hyperlink w:anchor="_Toc238794826" w:history="1">
             <w:r>
               <w:rPr>
                 <w:rStyle w:val="Hyperlink"/>
@@ -893,7 +892,7 @@
                 <w:noProof/>
                 <w:webHidden/>
               </w:rPr>
-              <w:instrText xml:space="preserve"> PAGEREF _Toc238726733 \h </w:instrText>
+              <w:instrText xml:space="preserve"> PAGEREF _Toc238794826 \h </w:instrText>
             </w:r>
             <w:r>
               <w:rPr>
@@ -913,7 +912,7 @@
                 <w:noProof/>
                 <w:webHidden/>
               </w:rPr>
-              <w:t>25</w:t>
+              <w:t>13</w:t>
             </w:r>
             <w:r>
               <w:rPr>
@@ -938,7 +937,7 @@
               <w:lang w:eastAsia="en-ZA"/>
             </w:rPr>
           </w:pPr>
-          <w:hyperlink w:anchor="_Toc238726734" w:history="1">
+          <w:hyperlink w:anchor="_Toc238794827" w:history="1">
             <w:r>
               <w:rPr>
                 <w:rStyle w:val="Hyperlink"/>
@@ -965,7 +964,7 @@
                 <w:noProof/>
                 <w:webHidden/>
               </w:rPr>
-              <w:instrText xml:space="preserve"> PAGEREF _Toc238726734 \h </w:instrText>
+              <w:instrText xml:space="preserve"> PAGEREF _Toc238794827 \h </w:instrText>
             </w:r>
             <w:r>
               <w:rPr>
@@ -985,7 +984,7 @@
                 <w:noProof/>
                 <w:webHidden/>
               </w:rPr>
-              <w:t>26</w:t>
+              <w:t>14</w:t>
             </w:r>
             <w:r>
               <w:rPr>
@@ -1010,7 +1009,7 @@
               <w:lang w:eastAsia="en-ZA"/>
             </w:rPr>
           </w:pPr>
-          <w:hyperlink w:anchor="_Toc238726735" w:history="1">
+          <w:hyperlink w:anchor="_Toc238794828" w:history="1">
             <w:r>
               <w:rPr>
                 <w:rStyle w:val="Hyperlink"/>
@@ -1037,7 +1036,7 @@
                 <w:noProof/>
                 <w:webHidden/>
               </w:rPr>
-              <w:instrText xml:space="preserve"> PAGEREF _Toc238726735 \h </w:instrText>
+              <w:instrText xml:space="preserve"> PAGEREF _Toc238794828 \h </w:instrText>
             </w:r>
             <w:r>
               <w:rPr>
@@ -1057,7 +1056,7 @@
                 <w:noProof/>
                 <w:webHidden/>
               </w:rPr>
-              <w:t>26</w:t>
+              <w:t>14</w:t>
             </w:r>
             <w:r>
               <w:rPr>
@@ -1082,7 +1081,7 @@
               <w:lang w:eastAsia="en-ZA"/>
             </w:rPr>
           </w:pPr>
-          <w:hyperlink w:anchor="_Toc238726736" w:history="1">
+          <w:hyperlink w:anchor="_Toc238794829" w:history="1">
             <w:r>
               <w:rPr>
                 <w:rStyle w:val="Hyperlink"/>
@@ -1109,7 +1108,7 @@
                 <w:noProof/>
                 <w:webHidden/>
               </w:rPr>
-              <w:instrText xml:space="preserve"> PAGEREF _Toc238726736 \h </w:instrText>
+              <w:instrText xml:space="preserve"> PAGEREF _Toc238794829 \h </w:instrText>
             </w:r>
             <w:r>
               <w:rPr>
@@ -1129,7 +1128,7 @@
                 <w:noProof/>
                 <w:webHidden/>
               </w:rPr>
-              <w:t>27</w:t>
+              <w:t>15</w:t>
             </w:r>
             <w:r>
               <w:rPr>
@@ -1154,7 +1153,7 @@
               <w:lang w:eastAsia="en-ZA"/>
             </w:rPr>
           </w:pPr>
-          <w:hyperlink w:anchor="_Toc238726737" w:history="1">
+          <w:hyperlink w:anchor="_Toc238794830" w:history="1">
             <w:r>
               <w:rPr>
                 <w:rStyle w:val="Hyperlink"/>
@@ -1181,7 +1180,7 @@
                 <w:noProof/>
                 <w:webHidden/>
               </w:rPr>
-              <w:instrText xml:space="preserve"> PAGEREF _Toc238726737 \h </w:instrText>
+              <w:instrText xml:space="preserve"> PAGEREF _Toc238794830 \h </w:instrText>
             </w:r>
             <w:r>
               <w:rPr>
@@ -1201,7 +1200,7 @@
                 <w:noProof/>
                 <w:webHidden/>
               </w:rPr>
-              <w:t>29</w:t>
+              <w:t>17</w:t>
             </w:r>
             <w:r>
               <w:rPr>
@@ -1226,7 +1225,7 @@
               <w:lang w:eastAsia="en-ZA"/>
             </w:rPr>
           </w:pPr>
-          <w:hyperlink w:anchor="_Toc238726738" w:history="1">
+          <w:hyperlink w:anchor="_Toc238794831" w:history="1">
             <w:r>
               <w:rPr>
                 <w:rStyle w:val="Hyperlink"/>
@@ -1253,7 +1252,7 @@
                 <w:noProof/>
                 <w:webHidden/>
               </w:rPr>
-              <w:instrText xml:space="preserve"> PAGEREF _Toc238726738 \h </w:instrText>
+              <w:instrText xml:space="preserve"> PAGEREF _Toc238794831 \h </w:instrText>
             </w:r>
             <w:r>
               <w:rPr>
@@ -1273,7 +1272,7 @@
                 <w:noProof/>
                 <w:webHidden/>
               </w:rPr>
-              <w:t>31</w:t>
+              <w:t>19</w:t>
             </w:r>
             <w:r>
               <w:rPr>
@@ -1298,7 +1297,7 @@
               <w:lang w:eastAsia="en-ZA"/>
             </w:rPr>
           </w:pPr>
-          <w:hyperlink w:anchor="_Toc238726739" w:history="1">
+          <w:hyperlink w:anchor="_Toc238794832" w:history="1">
             <w:r>
               <w:rPr>
                 <w:rStyle w:val="Hyperlink"/>
@@ -1325,7 +1324,7 @@
                 <w:noProof/>
                 <w:webHidden/>
               </w:rPr>
-              <w:instrText xml:space="preserve"> PAGEREF _Toc238726739 \h </w:instrText>
+              <w:instrText xml:space="preserve"> PAGEREF _Toc238794832 \h </w:instrText>
             </w:r>
             <w:r>
               <w:rPr>
@@ -1345,7 +1344,7 @@
                 <w:noProof/>
                 <w:webHidden/>
               </w:rPr>
-              <w:t>37</w:t>
+              <w:t>25</w:t>
             </w:r>
             <w:r>
               <w:rPr>
@@ -1370,7 +1369,7 @@
               <w:lang w:eastAsia="en-ZA"/>
             </w:rPr>
           </w:pPr>
-          <w:hyperlink w:anchor="_Toc238726740" w:history="1">
+          <w:hyperlink w:anchor="_Toc238794833" w:history="1">
             <w:r>
               <w:rPr>
                 <w:rStyle w:val="Hyperlink"/>
@@ -1397,7 +1396,7 @@
                 <w:noProof/>
                 <w:webHidden/>
               </w:rPr>
-              <w:instrText xml:space="preserve"> PAGEREF _Toc238726740 \h </w:instrText>
+              <w:instrText xml:space="preserve"> PAGEREF _Toc238794833 \h </w:instrText>
             </w:r>
             <w:r>
               <w:rPr>
@@ -1417,7 +1416,7 @@
                 <w:noProof/>
                 <w:webHidden/>
               </w:rPr>
-              <w:t>43</w:t>
+              <w:t>31</w:t>
             </w:r>
             <w:r>
               <w:rPr>
@@ -1442,7 +1441,7 @@
               <w:lang w:eastAsia="en-ZA"/>
             </w:rPr>
           </w:pPr>
-          <w:hyperlink w:anchor="_Toc238726741" w:history="1">
+          <w:hyperlink w:anchor="_Toc238794834" w:history="1">
             <w:r>
               <w:rPr>
                 <w:rStyle w:val="Hyperlink"/>
@@ -1469,7 +1468,7 @@
                 <w:noProof/>
                 <w:webHidden/>
               </w:rPr>
-              <w:instrText xml:space="preserve"> PAGEREF _Toc238726741 \h </w:instrText>
+              <w:instrText xml:space="preserve"> PAGEREF _Toc238794834 \h </w:instrText>
             </w:r>
             <w:r>
               <w:rPr>
@@ -1489,7 +1488,7 @@
                 <w:noProof/>
                 <w:webHidden/>
               </w:rPr>
-              <w:t>51</w:t>
+              <w:t>39</w:t>
             </w:r>
             <w:r>
               <w:rPr>
@@ -1514,7 +1513,7 @@
               <w:lang w:eastAsia="en-ZA"/>
             </w:rPr>
           </w:pPr>
-          <w:hyperlink w:anchor="_Toc238726742" w:history="1">
+          <w:hyperlink w:anchor="_Toc238794835" w:history="1">
             <w:r>
               <w:rPr>
                 <w:rStyle w:val="Hyperlink"/>
@@ -1541,7 +1540,7 @@
                 <w:noProof/>
                 <w:webHidden/>
               </w:rPr>
-              <w:instrText xml:space="preserve"> PAGEREF _Toc238726742 \h </w:instrText>
+              <w:instrText xml:space="preserve"> PAGEREF _Toc238794835 \h </w:instrText>
             </w:r>
             <w:r>
               <w:rPr>
@@ -1561,7 +1560,7 @@
                 <w:noProof/>
                 <w:webHidden/>
               </w:rPr>
-              <w:t>61</w:t>
+              <w:t>49</w:t>
             </w:r>
             <w:r>
               <w:rPr>
@@ -1586,7 +1585,7 @@
               <w:lang w:eastAsia="en-ZA"/>
             </w:rPr>
           </w:pPr>
-          <w:hyperlink w:anchor="_Toc238726743" w:history="1">
+          <w:hyperlink w:anchor="_Toc238794836" w:history="1">
             <w:r>
               <w:rPr>
                 <w:rStyle w:val="Hyperlink"/>
@@ -1613,7 +1612,7 @@
                 <w:noProof/>
                 <w:webHidden/>
               </w:rPr>
-              <w:instrText xml:space="preserve"> PAGEREF _Toc238726743 \h </w:instrText>
+              <w:instrText xml:space="preserve"> PAGEREF _Toc238794836 \h </w:instrText>
             </w:r>
             <w:r>
               <w:rPr>
@@ -1633,7 +1632,7 @@
                 <w:noProof/>
                 <w:webHidden/>
               </w:rPr>
-              <w:t>68</w:t>
+              <w:t>56</w:t>
             </w:r>
             <w:r>
               <w:rPr>
@@ -1658,7 +1657,7 @@
               <w:lang w:eastAsia="en-ZA"/>
             </w:rPr>
           </w:pPr>
-          <w:hyperlink w:anchor="_Toc238726744" w:history="1">
+          <w:hyperlink w:anchor="_Toc238794837" w:history="1">
             <w:r>
               <w:rPr>
                 <w:rStyle w:val="Hyperlink"/>
@@ -1685,7 +1684,7 @@
                 <w:noProof/>
                 <w:webHidden/>
               </w:rPr>
-              <w:instrText xml:space="preserve"> PAGEREF _Toc238726744 \h </w:instrText>
+              <w:instrText xml:space="preserve"> PAGEREF _Toc238794837 \h </w:instrText>
             </w:r>
             <w:r>
               <w:rPr>
@@ -1705,7 +1704,7 @@
                 <w:noProof/>
                 <w:webHidden/>
               </w:rPr>
-              <w:t>71</w:t>
+              <w:t>59</w:t>
             </w:r>
             <w:r>
               <w:rPr>
@@ -1730,7 +1729,7 @@
               <w:lang w:eastAsia="en-ZA"/>
             </w:rPr>
           </w:pPr>
-          <w:hyperlink w:anchor="_Toc238726745" w:history="1">
+          <w:hyperlink w:anchor="_Toc238794838" w:history="1">
             <w:r>
               <w:rPr>
                 <w:rStyle w:val="Hyperlink"/>
@@ -1757,7 +1756,7 @@
                 <w:noProof/>
                 <w:webHidden/>
               </w:rPr>
-              <w:instrText xml:space="preserve"> PAGEREF _Toc238726745 \h </w:instrText>
+              <w:instrText xml:space="preserve"> PAGEREF _Toc238794838 \h </w:instrText>
             </w:r>
             <w:r>
               <w:rPr>
@@ -1777,7 +1776,7 @@
                 <w:noProof/>
                 <w:webHidden/>
               </w:rPr>
-              <w:t>73</w:t>
+              <w:t>61</w:t>
             </w:r>
             <w:r>
               <w:rPr>
@@ -1802,7 +1801,7 @@
               <w:lang w:eastAsia="en-ZA"/>
             </w:rPr>
           </w:pPr>
-          <w:hyperlink w:anchor="_Toc238726746" w:history="1">
+          <w:hyperlink w:anchor="_Toc238794839" w:history="1">
             <w:r>
               <w:rPr>
                 <w:rStyle w:val="Hyperlink"/>
@@ -1829,7 +1828,7 @@
                 <w:noProof/>
                 <w:webHidden/>
               </w:rPr>
-              <w:instrText xml:space="preserve"> PAGEREF _Toc238726746 \h </w:instrText>
+              <w:instrText xml:space="preserve"> PAGEREF _Toc238794839 \h </w:instrText>
             </w:r>
             <w:r>
               <w:rPr>
@@ -1849,7 +1848,7 @@
                 <w:noProof/>
                 <w:webHidden/>
               </w:rPr>
-              <w:t>85</w:t>
+              <w:t>73</w:t>
             </w:r>
             <w:r>
               <w:rPr>
@@ -1874,7 +1873,7 @@
               <w:lang w:eastAsia="en-ZA"/>
             </w:rPr>
           </w:pPr>
-          <w:hyperlink w:anchor="_Toc238726747" w:history="1">
+          <w:hyperlink w:anchor="_Toc238794840" w:history="1">
             <w:r>
               <w:rPr>
                 <w:rStyle w:val="Hyperlink"/>
@@ -1901,7 +1900,7 @@
                 <w:noProof/>
                 <w:webHidden/>
               </w:rPr>
-              <w:instrText xml:space="preserve"> PAGEREF _Toc238726747 \h </w:instrText>
+              <w:instrText xml:space="preserve"> PAGEREF _Toc238794840 \h </w:instrText>
             </w:r>
             <w:r>
               <w:rPr>
@@ -1921,7 +1920,7 @@
                 <w:noProof/>
                 <w:webHidden/>
               </w:rPr>
-              <w:t>97</w:t>
+              <w:t>85</w:t>
             </w:r>
             <w:r>
               <w:rPr>
@@ -1946,7 +1945,7 @@
               <w:lang w:eastAsia="en-ZA"/>
             </w:rPr>
           </w:pPr>
-          <w:hyperlink w:anchor="_Toc238726748" w:history="1">
+          <w:hyperlink w:anchor="_Toc238794841" w:history="1">
             <w:r>
               <w:rPr>
                 <w:rStyle w:val="Hyperlink"/>
@@ -1973,7 +1972,7 @@
                 <w:noProof/>
                 <w:webHidden/>
               </w:rPr>
-              <w:instrText xml:space="preserve"> PAGEREF _Toc238726748 \h </w:instrText>
+              <w:instrText xml:space="preserve"> PAGEREF _Toc238794841 \h </w:instrText>
             </w:r>
             <w:r>
               <w:rPr>
@@ -1993,7 +1992,7 @@
                 <w:noProof/>
                 <w:webHidden/>
               </w:rPr>
-              <w:t>103</w:t>
+              <w:t>91</w:t>
             </w:r>
             <w:r>
               <w:rPr>
@@ -2018,7 +2017,7 @@
               <w:lang w:eastAsia="en-ZA"/>
             </w:rPr>
           </w:pPr>
-          <w:hyperlink w:anchor="_Toc238726749" w:history="1">
+          <w:hyperlink w:anchor="_Toc238794842" w:history="1">
             <w:r>
               <w:rPr>
                 <w:rStyle w:val="Hyperlink"/>
@@ -2045,7 +2044,7 @@
                 <w:noProof/>
                 <w:webHidden/>
               </w:rPr>
-              <w:instrText xml:space="preserve"> PAGEREF _Toc238726749 \h </w:instrText>
+              <w:instrText xml:space="preserve"> PAGEREF _Toc238794842 \h </w:instrText>
             </w:r>
             <w:r>
               <w:rPr>
@@ -2065,7 +2064,7 @@
                 <w:noProof/>
                 <w:webHidden/>
               </w:rPr>
-              <w:t>105</w:t>
+              <w:t>93</w:t>
             </w:r>
             <w:r>
               <w:rPr>
@@ -2090,7 +2089,7 @@
               <w:lang w:eastAsia="en-ZA"/>
             </w:rPr>
           </w:pPr>
-          <w:hyperlink w:anchor="_Toc238726750" w:history="1">
+          <w:hyperlink w:anchor="_Toc238794843" w:history="1">
             <w:r>
               <w:rPr>
                 <w:rStyle w:val="Hyperlink"/>
@@ -2117,7 +2116,7 @@
                 <w:noProof/>
                 <w:webHidden/>
               </w:rPr>
-              <w:instrText xml:space="preserve"> PAGEREF _Toc238726750 \h </w:instrText>
+              <w:instrText xml:space="preserve"> PAGEREF _Toc238794843 \h </w:instrText>
             </w:r>
             <w:r>
               <w:rPr>
@@ -2137,7 +2136,7 @@
                 <w:noProof/>
                 <w:webHidden/>
               </w:rPr>
-              <w:t>107</w:t>
+              <w:t>95</w:t>
             </w:r>
             <w:r>
               <w:rPr>
@@ -2162,7 +2161,7 @@
               <w:lang w:eastAsia="en-ZA"/>
             </w:rPr>
           </w:pPr>
-          <w:hyperlink w:anchor="_Toc238726751" w:history="1">
+          <w:hyperlink w:anchor="_Toc238794844" w:history="1">
             <w:r>
               <w:rPr>
                 <w:rStyle w:val="Hyperlink"/>
@@ -2189,7 +2188,7 @@
                 <w:noProof/>
                 <w:webHidden/>
               </w:rPr>
-              <w:instrText xml:space="preserve"> PAGEREF _Toc238726751 \h </w:instrText>
+              <w:instrText xml:space="preserve"> PAGEREF _Toc238794844 \h </w:instrText>
             </w:r>
             <w:r>
               <w:rPr>
@@ -2209,7 +2208,7 @@
                 <w:noProof/>
                 <w:webHidden/>
               </w:rPr>
-              <w:t>117</w:t>
+              <w:t>105</w:t>
             </w:r>
             <w:r>
               <w:rPr>
@@ -2234,7 +2233,7 @@
               <w:lang w:eastAsia="en-ZA"/>
             </w:rPr>
           </w:pPr>
-          <w:hyperlink w:anchor="_Toc238726752" w:history="1">
+          <w:hyperlink w:anchor="_Toc238794845" w:history="1">
             <w:r>
               <w:rPr>
                 <w:rStyle w:val="Hyperlink"/>
@@ -2261,7 +2260,7 @@
                 <w:noProof/>
                 <w:webHidden/>
               </w:rPr>
-              <w:instrText xml:space="preserve"> PAGEREF _Toc238726752 \h </w:instrText>
+              <w:instrText xml:space="preserve"> PAGEREF _Toc238794845 \h </w:instrText>
             </w:r>
             <w:r>
               <w:rPr>
@@ -2281,7 +2280,7 @@
                 <w:noProof/>
                 <w:webHidden/>
               </w:rPr>
-              <w:t>127</w:t>
+              <w:t>115</w:t>
             </w:r>
             <w:r>
               <w:rPr>
@@ -2306,7 +2305,7 @@
               <w:lang w:eastAsia="en-ZA"/>
             </w:rPr>
           </w:pPr>
-          <w:hyperlink w:anchor="_Toc238726753" w:history="1">
+          <w:hyperlink w:anchor="_Toc238794846" w:history="1">
             <w:r>
               <w:rPr>
                 <w:rStyle w:val="Hyperlink"/>
@@ -2333,7 +2332,7 @@
                 <w:noProof/>
                 <w:webHidden/>
               </w:rPr>
-              <w:instrText xml:space="preserve"> PAGEREF _Toc238726753 \h </w:instrText>
+              <w:instrText xml:space="preserve"> PAGEREF _Toc238794846 \h </w:instrText>
             </w:r>
             <w:r>
               <w:rPr>
@@ -2353,7 +2352,7 @@
                 <w:noProof/>
                 <w:webHidden/>
               </w:rPr>
-              <w:t>133</w:t>
+              <w:t>121</w:t>
             </w:r>
             <w:r>
               <w:rPr>
@@ -2378,7 +2377,7 @@
               <w:lang w:eastAsia="en-ZA"/>
             </w:rPr>
           </w:pPr>
-          <w:hyperlink w:anchor="_Toc238726754" w:history="1">
+          <w:hyperlink w:anchor="_Toc238794847" w:history="1">
             <w:r>
               <w:rPr>
                 <w:rStyle w:val="Hyperlink"/>
@@ -2405,7 +2404,7 @@
                 <w:noProof/>
                 <w:webHidden/>
               </w:rPr>
-              <w:instrText xml:space="preserve"> PAGEREF _Toc238726754 \h </w:instrText>
+              <w:instrText xml:space="preserve"> PAGEREF _Toc238794847 \h </w:instrText>
             </w:r>
             <w:r>
               <w:rPr>
@@ -2425,7 +2424,7 @@
                 <w:noProof/>
                 <w:webHidden/>
               </w:rPr>
-              <w:t>141</w:t>
+              <w:t>129</w:t>
             </w:r>
             <w:r>
               <w:rPr>
@@ -2450,7 +2449,7 @@
               <w:lang w:eastAsia="en-ZA"/>
             </w:rPr>
           </w:pPr>
-          <w:hyperlink w:anchor="_Toc238726755" w:history="1">
+          <w:hyperlink w:anchor="_Toc238794848" w:history="1">
             <w:r>
               <w:rPr>
                 <w:rStyle w:val="Hyperlink"/>
@@ -2477,7 +2476,7 @@
                 <w:noProof/>
                 <w:webHidden/>
               </w:rPr>
-              <w:instrText xml:space="preserve"> PAGEREF _Toc238726755 \h </w:instrText>
+              <w:instrText xml:space="preserve"> PAGEREF _Toc238794848 \h </w:instrText>
             </w:r>
             <w:r>
               <w:rPr>
@@ -2497,7 +2496,7 @@
                 <w:noProof/>
                 <w:webHidden/>
               </w:rPr>
-              <w:t>147</w:t>
+              <w:t>135</w:t>
             </w:r>
             <w:r>
               <w:rPr>
@@ -2522,7 +2521,7 @@
               <w:lang w:eastAsia="en-ZA"/>
             </w:rPr>
           </w:pPr>
-          <w:hyperlink w:anchor="_Toc238726756" w:history="1">
+          <w:hyperlink w:anchor="_Toc238794849" w:history="1">
             <w:r>
               <w:rPr>
                 <w:rStyle w:val="Hyperlink"/>
@@ -2549,7 +2548,7 @@
                 <w:noProof/>
                 <w:webHidden/>
               </w:rPr>
-              <w:instrText xml:space="preserve"> PAGEREF _Toc238726756 \h </w:instrText>
+              <w:instrText xml:space="preserve"> PAGEREF _Toc238794849 \h </w:instrText>
             </w:r>
             <w:r>
               <w:rPr>
@@ -2569,7 +2568,7 @@
                 <w:noProof/>
                 <w:webHidden/>
               </w:rPr>
-              <w:t>153</w:t>
+              <w:t>141</w:t>
             </w:r>
             <w:r>
               <w:rPr>
@@ -2594,7 +2593,7 @@
               <w:lang w:eastAsia="en-ZA"/>
             </w:rPr>
           </w:pPr>
-          <w:hyperlink w:anchor="_Toc238726757" w:history="1">
+          <w:hyperlink w:anchor="_Toc238794850" w:history="1">
             <w:r>
               <w:rPr>
                 <w:rStyle w:val="Hyperlink"/>
@@ -2621,7 +2620,7 @@
                 <w:noProof/>
                 <w:webHidden/>
               </w:rPr>
-              <w:instrText xml:space="preserve"> PAGEREF _Toc238726757 \h </w:instrText>
+              <w:instrText xml:space="preserve"> PAGEREF _Toc238794850 \h </w:instrText>
             </w:r>
             <w:r>
               <w:rPr>
@@ -2641,7 +2640,7 @@
                 <w:noProof/>
                 <w:webHidden/>
               </w:rPr>
-              <w:t>161</w:t>
+              <w:t>149</w:t>
             </w:r>
             <w:r>
               <w:rPr>
@@ -2666,7 +2665,7 @@
               <w:lang w:eastAsia="en-ZA"/>
             </w:rPr>
           </w:pPr>
-          <w:hyperlink w:anchor="_Toc238726758" w:history="1">
+          <w:hyperlink w:anchor="_Toc238794851" w:history="1">
             <w:r>
               <w:rPr>
                 <w:rStyle w:val="Hyperlink"/>
@@ -2693,7 +2692,7 @@
                 <w:noProof/>
                 <w:webHidden/>
               </w:rPr>
-              <w:instrText xml:space="preserve"> PAGEREF _Toc238726758 \h </w:instrText>
+              <w:instrText xml:space="preserve"> PAGEREF _Toc238794851 \h </w:instrText>
             </w:r>
             <w:r>
               <w:rPr>
@@ -2713,7 +2712,7 @@
                 <w:noProof/>
                 <w:webHidden/>
               </w:rPr>
-              <w:t>163</w:t>
+              <w:t>151</w:t>
             </w:r>
             <w:r>
               <w:rPr>
@@ -2738,7 +2737,7 @@
               <w:lang w:eastAsia="en-ZA"/>
             </w:rPr>
           </w:pPr>
-          <w:hyperlink w:anchor="_Toc238726759" w:history="1">
+          <w:hyperlink w:anchor="_Toc238794852" w:history="1">
             <w:r>
               <w:rPr>
                 <w:rStyle w:val="Hyperlink"/>
@@ -2765,7 +2764,7 @@
                 <w:noProof/>
                 <w:webHidden/>
               </w:rPr>
-              <w:instrText xml:space="preserve"> PAGEREF _Toc238726759 \h </w:instrText>
+              <w:instrText xml:space="preserve"> PAGEREF _Toc238794852 \h </w:instrText>
             </w:r>
             <w:r>
               <w:rPr>
@@ -2785,7 +2784,7 @@
                 <w:noProof/>
                 <w:webHidden/>
               </w:rPr>
-              <w:t>165</w:t>
+              <w:t>153</w:t>
             </w:r>
             <w:r>
               <w:rPr>
@@ -2810,7 +2809,7 @@
               <w:lang w:eastAsia="en-ZA"/>
             </w:rPr>
           </w:pPr>
-          <w:hyperlink w:anchor="_Toc238726760" w:history="1">
+          <w:hyperlink w:anchor="_Toc238794853" w:history="1">
             <w:r>
               <w:rPr>
                 <w:rStyle w:val="Hyperlink"/>
@@ -2837,7 +2836,7 @@
                 <w:noProof/>
                 <w:webHidden/>
               </w:rPr>
-              <w:instrText xml:space="preserve"> PAGEREF _Toc238726760 \h </w:instrText>
+              <w:instrText xml:space="preserve"> PAGEREF _Toc238794853 \h </w:instrText>
             </w:r>
             <w:r>
               <w:rPr>
@@ -2857,7 +2856,7 @@
                 <w:noProof/>
                 <w:webHidden/>
               </w:rPr>
-              <w:t>173</w:t>
+              <w:t>161</w:t>
             </w:r>
             <w:r>
               <w:rPr>
@@ -2882,7 +2881,7 @@
               <w:lang w:eastAsia="en-ZA"/>
             </w:rPr>
           </w:pPr>
-          <w:hyperlink w:anchor="_Toc238726761" w:history="1">
+          <w:hyperlink w:anchor="_Toc238794854" w:history="1">
             <w:r>
               <w:rPr>
                 <w:rStyle w:val="Hyperlink"/>
@@ -2909,7 +2908,7 @@
                 <w:noProof/>
                 <w:webHidden/>
               </w:rPr>
-              <w:instrText xml:space="preserve"> PAGEREF _Toc238726761 \h </w:instrText>
+              <w:instrText xml:space="preserve"> PAGEREF _Toc238794854 \h </w:instrText>
             </w:r>
             <w:r>
               <w:rPr>
@@ -2929,7 +2928,7 @@
                 <w:noProof/>
                 <w:webHidden/>
               </w:rPr>
-              <w:t>181</w:t>
+              <w:t>169</w:t>
             </w:r>
             <w:r>
               <w:rPr>
@@ -2954,7 +2953,7 @@
               <w:lang w:eastAsia="en-ZA"/>
             </w:rPr>
           </w:pPr>
-          <w:hyperlink w:anchor="_Toc238726762" w:history="1">
+          <w:hyperlink w:anchor="_Toc238794855" w:history="1">
             <w:r>
               <w:rPr>
                 <w:rStyle w:val="Hyperlink"/>
@@ -2981,7 +2980,7 @@
                 <w:noProof/>
                 <w:webHidden/>
               </w:rPr>
-              <w:instrText xml:space="preserve"> PAGEREF _Toc238726762 \h </w:instrText>
+              <w:instrText xml:space="preserve"> PAGEREF _Toc238794855 \h </w:instrText>
             </w:r>
             <w:r>
               <w:rPr>
@@ -3001,7 +3000,7 @@
                 <w:noProof/>
                 <w:webHidden/>
               </w:rPr>
-              <w:t>191</w:t>
+              <w:t>179</w:t>
             </w:r>
             <w:r>
               <w:rPr>
@@ -3026,7 +3025,7 @@
               <w:lang w:eastAsia="en-ZA"/>
             </w:rPr>
           </w:pPr>
-          <w:hyperlink w:anchor="_Toc238726763" w:history="1">
+          <w:hyperlink w:anchor="_Toc238794856" w:history="1">
             <w:r>
               <w:rPr>
                 <w:rStyle w:val="Hyperlink"/>
@@ -3053,7 +3052,7 @@
                 <w:noProof/>
                 <w:webHidden/>
               </w:rPr>
-              <w:instrText xml:space="preserve"> PAGEREF _Toc238726763 \h </w:instrText>
+              <w:instrText xml:space="preserve"> PAGEREF _Toc238794856 \h </w:instrText>
             </w:r>
             <w:r>
               <w:rPr>
@@ -3073,7 +3072,7 @@
                 <w:noProof/>
                 <w:webHidden/>
               </w:rPr>
-              <w:t>199</w:t>
+              <w:t>187</w:t>
             </w:r>
             <w:r>
               <w:rPr>
@@ -3098,7 +3097,7 @@
               <w:lang w:eastAsia="en-ZA"/>
             </w:rPr>
           </w:pPr>
-          <w:hyperlink w:anchor="_Toc238726764" w:history="1">
+          <w:hyperlink w:anchor="_Toc238794857" w:history="1">
             <w:r>
               <w:rPr>
                 <w:rStyle w:val="Hyperlink"/>
@@ -3125,7 +3124,7 @@
                 <w:noProof/>
                 <w:webHidden/>
               </w:rPr>
-              <w:instrText xml:space="preserve"> PAGEREF _Toc238726764 \h </w:instrText>
+              <w:instrText xml:space="preserve"> PAGEREF _Toc238794857 \h </w:instrText>
             </w:r>
             <w:r>
               <w:rPr>
@@ -3145,7 +3144,7 @@
                 <w:noProof/>
                 <w:webHidden/>
               </w:rPr>
-              <w:t>208</w:t>
+              <w:t>196</w:t>
             </w:r>
             <w:r>
               <w:rPr>
@@ -3170,7 +3169,7 @@
               <w:lang w:eastAsia="en-ZA"/>
             </w:rPr>
           </w:pPr>
-          <w:hyperlink w:anchor="_Toc238726765" w:history="1">
+          <w:hyperlink w:anchor="_Toc238794858" w:history="1">
             <w:r>
               <w:rPr>
                 <w:rStyle w:val="Hyperlink"/>
@@ -3197,7 +3196,7 @@
                 <w:noProof/>
                 <w:webHidden/>
               </w:rPr>
-              <w:instrText xml:space="preserve"> PAGEREF _Toc238726765 \h </w:instrText>
+              <w:instrText xml:space="preserve"> PAGEREF _Toc238794858 \h </w:instrText>
             </w:r>
             <w:r>
               <w:rPr>
@@ -3217,7 +3216,7 @@
                 <w:noProof/>
                 <w:webHidden/>
               </w:rPr>
-              <w:t>209</w:t>
+              <w:t>199</w:t>
             </w:r>
             <w:r>
               <w:rPr>
@@ -3242,7 +3241,7 @@
               <w:lang w:eastAsia="en-ZA"/>
             </w:rPr>
           </w:pPr>
-          <w:hyperlink w:anchor="_Toc238726766" w:history="1">
+          <w:hyperlink w:anchor="_Toc238794859" w:history="1">
             <w:r>
               <w:rPr>
                 <w:rStyle w:val="Hyperlink"/>
@@ -3269,7 +3268,7 @@
                 <w:noProof/>
                 <w:webHidden/>
               </w:rPr>
-              <w:instrText xml:space="preserve"> PAGEREF _Toc238726766 \h </w:instrText>
+              <w:instrText xml:space="preserve"> PAGEREF _Toc238794859 \h </w:instrText>
             </w:r>
             <w:r>
               <w:rPr>
@@ -3289,7 +3288,7 @@
                 <w:noProof/>
                 <w:webHidden/>
               </w:rPr>
-              <w:t>215</w:t>
+              <w:t>205</w:t>
             </w:r>
             <w:r>
               <w:rPr>
@@ -3314,7 +3313,7 @@
               <w:lang w:eastAsia="en-ZA"/>
             </w:rPr>
           </w:pPr>
-          <w:hyperlink w:anchor="_Toc238726767" w:history="1">
+          <w:hyperlink w:anchor="_Toc238794860" w:history="1">
             <w:r>
               <w:rPr>
                 <w:rStyle w:val="Hyperlink"/>
@@ -3341,7 +3340,7 @@
                 <w:noProof/>
                 <w:webHidden/>
               </w:rPr>
-              <w:instrText xml:space="preserve"> PAGEREF _Toc238726767 \h </w:instrText>
+              <w:instrText xml:space="preserve"> PAGEREF _Toc238794860 \h </w:instrText>
             </w:r>
             <w:r>
               <w:rPr>
@@ -3361,7 +3360,7 @@
                 <w:noProof/>
                 <w:webHidden/>
               </w:rPr>
-              <w:t>218</w:t>
+              <w:t>208</w:t>
             </w:r>
             <w:r>
               <w:rPr>
@@ -3386,7 +3385,7 @@
               <w:lang w:eastAsia="en-ZA"/>
             </w:rPr>
           </w:pPr>
-          <w:hyperlink w:anchor="_Toc238726768" w:history="1">
+          <w:hyperlink w:anchor="_Toc238794861" w:history="1">
             <w:r>
               <w:rPr>
                 <w:rStyle w:val="Hyperlink"/>
@@ -3413,7 +3412,7 @@
                 <w:noProof/>
                 <w:webHidden/>
               </w:rPr>
-              <w:instrText xml:space="preserve"> PAGEREF _Toc238726768 \h </w:instrText>
+              <w:instrText xml:space="preserve"> PAGEREF _Toc238794861 \h </w:instrText>
             </w:r>
             <w:r>
               <w:rPr>
@@ -3433,7 +3432,7 @@
                 <w:noProof/>
                 <w:webHidden/>
               </w:rPr>
-              <w:t>223</w:t>
+              <w:t>213</w:t>
             </w:r>
             <w:r>
               <w:rPr>
@@ -3459,9 +3458,11 @@
           <w:i w:val="0"/>
         </w:rPr>
         <w:sectPr>
+          <w:footerReference w:type="first" r:id="rId9"/>
           <w:type w:val="oddPage"/>
           <w:pgSz w:w="7920" w:h="12240" w:code="6"/>
           <w:pgMar w:top="1080" w:right="864" w:bottom="1080" w:left="1152" w:header="576" w:footer="576" w:gutter="0"/>
+          <w:pgNumType w:fmt="lowerRoman" w:start="1"/>
           <w:cols w:space="720"/>
           <w:titlePg/>
           <w:docGrid w:linePitch="360"/>
@@ -3494,7 +3495,7 @@
           <w:i w:val="0"/>
         </w:rPr>
       </w:pPr>
-      <w:bookmarkStart w:id="0" w:name="_Toc238726727"/>
+      <w:bookmarkStart w:id="0" w:name="_Toc238794820"/>
       <w:r>
         <w:rPr>
           <w:rStyle w:val="SPPrayerResponseCS"/>
@@ -4035,9 +4036,11 @@
           <w:rFonts w:ascii="Segoe UI Symbol" w:hAnsi="Segoe UI Symbol" w:cs="Segoe UI Symbol"/>
         </w:rPr>
         <w:sectPr>
+          <w:footerReference w:type="first" r:id="rId10"/>
           <w:type w:val="oddPage"/>
           <w:pgSz w:w="7920" w:h="12240" w:code="6"/>
           <w:pgMar w:top="1080" w:right="864" w:bottom="1080" w:left="1152" w:header="576" w:footer="576" w:gutter="0"/>
+          <w:pgNumType w:start="1"/>
           <w:cols w:space="720"/>
           <w:titlePg/>
           <w:docGrid w:linePitch="360"/>
@@ -4054,7 +4057,7 @@
       <w:pPr>
         <w:pStyle w:val="SPSectionTitle"/>
       </w:pPr>
-      <w:bookmarkStart w:id="1" w:name="_Toc238726728"/>
+      <w:bookmarkStart w:id="1" w:name="_Toc238794821"/>
       <w:r>
         <w:lastRenderedPageBreak/>
         <w:t>Introduction</w:t>
@@ -4279,7 +4282,7 @@
       <w:pPr>
         <w:pStyle w:val="SPSectionSubTitle"/>
       </w:pPr>
-      <w:bookmarkStart w:id="2" w:name="_Toc238726729"/>
+      <w:bookmarkStart w:id="2" w:name="_Toc238794822"/>
       <w:r>
         <w:lastRenderedPageBreak/>
         <w:t>English and Latin</w:t>
@@ -4340,7 +4343,7 @@
       </w:pPr>
       <w:r>
         <w:pict w14:anchorId="249FE732">
-          <v:rect id="_x0000_i4859" style="width:0;height:1.5pt" o:hralign="center" o:hrstd="t" o:hr="t" fillcolor="#a0a0a0" stroked="f"/>
+          <v:rect id="_x0000_i6149" style="width:0;height:1.5pt" o:hralign="center" o:hrstd="t" o:hr="t" fillcolor="#a0a0a0" stroked="f"/>
         </w:pict>
       </w:r>
     </w:p>
@@ -4361,7 +4364,7 @@
       <w:pPr>
         <w:pStyle w:val="SPSectionSubTitle"/>
       </w:pPr>
-      <w:bookmarkStart w:id="3" w:name="_Toc238726730"/>
+      <w:bookmarkStart w:id="3" w:name="_Toc238794823"/>
       <w:r>
         <w:lastRenderedPageBreak/>
         <w:t>The Prayer</w:t>
@@ -4528,7 +4531,7 @@
       </w:pPr>
       <w:r>
         <w:pict w14:anchorId="5281CFCF">
-          <v:rect id="_x0000_i4860" style="width:0;height:1.5pt" o:hralign="center" o:hrstd="t" o:hr="t" fillcolor="#a0a0a0" stroked="f"/>
+          <v:rect id="_x0000_i6150" style="width:0;height:1.5pt" o:hralign="center" o:hrstd="t" o:hr="t" fillcolor="#a0a0a0" stroked="f"/>
         </w:pict>
       </w:r>
     </w:p>
@@ -4554,7 +4557,7 @@
       <w:pPr>
         <w:pStyle w:val="SPSectionSubTitle"/>
       </w:pPr>
-      <w:bookmarkStart w:id="4" w:name="_Toc238726731"/>
+      <w:bookmarkStart w:id="4" w:name="_Toc238794824"/>
       <w:r>
         <w:t>Scripture</w:t>
       </w:r>
@@ -4626,7 +4629,7 @@
       </w:pPr>
       <w:r>
         <w:pict w14:anchorId="25751FDD">
-          <v:rect id="_x0000_i4861" style="width:0;height:1.5pt" o:hralign="center" o:hrstd="t" o:hr="t" fillcolor="#a0a0a0" stroked="f"/>
+          <v:rect id="_x0000_i6151" style="width:0;height:1.5pt" o:hralign="center" o:hrstd="t" o:hr="t" fillcolor="#a0a0a0" stroked="f"/>
         </w:pict>
       </w:r>
     </w:p>
@@ -4634,7 +4637,7 @@
       <w:pPr>
         <w:pStyle w:val="SPSectionSubTitle"/>
       </w:pPr>
-      <w:bookmarkStart w:id="5" w:name="_Toc238726732"/>
+      <w:bookmarkStart w:id="5" w:name="_Toc238794825"/>
       <w:r>
         <w:t>Reflection</w:t>
       </w:r>
@@ -4693,7 +4696,7 @@
       </w:pPr>
       <w:r>
         <w:pict w14:anchorId="19542BB1">
-          <v:rect id="_x0000_i4862" style="width:0;height:1.5pt" o:hralign="center" o:hrstd="t" o:hr="t" fillcolor="#a0a0a0" stroked="f"/>
+          <v:rect id="_x0000_i6152" style="width:0;height:1.5pt" o:hralign="center" o:hrstd="t" o:hr="t" fillcolor="#a0a0a0" stroked="f"/>
         </w:pict>
       </w:r>
     </w:p>
@@ -4701,7 +4704,7 @@
       <w:pPr>
         <w:pStyle w:val="SPSectionSubTitle"/>
       </w:pPr>
-      <w:bookmarkStart w:id="6" w:name="_Toc238726733"/>
+      <w:bookmarkStart w:id="6" w:name="_Toc238794826"/>
       <w:r>
         <w:t>Latin Vocabulary</w:t>
       </w:r>
@@ -4805,7 +4808,7 @@
       <w:pPr>
         <w:pStyle w:val="SPSectionSubTitle"/>
       </w:pPr>
-      <w:bookmarkStart w:id="7" w:name="_Toc238726734"/>
+      <w:bookmarkStart w:id="7" w:name="_Toc238794827"/>
       <w:r>
         <w:lastRenderedPageBreak/>
         <w:t>Prayer Through the Day</w:t>
@@ -4903,7 +4906,7 @@
       </w:pPr>
       <w:r>
         <w:pict w14:anchorId="68D46385">
-          <v:rect id="_x0000_i4863" style="width:0;height:1.5pt" o:hralign="center" o:hrstd="t" o:hr="t" fillcolor="#a0a0a0" stroked="f"/>
+          <v:rect id="_x0000_i6153" style="width:0;height:1.5pt" o:hralign="center" o:hrstd="t" o:hr="t" fillcolor="#a0a0a0" stroked="f"/>
         </w:pict>
       </w:r>
     </w:p>
@@ -4911,7 +4914,7 @@
       <w:pPr>
         <w:pStyle w:val="SPSectionSubTitle"/>
       </w:pPr>
-      <w:bookmarkStart w:id="8" w:name="_Toc238726735"/>
+      <w:bookmarkStart w:id="8" w:name="_Toc238794828"/>
       <w:r>
         <w:t>A Simple Way to Begin</w:t>
       </w:r>
@@ -5034,7 +5037,7 @@
       </w:pPr>
       <w:r>
         <w:pict w14:anchorId="36FAD975">
-          <v:rect id="_x0000_i4864" style="width:0;height:1.5pt" o:hralign="center" o:hrstd="t" o:hr="t" fillcolor="#a0a0a0" stroked="f"/>
+          <v:rect id="_x0000_i6154" style="width:0;height:1.5pt" o:hralign="center" o:hrstd="t" o:hr="t" fillcolor="#a0a0a0" stroked="f"/>
         </w:pict>
       </w:r>
     </w:p>
@@ -5042,7 +5045,7 @@
       <w:pPr>
         <w:pStyle w:val="SPSectionSubTitle"/>
       </w:pPr>
-      <w:bookmarkStart w:id="9" w:name="_Toc238726736"/>
+      <w:bookmarkStart w:id="9" w:name="_Toc238794829"/>
       <w:r>
         <w:t>Return</w:t>
       </w:r>
@@ -5232,7 +5235,7 @@
         <w:lastRenderedPageBreak/>
         <w:tab/>
       </w:r>
-      <w:bookmarkStart w:id="10" w:name="_Toc238726737"/>
+      <w:bookmarkStart w:id="10" w:name="_Toc238794830"/>
       <w:r>
         <w:t>Part I — Basic Prayers</w:t>
       </w:r>
@@ -5410,7 +5413,7 @@
       <w:pPr>
         <w:pStyle w:val="SPPrayerTitle"/>
       </w:pPr>
-      <w:bookmarkStart w:id="11" w:name="_Toc238726738"/>
+      <w:bookmarkStart w:id="11" w:name="_Toc238794831"/>
       <w:r>
         <w:t>Sign of the cross</w:t>
       </w:r>
@@ -5647,6 +5650,11 @@
       <w:pPr>
         <w:pStyle w:val="SPScriptureReference"/>
       </w:pPr>
+    </w:p>
+    <w:p>
+      <w:pPr>
+        <w:pStyle w:val="SPScriptureReference"/>
+      </w:pPr>
       <w:r>
         <w:t>Matthew 28:19</w:t>
       </w:r>
@@ -5775,7 +5783,7 @@
       <w:pPr>
         <w:pStyle w:val="SPPrayerTitle"/>
       </w:pPr>
-      <w:bookmarkStart w:id="12" w:name="_Toc238726739"/>
+      <w:bookmarkStart w:id="12" w:name="_Toc238794832"/>
       <w:r>
         <w:t>The Our Father</w:t>
       </w:r>
@@ -5844,6 +5852,11 @@
         <w:lastRenderedPageBreak/>
         <w:t xml:space="preserve">ENGLISH </w:t>
       </w:r>
+    </w:p>
+    <w:p>
+      <w:pPr>
+        <w:pStyle w:val="SPPrayerEnglish"/>
+      </w:pPr>
     </w:p>
     <w:p>
       <w:pPr>
@@ -5949,6 +5962,11 @@
       <w:pPr>
         <w:pStyle w:val="SPPrayerLatin"/>
       </w:pPr>
+    </w:p>
+    <w:p>
+      <w:pPr>
+        <w:pStyle w:val="SPPrayerLatin"/>
+      </w:pPr>
       <w:r>
         <w:t>Pater noster, qui es in caelis,</w:t>
       </w:r>
@@ -6057,6 +6075,11 @@
       <w:pPr>
         <w:pStyle w:val="SPScriptureReference"/>
       </w:pPr>
+    </w:p>
+    <w:p>
+      <w:pPr>
+        <w:pStyle w:val="SPScriptureReference"/>
+      </w:pPr>
       <w:r>
         <w:t>Matthew 6:9-13</w:t>
       </w:r>
@@ -6092,34 +6115,25 @@
         <w:t>n earth as it is in heaven. Give us this day our daily bread</w:t>
       </w:r>
       <w:r>
-        <w:t xml:space="preserve">; </w:t>
+        <w:t>; a</w:t>
+      </w:r>
+      <w:r>
+        <w:t xml:space="preserve">nd forgive us our </w:t>
+      </w:r>
+      <w:r>
+        <w:t>trespasses</w:t>
+      </w:r>
+      <w:r>
+        <w:t xml:space="preserve">, </w:t>
       </w:r>
       <w:r>
         <w:t>a</w:t>
       </w:r>
       <w:r>
-        <w:t xml:space="preserve">nd forgive us our </w:t>
-      </w:r>
-      <w:r>
-        <w:t>trespasses</w:t>
-      </w:r>
-      <w:r>
-        <w:t xml:space="preserve">, </w:t>
-      </w:r>
-      <w:r>
-        <w:t>a</w:t>
-      </w:r>
-      <w:r>
         <w:t xml:space="preserve">s we </w:t>
       </w:r>
       <w:r>
-        <w:t>forgive those who trespass against us</w:t>
-      </w:r>
-      <w:r>
-        <w:t>;</w:t>
-      </w:r>
-      <w:r>
-        <w:t xml:space="preserve"> </w:t>
+        <w:t xml:space="preserve">forgive those who trespass against us; </w:t>
       </w:r>
       <w:r>
         <w:t xml:space="preserve">And lead us not into temptation, </w:t>
@@ -6183,21 +6197,10 @@
     </w:p>
     <w:p>
       <w:pPr>
-        <w:pStyle w:val="SPBodyText"/>
-      </w:pPr>
-      <w:r>
-        <w:rPr>
-          <w:bCs/>
-        </w:rPr>
-        <w:t>The Our Father is given to us directly from the teaching of Christ.</w:t>
-      </w:r>
-      <w:r>
-        <w:t xml:space="preserve"> In Matthew, Jesus gives the prayer as part of His teaching on how His disciples should pray. In Luke, the disciples ask Him to teach them, and He answers with these words.</w:t>
-      </w:r>
-    </w:p>
-    <w:p>
-      <w:pPr>
-        <w:pStyle w:val="SPBodyText"/>
+        <w:pStyle w:val="SPPronunciation"/>
+        <w:rPr>
+          <w:rStyle w:val="Emphasis"/>
+        </w:rPr>
         <w:sectPr>
           <w:type w:val="evenPage"/>
           <w:pgSz w:w="7920" w:h="12240" w:code="6"/>
@@ -6207,15 +6210,6 @@
           <w:docGrid w:linePitch="360"/>
         </w:sectPr>
       </w:pPr>
-      <w:r>
-        <w:t xml:space="preserve">The two accounts remind us that prayer is both gift and invitation: Christ teaches us how to turn towards the Father, </w:t>
-      </w:r>
-      <w:r>
-        <w:t>bringing before Him the needs of each day and asking for the grace to forgive as we ourselves seek forgiveness.</w:t>
-      </w:r>
-      <w:r>
-        <w:t xml:space="preserve"> </w:t>
-      </w:r>
     </w:p>
     <w:p>
       <w:pPr>
@@ -6478,7 +6472,7 @@
       <w:pPr>
         <w:pStyle w:val="SPPrayerTitle"/>
       </w:pPr>
-      <w:bookmarkStart w:id="13" w:name="_Toc238726740"/>
+      <w:bookmarkStart w:id="13" w:name="_Toc238794833"/>
       <w:r>
         <w:t xml:space="preserve">The Hail </w:t>
       </w:r>
@@ -6863,6 +6857,11 @@
       <w:r>
         <w:t xml:space="preserve"> </w:t>
       </w:r>
+    </w:p>
+    <w:p>
+      <w:pPr>
+        <w:pStyle w:val="SPScriptureReference"/>
+      </w:pPr>
       <w:r>
         <w:t>Luke 1:28</w:t>
       </w:r>
@@ -6913,27 +6912,6 @@
       <w:pPr>
         <w:pStyle w:val="SPScripture"/>
       </w:pPr>
-    </w:p>
-    <w:p>
-      <w:pPr>
-        <w:pStyle w:val="SPScripture"/>
-      </w:pPr>
-    </w:p>
-    <w:p>
-      <w:pPr>
-        <w:pStyle w:val="SPBodyText"/>
-      </w:pPr>
-      <w:r>
-        <w:t>The opening of the Hail Mary is drawn from the Gospel of Luke. The angel Gabriel greets Mary with words that reveal the grace given to her and announces the presence of the Lord. Elizabeth then greets Mary as blessed among women and blesses the fruit of her womb.</w:t>
-      </w:r>
-    </w:p>
-    <w:p>
-      <w:pPr>
-        <w:pStyle w:val="SPBodyText"/>
-      </w:pPr>
-      <w:r>
-        <w:t>The Church gathers these words of Scripture into prayer. What begins as the greeting of the angel and the blessing of Elizabeth becomes our own confession of faith in the mystery of Christ and our petition for Mary's intercession.</w:t>
-      </w:r>
     </w:p>
     <w:p>
       <w:pPr>
@@ -7382,7 +7360,7 @@
       <w:pPr>
         <w:pStyle w:val="SPPrayerTitle"/>
       </w:pPr>
-      <w:bookmarkStart w:id="14" w:name="_Toc238726741"/>
+      <w:bookmarkStart w:id="14" w:name="_Toc238794834"/>
       <w:r>
         <w:t>The Glory Be</w:t>
       </w:r>
@@ -7627,6 +7605,11 @@
       <w:pPr>
         <w:pStyle w:val="SPScriptureReference"/>
       </w:pPr>
+    </w:p>
+    <w:p>
+      <w:pPr>
+        <w:pStyle w:val="SPScriptureReference"/>
+      </w:pPr>
       <w:r>
         <w:t xml:space="preserve"> </w:t>
       </w:r>
@@ -8127,6 +8110,7 @@
         <w:pStyle w:val="SPBodyText"/>
       </w:pPr>
       <w:r>
+        <w:lastRenderedPageBreak/>
         <w:t>And to the Holy Spirit.</w:t>
       </w:r>
     </w:p>
@@ -8135,7 +8119,6 @@
         <w:pStyle w:val="SPBodyText"/>
       </w:pPr>
       <w:r>
-        <w:lastRenderedPageBreak/>
         <w:t>Give thanks for the One who remains with you.</w:t>
       </w:r>
     </w:p>
@@ -8219,7 +8202,7 @@
       <w:pPr>
         <w:pStyle w:val="SPPrayerTitle"/>
       </w:pPr>
-      <w:bookmarkStart w:id="15" w:name="_Toc238726742"/>
+      <w:bookmarkStart w:id="15" w:name="_Toc238794835"/>
       <w:r>
         <w:t>Act of Contrition</w:t>
       </w:r>
@@ -8754,7 +8737,7 @@
       <w:pPr>
         <w:pStyle w:val="SPPrayerTitle"/>
       </w:pPr>
-      <w:bookmarkStart w:id="16" w:name="_Toc238726743"/>
+      <w:bookmarkStart w:id="16" w:name="_Toc238794836"/>
       <w:r>
         <w:lastRenderedPageBreak/>
         <w:t>Closing Thoughts</w:t>
@@ -9154,7 +9137,7 @@
       <w:pPr>
         <w:pStyle w:val="SPSectionTitle"/>
       </w:pPr>
-      <w:bookmarkStart w:id="17" w:name="_Toc238726744"/>
+      <w:bookmarkStart w:id="17" w:name="_Toc238794837"/>
       <w:r>
         <w:lastRenderedPageBreak/>
         <w:t xml:space="preserve">Part </w:t>
@@ -9379,7 +9362,7 @@
       <w:pPr>
         <w:pStyle w:val="SPPrayerTitle"/>
       </w:pPr>
-      <w:bookmarkStart w:id="18" w:name="_Toc238726745"/>
+      <w:bookmarkStart w:id="18" w:name="_Toc238794838"/>
       <w:r>
         <w:t>The Benedictus</w:t>
       </w:r>
@@ -9470,17 +9453,9 @@
         <w:pStyle w:val="SPPrayerEnglish"/>
       </w:pPr>
       <w:r>
-        <w:rPr>
-          <w:b/>
-          <w:bCs/>
-        </w:rPr>
         <w:t>Blessed be the Lord, the God of Israel</w:t>
       </w:r>
       <w:r>
-        <w:rPr>
-          <w:b/>
-          <w:bCs/>
-        </w:rPr>
         <w:t>,</w:t>
       </w:r>
       <w:r>
@@ -9588,14 +9563,12 @@
         <w:pStyle w:val="SPPrayerLatin"/>
       </w:pPr>
       <w:r>
-        <w:rPr>
-          <w:b/>
-          <w:bCs/>
-        </w:rPr>
         <w:t>Benedictus Dominus Deus Israel,</w:t>
       </w:r>
       <w:r>
         <w:br/>
+      </w:r>
+      <w:r>
         <w:t>quia visitavit et fecit redemptionem plebis suae,</w:t>
       </w:r>
       <w:r>
@@ -9708,17 +9681,9 @@
         </w:rPr>
       </w:pPr>
       <w:r>
-        <w:rPr>
-          <w:b/>
-          <w:bCs/>
-        </w:rPr>
         <w:t>You, my child, shall be called the prophet of the Most High;</w:t>
       </w:r>
       <w:r>
-        <w:rPr>
-          <w:b/>
-          <w:bCs/>
-        </w:rPr>
         <w:br/>
       </w:r>
       <w:r>
@@ -9765,10 +9730,6 @@
         <w:br/>
       </w:r>
       <w:r>
-        <w:rPr>
-          <w:b/>
-          <w:bCs/>
-        </w:rPr>
         <w:t>Glory to the Father and to the Son and to the Holy Spirit</w:t>
       </w:r>
       <w:r>
@@ -9829,85 +9790,73 @@
         <w:pStyle w:val="SPPrayerLatin"/>
       </w:pPr>
       <w:r>
+        <w:t>Et tu, puer, propheta Altissimi vocaberis</w:t>
+      </w:r>
+      <w:r>
+        <w:t>;</w:t>
+      </w:r>
+      <w:r>
+        <w:br/>
+      </w:r>
+    </w:p>
+    <w:p>
+      <w:pPr>
+        <w:pStyle w:val="SPPrayerLatin"/>
+      </w:pPr>
+      <w:r>
+        <w:t>praeibis enim ante faciem Domini parare vias eius,</w:t>
+      </w:r>
+    </w:p>
+    <w:p>
+      <w:pPr>
+        <w:pStyle w:val="SPPrayerLatin"/>
+      </w:pPr>
+      <w:r>
+        <w:t>ad dandam scientiam salutis plebi eius</w:t>
+      </w:r>
+      <w:r>
+        <w:br/>
+        <w:t>in remissionem peccatorum eorum,</w:t>
+      </w:r>
+    </w:p>
+    <w:p>
+      <w:pPr>
+        <w:pStyle w:val="SPPrayerLatin"/>
+      </w:pPr>
+      <w:r>
+        <w:t>per viscera misericordiae Dei nostri,</w:t>
+      </w:r>
+      <w:r>
+        <w:br/>
+        <w:t>in quibus visitabit nos oriens ex alto,</w:t>
+      </w:r>
+    </w:p>
+    <w:p>
+      <w:pPr>
+        <w:pStyle w:val="SPPrayerLatin"/>
+      </w:pPr>
+      <w:r>
+        <w:t>illuminare his qui in tenebris et in umbra mortis sedent,</w:t>
+      </w:r>
+      <w:r>
+        <w:br/>
+        <w:t>ad dirigendos pedes nostros in viam pacis.</w:t>
+      </w:r>
+    </w:p>
+    <w:p>
+      <w:pPr>
+        <w:pStyle w:val="SPPrayerLatin"/>
         <w:rPr>
           <w:b/>
           <w:bCs/>
         </w:rPr>
-        <w:t>Et tu, puer, propheta Altissimi vocaberis</w:t>
-      </w:r>
-      <w:r>
-        <w:rPr>
-          <w:b/>
-          <w:bCs/>
-        </w:rPr>
-        <w:t>;</w:t>
-      </w:r>
-      <w:r>
-        <w:br/>
-      </w:r>
+      </w:pPr>
     </w:p>
     <w:p>
       <w:pPr>
         <w:pStyle w:val="SPPrayerLatin"/>
       </w:pPr>
       <w:r>
-        <w:t>praeibis enim ante faciem Domini parare vias eius,</w:t>
-      </w:r>
-    </w:p>
-    <w:p>
-      <w:pPr>
-        <w:pStyle w:val="SPPrayerLatin"/>
-      </w:pPr>
-      <w:r>
-        <w:t>ad dandam scientiam salutis plebi eius</w:t>
-      </w:r>
-      <w:r>
-        <w:br/>
-        <w:t>in remissionem peccatorum eorum,</w:t>
-      </w:r>
-    </w:p>
-    <w:p>
-      <w:pPr>
-        <w:pStyle w:val="SPPrayerLatin"/>
-      </w:pPr>
-      <w:r>
-        <w:t>per viscera misericordiae Dei nostri,</w:t>
-      </w:r>
-      <w:r>
-        <w:br/>
-        <w:t>in quibus visitabit nos oriens ex alto,</w:t>
-      </w:r>
-    </w:p>
-    <w:p>
-      <w:pPr>
-        <w:pStyle w:val="SPPrayerLatin"/>
-      </w:pPr>
-      <w:r>
-        <w:t>illuminare his qui in tenebris et in umbra mortis sedent,</w:t>
-      </w:r>
-      <w:r>
-        <w:br/>
-        <w:t>ad dirigendos pedes nostros in viam pacis.</w:t>
-      </w:r>
-    </w:p>
-    <w:p>
-      <w:pPr>
-        <w:pStyle w:val="SPPrayerLatin"/>
-        <w:rPr>
-          <w:b/>
-          <w:bCs/>
-        </w:rPr>
-      </w:pPr>
-    </w:p>
-    <w:p>
-      <w:pPr>
-        <w:pStyle w:val="SPPrayerLatin"/>
-      </w:pPr>
-      <w:r>
-        <w:rPr>
-          <w:b/>
-          <w:bCs/>
-        </w:rPr>
         <w:t>Gloria Patri, et Filio, et Spiritui Sancto.</w:t>
       </w:r>
     </w:p>
@@ -10019,15 +9968,7 @@
         <w:pStyle w:val="SPScripture"/>
       </w:pPr>
       <w:r>
-        <w:t xml:space="preserve">And you, child, will be called prophet of the </w:t>
-      </w:r>
-      <w:proofErr w:type="gramStart"/>
-      <w:r>
-        <w:t>Most High</w:t>
-      </w:r>
-      <w:proofErr w:type="gramEnd"/>
-      <w:r>
-        <w:t>; for you will go before the Lord to prepare his ways, to give knowledge of salvation to his people in the forgiveness of their sins</w:t>
+        <w:t>And you, child, will be called prophet of the Most High; for you will go before the Lord to prepare his ways, to give knowledge of salvation to his people in the forgiveness of their sins</w:t>
       </w:r>
       <w:r>
         <w:t xml:space="preserve">, through the tender mercy of our God, </w:t>
@@ -10062,6 +10003,11 @@
       <w:pPr>
         <w:pStyle w:val="SPBodyText"/>
       </w:pPr>
+    </w:p>
+    <w:p>
+      <w:pPr>
+        <w:pStyle w:val="SPBodyText"/>
+      </w:pPr>
       <w:r>
         <w:t>A Song at the Dawn</w:t>
       </w:r>
@@ -10190,7 +10136,6 @@
         <w:pStyle w:val="SPBodyText"/>
       </w:pPr>
       <w:r>
-        <w:lastRenderedPageBreak/>
         <w:t>Sometimes faith is lived in the space between promise and fulfilment.</w:t>
       </w:r>
     </w:p>
@@ -10355,6 +10300,7 @@
         <w:pStyle w:val="SPBodyText"/>
       </w:pPr>
       <w:r>
+        <w:lastRenderedPageBreak/>
         <w:t>God has brought light into darkness before.</w:t>
       </w:r>
     </w:p>
@@ -10368,138 +10314,138 @@
         <w:pStyle w:val="SPBodyText"/>
       </w:pPr>
       <w:r>
+        <w:t xml:space="preserve">And </w:t>
+      </w:r>
+      <w:r>
+        <w:t>therefore,</w:t>
+      </w:r>
+      <w:r>
+        <w:t xml:space="preserve"> we can trust Him again.</w:t>
+      </w:r>
+    </w:p>
+    <w:p>
+      <w:pPr>
+        <w:pStyle w:val="SPBodyText"/>
+      </w:pPr>
+      <w:r>
+        <w:t>A Child Who Will Prepare the Way</w:t>
+      </w:r>
+    </w:p>
+    <w:p>
+      <w:pPr>
+        <w:pStyle w:val="SPBodyText"/>
+      </w:pPr>
+      <w:r>
+        <w:t>Then Zechariah turns toward his son.</w:t>
+      </w:r>
+    </w:p>
+    <w:p>
+      <w:pPr>
+        <w:pStyle w:val="SPBodyText"/>
+      </w:pPr>
+      <w:r>
+        <w:t>John will not be the light.</w:t>
+      </w:r>
+    </w:p>
+    <w:p>
+      <w:pPr>
+        <w:pStyle w:val="SPBodyText"/>
+      </w:pPr>
+      <w:r>
+        <w:t>He will prepare the way for the Light.</w:t>
+      </w:r>
+    </w:p>
+    <w:p>
+      <w:pPr>
+        <w:pStyle w:val="SPBodyText"/>
+      </w:pPr>
+      <w:r>
+        <w:t>His vocation is not to draw attention to himself, but to point beyond himself toward Christ.</w:t>
+      </w:r>
+    </w:p>
+    <w:p>
+      <w:pPr>
+        <w:pStyle w:val="SPBodyText"/>
+      </w:pPr>
+      <w:r>
+        <w:t>There is something deeply Christian in this.</w:t>
+      </w:r>
+    </w:p>
+    <w:p>
+      <w:pPr>
+        <w:pStyle w:val="SPBodyText"/>
+      </w:pPr>
+      <w:r>
+        <w:t>Our lives are not ultimately about making ourselves important.</w:t>
+      </w:r>
+    </w:p>
+    <w:p>
+      <w:pPr>
+        <w:pStyle w:val="SPBodyText"/>
+      </w:pPr>
+      <w:r>
+        <w:t>We are called to prepare the way.</w:t>
+      </w:r>
+    </w:p>
+    <w:p>
+      <w:pPr>
+        <w:pStyle w:val="SPBodyText"/>
+      </w:pPr>
+      <w:r>
+        <w:t>Perhaps that means preparing a way for Christ in our own hearts.</w:t>
+      </w:r>
+    </w:p>
+    <w:p>
+      <w:pPr>
+        <w:pStyle w:val="SPBodyText"/>
+      </w:pPr>
+      <w:r>
+        <w:t>Perhaps it means preparing a way for Him in our families.</w:t>
+      </w:r>
+    </w:p>
+    <w:p>
+      <w:pPr>
+        <w:pStyle w:val="SPBodyText"/>
+      </w:pPr>
+      <w:r>
+        <w:t>Perhaps it means becoming a little more patient, forgiving, truthful, merciful, and courageous so that another person may encounter something of God's love through us.</w:t>
+      </w:r>
+    </w:p>
+    <w:p>
+      <w:pPr>
+        <w:pStyle w:val="SPBodyText"/>
+      </w:pPr>
+      <w:r>
+        <w:t>John prepares the way.</w:t>
+      </w:r>
+    </w:p>
+    <w:p>
+      <w:pPr>
+        <w:pStyle w:val="SPBodyText"/>
+      </w:pPr>
+      <w:r>
+        <w:t>And so can we.</w:t>
+      </w:r>
+    </w:p>
+    <w:p>
+      <w:pPr>
+        <w:pStyle w:val="SPBodyText"/>
+      </w:pPr>
+    </w:p>
+    <w:p>
+      <w:pPr>
+        <w:pStyle w:val="SPBodyText"/>
+      </w:pPr>
+      <w:r>
+        <w:t>The Tender Mercy of God</w:t>
+      </w:r>
+    </w:p>
+    <w:p>
+      <w:pPr>
+        <w:pStyle w:val="SPBodyText"/>
+      </w:pPr>
+      <w:r>
         <w:lastRenderedPageBreak/>
-        <w:t xml:space="preserve">And </w:t>
-      </w:r>
-      <w:r>
-        <w:t>therefore,</w:t>
-      </w:r>
-      <w:r>
-        <w:t xml:space="preserve"> we can trust Him again.</w:t>
-      </w:r>
-    </w:p>
-    <w:p>
-      <w:pPr>
-        <w:pStyle w:val="SPBodyText"/>
-      </w:pPr>
-      <w:r>
-        <w:t>A Child Who Will Prepare the Way</w:t>
-      </w:r>
-    </w:p>
-    <w:p>
-      <w:pPr>
-        <w:pStyle w:val="SPBodyText"/>
-      </w:pPr>
-      <w:r>
-        <w:t>Then Zechariah turns toward his son.</w:t>
-      </w:r>
-    </w:p>
-    <w:p>
-      <w:pPr>
-        <w:pStyle w:val="SPBodyText"/>
-      </w:pPr>
-      <w:r>
-        <w:t>John will not be the light.</w:t>
-      </w:r>
-    </w:p>
-    <w:p>
-      <w:pPr>
-        <w:pStyle w:val="SPBodyText"/>
-      </w:pPr>
-      <w:r>
-        <w:t>He will prepare the way for the Light.</w:t>
-      </w:r>
-    </w:p>
-    <w:p>
-      <w:pPr>
-        <w:pStyle w:val="SPBodyText"/>
-      </w:pPr>
-      <w:r>
-        <w:t>His vocation is not to draw attention to himself, but to point beyond himself toward Christ.</w:t>
-      </w:r>
-    </w:p>
-    <w:p>
-      <w:pPr>
-        <w:pStyle w:val="SPBodyText"/>
-      </w:pPr>
-      <w:r>
-        <w:t>There is something deeply Christian in this.</w:t>
-      </w:r>
-    </w:p>
-    <w:p>
-      <w:pPr>
-        <w:pStyle w:val="SPBodyText"/>
-      </w:pPr>
-      <w:r>
-        <w:t>Our lives are not ultimately about making ourselves important.</w:t>
-      </w:r>
-    </w:p>
-    <w:p>
-      <w:pPr>
-        <w:pStyle w:val="SPBodyText"/>
-      </w:pPr>
-      <w:r>
-        <w:t>We are called to prepare the way.</w:t>
-      </w:r>
-    </w:p>
-    <w:p>
-      <w:pPr>
-        <w:pStyle w:val="SPBodyText"/>
-      </w:pPr>
-      <w:r>
-        <w:t>Perhaps that means preparing a way for Christ in our own hearts.</w:t>
-      </w:r>
-    </w:p>
-    <w:p>
-      <w:pPr>
-        <w:pStyle w:val="SPBodyText"/>
-      </w:pPr>
-      <w:r>
-        <w:t>Perhaps it means preparing a way for Him in our families.</w:t>
-      </w:r>
-    </w:p>
-    <w:p>
-      <w:pPr>
-        <w:pStyle w:val="SPBodyText"/>
-      </w:pPr>
-      <w:r>
-        <w:t>Perhaps it means becoming a little more patient, forgiving, truthful, merciful, and courageous so that another person may encounter something of God's love through us.</w:t>
-      </w:r>
-    </w:p>
-    <w:p>
-      <w:pPr>
-        <w:pStyle w:val="SPBodyText"/>
-      </w:pPr>
-      <w:r>
-        <w:t>John prepares the way.</w:t>
-      </w:r>
-    </w:p>
-    <w:p>
-      <w:pPr>
-        <w:pStyle w:val="SPBodyText"/>
-      </w:pPr>
-      <w:r>
-        <w:t>And so can we.</w:t>
-      </w:r>
-    </w:p>
-    <w:p>
-      <w:pPr>
-        <w:pStyle w:val="SPBodyText"/>
-      </w:pPr>
-    </w:p>
-    <w:p>
-      <w:pPr>
-        <w:pStyle w:val="SPBodyText"/>
-      </w:pPr>
-      <w:r>
-        <w:t>The Tender Mercy of God</w:t>
-      </w:r>
-    </w:p>
-    <w:p>
-      <w:pPr>
-        <w:pStyle w:val="SPBodyText"/>
-      </w:pPr>
-      <w:r>
         <w:t>One of the most beautiful moments in the Benedictus comes near its end.</w:t>
       </w:r>
     </w:p>
@@ -10513,7 +10459,6 @@
         <w:pStyle w:val="SPBodyText"/>
       </w:pPr>
       <w:r>
-        <w:lastRenderedPageBreak/>
         <w:t xml:space="preserve">The coming of salvation is described through the </w:t>
       </w:r>
       <w:r>
@@ -10673,6 +10618,7 @@
         <w:pStyle w:val="SPBodyText"/>
       </w:pPr>
       <w:r>
+        <w:lastRenderedPageBreak/>
         <w:t>The final words of the Benedictus are not about giving us a complete map of the future.</w:t>
       </w:r>
     </w:p>
@@ -10686,153 +10632,153 @@
         <w:pStyle w:val="SPBodyText"/>
       </w:pPr>
       <w:r>
+        <w:t>They ask for something simpler:</w:t>
+      </w:r>
+    </w:p>
+    <w:p>
+      <w:pPr>
+        <w:pStyle w:val="SPBodyText"/>
+      </w:pPr>
+      <w:r>
+        <w:t>that God may guide our feet into the way of peace.</w:t>
+      </w:r>
+    </w:p>
+    <w:p>
+      <w:pPr>
+        <w:pStyle w:val="SPBodyText"/>
+      </w:pPr>
+      <w:r>
+        <w:t>Not necessarily the whole road.</w:t>
+      </w:r>
+    </w:p>
+    <w:p>
+      <w:pPr>
+        <w:pStyle w:val="SPBodyText"/>
+      </w:pPr>
+      <w:r>
+        <w:t>Just the next step.</w:t>
+      </w:r>
+    </w:p>
+    <w:p>
+      <w:pPr>
+        <w:pStyle w:val="SPBodyText"/>
+      </w:pPr>
+      <w:r>
+        <w:t>That may be all we need.</w:t>
+      </w:r>
+    </w:p>
+    <w:p>
+      <w:pPr>
+        <w:pStyle w:val="SPBodyText"/>
+      </w:pPr>
+      <w:r>
+        <w:t>We do not always need to know where the road will eventually lead.</w:t>
+      </w:r>
+    </w:p>
+    <w:p>
+      <w:pPr>
+        <w:pStyle w:val="SPBodyText"/>
+      </w:pPr>
+      <w:r>
+        <w:t>We need only enough light to take the next faithful step.</w:t>
+      </w:r>
+    </w:p>
+    <w:p>
+      <w:pPr>
+        <w:pStyle w:val="SPBodyText"/>
+      </w:pPr>
+      <w:r>
+        <w:t>The Benedictus therefore becomes a prayer for our own lives.</w:t>
+      </w:r>
+    </w:p>
+    <w:p>
+      <w:pPr>
+        <w:pStyle w:val="SPBodyText"/>
+      </w:pPr>
+    </w:p>
+    <w:p>
+      <w:pPr>
+        <w:pStyle w:val="SPBodyText"/>
+      </w:pPr>
+      <w:r>
+        <w:t>When we are uncertain:</w:t>
+      </w:r>
+    </w:p>
+    <w:p>
+      <w:pPr>
+        <w:pStyle w:val="SPBodyText"/>
+      </w:pPr>
+      <w:r>
+        <w:t>Guide our feet.</w:t>
+      </w:r>
+    </w:p>
+    <w:p>
+      <w:pPr>
+        <w:pStyle w:val="SPBodyText"/>
+      </w:pPr>
+      <w:r>
+        <w:t>When we are afraid:</w:t>
+      </w:r>
+    </w:p>
+    <w:p>
+      <w:pPr>
+        <w:pStyle w:val="SPBodyText"/>
+      </w:pPr>
+      <w:r>
+        <w:t>Guide our feet.</w:t>
+      </w:r>
+    </w:p>
+    <w:p>
+      <w:pPr>
+        <w:pStyle w:val="SPBodyText"/>
+      </w:pPr>
+      <w:r>
+        <w:t>When we have wandered:</w:t>
+      </w:r>
+    </w:p>
+    <w:p>
+      <w:pPr>
+        <w:pStyle w:val="SPBodyText"/>
+      </w:pPr>
+      <w:r>
+        <w:t>Guide our feet.</w:t>
+      </w:r>
+    </w:p>
+    <w:p>
+      <w:pPr>
+        <w:pStyle w:val="SPBodyText"/>
+      </w:pPr>
+      <w:r>
+        <w:t>When we cannot see beyond the darkness:</w:t>
+      </w:r>
+    </w:p>
+    <w:p>
+      <w:pPr>
+        <w:pStyle w:val="SPBodyText"/>
+      </w:pPr>
+      <w:r>
+        <w:t>Guide our feet into the way of peace.</w:t>
+      </w:r>
+    </w:p>
+    <w:p>
+      <w:pPr>
+        <w:pStyle w:val="SPBodyText"/>
+      </w:pPr>
+    </w:p>
+    <w:p>
+      <w:pPr>
+        <w:pStyle w:val="SPBodyText"/>
+      </w:pPr>
+      <w:r>
+        <w:t>And perhaps this is why the Church gives this canticle to the morning.</w:t>
+      </w:r>
+    </w:p>
+    <w:p>
+      <w:pPr>
+        <w:pStyle w:val="SPBodyText"/>
+      </w:pPr>
+      <w:r>
         <w:lastRenderedPageBreak/>
-        <w:t>They ask for something simpler:</w:t>
-      </w:r>
-    </w:p>
-    <w:p>
-      <w:pPr>
-        <w:pStyle w:val="SPBodyText"/>
-      </w:pPr>
-      <w:r>
-        <w:t>that God may guide our feet into the way of peace.</w:t>
-      </w:r>
-    </w:p>
-    <w:p>
-      <w:pPr>
-        <w:pStyle w:val="SPBodyText"/>
-      </w:pPr>
-      <w:r>
-        <w:t>Not necessarily the whole road.</w:t>
-      </w:r>
-    </w:p>
-    <w:p>
-      <w:pPr>
-        <w:pStyle w:val="SPBodyText"/>
-      </w:pPr>
-      <w:r>
-        <w:t>Just the next step.</w:t>
-      </w:r>
-    </w:p>
-    <w:p>
-      <w:pPr>
-        <w:pStyle w:val="SPBodyText"/>
-      </w:pPr>
-      <w:r>
-        <w:t>That may be all we need.</w:t>
-      </w:r>
-    </w:p>
-    <w:p>
-      <w:pPr>
-        <w:pStyle w:val="SPBodyText"/>
-      </w:pPr>
-      <w:r>
-        <w:t>We do not always need to know where the road will eventually lead.</w:t>
-      </w:r>
-    </w:p>
-    <w:p>
-      <w:pPr>
-        <w:pStyle w:val="SPBodyText"/>
-      </w:pPr>
-      <w:r>
-        <w:t>We need only enough light to take the next faithful step.</w:t>
-      </w:r>
-    </w:p>
-    <w:p>
-      <w:pPr>
-        <w:pStyle w:val="SPBodyText"/>
-      </w:pPr>
-      <w:r>
-        <w:t>The Benedictus therefore becomes a prayer for our own lives.</w:t>
-      </w:r>
-    </w:p>
-    <w:p>
-      <w:pPr>
-        <w:pStyle w:val="SPBodyText"/>
-      </w:pPr>
-    </w:p>
-    <w:p>
-      <w:pPr>
-        <w:pStyle w:val="SPBodyText"/>
-      </w:pPr>
-      <w:r>
-        <w:t>When we are uncertain:</w:t>
-      </w:r>
-    </w:p>
-    <w:p>
-      <w:pPr>
-        <w:pStyle w:val="SPBodyText"/>
-      </w:pPr>
-      <w:r>
-        <w:t>Guide our feet.</w:t>
-      </w:r>
-    </w:p>
-    <w:p>
-      <w:pPr>
-        <w:pStyle w:val="SPBodyText"/>
-      </w:pPr>
-      <w:r>
-        <w:t>When we are afraid:</w:t>
-      </w:r>
-    </w:p>
-    <w:p>
-      <w:pPr>
-        <w:pStyle w:val="SPBodyText"/>
-      </w:pPr>
-      <w:r>
-        <w:t>Guide our feet.</w:t>
-      </w:r>
-    </w:p>
-    <w:p>
-      <w:pPr>
-        <w:pStyle w:val="SPBodyText"/>
-      </w:pPr>
-      <w:r>
-        <w:t>When we have wandered:</w:t>
-      </w:r>
-    </w:p>
-    <w:p>
-      <w:pPr>
-        <w:pStyle w:val="SPBodyText"/>
-      </w:pPr>
-      <w:r>
-        <w:t>Guide our feet.</w:t>
-      </w:r>
-    </w:p>
-    <w:p>
-      <w:pPr>
-        <w:pStyle w:val="SPBodyText"/>
-      </w:pPr>
-      <w:r>
-        <w:t>When we cannot see beyond the darkness:</w:t>
-      </w:r>
-    </w:p>
-    <w:p>
-      <w:pPr>
-        <w:pStyle w:val="SPBodyText"/>
-      </w:pPr>
-      <w:r>
-        <w:t>Guide our feet into the way of peace.</w:t>
-      </w:r>
-    </w:p>
-    <w:p>
-      <w:pPr>
-        <w:pStyle w:val="SPBodyText"/>
-      </w:pPr>
-    </w:p>
-    <w:p>
-      <w:pPr>
-        <w:pStyle w:val="SPBodyText"/>
-      </w:pPr>
-      <w:r>
-        <w:t>And perhaps this is why the Church gives this canticle to the morning.</w:t>
-      </w:r>
-    </w:p>
-    <w:p>
-      <w:pPr>
-        <w:pStyle w:val="SPBodyText"/>
-      </w:pPr>
-      <w:r>
         <w:t>The day is beginning.</w:t>
       </w:r>
     </w:p>
@@ -10854,7 +10800,6 @@
         <w:pStyle w:val="SPBodyText"/>
       </w:pPr>
       <w:r>
-        <w:lastRenderedPageBreak/>
         <w:t>But the dawn has come.</w:t>
       </w:r>
     </w:p>
@@ -11004,6 +10949,7 @@
     <w:p>
       <w:pPr>
         <w:pStyle w:val="SPBodyText"/>
+        <w:jc w:val="center"/>
         <w:sectPr>
           <w:type w:val="oddPage"/>
           <w:pgSz w:w="7920" w:h="12240" w:code="6"/>
@@ -11042,7 +10988,7 @@
       <w:pPr>
         <w:pStyle w:val="SPPrayerTitle"/>
       </w:pPr>
-      <w:bookmarkStart w:id="19" w:name="_Toc238726746"/>
+      <w:bookmarkStart w:id="19" w:name="_Toc238794839"/>
       <w:r>
         <w:t>The Magnificat</w:t>
       </w:r>
@@ -11178,15 +11124,7 @@
         <w:pStyle w:val="SPPrayerEnglish"/>
       </w:pPr>
       <w:r>
-        <w:t xml:space="preserve">for he has looked with </w:t>
-      </w:r>
-      <w:proofErr w:type="spellStart"/>
-      <w:r>
-        <w:t>favor</w:t>
-      </w:r>
-      <w:proofErr w:type="spellEnd"/>
-      <w:r>
-        <w:t xml:space="preserve"> on his lowly servant.</w:t>
+        <w:t>for he has looked with favor on his lowly servant.</w:t>
       </w:r>
       <w:r>
         <w:br/>
@@ -12280,6 +12218,7 @@
     <w:p>
       <w:pPr>
         <w:pStyle w:val="SPBodyText"/>
+        <w:jc w:val="center"/>
         <w:sectPr>
           <w:type w:val="oddPage"/>
           <w:pgSz w:w="7920" w:h="12240" w:code="6"/>
@@ -12318,7 +12257,7 @@
       <w:pPr>
         <w:pStyle w:val="SPPrayerTitle"/>
       </w:pPr>
-      <w:bookmarkStart w:id="20" w:name="_Toc238726747"/>
+      <w:bookmarkStart w:id="20" w:name="_Toc238794840"/>
       <w:r>
         <w:t>Nunc Dimmitis</w:t>
       </w:r>
@@ -12528,6 +12467,11 @@
       <w:pPr>
         <w:pStyle w:val="SPScriptureReference"/>
       </w:pPr>
+    </w:p>
+    <w:p>
+      <w:pPr>
+        <w:pStyle w:val="SPScriptureReference"/>
+      </w:pPr>
       <w:r>
         <w:t xml:space="preserve"> Luke </w:t>
       </w:r>
@@ -12989,7 +12933,7 @@
       <w:pPr>
         <w:pStyle w:val="SPPrayerTitle"/>
       </w:pPr>
-      <w:bookmarkStart w:id="21" w:name="_Toc238726748"/>
+      <w:bookmarkStart w:id="21" w:name="_Toc238794841"/>
       <w:r>
         <w:lastRenderedPageBreak/>
         <w:t>Closing Thoughts</w:t>
@@ -13190,7 +13134,7 @@
       <w:pPr>
         <w:pStyle w:val="SPSectionTitle"/>
       </w:pPr>
-      <w:bookmarkStart w:id="22" w:name="_Toc238726749"/>
+      <w:bookmarkStart w:id="22" w:name="_Toc238794842"/>
       <w:r>
         <w:lastRenderedPageBreak/>
         <w:t xml:space="preserve">Part </w:t>
@@ -13396,7 +13340,7 @@
       <w:pPr>
         <w:pStyle w:val="SPPrayerTitle"/>
       </w:pPr>
-      <w:bookmarkStart w:id="23" w:name="_Toc238726750"/>
+      <w:bookmarkStart w:id="23" w:name="_Toc238794843"/>
       <w:r>
         <w:t xml:space="preserve">Morning </w:t>
       </w:r>
@@ -13910,6 +13854,11 @@
       <w:pPr>
         <w:pStyle w:val="SPScriptureReference"/>
       </w:pPr>
+    </w:p>
+    <w:p>
+      <w:pPr>
+        <w:pStyle w:val="SPScriptureReference"/>
+      </w:pPr>
       <w:r>
         <w:t>Romans 12:1</w:t>
       </w:r>
@@ -14268,9 +14217,6 @@
       <w:pPr>
         <w:pStyle w:val="SPBodyText"/>
       </w:pPr>
-      <w:r>
-        <w:t>And then the next.</w:t>
-      </w:r>
     </w:p>
     <w:p>
       <w:pPr>
@@ -14412,7 +14358,7 @@
       <w:pPr>
         <w:pStyle w:val="SPPrayerTitle"/>
       </w:pPr>
-      <w:bookmarkStart w:id="24" w:name="_Toc238726751"/>
+      <w:bookmarkStart w:id="24" w:name="_Toc238794844"/>
       <w:r>
         <w:t>The Angelus</w:t>
       </w:r>
@@ -14986,6 +14932,11 @@
       <w:pPr>
         <w:pStyle w:val="SPScriptureReference"/>
       </w:pPr>
+    </w:p>
+    <w:p>
+      <w:pPr>
+        <w:pStyle w:val="SPScriptureReference"/>
+      </w:pPr>
       <w:r>
         <w:t>Luke 1:</w:t>
       </w:r>
@@ -15089,6 +15040,11 @@
       <w:r>
         <w:t xml:space="preserve"> </w:t>
       </w:r>
+    </w:p>
+    <w:p>
+      <w:pPr>
+        <w:pStyle w:val="SPBodyText"/>
+      </w:pPr>
       <w:r>
         <w:t>The Word Became Flesh</w:t>
       </w:r>
@@ -15235,6 +15191,7 @@
         <w:pStyle w:val="SPBodyText"/>
       </w:pPr>
       <w:r>
+        <w:lastRenderedPageBreak/>
         <w:t>But the mystery remains.</w:t>
       </w:r>
     </w:p>
@@ -15395,6 +15352,7 @@
         <w:pStyle w:val="SPBodyText"/>
       </w:pPr>
       <w:r>
+        <w:lastRenderedPageBreak/>
         <w:t>The prayer leads us from the Incarnation toward the Cross and the Resurrection.</w:t>
       </w:r>
     </w:p>
@@ -15403,158 +15361,158 @@
         <w:pStyle w:val="SPBodyText"/>
       </w:pPr>
       <w:r>
+        <w:t>The Child whom Mary carried would become the Christ who suffered, died, and rose again.</w:t>
+      </w:r>
+    </w:p>
+    <w:p>
+      <w:pPr>
+        <w:pStyle w:val="SPBodyText"/>
+      </w:pPr>
+      <w:r>
+        <w:t>The Word who became flesh came to redeem us.</w:t>
+      </w:r>
+    </w:p>
+    <w:p>
+      <w:pPr>
+        <w:pStyle w:val="SPBodyText"/>
+      </w:pPr>
+      <w:r>
+        <w:t>The mystery of the Incarnation is therefore also the mystery of our salvation.</w:t>
+      </w:r>
+    </w:p>
+    <w:p>
+      <w:pPr>
+        <w:pStyle w:val="SPBodyText"/>
+      </w:pPr>
+      <w:r>
+        <w:t>God did not merely come among us.</w:t>
+      </w:r>
+    </w:p>
+    <w:p>
+      <w:pPr>
+        <w:pStyle w:val="SPBodyText"/>
+      </w:pPr>
+    </w:p>
+    <w:p>
+      <w:pPr>
+        <w:pStyle w:val="SPBodyText"/>
+      </w:pPr>
+      <w:r>
+        <w:t>He came for us.</w:t>
+      </w:r>
+    </w:p>
+    <w:p>
+      <w:pPr>
+        <w:pStyle w:val="SPBodyText"/>
+      </w:pPr>
+    </w:p>
+    <w:p>
+      <w:pPr>
+        <w:pStyle w:val="SPBodyText"/>
+      </w:pPr>
+      <w:r>
+        <w:t>Perhaps that is why the Angelus is so beautiful as a prayer throughout the day.</w:t>
+      </w:r>
+    </w:p>
+    <w:p>
+      <w:pPr>
+        <w:pStyle w:val="SPBodyText"/>
+      </w:pPr>
+      <w:r>
+        <w:t>It interrupts us.</w:t>
+      </w:r>
+    </w:p>
+    <w:p>
+      <w:pPr>
+        <w:pStyle w:val="SPBodyText"/>
+      </w:pPr>
+      <w:r>
+        <w:t>For a few moments, the work can wait.</w:t>
+      </w:r>
+    </w:p>
+    <w:p>
+      <w:pPr>
+        <w:pStyle w:val="SPBodyText"/>
+      </w:pPr>
+      <w:r>
+        <w:t>The noise can wait.</w:t>
+      </w:r>
+    </w:p>
+    <w:p>
+      <w:pPr>
+        <w:pStyle w:val="SPBodyText"/>
+      </w:pPr>
+      <w:r>
+        <w:t>Our worries can wait.</w:t>
+      </w:r>
+    </w:p>
+    <w:p>
+      <w:pPr>
+        <w:pStyle w:val="SPBodyText"/>
+      </w:pPr>
+      <w:r>
+        <w:t>We remember.</w:t>
+      </w:r>
+    </w:p>
+    <w:p>
+      <w:pPr>
+        <w:pStyle w:val="SPBodyText"/>
+      </w:pPr>
+      <w:r>
+        <w:t>The angel spoke.</w:t>
+      </w:r>
+    </w:p>
+    <w:p>
+      <w:pPr>
+        <w:pStyle w:val="SPBodyText"/>
+      </w:pPr>
+      <w:r>
+        <w:t>Mary believed.</w:t>
+      </w:r>
+    </w:p>
+    <w:p>
+      <w:pPr>
+        <w:pStyle w:val="SPBodyText"/>
+      </w:pPr>
+      <w:r>
+        <w:t>The Word became flesh.</w:t>
+      </w:r>
+    </w:p>
+    <w:p>
+      <w:pPr>
+        <w:pStyle w:val="SPBodyText"/>
+      </w:pPr>
+      <w:r>
+        <w:t>And Christ dwells among us.</w:t>
+      </w:r>
+    </w:p>
+    <w:p>
+      <w:pPr>
+        <w:pStyle w:val="SPBodyText"/>
+      </w:pPr>
+    </w:p>
+    <w:p>
+      <w:pPr>
+        <w:pStyle w:val="SPBodyText"/>
+      </w:pPr>
+      <w:r>
+        <w:t>At six in the morning, we remember the beginning.</w:t>
+      </w:r>
+    </w:p>
+    <w:p>
+      <w:pPr>
+        <w:pStyle w:val="SPBodyText"/>
+      </w:pPr>
+      <w:r>
+        <w:t>At noon, we pause in the midst of our work.</w:t>
+      </w:r>
+    </w:p>
+    <w:p>
+      <w:pPr>
+        <w:pStyle w:val="SPBodyText"/>
+      </w:pPr>
+      <w:r>
         <w:lastRenderedPageBreak/>
-        <w:t>The Child whom Mary carried would become the Christ who suffered, died, and rose again.</w:t>
-      </w:r>
-    </w:p>
-    <w:p>
-      <w:pPr>
-        <w:pStyle w:val="SPBodyText"/>
-      </w:pPr>
-      <w:r>
-        <w:t>The Word who became flesh came to redeem us.</w:t>
-      </w:r>
-    </w:p>
-    <w:p>
-      <w:pPr>
-        <w:pStyle w:val="SPBodyText"/>
-      </w:pPr>
-      <w:r>
-        <w:t>The mystery of the Incarnation is therefore also the mystery of our salvation.</w:t>
-      </w:r>
-    </w:p>
-    <w:p>
-      <w:pPr>
-        <w:pStyle w:val="SPBodyText"/>
-      </w:pPr>
-      <w:r>
-        <w:t>God did not merely come among us.</w:t>
-      </w:r>
-    </w:p>
-    <w:p>
-      <w:pPr>
-        <w:pStyle w:val="SPBodyText"/>
-      </w:pPr>
-    </w:p>
-    <w:p>
-      <w:pPr>
-        <w:pStyle w:val="SPBodyText"/>
-      </w:pPr>
-      <w:r>
-        <w:t>He came for us.</w:t>
-      </w:r>
-    </w:p>
-    <w:p>
-      <w:pPr>
-        <w:pStyle w:val="SPBodyText"/>
-      </w:pPr>
-    </w:p>
-    <w:p>
-      <w:pPr>
-        <w:pStyle w:val="SPBodyText"/>
-      </w:pPr>
-      <w:r>
-        <w:t>Perhaps that is why the Angelus is so beautiful as a prayer throughout the day.</w:t>
-      </w:r>
-    </w:p>
-    <w:p>
-      <w:pPr>
-        <w:pStyle w:val="SPBodyText"/>
-      </w:pPr>
-      <w:r>
-        <w:t>It interrupts us.</w:t>
-      </w:r>
-    </w:p>
-    <w:p>
-      <w:pPr>
-        <w:pStyle w:val="SPBodyText"/>
-      </w:pPr>
-      <w:r>
-        <w:t>For a few moments, the work can wait.</w:t>
-      </w:r>
-    </w:p>
-    <w:p>
-      <w:pPr>
-        <w:pStyle w:val="SPBodyText"/>
-      </w:pPr>
-      <w:r>
-        <w:t>The noise can wait.</w:t>
-      </w:r>
-    </w:p>
-    <w:p>
-      <w:pPr>
-        <w:pStyle w:val="SPBodyText"/>
-      </w:pPr>
-      <w:r>
-        <w:t>Our worries can wait.</w:t>
-      </w:r>
-    </w:p>
-    <w:p>
-      <w:pPr>
-        <w:pStyle w:val="SPBodyText"/>
-      </w:pPr>
-      <w:r>
-        <w:t>We remember.</w:t>
-      </w:r>
-    </w:p>
-    <w:p>
-      <w:pPr>
-        <w:pStyle w:val="SPBodyText"/>
-      </w:pPr>
-      <w:r>
-        <w:t>The angel spoke.</w:t>
-      </w:r>
-    </w:p>
-    <w:p>
-      <w:pPr>
-        <w:pStyle w:val="SPBodyText"/>
-      </w:pPr>
-      <w:r>
-        <w:t>Mary believed.</w:t>
-      </w:r>
-    </w:p>
-    <w:p>
-      <w:pPr>
-        <w:pStyle w:val="SPBodyText"/>
-      </w:pPr>
-      <w:r>
-        <w:t>The Word became flesh.</w:t>
-      </w:r>
-    </w:p>
-    <w:p>
-      <w:pPr>
-        <w:pStyle w:val="SPBodyText"/>
-      </w:pPr>
-      <w:r>
-        <w:t>And Christ dwells among us.</w:t>
-      </w:r>
-    </w:p>
-    <w:p>
-      <w:pPr>
-        <w:pStyle w:val="SPBodyText"/>
-      </w:pPr>
-    </w:p>
-    <w:p>
-      <w:pPr>
-        <w:pStyle w:val="SPBodyText"/>
-      </w:pPr>
-      <w:r>
-        <w:t>At six in the morning, we remember the beginning.</w:t>
-      </w:r>
-    </w:p>
-    <w:p>
-      <w:pPr>
-        <w:pStyle w:val="SPBodyText"/>
-      </w:pPr>
-      <w:r>
-        <w:t>At noon, we pause in the midst of our work.</w:t>
-      </w:r>
-    </w:p>
-    <w:p>
-      <w:pPr>
-        <w:pStyle w:val="SPBodyText"/>
-      </w:pPr>
-      <w:r>
         <w:t>At six in the evening, we remember again as the day comes to an end.</w:t>
       </w:r>
     </w:p>
@@ -15568,7 +15526,6 @@
         <w:pStyle w:val="SPBodyText"/>
       </w:pPr>
       <w:r>
-        <w:lastRenderedPageBreak/>
         <w:t>Three times a day, we return to the same mystery.</w:t>
       </w:r>
     </w:p>
@@ -15722,7 +15679,7 @@
       <w:pPr>
         <w:pStyle w:val="SPPrayerTitle"/>
       </w:pPr>
-      <w:bookmarkStart w:id="25" w:name="_Toc238726752"/>
+      <w:bookmarkStart w:id="25" w:name="_Toc238794845"/>
       <w:r>
         <w:t>Anima Christi</w:t>
       </w:r>
@@ -16485,7 +16442,7 @@
       <w:pPr>
         <w:pStyle w:val="SPPrayerTitle"/>
       </w:pPr>
-      <w:bookmarkStart w:id="26" w:name="_Toc238726753"/>
+      <w:bookmarkStart w:id="26" w:name="_Toc238794846"/>
       <w:r>
         <w:t>Guardian Angel Prayer</w:t>
       </w:r>
@@ -17141,7 +17098,7 @@
       <w:pPr>
         <w:pStyle w:val="SPPrayerTitle"/>
       </w:pPr>
-      <w:bookmarkStart w:id="27" w:name="_Toc238726754"/>
+      <w:bookmarkStart w:id="27" w:name="_Toc238794847"/>
       <w:r>
         <w:t>Prayer for the faithful departed</w:t>
       </w:r>
@@ -17683,7 +17640,7 @@
       <w:pPr>
         <w:pStyle w:val="SPPrayerTitle"/>
       </w:pPr>
-      <w:bookmarkStart w:id="28" w:name="_Toc238726755"/>
+      <w:bookmarkStart w:id="28" w:name="_Toc238794848"/>
       <w:r>
         <w:t>Divine  praises</w:t>
       </w:r>
@@ -18321,7 +18278,7 @@
       <w:pPr>
         <w:pStyle w:val="SPPrayerTitle"/>
       </w:pPr>
-      <w:bookmarkStart w:id="29" w:name="_Toc238726756"/>
+      <w:bookmarkStart w:id="29" w:name="_Toc238794849"/>
       <w:r>
         <w:t>Night prayer</w:t>
       </w:r>
@@ -18848,7 +18805,7 @@
         <w:pStyle w:val="SPPrayerTitle"/>
       </w:pPr>
       <w:bookmarkStart w:id="30" w:name="_Toc238726594"/>
-      <w:bookmarkStart w:id="31" w:name="_Toc238726757"/>
+      <w:bookmarkStart w:id="31" w:name="_Toc238794850"/>
       <w:r>
         <w:lastRenderedPageBreak/>
         <w:t>Closing Thoughts</w:t>
@@ -19032,7 +18989,7 @@
       <w:pPr>
         <w:pStyle w:val="SPSectionTitle"/>
       </w:pPr>
-      <w:bookmarkStart w:id="32" w:name="_Toc238726758"/>
+      <w:bookmarkStart w:id="32" w:name="_Toc238794851"/>
       <w:r>
         <w:lastRenderedPageBreak/>
         <w:t xml:space="preserve">Part </w:t>
@@ -19117,7 +19074,7 @@
       <w:pPr>
         <w:pStyle w:val="SPPrayerTitle"/>
       </w:pPr>
-      <w:bookmarkStart w:id="33" w:name="_Toc238726759"/>
+      <w:bookmarkStart w:id="33" w:name="_Toc238794852"/>
       <w:r>
         <w:t>Saint Michael the Archangel</w:t>
       </w:r>
@@ -19699,7 +19656,7 @@
       <w:pPr>
         <w:pStyle w:val="SPPrayerTitle"/>
       </w:pPr>
-      <w:bookmarkStart w:id="34" w:name="_Toc238726760"/>
+      <w:bookmarkStart w:id="34" w:name="_Toc238794853"/>
       <w:r>
         <w:t xml:space="preserve">Saint </w:t>
       </w:r>
@@ -20519,7 +20476,7 @@
       <w:pPr>
         <w:pStyle w:val="SPPrayerTitle"/>
       </w:pPr>
-      <w:bookmarkStart w:id="35" w:name="_Toc238726761"/>
+      <w:bookmarkStart w:id="35" w:name="_Toc238794854"/>
       <w:r>
         <w:t xml:space="preserve">Saint </w:t>
       </w:r>
@@ -21447,7 +21404,7 @@
       <w:pPr>
         <w:pStyle w:val="SPPrayerTitle"/>
       </w:pPr>
-      <w:bookmarkStart w:id="36" w:name="_Toc238726762"/>
+      <w:bookmarkStart w:id="36" w:name="_Toc238794855"/>
       <w:r>
         <w:t xml:space="preserve">Saint </w:t>
       </w:r>
@@ -22317,7 +22274,7 @@
       <w:pPr>
         <w:pStyle w:val="SPPrayerTitle"/>
       </w:pPr>
-      <w:bookmarkStart w:id="37" w:name="_Toc238726763"/>
+      <w:bookmarkStart w:id="37" w:name="_Toc238794856"/>
       <w:r>
         <w:t xml:space="preserve">Saint </w:t>
       </w:r>
@@ -23117,7 +23074,7 @@
       <w:pPr>
         <w:pStyle w:val="SPPrayerTitle"/>
       </w:pPr>
-      <w:bookmarkStart w:id="38" w:name="_Toc238726764"/>
+      <w:bookmarkStart w:id="38" w:name="_Toc238794857"/>
       <w:r>
         <w:lastRenderedPageBreak/>
         <w:t>Closing Thoughts</w:t>
@@ -23417,7 +23374,7 @@
       <w:pPr>
         <w:pStyle w:val="SPSectionTitle"/>
       </w:pPr>
-      <w:bookmarkStart w:id="39" w:name="_Toc238726765"/>
+      <w:bookmarkStart w:id="39" w:name="_Toc238794858"/>
       <w:r>
         <w:lastRenderedPageBreak/>
         <w:t>Conclusion</w:t>
@@ -24001,7 +23958,7 @@
       <w:pPr>
         <w:pStyle w:val="SPSectionTitle"/>
       </w:pPr>
-      <w:bookmarkStart w:id="40" w:name="_Toc238726766"/>
+      <w:bookmarkStart w:id="40" w:name="_Toc238794859"/>
       <w:r>
         <w:lastRenderedPageBreak/>
         <w:t>Latin Guide</w:t>
@@ -24414,7 +24371,7 @@
       <w:pPr>
         <w:pStyle w:val="SPSectionTitle"/>
       </w:pPr>
-      <w:bookmarkStart w:id="41" w:name="_Toc238726767"/>
+      <w:bookmarkStart w:id="41" w:name="_Toc238794860"/>
       <w:r>
         <w:lastRenderedPageBreak/>
         <w:t>Common Prayers</w:t>
@@ -24968,7 +24925,7 @@
       <w:pPr>
         <w:pStyle w:val="SPSectionTitle"/>
       </w:pPr>
-      <w:bookmarkStart w:id="42" w:name="_Toc238726768"/>
+      <w:bookmarkStart w:id="42" w:name="_Toc238794861"/>
       <w:r>
         <w:lastRenderedPageBreak/>
         <w:t>Common Catholic Expressions</w:t>
@@ -25711,12 +25668,155 @@
 
 <file path=word/footer1.xml><?xml version="1.0" encoding="utf-8"?>
 <w:ftr xmlns:wpc="http://schemas.microsoft.com/office/word/2010/wordprocessingCanvas" xmlns:cx="http://schemas.microsoft.com/office/drawing/2014/chartex" xmlns:cx1="http://schemas.microsoft.com/office/drawing/2015/9/8/chartex" xmlns:cx2="http://schemas.microsoft.com/office/drawing/2015/10/21/chartex" xmlns:cx3="http://schemas.microsoft.com/office/drawing/2016/5/9/chartex" xmlns:cx4="http://schemas.microsoft.com/office/drawing/2016/5/10/chartex" xmlns:cx5="http://schemas.microsoft.com/office/drawing/2016/5/11/chartex" xmlns:cx6="http://schemas.microsoft.com/office/drawing/2016/5/12/chartex" xmlns:cx7="http://schemas.microsoft.com/office/drawing/2016/5/13/chartex" xmlns:cx8="http://schemas.microsoft.com/office/drawing/2016/5/14/chartex" xmlns:mc="http://schemas.openxmlformats.org/markup-compatibility/2006" xmlns:aink="http://schemas.microsoft.com/office/drawing/2016/ink" xmlns:am3d="http://schemas.microsoft.com/office/drawing/2017/model3d" xmlns:o="urn:schemas-microsoft-com:office:office" xmlns:oel="http://schemas.microsoft.com/office/2019/extlst" xmlns:r="http://schemas.openxmlformats.org/officeDocument/2006/relationships" xmlns:m="http://schemas.openxmlformats.org/officeDocument/2006/math" xmlns:v="urn:schemas-microsoft-com:vml" xmlns:wp14="http://schemas.microsoft.com/office/word/2010/wordprocessingDrawing" xmlns:wp="http://schemas.openxmlformats.org/drawingml/2006/wordprocessingDrawing" xmlns:w10="urn:schemas-microsoft-com:office:word" xmlns:w="http://schemas.openxmlformats.org/wordprocessingml/2006/main" xmlns:w14="http://schemas.microsoft.com/office/word/2010/wordml" xmlns:w15="http://schemas.microsoft.com/office/word/2012/wordml" xmlns:w16cei="http://schemas.microsoft.com/office/word/2026/wordml/cei" xmlns:w16cex="http://schemas.microsoft.com/office/word/2018/wordml/cex" xmlns:w16cid="http://schemas.microsoft.com/office/word/2016/wordml/cid" xmlns:w16="http://schemas.microsoft.com/office/word/2018/wordml" xmlns:w16du="http://schemas.microsoft.com/office/word/2023/wordml/word16du" xmlns:w16sdtdh="http://schemas.microsoft.com/office/word/2020/wordml/sdtdatahash" xmlns:w16sdtfl="http://schemas.microsoft.com/office/word/2024/wordml/sdtformatlock" xmlns:w16se="http://schemas.microsoft.com/office/word/2015/wordml/symex" xmlns:wpg="http://schemas.microsoft.com/office/word/2010/wordprocessingGroup" xmlns:wpi="http://schemas.microsoft.com/office/word/2010/wordprocessingInk" xmlns:wne="http://schemas.microsoft.com/office/word/2006/wordml" xmlns:wps="http://schemas.microsoft.com/office/word/2010/wordprocessingShape" mc:Ignorable="w14 w15 w16se w16cid w16 w16cex w16sdtdh w16sdtfl w16du wp14">
+  <w:sdt>
+    <w:sdtPr>
+      <w:id w:val="-1002042901"/>
+      <w:docPartObj>
+        <w:docPartGallery w:val="Page Numbers (Bottom of Page)"/>
+        <w:docPartUnique/>
+      </w:docPartObj>
+    </w:sdtPr>
+    <w:sdtEndPr>
+      <w:rPr>
+        <w:noProof/>
+      </w:rPr>
+    </w:sdtEndPr>
+    <w:sdtContent>
+      <w:p>
+        <w:pPr>
+          <w:pStyle w:val="Footer"/>
+          <w:jc w:val="center"/>
+        </w:pPr>
+        <w:r>
+          <w:fldChar w:fldCharType="begin"/>
+        </w:r>
+        <w:r>
+          <w:instrText xml:space="preserve"> PAGE   \* MERGEFORMAT </w:instrText>
+        </w:r>
+        <w:r>
+          <w:fldChar w:fldCharType="separate"/>
+        </w:r>
+        <w:r>
+          <w:rPr>
+            <w:noProof/>
+          </w:rPr>
+          <w:t>2</w:t>
+        </w:r>
+        <w:r>
+          <w:rPr>
+            <w:noProof/>
+          </w:rPr>
+          <w:fldChar w:fldCharType="end"/>
+        </w:r>
+      </w:p>
+    </w:sdtContent>
+  </w:sdt>
   <w:p>
     <w:pPr>
       <w:pStyle w:val="Footer"/>
-      <w:jc w:val="center"/>
     </w:pPr>
   </w:p>
+</w:ftr>
+</file>
+
+<file path=word/footer2.xml><?xml version="1.0" encoding="utf-8"?>
+<w:ftr xmlns:wpc="http://schemas.microsoft.com/office/word/2010/wordprocessingCanvas" xmlns:cx="http://schemas.microsoft.com/office/drawing/2014/chartex" xmlns:cx1="http://schemas.microsoft.com/office/drawing/2015/9/8/chartex" xmlns:cx2="http://schemas.microsoft.com/office/drawing/2015/10/21/chartex" xmlns:cx3="http://schemas.microsoft.com/office/drawing/2016/5/9/chartex" xmlns:cx4="http://schemas.microsoft.com/office/drawing/2016/5/10/chartex" xmlns:cx5="http://schemas.microsoft.com/office/drawing/2016/5/11/chartex" xmlns:cx6="http://schemas.microsoft.com/office/drawing/2016/5/12/chartex" xmlns:cx7="http://schemas.microsoft.com/office/drawing/2016/5/13/chartex" xmlns:cx8="http://schemas.microsoft.com/office/drawing/2016/5/14/chartex" xmlns:mc="http://schemas.openxmlformats.org/markup-compatibility/2006" xmlns:aink="http://schemas.microsoft.com/office/drawing/2016/ink" xmlns:am3d="http://schemas.microsoft.com/office/drawing/2017/model3d" xmlns:o="urn:schemas-microsoft-com:office:office" xmlns:oel="http://schemas.microsoft.com/office/2019/extlst" xmlns:r="http://schemas.openxmlformats.org/officeDocument/2006/relationships" xmlns:m="http://schemas.openxmlformats.org/officeDocument/2006/math" xmlns:v="urn:schemas-microsoft-com:vml" xmlns:wp14="http://schemas.microsoft.com/office/word/2010/wordprocessingDrawing" xmlns:wp="http://schemas.openxmlformats.org/drawingml/2006/wordprocessingDrawing" xmlns:w10="urn:schemas-microsoft-com:office:word" xmlns:w="http://schemas.openxmlformats.org/wordprocessingml/2006/main" xmlns:w14="http://schemas.microsoft.com/office/word/2010/wordml" xmlns:w15="http://schemas.microsoft.com/office/word/2012/wordml" xmlns:w16cei="http://schemas.microsoft.com/office/word/2026/wordml/cei" xmlns:w16cex="http://schemas.microsoft.com/office/word/2018/wordml/cex" xmlns:w16cid="http://schemas.microsoft.com/office/word/2016/wordml/cid" xmlns:w16="http://schemas.microsoft.com/office/word/2018/wordml" xmlns:w16du="http://schemas.microsoft.com/office/word/2023/wordml/word16du" xmlns:w16sdtdh="http://schemas.microsoft.com/office/word/2020/wordml/sdtdatahash" xmlns:w16sdtfl="http://schemas.microsoft.com/office/word/2024/wordml/sdtformatlock" xmlns:w16se="http://schemas.microsoft.com/office/word/2015/wordml/symex" xmlns:wpg="http://schemas.microsoft.com/office/word/2010/wordprocessingGroup" xmlns:wpi="http://schemas.microsoft.com/office/word/2010/wordprocessingInk" xmlns:wne="http://schemas.microsoft.com/office/word/2006/wordml" xmlns:wps="http://schemas.microsoft.com/office/word/2010/wordprocessingShape" mc:Ignorable="w14 w15 w16se w16cid w16 w16cex w16sdtdh w16sdtfl w16du wp14">
+  <w:sdt>
+    <w:sdtPr>
+      <w:id w:val="-755368615"/>
+      <w:docPartObj>
+        <w:docPartGallery w:val="Page Numbers (Bottom of Page)"/>
+        <w:docPartUnique/>
+      </w:docPartObj>
+    </w:sdtPr>
+    <w:sdtEndPr>
+      <w:rPr>
+        <w:noProof/>
+      </w:rPr>
+    </w:sdtEndPr>
+    <w:sdtContent>
+      <w:p>
+        <w:pPr>
+          <w:pStyle w:val="Footer"/>
+          <w:jc w:val="center"/>
+        </w:pPr>
+        <w:r>
+          <w:fldChar w:fldCharType="begin"/>
+        </w:r>
+        <w:r>
+          <w:instrText xml:space="preserve"> PAGE   \* MERGEFORMAT </w:instrText>
+        </w:r>
+        <w:r>
+          <w:fldChar w:fldCharType="separate"/>
+        </w:r>
+        <w:r>
+          <w:rPr>
+            <w:noProof/>
+          </w:rPr>
+          <w:t>2</w:t>
+        </w:r>
+        <w:r>
+          <w:rPr>
+            <w:noProof/>
+          </w:rPr>
+          <w:fldChar w:fldCharType="end"/>
+        </w:r>
+      </w:p>
+    </w:sdtContent>
+  </w:sdt>
+  <w:p>
+    <w:pPr>
+      <w:pStyle w:val="Footer"/>
+    </w:pPr>
+  </w:p>
+</w:ftr>
+</file>
+
+<file path=word/footer3.xml><?xml version="1.0" encoding="utf-8"?>
+<w:ftr xmlns:wpc="http://schemas.microsoft.com/office/word/2010/wordprocessingCanvas" xmlns:cx="http://schemas.microsoft.com/office/drawing/2014/chartex" xmlns:cx1="http://schemas.microsoft.com/office/drawing/2015/9/8/chartex" xmlns:cx2="http://schemas.microsoft.com/office/drawing/2015/10/21/chartex" xmlns:cx3="http://schemas.microsoft.com/office/drawing/2016/5/9/chartex" xmlns:cx4="http://schemas.microsoft.com/office/drawing/2016/5/10/chartex" xmlns:cx5="http://schemas.microsoft.com/office/drawing/2016/5/11/chartex" xmlns:cx6="http://schemas.microsoft.com/office/drawing/2016/5/12/chartex" xmlns:cx7="http://schemas.microsoft.com/office/drawing/2016/5/13/chartex" xmlns:cx8="http://schemas.microsoft.com/office/drawing/2016/5/14/chartex" xmlns:mc="http://schemas.openxmlformats.org/markup-compatibility/2006" xmlns:aink="http://schemas.microsoft.com/office/drawing/2016/ink" xmlns:am3d="http://schemas.microsoft.com/office/drawing/2017/model3d" xmlns:o="urn:schemas-microsoft-com:office:office" xmlns:oel="http://schemas.microsoft.com/office/2019/extlst" xmlns:r="http://schemas.openxmlformats.org/officeDocument/2006/relationships" xmlns:m="http://schemas.openxmlformats.org/officeDocument/2006/math" xmlns:v="urn:schemas-microsoft-com:vml" xmlns:wp14="http://schemas.microsoft.com/office/word/2010/wordprocessingDrawing" xmlns:wp="http://schemas.openxmlformats.org/drawingml/2006/wordprocessingDrawing" xmlns:w10="urn:schemas-microsoft-com:office:word" xmlns:w="http://schemas.openxmlformats.org/wordprocessingml/2006/main" xmlns:w14="http://schemas.microsoft.com/office/word/2010/wordml" xmlns:w15="http://schemas.microsoft.com/office/word/2012/wordml" xmlns:w16cei="http://schemas.microsoft.com/office/word/2026/wordml/cei" xmlns:w16cex="http://schemas.microsoft.com/office/word/2018/wordml/cex" xmlns:w16cid="http://schemas.microsoft.com/office/word/2016/wordml/cid" xmlns:w16="http://schemas.microsoft.com/office/word/2018/wordml" xmlns:w16du="http://schemas.microsoft.com/office/word/2023/wordml/word16du" xmlns:w16sdtdh="http://schemas.microsoft.com/office/word/2020/wordml/sdtdatahash" xmlns:w16sdtfl="http://schemas.microsoft.com/office/word/2024/wordml/sdtformatlock" xmlns:w16se="http://schemas.microsoft.com/office/word/2015/wordml/symex" xmlns:wpg="http://schemas.microsoft.com/office/word/2010/wordprocessingGroup" xmlns:wpi="http://schemas.microsoft.com/office/word/2010/wordprocessingInk" xmlns:wne="http://schemas.microsoft.com/office/word/2006/wordml" xmlns:wps="http://schemas.microsoft.com/office/word/2010/wordprocessingShape" mc:Ignorable="w14 w15 w16se w16cid w16 w16cex w16sdtdh w16sdtfl w16du wp14">
+  <w:sdt>
+    <w:sdtPr>
+      <w:id w:val="-1971357067"/>
+      <w:docPartObj>
+        <w:docPartGallery w:val="Page Numbers (Bottom of Page)"/>
+        <w:docPartUnique/>
+      </w:docPartObj>
+    </w:sdtPr>
+    <w:sdtEndPr>
+      <w:rPr>
+        <w:noProof/>
+      </w:rPr>
+    </w:sdtEndPr>
+    <w:sdtContent>
+      <w:p>
+        <w:pPr>
+          <w:pStyle w:val="Footer"/>
+          <w:jc w:val="center"/>
+        </w:pPr>
+        <w:r>
+          <w:fldChar w:fldCharType="begin"/>
+        </w:r>
+        <w:r>
+          <w:instrText xml:space="preserve"> PAGE   \* MERGEFORMAT </w:instrText>
+        </w:r>
+        <w:r>
+          <w:fldChar w:fldCharType="separate"/>
+        </w:r>
+        <w:r>
+          <w:rPr>
+            <w:noProof/>
+          </w:rPr>
+          <w:t>2</w:t>
+        </w:r>
+        <w:r>
+          <w:rPr>
+            <w:noProof/>
+          </w:rPr>
+          <w:fldChar w:fldCharType="end"/>
+        </w:r>
+      </w:p>
+    </w:sdtContent>
+  </w:sdt>
   <w:p>
     <w:pPr>
       <w:pStyle w:val="Footer"/>

</xml_diff>

<commit_message>
Checked up to Act of Contrition
</commit_message>
<xml_diff>
--- a/manuscript/volume-1/sacrae-preces-volume-1.docx
+++ b/manuscript/volume-1/sacrae-preces-volume-1.docx
@@ -4434,7 +4434,7 @@
       </w:pPr>
       <w:r>
         <w:pict w14:anchorId="249FE732">
-          <v:rect id="_x0000_i3175" style="width:0;height:1.5pt" o:hralign="center" o:hrstd="t" o:hr="t" fillcolor="#a0a0a0" stroked="f"/>
+          <v:rect id="_x0000_i4465" style="width:0;height:1.5pt" o:hralign="center" o:hrstd="t" o:hr="t" fillcolor="#a0a0a0" stroked="f"/>
         </w:pict>
       </w:r>
     </w:p>
@@ -4698,7 +4698,7 @@
       </w:pPr>
       <w:r>
         <w:pict w14:anchorId="25751FDD">
-          <v:rect id="_x0000_i3176" style="width:0;height:1.5pt" o:hralign="center" o:hrstd="t" o:hr="t" fillcolor="#a0a0a0" stroked="f"/>
+          <v:rect id="_x0000_i4466" style="width:0;height:1.5pt" o:hralign="center" o:hrstd="t" o:hr="t" fillcolor="#a0a0a0" stroked="f"/>
         </w:pict>
       </w:r>
     </w:p>
@@ -4770,7 +4770,7 @@
       </w:pPr>
       <w:r>
         <w:pict w14:anchorId="19542BB1">
-          <v:rect id="_x0000_i3177" style="width:0;height:1.5pt" o:hralign="center" o:hrstd="t" o:hr="t" fillcolor="#a0a0a0" stroked="f"/>
+          <v:rect id="_x0000_i4467" style="width:0;height:1.5pt" o:hralign="center" o:hrstd="t" o:hr="t" fillcolor="#a0a0a0" stroked="f"/>
         </w:pict>
       </w:r>
     </w:p>
@@ -5008,7 +5008,7 @@
       </w:pPr>
       <w:r>
         <w:pict w14:anchorId="68D46385">
-          <v:rect id="_x0000_i3178" style="width:0;height:1.5pt" o:hralign="center" o:hrstd="t" o:hr="t" fillcolor="#a0a0a0" stroked="f"/>
+          <v:rect id="_x0000_i4468" style="width:0;height:1.5pt" o:hralign="center" o:hrstd="t" o:hr="t" fillcolor="#a0a0a0" stroked="f"/>
         </w:pict>
       </w:r>
     </w:p>
@@ -5714,58 +5714,16 @@
         <w:rPr>
           <w:rStyle w:val="Emphasis"/>
         </w:rPr>
-        <w:t>in NOH-mee-</w:t>
-      </w:r>
-      <w:proofErr w:type="spellStart"/>
+        <w:t>in NOH-mee-neh PAH-tris,</w:t>
+      </w:r>
+      <w:r>
+        <w:br/>
+      </w:r>
       <w:r>
         <w:rPr>
           <w:rStyle w:val="Emphasis"/>
         </w:rPr>
-        <w:t>neh</w:t>
-      </w:r>
-      <w:proofErr w:type="spellEnd"/>
-      <w:r>
-        <w:rPr>
-          <w:rStyle w:val="Emphasis"/>
-        </w:rPr>
-        <w:t xml:space="preserve"> PAH-tris,</w:t>
-      </w:r>
-      <w:r>
-        <w:br/>
-      </w:r>
-      <w:r>
-        <w:rPr>
-          <w:rStyle w:val="Emphasis"/>
-        </w:rPr>
-        <w:t>et FEE-lee-ee, et SPEE-</w:t>
-      </w:r>
-      <w:proofErr w:type="spellStart"/>
-      <w:r>
-        <w:rPr>
-          <w:rStyle w:val="Emphasis"/>
-        </w:rPr>
-        <w:t>ree</w:t>
-      </w:r>
-      <w:proofErr w:type="spellEnd"/>
-      <w:r>
-        <w:rPr>
-          <w:rStyle w:val="Emphasis"/>
-        </w:rPr>
-        <w:t>-</w:t>
-      </w:r>
-      <w:proofErr w:type="spellStart"/>
-      <w:r>
-        <w:rPr>
-          <w:rStyle w:val="Emphasis"/>
-        </w:rPr>
-        <w:t>toos</w:t>
-      </w:r>
-      <w:proofErr w:type="spellEnd"/>
-      <w:r>
-        <w:rPr>
-          <w:rStyle w:val="Emphasis"/>
-        </w:rPr>
-        <w:t xml:space="preserve"> SAHNK-tee.</w:t>
+        <w:t>et FEE-lee-ee, et SPEE-ree-toos SAHNK-tee.</w:t>
       </w:r>
       <w:r>
         <w:br/>
@@ -6229,9 +6187,6 @@
         <w:pStyle w:val="SPScripture"/>
       </w:pPr>
       <w:r>
-        <w:t>“</w:t>
-      </w:r>
-      <w:r>
         <w:t>Pray then like this:</w:t>
       </w:r>
     </w:p>
@@ -6246,7 +6201,7 @@
         <w:t>.</w:t>
       </w:r>
       <w:r>
-        <w:t xml:space="preserve"> Thy will be done, </w:t>
+        <w:t xml:space="preserve"> Thy will be done </w:t>
       </w:r>
       <w:r>
         <w:t>o</w:t>
@@ -6264,7 +6219,7 @@
         <w:t>trespasses</w:t>
       </w:r>
       <w:r>
-        <w:t xml:space="preserve">, </w:t>
+        <w:t xml:space="preserve"> </w:t>
       </w:r>
       <w:r>
         <w:t>a</w:t>
@@ -6284,9 +6239,6 @@
       <w:r>
         <w:t>ut deliver us from evil.</w:t>
       </w:r>
-      <w:r>
-        <w:t>”</w:t>
-      </w:r>
     </w:p>
     <w:p>
       <w:pPr>
@@ -6301,7 +6253,19 @@
         <w:pStyle w:val="SPScripture"/>
       </w:pPr>
       <w:r>
-        <w:t xml:space="preserve">And He said to them “When you pray, say: </w:t>
+        <w:t xml:space="preserve">And </w:t>
+      </w:r>
+      <w:r>
+        <w:t>h</w:t>
+      </w:r>
+      <w:r>
+        <w:t>e said to them</w:t>
+      </w:r>
+      <w:r>
+        <w:t>,</w:t>
+      </w:r>
+      <w:r>
+        <w:t xml:space="preserve"> “When you pray, say: </w:t>
       </w:r>
       <w:r>
         <w:t xml:space="preserve">Father, hallowed be </w:t>
@@ -6316,15 +6280,7 @@
         <w:t>Your</w:t>
       </w:r>
       <w:r>
-        <w:t xml:space="preserve"> kingdom come. Give us each day our daily bread; and forgive us our sins, for we ourselves forgive </w:t>
-      </w:r>
-      <w:proofErr w:type="spellStart"/>
-      <w:r>
-        <w:t>every one</w:t>
-      </w:r>
-      <w:proofErr w:type="spellEnd"/>
-      <w:r>
-        <w:t xml:space="preserve"> who is indebted to us; and lead us not into temptation.</w:t>
+        <w:t xml:space="preserve"> kingdom come. Give us each day our daily bread; and forgive us our sins, for we ourselves forgive every one who is indebted to us; and lead us not into temptation.</w:t>
       </w:r>
       <w:r>
         <w:t>”</w:t>
@@ -6410,7 +6366,6 @@
       <w:r>
         <w:t xml:space="preserve">. It is </w:t>
       </w:r>
-      <w:proofErr w:type="spellStart"/>
       <w:r>
         <w:rPr>
           <w:i/>
@@ -6418,7 +6373,6 @@
         </w:rPr>
         <w:t>our</w:t>
       </w:r>
-      <w:proofErr w:type="spellEnd"/>
       <w:r>
         <w:t>.</w:t>
       </w:r>
@@ -6523,9 +6477,6 @@
       <w:pPr>
         <w:pStyle w:val="SPBodyText"/>
       </w:pPr>
-      <w:r>
-        <w:t>We are many, but we pray as one.</w:t>
-      </w:r>
     </w:p>
     <w:p>
       <w:pPr>
@@ -6549,8 +6500,16 @@
     <w:p>
       <w:pPr>
         <w:pStyle w:val="SPBodyText"/>
-      </w:pPr>
-      <w:r>
+        <w:rPr>
+          <w:b/>
+          <w:bCs/>
+        </w:rPr>
+      </w:pPr>
+      <w:r>
+        <w:rPr>
+          <w:b/>
+          <w:bCs/>
+        </w:rPr>
         <w:t>Our.</w:t>
       </w:r>
     </w:p>
@@ -6720,7 +6679,7 @@
         <w:t>Hail</w:t>
       </w:r>
       <w:r>
-        <w:t xml:space="preserve">, </w:t>
+        <w:t xml:space="preserve"> </w:t>
       </w:r>
       <w:r>
         <w:t>Mary</w:t>
@@ -7113,8 +7072,16 @@
     <w:p>
       <w:pPr>
         <w:pStyle w:val="SPBodyText"/>
-      </w:pPr>
-      <w:r>
+        <w:rPr>
+          <w:b/>
+          <w:bCs/>
+        </w:rPr>
+      </w:pPr>
+      <w:r>
+        <w:rPr>
+          <w:b/>
+          <w:bCs/>
+        </w:rPr>
         <w:t>The Words We Receive</w:t>
       </w:r>
     </w:p>
@@ -7188,14 +7155,6 @@
         <w:pStyle w:val="SPBodyText"/>
       </w:pPr>
       <w:r>
-        <w:t>The Prayer We Offer</w:t>
-      </w:r>
-    </w:p>
-    <w:p>
-      <w:pPr>
-        <w:pStyle w:val="SPBodyText"/>
-      </w:pPr>
-      <w:r>
         <w:t>Then the prayer changes.</w:t>
       </w:r>
     </w:p>
@@ -7220,15 +7179,15 @@
         <w:pStyle w:val="SPBodyText"/>
       </w:pPr>
       <w:r>
+        <w:t>We ask Mary to pray for us because we know that we do not walk the Christian life alone. We are sinners in need of mercy, and we are members of a Church in which we are called to carry one another in prayer.</w:t>
+      </w:r>
+    </w:p>
+    <w:p>
+      <w:pPr>
+        <w:pStyle w:val="SPBodyText"/>
+      </w:pPr>
+      <w:r>
         <w:lastRenderedPageBreak/>
-        <w:t>We ask Mary to pray for us because we know that we do not walk the Christian life alone. We are sinners in need of mercy, and we are members of a Church in which we are called to carry one another in prayer.</w:t>
-      </w:r>
-    </w:p>
-    <w:p>
-      <w:pPr>
-        <w:pStyle w:val="SPBodyText"/>
-      </w:pPr>
-      <w:r>
         <w:t xml:space="preserve">The title </w:t>
       </w:r>
       <w:r>
@@ -7309,7 +7268,13 @@
         <w:pStyle w:val="SPBodyText"/>
       </w:pPr>
       <w:r>
-        <w:t>The final petition reaches across the whole of our earthly life:</w:t>
+        <w:t>Th</w:t>
+      </w:r>
+      <w:r>
+        <w:t>at</w:t>
+      </w:r>
+      <w:r>
+        <w:t xml:space="preserve"> final petition reaches across the whole of our earthly life:</w:t>
       </w:r>
     </w:p>
     <w:p>
@@ -7332,157 +7297,6 @@
       <w:r>
         <w:t>We ask for Mary's prayers in the present moment — in our joys, our struggles, our temptations, our failures, and our hopes. But we also place our final hour into God's hands.</w:t>
       </w:r>
-    </w:p>
-    <w:p>
-      <w:pPr>
-        <w:pStyle w:val="SPBodyText"/>
-      </w:pPr>
-      <w:r>
-        <w:lastRenderedPageBreak/>
-        <w:t>The Hail Mary therefore reminds us that our life is a journey.</w:t>
-      </w:r>
-    </w:p>
-    <w:p>
-      <w:pPr>
-        <w:pStyle w:val="SPBodyText"/>
-      </w:pPr>
-      <w:r>
-        <w:t xml:space="preserve">We need grace </w:t>
-      </w:r>
-      <w:r>
-        <w:rPr>
-          <w:b/>
-          <w:bCs/>
-        </w:rPr>
-        <w:t>now</w:t>
-      </w:r>
-      <w:r>
-        <w:t>.</w:t>
-      </w:r>
-    </w:p>
-    <w:p>
-      <w:pPr>
-        <w:pStyle w:val="SPBodyText"/>
-      </w:pPr>
-      <w:r>
-        <w:t xml:space="preserve">We will need grace </w:t>
-      </w:r>
-      <w:r>
-        <w:rPr>
-          <w:b/>
-          <w:bCs/>
-        </w:rPr>
-        <w:t>at the end</w:t>
-      </w:r>
-      <w:r>
-        <w:t>.</w:t>
-      </w:r>
-    </w:p>
-    <w:p>
-      <w:pPr>
-        <w:pStyle w:val="SPBodyText"/>
-      </w:pPr>
-      <w:r>
-        <w:t>And throughout that journey, we are never beyond the reach of God's mercy.</w:t>
-      </w:r>
-    </w:p>
-    <w:p>
-      <w:pPr>
-        <w:pStyle w:val="SPBodyText"/>
-      </w:pPr>
-      <w:r>
-        <w:t>The prayer begins with the words of Scripture and ends with our humble request for intercession. Between the two stands the mystery of Christ: God who comes among us, takes flesh, and enters into our human story.</w:t>
-      </w:r>
-    </w:p>
-    <w:p>
-      <w:pPr>
-        <w:pStyle w:val="SPBodyText"/>
-      </w:pPr>
-    </w:p>
-    <w:p>
-      <w:pPr>
-        <w:pStyle w:val="SPBodyText"/>
-      </w:pPr>
-      <w:r>
-        <w:t>So,</w:t>
-      </w:r>
-      <w:r>
-        <w:t xml:space="preserve"> when you pray the Hail Mary, do not hurry.</w:t>
-      </w:r>
-    </w:p>
-    <w:p>
-      <w:pPr>
-        <w:pStyle w:val="SPBodyText"/>
-      </w:pPr>
-      <w:r>
-        <w:t>Hear the words of Gabriel.</w:t>
-      </w:r>
-    </w:p>
-    <w:p>
-      <w:pPr>
-        <w:pStyle w:val="SPBodyText"/>
-      </w:pPr>
-      <w:r>
-        <w:t>Hear the blessing of Elizabeth.</w:t>
-      </w:r>
-    </w:p>
-    <w:p>
-      <w:pPr>
-        <w:pStyle w:val="SPBodyText"/>
-      </w:pPr>
-      <w:r>
-        <w:t>Remember Jesus, the fruit of Mary's womb.</w:t>
-      </w:r>
-    </w:p>
-    <w:p>
-      <w:pPr>
-        <w:pStyle w:val="SPBodyText"/>
-      </w:pPr>
-      <w:r>
-        <w:t>Then bring your own life before God.</w:t>
-      </w:r>
-    </w:p>
-    <w:p>
-      <w:pPr>
-        <w:pStyle w:val="SPBodyText"/>
-      </w:pPr>
-    </w:p>
-    <w:p>
-      <w:pPr>
-        <w:pStyle w:val="SPBodyText"/>
-      </w:pPr>
-      <w:r>
-        <w:t>Your joys.</w:t>
-      </w:r>
-      <w:r>
-        <w:br/>
-        <w:t>Your failures.</w:t>
-      </w:r>
-      <w:r>
-        <w:br/>
-        <w:t>Your loved ones.</w:t>
-      </w:r>
-      <w:r>
-        <w:br/>
-        <w:t>Those who need your prayers.</w:t>
-      </w:r>
-      <w:r>
-        <w:br/>
-        <w:t>And yourself.</w:t>
-      </w:r>
-    </w:p>
-    <w:p>
-      <w:pPr>
-        <w:pStyle w:val="SPBodyText"/>
-      </w:pPr>
-      <w:r>
-        <w:t>You are not praying alone.</w:t>
-      </w:r>
-    </w:p>
-    <w:p>
-      <w:pPr>
-        <w:pStyle w:val="SPBodyText"/>
-      </w:pPr>
     </w:p>
     <w:p>
       <w:pPr>
@@ -7496,9 +7310,179 @@
           <w:docGrid w:linePitch="360"/>
         </w:sectPr>
       </w:pPr>
-      <w:r>
-        <w:t>The words you speak have been spoken by generations of Christians before you, and they remain a simple invitation to turn again toward Christ.</w:t>
-      </w:r>
+    </w:p>
+    <w:p>
+      <w:pPr>
+        <w:pStyle w:val="SPBodyText"/>
+      </w:pPr>
+      <w:r>
+        <w:lastRenderedPageBreak/>
+        <w:t>The Hail Mary therefore reminds us that our life is a journey.</w:t>
+      </w:r>
+    </w:p>
+    <w:p>
+      <w:pPr>
+        <w:pStyle w:val="SPBodyText"/>
+      </w:pPr>
+      <w:r>
+        <w:t xml:space="preserve">We need grace </w:t>
+      </w:r>
+      <w:r>
+        <w:rPr>
+          <w:b/>
+          <w:bCs/>
+        </w:rPr>
+        <w:t>now</w:t>
+      </w:r>
+      <w:r>
+        <w:t>.</w:t>
+      </w:r>
+    </w:p>
+    <w:p>
+      <w:pPr>
+        <w:pStyle w:val="SPBodyText"/>
+      </w:pPr>
+      <w:r>
+        <w:t xml:space="preserve">We will need grace </w:t>
+      </w:r>
+      <w:r>
+        <w:rPr>
+          <w:b/>
+          <w:bCs/>
+        </w:rPr>
+        <w:t>at the end</w:t>
+      </w:r>
+      <w:r>
+        <w:t>.</w:t>
+      </w:r>
+    </w:p>
+    <w:p>
+      <w:pPr>
+        <w:pStyle w:val="SPBodyText"/>
+      </w:pPr>
+      <w:r>
+        <w:t>And throughout that journey, we are never beyond the reach of God's mercy.</w:t>
+      </w:r>
+    </w:p>
+    <w:p>
+      <w:pPr>
+        <w:pStyle w:val="SPBodyText"/>
+      </w:pPr>
+      <w:r>
+        <w:t>The prayer begins with the words of Scripture and ends with our humble request for intercession. Between the two stands the mystery of Christ: God who comes among us, takes flesh, and enters into our human story.</w:t>
+      </w:r>
+    </w:p>
+    <w:p>
+      <w:pPr>
+        <w:pStyle w:val="SPBodyText"/>
+      </w:pPr>
+    </w:p>
+    <w:p>
+      <w:pPr>
+        <w:pStyle w:val="SPBodyText"/>
+      </w:pPr>
+      <w:r>
+        <w:t>So,</w:t>
+      </w:r>
+      <w:r>
+        <w:t xml:space="preserve"> when you pray the Hail Mary, do not hurry.</w:t>
+      </w:r>
+    </w:p>
+    <w:p>
+      <w:pPr>
+        <w:pStyle w:val="SPBodyText"/>
+      </w:pPr>
+      <w:r>
+        <w:t>Hear the words of Gabriel.</w:t>
+      </w:r>
+    </w:p>
+    <w:p>
+      <w:pPr>
+        <w:pStyle w:val="SPBodyText"/>
+      </w:pPr>
+      <w:r>
+        <w:t>Hear the blessing of Elizabeth.</w:t>
+      </w:r>
+    </w:p>
+    <w:p>
+      <w:pPr>
+        <w:pStyle w:val="SPBodyText"/>
+      </w:pPr>
+      <w:r>
+        <w:t>Remember Jesus, the fruit of Mary's womb.</w:t>
+      </w:r>
+    </w:p>
+    <w:p>
+      <w:pPr>
+        <w:pStyle w:val="SPBodyText"/>
+      </w:pPr>
+      <w:r>
+        <w:t>Then bring your own life before God.</w:t>
+      </w:r>
+    </w:p>
+    <w:p>
+      <w:pPr>
+        <w:pStyle w:val="SPBodyText"/>
+      </w:pPr>
+    </w:p>
+    <w:p>
+      <w:pPr>
+        <w:pStyle w:val="SPBodyText"/>
+      </w:pPr>
+      <w:r>
+        <w:t>Your joys.</w:t>
+      </w:r>
+      <w:r>
+        <w:br/>
+        <w:t>Your failures.</w:t>
+      </w:r>
+      <w:r>
+        <w:br/>
+        <w:t>Your loved ones.</w:t>
+      </w:r>
+      <w:r>
+        <w:br/>
+        <w:t>Those who need your prayers.</w:t>
+      </w:r>
+      <w:r>
+        <w:br/>
+        <w:t>And yourself.</w:t>
+      </w:r>
+    </w:p>
+    <w:p>
+      <w:pPr>
+        <w:pStyle w:val="SPBodyText"/>
+      </w:pPr>
+    </w:p>
+    <w:p>
+      <w:pPr>
+        <w:pStyle w:val="SPBodyText"/>
+      </w:pPr>
+      <w:r>
+        <w:t>You are not praying alone.</w:t>
+      </w:r>
+    </w:p>
+    <w:p>
+      <w:pPr>
+        <w:pStyle w:val="SPBodyText"/>
+      </w:pPr>
+    </w:p>
+    <w:p>
+      <w:pPr>
+        <w:pStyle w:val="SPBodyText"/>
+        <w:jc w:val="center"/>
+        <w:rPr>
+          <w:rFonts w:ascii="Segoe UI Symbol" w:hAnsi="Segoe UI Symbol" w:cs="Segoe UI Symbol"/>
+        </w:rPr>
+        <w:sectPr>
+          <w:type w:val="oddPage"/>
+          <w:pgSz w:w="7920" w:h="12240" w:code="6"/>
+          <w:pgMar w:top="1080" w:right="864" w:bottom="1080" w:left="1152" w:header="576" w:footer="576" w:gutter="0"/>
+          <w:cols w:space="720"/>
+          <w:titlePg/>
+          <w:docGrid w:linePitch="360"/>
+        </w:sectPr>
+      </w:pPr>
     </w:p>
     <w:p>
       <w:pPr>
@@ -7784,7 +7768,7 @@
         <w:pStyle w:val="SPScripture"/>
       </w:pPr>
       <w:r>
-        <w:t>“to him be glory in the Church and in Christ Jesus to all generations, for ever and ever. Amen.”</w:t>
+        <w:t>to him be glory in the Church and in Christ Jesus to all generations, for ever and ever. Amen.</w:t>
       </w:r>
     </w:p>
     <w:p>
@@ -7800,7 +7784,7 @@
         <w:pStyle w:val="SPScripture"/>
       </w:pPr>
       <w:r>
-        <w:t>“For from him and through him and to him are all things. To him be glory for ever. Amen.”</w:t>
+        <w:t>For from him and through him and to him are all things. To him be glory for ever. Amen.</w:t>
       </w:r>
     </w:p>
     <w:p>
@@ -7816,7 +7800,7 @@
         <w:pStyle w:val="SPScripture"/>
       </w:pPr>
       <w:r>
-        <w:t>“To the King of ages, immortal, invisible, the only God, be honor and glory for ever and ever. Amen.”</w:t>
+        <w:t>To the King of ages, immortal, invisible, the only God, be honor and glory for ever and ever. Amen.</w:t>
       </w:r>
     </w:p>
     <w:p>
@@ -7832,7 +7816,13 @@
         <w:pStyle w:val="SPScripture"/>
       </w:pPr>
       <w:r>
-        <w:t>“and from Jesus Christ the faithful witness, the first-born of the dead, and the ruler of kings on earth. To him who loves us and has freed us from our sins by his blood and made us a kingdom, priests to God and Father, to him be glory and dominion for ever and ever. Amen.”</w:t>
+        <w:t>and from Jesus Christ the faithful witness, the first-born of the dead, and the ruler of kings on earth. To him who loves us and has freed us from our sins by his blood and made us a kingdom, priests to</w:t>
+      </w:r>
+      <w:r>
+        <w:t xml:space="preserve"> his</w:t>
+      </w:r>
+      <w:r>
+        <w:t xml:space="preserve"> God and Father, to him be glory and dominion for ever and ever. Amen.</w:t>
       </w:r>
     </w:p>
     <w:p>
@@ -7870,78 +7860,86 @@
     <w:p>
       <w:pPr>
         <w:pStyle w:val="SPBodyText"/>
-      </w:pPr>
-      <w:r>
-        <w:t xml:space="preserve">  </w:t>
-      </w:r>
-      <w:r>
-        <w:t>The Glory We Give</w:t>
-      </w:r>
-    </w:p>
-    <w:p>
-      <w:pPr>
-        <w:pStyle w:val="SPBodyText"/>
-      </w:pPr>
-      <w:r>
-        <w:t>The Glory Be is a short prayer, but it carries within it the heart of our faith.</w:t>
-      </w:r>
-    </w:p>
-    <w:p>
-      <w:pPr>
-        <w:pStyle w:val="SPBodyText"/>
-      </w:pPr>
-      <w:r>
-        <w:t>We begin with the Father, and then we name the Son and the Holy Spirit. We are not speaking of three gods, but of the one God who has revealed Himself to us as Father, Son, and Holy Spirit.</w:t>
-      </w:r>
-    </w:p>
-    <w:p>
-      <w:pPr>
-        <w:pStyle w:val="SPBodyText"/>
-      </w:pPr>
-      <w:r>
-        <w:t xml:space="preserve">When we say </w:t>
-      </w:r>
-      <w:r>
         <w:rPr>
           <w:b/>
           <w:bCs/>
         </w:rPr>
-        <w:t>Glory be to the Father</w:t>
-      </w:r>
-      <w:r>
-        <w:t>, we turn our hearts towards the One from whom all things come.</w:t>
-      </w:r>
-    </w:p>
-    <w:p>
-      <w:pPr>
-        <w:pStyle w:val="SPBodyText"/>
-      </w:pPr>
-      <w:r>
-        <w:t xml:space="preserve">When we say </w:t>
+      </w:pPr>
+      <w:r>
+        <w:t xml:space="preserve">  </w:t>
       </w:r>
       <w:r>
         <w:rPr>
           <w:b/>
           <w:bCs/>
         </w:rPr>
-        <w:t>and to the Son</w:t>
-      </w:r>
-      <w:r>
-        <w:t>, we remember Jesus Christ, through whom God has come among us and through whom we have been brought into the life of God.</w:t>
-      </w:r>
-    </w:p>
-    <w:p>
-      <w:pPr>
-        <w:pStyle w:val="SPBodyText"/>
-      </w:pPr>
-      <w:r>
-        <w:t xml:space="preserve">And when we say </w:t>
+        <w:t>The Glory We Give</w:t>
+      </w:r>
+    </w:p>
+    <w:p>
+      <w:pPr>
+        <w:pStyle w:val="SPBodyText"/>
+      </w:pPr>
+      <w:r>
+        <w:t>The Glory Be is a short prayer, but it carries within it the heart of our faith.</w:t>
+      </w:r>
+    </w:p>
+    <w:p>
+      <w:pPr>
+        <w:pStyle w:val="SPBodyText"/>
+      </w:pPr>
+      <w:r>
+        <w:t>We begin with the Father, and then we name the Son and the Holy Spirit. We are not speaking of three gods, but of the one God who has revealed Himself to us as Father, Son, and Holy Spirit.</w:t>
+      </w:r>
+    </w:p>
+    <w:p>
+      <w:pPr>
+        <w:pStyle w:val="SPBodyText"/>
+      </w:pPr>
+      <w:r>
+        <w:t xml:space="preserve">When we say </w:t>
       </w:r>
       <w:r>
         <w:rPr>
           <w:b/>
           <w:bCs/>
         </w:rPr>
+        <w:t>Glory be to the Father</w:t>
+      </w:r>
+      <w:r>
+        <w:t>, we turn our hearts towards the One from whom all things come.</w:t>
+      </w:r>
+    </w:p>
+    <w:p>
+      <w:pPr>
+        <w:pStyle w:val="SPBodyText"/>
+      </w:pPr>
+      <w:r>
+        <w:t xml:space="preserve">When we say </w:t>
+      </w:r>
+      <w:r>
+        <w:rPr>
+          <w:b/>
+          <w:bCs/>
+        </w:rPr>
+        <w:t>and to the Son</w:t>
+      </w:r>
+      <w:r>
+        <w:t>, we remember Jesus Christ, through whom God has come among us and through whom we have been brought into the life of God.</w:t>
+      </w:r>
+    </w:p>
+    <w:p>
+      <w:pPr>
+        <w:pStyle w:val="SPBodyText"/>
+      </w:pPr>
+      <w:r>
+        <w:t xml:space="preserve">And when we say </w:t>
+      </w:r>
+      <w:r>
+        <w:rPr>
+          <w:b/>
+          <w:bCs/>
+        </w:rPr>
         <w:t>and to the Holy Spirit</w:t>
       </w:r>
       <w:r>
@@ -8029,6 +8027,11 @@
       <w:pPr>
         <w:pStyle w:val="SPBodyText"/>
       </w:pPr>
+    </w:p>
+    <w:p>
+      <w:pPr>
+        <w:pStyle w:val="SPBodyText"/>
+      </w:pPr>
       <w:r>
         <w:t>Whatever good we possess is received. Whatever strength we have is given. Whatever love we are able to offer has its source in Him.</w:t>
       </w:r>
@@ -8037,6 +8040,11 @@
       <w:pPr>
         <w:pStyle w:val="SPBodyText"/>
       </w:pPr>
+    </w:p>
+    <w:p>
+      <w:pPr>
+        <w:pStyle w:val="SPBodyText"/>
+      </w:pPr>
       <w:r>
         <w:t>As Scripture reminds us:</w:t>
       </w:r>
@@ -8120,6 +8128,7 @@
         <w:pStyle w:val="SPBodyText"/>
       </w:pPr>
       <w:r>
+        <w:lastRenderedPageBreak/>
         <w:t>All of them can become an offering when we remember where they came from and to whom they ultimately belong.</w:t>
       </w:r>
     </w:p>
@@ -8127,6 +8136,11 @@
       <w:pPr>
         <w:pStyle w:val="SPBodyText"/>
       </w:pPr>
+    </w:p>
+    <w:p>
+      <w:pPr>
+        <w:pStyle w:val="SPBodyText"/>
+      </w:pPr>
       <w:r>
         <w:t>Forever</w:t>
       </w:r>
@@ -8172,6 +8186,11 @@
       <w:pPr>
         <w:pStyle w:val="SPBodyText"/>
       </w:pPr>
+    </w:p>
+    <w:p>
+      <w:pPr>
+        <w:pStyle w:val="SPBodyText"/>
+      </w:pPr>
       <w:r>
         <w:t>God does not pass away.</w:t>
       </w:r>
@@ -8180,6 +8199,11 @@
       <w:pPr>
         <w:pStyle w:val="SPBodyText"/>
       </w:pPr>
+    </w:p>
+    <w:p>
+      <w:pPr>
+        <w:pStyle w:val="SPBodyText"/>
+      </w:pPr>
       <w:r>
         <w:t>The Father, Son, and Holy Spirit were before us, are with us now, and will remain when our earthly lives are finished.</w:t>
       </w:r>
@@ -8215,113 +8239,131 @@
       <w:r>
         <w:t>So, pray them slowly.</w:t>
       </w:r>
-    </w:p>
-    <w:p>
-      <w:pPr>
-        <w:pStyle w:val="SPBodyText"/>
-      </w:pPr>
-      <w:r>
-        <w:t>Glory be to the Father.</w:t>
-      </w:r>
-    </w:p>
-    <w:p>
-      <w:pPr>
-        <w:pStyle w:val="SPBodyText"/>
-      </w:pPr>
-      <w:r>
-        <w:t>Give thanks for the One who created you.</w:t>
-      </w:r>
-    </w:p>
-    <w:p>
-      <w:pPr>
-        <w:pStyle w:val="SPBodyText"/>
-      </w:pPr>
-    </w:p>
-    <w:p>
-      <w:pPr>
-        <w:pStyle w:val="SPBodyText"/>
-      </w:pPr>
-      <w:r>
-        <w:t>And to the Son.</w:t>
-      </w:r>
-    </w:p>
-    <w:p>
-      <w:pPr>
-        <w:pStyle w:val="SPBodyText"/>
-      </w:pPr>
-      <w:r>
-        <w:t>Give thanks for the One who came to save you.</w:t>
-      </w:r>
-    </w:p>
-    <w:p>
-      <w:pPr>
-        <w:pStyle w:val="SPBodyText"/>
-      </w:pPr>
-    </w:p>
-    <w:p>
-      <w:pPr>
-        <w:pStyle w:val="SPBodyText"/>
-      </w:pPr>
-      <w:r>
-        <w:lastRenderedPageBreak/>
-        <w:t>And to the Holy Spirit.</w:t>
-      </w:r>
-    </w:p>
-    <w:p>
-      <w:pPr>
-        <w:pStyle w:val="SPBodyText"/>
-      </w:pPr>
-      <w:r>
-        <w:t>Give thanks for the One who remains with you.</w:t>
-      </w:r>
-    </w:p>
-    <w:p>
-      <w:pPr>
-        <w:pStyle w:val="SPBodyText"/>
-      </w:pPr>
-      <w:r>
-        <w:t>As it was in the beginning,</w:t>
-      </w:r>
-      <w:r>
-        <w:br/>
-        <w:t>is now, and ever shall be,</w:t>
-      </w:r>
-      <w:r>
-        <w:br/>
-        <w:t>world without end.</w:t>
-      </w:r>
-    </w:p>
-    <w:p>
-      <w:pPr>
-        <w:pStyle w:val="SPBodyText"/>
-      </w:pPr>
-    </w:p>
-    <w:p>
-      <w:pPr>
-        <w:pStyle w:val="SPBodyText"/>
-      </w:pPr>
-      <w:r>
-        <w:t>And then simply say:</w:t>
-      </w:r>
-    </w:p>
-    <w:p>
-      <w:pPr>
-        <w:pStyle w:val="SPBodyText"/>
-      </w:pPr>
-      <w:r>
-        <w:t>Amen.</w:t>
-      </w:r>
-    </w:p>
-    <w:p>
-      <w:pPr>
-        <w:pStyle w:val="SPBodyText"/>
-      </w:pPr>
     </w:p>
     <w:p>
       <w:pPr>
         <w:pStyle w:val="SPBodyText"/>
         <w:sectPr>
           <w:type w:val="oddPage"/>
+          <w:pgSz w:w="7920" w:h="12240" w:code="6"/>
+          <w:pgMar w:top="1080" w:right="864" w:bottom="1080" w:left="1152" w:header="576" w:footer="576" w:gutter="0"/>
+          <w:cols w:space="720"/>
+          <w:titlePg/>
+          <w:docGrid w:linePitch="360"/>
+        </w:sectPr>
+      </w:pPr>
+    </w:p>
+    <w:p>
+      <w:pPr>
+        <w:pStyle w:val="SPBodyText"/>
+      </w:pPr>
+      <w:r>
+        <w:lastRenderedPageBreak/>
+        <w:t>Glory be to the Father.</w:t>
+      </w:r>
+    </w:p>
+    <w:p>
+      <w:pPr>
+        <w:pStyle w:val="SPBodyText"/>
+      </w:pPr>
+      <w:r>
+        <w:t>Give thanks for the One who created you.</w:t>
+      </w:r>
+    </w:p>
+    <w:p>
+      <w:pPr>
+        <w:pStyle w:val="SPBodyText"/>
+      </w:pPr>
+    </w:p>
+    <w:p>
+      <w:pPr>
+        <w:pStyle w:val="SPBodyText"/>
+      </w:pPr>
+      <w:r>
+        <w:t>And to the Son.</w:t>
+      </w:r>
+    </w:p>
+    <w:p>
+      <w:pPr>
+        <w:pStyle w:val="SPBodyText"/>
+      </w:pPr>
+      <w:r>
+        <w:t>Give thanks for the One who came to save you.</w:t>
+      </w:r>
+    </w:p>
+    <w:p>
+      <w:pPr>
+        <w:pStyle w:val="SPBodyText"/>
+      </w:pPr>
+    </w:p>
+    <w:p>
+      <w:pPr>
+        <w:pStyle w:val="SPBodyText"/>
+      </w:pPr>
+      <w:r>
+        <w:t>And to the Holy Spirit.</w:t>
+      </w:r>
+    </w:p>
+    <w:p>
+      <w:pPr>
+        <w:pStyle w:val="SPBodyText"/>
+      </w:pPr>
+      <w:r>
+        <w:t>Give thanks for the One who remains with you.</w:t>
+      </w:r>
+    </w:p>
+    <w:p>
+      <w:pPr>
+        <w:pStyle w:val="SPBodyText"/>
+      </w:pPr>
+    </w:p>
+    <w:p>
+      <w:pPr>
+        <w:pStyle w:val="SPBodyText"/>
+      </w:pPr>
+      <w:r>
+        <w:t>As it was in the beginning,</w:t>
+      </w:r>
+      <w:r>
+        <w:br/>
+        <w:t>is now, and ever shall be,</w:t>
+      </w:r>
+      <w:r>
+        <w:br/>
+        <w:t>world without end.</w:t>
+      </w:r>
+    </w:p>
+    <w:p>
+      <w:pPr>
+        <w:pStyle w:val="SPBodyText"/>
+      </w:pPr>
+    </w:p>
+    <w:p>
+      <w:pPr>
+        <w:pStyle w:val="SPBodyText"/>
+      </w:pPr>
+      <w:r>
+        <w:t>And then simply say:</w:t>
+      </w:r>
+    </w:p>
+    <w:p>
+      <w:pPr>
+        <w:pStyle w:val="SPBodyText"/>
+      </w:pPr>
+      <w:r>
+        <w:t>Amen.</w:t>
+      </w:r>
+    </w:p>
+    <w:p>
+      <w:pPr>
+        <w:pStyle w:val="SPBodyText"/>
+      </w:pPr>
+    </w:p>
+    <w:p>
+      <w:pPr>
+        <w:pStyle w:val="SPBodyText"/>
+        <w:sectPr>
+          <w:type w:val="evenPage"/>
           <w:pgSz w:w="7920" w:h="12240" w:code="6"/>
           <w:pgMar w:top="1080" w:right="864" w:bottom="1080" w:left="1152" w:header="576" w:footer="576" w:gutter="0"/>
           <w:cols w:space="720"/>
@@ -9617,15 +9659,7 @@
       </w:r>
       <w:r>
         <w:br/>
-        <w:t xml:space="preserve">He has raised up for us a mighty </w:t>
-      </w:r>
-      <w:proofErr w:type="spellStart"/>
-      <w:r>
-        <w:t>savior</w:t>
-      </w:r>
-      <w:proofErr w:type="spellEnd"/>
-      <w:r>
-        <w:t>,</w:t>
+        <w:t>He has raised up for us a mighty savior,</w:t>
       </w:r>
       <w:r>
         <w:br/>
@@ -11277,15 +11311,7 @@
         <w:pStyle w:val="SPPrayerEnglish"/>
       </w:pPr>
       <w:r>
-        <w:t xml:space="preserve">for he has looked with </w:t>
-      </w:r>
-      <w:proofErr w:type="spellStart"/>
-      <w:r>
-        <w:t>favor</w:t>
-      </w:r>
-      <w:proofErr w:type="spellEnd"/>
-      <w:r>
-        <w:t xml:space="preserve"> on his lowly servant.</w:t>
+        <w:t>for he has looked with favor on his lowly servant.</w:t>
       </w:r>
       <w:r>
         <w:br/>
@@ -18237,15 +18263,7 @@
         <w:pStyle w:val="SPScripture"/>
       </w:pPr>
       <w:r>
-        <w:t xml:space="preserve">Therefore God has highly exalted him and bestowed on him the </w:t>
-      </w:r>
-      <w:proofErr w:type="gramStart"/>
-      <w:r>
-        <w:t>name</w:t>
-      </w:r>
-      <w:proofErr w:type="gramEnd"/>
-      <w:r>
-        <w:t xml:space="preserve"> which is above every name, that at the name of Jesus every knee should bow, in heaven and on earth and under the earth, and every tongue confess that Jesus Christ is Lord, to the glory of God the father.</w:t>
+        <w:t>Therefore God has highly exalted him and bestowed on him the name which is above every name, that at the name of Jesus every knee should bow, in heaven and on earth and under the earth, and every tongue confess that Jesus Christ is Lord, to the glory of God the father.</w:t>
       </w:r>
     </w:p>
     <w:p>
@@ -18291,15 +18309,7 @@
         <w:t>I am the living bread which came down from heaven</w:t>
       </w:r>
       <w:r>
-        <w:t xml:space="preserve">; if </w:t>
-      </w:r>
-      <w:proofErr w:type="gramStart"/>
-      <w:r>
-        <w:t>any one</w:t>
-      </w:r>
-      <w:proofErr w:type="gramEnd"/>
-      <w:r>
-        <w:t xml:space="preserve"> eats of this bread, he will live forever; and the  bread which I shall give for the life of the world is my flesh.”</w:t>
+        <w:t>; if any one eats of this bread, he will live forever; and the  bread which I shall give for the life of the world is my flesh.”</w:t>
       </w:r>
     </w:p>
     <w:p>
@@ -22047,15 +22057,7 @@
         <w:pStyle w:val="SPScripture"/>
       </w:pPr>
       <w:r>
-        <w:t xml:space="preserve">“What man of you, having a hundred sheep, if he has lost one of them,  does not leave the ninety-nine in the wilderness, and go after the one which is lost, until he finds it? And when he has found it, he lays it on his shoulders, rejoicing. And when he comes home, he calls together his friends and his </w:t>
-      </w:r>
-      <w:proofErr w:type="spellStart"/>
-      <w:r>
-        <w:t>neighbors</w:t>
-      </w:r>
-      <w:proofErr w:type="spellEnd"/>
-      <w:r>
-        <w:t>, saying to them, ‘Rejoice with me, for I have found my sheep which was lost.’ Just so, I tell you, there will be more joy in heaven over one sinner who repents than over ninety-nine righteous persons who need no repentance.”</w:t>
+        <w:t>“What man of you, having a hundred sheep, if he has lost one of them,  does not leave the ninety-nine in the wilderness, and go after the one which is lost, until he finds it? And when he has found it, he lays it on his shoulders, rejoicing. And when he comes home, he calls together his friends and his neighbors, saying to them, ‘Rejoice with me, for I have found my sheep which was lost.’ Just so, I tell you, there will be more joy in heaven over one sinner who repents than over ninety-nine righteous persons who need no repentance.”</w:t>
       </w:r>
     </w:p>
     <w:p>
@@ -24409,28 +24411,79 @@
           <w:i/>
           <w:iCs/>
         </w:rPr>
-        <w:t xml:space="preserve">e, </w:t>
-      </w:r>
-      <w:proofErr w:type="spellStart"/>
+        <w:t>e, i, ae,</w:t>
+      </w:r>
+      <w:r>
+        <w:t xml:space="preserve"> or </w:t>
+      </w:r>
       <w:r>
         <w:rPr>
           <w:i/>
           <w:iCs/>
         </w:rPr>
-        <w:t>i</w:t>
-      </w:r>
-      <w:proofErr w:type="spellEnd"/>
+        <w:t>oe</w:t>
+      </w:r>
+      <w:r>
+        <w:t xml:space="preserve"> is generally pronounced like </w:t>
+      </w:r>
+      <w:r>
+        <w:rPr>
+          <w:b/>
+          <w:bCs/>
+        </w:rPr>
+        <w:t>ch</w:t>
+      </w:r>
+      <w:r>
+        <w:t>.</w:t>
+      </w:r>
+      <w:r>
+        <w:br/>
+      </w:r>
+      <w:r>
+        <w:rPr>
+          <w:b/>
+          <w:bCs/>
+        </w:rPr>
+        <w:t>c</w:t>
+      </w:r>
+      <w:r>
+        <w:t xml:space="preserve"> elsewhere is generally pronounced like </w:t>
+      </w:r>
+      <w:r>
+        <w:rPr>
+          <w:b/>
+          <w:bCs/>
+        </w:rPr>
+        <w:t>k</w:t>
+      </w:r>
+      <w:r>
+        <w:t>.</w:t>
+      </w:r>
+    </w:p>
+    <w:p>
+      <w:pPr>
+        <w:pStyle w:val="SPBodyText"/>
+      </w:pPr>
+      <w:r>
+        <w:rPr>
+          <w:b/>
+          <w:bCs/>
+        </w:rPr>
+        <w:t>g</w:t>
+      </w:r>
+      <w:r>
+        <w:t xml:space="preserve"> before </w:t>
+      </w:r>
       <w:r>
         <w:rPr>
           <w:i/>
           <w:iCs/>
         </w:rPr>
-        <w:t>, ae,</w:t>
+        <w:t>e, i, ae,</w:t>
       </w:r>
       <w:r>
         <w:t xml:space="preserve"> or </w:t>
       </w:r>
-      <w:proofErr w:type="spellStart"/>
       <w:r>
         <w:rPr>
           <w:i/>
@@ -24438,16 +24491,25 @@
         </w:rPr>
         <w:t>oe</w:t>
       </w:r>
-      <w:proofErr w:type="spellEnd"/>
-      <w:r>
-        <w:t xml:space="preserve"> is generally pronounced like </w:t>
+      <w:r>
+        <w:t xml:space="preserve"> is generally pronounced like the </w:t>
       </w:r>
       <w:r>
         <w:rPr>
           <w:b/>
           <w:bCs/>
         </w:rPr>
-        <w:t>ch</w:t>
+        <w:t>g</w:t>
+      </w:r>
+      <w:r>
+        <w:t xml:space="preserve"> in </w:t>
+      </w:r>
+      <w:r>
+        <w:rPr>
+          <w:i/>
+          <w:iCs/>
+        </w:rPr>
+        <w:t>gentle</w:t>
       </w:r>
       <w:r>
         <w:t>.</w:t>
@@ -24460,17 +24522,27 @@
           <w:b/>
           <w:bCs/>
         </w:rPr>
-        <w:t>c</w:t>
-      </w:r>
-      <w:r>
-        <w:t xml:space="preserve"> elsewhere is generally pronounced like </w:t>
+        <w:t>g</w:t>
+      </w:r>
+      <w:r>
+        <w:t xml:space="preserve"> elsewhere is generally pronounced like the </w:t>
       </w:r>
       <w:r>
         <w:rPr>
           <w:b/>
           <w:bCs/>
         </w:rPr>
-        <w:t>k</w:t>
+        <w:t>g</w:t>
+      </w:r>
+      <w:r>
+        <w:t xml:space="preserve"> in </w:t>
+      </w:r>
+      <w:r>
+        <w:rPr>
+          <w:i/>
+          <w:iCs/>
+        </w:rPr>
+        <w:t>go</w:t>
       </w:r>
       <w:r>
         <w:t>.</w:t>
@@ -24485,126 +24557,18 @@
           <w:b/>
           <w:bCs/>
         </w:rPr>
-        <w:t>g</w:t>
-      </w:r>
-      <w:r>
-        <w:t xml:space="preserve"> before </w:t>
-      </w:r>
-      <w:r>
-        <w:rPr>
-          <w:i/>
-          <w:iCs/>
-        </w:rPr>
-        <w:t xml:space="preserve">e, </w:t>
-      </w:r>
-      <w:proofErr w:type="spellStart"/>
-      <w:r>
-        <w:rPr>
-          <w:i/>
-          <w:iCs/>
-        </w:rPr>
-        <w:t>i</w:t>
-      </w:r>
-      <w:proofErr w:type="spellEnd"/>
-      <w:r>
-        <w:rPr>
-          <w:i/>
-          <w:iCs/>
-        </w:rPr>
-        <w:t>, ae,</w:t>
-      </w:r>
-      <w:r>
-        <w:t xml:space="preserve"> or </w:t>
-      </w:r>
-      <w:proofErr w:type="spellStart"/>
-      <w:r>
-        <w:rPr>
-          <w:i/>
-          <w:iCs/>
-        </w:rPr>
-        <w:t>oe</w:t>
-      </w:r>
-      <w:proofErr w:type="spellEnd"/>
-      <w:r>
-        <w:t xml:space="preserve"> is generally pronounced like the </w:t>
+        <w:t>ae</w:t>
+      </w:r>
+      <w:r>
+        <w:t xml:space="preserve"> and </w:t>
       </w:r>
       <w:r>
         <w:rPr>
           <w:b/>
           <w:bCs/>
         </w:rPr>
-        <w:t>g</w:t>
-      </w:r>
-      <w:r>
-        <w:t xml:space="preserve"> in </w:t>
-      </w:r>
-      <w:r>
-        <w:rPr>
-          <w:i/>
-          <w:iCs/>
-        </w:rPr>
-        <w:t>gentle</w:t>
-      </w:r>
-      <w:r>
-        <w:t>.</w:t>
-      </w:r>
-      <w:r>
-        <w:br/>
-      </w:r>
-      <w:r>
-        <w:rPr>
-          <w:b/>
-          <w:bCs/>
-        </w:rPr>
-        <w:t>g</w:t>
-      </w:r>
-      <w:r>
-        <w:t xml:space="preserve"> elsewhere is generally pronounced like the </w:t>
-      </w:r>
-      <w:r>
-        <w:rPr>
-          <w:b/>
-          <w:bCs/>
-        </w:rPr>
-        <w:t>g</w:t>
-      </w:r>
-      <w:r>
-        <w:t xml:space="preserve"> in </w:t>
-      </w:r>
-      <w:r>
-        <w:rPr>
-          <w:i/>
-          <w:iCs/>
-        </w:rPr>
-        <w:t>go</w:t>
-      </w:r>
-      <w:r>
-        <w:t>.</w:t>
-      </w:r>
-    </w:p>
-    <w:p>
-      <w:pPr>
-        <w:pStyle w:val="SPBodyText"/>
-      </w:pPr>
-      <w:r>
-        <w:rPr>
-          <w:b/>
-          <w:bCs/>
-        </w:rPr>
-        <w:t>ae</w:t>
-      </w:r>
-      <w:r>
-        <w:t xml:space="preserve"> and </w:t>
-      </w:r>
-      <w:proofErr w:type="spellStart"/>
-      <w:r>
-        <w:rPr>
-          <w:b/>
-          <w:bCs/>
-        </w:rPr>
         <w:t>oe</w:t>
       </w:r>
-      <w:proofErr w:type="spellEnd"/>
       <w:r>
         <w:t xml:space="preserve"> are generally pronounced like </w:t>
       </w:r>
@@ -24823,13 +24787,8 @@
         <w:pStyle w:val="SPPrayerEnglish"/>
       </w:pPr>
       <w:r>
-        <w:t xml:space="preserve">qui es in </w:t>
-      </w:r>
-      <w:proofErr w:type="spellStart"/>
-      <w:r>
-        <w:t>caelis</w:t>
-      </w:r>
-      <w:proofErr w:type="spellEnd"/>
+        <w:t>qui es in caelis</w:t>
+      </w:r>
       <w:r>
         <w:br/>
         <w:t>who art in heaven</w:t>

</xml_diff>